<commit_message>
step 90 : add notes
</commit_message>
<xml_diff>
--- a/video context/video_context_newVersion.docx
+++ b/video context/video_context_newVersion.docx
@@ -1773,17 +1773,29 @@
     <w:p>
       <w:pPr>
         <w:rPr>
+          <w:b/>
+          <w:bCs/>
           <w:rtl/>
           <w:lang w:bidi="fa-IR"/>
         </w:rPr>
       </w:pPr>
-      <w:r>
-        <w:rPr>
-          <w:b/>
-          <w:bCs/>
-          <w:lang w:bidi="fa-IR"/>
-        </w:rPr>
-        <w:t>Hellooo, and welcome back!</w:t>
+      <w:proofErr w:type="spellStart"/>
+      <w:r>
+        <w:rPr>
+          <w:b/>
+          <w:bCs/>
+          <w:lang w:bidi="fa-IR"/>
+        </w:rPr>
+        <w:t>Hellooo</w:t>
+      </w:r>
+      <w:proofErr w:type="spellEnd"/>
+      <w:r>
+        <w:rPr>
+          <w:b/>
+          <w:bCs/>
+          <w:lang w:bidi="fa-IR"/>
+        </w:rPr>
+        <w:t>, and welcome back!</w:t>
       </w:r>
       <w:r>
         <w:rPr>
@@ -1820,6 +1832,488 @@
     </w:p>
     <w:p>
       <w:pPr>
+        <w:rPr>
+          <w:b/>
+          <w:bCs/>
+          <w:lang w:bidi="fa-IR"/>
+        </w:rPr>
+      </w:pPr>
+      <w:r>
+        <w:rPr>
+          <w:b/>
+          <w:bCs/>
+          <w:lang w:bidi="fa-IR"/>
+        </w:rPr>
+        <w:t>2:</w:t>
+      </w:r>
+    </w:p>
+    <w:p>
+      <w:pPr>
+        <w:rPr>
+          <w:b/>
+          <w:bCs/>
+          <w:lang w:bidi="fa-IR"/>
+        </w:rPr>
+      </w:pPr>
+      <w:r>
+        <w:rPr>
+          <w:b/>
+          <w:bCs/>
+          <w:lang w:bidi="fa-IR"/>
+        </w:rPr>
+        <w:t>Let us consider a two-dimensional coordinate plane and two points, A and B, on it</w:t>
+      </w:r>
+    </w:p>
+    <w:p>
+      <w:pPr>
+        <w:rPr>
+          <w:lang w:bidi="fa-IR"/>
+        </w:rPr>
+      </w:pPr>
+      <w:r>
+        <w:rPr>
+          <w:lang w:bidi="fa-IR"/>
+        </w:rPr>
+        <w:t>Our goal is to compute the distance between these two points.</w:t>
+      </w:r>
+      <w:r>
+        <w:rPr>
+          <w:lang w:bidi="fa-IR"/>
+        </w:rPr>
+        <w:br/>
+        <w:t xml:space="preserve">Equivalently, if we consider the vector </w:t>
+      </w:r>
+      <m:oMath>
+        <m:r>
+          <m:rPr>
+            <m:sty m:val="bi"/>
+          </m:rPr>
+          <w:rPr>
+            <w:rFonts w:ascii="Cambria Math" w:hAnsi="Cambria Math"/>
+            <w:lang w:bidi="fa-IR"/>
+          </w:rPr>
+          <m:t>BA</m:t>
+        </m:r>
+      </m:oMath>
+      <w:r>
+        <w:rPr>
+          <w:lang w:bidi="fa-IR"/>
+        </w:rPr>
+        <w:t>, our objective is to find its length—that is, the norm of this vector.</w:t>
+      </w:r>
+    </w:p>
+    <w:p>
+      <w:pPr>
+        <w:rPr>
+          <w:lang w:bidi="fa-IR"/>
+        </w:rPr>
+      </w:pPr>
+      <w:r>
+        <w:rPr>
+          <w:lang w:bidi="fa-IR"/>
+        </w:rPr>
+        <w:t xml:space="preserve">Suppose we draw the vector </w:t>
+      </w:r>
+      <w:r>
+        <w:rPr>
+          <w:b/>
+          <w:bCs/>
+          <w:lang w:bidi="fa-IR"/>
+        </w:rPr>
+        <w:t>a</w:t>
+      </w:r>
+      <w:r>
+        <w:rPr>
+          <w:lang w:bidi="fa-IR"/>
+        </w:rPr>
+        <w:t xml:space="preserve"> from the origin to point </w:t>
+      </w:r>
+      <w:r>
+        <w:rPr>
+          <w:b/>
+          <w:bCs/>
+          <w:lang w:bidi="fa-IR"/>
+        </w:rPr>
+        <w:t>A</w:t>
+      </w:r>
+      <w:r>
+        <w:rPr>
+          <w:lang w:bidi="fa-IR"/>
+        </w:rPr>
+        <w:t xml:space="preserve">, and the vector </w:t>
+      </w:r>
+      <w:r>
+        <w:rPr>
+          <w:b/>
+          <w:bCs/>
+          <w:lang w:bidi="fa-IR"/>
+        </w:rPr>
+        <w:t>b</w:t>
+      </w:r>
+      <w:r>
+        <w:rPr>
+          <w:lang w:bidi="fa-IR"/>
+        </w:rPr>
+        <w:t xml:space="preserve"> from the origin to point </w:t>
+      </w:r>
+      <w:r>
+        <w:rPr>
+          <w:b/>
+          <w:bCs/>
+          <w:lang w:bidi="fa-IR"/>
+        </w:rPr>
+        <w:t>B</w:t>
+      </w:r>
+      <w:r>
+        <w:rPr>
+          <w:lang w:bidi="fa-IR"/>
+        </w:rPr>
+        <w:t>.</w:t>
+      </w:r>
+      <w:r>
+        <w:rPr>
+          <w:lang w:bidi="fa-IR"/>
+        </w:rPr>
+        <w:br/>
+        <w:t xml:space="preserve">We know that the vector </w:t>
+      </w:r>
+      <w:r>
+        <w:rPr>
+          <w:b/>
+          <w:bCs/>
+          <w:lang w:bidi="fa-IR"/>
+        </w:rPr>
+        <w:t>BA</w:t>
+      </w:r>
+      <w:r>
+        <w:rPr>
+          <w:lang w:bidi="fa-IR"/>
+        </w:rPr>
+        <w:t xml:space="preserve"> is simply </w:t>
+      </w:r>
+      <w:r>
+        <w:rPr>
+          <w:b/>
+          <w:bCs/>
+          <w:lang w:bidi="fa-IR"/>
+        </w:rPr>
+        <w:t>a−b</w:t>
+      </w:r>
+      <w:r>
+        <w:rPr>
+          <w:lang w:bidi="fa-IR"/>
+        </w:rPr>
+        <w:t>.</w:t>
+      </w:r>
+      <w:r>
+        <w:rPr>
+          <w:lang w:bidi="fa-IR"/>
+        </w:rPr>
+        <w:br/>
+        <w:t>By substituting this into our previous formula, we obtain the distance between the two points, exactly as shown on the screen.</w:t>
+      </w:r>
+    </w:p>
+    <w:p>
+      <w:pPr>
+        <w:rPr>
+          <w:lang w:bidi="fa-IR"/>
+        </w:rPr>
+      </w:pPr>
+      <w:r>
+        <w:rPr>
+          <w:lang w:bidi="fa-IR"/>
+        </w:rPr>
+        <w:t xml:space="preserve">3 : </w:t>
+      </w:r>
+    </w:p>
+    <w:p>
+      <w:pPr>
+        <w:rPr>
+          <w:lang w:bidi="fa-IR"/>
+        </w:rPr>
+      </w:pPr>
+      <w:r>
+        <w:rPr>
+          <w:lang w:bidi="fa-IR"/>
+        </w:rPr>
+        <w:t>We can now define the distance between two points, x and y, as shown on the screen, and we claim that this indeed defines a metric.</w:t>
+      </w:r>
+    </w:p>
+    <w:p>
+      <w:pPr>
+        <w:rPr>
+          <w:lang w:bidi="fa-IR"/>
+        </w:rPr>
+      </w:pPr>
+      <w:r>
+        <w:rPr>
+          <w:lang w:bidi="fa-IR"/>
+        </w:rPr>
+        <w:lastRenderedPageBreak/>
+        <w:t>To justify this claim, we need to verify that it satisfies the three metric axioms.</w:t>
+      </w:r>
+    </w:p>
+    <w:p>
+      <w:pPr>
+        <w:rPr>
+          <w:lang w:bidi="fa-IR"/>
+        </w:rPr>
+      </w:pPr>
+      <w:r>
+        <w:rPr>
+          <w:lang w:bidi="fa-IR"/>
+        </w:rPr>
+        <w:t>Let us begin by proving that the distance from a point to itself is zero, and conversely, if the distance between two points is zero, then the two points must be identical.</w:t>
+      </w:r>
+    </w:p>
+    <w:p>
+      <w:pPr>
+        <w:rPr>
+          <w:lang w:bidi="fa-IR"/>
+        </w:rPr>
+      </w:pPr>
+      <w:r>
+        <w:rPr>
+          <w:lang w:bidi="fa-IR"/>
+        </w:rPr>
+        <w:t>We start from the left-hand side and substitute the equivalent expression using our definition of the distance.</w:t>
+      </w:r>
+    </w:p>
+    <w:p>
+      <w:pPr>
+        <w:rPr>
+          <w:rtl/>
+          <w:lang w:bidi="fa-IR"/>
+        </w:rPr>
+      </w:pPr>
+      <w:r>
+        <w:rPr>
+          <w:lang w:bidi="fa-IR"/>
+        </w:rPr>
+        <w:t>Then, by applying the first axiom of a norm and simplifying the expression, the result follows immediately.</w:t>
+      </w:r>
+    </w:p>
+    <w:p>
+      <w:pPr>
+        <w:rPr>
+          <w:rtl/>
+          <w:lang w:bidi="fa-IR"/>
+        </w:rPr>
+      </w:pPr>
+      <w:r>
+        <w:rPr>
+          <w:lang w:bidi="fa-IR"/>
+        </w:rPr>
+        <w:t>To build some intuition, take a look at the figure. When the two points coincide, the distance between them is naturally zero</w:t>
+      </w:r>
+    </w:p>
+    <w:p>
+      <w:pPr>
+        <w:rPr>
+          <w:lang w:bidi="fa-IR"/>
+        </w:rPr>
+      </w:pPr>
+      <w:r>
+        <w:rPr>
+          <w:lang w:bidi="fa-IR"/>
+        </w:rPr>
+        <w:t xml:space="preserve">4 : </w:t>
+      </w:r>
+    </w:p>
+    <w:p>
+      <w:pPr>
+        <w:rPr>
+          <w:lang w:bidi="fa-IR"/>
+        </w:rPr>
+      </w:pPr>
+      <w:r>
+        <w:rPr>
+          <w:lang w:bidi="fa-IR"/>
+        </w:rPr>
+        <w:t xml:space="preserve">Next, we show that the distance from x </w:t>
+      </w:r>
+      <w:proofErr w:type="spellStart"/>
+      <w:r>
+        <w:rPr>
+          <w:lang w:bidi="fa-IR"/>
+        </w:rPr>
+        <w:t>to y</w:t>
+      </w:r>
+      <w:proofErr w:type="spellEnd"/>
+      <w:r>
+        <w:rPr>
+          <w:lang w:bidi="fa-IR"/>
+        </w:rPr>
+        <w:t xml:space="preserve"> is equal to the distance from y to x.</w:t>
+      </w:r>
+    </w:p>
+    <w:p>
+      <w:pPr>
+        <w:rPr>
+          <w:lang w:bidi="fa-IR"/>
+        </w:rPr>
+      </w:pPr>
+      <w:r>
+        <w:rPr>
+          <w:lang w:bidi="fa-IR"/>
+        </w:rPr>
+        <w:t>We begin with the left-hand side and substitute the definition of the distance. Then, by factoring out −1, applying the second axiom of a norm, and simplifying the expression, the claim follows.</w:t>
+      </w:r>
+    </w:p>
+    <w:p>
+      <w:pPr>
+        <w:rPr>
+          <w:lang w:bidi="fa-IR"/>
+        </w:rPr>
+      </w:pPr>
+      <w:r>
+        <w:rPr>
+          <w:lang w:bidi="fa-IR"/>
+        </w:rPr>
+        <w:t xml:space="preserve">To gain some geometric intuition, consider two points, x and y, in the two-dimensional plane. We first represent the distance from x </w:t>
+      </w:r>
+      <w:proofErr w:type="spellStart"/>
+      <w:r>
+        <w:rPr>
+          <w:lang w:bidi="fa-IR"/>
+        </w:rPr>
+        <w:t>to y</w:t>
+      </w:r>
+      <w:proofErr w:type="spellEnd"/>
+      <w:r>
+        <w:rPr>
+          <w:lang w:bidi="fa-IR"/>
+        </w:rPr>
+        <w:t xml:space="preserve"> </w:t>
+      </w:r>
+      <w:r>
+        <w:rPr>
+          <w:lang w:bidi="fa-IR"/>
+        </w:rPr>
+        <w:t xml:space="preserve">as the norm of the green vector, and then the distance from y to x as the norm of the </w:t>
+      </w:r>
+      <w:r>
+        <w:rPr>
+          <w:lang w:bidi="fa-IR"/>
+        </w:rPr>
+        <w:t>blue</w:t>
+      </w:r>
+      <w:r>
+        <w:rPr>
+          <w:lang w:bidi="fa-IR"/>
+        </w:rPr>
+        <w:t xml:space="preserve"> vector.</w:t>
+      </w:r>
+    </w:p>
+    <w:p>
+      <w:pPr>
+        <w:rPr>
+          <w:rtl/>
+          <w:lang w:bidi="fa-IR"/>
+        </w:rPr>
+      </w:pPr>
+      <w:r>
+        <w:rPr>
+          <w:lang w:bidi="fa-IR"/>
+        </w:rPr>
+        <w:t>As you can see, these two vectors have exactly the same length. Therefore, their norms—and hence the corresponding distances—are equal</w:t>
+      </w:r>
+      <w:r>
+        <w:rPr>
+          <w:lang w:bidi="fa-IR"/>
+        </w:rPr>
+        <w:t>.</w:t>
+      </w:r>
+    </w:p>
+    <w:p>
+      <w:pPr>
+        <w:rPr>
+          <w:lang w:bidi="fa-IR"/>
+        </w:rPr>
+      </w:pPr>
+      <w:r>
+        <w:rPr>
+          <w:lang w:bidi="fa-IR"/>
+        </w:rPr>
+        <w:t xml:space="preserve">5 : </w:t>
+      </w:r>
+    </w:p>
+    <w:p>
+      <w:pPr>
+        <w:rPr>
+          <w:lang w:bidi="fa-IR"/>
+        </w:rPr>
+      </w:pPr>
+      <w:r>
+        <w:rPr>
+          <w:lang w:bidi="fa-IR"/>
+        </w:rPr>
+        <w:t>Finally, we show that the triangle inequality also holds for our distance function.</w:t>
+      </w:r>
+    </w:p>
+    <w:p>
+      <w:pPr>
+        <w:rPr>
+          <w:lang w:bidi="fa-IR"/>
+        </w:rPr>
+      </w:pPr>
+      <w:r>
+        <w:rPr>
+          <w:lang w:bidi="fa-IR"/>
+        </w:rPr>
+        <w:t>As before, we begin with the left-hand side and substitute the definition of the distance. We then add and subtract the vector z, rearrange the terms, apply the third axiom of a norm, and finally simplify the expression. This completes the proof.</w:t>
+      </w:r>
+    </w:p>
+    <w:p>
+      <w:pPr>
+        <w:rPr>
+          <w:lang w:bidi="fa-IR"/>
+        </w:rPr>
+      </w:pPr>
+      <w:r>
+        <w:rPr>
+          <w:lang w:bidi="fa-IR"/>
+        </w:rPr>
+        <w:t>To gain some geometric intuition, consider the points x and y, together with the vector representing the distance between them. Now introduce an arbitrary point z, and draw the corresponding vectors as shown in the figure.</w:t>
+      </w:r>
+    </w:p>
+    <w:p>
+      <w:pPr>
+        <w:rPr>
+          <w:lang w:bidi="fa-IR"/>
+        </w:rPr>
+      </w:pPr>
+      <w:r>
+        <w:rPr>
+          <w:lang w:bidi="fa-IR"/>
+        </w:rPr>
+        <w:t>These three vectors form a triangle, and the triangle inequality tells us that the length of one side is never greater than the sum of the lengths of the other two sides. Therefore, the triangle inequality holds for our distance function as well</w:t>
+      </w:r>
+    </w:p>
+    <w:p>
+      <w:pPr>
+        <w:rPr>
+          <w:rFonts w:hint="cs"/>
+          <w:lang w:bidi="fa-IR"/>
+        </w:rPr>
+      </w:pPr>
+    </w:p>
+    <w:p>
+      <w:pPr>
+        <w:rPr>
+          <w:lang w:bidi="fa-IR"/>
+        </w:rPr>
+      </w:pPr>
+    </w:p>
+    <w:p>
+      <w:pPr>
+        <w:rPr>
+          <w:lang w:bidi="fa-IR"/>
+        </w:rPr>
+      </w:pPr>
+    </w:p>
+    <w:p>
+      <w:pPr>
         <w:pStyle w:val="Heading2"/>
         <w:rPr>
           <w:lang w:bidi="fa-IR"/>
@@ -1934,7 +2428,6 @@
         <w:rPr>
           <w:lang w:bidi="fa-IR"/>
         </w:rPr>
-        <w:lastRenderedPageBreak/>
         <w:t>Orthogonality in inner product spaces</w:t>
       </w:r>
     </w:p>

</xml_diff>

<commit_message>
step 91 : finish part 2 and start part3
</commit_message>
<xml_diff>
--- a/video context/video_context_newVersion.docx
+++ b/video context/video_context_newVersion.docx
@@ -1779,23 +1779,13 @@
           <w:lang w:bidi="fa-IR"/>
         </w:rPr>
       </w:pPr>
-      <w:proofErr w:type="spellStart"/>
-      <w:r>
-        <w:rPr>
-          <w:b/>
-          <w:bCs/>
-          <w:lang w:bidi="fa-IR"/>
-        </w:rPr>
-        <w:t>Hellooo</w:t>
-      </w:r>
-      <w:proofErr w:type="spellEnd"/>
-      <w:r>
-        <w:rPr>
-          <w:b/>
-          <w:bCs/>
-          <w:lang w:bidi="fa-IR"/>
-        </w:rPr>
-        <w:t>, and welcome back!</w:t>
+      <w:r>
+        <w:rPr>
+          <w:b/>
+          <w:bCs/>
+          <w:lang w:bidi="fa-IR"/>
+        </w:rPr>
+        <w:t>Hellooo, and welcome back!</w:t>
       </w:r>
       <w:r>
         <w:rPr>
@@ -2130,21 +2120,7 @@
         <w:rPr>
           <w:lang w:bidi="fa-IR"/>
         </w:rPr>
-        <w:t xml:space="preserve">Next, we show that the distance from x </w:t>
-      </w:r>
-      <w:proofErr w:type="spellStart"/>
-      <w:r>
-        <w:rPr>
-          <w:lang w:bidi="fa-IR"/>
-        </w:rPr>
-        <w:t>to y</w:t>
-      </w:r>
-      <w:proofErr w:type="spellEnd"/>
-      <w:r>
-        <w:rPr>
-          <w:lang w:bidi="fa-IR"/>
-        </w:rPr>
-        <w:t xml:space="preserve"> is equal to the distance from y to x.</w:t>
+        <w:t>Next, we show that the distance from x to y is equal to the distance from y to x.</w:t>
       </w:r>
     </w:p>
     <w:p>
@@ -2170,16 +2146,8 @@
         <w:rPr>
           <w:lang w:bidi="fa-IR"/>
         </w:rPr>
-        <w:t xml:space="preserve">To gain some geometric intuition, consider two points, x and y, in the two-dimensional plane. We first represent the distance from x </w:t>
-      </w:r>
-      <w:proofErr w:type="spellStart"/>
-      <w:r>
-        <w:rPr>
-          <w:lang w:bidi="fa-IR"/>
-        </w:rPr>
-        <w:t>to y</w:t>
-      </w:r>
-      <w:proofErr w:type="spellEnd"/>
+        <w:t>To gain some geometric intuition, consider two points, x and y, in the two-dimensional plane. We first represent the distance from x to y</w:t>
+      </w:r>
       <w:r>
         <w:rPr>
           <w:lang w:bidi="fa-IR"/>
@@ -2289,28 +2257,254 @@
         </w:rPr>
         <w:t>These three vectors form a triangle, and the triangle inequality tells us that the length of one side is never greater than the sum of the lengths of the other two sides. Therefore, the triangle inequality holds for our distance function as well</w:t>
       </w:r>
+      <w:r>
+        <w:rPr>
+          <w:lang w:bidi="fa-IR"/>
+        </w:rPr>
+        <w:t>.</w:t>
+      </w:r>
+    </w:p>
+    <w:p>
+      <w:pPr>
+        <w:rPr>
+          <w:lang w:bidi="fa-IR"/>
+        </w:rPr>
+      </w:pPr>
+      <w:r>
+        <w:rPr>
+          <w:lang w:bidi="fa-IR"/>
+        </w:rPr>
+        <w:t xml:space="preserve">6 : </w:t>
+      </w:r>
+    </w:p>
+    <w:p>
+      <w:pPr>
+        <w:rPr>
+          <w:sz w:val="44"/>
+          <w:szCs w:val="44"/>
+          <w:lang w:bidi="fa-IR"/>
+        </w:rPr>
+      </w:pPr>
+      <w:r>
+        <w:rPr>
+          <w:sz w:val="44"/>
+          <w:szCs w:val="44"/>
+          <w:lang w:bidi="fa-IR"/>
+        </w:rPr>
+        <w:lastRenderedPageBreak/>
+        <w:t>Earlier, we introduced the concept of normed spaces. Now, suppose we replace the norm with the distance function we have just defined.</w:t>
+      </w:r>
+    </w:p>
+    <w:p>
+      <w:pPr>
+        <w:rPr>
+          <w:sz w:val="44"/>
+          <w:szCs w:val="44"/>
+          <w:lang w:bidi="fa-IR"/>
+        </w:rPr>
+      </w:pPr>
+      <w:r>
+        <w:rPr>
+          <w:sz w:val="44"/>
+          <w:szCs w:val="44"/>
+          <w:lang w:bidi="fa-IR"/>
+        </w:rPr>
+        <w:t>We have already proved that this function is a metric. Therefore, the resulting space is a metric space.</w:t>
+      </w:r>
+    </w:p>
+    <w:p>
+      <w:pPr>
+        <w:rPr>
+          <w:sz w:val="44"/>
+          <w:szCs w:val="44"/>
+          <w:lang w:bidi="fa-IR"/>
+        </w:rPr>
+      </w:pPr>
+      <w:r>
+        <w:rPr>
+          <w:sz w:val="44"/>
+          <w:szCs w:val="44"/>
+          <w:lang w:bidi="fa-IR"/>
+        </w:rPr>
+        <w:t>This leads to an important conclusion: every normed space is a metric space. However, the converse is not necessarily true—not every metric space is a normed space.</w:t>
+      </w:r>
+    </w:p>
+    <w:p>
+      <w:pPr>
+        <w:rPr>
+          <w:sz w:val="44"/>
+          <w:szCs w:val="44"/>
+          <w:lang w:bidi="fa-IR"/>
+        </w:rPr>
+      </w:pPr>
+      <w:r>
+        <w:rPr>
+          <w:sz w:val="44"/>
+          <w:szCs w:val="44"/>
+          <w:lang w:bidi="fa-IR"/>
+        </w:rPr>
+        <w:t>To see this, let us consider the following counterexample.</w:t>
+      </w:r>
+    </w:p>
+    <w:p>
+      <w:pPr>
+        <w:rPr>
+          <w:sz w:val="44"/>
+          <w:szCs w:val="44"/>
+          <w:lang w:bidi="fa-IR"/>
+        </w:rPr>
+      </w:pPr>
+      <w:r>
+        <w:rPr>
+          <w:sz w:val="44"/>
+          <w:szCs w:val="44"/>
+          <w:lang w:bidi="fa-IR"/>
+        </w:rPr>
+        <w:t>Suppose the distance between two points is defined as shown on the screen. Since the norm of a vector is simply its distance from the origin, the corresponding norm would have to be given by the expression shown here.</w:t>
+      </w:r>
+    </w:p>
+    <w:p>
+      <w:pPr>
+        <w:rPr>
+          <w:sz w:val="44"/>
+          <w:szCs w:val="44"/>
+          <w:lang w:bidi="fa-IR"/>
+        </w:rPr>
+      </w:pPr>
+      <w:r>
+        <w:rPr>
+          <w:sz w:val="44"/>
+          <w:szCs w:val="44"/>
+          <w:lang w:bidi="fa-IR"/>
+        </w:rPr>
+        <w:t xml:space="preserve">We will now show that this cannot be a norm. In particular, it violates the second norm axiom. For </w:t>
+      </w:r>
+      <w:r>
+        <w:rPr>
+          <w:sz w:val="44"/>
+          <w:szCs w:val="44"/>
+          <w:lang w:bidi="fa-IR"/>
+        </w:rPr>
+        <w:lastRenderedPageBreak/>
+        <w:t>example, if we choose the scalar α=2, the equality required by the homogeneity property no longer holds, as shown.</w:t>
+      </w:r>
+    </w:p>
+    <w:p>
+      <w:pPr>
+        <w:rPr>
+          <w:sz w:val="44"/>
+          <w:szCs w:val="44"/>
+          <w:lang w:bidi="fa-IR"/>
+        </w:rPr>
+      </w:pPr>
+      <w:r>
+        <w:rPr>
+          <w:sz w:val="44"/>
+          <w:szCs w:val="44"/>
+          <w:lang w:bidi="fa-IR"/>
+        </w:rPr>
+        <w:t>Therefore, this function cannot be a norm.</w:t>
+      </w:r>
+    </w:p>
+    <w:p>
+      <w:pPr>
+        <w:rPr>
+          <w:sz w:val="44"/>
+          <w:szCs w:val="44"/>
+          <w:lang w:bidi="fa-IR"/>
+        </w:rPr>
+      </w:pPr>
+      <w:r>
+        <w:rPr>
+          <w:sz w:val="44"/>
+          <w:szCs w:val="44"/>
+          <w:lang w:bidi="fa-IR"/>
+        </w:rPr>
+        <w:t>In summary, the collection of all normed spaces is a proper subset of the collection of all metric spaces</w:t>
+      </w:r>
+    </w:p>
+    <w:p>
+      <w:pPr>
+        <w:rPr>
+          <w:lang w:bidi="fa-IR"/>
+        </w:rPr>
+      </w:pPr>
+      <w:r>
+        <w:rPr>
+          <w:lang w:bidi="fa-IR"/>
+        </w:rPr>
+        <w:t>7 :</w:t>
+      </w:r>
+    </w:p>
+    <w:p>
+      <w:pPr>
+        <w:rPr>
+          <w:sz w:val="44"/>
+          <w:szCs w:val="44"/>
+          <w:lang w:bidi="fa-IR"/>
+        </w:rPr>
+      </w:pPr>
+      <w:r>
+        <w:rPr>
+          <w:sz w:val="44"/>
+          <w:szCs w:val="44"/>
+          <w:lang w:bidi="fa-IR"/>
+        </w:rPr>
+        <w:t>In this video, we discovered how every norm induces a metric.</w:t>
+      </w:r>
+    </w:p>
+    <w:p>
+      <w:pPr>
+        <w:rPr>
+          <w:sz w:val="44"/>
+          <w:szCs w:val="44"/>
+          <w:lang w:bidi="fa-IR"/>
+        </w:rPr>
+      </w:pPr>
+      <w:r>
+        <w:rPr>
+          <w:sz w:val="44"/>
+          <w:szCs w:val="44"/>
+          <w:lang w:bidi="fa-IR"/>
+        </w:rPr>
+        <w:t>But this is only the beginning.</w:t>
+      </w:r>
     </w:p>
     <w:p>
       <w:pPr>
         <w:rPr>
           <w:rFonts w:hint="cs"/>
-          <w:lang w:bidi="fa-IR"/>
-        </w:rPr>
-      </w:pPr>
-    </w:p>
-    <w:p>
-      <w:pPr>
-        <w:rPr>
-          <w:lang w:bidi="fa-IR"/>
-        </w:rPr>
-      </w:pPr>
-    </w:p>
-    <w:p>
-      <w:pPr>
-        <w:rPr>
-          <w:lang w:bidi="fa-IR"/>
-        </w:rPr>
-      </w:pPr>
+          <w:sz w:val="44"/>
+          <w:szCs w:val="44"/>
+          <w:rtl/>
+          <w:lang w:bidi="fa-IR"/>
+        </w:rPr>
+      </w:pPr>
+      <w:r>
+        <w:rPr>
+          <w:sz w:val="44"/>
+          <w:szCs w:val="44"/>
+          <w:lang w:bidi="fa-IR"/>
+        </w:rPr>
+        <w:t>Join me in the next episode as we explore the world of Cauchy sequences and uncover the secrets they hold.</w:t>
+      </w:r>
+    </w:p>
+    <w:p>
+      <w:pPr>
+        <w:rPr>
+          <w:sz w:val="44"/>
+          <w:szCs w:val="44"/>
+          <w:lang w:bidi="fa-IR"/>
+        </w:rPr>
+      </w:pPr>
+      <w:r>
+        <w:rPr>
+          <w:sz w:val="44"/>
+          <w:szCs w:val="44"/>
+          <w:lang w:bidi="fa-IR"/>
+        </w:rPr>
+        <w:t>See you next time</w:t>
+      </w:r>
     </w:p>
     <w:p>
       <w:pPr>
@@ -2324,6 +2518,458 @@
           <w:lang w:bidi="fa-IR"/>
         </w:rPr>
         <w:t>Cauchy sequences</w:t>
+      </w:r>
+    </w:p>
+    <w:p>
+      <w:pPr>
+        <w:rPr>
+          <w:lang w:bidi="fa-IR"/>
+        </w:rPr>
+      </w:pPr>
+      <w:r>
+        <w:rPr>
+          <w:lang w:bidi="fa-IR"/>
+        </w:rPr>
+        <w:t xml:space="preserve">1 : </w:t>
+      </w:r>
+    </w:p>
+    <w:p>
+      <w:pPr>
+        <w:rPr>
+          <w:sz w:val="44"/>
+          <w:szCs w:val="44"/>
+          <w:lang w:bidi="fa-IR"/>
+        </w:rPr>
+      </w:pPr>
+      <w:r>
+        <w:rPr>
+          <w:sz w:val="44"/>
+          <w:szCs w:val="44"/>
+          <w:lang w:bidi="fa-IR"/>
+        </w:rPr>
+        <w:t>In the previous video, we saw how a norm can be used to construct a metric.</w:t>
+      </w:r>
+    </w:p>
+    <w:p>
+      <w:pPr>
+        <w:rPr>
+          <w:rFonts w:hint="cs"/>
+          <w:sz w:val="44"/>
+          <w:szCs w:val="44"/>
+          <w:rtl/>
+          <w:lang w:bidi="fa-IR"/>
+        </w:rPr>
+      </w:pPr>
+      <w:r>
+        <w:rPr>
+          <w:sz w:val="44"/>
+          <w:szCs w:val="44"/>
+          <w:lang w:bidi="fa-IR"/>
+        </w:rPr>
+        <w:t>Now it's time to take the next step.</w:t>
+      </w:r>
+    </w:p>
+    <w:p>
+      <w:pPr>
+        <w:rPr>
+          <w:sz w:val="44"/>
+          <w:szCs w:val="44"/>
+          <w:lang w:bidi="fa-IR"/>
+        </w:rPr>
+      </w:pPr>
+      <w:r>
+        <w:rPr>
+          <w:sz w:val="44"/>
+          <w:szCs w:val="44"/>
+          <w:lang w:bidi="fa-IR"/>
+        </w:rPr>
+        <w:lastRenderedPageBreak/>
+        <w:t xml:space="preserve">In this video, we'll explore </w:t>
+      </w:r>
+      <w:r>
+        <w:rPr>
+          <w:b/>
+          <w:bCs/>
+          <w:sz w:val="44"/>
+          <w:szCs w:val="44"/>
+          <w:lang w:bidi="fa-IR"/>
+        </w:rPr>
+        <w:t>Cauchy sequences</w:t>
+      </w:r>
+      <w:r>
+        <w:rPr>
+          <w:sz w:val="44"/>
+          <w:szCs w:val="44"/>
+          <w:lang w:bidi="fa-IR"/>
+        </w:rPr>
+        <w:t xml:space="preserve"> and uncover the mystery behind what it really means for points to become </w:t>
+      </w:r>
+      <w:r>
+        <w:rPr>
+          <w:b/>
+          <w:bCs/>
+          <w:sz w:val="44"/>
+          <w:szCs w:val="44"/>
+          <w:lang w:bidi="fa-IR"/>
+        </w:rPr>
+        <w:t>arbitrarily close</w:t>
+      </w:r>
+      <w:r>
+        <w:rPr>
+          <w:sz w:val="44"/>
+          <w:szCs w:val="44"/>
+          <w:lang w:bidi="fa-IR"/>
+        </w:rPr>
+        <w:t>.</w:t>
+      </w:r>
+    </w:p>
+    <w:p>
+      <w:pPr>
+        <w:rPr>
+          <w:sz w:val="44"/>
+          <w:szCs w:val="44"/>
+          <w:lang w:bidi="fa-IR"/>
+        </w:rPr>
+      </w:pPr>
+      <w:r>
+        <w:rPr>
+          <w:sz w:val="44"/>
+          <w:szCs w:val="44"/>
+          <w:lang w:bidi="fa-IR"/>
+        </w:rPr>
+        <w:t>If you're ready, let's begin</w:t>
+      </w:r>
+    </w:p>
+    <w:p>
+      <w:pPr>
+        <w:rPr>
+          <w:lang w:bidi="fa-IR"/>
+        </w:rPr>
+      </w:pPr>
+      <w:r>
+        <w:rPr>
+          <w:lang w:bidi="fa-IR"/>
+        </w:rPr>
+        <w:t xml:space="preserve">2 : </w:t>
+      </w:r>
+    </w:p>
+    <w:p>
+      <w:pPr>
+        <w:rPr>
+          <w:sz w:val="44"/>
+          <w:szCs w:val="44"/>
+          <w:lang w:bidi="fa-IR"/>
+        </w:rPr>
+      </w:pPr>
+      <w:r>
+        <w:rPr>
+          <w:sz w:val="44"/>
+          <w:szCs w:val="44"/>
+          <w:lang w:bidi="fa-IR"/>
+        </w:rPr>
+        <w:t>To begin, let (X,d) be a metric space, and let y_n</w:t>
+      </w:r>
+      <w:r>
+        <w:rPr>
+          <w:sz w:val="44"/>
+          <w:szCs w:val="44"/>
+          <w:lang w:bidi="fa-IR"/>
+        </w:rPr>
+        <w:t xml:space="preserve"> </w:t>
+      </w:r>
+      <w:r>
+        <w:rPr>
+          <w:sz w:val="44"/>
+          <w:szCs w:val="44"/>
+          <w:lang w:bidi="fa-IR"/>
+        </w:rPr>
+        <w:t>be a sequence in X.</w:t>
+      </w:r>
+    </w:p>
+    <w:p>
+      <w:pPr>
+        <w:rPr>
+          <w:sz w:val="44"/>
+          <w:szCs w:val="44"/>
+          <w:lang w:bidi="fa-IR"/>
+        </w:rPr>
+      </w:pPr>
+      <w:r>
+        <w:rPr>
+          <w:sz w:val="44"/>
+          <w:szCs w:val="44"/>
+          <w:lang w:bidi="fa-IR"/>
+        </w:rPr>
+        <w:t>We say that the sequence y_n</w:t>
+      </w:r>
+      <w:r>
+        <w:rPr>
+          <w:sz w:val="44"/>
+          <w:szCs w:val="44"/>
+          <w:lang w:bidi="fa-IR"/>
+        </w:rPr>
+        <w:t xml:space="preserve"> </w:t>
+      </w:r>
+      <w:r>
+        <w:rPr>
+          <w:sz w:val="44"/>
+          <w:szCs w:val="44"/>
+          <w:lang w:bidi="fa-IR"/>
+        </w:rPr>
+        <w:t>converges</w:t>
+      </w:r>
+      <w:r>
+        <w:rPr>
+          <w:sz w:val="44"/>
+          <w:szCs w:val="44"/>
+          <w:lang w:bidi="fa-IR"/>
+        </w:rPr>
+        <w:t xml:space="preserve"> </w:t>
+      </w:r>
+      <w:r>
+        <w:rPr>
+          <w:sz w:val="44"/>
+          <w:szCs w:val="44"/>
+          <w:lang w:bidi="fa-IR"/>
+        </w:rPr>
+        <w:t>if there exists a point y</w:t>
+      </w:r>
+      <w:r>
+        <w:rPr>
+          <w:rFonts w:ascii="Cambria Math" w:hAnsi="Cambria Math" w:cs="Cambria Math"/>
+          <w:sz w:val="44"/>
+          <w:szCs w:val="44"/>
+          <w:lang w:bidi="fa-IR"/>
+        </w:rPr>
+        <w:t>∈</w:t>
+      </w:r>
+      <w:r>
+        <w:rPr>
+          <w:sz w:val="44"/>
+          <w:szCs w:val="44"/>
+          <w:lang w:bidi="fa-IR"/>
+        </w:rPr>
+        <w:t xml:space="preserve"> </w:t>
+      </w:r>
+      <w:r>
+        <w:rPr>
+          <w:sz w:val="44"/>
+          <w:szCs w:val="44"/>
+          <w:lang w:bidi="fa-IR"/>
+        </w:rPr>
+        <w:t>X such that the terms of the sequence get closer and closer to y.</w:t>
+      </w:r>
+    </w:p>
+    <w:p>
+      <w:pPr>
+        <w:rPr>
+          <w:sz w:val="44"/>
+          <w:szCs w:val="44"/>
+          <w:lang w:bidi="fa-IR"/>
+        </w:rPr>
+      </w:pPr>
+      <w:r>
+        <w:rPr>
+          <w:sz w:val="44"/>
+          <w:szCs w:val="44"/>
+          <w:lang w:bidi="fa-IR"/>
+        </w:rPr>
+        <w:t>To build some intuition, consider the metric space shown on the screen. We first mark the limit point, y. Then we plot the terms of the sequence.</w:t>
+      </w:r>
+    </w:p>
+    <w:p>
+      <w:pPr>
+        <w:rPr>
+          <w:sz w:val="44"/>
+          <w:szCs w:val="44"/>
+          <w:lang w:bidi="fa-IR"/>
+        </w:rPr>
+      </w:pPr>
+      <w:r>
+        <w:rPr>
+          <w:sz w:val="44"/>
+          <w:szCs w:val="44"/>
+          <w:lang w:bidi="fa-IR"/>
+        </w:rPr>
+        <w:t xml:space="preserve">As you can see, the terms of the sequence move closer and closer to the same point. This point is called the </w:t>
+      </w:r>
+      <w:r>
+        <w:rPr>
+          <w:b/>
+          <w:bCs/>
+          <w:sz w:val="44"/>
+          <w:szCs w:val="44"/>
+          <w:lang w:bidi="fa-IR"/>
+        </w:rPr>
+        <w:t>limit</w:t>
+      </w:r>
+      <w:r>
+        <w:rPr>
+          <w:sz w:val="44"/>
+          <w:szCs w:val="44"/>
+          <w:lang w:bidi="fa-IR"/>
+        </w:rPr>
+        <w:t xml:space="preserve"> of the sequence.</w:t>
+      </w:r>
+    </w:p>
+    <w:p>
+      <w:pPr>
+        <w:rPr>
+          <w:sz w:val="44"/>
+          <w:szCs w:val="44"/>
+          <w:lang w:bidi="fa-IR"/>
+        </w:rPr>
+      </w:pPr>
+      <w:r>
+        <w:rPr>
+          <w:sz w:val="44"/>
+          <w:szCs w:val="44"/>
+          <w:lang w:bidi="fa-IR"/>
+        </w:rPr>
+        <w:t>Now suppose we consider a subspace Y of X, chosen so that the limit lies on its boundary—or, more generally, outside the subspace.</w:t>
+      </w:r>
+    </w:p>
+    <w:p>
+      <w:pPr>
+        <w:rPr>
+          <w:sz w:val="44"/>
+          <w:szCs w:val="44"/>
+          <w:lang w:bidi="fa-IR"/>
+        </w:rPr>
+      </w:pPr>
+      <w:r>
+        <w:rPr>
+          <w:sz w:val="44"/>
+          <w:szCs w:val="44"/>
+          <w:lang w:bidi="fa-IR"/>
+        </w:rPr>
+        <w:lastRenderedPageBreak/>
+        <w:t xml:space="preserve">In this case, something interesting happens. The very same sequence </w:t>
+      </w:r>
+      <w:r>
+        <w:rPr>
+          <w:sz w:val="44"/>
+          <w:szCs w:val="44"/>
+          <w:lang w:bidi="fa-IR"/>
+        </w:rPr>
+        <w:t>y_n</w:t>
+      </w:r>
+      <w:r>
+        <w:rPr>
+          <w:sz w:val="44"/>
+          <w:szCs w:val="44"/>
+          <w:lang w:bidi="fa-IR"/>
+        </w:rPr>
+        <w:t xml:space="preserve"> is no longer convergent </w:t>
+      </w:r>
+      <w:r>
+        <w:rPr>
+          <w:b/>
+          <w:bCs/>
+          <w:sz w:val="44"/>
+          <w:szCs w:val="44"/>
+          <w:lang w:bidi="fa-IR"/>
+        </w:rPr>
+        <w:t>in the space Y</w:t>
+      </w:r>
+      <w:r>
+        <w:rPr>
+          <w:sz w:val="44"/>
+          <w:szCs w:val="44"/>
+          <w:lang w:bidi="fa-IR"/>
+        </w:rPr>
+        <w:t>, because its limit does not belong to Y</w:t>
+      </w:r>
+      <w:r>
+        <w:rPr>
+          <w:sz w:val="44"/>
+          <w:szCs w:val="44"/>
+          <w:lang w:bidi="fa-IR"/>
+        </w:rPr>
+        <w:t xml:space="preserve"> </w:t>
+      </w:r>
+      <w:r>
+        <w:rPr>
+          <w:sz w:val="44"/>
+          <w:szCs w:val="44"/>
+          <w:lang w:bidi="fa-IR"/>
+        </w:rPr>
+        <w:t>.</w:t>
+      </w:r>
+    </w:p>
+    <w:p>
+      <w:pPr>
+        <w:rPr>
+          <w:sz w:val="44"/>
+          <w:szCs w:val="44"/>
+          <w:lang w:bidi="fa-IR"/>
+        </w:rPr>
+      </w:pPr>
+      <w:r>
+        <w:rPr>
+          <w:sz w:val="44"/>
+          <w:szCs w:val="44"/>
+          <w:lang w:bidi="fa-IR"/>
+        </w:rPr>
+        <w:t>This shows that convergence depends not only on the sequence itself, but also on the space in which the sequence is considered.</w:t>
+      </w:r>
+    </w:p>
+    <w:p>
+      <w:pPr>
+        <w:rPr>
+          <w:sz w:val="44"/>
+          <w:szCs w:val="44"/>
+          <w:lang w:bidi="fa-IR"/>
+        </w:rPr>
+      </w:pPr>
+      <w:r>
+        <w:rPr>
+          <w:sz w:val="44"/>
+          <w:szCs w:val="44"/>
+          <w:lang w:bidi="fa-IR"/>
+        </w:rPr>
+        <w:t xml:space="preserve">3 : </w:t>
+      </w:r>
+    </w:p>
+    <w:p>
+      <w:pPr>
+        <w:rPr>
+          <w:sz w:val="44"/>
+          <w:szCs w:val="44"/>
+          <w:lang w:bidi="fa-IR"/>
+        </w:rPr>
+      </w:pPr>
+      <w:r>
+        <w:rPr>
+          <w:sz w:val="44"/>
+          <w:szCs w:val="44"/>
+          <w:lang w:bidi="fa-IR"/>
+        </w:rPr>
+        <w:t>Based on what we've seen so far, a natural question arises:</w:t>
+      </w:r>
+      <w:r>
+        <w:rPr>
+          <w:sz w:val="44"/>
+          <w:szCs w:val="44"/>
+          <w:lang w:bidi="fa-IR"/>
+        </w:rPr>
+        <w:t xml:space="preserve"> </w:t>
+      </w:r>
+      <w:r>
+        <w:rPr>
+          <w:sz w:val="44"/>
+          <w:szCs w:val="44"/>
+          <w:lang w:bidi="fa-IR"/>
+        </w:rPr>
+        <w:t>How can we define a metric-independent notion of convergence</w:t>
+      </w:r>
+      <w:r>
+        <w:rPr>
+          <w:sz w:val="44"/>
+          <w:szCs w:val="44"/>
+          <w:lang w:bidi="fa-IR"/>
+        </w:rPr>
+        <w:t>?</w:t>
       </w:r>
     </w:p>
     <w:p>

</xml_diff>

<commit_message>
step 92 : finish part 3
</commit_message>
<xml_diff>
--- a/video context/video_context_newVersion.docx
+++ b/video context/video_context_newVersion.docx
@@ -518,11 +518,19 @@
           <w:lang w:bidi="fa-IR"/>
         </w:rPr>
       </w:pPr>
-      <w:r>
-        <w:rPr>
-          <w:lang w:bidi="fa-IR"/>
-        </w:rPr>
-        <w:t>So we need a different way to measure distance.</w:t>
+      <w:proofErr w:type="gramStart"/>
+      <w:r>
+        <w:rPr>
+          <w:lang w:bidi="fa-IR"/>
+        </w:rPr>
+        <w:t>So</w:t>
+      </w:r>
+      <w:proofErr w:type="gramEnd"/>
+      <w:r>
+        <w:rPr>
+          <w:lang w:bidi="fa-IR"/>
+        </w:rPr>
+        <w:t xml:space="preserve"> we need a different way to measure distance.</w:t>
       </w:r>
     </w:p>
     <w:p>
@@ -894,12 +902,20 @@
           <w:lang w:bidi="fa-IR"/>
         </w:rPr>
       </w:pPr>
+      <w:proofErr w:type="gramStart"/>
       <w:r>
         <w:rPr>
           <w:lang w:bidi="fa-IR"/>
         </w:rPr>
         <w:lastRenderedPageBreak/>
-        <w:t xml:space="preserve">8 : </w:t>
+        <w:t>8 :</w:t>
+      </w:r>
+      <w:proofErr w:type="gramEnd"/>
+      <w:r>
+        <w:rPr>
+          <w:lang w:bidi="fa-IR"/>
+        </w:rPr>
+        <w:t xml:space="preserve"> </w:t>
       </w:r>
     </w:p>
     <w:p>
@@ -1027,12 +1043,14 @@
           <w:lang w:bidi="fa-IR"/>
         </w:rPr>
       </w:pPr>
+      <w:proofErr w:type="gramStart"/>
       <w:r>
         <w:rPr>
           <w:lang w:bidi="fa-IR"/>
         </w:rPr>
         <w:t>9 :</w:t>
       </w:r>
+      <w:proofErr w:type="gramEnd"/>
     </w:p>
     <w:p>
       <w:pPr>
@@ -1438,17 +1456,33 @@
           <w:lang w:bidi="fa-IR"/>
         </w:rPr>
       </w:pPr>
-      <w:r>
-        <w:rPr>
-          <w:lang w:bidi="fa-IR"/>
-        </w:rPr>
-        <w:t xml:space="preserve">So , </w:t>
-      </w:r>
-      <w:r>
-        <w:rPr>
-          <w:lang w:bidi="fa-IR"/>
-        </w:rPr>
-        <w:t>Let's quickly recap.</w:t>
+      <w:proofErr w:type="gramStart"/>
+      <w:r>
+        <w:rPr>
+          <w:lang w:bidi="fa-IR"/>
+        </w:rPr>
+        <w:t>So ,</w:t>
+      </w:r>
+      <w:proofErr w:type="gramEnd"/>
+      <w:r>
+        <w:rPr>
+          <w:lang w:bidi="fa-IR"/>
+        </w:rPr>
+        <w:t xml:space="preserve"> </w:t>
+      </w:r>
+      <w:proofErr w:type="gramStart"/>
+      <w:r>
+        <w:rPr>
+          <w:lang w:bidi="fa-IR"/>
+        </w:rPr>
+        <w:t>Let's</w:t>
+      </w:r>
+      <w:proofErr w:type="gramEnd"/>
+      <w:r>
+        <w:rPr>
+          <w:lang w:bidi="fa-IR"/>
+        </w:rPr>
+        <w:t xml:space="preserve"> quickly recap.</w:t>
       </w:r>
     </w:p>
     <w:p>
@@ -1661,13 +1695,23 @@
           <w:lang w:bidi="fa-IR"/>
         </w:rPr>
       </w:pPr>
-      <w:r>
-        <w:rPr>
-          <w:b/>
-          <w:bCs/>
-          <w:lang w:bidi="fa-IR"/>
-        </w:rPr>
-        <w:t xml:space="preserve">10 : </w:t>
+      <w:proofErr w:type="gramStart"/>
+      <w:r>
+        <w:rPr>
+          <w:b/>
+          <w:bCs/>
+          <w:lang w:bidi="fa-IR"/>
+        </w:rPr>
+        <w:t>10 :</w:t>
+      </w:r>
+      <w:proofErr w:type="gramEnd"/>
+      <w:r>
+        <w:rPr>
+          <w:b/>
+          <w:bCs/>
+          <w:lang w:bidi="fa-IR"/>
+        </w:rPr>
+        <w:t xml:space="preserve"> </w:t>
       </w:r>
     </w:p>
     <w:p>
@@ -1763,11 +1807,19 @@
           <w:lang w:bidi="fa-IR"/>
         </w:rPr>
       </w:pPr>
-      <w:r>
-        <w:rPr>
-          <w:lang w:bidi="fa-IR"/>
-        </w:rPr>
-        <w:t xml:space="preserve">1 : </w:t>
+      <w:proofErr w:type="gramStart"/>
+      <w:r>
+        <w:rPr>
+          <w:lang w:bidi="fa-IR"/>
+        </w:rPr>
+        <w:t>1 :</w:t>
+      </w:r>
+      <w:proofErr w:type="gramEnd"/>
+      <w:r>
+        <w:rPr>
+          <w:lang w:bidi="fa-IR"/>
+        </w:rPr>
+        <w:t xml:space="preserve"> </w:t>
       </w:r>
     </w:p>
     <w:p>
@@ -1779,13 +1831,23 @@
           <w:lang w:bidi="fa-IR"/>
         </w:rPr>
       </w:pPr>
-      <w:r>
-        <w:rPr>
-          <w:b/>
-          <w:bCs/>
-          <w:lang w:bidi="fa-IR"/>
-        </w:rPr>
-        <w:t>Hellooo, and welcome back!</w:t>
+      <w:proofErr w:type="spellStart"/>
+      <w:r>
+        <w:rPr>
+          <w:b/>
+          <w:bCs/>
+          <w:lang w:bidi="fa-IR"/>
+        </w:rPr>
+        <w:t>Hellooo</w:t>
+      </w:r>
+      <w:proofErr w:type="spellEnd"/>
+      <w:r>
+        <w:rPr>
+          <w:b/>
+          <w:bCs/>
+          <w:lang w:bidi="fa-IR"/>
+        </w:rPr>
+        <w:t>, and welcome back!</w:t>
       </w:r>
       <w:r>
         <w:rPr>
@@ -2009,11 +2071,19 @@
           <w:lang w:bidi="fa-IR"/>
         </w:rPr>
       </w:pPr>
-      <w:r>
-        <w:rPr>
-          <w:lang w:bidi="fa-IR"/>
-        </w:rPr>
-        <w:t xml:space="preserve">3 : </w:t>
+      <w:proofErr w:type="gramStart"/>
+      <w:r>
+        <w:rPr>
+          <w:lang w:bidi="fa-IR"/>
+        </w:rPr>
+        <w:t>3 :</w:t>
+      </w:r>
+      <w:proofErr w:type="gramEnd"/>
+      <w:r>
+        <w:rPr>
+          <w:lang w:bidi="fa-IR"/>
+        </w:rPr>
+        <w:t xml:space="preserve"> </w:t>
       </w:r>
     </w:p>
     <w:p>
@@ -2103,24 +2173,46 @@
           <w:lang w:bidi="fa-IR"/>
         </w:rPr>
       </w:pPr>
-      <w:r>
-        <w:rPr>
-          <w:lang w:bidi="fa-IR"/>
-        </w:rPr>
-        <w:t xml:space="preserve">4 : </w:t>
-      </w:r>
-    </w:p>
-    <w:p>
-      <w:pPr>
-        <w:rPr>
-          <w:lang w:bidi="fa-IR"/>
-        </w:rPr>
-      </w:pPr>
-      <w:r>
-        <w:rPr>
-          <w:lang w:bidi="fa-IR"/>
-        </w:rPr>
-        <w:t>Next, we show that the distance from x to y is equal to the distance from y to x.</w:t>
+      <w:proofErr w:type="gramStart"/>
+      <w:r>
+        <w:rPr>
+          <w:lang w:bidi="fa-IR"/>
+        </w:rPr>
+        <w:t>4 :</w:t>
+      </w:r>
+      <w:proofErr w:type="gramEnd"/>
+      <w:r>
+        <w:rPr>
+          <w:lang w:bidi="fa-IR"/>
+        </w:rPr>
+        <w:t xml:space="preserve"> </w:t>
+      </w:r>
+    </w:p>
+    <w:p>
+      <w:pPr>
+        <w:rPr>
+          <w:lang w:bidi="fa-IR"/>
+        </w:rPr>
+      </w:pPr>
+      <w:r>
+        <w:rPr>
+          <w:lang w:bidi="fa-IR"/>
+        </w:rPr>
+        <w:t xml:space="preserve">Next, we show that the distance from x </w:t>
+      </w:r>
+      <w:proofErr w:type="spellStart"/>
+      <w:r>
+        <w:rPr>
+          <w:lang w:bidi="fa-IR"/>
+        </w:rPr>
+        <w:t>to y</w:t>
+      </w:r>
+      <w:proofErr w:type="spellEnd"/>
+      <w:r>
+        <w:rPr>
+          <w:lang w:bidi="fa-IR"/>
+        </w:rPr>
+        <w:t xml:space="preserve"> is equal to the distance from y to x.</w:t>
       </w:r>
     </w:p>
     <w:p>
@@ -2146,8 +2238,16 @@
         <w:rPr>
           <w:lang w:bidi="fa-IR"/>
         </w:rPr>
-        <w:t>To gain some geometric intuition, consider two points, x and y, in the two-dimensional plane. We first represent the distance from x to y</w:t>
-      </w:r>
+        <w:t xml:space="preserve">To gain some geometric intuition, consider two points, x and y, in the two-dimensional plane. We first represent the distance from x </w:t>
+      </w:r>
+      <w:proofErr w:type="spellStart"/>
+      <w:r>
+        <w:rPr>
+          <w:lang w:bidi="fa-IR"/>
+        </w:rPr>
+        <w:t>to y</w:t>
+      </w:r>
+      <w:proofErr w:type="spellEnd"/>
       <w:r>
         <w:rPr>
           <w:lang w:bidi="fa-IR"/>
@@ -2199,11 +2299,19 @@
           <w:lang w:bidi="fa-IR"/>
         </w:rPr>
       </w:pPr>
-      <w:r>
-        <w:rPr>
-          <w:lang w:bidi="fa-IR"/>
-        </w:rPr>
-        <w:t xml:space="preserve">5 : </w:t>
+      <w:proofErr w:type="gramStart"/>
+      <w:r>
+        <w:rPr>
+          <w:lang w:bidi="fa-IR"/>
+        </w:rPr>
+        <w:t>5 :</w:t>
+      </w:r>
+      <w:proofErr w:type="gramEnd"/>
+      <w:r>
+        <w:rPr>
+          <w:lang w:bidi="fa-IR"/>
+        </w:rPr>
+        <w:t xml:space="preserve"> </w:t>
       </w:r>
     </w:p>
     <w:p>
@@ -2270,11 +2378,19 @@
           <w:lang w:bidi="fa-IR"/>
         </w:rPr>
       </w:pPr>
-      <w:r>
-        <w:rPr>
-          <w:lang w:bidi="fa-IR"/>
-        </w:rPr>
-        <w:t xml:space="preserve">6 : </w:t>
+      <w:proofErr w:type="gramStart"/>
+      <w:r>
+        <w:rPr>
+          <w:lang w:bidi="fa-IR"/>
+        </w:rPr>
+        <w:t>6 :</w:t>
+      </w:r>
+      <w:proofErr w:type="gramEnd"/>
+      <w:r>
+        <w:rPr>
+          <w:lang w:bidi="fa-IR"/>
+        </w:rPr>
+        <w:t xml:space="preserve"> </w:t>
       </w:r>
     </w:p>
     <w:p>
@@ -2429,12 +2545,14 @@
           <w:lang w:bidi="fa-IR"/>
         </w:rPr>
       </w:pPr>
+      <w:proofErr w:type="gramStart"/>
       <w:r>
         <w:rPr>
           <w:lang w:bidi="fa-IR"/>
         </w:rPr>
         <w:t>7 :</w:t>
       </w:r>
+      <w:proofErr w:type="gramEnd"/>
     </w:p>
     <w:p>
       <w:pPr>
@@ -2473,7 +2591,6 @@
     <w:p>
       <w:pPr>
         <w:rPr>
-          <w:rFonts w:hint="cs"/>
           <w:sz w:val="44"/>
           <w:szCs w:val="44"/>
           <w:rtl/>
@@ -2526,11 +2643,19 @@
           <w:lang w:bidi="fa-IR"/>
         </w:rPr>
       </w:pPr>
-      <w:r>
-        <w:rPr>
-          <w:lang w:bidi="fa-IR"/>
-        </w:rPr>
-        <w:t xml:space="preserve">1 : </w:t>
+      <w:proofErr w:type="gramStart"/>
+      <w:r>
+        <w:rPr>
+          <w:lang w:bidi="fa-IR"/>
+        </w:rPr>
+        <w:t>1 :</w:t>
+      </w:r>
+      <w:proofErr w:type="gramEnd"/>
+      <w:r>
+        <w:rPr>
+          <w:lang w:bidi="fa-IR"/>
+        </w:rPr>
+        <w:t xml:space="preserve"> </w:t>
       </w:r>
     </w:p>
     <w:p>
@@ -2553,7 +2678,6 @@
     <w:p>
       <w:pPr>
         <w:rPr>
-          <w:rFonts w:hint="cs"/>
           <w:sz w:val="44"/>
           <w:szCs w:val="44"/>
           <w:rtl/>
@@ -2646,37 +2770,75 @@
           <w:lang w:bidi="fa-IR"/>
         </w:rPr>
       </w:pPr>
-      <w:r>
-        <w:rPr>
-          <w:lang w:bidi="fa-IR"/>
-        </w:rPr>
-        <w:t xml:space="preserve">2 : </w:t>
-      </w:r>
-    </w:p>
-    <w:p>
-      <w:pPr>
-        <w:rPr>
-          <w:sz w:val="44"/>
-          <w:szCs w:val="44"/>
-          <w:lang w:bidi="fa-IR"/>
-        </w:rPr>
-      </w:pPr>
-      <w:r>
-        <w:rPr>
-          <w:sz w:val="44"/>
-          <w:szCs w:val="44"/>
-          <w:lang w:bidi="fa-IR"/>
-        </w:rPr>
-        <w:t>To begin, let (X,d) be a metric space, and let y_n</w:t>
-      </w:r>
-      <w:r>
-        <w:rPr>
-          <w:sz w:val="44"/>
-          <w:szCs w:val="44"/>
+      <w:proofErr w:type="gramStart"/>
+      <w:r>
+        <w:rPr>
+          <w:lang w:bidi="fa-IR"/>
+        </w:rPr>
+        <w:t>2 :</w:t>
+      </w:r>
+      <w:proofErr w:type="gramEnd"/>
+      <w:r>
+        <w:rPr>
           <w:lang w:bidi="fa-IR"/>
         </w:rPr>
         <w:t xml:space="preserve"> </w:t>
       </w:r>
+    </w:p>
+    <w:p>
+      <w:pPr>
+        <w:rPr>
+          <w:sz w:val="44"/>
+          <w:szCs w:val="44"/>
+          <w:lang w:bidi="fa-IR"/>
+        </w:rPr>
+      </w:pPr>
+      <w:r>
+        <w:rPr>
+          <w:sz w:val="44"/>
+          <w:szCs w:val="44"/>
+          <w:lang w:bidi="fa-IR"/>
+        </w:rPr>
+        <w:t>To begin, let (</w:t>
+      </w:r>
+      <w:proofErr w:type="spellStart"/>
+      <w:proofErr w:type="gramStart"/>
+      <w:r>
+        <w:rPr>
+          <w:sz w:val="44"/>
+          <w:szCs w:val="44"/>
+          <w:lang w:bidi="fa-IR"/>
+        </w:rPr>
+        <w:t>X,d</w:t>
+      </w:r>
+      <w:proofErr w:type="spellEnd"/>
+      <w:proofErr w:type="gramEnd"/>
+      <w:r>
+        <w:rPr>
+          <w:sz w:val="44"/>
+          <w:szCs w:val="44"/>
+          <w:lang w:bidi="fa-IR"/>
+        </w:rPr>
+        <w:t xml:space="preserve">) be a metric space, and let </w:t>
+      </w:r>
+      <w:proofErr w:type="spellStart"/>
+      <w:r>
+        <w:rPr>
+          <w:sz w:val="44"/>
+          <w:szCs w:val="44"/>
+          <w:lang w:bidi="fa-IR"/>
+        </w:rPr>
+        <w:t>y_n</w:t>
+      </w:r>
+      <w:proofErr w:type="spellEnd"/>
+      <w:r>
+        <w:rPr>
+          <w:sz w:val="44"/>
+          <w:szCs w:val="44"/>
+          <w:lang w:bidi="fa-IR"/>
+        </w:rPr>
+        <w:t xml:space="preserve"> </w:t>
+      </w:r>
       <w:r>
         <w:rPr>
           <w:sz w:val="44"/>
@@ -2700,8 +2862,18 @@
           <w:szCs w:val="44"/>
           <w:lang w:bidi="fa-IR"/>
         </w:rPr>
-        <w:t>We say that the sequence y_n</w:t>
-      </w:r>
+        <w:t xml:space="preserve">We say that the sequence </w:t>
+      </w:r>
+      <w:proofErr w:type="spellStart"/>
+      <w:r>
+        <w:rPr>
+          <w:sz w:val="44"/>
+          <w:szCs w:val="44"/>
+          <w:lang w:bidi="fa-IR"/>
+        </w:rPr>
+        <w:t>y_n</w:t>
+      </w:r>
+      <w:proofErr w:type="spellEnd"/>
       <w:r>
         <w:rPr>
           <w:sz w:val="44"/>
@@ -2749,15 +2921,7 @@
           <w:szCs w:val="44"/>
           <w:lang w:bidi="fa-IR"/>
         </w:rPr>
-        <w:t xml:space="preserve"> </w:t>
-      </w:r>
-      <w:r>
-        <w:rPr>
-          <w:sz w:val="44"/>
-          <w:szCs w:val="44"/>
-          <w:lang w:bidi="fa-IR"/>
-        </w:rPr>
-        <w:t>X such that the terms of the sequence get closer and closer to y.</w:t>
+        <w:t xml:space="preserve"> X such that the terms of the sequence get closer and closer to y.</w:t>
       </w:r>
     </w:p>
     <w:p>
@@ -2846,6 +3010,7 @@
         <w:lastRenderedPageBreak/>
         <w:t xml:space="preserve">In this case, something interesting happens. The very same sequence </w:t>
       </w:r>
+      <w:proofErr w:type="spellStart"/>
       <w:r>
         <w:rPr>
           <w:sz w:val="44"/>
@@ -2854,6 +3019,7 @@
         </w:rPr>
         <w:t>y_n</w:t>
       </w:r>
+      <w:proofErr w:type="spellEnd"/>
       <w:r>
         <w:rPr>
           <w:sz w:val="44"/>
@@ -2878,7 +3044,16 @@
           <w:szCs w:val="44"/>
           <w:lang w:bidi="fa-IR"/>
         </w:rPr>
-        <w:t>, because its limit does not belong to Y</w:t>
+        <w:t xml:space="preserve">, because its limit does not belong to </w:t>
+      </w:r>
+      <w:proofErr w:type="gramStart"/>
+      <w:r>
+        <w:rPr>
+          <w:sz w:val="44"/>
+          <w:szCs w:val="44"/>
+          <w:lang w:bidi="fa-IR"/>
+        </w:rPr>
+        <w:t>Y</w:t>
       </w:r>
       <w:r>
         <w:rPr>
@@ -2896,6 +3071,7 @@
         </w:rPr>
         <w:t>.</w:t>
       </w:r>
+      <w:proofErr w:type="gramEnd"/>
     </w:p>
     <w:p>
       <w:pPr>
@@ -2922,13 +3098,23 @@
           <w:lang w:bidi="fa-IR"/>
         </w:rPr>
       </w:pPr>
-      <w:r>
-        <w:rPr>
-          <w:sz w:val="44"/>
-          <w:szCs w:val="44"/>
-          <w:lang w:bidi="fa-IR"/>
-        </w:rPr>
-        <w:t xml:space="preserve">3 : </w:t>
+      <w:proofErr w:type="gramStart"/>
+      <w:r>
+        <w:rPr>
+          <w:sz w:val="44"/>
+          <w:szCs w:val="44"/>
+          <w:lang w:bidi="fa-IR"/>
+        </w:rPr>
+        <w:t>3 :</w:t>
+      </w:r>
+      <w:proofErr w:type="gramEnd"/>
+      <w:r>
+        <w:rPr>
+          <w:sz w:val="44"/>
+          <w:szCs w:val="44"/>
+          <w:lang w:bidi="fa-IR"/>
+        </w:rPr>
+        <w:t xml:space="preserve"> </w:t>
       </w:r>
     </w:p>
     <w:p>
@@ -2970,6 +3156,1256 @@
           <w:lang w:bidi="fa-IR"/>
         </w:rPr>
         <w:t>?</w:t>
+      </w:r>
+    </w:p>
+    <w:p>
+      <w:pPr>
+        <w:rPr>
+          <w:lang w:bidi="fa-IR"/>
+        </w:rPr>
+      </w:pPr>
+      <w:proofErr w:type="gramStart"/>
+      <w:r>
+        <w:rPr>
+          <w:lang w:bidi="fa-IR"/>
+        </w:rPr>
+        <w:t>4 :</w:t>
+      </w:r>
+      <w:proofErr w:type="gramEnd"/>
+      <w:r>
+        <w:rPr>
+          <w:lang w:bidi="fa-IR"/>
+        </w:rPr>
+        <w:t xml:space="preserve"> </w:t>
+      </w:r>
+    </w:p>
+    <w:p>
+      <w:pPr>
+        <w:rPr>
+          <w:rFonts w:hint="cs"/>
+          <w:sz w:val="44"/>
+          <w:szCs w:val="44"/>
+          <w:rtl/>
+          <w:lang w:bidi="fa-IR"/>
+        </w:rPr>
+      </w:pPr>
+      <w:r>
+        <w:rPr>
+          <w:sz w:val="44"/>
+          <w:szCs w:val="44"/>
+          <w:lang w:bidi="fa-IR"/>
+        </w:rPr>
+        <w:t xml:space="preserve">To answer this question, we introduce the concept of </w:t>
+      </w:r>
+      <w:r>
+        <w:rPr>
+          <w:b/>
+          <w:bCs/>
+          <w:sz w:val="44"/>
+          <w:szCs w:val="44"/>
+          <w:lang w:bidi="fa-IR"/>
+        </w:rPr>
+        <w:t>Cauchy sequences</w:t>
+      </w:r>
+      <w:r>
+        <w:rPr>
+          <w:sz w:val="44"/>
+          <w:szCs w:val="44"/>
+          <w:lang w:bidi="fa-IR"/>
+        </w:rPr>
+        <w:t>.</w:t>
+      </w:r>
+    </w:p>
+    <w:p>
+      <w:pPr>
+        <w:rPr>
+          <w:sz w:val="44"/>
+          <w:szCs w:val="44"/>
+          <w:lang w:bidi="fa-IR"/>
+        </w:rPr>
+      </w:pPr>
+      <w:r>
+        <w:rPr>
+          <w:sz w:val="44"/>
+          <w:szCs w:val="44"/>
+          <w:lang w:bidi="fa-IR"/>
+        </w:rPr>
+        <w:t xml:space="preserve">Informally, a sequence is called </w:t>
+      </w:r>
+      <w:r>
+        <w:rPr>
+          <w:b/>
+          <w:bCs/>
+          <w:sz w:val="44"/>
+          <w:szCs w:val="44"/>
+          <w:lang w:bidi="fa-IR"/>
+        </w:rPr>
+        <w:t>Cauchy</w:t>
+      </w:r>
+      <w:r>
+        <w:rPr>
+          <w:sz w:val="44"/>
+          <w:szCs w:val="44"/>
+          <w:lang w:bidi="fa-IR"/>
+        </w:rPr>
+        <w:t xml:space="preserve"> if, as we move further along the sequence, its terms become arbitrarily close to one another. In other words, no matter how small a distance we choose, there is a point in the sequence after which every pair of terms is closer than that distance.</w:t>
+      </w:r>
+    </w:p>
+    <w:p>
+      <w:pPr>
+        <w:rPr>
+          <w:sz w:val="44"/>
+          <w:szCs w:val="44"/>
+          <w:lang w:bidi="fa-IR"/>
+        </w:rPr>
+      </w:pPr>
+      <w:r>
+        <w:rPr>
+          <w:sz w:val="44"/>
+          <w:szCs w:val="44"/>
+          <w:lang w:bidi="fa-IR"/>
+        </w:rPr>
+        <w:lastRenderedPageBreak/>
+        <w:t>Formally, a sequence ({</w:t>
+      </w:r>
+      <w:proofErr w:type="spellStart"/>
+      <w:r>
+        <w:rPr>
+          <w:sz w:val="44"/>
+          <w:szCs w:val="44"/>
+          <w:lang w:bidi="fa-IR"/>
+        </w:rPr>
+        <w:t>x_n</w:t>
+      </w:r>
+      <w:proofErr w:type="spellEnd"/>
+      <w:r>
+        <w:rPr>
+          <w:sz w:val="44"/>
+          <w:szCs w:val="44"/>
+          <w:lang w:bidi="fa-IR"/>
+        </w:rPr>
+        <w:t>}) in a metric space ((</w:t>
+      </w:r>
+      <w:proofErr w:type="spellStart"/>
+      <w:proofErr w:type="gramStart"/>
+      <w:r>
+        <w:rPr>
+          <w:sz w:val="44"/>
+          <w:szCs w:val="44"/>
+          <w:lang w:bidi="fa-IR"/>
+        </w:rPr>
+        <w:t>X,d</w:t>
+      </w:r>
+      <w:proofErr w:type="spellEnd"/>
+      <w:proofErr w:type="gramEnd"/>
+      <w:r>
+        <w:rPr>
+          <w:sz w:val="44"/>
+          <w:szCs w:val="44"/>
+          <w:lang w:bidi="fa-IR"/>
+        </w:rPr>
+        <w:t xml:space="preserve">)) is called </w:t>
+      </w:r>
+      <w:r>
+        <w:rPr>
+          <w:b/>
+          <w:bCs/>
+          <w:sz w:val="44"/>
+          <w:szCs w:val="44"/>
+          <w:lang w:bidi="fa-IR"/>
+        </w:rPr>
+        <w:t>Cauchy</w:t>
+      </w:r>
+      <w:r>
+        <w:rPr>
+          <w:sz w:val="44"/>
+          <w:szCs w:val="44"/>
+          <w:lang w:bidi="fa-IR"/>
+        </w:rPr>
+        <w:t xml:space="preserve"> if, for every (\</w:t>
+      </w:r>
+      <w:proofErr w:type="spellStart"/>
+      <w:r>
+        <w:rPr>
+          <w:sz w:val="44"/>
+          <w:szCs w:val="44"/>
+          <w:lang w:bidi="fa-IR"/>
+        </w:rPr>
+        <w:t>varepsilon</w:t>
+      </w:r>
+      <w:proofErr w:type="spellEnd"/>
+      <w:r>
+        <w:rPr>
+          <w:sz w:val="44"/>
+          <w:szCs w:val="44"/>
+          <w:lang w:bidi="fa-IR"/>
+        </w:rPr>
+        <w:t xml:space="preserve"> &gt; 0), there exists an integer (N) such that</w:t>
+      </w:r>
+    </w:p>
+    <w:p>
+      <w:pPr>
+        <w:rPr>
+          <w:sz w:val="44"/>
+          <w:szCs w:val="44"/>
+          <w:lang w:bidi="fa-IR"/>
+        </w:rPr>
+      </w:pPr>
+      <w:r>
+        <w:rPr>
+          <w:sz w:val="44"/>
+          <w:szCs w:val="44"/>
+          <w:lang w:bidi="fa-IR"/>
+        </w:rPr>
+        <w:t>[</w:t>
+      </w:r>
+      <w:r>
+        <w:rPr>
+          <w:sz w:val="44"/>
+          <w:szCs w:val="44"/>
+          <w:lang w:bidi="fa-IR"/>
+        </w:rPr>
+        <w:br/>
+      </w:r>
+      <w:proofErr w:type="gramStart"/>
+      <w:r>
+        <w:rPr>
+          <w:sz w:val="44"/>
+          <w:szCs w:val="44"/>
+          <w:lang w:bidi="fa-IR"/>
+        </w:rPr>
+        <w:t>d(</w:t>
+      </w:r>
+      <w:proofErr w:type="spellStart"/>
+      <w:proofErr w:type="gramEnd"/>
+      <w:r>
+        <w:rPr>
+          <w:sz w:val="44"/>
+          <w:szCs w:val="44"/>
+          <w:lang w:bidi="fa-IR"/>
+        </w:rPr>
+        <w:t>x_m</w:t>
+      </w:r>
+      <w:proofErr w:type="spellEnd"/>
+      <w:r>
+        <w:rPr>
+          <w:sz w:val="44"/>
+          <w:szCs w:val="44"/>
+          <w:lang w:bidi="fa-IR"/>
+        </w:rPr>
+        <w:t xml:space="preserve">, </w:t>
+      </w:r>
+      <w:proofErr w:type="spellStart"/>
+      <w:r>
+        <w:rPr>
+          <w:sz w:val="44"/>
+          <w:szCs w:val="44"/>
+          <w:lang w:bidi="fa-IR"/>
+        </w:rPr>
+        <w:t>x_n</w:t>
+      </w:r>
+      <w:proofErr w:type="spellEnd"/>
+      <w:r>
+        <w:rPr>
+          <w:sz w:val="44"/>
+          <w:szCs w:val="44"/>
+          <w:lang w:bidi="fa-IR"/>
+        </w:rPr>
+        <w:t>) &lt; \</w:t>
+      </w:r>
+      <w:proofErr w:type="spellStart"/>
+      <w:r>
+        <w:rPr>
+          <w:sz w:val="44"/>
+          <w:szCs w:val="44"/>
+          <w:lang w:bidi="fa-IR"/>
+        </w:rPr>
+        <w:t>varepsilon</w:t>
+      </w:r>
+      <w:proofErr w:type="spellEnd"/>
+      <w:r>
+        <w:rPr>
+          <w:sz w:val="44"/>
+          <w:szCs w:val="44"/>
+          <w:lang w:bidi="fa-IR"/>
+        </w:rPr>
+        <w:br/>
+        <w:t>]</w:t>
+      </w:r>
+    </w:p>
+    <w:p>
+      <w:pPr>
+        <w:rPr>
+          <w:sz w:val="44"/>
+          <w:szCs w:val="44"/>
+          <w:lang w:bidi="fa-IR"/>
+        </w:rPr>
+      </w:pPr>
+      <w:r>
+        <w:rPr>
+          <w:sz w:val="44"/>
+          <w:szCs w:val="44"/>
+          <w:lang w:bidi="fa-IR"/>
+        </w:rPr>
+        <w:t>for every (</w:t>
+      </w:r>
+      <w:proofErr w:type="spellStart"/>
+      <w:proofErr w:type="gramStart"/>
+      <w:r>
+        <w:rPr>
+          <w:sz w:val="44"/>
+          <w:szCs w:val="44"/>
+          <w:lang w:bidi="fa-IR"/>
+        </w:rPr>
+        <w:t>m,n</w:t>
+      </w:r>
+      <w:proofErr w:type="spellEnd"/>
+      <w:proofErr w:type="gramEnd"/>
+      <w:r>
+        <w:rPr>
+          <w:sz w:val="44"/>
+          <w:szCs w:val="44"/>
+          <w:lang w:bidi="fa-IR"/>
+        </w:rPr>
+        <w:t xml:space="preserve"> &gt; N).</w:t>
+      </w:r>
+    </w:p>
+    <w:p>
+      <w:pPr>
+        <w:rPr>
+          <w:sz w:val="44"/>
+          <w:szCs w:val="44"/>
+          <w:lang w:bidi="fa-IR"/>
+        </w:rPr>
+      </w:pPr>
+      <w:r>
+        <w:rPr>
+          <w:sz w:val="44"/>
+          <w:szCs w:val="44"/>
+          <w:lang w:bidi="fa-IR"/>
+        </w:rPr>
+        <w:t>Now let's look again at our sequence ({</w:t>
+      </w:r>
+      <w:proofErr w:type="spellStart"/>
+      <w:r>
+        <w:rPr>
+          <w:sz w:val="44"/>
+          <w:szCs w:val="44"/>
+          <w:lang w:bidi="fa-IR"/>
+        </w:rPr>
+        <w:t>y_n</w:t>
+      </w:r>
+      <w:proofErr w:type="spellEnd"/>
+      <w:r>
+        <w:rPr>
+          <w:sz w:val="44"/>
+          <w:szCs w:val="44"/>
+          <w:lang w:bidi="fa-IR"/>
+        </w:rPr>
+        <w:t>}).</w:t>
+      </w:r>
+    </w:p>
+    <w:p>
+      <w:pPr>
+        <w:rPr>
+          <w:sz w:val="44"/>
+          <w:szCs w:val="44"/>
+          <w:lang w:bidi="fa-IR"/>
+        </w:rPr>
+      </w:pPr>
+      <w:r>
+        <w:rPr>
+          <w:sz w:val="44"/>
+          <w:szCs w:val="44"/>
+          <w:lang w:bidi="fa-IR"/>
+        </w:rPr>
+        <w:t xml:space="preserve">Being a Cauchy sequence means that the terms are getting closer and closer </w:t>
+      </w:r>
+      <w:r>
+        <w:rPr>
+          <w:b/>
+          <w:bCs/>
+          <w:sz w:val="44"/>
+          <w:szCs w:val="44"/>
+          <w:lang w:bidi="fa-IR"/>
+        </w:rPr>
+        <w:t>to each other</w:t>
+      </w:r>
+      <w:r>
+        <w:rPr>
+          <w:sz w:val="44"/>
+          <w:szCs w:val="44"/>
+          <w:lang w:bidi="fa-IR"/>
+        </w:rPr>
+        <w:t>, rather than necessarily getting closer to a particular point. As we move further along the sequence, the distance between any two sufficiently late terms becomes as small as we want.</w:t>
+      </w:r>
+    </w:p>
+    <w:p>
+      <w:pPr>
+        <w:rPr>
+          <w:sz w:val="44"/>
+          <w:szCs w:val="44"/>
+          <w:rtl/>
+          <w:lang w:bidi="fa-IR"/>
+        </w:rPr>
+      </w:pPr>
+      <w:r>
+        <w:rPr>
+          <w:sz w:val="44"/>
+          <w:szCs w:val="44"/>
+          <w:lang w:bidi="fa-IR"/>
+        </w:rPr>
+        <w:t xml:space="preserve">This is an important distinction. A Cauchy sequence is defined entirely in terms of the </w:t>
+      </w:r>
+      <w:r>
+        <w:rPr>
+          <w:b/>
+          <w:bCs/>
+          <w:sz w:val="44"/>
+          <w:szCs w:val="44"/>
+          <w:lang w:bidi="fa-IR"/>
+        </w:rPr>
+        <w:t>metric</w:t>
+      </w:r>
+      <w:r>
+        <w:rPr>
+          <w:sz w:val="44"/>
+          <w:szCs w:val="44"/>
+          <w:lang w:bidi="fa-IR"/>
+        </w:rPr>
+        <w:t xml:space="preserve">—it only measures the distances between the terms of the sequence themselves. Unlike convergence, it does </w:t>
+      </w:r>
+      <w:r>
+        <w:rPr>
+          <w:b/>
+          <w:bCs/>
+          <w:sz w:val="44"/>
+          <w:szCs w:val="44"/>
+          <w:lang w:bidi="fa-IR"/>
+        </w:rPr>
+        <w:t>not</w:t>
+      </w:r>
+      <w:r>
+        <w:rPr>
+          <w:sz w:val="44"/>
+          <w:szCs w:val="44"/>
+          <w:lang w:bidi="fa-IR"/>
+        </w:rPr>
+        <w:t xml:space="preserve"> require us to know whether the limit point </w:t>
+      </w:r>
+      <w:r>
+        <w:rPr>
+          <w:sz w:val="44"/>
+          <w:szCs w:val="44"/>
+          <w:lang w:bidi="fa-IR"/>
+        </w:rPr>
+        <w:lastRenderedPageBreak/>
+        <w:t>actually exists in the space. In this sense, the notion of a Cauchy sequence is intrinsic to the metric and independent of the space in which the sequence is considered.</w:t>
+      </w:r>
+    </w:p>
+    <w:p>
+      <w:pPr>
+        <w:rPr>
+          <w:sz w:val="44"/>
+          <w:szCs w:val="44"/>
+          <w:lang w:bidi="fa-IR"/>
+        </w:rPr>
+      </w:pPr>
+      <w:proofErr w:type="gramStart"/>
+      <w:r>
+        <w:rPr>
+          <w:sz w:val="44"/>
+          <w:szCs w:val="44"/>
+          <w:lang w:bidi="fa-IR"/>
+        </w:rPr>
+        <w:t>5 :</w:t>
+      </w:r>
+      <w:proofErr w:type="gramEnd"/>
+      <w:r>
+        <w:rPr>
+          <w:sz w:val="44"/>
+          <w:szCs w:val="44"/>
+          <w:lang w:bidi="fa-IR"/>
+        </w:rPr>
+        <w:t xml:space="preserve"> </w:t>
+      </w:r>
+    </w:p>
+    <w:p>
+      <w:pPr>
+        <w:rPr>
+          <w:sz w:val="44"/>
+          <w:szCs w:val="44"/>
+          <w:lang w:bidi="fa-IR"/>
+        </w:rPr>
+      </w:pPr>
+      <w:r>
+        <w:rPr>
+          <w:sz w:val="44"/>
+          <w:szCs w:val="44"/>
+          <w:lang w:bidi="fa-IR"/>
+        </w:rPr>
+        <w:t xml:space="preserve">Now, let's explore the relationship between </w:t>
+      </w:r>
+      <w:r>
+        <w:rPr>
+          <w:b/>
+          <w:bCs/>
+          <w:sz w:val="44"/>
+          <w:szCs w:val="44"/>
+          <w:lang w:bidi="fa-IR"/>
+        </w:rPr>
+        <w:t>convergence</w:t>
+      </w:r>
+      <w:r>
+        <w:rPr>
+          <w:sz w:val="44"/>
+          <w:szCs w:val="44"/>
+          <w:lang w:bidi="fa-IR"/>
+        </w:rPr>
+        <w:t xml:space="preserve"> and </w:t>
+      </w:r>
+      <w:r>
+        <w:rPr>
+          <w:b/>
+          <w:bCs/>
+          <w:sz w:val="44"/>
+          <w:szCs w:val="44"/>
+          <w:lang w:bidi="fa-IR"/>
+        </w:rPr>
+        <w:t>Cauchy sequences</w:t>
+      </w:r>
+      <w:r>
+        <w:rPr>
+          <w:sz w:val="44"/>
+          <w:szCs w:val="44"/>
+          <w:lang w:bidi="fa-IR"/>
+        </w:rPr>
+        <w:t>.</w:t>
+      </w:r>
+    </w:p>
+    <w:p>
+      <w:pPr>
+        <w:rPr>
+          <w:sz w:val="44"/>
+          <w:szCs w:val="44"/>
+          <w:lang w:bidi="fa-IR"/>
+        </w:rPr>
+      </w:pPr>
+      <w:r>
+        <w:rPr>
+          <w:sz w:val="44"/>
+          <w:szCs w:val="44"/>
+          <w:lang w:bidi="fa-IR"/>
+        </w:rPr>
+        <w:t xml:space="preserve">Based on what we've learned so far, one fact should already be clear: </w:t>
+      </w:r>
+      <w:r>
+        <w:rPr>
+          <w:b/>
+          <w:bCs/>
+          <w:sz w:val="44"/>
+          <w:szCs w:val="44"/>
+          <w:lang w:bidi="fa-IR"/>
+        </w:rPr>
+        <w:t>every convergent sequence is necessarily a Cauchy sequence</w:t>
+      </w:r>
+      <w:r>
+        <w:rPr>
+          <w:sz w:val="44"/>
+          <w:szCs w:val="44"/>
+          <w:lang w:bidi="fa-IR"/>
+        </w:rPr>
+        <w:t>. As the terms approach their limit, they also get closer and closer to one another.</w:t>
+      </w:r>
+    </w:p>
+    <w:p>
+      <w:pPr>
+        <w:rPr>
+          <w:sz w:val="44"/>
+          <w:szCs w:val="44"/>
+          <w:lang w:bidi="fa-IR"/>
+        </w:rPr>
+      </w:pPr>
+      <w:r>
+        <w:rPr>
+          <w:sz w:val="44"/>
+          <w:szCs w:val="44"/>
+          <w:lang w:bidi="fa-IR"/>
+        </w:rPr>
+        <w:t>But what about the converse?</w:t>
+      </w:r>
+    </w:p>
+    <w:p>
+      <w:pPr>
+        <w:rPr>
+          <w:sz w:val="44"/>
+          <w:szCs w:val="44"/>
+          <w:lang w:bidi="fa-IR"/>
+        </w:rPr>
+      </w:pPr>
+      <w:r>
+        <w:rPr>
+          <w:sz w:val="44"/>
+          <w:szCs w:val="44"/>
+          <w:lang w:bidi="fa-IR"/>
+        </w:rPr>
+        <w:t>Is every Cauchy sequence convergent?</w:t>
+      </w:r>
+    </w:p>
+    <w:p>
+      <w:pPr>
+        <w:rPr>
+          <w:rFonts w:hint="cs"/>
+          <w:sz w:val="44"/>
+          <w:szCs w:val="44"/>
+          <w:rtl/>
+          <w:lang w:bidi="fa-IR"/>
+        </w:rPr>
+      </w:pPr>
+      <w:r>
+        <w:rPr>
+          <w:sz w:val="44"/>
+          <w:szCs w:val="44"/>
+          <w:lang w:bidi="fa-IR"/>
+        </w:rPr>
+        <w:t xml:space="preserve">The answer is </w:t>
+      </w:r>
+      <w:r>
+        <w:rPr>
+          <w:b/>
+          <w:bCs/>
+          <w:sz w:val="44"/>
+          <w:szCs w:val="44"/>
+          <w:lang w:bidi="fa-IR"/>
+        </w:rPr>
+        <w:t>no</w:t>
+      </w:r>
+      <w:r>
+        <w:rPr>
+          <w:sz w:val="44"/>
+          <w:szCs w:val="44"/>
+          <w:lang w:bidi="fa-IR"/>
+        </w:rPr>
+        <w:t>—not necessarily.</w:t>
+      </w:r>
+    </w:p>
+    <w:p>
+      <w:pPr>
+        <w:rPr>
+          <w:sz w:val="44"/>
+          <w:szCs w:val="44"/>
+          <w:lang w:bidi="fa-IR"/>
+        </w:rPr>
+      </w:pPr>
+      <w:r>
+        <w:rPr>
+          <w:sz w:val="44"/>
+          <w:szCs w:val="44"/>
+          <w:lang w:bidi="fa-IR"/>
+        </w:rPr>
+        <w:t xml:space="preserve">Whether a Cauchy sequence converges depends on the space in which it is defined. More specifically, it depends on whether the limit of the sequence actually exists </w:t>
+      </w:r>
+      <w:r>
+        <w:rPr>
+          <w:b/>
+          <w:bCs/>
+          <w:sz w:val="44"/>
+          <w:szCs w:val="44"/>
+          <w:lang w:bidi="fa-IR"/>
+        </w:rPr>
+        <w:t>within that space</w:t>
+      </w:r>
+      <w:r>
+        <w:rPr>
+          <w:sz w:val="44"/>
+          <w:szCs w:val="44"/>
+          <w:lang w:bidi="fa-IR"/>
+        </w:rPr>
+        <w:t>.</w:t>
+      </w:r>
+    </w:p>
+    <w:p>
+      <w:pPr>
+        <w:rPr>
+          <w:sz w:val="44"/>
+          <w:szCs w:val="44"/>
+          <w:lang w:bidi="fa-IR"/>
+        </w:rPr>
+      </w:pPr>
+      <w:r>
+        <w:rPr>
+          <w:sz w:val="44"/>
+          <w:szCs w:val="44"/>
+          <w:lang w:bidi="fa-IR"/>
+        </w:rPr>
+        <w:lastRenderedPageBreak/>
+        <w:t>To see why, let's look at a counterexample.</w:t>
+      </w:r>
+    </w:p>
+    <w:p>
+      <w:pPr>
+        <w:rPr>
+          <w:sz w:val="44"/>
+          <w:szCs w:val="44"/>
+          <w:lang w:bidi="fa-IR"/>
+        </w:rPr>
+      </w:pPr>
+      <w:r>
+        <w:rPr>
+          <w:sz w:val="44"/>
+          <w:szCs w:val="44"/>
+          <w:lang w:bidi="fa-IR"/>
+        </w:rPr>
+        <w:t xml:space="preserve">Consider the following sequence. It is a Cauchy sequence because its terms become arbitrarily close to one another. However, its limit does not belong to the space we are working in. Therefore, although the sequence is Cauchy, </w:t>
+      </w:r>
+      <w:r>
+        <w:rPr>
+          <w:b/>
+          <w:bCs/>
+          <w:sz w:val="44"/>
+          <w:szCs w:val="44"/>
+          <w:lang w:bidi="fa-IR"/>
+        </w:rPr>
+        <w:t>it is not convergent in this space</w:t>
+      </w:r>
+      <w:r>
+        <w:rPr>
+          <w:sz w:val="44"/>
+          <w:szCs w:val="44"/>
+          <w:lang w:bidi="fa-IR"/>
+        </w:rPr>
+        <w:t>.</w:t>
+      </w:r>
+    </w:p>
+    <w:p>
+      <w:pPr>
+        <w:rPr>
+          <w:rFonts w:hint="cs"/>
+          <w:sz w:val="44"/>
+          <w:szCs w:val="44"/>
+          <w:rtl/>
+          <w:lang w:bidi="fa-IR"/>
+        </w:rPr>
+      </w:pPr>
+      <w:proofErr w:type="gramStart"/>
+      <w:r>
+        <w:rPr>
+          <w:sz w:val="44"/>
+          <w:szCs w:val="44"/>
+          <w:lang w:bidi="fa-IR"/>
+        </w:rPr>
+        <w:t>6 :</w:t>
+      </w:r>
+      <w:proofErr w:type="gramEnd"/>
+      <w:r>
+        <w:rPr>
+          <w:sz w:val="44"/>
+          <w:szCs w:val="44"/>
+          <w:lang w:bidi="fa-IR"/>
+        </w:rPr>
+        <w:t xml:space="preserve"> </w:t>
+      </w:r>
+    </w:p>
+    <w:p>
+      <w:pPr>
+        <w:rPr>
+          <w:sz w:val="44"/>
+          <w:szCs w:val="44"/>
+          <w:lang w:bidi="fa-IR"/>
+        </w:rPr>
+      </w:pPr>
+      <w:r>
+        <w:rPr>
+          <w:sz w:val="44"/>
+          <w:szCs w:val="44"/>
+          <w:lang w:bidi="fa-IR"/>
+        </w:rPr>
+        <w:t>Based on everything we've discussed so far, a natural question comes to mind.</w:t>
+      </w:r>
+    </w:p>
+    <w:p>
+      <w:pPr>
+        <w:rPr>
+          <w:sz w:val="44"/>
+          <w:szCs w:val="44"/>
+          <w:lang w:bidi="fa-IR"/>
+        </w:rPr>
+      </w:pPr>
+      <w:r>
+        <w:rPr>
+          <w:sz w:val="44"/>
+          <w:szCs w:val="44"/>
+          <w:lang w:bidi="fa-IR"/>
+        </w:rPr>
+        <w:t xml:space="preserve">Can we construct a metric space in which </w:t>
+      </w:r>
+      <w:r>
+        <w:rPr>
+          <w:b/>
+          <w:bCs/>
+          <w:sz w:val="44"/>
+          <w:szCs w:val="44"/>
+          <w:lang w:bidi="fa-IR"/>
+        </w:rPr>
+        <w:t>being Cauchy and being convergent are equivalent</w:t>
+      </w:r>
+      <w:r>
+        <w:rPr>
+          <w:sz w:val="44"/>
+          <w:szCs w:val="44"/>
+          <w:lang w:bidi="fa-IR"/>
+        </w:rPr>
+        <w:t xml:space="preserve">? In other words, a space where </w:t>
+      </w:r>
+      <w:r>
+        <w:rPr>
+          <w:b/>
+          <w:bCs/>
+          <w:sz w:val="44"/>
+          <w:szCs w:val="44"/>
+          <w:lang w:bidi="fa-IR"/>
+        </w:rPr>
+        <w:t>every Cauchy sequence actually converges</w:t>
+      </w:r>
+      <w:r>
+        <w:rPr>
+          <w:sz w:val="44"/>
+          <w:szCs w:val="44"/>
+          <w:lang w:bidi="fa-IR"/>
+        </w:rPr>
+        <w:t>.</w:t>
+      </w:r>
+    </w:p>
+    <w:p>
+      <w:pPr>
+        <w:rPr>
+          <w:sz w:val="44"/>
+          <w:szCs w:val="44"/>
+          <w:lang w:bidi="fa-IR"/>
+        </w:rPr>
+      </w:pPr>
+      <w:r>
+        <w:rPr>
+          <w:sz w:val="44"/>
+          <w:szCs w:val="44"/>
+          <w:lang w:bidi="fa-IR"/>
+        </w:rPr>
+        <w:t>The answer is yes.</w:t>
+      </w:r>
+    </w:p>
+    <w:p>
+      <w:pPr>
+        <w:rPr>
+          <w:sz w:val="44"/>
+          <w:szCs w:val="44"/>
+          <w:lang w:bidi="fa-IR"/>
+        </w:rPr>
+      </w:pPr>
+      <w:r>
+        <w:rPr>
+          <w:sz w:val="44"/>
+          <w:szCs w:val="44"/>
+          <w:lang w:bidi="fa-IR"/>
+        </w:rPr>
+        <w:t xml:space="preserve">Such a space is called a </w:t>
+      </w:r>
+      <w:r>
+        <w:rPr>
+          <w:b/>
+          <w:bCs/>
+          <w:sz w:val="44"/>
+          <w:szCs w:val="44"/>
+          <w:lang w:bidi="fa-IR"/>
+        </w:rPr>
+        <w:t>complete metric space</w:t>
+      </w:r>
+      <w:r>
+        <w:rPr>
+          <w:sz w:val="44"/>
+          <w:szCs w:val="44"/>
+          <w:lang w:bidi="fa-IR"/>
+        </w:rPr>
+        <w:t xml:space="preserve">. A metric space is said to be </w:t>
+      </w:r>
+      <w:r>
+        <w:rPr>
+          <w:b/>
+          <w:bCs/>
+          <w:sz w:val="44"/>
+          <w:szCs w:val="44"/>
+          <w:lang w:bidi="fa-IR"/>
+        </w:rPr>
+        <w:t>complete</w:t>
+      </w:r>
+      <w:r>
+        <w:rPr>
+          <w:sz w:val="44"/>
+          <w:szCs w:val="44"/>
+          <w:lang w:bidi="fa-IR"/>
+        </w:rPr>
+        <w:t xml:space="preserve"> if every Cauchy sequence converges to a point that already belongs to the space.</w:t>
+      </w:r>
+    </w:p>
+    <w:p>
+      <w:pPr>
+        <w:rPr>
+          <w:sz w:val="44"/>
+          <w:szCs w:val="44"/>
+          <w:lang w:bidi="fa-IR"/>
+        </w:rPr>
+      </w:pPr>
+      <w:r>
+        <w:rPr>
+          <w:sz w:val="44"/>
+          <w:szCs w:val="44"/>
+          <w:lang w:bidi="fa-IR"/>
+        </w:rPr>
+        <w:lastRenderedPageBreak/>
+        <w:t>Let's visualize this idea.</w:t>
+      </w:r>
+    </w:p>
+    <w:p>
+      <w:pPr>
+        <w:rPr>
+          <w:sz w:val="44"/>
+          <w:szCs w:val="44"/>
+          <w:lang w:bidi="fa-IR"/>
+        </w:rPr>
+      </w:pPr>
+      <w:r>
+        <w:rPr>
+          <w:sz w:val="44"/>
+          <w:szCs w:val="44"/>
+          <w:lang w:bidi="fa-IR"/>
+        </w:rPr>
+        <w:t>Go back to our previous metric space (X), and consider the same Cauchy sequence ({</w:t>
+      </w:r>
+      <w:proofErr w:type="spellStart"/>
+      <w:r>
+        <w:rPr>
+          <w:sz w:val="44"/>
+          <w:szCs w:val="44"/>
+          <w:lang w:bidi="fa-IR"/>
+        </w:rPr>
+        <w:t>y_n</w:t>
+      </w:r>
+      <w:proofErr w:type="spellEnd"/>
+      <w:r>
+        <w:rPr>
+          <w:sz w:val="44"/>
+          <w:szCs w:val="44"/>
+          <w:lang w:bidi="fa-IR"/>
+        </w:rPr>
+        <w:t>}).</w:t>
+      </w:r>
+    </w:p>
+    <w:p>
+      <w:pPr>
+        <w:rPr>
+          <w:sz w:val="44"/>
+          <w:szCs w:val="44"/>
+          <w:lang w:bidi="fa-IR"/>
+        </w:rPr>
+      </w:pPr>
+      <w:r>
+        <w:rPr>
+          <w:sz w:val="44"/>
+          <w:szCs w:val="44"/>
+          <w:lang w:bidi="fa-IR"/>
+        </w:rPr>
+        <w:t xml:space="preserve">If the limit of this sequence does </w:t>
+      </w:r>
+      <w:r>
+        <w:rPr>
+          <w:b/>
+          <w:bCs/>
+          <w:sz w:val="44"/>
+          <w:szCs w:val="44"/>
+          <w:lang w:bidi="fa-IR"/>
+        </w:rPr>
+        <w:t>not</w:t>
+      </w:r>
+      <w:r>
+        <w:rPr>
+          <w:sz w:val="44"/>
+          <w:szCs w:val="44"/>
+          <w:lang w:bidi="fa-IR"/>
+        </w:rPr>
+        <w:t xml:space="preserve"> belong to (X), then the sequence is Cauchy but </w:t>
+      </w:r>
+      <w:r>
+        <w:rPr>
+          <w:b/>
+          <w:bCs/>
+          <w:sz w:val="44"/>
+          <w:szCs w:val="44"/>
+          <w:lang w:bidi="fa-IR"/>
+        </w:rPr>
+        <w:t>not</w:t>
+      </w:r>
+      <w:r>
+        <w:rPr>
+          <w:sz w:val="44"/>
+          <w:szCs w:val="44"/>
+          <w:lang w:bidi="fa-IR"/>
+        </w:rPr>
+        <w:t xml:space="preserve"> convergent in (X). Now imagine that the same thing happens for many other Cauchy sequences—their limit points are also missing from the space.</w:t>
+      </w:r>
+    </w:p>
+    <w:p>
+      <w:pPr>
+        <w:rPr>
+          <w:sz w:val="44"/>
+          <w:szCs w:val="44"/>
+          <w:lang w:bidi="fa-IR"/>
+        </w:rPr>
+      </w:pPr>
+      <w:r>
+        <w:rPr>
+          <w:sz w:val="44"/>
+          <w:szCs w:val="44"/>
+          <w:lang w:bidi="fa-IR"/>
+        </w:rPr>
+        <w:t xml:space="preserve">In that case, the space (X) is </w:t>
+      </w:r>
+      <w:r>
+        <w:rPr>
+          <w:b/>
+          <w:bCs/>
+          <w:sz w:val="44"/>
+          <w:szCs w:val="44"/>
+          <w:lang w:bidi="fa-IR"/>
+        </w:rPr>
+        <w:t>not complete</w:t>
+      </w:r>
+      <w:r>
+        <w:rPr>
+          <w:sz w:val="44"/>
+          <w:szCs w:val="44"/>
+          <w:lang w:bidi="fa-IR"/>
+        </w:rPr>
+        <w:t>.</w:t>
+      </w:r>
+    </w:p>
+    <w:p>
+      <w:pPr>
+        <w:rPr>
+          <w:sz w:val="44"/>
+          <w:szCs w:val="44"/>
+          <w:lang w:bidi="fa-IR"/>
+        </w:rPr>
+      </w:pPr>
+      <w:r>
+        <w:rPr>
+          <w:sz w:val="44"/>
+          <w:szCs w:val="44"/>
+          <w:lang w:bidi="fa-IR"/>
+        </w:rPr>
+        <w:t>Now suppose we enlarge the space by adding all of those missing limit points. Once every Cauchy sequence has its limit inside the space, the new space becomes complete.</w:t>
+      </w:r>
+    </w:p>
+    <w:p>
+      <w:pPr>
+        <w:rPr>
+          <w:sz w:val="44"/>
+          <w:szCs w:val="44"/>
+          <w:lang w:bidi="fa-IR"/>
+        </w:rPr>
+      </w:pPr>
+      <w:r>
+        <w:rPr>
+          <w:sz w:val="44"/>
+          <w:szCs w:val="44"/>
+          <w:lang w:bidi="fa-IR"/>
+        </w:rPr>
+        <w:t>Remarkably, mathematics tells us that this can always be done.</w:t>
+      </w:r>
+    </w:p>
+    <w:p>
+      <w:pPr>
+        <w:rPr>
+          <w:sz w:val="44"/>
+          <w:szCs w:val="44"/>
+          <w:rtl/>
+          <w:lang w:bidi="fa-IR"/>
+        </w:rPr>
+      </w:pPr>
+      <w:r>
+        <w:rPr>
+          <w:sz w:val="44"/>
+          <w:szCs w:val="44"/>
+          <w:lang w:bidi="fa-IR"/>
+        </w:rPr>
+        <w:t xml:space="preserve">In fact, one of the fundamental results in metric space theory states that </w:t>
+      </w:r>
+      <w:r>
+        <w:rPr>
+          <w:b/>
+          <w:bCs/>
+          <w:sz w:val="44"/>
+          <w:szCs w:val="44"/>
+          <w:lang w:bidi="fa-IR"/>
+        </w:rPr>
+        <w:t>every metric space has a completion</w:t>
+      </w:r>
+      <w:r>
+        <w:rPr>
+          <w:sz w:val="44"/>
+          <w:szCs w:val="44"/>
+          <w:lang w:bidi="fa-IR"/>
+        </w:rPr>
+        <w:t>—a complete metric space that contains the original one while preserving all of its distances.</w:t>
+      </w:r>
+    </w:p>
+    <w:p>
+      <w:pPr>
+        <w:rPr>
+          <w:sz w:val="44"/>
+          <w:szCs w:val="44"/>
+          <w:lang w:bidi="fa-IR"/>
+        </w:rPr>
+      </w:pPr>
+      <w:proofErr w:type="gramStart"/>
+      <w:r>
+        <w:rPr>
+          <w:sz w:val="44"/>
+          <w:szCs w:val="44"/>
+          <w:lang w:bidi="fa-IR"/>
+        </w:rPr>
+        <w:lastRenderedPageBreak/>
+        <w:t>7 :</w:t>
+      </w:r>
+      <w:proofErr w:type="gramEnd"/>
+      <w:r>
+        <w:rPr>
+          <w:sz w:val="44"/>
+          <w:szCs w:val="44"/>
+          <w:lang w:bidi="fa-IR"/>
+        </w:rPr>
+        <w:t xml:space="preserve"> </w:t>
+      </w:r>
+    </w:p>
+    <w:p>
+      <w:pPr>
+        <w:rPr>
+          <w:sz w:val="44"/>
+          <w:szCs w:val="44"/>
+          <w:lang w:bidi="fa-IR"/>
+        </w:rPr>
+      </w:pPr>
+      <w:r>
+        <w:rPr>
+          <w:sz w:val="44"/>
+          <w:szCs w:val="44"/>
+          <w:lang w:bidi="fa-IR"/>
+        </w:rPr>
+        <w:t xml:space="preserve">In this video, we explored </w:t>
+      </w:r>
+      <w:r>
+        <w:rPr>
+          <w:b/>
+          <w:bCs/>
+          <w:sz w:val="44"/>
+          <w:szCs w:val="44"/>
+          <w:lang w:bidi="fa-IR"/>
+        </w:rPr>
+        <w:t>Cauchy sequences</w:t>
+      </w:r>
+      <w:r>
+        <w:rPr>
+          <w:sz w:val="44"/>
+          <w:szCs w:val="44"/>
+          <w:lang w:bidi="fa-IR"/>
+        </w:rPr>
+        <w:t xml:space="preserve">, </w:t>
+      </w:r>
+      <w:r>
+        <w:rPr>
+          <w:b/>
+          <w:bCs/>
+          <w:sz w:val="44"/>
+          <w:szCs w:val="44"/>
+          <w:lang w:bidi="fa-IR"/>
+        </w:rPr>
+        <w:t>convergent sequences</w:t>
+      </w:r>
+      <w:r>
+        <w:rPr>
+          <w:sz w:val="44"/>
+          <w:szCs w:val="44"/>
+          <w:lang w:bidi="fa-IR"/>
+        </w:rPr>
+        <w:t xml:space="preserve">, the relationship between them, and the concept of </w:t>
+      </w:r>
+      <w:r>
+        <w:rPr>
+          <w:b/>
+          <w:bCs/>
+          <w:sz w:val="44"/>
+          <w:szCs w:val="44"/>
+          <w:lang w:bidi="fa-IR"/>
+        </w:rPr>
+        <w:t>complete metric spaces</w:t>
+      </w:r>
+      <w:r>
+        <w:rPr>
+          <w:sz w:val="44"/>
+          <w:szCs w:val="44"/>
+          <w:lang w:bidi="fa-IR"/>
+        </w:rPr>
+        <w:t>.</w:t>
+      </w:r>
+    </w:p>
+    <w:p>
+      <w:pPr>
+        <w:rPr>
+          <w:sz w:val="44"/>
+          <w:szCs w:val="44"/>
+          <w:lang w:bidi="fa-IR"/>
+        </w:rPr>
+      </w:pPr>
+      <w:r>
+        <w:rPr>
+          <w:sz w:val="44"/>
+          <w:szCs w:val="44"/>
+          <w:lang w:bidi="fa-IR"/>
+        </w:rPr>
+        <w:t xml:space="preserve">In the next video, we'll take the next step in our journey and enter the fascinating world of </w:t>
+      </w:r>
+      <w:r>
+        <w:rPr>
+          <w:b/>
+          <w:bCs/>
+          <w:sz w:val="44"/>
+          <w:szCs w:val="44"/>
+          <w:lang w:bidi="fa-IR"/>
+        </w:rPr>
+        <w:t>Banach spaces</w:t>
+      </w:r>
+      <w:r>
+        <w:rPr>
+          <w:sz w:val="44"/>
+          <w:szCs w:val="44"/>
+          <w:lang w:bidi="fa-IR"/>
+        </w:rPr>
+        <w:t>.</w:t>
+      </w:r>
+    </w:p>
+    <w:p>
+      <w:pPr>
+        <w:rPr>
+          <w:sz w:val="44"/>
+          <w:szCs w:val="44"/>
+          <w:lang w:bidi="fa-IR"/>
+        </w:rPr>
+      </w:pPr>
+      <w:r>
+        <w:rPr>
+          <w:sz w:val="44"/>
+          <w:szCs w:val="44"/>
+          <w:lang w:bidi="fa-IR"/>
+        </w:rPr>
+        <w:t>See you in the next video!</w:t>
       </w:r>
     </w:p>
     <w:p>

</xml_diff>

<commit_message>
step 93 : add notes and finish part 4 and 5
</commit_message>
<xml_diff>
--- a/video context/video_context_newVersion.docx
+++ b/video context/video_context_newVersion.docx
@@ -518,19 +518,11 @@
           <w:lang w:bidi="fa-IR"/>
         </w:rPr>
       </w:pPr>
-      <w:proofErr w:type="gramStart"/>
-      <w:r>
-        <w:rPr>
-          <w:lang w:bidi="fa-IR"/>
-        </w:rPr>
-        <w:t>So</w:t>
-      </w:r>
-      <w:proofErr w:type="gramEnd"/>
-      <w:r>
-        <w:rPr>
-          <w:lang w:bidi="fa-IR"/>
-        </w:rPr>
-        <w:t xml:space="preserve"> we need a different way to measure distance.</w:t>
+      <w:r>
+        <w:rPr>
+          <w:lang w:bidi="fa-IR"/>
+        </w:rPr>
+        <w:t>So we need a different way to measure distance.</w:t>
       </w:r>
     </w:p>
     <w:p>
@@ -902,20 +894,12 @@
           <w:lang w:bidi="fa-IR"/>
         </w:rPr>
       </w:pPr>
-      <w:proofErr w:type="gramStart"/>
       <w:r>
         <w:rPr>
           <w:lang w:bidi="fa-IR"/>
         </w:rPr>
         <w:lastRenderedPageBreak/>
-        <w:t>8 :</w:t>
-      </w:r>
-      <w:proofErr w:type="gramEnd"/>
-      <w:r>
-        <w:rPr>
-          <w:lang w:bidi="fa-IR"/>
-        </w:rPr>
-        <w:t xml:space="preserve"> </w:t>
+        <w:t xml:space="preserve">8 : </w:t>
       </w:r>
     </w:p>
     <w:p>
@@ -1043,14 +1027,12 @@
           <w:lang w:bidi="fa-IR"/>
         </w:rPr>
       </w:pPr>
-      <w:proofErr w:type="gramStart"/>
       <w:r>
         <w:rPr>
           <w:lang w:bidi="fa-IR"/>
         </w:rPr>
         <w:t>9 :</w:t>
       </w:r>
-      <w:proofErr w:type="gramEnd"/>
     </w:p>
     <w:p>
       <w:pPr>
@@ -1456,33 +1438,17 @@
           <w:lang w:bidi="fa-IR"/>
         </w:rPr>
       </w:pPr>
-      <w:proofErr w:type="gramStart"/>
-      <w:r>
-        <w:rPr>
-          <w:lang w:bidi="fa-IR"/>
-        </w:rPr>
-        <w:t>So ,</w:t>
-      </w:r>
-      <w:proofErr w:type="gramEnd"/>
-      <w:r>
-        <w:rPr>
-          <w:lang w:bidi="fa-IR"/>
-        </w:rPr>
-        <w:t xml:space="preserve"> </w:t>
-      </w:r>
-      <w:proofErr w:type="gramStart"/>
-      <w:r>
-        <w:rPr>
-          <w:lang w:bidi="fa-IR"/>
-        </w:rPr>
-        <w:t>Let's</w:t>
-      </w:r>
-      <w:proofErr w:type="gramEnd"/>
-      <w:r>
-        <w:rPr>
-          <w:lang w:bidi="fa-IR"/>
-        </w:rPr>
-        <w:t xml:space="preserve"> quickly recap.</w:t>
+      <w:r>
+        <w:rPr>
+          <w:lang w:bidi="fa-IR"/>
+        </w:rPr>
+        <w:t xml:space="preserve">So , </w:t>
+      </w:r>
+      <w:r>
+        <w:rPr>
+          <w:lang w:bidi="fa-IR"/>
+        </w:rPr>
+        <w:t>Let's quickly recap.</w:t>
       </w:r>
     </w:p>
     <w:p>
@@ -1695,23 +1661,13 @@
           <w:lang w:bidi="fa-IR"/>
         </w:rPr>
       </w:pPr>
-      <w:proofErr w:type="gramStart"/>
-      <w:r>
-        <w:rPr>
-          <w:b/>
-          <w:bCs/>
-          <w:lang w:bidi="fa-IR"/>
-        </w:rPr>
-        <w:t>10 :</w:t>
-      </w:r>
-      <w:proofErr w:type="gramEnd"/>
-      <w:r>
-        <w:rPr>
-          <w:b/>
-          <w:bCs/>
-          <w:lang w:bidi="fa-IR"/>
-        </w:rPr>
-        <w:t xml:space="preserve"> </w:t>
+      <w:r>
+        <w:rPr>
+          <w:b/>
+          <w:bCs/>
+          <w:lang w:bidi="fa-IR"/>
+        </w:rPr>
+        <w:t xml:space="preserve">10 : </w:t>
       </w:r>
     </w:p>
     <w:p>
@@ -1807,19 +1763,11 @@
           <w:lang w:bidi="fa-IR"/>
         </w:rPr>
       </w:pPr>
-      <w:proofErr w:type="gramStart"/>
-      <w:r>
-        <w:rPr>
-          <w:lang w:bidi="fa-IR"/>
-        </w:rPr>
-        <w:t>1 :</w:t>
-      </w:r>
-      <w:proofErr w:type="gramEnd"/>
-      <w:r>
-        <w:rPr>
-          <w:lang w:bidi="fa-IR"/>
-        </w:rPr>
-        <w:t xml:space="preserve"> </w:t>
+      <w:r>
+        <w:rPr>
+          <w:lang w:bidi="fa-IR"/>
+        </w:rPr>
+        <w:t xml:space="preserve">1 : </w:t>
       </w:r>
     </w:p>
     <w:p>
@@ -2071,19 +2019,11 @@
           <w:lang w:bidi="fa-IR"/>
         </w:rPr>
       </w:pPr>
-      <w:proofErr w:type="gramStart"/>
-      <w:r>
-        <w:rPr>
-          <w:lang w:bidi="fa-IR"/>
-        </w:rPr>
-        <w:t>3 :</w:t>
-      </w:r>
-      <w:proofErr w:type="gramEnd"/>
-      <w:r>
-        <w:rPr>
-          <w:lang w:bidi="fa-IR"/>
-        </w:rPr>
-        <w:t xml:space="preserve"> </w:t>
+      <w:r>
+        <w:rPr>
+          <w:lang w:bidi="fa-IR"/>
+        </w:rPr>
+        <w:t xml:space="preserve">3 : </w:t>
       </w:r>
     </w:p>
     <w:p>
@@ -2173,87 +2113,79 @@
           <w:lang w:bidi="fa-IR"/>
         </w:rPr>
       </w:pPr>
-      <w:proofErr w:type="gramStart"/>
-      <w:r>
-        <w:rPr>
-          <w:lang w:bidi="fa-IR"/>
-        </w:rPr>
-        <w:t>4 :</w:t>
-      </w:r>
-      <w:proofErr w:type="gramEnd"/>
+      <w:r>
+        <w:rPr>
+          <w:lang w:bidi="fa-IR"/>
+        </w:rPr>
+        <w:t xml:space="preserve">4 : </w:t>
+      </w:r>
+    </w:p>
+    <w:p>
+      <w:pPr>
+        <w:rPr>
+          <w:lang w:bidi="fa-IR"/>
+        </w:rPr>
+      </w:pPr>
+      <w:r>
+        <w:rPr>
+          <w:lang w:bidi="fa-IR"/>
+        </w:rPr>
+        <w:t xml:space="preserve">Next, we show that the distance from x </w:t>
+      </w:r>
+      <w:proofErr w:type="spellStart"/>
+      <w:r>
+        <w:rPr>
+          <w:lang w:bidi="fa-IR"/>
+        </w:rPr>
+        <w:t>to y</w:t>
+      </w:r>
+      <w:proofErr w:type="spellEnd"/>
+      <w:r>
+        <w:rPr>
+          <w:lang w:bidi="fa-IR"/>
+        </w:rPr>
+        <w:t xml:space="preserve"> is equal to the distance from y to x.</w:t>
+      </w:r>
+    </w:p>
+    <w:p>
+      <w:pPr>
+        <w:rPr>
+          <w:lang w:bidi="fa-IR"/>
+        </w:rPr>
+      </w:pPr>
+      <w:r>
+        <w:rPr>
+          <w:lang w:bidi="fa-IR"/>
+        </w:rPr>
+        <w:t>We begin with the left-hand side and substitute the definition of the distance. Then, by factoring out −1, applying the second axiom of a norm, and simplifying the expression, the claim follows.</w:t>
+      </w:r>
+    </w:p>
+    <w:p>
+      <w:pPr>
+        <w:rPr>
+          <w:lang w:bidi="fa-IR"/>
+        </w:rPr>
+      </w:pPr>
+      <w:r>
+        <w:rPr>
+          <w:lang w:bidi="fa-IR"/>
+        </w:rPr>
+        <w:t xml:space="preserve">To gain some geometric intuition, consider two points, x and y, in the two-dimensional plane. We first represent the distance from x </w:t>
+      </w:r>
+      <w:proofErr w:type="spellStart"/>
+      <w:r>
+        <w:rPr>
+          <w:lang w:bidi="fa-IR"/>
+        </w:rPr>
+        <w:t>to y</w:t>
+      </w:r>
+      <w:proofErr w:type="spellEnd"/>
       <w:r>
         <w:rPr>
           <w:lang w:bidi="fa-IR"/>
         </w:rPr>
         <w:t xml:space="preserve"> </w:t>
       </w:r>
-    </w:p>
-    <w:p>
-      <w:pPr>
-        <w:rPr>
-          <w:lang w:bidi="fa-IR"/>
-        </w:rPr>
-      </w:pPr>
-      <w:r>
-        <w:rPr>
-          <w:lang w:bidi="fa-IR"/>
-        </w:rPr>
-        <w:t xml:space="preserve">Next, we show that the distance from x </w:t>
-      </w:r>
-      <w:proofErr w:type="spellStart"/>
-      <w:r>
-        <w:rPr>
-          <w:lang w:bidi="fa-IR"/>
-        </w:rPr>
-        <w:t>to y</w:t>
-      </w:r>
-      <w:proofErr w:type="spellEnd"/>
-      <w:r>
-        <w:rPr>
-          <w:lang w:bidi="fa-IR"/>
-        </w:rPr>
-        <w:t xml:space="preserve"> is equal to the distance from y to x.</w:t>
-      </w:r>
-    </w:p>
-    <w:p>
-      <w:pPr>
-        <w:rPr>
-          <w:lang w:bidi="fa-IR"/>
-        </w:rPr>
-      </w:pPr>
-      <w:r>
-        <w:rPr>
-          <w:lang w:bidi="fa-IR"/>
-        </w:rPr>
-        <w:t>We begin with the left-hand side and substitute the definition of the distance. Then, by factoring out −1, applying the second axiom of a norm, and simplifying the expression, the claim follows.</w:t>
-      </w:r>
-    </w:p>
-    <w:p>
-      <w:pPr>
-        <w:rPr>
-          <w:lang w:bidi="fa-IR"/>
-        </w:rPr>
-      </w:pPr>
-      <w:r>
-        <w:rPr>
-          <w:lang w:bidi="fa-IR"/>
-        </w:rPr>
-        <w:t xml:space="preserve">To gain some geometric intuition, consider two points, x and y, in the two-dimensional plane. We first represent the distance from x </w:t>
-      </w:r>
-      <w:proofErr w:type="spellStart"/>
-      <w:r>
-        <w:rPr>
-          <w:lang w:bidi="fa-IR"/>
-        </w:rPr>
-        <w:t>to y</w:t>
-      </w:r>
-      <w:proofErr w:type="spellEnd"/>
-      <w:r>
-        <w:rPr>
-          <w:lang w:bidi="fa-IR"/>
-        </w:rPr>
-        <w:t xml:space="preserve"> </w:t>
-      </w:r>
       <w:r>
         <w:rPr>
           <w:lang w:bidi="fa-IR"/>
@@ -2299,19 +2231,11 @@
           <w:lang w:bidi="fa-IR"/>
         </w:rPr>
       </w:pPr>
-      <w:proofErr w:type="gramStart"/>
-      <w:r>
-        <w:rPr>
-          <w:lang w:bidi="fa-IR"/>
-        </w:rPr>
-        <w:t>5 :</w:t>
-      </w:r>
-      <w:proofErr w:type="gramEnd"/>
-      <w:r>
-        <w:rPr>
-          <w:lang w:bidi="fa-IR"/>
-        </w:rPr>
-        <w:t xml:space="preserve"> </w:t>
+      <w:r>
+        <w:rPr>
+          <w:lang w:bidi="fa-IR"/>
+        </w:rPr>
+        <w:t xml:space="preserve">5 : </w:t>
       </w:r>
     </w:p>
     <w:p>
@@ -2378,19 +2302,11 @@
           <w:lang w:bidi="fa-IR"/>
         </w:rPr>
       </w:pPr>
-      <w:proofErr w:type="gramStart"/>
-      <w:r>
-        <w:rPr>
-          <w:lang w:bidi="fa-IR"/>
-        </w:rPr>
-        <w:t>6 :</w:t>
-      </w:r>
-      <w:proofErr w:type="gramEnd"/>
-      <w:r>
-        <w:rPr>
-          <w:lang w:bidi="fa-IR"/>
-        </w:rPr>
-        <w:t xml:space="preserve"> </w:t>
+      <w:r>
+        <w:rPr>
+          <w:lang w:bidi="fa-IR"/>
+        </w:rPr>
+        <w:t xml:space="preserve">6 : </w:t>
       </w:r>
     </w:p>
     <w:p>
@@ -2545,14 +2461,12 @@
           <w:lang w:bidi="fa-IR"/>
         </w:rPr>
       </w:pPr>
-      <w:proofErr w:type="gramStart"/>
       <w:r>
         <w:rPr>
           <w:lang w:bidi="fa-IR"/>
         </w:rPr>
         <w:t>7 :</w:t>
       </w:r>
-      <w:proofErr w:type="gramEnd"/>
     </w:p>
     <w:p>
       <w:pPr>
@@ -2643,19 +2557,11 @@
           <w:lang w:bidi="fa-IR"/>
         </w:rPr>
       </w:pPr>
-      <w:proofErr w:type="gramStart"/>
-      <w:r>
-        <w:rPr>
-          <w:lang w:bidi="fa-IR"/>
-        </w:rPr>
-        <w:t>1 :</w:t>
-      </w:r>
-      <w:proofErr w:type="gramEnd"/>
-      <w:r>
-        <w:rPr>
-          <w:lang w:bidi="fa-IR"/>
-        </w:rPr>
-        <w:t xml:space="preserve"> </w:t>
+      <w:r>
+        <w:rPr>
+          <w:lang w:bidi="fa-IR"/>
+        </w:rPr>
+        <w:t xml:space="preserve">1 : </w:t>
       </w:r>
     </w:p>
     <w:p>
@@ -2770,19 +2676,11 @@
           <w:lang w:bidi="fa-IR"/>
         </w:rPr>
       </w:pPr>
-      <w:proofErr w:type="gramStart"/>
-      <w:r>
-        <w:rPr>
-          <w:lang w:bidi="fa-IR"/>
-        </w:rPr>
-        <w:t>2 :</w:t>
-      </w:r>
-      <w:proofErr w:type="gramEnd"/>
-      <w:r>
-        <w:rPr>
-          <w:lang w:bidi="fa-IR"/>
-        </w:rPr>
-        <w:t xml:space="preserve"> </w:t>
+      <w:r>
+        <w:rPr>
+          <w:lang w:bidi="fa-IR"/>
+        </w:rPr>
+        <w:t xml:space="preserve">2 : </w:t>
       </w:r>
     </w:p>
     <w:p>
@@ -2802,7 +2700,6 @@
         <w:t>To begin, let (</w:t>
       </w:r>
       <w:proofErr w:type="spellStart"/>
-      <w:proofErr w:type="gramStart"/>
       <w:r>
         <w:rPr>
           <w:sz w:val="44"/>
@@ -2812,7 +2709,6 @@
         <w:t>X,d</w:t>
       </w:r>
       <w:proofErr w:type="spellEnd"/>
-      <w:proofErr w:type="gramEnd"/>
       <w:r>
         <w:rPr>
           <w:sz w:val="44"/>
@@ -3044,16 +2940,7 @@
           <w:szCs w:val="44"/>
           <w:lang w:bidi="fa-IR"/>
         </w:rPr>
-        <w:t xml:space="preserve">, because its limit does not belong to </w:t>
-      </w:r>
-      <w:proofErr w:type="gramStart"/>
-      <w:r>
-        <w:rPr>
-          <w:sz w:val="44"/>
-          <w:szCs w:val="44"/>
-          <w:lang w:bidi="fa-IR"/>
-        </w:rPr>
-        <w:t>Y</w:t>
+        <w:t>, because its limit does not belong to Y</w:t>
       </w:r>
       <w:r>
         <w:rPr>
@@ -3071,7 +2958,6 @@
         </w:rPr>
         <w:t>.</w:t>
       </w:r>
-      <w:proofErr w:type="gramEnd"/>
     </w:p>
     <w:p>
       <w:pPr>
@@ -3098,16 +2984,31 @@
           <w:lang w:bidi="fa-IR"/>
         </w:rPr>
       </w:pPr>
-      <w:proofErr w:type="gramStart"/>
-      <w:r>
-        <w:rPr>
-          <w:sz w:val="44"/>
-          <w:szCs w:val="44"/>
-          <w:lang w:bidi="fa-IR"/>
-        </w:rPr>
-        <w:t>3 :</w:t>
-      </w:r>
-      <w:proofErr w:type="gramEnd"/>
+      <w:r>
+        <w:rPr>
+          <w:sz w:val="44"/>
+          <w:szCs w:val="44"/>
+          <w:lang w:bidi="fa-IR"/>
+        </w:rPr>
+        <w:t xml:space="preserve">3 : </w:t>
+      </w:r>
+    </w:p>
+    <w:p>
+      <w:pPr>
+        <w:rPr>
+          <w:sz w:val="44"/>
+          <w:szCs w:val="44"/>
+          <w:lang w:bidi="fa-IR"/>
+        </w:rPr>
+      </w:pPr>
+      <w:r>
+        <w:rPr>
+          <w:sz w:val="44"/>
+          <w:szCs w:val="44"/>
+          <w:lang w:bidi="fa-IR"/>
+        </w:rPr>
+        <w:t>Based on what we've seen so far, a natural question arises:</w:t>
+      </w:r>
       <w:r>
         <w:rPr>
           <w:sz w:val="44"/>
@@ -3116,31 +3017,6 @@
         </w:rPr>
         <w:t xml:space="preserve"> </w:t>
       </w:r>
-    </w:p>
-    <w:p>
-      <w:pPr>
-        <w:rPr>
-          <w:sz w:val="44"/>
-          <w:szCs w:val="44"/>
-          <w:lang w:bidi="fa-IR"/>
-        </w:rPr>
-      </w:pPr>
-      <w:r>
-        <w:rPr>
-          <w:sz w:val="44"/>
-          <w:szCs w:val="44"/>
-          <w:lang w:bidi="fa-IR"/>
-        </w:rPr>
-        <w:t>Based on what we've seen so far, a natural question arises:</w:t>
-      </w:r>
-      <w:r>
-        <w:rPr>
-          <w:sz w:val="44"/>
-          <w:szCs w:val="44"/>
-          <w:lang w:bidi="fa-IR"/>
-        </w:rPr>
-        <w:t xml:space="preserve"> </w:t>
-      </w:r>
       <w:r>
         <w:rPr>
           <w:sz w:val="44"/>
@@ -3164,25 +3040,16 @@
           <w:lang w:bidi="fa-IR"/>
         </w:rPr>
       </w:pPr>
-      <w:proofErr w:type="gramStart"/>
-      <w:r>
-        <w:rPr>
-          <w:lang w:bidi="fa-IR"/>
-        </w:rPr>
-        <w:t>4 :</w:t>
-      </w:r>
-      <w:proofErr w:type="gramEnd"/>
-      <w:r>
-        <w:rPr>
-          <w:lang w:bidi="fa-IR"/>
-        </w:rPr>
-        <w:t xml:space="preserve"> </w:t>
-      </w:r>
-    </w:p>
-    <w:p>
-      <w:pPr>
-        <w:rPr>
-          <w:rFonts w:hint="cs"/>
+      <w:r>
+        <w:rPr>
+          <w:lang w:bidi="fa-IR"/>
+        </w:rPr>
+        <w:t xml:space="preserve">4 : </w:t>
+      </w:r>
+    </w:p>
+    <w:p>
+      <w:pPr>
+        <w:rPr>
           <w:sz w:val="44"/>
           <w:szCs w:val="44"/>
           <w:rtl/>
@@ -3287,7 +3154,6 @@
         <w:t>}) in a metric space ((</w:t>
       </w:r>
       <w:proofErr w:type="spellStart"/>
-      <w:proofErr w:type="gramStart"/>
       <w:r>
         <w:rPr>
           <w:sz w:val="44"/>
@@ -3297,7 +3163,6 @@
         <w:t>X,d</w:t>
       </w:r>
       <w:proofErr w:type="spellEnd"/>
-      <w:proofErr w:type="gramEnd"/>
       <w:r>
         <w:rPr>
           <w:sz w:val="44"/>
@@ -3366,18 +3231,9 @@
           <w:lang w:bidi="fa-IR"/>
         </w:rPr>
         <w:br/>
-      </w:r>
-      <w:proofErr w:type="gramStart"/>
-      <w:r>
-        <w:rPr>
-          <w:sz w:val="44"/>
-          <w:szCs w:val="44"/>
-          <w:lang w:bidi="fa-IR"/>
-        </w:rPr>
         <w:t>d(</w:t>
       </w:r>
       <w:proofErr w:type="spellStart"/>
-      <w:proofErr w:type="gramEnd"/>
       <w:r>
         <w:rPr>
           <w:sz w:val="44"/>
@@ -3450,7 +3306,6 @@
         <w:t>for every (</w:t>
       </w:r>
       <w:proofErr w:type="spellStart"/>
-      <w:proofErr w:type="gramStart"/>
       <w:r>
         <w:rPr>
           <w:sz w:val="44"/>
@@ -3460,7 +3315,6 @@
         <w:t>m,n</w:t>
       </w:r>
       <w:proofErr w:type="spellEnd"/>
-      <w:proofErr w:type="gramEnd"/>
       <w:r>
         <w:rPr>
           <w:sz w:val="44"/>
@@ -3611,23 +3465,13 @@
           <w:lang w:bidi="fa-IR"/>
         </w:rPr>
       </w:pPr>
-      <w:proofErr w:type="gramStart"/>
-      <w:r>
-        <w:rPr>
-          <w:sz w:val="44"/>
-          <w:szCs w:val="44"/>
-          <w:lang w:bidi="fa-IR"/>
-        </w:rPr>
-        <w:t>5 :</w:t>
-      </w:r>
-      <w:proofErr w:type="gramEnd"/>
-      <w:r>
-        <w:rPr>
-          <w:sz w:val="44"/>
-          <w:szCs w:val="44"/>
-          <w:lang w:bidi="fa-IR"/>
-        </w:rPr>
-        <w:t xml:space="preserve"> </w:t>
+      <w:r>
+        <w:rPr>
+          <w:sz w:val="44"/>
+          <w:szCs w:val="44"/>
+          <w:lang w:bidi="fa-IR"/>
+        </w:rPr>
+        <w:t xml:space="preserve">5 : </w:t>
       </w:r>
     </w:p>
     <w:p>
@@ -3755,7 +3599,6 @@
     <w:p>
       <w:pPr>
         <w:rPr>
-          <w:rFonts w:hint="cs"/>
           <w:sz w:val="44"/>
           <w:szCs w:val="44"/>
           <w:rtl/>
@@ -3880,30 +3723,19 @@
     <w:p>
       <w:pPr>
         <w:rPr>
-          <w:rFonts w:hint="cs"/>
           <w:sz w:val="44"/>
           <w:szCs w:val="44"/>
           <w:rtl/>
           <w:lang w:bidi="fa-IR"/>
         </w:rPr>
       </w:pPr>
-      <w:proofErr w:type="gramStart"/>
-      <w:r>
-        <w:rPr>
-          <w:sz w:val="44"/>
-          <w:szCs w:val="44"/>
-          <w:lang w:bidi="fa-IR"/>
-        </w:rPr>
-        <w:t>6 :</w:t>
-      </w:r>
-      <w:proofErr w:type="gramEnd"/>
-      <w:r>
-        <w:rPr>
-          <w:sz w:val="44"/>
-          <w:szCs w:val="44"/>
-          <w:lang w:bidi="fa-IR"/>
-        </w:rPr>
-        <w:t xml:space="preserve"> </w:t>
+      <w:r>
+        <w:rPr>
+          <w:sz w:val="44"/>
+          <w:szCs w:val="44"/>
+          <w:lang w:bidi="fa-IR"/>
+        </w:rPr>
+        <w:t xml:space="preserve">6 : </w:t>
       </w:r>
     </w:p>
     <w:p>
@@ -4265,7 +4097,6 @@
           <w:lang w:bidi="fa-IR"/>
         </w:rPr>
       </w:pPr>
-      <w:proofErr w:type="gramStart"/>
       <w:r>
         <w:rPr>
           <w:sz w:val="44"/>
@@ -4273,16 +4104,7 @@
           <w:lang w:bidi="fa-IR"/>
         </w:rPr>
         <w:lastRenderedPageBreak/>
-        <w:t>7 :</w:t>
-      </w:r>
-      <w:proofErr w:type="gramEnd"/>
-      <w:r>
-        <w:rPr>
-          <w:sz w:val="44"/>
-          <w:szCs w:val="44"/>
-          <w:lang w:bidi="fa-IR"/>
-        </w:rPr>
-        <w:t xml:space="preserve"> </w:t>
+        <w:t xml:space="preserve">7 : </w:t>
       </w:r>
     </w:p>
     <w:p>
@@ -4432,9 +4254,1350 @@
     <w:p>
       <w:pPr>
         <w:rPr>
-          <w:lang w:bidi="fa-IR"/>
-        </w:rPr>
-      </w:pPr>
+          <w:sz w:val="44"/>
+          <w:szCs w:val="44"/>
+          <w:lang w:bidi="fa-IR"/>
+        </w:rPr>
+      </w:pPr>
+      <w:r>
+        <w:rPr>
+          <w:sz w:val="44"/>
+          <w:szCs w:val="44"/>
+          <w:lang w:bidi="fa-IR"/>
+        </w:rPr>
+        <w:t xml:space="preserve">1 : </w:t>
+      </w:r>
+    </w:p>
+    <w:p>
+      <w:pPr>
+        <w:rPr>
+          <w:sz w:val="44"/>
+          <w:szCs w:val="44"/>
+          <w:lang w:bidi="fa-IR"/>
+        </w:rPr>
+      </w:pPr>
+      <w:r>
+        <w:rPr>
+          <w:sz w:val="44"/>
+          <w:szCs w:val="44"/>
+          <w:lang w:bidi="fa-IR"/>
+        </w:rPr>
+        <w:t>In the previous video, we explored Cauchy sequences, convergent sequences, and the relationship between them.</w:t>
+      </w:r>
+    </w:p>
+    <w:p>
+      <w:pPr>
+        <w:rPr>
+          <w:sz w:val="44"/>
+          <w:szCs w:val="44"/>
+          <w:lang w:bidi="fa-IR"/>
+        </w:rPr>
+      </w:pPr>
+      <w:r>
+        <w:rPr>
+          <w:sz w:val="44"/>
+          <w:szCs w:val="44"/>
+          <w:lang w:bidi="fa-IR"/>
+        </w:rPr>
+        <w:t xml:space="preserve">In this video, we're going to introduce </w:t>
+      </w:r>
+      <w:r>
+        <w:rPr>
+          <w:b/>
+          <w:bCs/>
+          <w:sz w:val="44"/>
+          <w:szCs w:val="44"/>
+          <w:lang w:bidi="fa-IR"/>
+        </w:rPr>
+        <w:t>Banach spaces</w:t>
+      </w:r>
+      <w:r>
+        <w:rPr>
+          <w:sz w:val="44"/>
+          <w:szCs w:val="44"/>
+          <w:lang w:bidi="fa-IR"/>
+        </w:rPr>
+        <w:t>, one of the most fundamental concepts in functional analysis.</w:t>
+      </w:r>
+    </w:p>
+    <w:p>
+      <w:pPr>
+        <w:rPr>
+          <w:sz w:val="44"/>
+          <w:szCs w:val="44"/>
+          <w:rtl/>
+          <w:lang w:bidi="fa-IR"/>
+        </w:rPr>
+      </w:pPr>
+      <w:r>
+        <w:rPr>
+          <w:sz w:val="44"/>
+          <w:szCs w:val="44"/>
+          <w:lang w:bidi="fa-IR"/>
+        </w:rPr>
+        <w:t>So, without further ado, let's get started.</w:t>
+      </w:r>
+    </w:p>
+    <w:p>
+      <w:pPr>
+        <w:rPr>
+          <w:sz w:val="44"/>
+          <w:szCs w:val="44"/>
+          <w:lang w:bidi="fa-IR"/>
+        </w:rPr>
+      </w:pPr>
+    </w:p>
+    <w:p>
+      <w:pPr>
+        <w:rPr>
+          <w:rFonts w:hint="cs"/>
+          <w:sz w:val="44"/>
+          <w:szCs w:val="44"/>
+          <w:rtl/>
+          <w:lang w:bidi="fa-IR"/>
+        </w:rPr>
+      </w:pPr>
+      <w:r>
+        <w:rPr>
+          <w:sz w:val="44"/>
+          <w:szCs w:val="44"/>
+          <w:lang w:bidi="fa-IR"/>
+        </w:rPr>
+        <w:lastRenderedPageBreak/>
+        <w:t xml:space="preserve">2 : </w:t>
+      </w:r>
+    </w:p>
+    <w:p>
+      <w:pPr>
+        <w:rPr>
+          <w:sz w:val="44"/>
+          <w:szCs w:val="44"/>
+          <w:lang w:bidi="fa-IR"/>
+        </w:rPr>
+      </w:pPr>
+      <w:r>
+        <w:rPr>
+          <w:sz w:val="44"/>
+          <w:szCs w:val="44"/>
+          <w:lang w:bidi="fa-IR"/>
+        </w:rPr>
+        <w:t>Before we talk about Banach spaces, let's spend a minute getting to know the man behind the name.</w:t>
+      </w:r>
+    </w:p>
+    <w:p>
+      <w:pPr>
+        <w:rPr>
+          <w:sz w:val="44"/>
+          <w:szCs w:val="44"/>
+          <w:lang w:bidi="fa-IR"/>
+        </w:rPr>
+      </w:pPr>
+      <w:r>
+        <w:rPr>
+          <w:sz w:val="44"/>
+          <w:szCs w:val="44"/>
+          <w:lang w:bidi="fa-IR"/>
+        </w:rPr>
+        <w:t>Stefan Banach was born in 1892 in Kraków, Poland. What's remarkable is that he never followed the traditional path of becoming a mathematician. In fact, he was largely self-taught and did not even have a formal degree in mathematics when he began producing original research.</w:t>
+      </w:r>
+    </w:p>
+    <w:p>
+      <w:pPr>
+        <w:rPr>
+          <w:sz w:val="44"/>
+          <w:szCs w:val="44"/>
+          <w:lang w:bidi="fa-IR"/>
+        </w:rPr>
+      </w:pPr>
+      <w:r>
+        <w:rPr>
+          <w:sz w:val="44"/>
+          <w:szCs w:val="44"/>
+          <w:lang w:bidi="fa-IR"/>
+        </w:rPr>
+        <w:t xml:space="preserve">The turning point came in 1916. One evening, the famous mathematician Hugo Steinhaus was walking through a park when he overheard two young men discussing the </w:t>
+      </w:r>
+      <w:r>
+        <w:rPr>
+          <w:b/>
+          <w:bCs/>
+          <w:sz w:val="44"/>
+          <w:szCs w:val="44"/>
+          <w:lang w:bidi="fa-IR"/>
+        </w:rPr>
+        <w:t>Lebesgue integral</w:t>
+      </w:r>
+      <w:r>
+        <w:rPr>
+          <w:sz w:val="44"/>
+          <w:szCs w:val="44"/>
+          <w:lang w:bidi="fa-IR"/>
+        </w:rPr>
+        <w:t>—a topic that was still considered very advanced at the time. Curious, he introduced himself. One of those young men was Stefan Banach.</w:t>
+      </w:r>
+    </w:p>
+    <w:p>
+      <w:pPr>
+        <w:rPr>
+          <w:sz w:val="44"/>
+          <w:szCs w:val="44"/>
+          <w:lang w:bidi="fa-IR"/>
+        </w:rPr>
+      </w:pPr>
+      <w:r>
+        <w:rPr>
+          <w:sz w:val="44"/>
+          <w:szCs w:val="44"/>
+          <w:lang w:bidi="fa-IR"/>
+        </w:rPr>
+        <w:t xml:space="preserve">Steinhaus later gave Banach a difficult mathematical problem that he himself had been unable to solve. Banach returned with a complete solution within </w:t>
+      </w:r>
+      <w:r>
+        <w:rPr>
+          <w:sz w:val="44"/>
+          <w:szCs w:val="44"/>
+          <w:lang w:bidi="fa-IR"/>
+        </w:rPr>
+        <w:lastRenderedPageBreak/>
+        <w:t>just a few days. That chance encounter changed the course of mathematics.</w:t>
+      </w:r>
+    </w:p>
+    <w:p>
+      <w:pPr>
+        <w:rPr>
+          <w:sz w:val="44"/>
+          <w:szCs w:val="44"/>
+          <w:lang w:bidi="fa-IR"/>
+        </w:rPr>
+      </w:pPr>
+      <w:r>
+        <w:rPr>
+          <w:sz w:val="44"/>
+          <w:szCs w:val="44"/>
+          <w:lang w:bidi="fa-IR"/>
+        </w:rPr>
+        <w:t xml:space="preserve">Banach went on to found modern functional analysis, and in 1932 he published </w:t>
+      </w:r>
+      <w:r>
+        <w:rPr>
+          <w:i/>
+          <w:iCs/>
+          <w:sz w:val="44"/>
+          <w:szCs w:val="44"/>
+          <w:lang w:bidi="fa-IR"/>
+        </w:rPr>
+        <w:t>Theory of Linear Operations</w:t>
+      </w:r>
+      <w:r>
+        <w:rPr>
+          <w:sz w:val="44"/>
+          <w:szCs w:val="44"/>
+          <w:lang w:bidi="fa-IR"/>
+        </w:rPr>
+        <w:t xml:space="preserve">, the first comprehensive book on the subject. Today, his name lives on in one of the most fundamental objects in mathematics: </w:t>
+      </w:r>
+      <w:r>
+        <w:rPr>
+          <w:b/>
+          <w:bCs/>
+          <w:sz w:val="44"/>
+          <w:szCs w:val="44"/>
+          <w:lang w:bidi="fa-IR"/>
+        </w:rPr>
+        <w:t>Banach spaces</w:t>
+      </w:r>
+      <w:r>
+        <w:rPr>
+          <w:sz w:val="44"/>
+          <w:szCs w:val="44"/>
+          <w:lang w:bidi="fa-IR"/>
+        </w:rPr>
+        <w:t>.</w:t>
+      </w:r>
+    </w:p>
+    <w:p>
+      <w:pPr>
+        <w:rPr>
+          <w:sz w:val="44"/>
+          <w:szCs w:val="44"/>
+          <w:lang w:bidi="fa-IR"/>
+        </w:rPr>
+      </w:pPr>
+      <w:r>
+        <w:rPr>
+          <w:sz w:val="44"/>
+          <w:szCs w:val="44"/>
+          <w:lang w:bidi="fa-IR"/>
+        </w:rPr>
+        <w:t>Now, let's see what a Banach space actually is.</w:t>
+      </w:r>
+    </w:p>
+    <w:p>
+      <w:pPr>
+        <w:rPr>
+          <w:sz w:val="44"/>
+          <w:szCs w:val="44"/>
+          <w:lang w:bidi="fa-IR"/>
+        </w:rPr>
+      </w:pPr>
+      <w:r>
+        <w:rPr>
+          <w:sz w:val="44"/>
+          <w:szCs w:val="44"/>
+          <w:lang w:bidi="fa-IR"/>
+        </w:rPr>
+        <w:t>3 :</w:t>
+      </w:r>
+    </w:p>
+    <w:p>
+      <w:pPr>
+        <w:rPr>
+          <w:sz w:val="44"/>
+          <w:szCs w:val="44"/>
+          <w:lang w:bidi="fa-IR"/>
+        </w:rPr>
+      </w:pPr>
+      <w:r>
+        <w:rPr>
+          <w:sz w:val="44"/>
+          <w:szCs w:val="44"/>
+          <w:lang w:bidi="fa-IR"/>
+        </w:rPr>
+        <w:t xml:space="preserve">A Banach space is simply a </w:t>
+      </w:r>
+      <w:r>
+        <w:rPr>
+          <w:b/>
+          <w:bCs/>
+          <w:sz w:val="44"/>
+          <w:szCs w:val="44"/>
+          <w:lang w:bidi="fa-IR"/>
+        </w:rPr>
+        <w:t>normed space</w:t>
+      </w:r>
+      <w:r>
+        <w:rPr>
+          <w:sz w:val="44"/>
+          <w:szCs w:val="44"/>
+          <w:lang w:bidi="fa-IR"/>
+        </w:rPr>
+        <w:t xml:space="preserve"> that is </w:t>
+      </w:r>
+      <w:r>
+        <w:rPr>
+          <w:b/>
+          <w:bCs/>
+          <w:sz w:val="44"/>
+          <w:szCs w:val="44"/>
+          <w:lang w:bidi="fa-IR"/>
+        </w:rPr>
+        <w:t>complete</w:t>
+      </w:r>
+      <w:r>
+        <w:rPr>
+          <w:sz w:val="44"/>
+          <w:szCs w:val="44"/>
+          <w:lang w:bidi="fa-IR"/>
+        </w:rPr>
+        <w:t xml:space="preserve"> with respect to the metric induced by its norm.</w:t>
+      </w:r>
+    </w:p>
+    <w:p>
+      <w:pPr>
+        <w:rPr>
+          <w:sz w:val="44"/>
+          <w:szCs w:val="44"/>
+          <w:lang w:bidi="fa-IR"/>
+        </w:rPr>
+      </w:pPr>
+      <w:r>
+        <w:rPr>
+          <w:sz w:val="44"/>
+          <w:szCs w:val="44"/>
+          <w:lang w:bidi="fa-IR"/>
+        </w:rPr>
+        <w:t xml:space="preserve">In other words, if every Cauchy sequence in the space converges to a point that also belongs to the same space, then that normed space is called a </w:t>
+      </w:r>
+      <w:r>
+        <w:rPr>
+          <w:b/>
+          <w:bCs/>
+          <w:sz w:val="44"/>
+          <w:szCs w:val="44"/>
+          <w:lang w:bidi="fa-IR"/>
+        </w:rPr>
+        <w:t>Banach space</w:t>
+      </w:r>
+      <w:r>
+        <w:rPr>
+          <w:sz w:val="44"/>
+          <w:szCs w:val="44"/>
+          <w:lang w:bidi="fa-IR"/>
+        </w:rPr>
+        <w:t>.</w:t>
+      </w:r>
+    </w:p>
+    <w:p>
+      <w:pPr>
+        <w:rPr>
+          <w:sz w:val="44"/>
+          <w:szCs w:val="44"/>
+          <w:lang w:bidi="fa-IR"/>
+        </w:rPr>
+      </w:pPr>
+      <w:r>
+        <w:rPr>
+          <w:sz w:val="44"/>
+          <w:szCs w:val="44"/>
+          <w:lang w:bidi="fa-IR"/>
+        </w:rPr>
+        <w:t xml:space="preserve">4 : </w:t>
+      </w:r>
+    </w:p>
+    <w:p>
+      <w:pPr>
+        <w:rPr>
+          <w:sz w:val="44"/>
+          <w:szCs w:val="44"/>
+          <w:lang w:bidi="fa-IR"/>
+        </w:rPr>
+      </w:pPr>
+      <w:r>
+        <w:rPr>
+          <w:sz w:val="44"/>
+          <w:szCs w:val="44"/>
+          <w:lang w:bidi="fa-IR"/>
+        </w:rPr>
+        <w:lastRenderedPageBreak/>
+        <w:t>To compare Banach spaces with the other spaces we've discussed so far, let's take a look at the following diagram.</w:t>
+      </w:r>
+    </w:p>
+    <w:p>
+      <w:pPr>
+        <w:rPr>
+          <w:sz w:val="44"/>
+          <w:szCs w:val="44"/>
+          <w:lang w:bidi="fa-IR"/>
+        </w:rPr>
+      </w:pPr>
+      <w:r>
+        <w:rPr>
+          <w:sz w:val="44"/>
+          <w:szCs w:val="44"/>
+          <w:lang w:bidi="fa-IR"/>
+        </w:rPr>
+        <w:t xml:space="preserve">A Banach space is simply a </w:t>
+      </w:r>
+      <w:r>
+        <w:rPr>
+          <w:b/>
+          <w:bCs/>
+          <w:sz w:val="44"/>
+          <w:szCs w:val="44"/>
+          <w:lang w:bidi="fa-IR"/>
+        </w:rPr>
+        <w:t>complete normed space</w:t>
+      </w:r>
+      <w:r>
+        <w:rPr>
+          <w:sz w:val="44"/>
+          <w:szCs w:val="44"/>
+          <w:lang w:bidi="fa-IR"/>
+        </w:rPr>
+        <w:t>. In other words, whenever a normed space is complete, it is called a Banach space.</w:t>
+      </w:r>
+    </w:p>
+    <w:p>
+      <w:pPr>
+        <w:rPr>
+          <w:sz w:val="44"/>
+          <w:szCs w:val="44"/>
+          <w:lang w:bidi="fa-IR"/>
+        </w:rPr>
+      </w:pPr>
+      <w:r>
+        <w:rPr>
+          <w:sz w:val="44"/>
+          <w:szCs w:val="44"/>
+          <w:lang w:bidi="fa-IR"/>
+        </w:rPr>
+        <w:t>This means that every Banach space is a normed space. And as we discussed in the previous videos, every normed space is, in turn, a metric space.</w:t>
+      </w:r>
+    </w:p>
+    <w:p>
+      <w:pPr>
+        <w:rPr>
+          <w:sz w:val="44"/>
+          <w:szCs w:val="44"/>
+          <w:lang w:bidi="fa-IR"/>
+        </w:rPr>
+      </w:pPr>
+      <w:r>
+        <w:rPr>
+          <w:sz w:val="44"/>
+          <w:szCs w:val="44"/>
+          <w:lang w:bidi="fa-IR"/>
+        </w:rPr>
+        <w:t>So, we have the following chain of inclusions:</w:t>
+      </w:r>
+    </w:p>
+    <w:p>
+      <w:pPr>
+        <w:rPr>
+          <w:b/>
+          <w:bCs/>
+          <w:sz w:val="44"/>
+          <w:szCs w:val="44"/>
+          <w:lang w:bidi="fa-IR"/>
+        </w:rPr>
+      </w:pPr>
+      <w:r>
+        <w:rPr>
+          <w:b/>
+          <w:bCs/>
+          <w:sz w:val="44"/>
+          <w:szCs w:val="44"/>
+          <w:lang w:bidi="fa-IR"/>
+        </w:rPr>
+        <w:t xml:space="preserve">Banach spaces </w:t>
+      </w:r>
+      <w:r>
+        <w:rPr>
+          <w:rFonts w:ascii="Cambria Math" w:hAnsi="Cambria Math" w:cs="Cambria Math"/>
+          <w:b/>
+          <w:bCs/>
+          <w:sz w:val="44"/>
+          <w:szCs w:val="44"/>
+          <w:lang w:bidi="fa-IR"/>
+        </w:rPr>
+        <w:t>is a subset of</w:t>
+      </w:r>
+      <w:r>
+        <w:rPr>
+          <w:b/>
+          <w:bCs/>
+          <w:sz w:val="44"/>
+          <w:szCs w:val="44"/>
+          <w:lang w:bidi="fa-IR"/>
+        </w:rPr>
+        <w:t xml:space="preserve"> Normed spaces </w:t>
+      </w:r>
+      <w:r>
+        <w:rPr>
+          <w:rFonts w:ascii="Cambria Math" w:hAnsi="Cambria Math" w:cs="Cambria Math"/>
+          <w:b/>
+          <w:bCs/>
+          <w:sz w:val="44"/>
+          <w:szCs w:val="44"/>
+          <w:lang w:bidi="fa-IR"/>
+        </w:rPr>
+        <w:t>is a subset of</w:t>
+      </w:r>
+      <w:r>
+        <w:rPr>
+          <w:b/>
+          <w:bCs/>
+          <w:sz w:val="44"/>
+          <w:szCs w:val="44"/>
+          <w:lang w:bidi="fa-IR"/>
+        </w:rPr>
+        <w:t xml:space="preserve"> Metric spaces.</w:t>
+      </w:r>
+    </w:p>
+    <w:p>
+      <w:pPr>
+        <w:rPr>
+          <w:b/>
+          <w:bCs/>
+          <w:sz w:val="44"/>
+          <w:szCs w:val="44"/>
+          <w:lang w:bidi="fa-IR"/>
+        </w:rPr>
+      </w:pPr>
+      <w:r>
+        <w:rPr>
+          <w:b/>
+          <w:bCs/>
+          <w:sz w:val="44"/>
+          <w:szCs w:val="44"/>
+          <w:lang w:bidi="fa-IR"/>
+        </w:rPr>
+        <w:t xml:space="preserve">5 : </w:t>
+      </w:r>
+    </w:p>
+    <w:p>
+      <w:pPr>
+        <w:rPr>
+          <w:rFonts w:hint="cs"/>
+          <w:b/>
+          <w:bCs/>
+          <w:sz w:val="44"/>
+          <w:szCs w:val="44"/>
+          <w:rtl/>
+          <w:lang w:bidi="fa-IR"/>
+        </w:rPr>
+      </w:pPr>
+      <w:r>
+        <w:rPr>
+          <w:b/>
+          <w:bCs/>
+          <w:sz w:val="44"/>
+          <w:szCs w:val="44"/>
+          <w:lang w:bidi="fa-IR"/>
+        </w:rPr>
+        <w:br w:type="page"/>
+      </w:r>
+    </w:p>
+    <w:p>
+      <w:pPr>
+        <w:rPr>
+          <w:sz w:val="44"/>
+          <w:szCs w:val="44"/>
+          <w:lang w:bidi="fa-IR"/>
+        </w:rPr>
+      </w:pPr>
+      <w:r>
+        <w:rPr>
+          <w:sz w:val="44"/>
+          <w:szCs w:val="44"/>
+          <w:lang w:bidi="fa-IR"/>
+        </w:rPr>
+        <w:lastRenderedPageBreak/>
+        <w:t>Now, let's look at an example.</w:t>
+      </w:r>
+    </w:p>
+    <w:p>
+      <w:pPr>
+        <w:rPr>
+          <w:sz w:val="44"/>
+          <w:szCs w:val="44"/>
+          <w:lang w:bidi="fa-IR"/>
+        </w:rPr>
+      </w:pPr>
+      <w:r>
+        <w:rPr>
+          <w:sz w:val="44"/>
+          <w:szCs w:val="44"/>
+          <w:lang w:bidi="fa-IR"/>
+        </w:rPr>
+        <w:t xml:space="preserve">As our metric space, we'll consider a </w:t>
+      </w:r>
+      <w:r>
+        <w:rPr>
+          <w:b/>
+          <w:bCs/>
+          <w:sz w:val="44"/>
+          <w:szCs w:val="44"/>
+          <w:lang w:bidi="fa-IR"/>
+        </w:rPr>
+        <w:t>space of functions</w:t>
+      </w:r>
+      <w:r>
+        <w:rPr>
+          <w:sz w:val="44"/>
+          <w:szCs w:val="44"/>
+          <w:lang w:bidi="fa-IR"/>
+        </w:rPr>
+        <w:t>, where each vector is a function. Function addition and scalar multiplication are defined in the usual way, so this is indeed a vector space.</w:t>
+      </w:r>
+    </w:p>
+    <w:p>
+      <w:pPr>
+        <w:rPr>
+          <w:sz w:val="44"/>
+          <w:szCs w:val="44"/>
+          <w:lang w:bidi="fa-IR"/>
+        </w:rPr>
+      </w:pPr>
+      <w:r>
+        <w:rPr>
+          <w:sz w:val="44"/>
+          <w:szCs w:val="44"/>
+          <w:lang w:bidi="fa-IR"/>
+        </w:rPr>
+        <w:t>For our first example, let (X) be the space of all real-valued continuous functions on the interval ([-1,1]).</w:t>
+      </w:r>
+    </w:p>
+    <w:p>
+      <w:pPr>
+        <w:rPr>
+          <w:sz w:val="44"/>
+          <w:szCs w:val="44"/>
+          <w:lang w:bidi="fa-IR"/>
+        </w:rPr>
+      </w:pPr>
+      <w:r>
+        <w:rPr>
+          <w:sz w:val="44"/>
+          <w:szCs w:val="44"/>
+          <w:lang w:bidi="fa-IR"/>
+        </w:rPr>
+        <w:t>We equip this space with the following norm. It is straightforward to verify that this function satisfies all the axioms of a norm.</w:t>
+      </w:r>
+    </w:p>
+    <w:p>
+      <w:pPr>
+        <w:rPr>
+          <w:sz w:val="44"/>
+          <w:szCs w:val="44"/>
+          <w:lang w:bidi="fa-IR"/>
+        </w:rPr>
+      </w:pPr>
+      <w:r>
+        <w:rPr>
+          <w:sz w:val="44"/>
+          <w:szCs w:val="44"/>
+          <w:lang w:bidi="fa-IR"/>
+        </w:rPr>
+        <w:t xml:space="preserve">Now, the question is: </w:t>
+      </w:r>
+      <w:r>
+        <w:rPr>
+          <w:b/>
+          <w:bCs/>
+          <w:sz w:val="44"/>
+          <w:szCs w:val="44"/>
+          <w:lang w:bidi="fa-IR"/>
+        </w:rPr>
+        <w:t>Is this a Banach space?</w:t>
+      </w:r>
+    </w:p>
+    <w:p>
+      <w:pPr>
+        <w:rPr>
+          <w:sz w:val="44"/>
+          <w:szCs w:val="44"/>
+          <w:lang w:bidi="fa-IR"/>
+        </w:rPr>
+      </w:pPr>
+      <w:r>
+        <w:rPr>
+          <w:sz w:val="44"/>
+          <w:szCs w:val="44"/>
+          <w:lang w:bidi="fa-IR"/>
+        </w:rPr>
+        <w:t xml:space="preserve">The answer is </w:t>
+      </w:r>
+      <w:r>
+        <w:rPr>
+          <w:b/>
+          <w:bCs/>
+          <w:sz w:val="44"/>
+          <w:szCs w:val="44"/>
+          <w:lang w:bidi="fa-IR"/>
+        </w:rPr>
+        <w:t>no</w:t>
+      </w:r>
+      <w:r>
+        <w:rPr>
+          <w:sz w:val="44"/>
+          <w:szCs w:val="44"/>
+          <w:lang w:bidi="fa-IR"/>
+        </w:rPr>
+        <w:t>.</w:t>
+      </w:r>
+    </w:p>
+    <w:p>
+      <w:pPr>
+        <w:rPr>
+          <w:sz w:val="44"/>
+          <w:szCs w:val="44"/>
+          <w:lang w:bidi="fa-IR"/>
+        </w:rPr>
+      </w:pPr>
+      <w:r>
+        <w:rPr>
+          <w:sz w:val="44"/>
+          <w:szCs w:val="44"/>
+          <w:lang w:bidi="fa-IR"/>
+        </w:rPr>
+        <w:t>To see why, consider the following sequence of functions.</w:t>
+      </w:r>
+    </w:p>
+    <w:p>
+      <w:pPr>
+        <w:rPr>
+          <w:sz w:val="44"/>
+          <w:szCs w:val="44"/>
+          <w:lang w:bidi="fa-IR"/>
+        </w:rPr>
+      </w:pPr>
+      <w:r>
+        <w:rPr>
+          <w:sz w:val="44"/>
+          <w:szCs w:val="44"/>
+          <w:lang w:bidi="fa-IR"/>
+        </w:rPr>
+        <w:t xml:space="preserve">This sequence is a </w:t>
+      </w:r>
+      <w:r>
+        <w:rPr>
+          <w:b/>
+          <w:bCs/>
+          <w:sz w:val="44"/>
+          <w:szCs w:val="44"/>
+          <w:lang w:bidi="fa-IR"/>
+        </w:rPr>
+        <w:t>Cauchy sequence</w:t>
+      </w:r>
+      <w:r>
+        <w:rPr>
+          <w:sz w:val="44"/>
+          <w:szCs w:val="44"/>
+          <w:lang w:bidi="fa-IR"/>
+        </w:rPr>
+        <w:t xml:space="preserve"> with respect to the given norm. However, its limit is </w:t>
+      </w:r>
+      <w:r>
+        <w:rPr>
+          <w:b/>
+          <w:bCs/>
+          <w:sz w:val="44"/>
+          <w:szCs w:val="44"/>
+          <w:lang w:bidi="fa-IR"/>
+        </w:rPr>
+        <w:t>not</w:t>
+      </w:r>
+      <w:r>
+        <w:rPr>
+          <w:sz w:val="44"/>
+          <w:szCs w:val="44"/>
+          <w:lang w:bidi="fa-IR"/>
+        </w:rPr>
+        <w:t xml:space="preserve"> a continuous function.</w:t>
+      </w:r>
+    </w:p>
+    <w:p>
+      <w:pPr>
+        <w:rPr>
+          <w:sz w:val="44"/>
+          <w:szCs w:val="44"/>
+          <w:lang w:bidi="fa-IR"/>
+        </w:rPr>
+      </w:pPr>
+      <w:r>
+        <w:rPr>
+          <w:sz w:val="44"/>
+          <w:szCs w:val="44"/>
+          <w:lang w:bidi="fa-IR"/>
+        </w:rPr>
+        <w:lastRenderedPageBreak/>
+        <w:t>Since the limit does not belong to our space, the sequence does not converge within (X).</w:t>
+      </w:r>
+    </w:p>
+    <w:p>
+      <w:pPr>
+        <w:rPr>
+          <w:sz w:val="44"/>
+          <w:szCs w:val="44"/>
+          <w:lang w:bidi="fa-IR"/>
+        </w:rPr>
+      </w:pPr>
+      <w:r>
+        <w:rPr>
+          <w:sz w:val="44"/>
+          <w:szCs w:val="44"/>
+          <w:lang w:bidi="fa-IR"/>
+        </w:rPr>
+        <w:t xml:space="preserve">Therefore, (X) is </w:t>
+      </w:r>
+      <w:r>
+        <w:rPr>
+          <w:b/>
+          <w:bCs/>
+          <w:sz w:val="44"/>
+          <w:szCs w:val="44"/>
+          <w:lang w:bidi="fa-IR"/>
+        </w:rPr>
+        <w:t>not complete</w:t>
+      </w:r>
+      <w:r>
+        <w:rPr>
+          <w:sz w:val="44"/>
+          <w:szCs w:val="44"/>
+          <w:lang w:bidi="fa-IR"/>
+        </w:rPr>
+        <w:t xml:space="preserve"> under this norm.</w:t>
+      </w:r>
+    </w:p>
+    <w:p>
+      <w:pPr>
+        <w:rPr>
+          <w:sz w:val="44"/>
+          <w:szCs w:val="44"/>
+          <w:lang w:bidi="fa-IR"/>
+        </w:rPr>
+      </w:pPr>
+      <w:r>
+        <w:rPr>
+          <w:sz w:val="44"/>
+          <w:szCs w:val="44"/>
+          <w:lang w:bidi="fa-IR"/>
+        </w:rPr>
+        <w:t xml:space="preserve">So , </w:t>
+      </w:r>
+      <w:r>
+        <w:rPr>
+          <w:sz w:val="44"/>
+          <w:szCs w:val="44"/>
+          <w:lang w:bidi="fa-IR"/>
+        </w:rPr>
+        <w:t xml:space="preserve">we conclude that this space is </w:t>
+      </w:r>
+      <w:r>
+        <w:rPr>
+          <w:b/>
+          <w:bCs/>
+          <w:sz w:val="44"/>
+          <w:szCs w:val="44"/>
+          <w:lang w:bidi="fa-IR"/>
+        </w:rPr>
+        <w:t>not</w:t>
+      </w:r>
+      <w:r>
+        <w:rPr>
+          <w:sz w:val="44"/>
+          <w:szCs w:val="44"/>
+          <w:lang w:bidi="fa-IR"/>
+        </w:rPr>
+        <w:t xml:space="preserve"> a Banach space.</w:t>
+      </w:r>
+    </w:p>
+    <w:p>
+      <w:pPr>
+        <w:rPr>
+          <w:sz w:val="44"/>
+          <w:szCs w:val="44"/>
+          <w:lang w:bidi="fa-IR"/>
+        </w:rPr>
+      </w:pPr>
+      <w:r>
+        <w:rPr>
+          <w:sz w:val="44"/>
+          <w:szCs w:val="44"/>
+          <w:lang w:bidi="fa-IR"/>
+        </w:rPr>
+        <w:t xml:space="preserve">6 : </w:t>
+      </w:r>
+    </w:p>
+    <w:p>
+      <w:pPr>
+        <w:rPr>
+          <w:sz w:val="44"/>
+          <w:szCs w:val="44"/>
+          <w:lang w:bidi="fa-IR"/>
+        </w:rPr>
+      </w:pPr>
+      <w:r>
+        <w:rPr>
+          <w:sz w:val="44"/>
+          <w:szCs w:val="44"/>
+          <w:lang w:bidi="fa-IR"/>
+        </w:rPr>
+        <w:t>Now, let's look at another example.</w:t>
+      </w:r>
+    </w:p>
+    <w:p>
+      <w:pPr>
+        <w:rPr>
+          <w:sz w:val="44"/>
+          <w:szCs w:val="44"/>
+          <w:lang w:bidi="fa-IR"/>
+        </w:rPr>
+      </w:pPr>
+      <w:r>
+        <w:rPr>
+          <w:sz w:val="44"/>
+          <w:szCs w:val="44"/>
+          <w:lang w:bidi="fa-IR"/>
+        </w:rPr>
+        <w:t xml:space="preserve">Suppose we consider the same vector space of continuous real-valued functions on the interval ([-1,1]), but this time we equip it with the </w:t>
+      </w:r>
+      <w:r>
+        <w:rPr>
+          <w:b/>
+          <w:bCs/>
+          <w:sz w:val="44"/>
+          <w:szCs w:val="44"/>
+          <w:lang w:bidi="fa-IR"/>
+        </w:rPr>
+        <w:t>supremum norm</w:t>
+      </w:r>
+      <w:r>
+        <w:rPr>
+          <w:sz w:val="44"/>
+          <w:szCs w:val="44"/>
+          <w:lang w:bidi="fa-IR"/>
+        </w:rPr>
+        <w:t>.</w:t>
+      </w:r>
+    </w:p>
+    <w:p>
+      <w:pPr>
+        <w:rPr>
+          <w:sz w:val="44"/>
+          <w:szCs w:val="44"/>
+          <w:lang w:bidi="fa-IR"/>
+        </w:rPr>
+      </w:pPr>
+      <w:r>
+        <w:rPr>
+          <w:sz w:val="44"/>
+          <w:szCs w:val="44"/>
+          <w:lang w:bidi="fa-IR"/>
+        </w:rPr>
+        <w:t xml:space="preserve">Interestingly, under this norm, the resulting space </w:t>
+      </w:r>
+      <w:r>
+        <w:rPr>
+          <w:b/>
+          <w:bCs/>
+          <w:sz w:val="44"/>
+          <w:szCs w:val="44"/>
+          <w:lang w:bidi="fa-IR"/>
+        </w:rPr>
+        <w:t>is</w:t>
+      </w:r>
+      <w:r>
+        <w:rPr>
+          <w:sz w:val="44"/>
+          <w:szCs w:val="44"/>
+          <w:lang w:bidi="fa-IR"/>
+        </w:rPr>
+        <w:t xml:space="preserve"> a Banach space. </w:t>
+      </w:r>
+    </w:p>
+    <w:p>
+      <w:pPr>
+        <w:rPr>
+          <w:sz w:val="44"/>
+          <w:szCs w:val="44"/>
+          <w:lang w:bidi="fa-IR"/>
+        </w:rPr>
+      </w:pPr>
+      <w:r>
+        <w:rPr>
+          <w:sz w:val="44"/>
+          <w:szCs w:val="44"/>
+          <w:lang w:bidi="fa-IR"/>
+        </w:rPr>
+        <w:t>There is another interesting observation.</w:t>
+      </w:r>
+    </w:p>
+    <w:p>
+      <w:pPr>
+        <w:rPr>
+          <w:sz w:val="44"/>
+          <w:szCs w:val="44"/>
+          <w:lang w:bidi="fa-IR"/>
+        </w:rPr>
+      </w:pPr>
+      <w:r>
+        <w:rPr>
+          <w:sz w:val="44"/>
+          <w:szCs w:val="44"/>
+          <w:lang w:bidi="fa-IR"/>
+        </w:rPr>
+        <w:t xml:space="preserve">Instead of changing the norm, let's go back to our first example, where we used the (L^1) norm. Rather than changing the norm, we enlarge the </w:t>
+      </w:r>
+      <w:r>
+        <w:rPr>
+          <w:sz w:val="44"/>
+          <w:szCs w:val="44"/>
+          <w:lang w:bidi="fa-IR"/>
+        </w:rPr>
+        <w:lastRenderedPageBreak/>
+        <w:t>space itself by adding the limits of all Cauchy sequences.</w:t>
+      </w:r>
+    </w:p>
+    <w:p>
+      <w:pPr>
+        <w:rPr>
+          <w:sz w:val="44"/>
+          <w:szCs w:val="44"/>
+          <w:lang w:bidi="fa-IR"/>
+        </w:rPr>
+      </w:pPr>
+      <w:r>
+        <w:rPr>
+          <w:sz w:val="44"/>
+          <w:szCs w:val="44"/>
+          <w:lang w:bidi="fa-IR"/>
+        </w:rPr>
+        <w:t xml:space="preserve">In other words, we take the </w:t>
+      </w:r>
+      <w:r>
+        <w:rPr>
+          <w:b/>
+          <w:bCs/>
+          <w:sz w:val="44"/>
+          <w:szCs w:val="44"/>
+          <w:lang w:bidi="fa-IR"/>
+        </w:rPr>
+        <w:t>completion</w:t>
+      </w:r>
+      <w:r>
+        <w:rPr>
+          <w:sz w:val="44"/>
+          <w:szCs w:val="44"/>
+          <w:lang w:bidi="fa-IR"/>
+        </w:rPr>
+        <w:t xml:space="preserve"> of the original space.</w:t>
+      </w:r>
+    </w:p>
+    <w:p>
+      <w:pPr>
+        <w:rPr>
+          <w:sz w:val="44"/>
+          <w:szCs w:val="44"/>
+          <w:lang w:bidi="fa-IR"/>
+        </w:rPr>
+      </w:pPr>
+      <w:r>
+        <w:rPr>
+          <w:sz w:val="44"/>
+          <w:szCs w:val="44"/>
+          <w:lang w:bidi="fa-IR"/>
+        </w:rPr>
+        <w:t>The completion of (C([-1,1])) with respect to the (L^1) norm is the space (L^1([-1,1])).</w:t>
+      </w:r>
+    </w:p>
+    <w:p>
+      <w:pPr>
+        <w:rPr>
+          <w:sz w:val="44"/>
+          <w:szCs w:val="44"/>
+          <w:lang w:bidi="fa-IR"/>
+        </w:rPr>
+      </w:pPr>
+      <w:r>
+        <w:rPr>
+          <w:sz w:val="44"/>
+          <w:szCs w:val="44"/>
+          <w:lang w:bidi="fa-IR"/>
+        </w:rPr>
+        <w:t>There is one important point to keep in mind.</w:t>
+      </w:r>
+    </w:p>
+    <w:p>
+      <w:pPr>
+        <w:rPr>
+          <w:sz w:val="44"/>
+          <w:szCs w:val="44"/>
+          <w:lang w:bidi="fa-IR"/>
+        </w:rPr>
+      </w:pPr>
+      <w:r>
+        <w:rPr>
+          <w:sz w:val="44"/>
+          <w:szCs w:val="44"/>
+          <w:lang w:bidi="fa-IR"/>
+        </w:rPr>
+        <w:t xml:space="preserve">In the space (L^1), two functions are considered to be the same if they are equal </w:t>
+      </w:r>
+      <w:r>
+        <w:rPr>
+          <w:b/>
+          <w:bCs/>
+          <w:sz w:val="44"/>
+          <w:szCs w:val="44"/>
+          <w:lang w:bidi="fa-IR"/>
+        </w:rPr>
+        <w:t>almost everywhere</w:t>
+      </w:r>
+      <w:r>
+        <w:rPr>
+          <w:sz w:val="44"/>
+          <w:szCs w:val="44"/>
+          <w:lang w:bidi="fa-IR"/>
+        </w:rPr>
+        <w:t>.</w:t>
+      </w:r>
+    </w:p>
+    <w:p>
+      <w:pPr>
+        <w:rPr>
+          <w:sz w:val="44"/>
+          <w:szCs w:val="44"/>
+          <w:lang w:bidi="fa-IR"/>
+        </w:rPr>
+      </w:pPr>
+      <w:r>
+        <w:rPr>
+          <w:sz w:val="44"/>
+          <w:szCs w:val="44"/>
+          <w:lang w:bidi="fa-IR"/>
+        </w:rPr>
+        <w:t xml:space="preserve">That means they are allowed to differ on a set of </w:t>
+      </w:r>
+      <w:r>
+        <w:rPr>
+          <w:b/>
+          <w:bCs/>
+          <w:sz w:val="44"/>
+          <w:szCs w:val="44"/>
+          <w:lang w:bidi="fa-IR"/>
+        </w:rPr>
+        <w:t>measure zero</w:t>
+      </w:r>
+      <w:r>
+        <w:rPr>
+          <w:sz w:val="44"/>
+          <w:szCs w:val="44"/>
+          <w:lang w:bidi="fa-IR"/>
+        </w:rPr>
+        <w:t>.</w:t>
+      </w:r>
+    </w:p>
+    <w:p>
+      <w:pPr>
+        <w:rPr>
+          <w:sz w:val="44"/>
+          <w:szCs w:val="44"/>
+          <w:lang w:bidi="fa-IR"/>
+        </w:rPr>
+      </w:pPr>
+      <w:r>
+        <w:rPr>
+          <w:sz w:val="44"/>
+          <w:szCs w:val="44"/>
+          <w:lang w:bidi="fa-IR"/>
+        </w:rPr>
+        <w:t xml:space="preserve">With this interpretation, and using exactly the same (L^1) norm as before, the completed space becomes a </w:t>
+      </w:r>
+      <w:r>
+        <w:rPr>
+          <w:b/>
+          <w:bCs/>
+          <w:sz w:val="44"/>
+          <w:szCs w:val="44"/>
+          <w:lang w:bidi="fa-IR"/>
+        </w:rPr>
+        <w:t>Banach space</w:t>
+      </w:r>
+      <w:r>
+        <w:rPr>
+          <w:sz w:val="44"/>
+          <w:szCs w:val="44"/>
+          <w:lang w:bidi="fa-IR"/>
+        </w:rPr>
+        <w:t>.</w:t>
+      </w:r>
+    </w:p>
+    <w:p>
+      <w:pPr>
+        <w:rPr>
+          <w:sz w:val="44"/>
+          <w:szCs w:val="44"/>
+          <w:lang w:bidi="fa-IR"/>
+        </w:rPr>
+      </w:pPr>
+      <w:r>
+        <w:rPr>
+          <w:sz w:val="44"/>
+          <w:szCs w:val="44"/>
+          <w:lang w:bidi="fa-IR"/>
+        </w:rPr>
+        <w:t xml:space="preserve">7 : </w:t>
+      </w:r>
+    </w:p>
+    <w:p>
+      <w:pPr>
+        <w:rPr>
+          <w:sz w:val="44"/>
+          <w:szCs w:val="44"/>
+          <w:lang w:bidi="fa-IR"/>
+        </w:rPr>
+      </w:pPr>
+      <w:r>
+        <w:rPr>
+          <w:sz w:val="44"/>
+          <w:szCs w:val="44"/>
+          <w:lang w:bidi="fa-IR"/>
+        </w:rPr>
+        <w:t xml:space="preserve">In this video, we explored </w:t>
+      </w:r>
+      <w:r>
+        <w:rPr>
+          <w:b/>
+          <w:bCs/>
+          <w:sz w:val="44"/>
+          <w:szCs w:val="44"/>
+          <w:lang w:bidi="fa-IR"/>
+        </w:rPr>
+        <w:t>Banach spaces</w:t>
+      </w:r>
+      <w:r>
+        <w:rPr>
+          <w:sz w:val="44"/>
+          <w:szCs w:val="44"/>
+          <w:lang w:bidi="fa-IR"/>
+        </w:rPr>
+        <w:t xml:space="preserve">, learned what it means for a normed space to be complete, </w:t>
+      </w:r>
+      <w:r>
+        <w:rPr>
+          <w:sz w:val="44"/>
+          <w:szCs w:val="44"/>
+          <w:lang w:bidi="fa-IR"/>
+        </w:rPr>
+        <w:lastRenderedPageBreak/>
+        <w:t>and looked at several examples to see when a normed space is—or is not—a Banach space.</w:t>
+      </w:r>
+    </w:p>
+    <w:p>
+      <w:pPr>
+        <w:rPr>
+          <w:sz w:val="44"/>
+          <w:szCs w:val="44"/>
+          <w:lang w:bidi="fa-IR"/>
+        </w:rPr>
+      </w:pPr>
+      <w:r>
+        <w:rPr>
+          <w:sz w:val="44"/>
+          <w:szCs w:val="44"/>
+          <w:lang w:bidi="fa-IR"/>
+        </w:rPr>
+        <w:t xml:space="preserve">In the next video, we'll move on to another fundamental concept in functional analysis: </w:t>
+      </w:r>
+      <w:r>
+        <w:rPr>
+          <w:b/>
+          <w:bCs/>
+          <w:sz w:val="44"/>
+          <w:szCs w:val="44"/>
+          <w:lang w:bidi="fa-IR"/>
+        </w:rPr>
+        <w:t>inner products</w:t>
+      </w:r>
+      <w:r>
+        <w:rPr>
+          <w:sz w:val="44"/>
+          <w:szCs w:val="44"/>
+          <w:lang w:bidi="fa-IR"/>
+        </w:rPr>
+        <w:t xml:space="preserve">. </w:t>
+      </w:r>
+    </w:p>
+    <w:p>
+      <w:pPr>
+        <w:rPr>
+          <w:rFonts w:hint="cs"/>
+          <w:sz w:val="44"/>
+          <w:szCs w:val="44"/>
+          <w:rtl/>
+          <w:lang w:bidi="fa-IR"/>
+        </w:rPr>
+      </w:pPr>
+      <w:r>
+        <w:rPr>
+          <w:sz w:val="44"/>
+          <w:szCs w:val="44"/>
+          <w:lang w:bidi="fa-IR"/>
+        </w:rPr>
+        <w:t>Thanks for watching, and I'll see you in the next video.</w:t>
+      </w:r>
     </w:p>
     <w:p>
       <w:pPr>
@@ -4453,9 +5616,116 @@
     <w:p>
       <w:pPr>
         <w:rPr>
-          <w:lang w:bidi="fa-IR"/>
-        </w:rPr>
-      </w:pPr>
+          <w:sz w:val="44"/>
+          <w:szCs w:val="44"/>
+          <w:lang w:bidi="fa-IR"/>
+        </w:rPr>
+      </w:pPr>
+      <w:r>
+        <w:rPr>
+          <w:sz w:val="44"/>
+          <w:szCs w:val="44"/>
+          <w:lang w:bidi="fa-IR"/>
+        </w:rPr>
+        <w:t xml:space="preserve">1 : </w:t>
+      </w:r>
+    </w:p>
+    <w:p>
+      <w:pPr>
+        <w:rPr>
+          <w:sz w:val="44"/>
+          <w:szCs w:val="44"/>
+          <w:lang w:bidi="fa-IR"/>
+        </w:rPr>
+      </w:pPr>
+      <w:r>
+        <w:rPr>
+          <w:sz w:val="44"/>
+          <w:szCs w:val="44"/>
+          <w:lang w:bidi="fa-IR"/>
+        </w:rPr>
+        <w:t xml:space="preserve">In the previous video, we introduced </w:t>
+      </w:r>
+      <w:r>
+        <w:rPr>
+          <w:b/>
+          <w:bCs/>
+          <w:sz w:val="44"/>
+          <w:szCs w:val="44"/>
+          <w:lang w:bidi="fa-IR"/>
+        </w:rPr>
+        <w:t>Banach spaces</w:t>
+      </w:r>
+      <w:r>
+        <w:rPr>
+          <w:sz w:val="44"/>
+          <w:szCs w:val="44"/>
+          <w:lang w:bidi="fa-IR"/>
+        </w:rPr>
+        <w:t xml:space="preserve"> and learned why completeness is such an important property in functional analysis.</w:t>
+      </w:r>
+    </w:p>
+    <w:p>
+      <w:pPr>
+        <w:rPr>
+          <w:sz w:val="44"/>
+          <w:szCs w:val="44"/>
+          <w:lang w:bidi="fa-IR"/>
+        </w:rPr>
+      </w:pPr>
+      <w:r>
+        <w:rPr>
+          <w:sz w:val="44"/>
+          <w:szCs w:val="44"/>
+          <w:lang w:bidi="fa-IR"/>
+        </w:rPr>
+        <w:t xml:space="preserve">In this video, we'll take the next step by exploring </w:t>
+      </w:r>
+      <w:r>
+        <w:rPr>
+          <w:b/>
+          <w:bCs/>
+          <w:sz w:val="44"/>
+          <w:szCs w:val="44"/>
+          <w:lang w:bidi="fa-IR"/>
+        </w:rPr>
+        <w:t>inner products</w:t>
+      </w:r>
+      <w:r>
+        <w:rPr>
+          <w:sz w:val="44"/>
+          <w:szCs w:val="44"/>
+          <w:lang w:bidi="fa-IR"/>
+        </w:rPr>
+        <w:t xml:space="preserve"> and </w:t>
+      </w:r>
+      <w:r>
+        <w:rPr>
+          <w:b/>
+          <w:bCs/>
+          <w:sz w:val="44"/>
+          <w:szCs w:val="44"/>
+          <w:lang w:bidi="fa-IR"/>
+        </w:rPr>
+        <w:t>inner product spaces</w:t>
+      </w:r>
+    </w:p>
+    <w:p>
+      <w:pPr>
+        <w:rPr>
+          <w:sz w:val="44"/>
+          <w:szCs w:val="44"/>
+          <w:lang w:bidi="fa-IR"/>
+        </w:rPr>
+      </w:pPr>
+      <w:r>
+        <w:rPr>
+          <w:sz w:val="44"/>
+          <w:szCs w:val="44"/>
+          <w:lang w:bidi="fa-IR"/>
+        </w:rPr>
+        <w:t>So, if you're ready, let's get started.</w:t>
+      </w:r>
     </w:p>
     <w:p>
       <w:pPr>
@@ -4510,6 +5780,7 @@
         <w:rPr>
           <w:lang w:bidi="fa-IR"/>
         </w:rPr>
+        <w:lastRenderedPageBreak/>
         <w:t>Orthogonality in inner product spaces</w:t>
       </w:r>
     </w:p>

</xml_diff>

<commit_message>
step 94 : add notes and start part 6
</commit_message>
<xml_diff>
--- a/video context/video_context_newVersion.docx
+++ b/video context/video_context_newVersion.docx
@@ -4350,7 +4350,6 @@
     <w:p>
       <w:pPr>
         <w:rPr>
-          <w:rFonts w:hint="cs"/>
           <w:sz w:val="44"/>
           <w:szCs w:val="44"/>
           <w:rtl/>
@@ -4828,7 +4827,6 @@
     <w:p>
       <w:pPr>
         <w:rPr>
-          <w:rFonts w:hint="cs"/>
           <w:b/>
           <w:bCs/>
           <w:sz w:val="44"/>
@@ -5583,6 +5581,1167 @@
     <w:p>
       <w:pPr>
         <w:rPr>
+          <w:sz w:val="44"/>
+          <w:szCs w:val="44"/>
+          <w:rtl/>
+          <w:lang w:bidi="fa-IR"/>
+        </w:rPr>
+      </w:pPr>
+      <w:r>
+        <w:rPr>
+          <w:sz w:val="44"/>
+          <w:szCs w:val="44"/>
+          <w:lang w:bidi="fa-IR"/>
+        </w:rPr>
+        <w:t>Thanks for watching, and I'll see you in the next video.</w:t>
+      </w:r>
+    </w:p>
+    <w:p>
+      <w:pPr>
+        <w:pStyle w:val="Heading2"/>
+        <w:rPr>
+          <w:lang w:bidi="fa-IR"/>
+        </w:rPr>
+      </w:pPr>
+      <w:r>
+        <w:rPr>
+          <w:lang w:bidi="fa-IR"/>
+        </w:rPr>
+        <w:t>Inner products</w:t>
+      </w:r>
+    </w:p>
+    <w:p>
+      <w:pPr>
+        <w:rPr>
+          <w:sz w:val="44"/>
+          <w:szCs w:val="44"/>
+          <w:lang w:bidi="fa-IR"/>
+        </w:rPr>
+      </w:pPr>
+      <w:r>
+        <w:rPr>
+          <w:sz w:val="44"/>
+          <w:szCs w:val="44"/>
+          <w:lang w:bidi="fa-IR"/>
+        </w:rPr>
+        <w:t xml:space="preserve">1 : </w:t>
+      </w:r>
+    </w:p>
+    <w:p>
+      <w:pPr>
+        <w:rPr>
+          <w:sz w:val="44"/>
+          <w:szCs w:val="44"/>
+          <w:lang w:bidi="fa-IR"/>
+        </w:rPr>
+      </w:pPr>
+      <w:r>
+        <w:rPr>
+          <w:sz w:val="44"/>
+          <w:szCs w:val="44"/>
+          <w:lang w:bidi="fa-IR"/>
+        </w:rPr>
+        <w:t xml:space="preserve">In the previous video, we introduced </w:t>
+      </w:r>
+      <w:r>
+        <w:rPr>
+          <w:b/>
+          <w:bCs/>
+          <w:sz w:val="44"/>
+          <w:szCs w:val="44"/>
+          <w:lang w:bidi="fa-IR"/>
+        </w:rPr>
+        <w:t>Banach spaces</w:t>
+      </w:r>
+      <w:r>
+        <w:rPr>
+          <w:sz w:val="44"/>
+          <w:szCs w:val="44"/>
+          <w:lang w:bidi="fa-IR"/>
+        </w:rPr>
+        <w:t xml:space="preserve"> and learned why completeness is such an important property in functional analysis.</w:t>
+      </w:r>
+    </w:p>
+    <w:p>
+      <w:pPr>
+        <w:rPr>
+          <w:sz w:val="44"/>
+          <w:szCs w:val="44"/>
+          <w:lang w:bidi="fa-IR"/>
+        </w:rPr>
+      </w:pPr>
+      <w:r>
+        <w:rPr>
+          <w:sz w:val="44"/>
+          <w:szCs w:val="44"/>
+          <w:lang w:bidi="fa-IR"/>
+        </w:rPr>
+        <w:t xml:space="preserve">In this video, we'll take the next step by exploring </w:t>
+      </w:r>
+      <w:r>
+        <w:rPr>
+          <w:b/>
+          <w:bCs/>
+          <w:sz w:val="44"/>
+          <w:szCs w:val="44"/>
+          <w:lang w:bidi="fa-IR"/>
+        </w:rPr>
+        <w:t>inner products</w:t>
+      </w:r>
+      <w:r>
+        <w:rPr>
+          <w:sz w:val="44"/>
+          <w:szCs w:val="44"/>
+          <w:lang w:bidi="fa-IR"/>
+        </w:rPr>
+        <w:t xml:space="preserve"> and </w:t>
+      </w:r>
+      <w:r>
+        <w:rPr>
+          <w:b/>
+          <w:bCs/>
+          <w:sz w:val="44"/>
+          <w:szCs w:val="44"/>
+          <w:lang w:bidi="fa-IR"/>
+        </w:rPr>
+        <w:t>inner product spaces</w:t>
+      </w:r>
+    </w:p>
+    <w:p>
+      <w:pPr>
+        <w:rPr>
+          <w:sz w:val="44"/>
+          <w:szCs w:val="44"/>
+          <w:lang w:bidi="fa-IR"/>
+        </w:rPr>
+      </w:pPr>
+      <w:r>
+        <w:rPr>
+          <w:sz w:val="44"/>
+          <w:szCs w:val="44"/>
+          <w:lang w:bidi="fa-IR"/>
+        </w:rPr>
+        <w:t>So, if you're ready, let's get started.</w:t>
+      </w:r>
+    </w:p>
+    <w:p>
+      <w:pPr>
+        <w:rPr>
+          <w:sz w:val="44"/>
+          <w:szCs w:val="44"/>
+          <w:lang w:bidi="fa-IR"/>
+        </w:rPr>
+      </w:pPr>
+      <w:r>
+        <w:rPr>
+          <w:sz w:val="44"/>
+          <w:szCs w:val="44"/>
+          <w:lang w:bidi="fa-IR"/>
+        </w:rPr>
+        <w:t xml:space="preserve">2 : </w:t>
+      </w:r>
+    </w:p>
+    <w:p>
+      <w:pPr>
+        <w:rPr>
+          <w:sz w:val="44"/>
+          <w:szCs w:val="44"/>
+          <w:lang w:bidi="fa-IR"/>
+        </w:rPr>
+      </w:pPr>
+      <w:r>
+        <w:rPr>
+          <w:b/>
+          <w:bCs/>
+          <w:sz w:val="44"/>
+          <w:szCs w:val="44"/>
+          <w:lang w:bidi="fa-IR"/>
+        </w:rPr>
+        <w:t>Let's begin by reviewing the concept of the dot product.</w:t>
+      </w:r>
+    </w:p>
+    <w:p>
+      <w:pPr>
+        <w:rPr>
+          <w:sz w:val="44"/>
+          <w:szCs w:val="44"/>
+          <w:rtl/>
+          <w:lang w:bidi="fa-IR"/>
+        </w:rPr>
+      </w:pPr>
+      <w:r>
+        <w:rPr>
+          <w:sz w:val="44"/>
+          <w:szCs w:val="44"/>
+          <w:lang w:bidi="fa-IR"/>
+        </w:rPr>
+        <w:lastRenderedPageBreak/>
+        <w:t>The dot product is a function that takes two vectors as its input and returns a single scalar value as its output.</w:t>
+      </w:r>
+    </w:p>
+    <w:p>
+      <w:pPr>
+        <w:rPr>
+          <w:sz w:val="44"/>
+          <w:szCs w:val="44"/>
+          <w:rtl/>
+          <w:lang w:bidi="fa-IR"/>
+        </w:rPr>
+      </w:pPr>
+      <w:r>
+        <w:rPr>
+          <w:sz w:val="44"/>
+          <w:szCs w:val="44"/>
+          <w:lang w:bidi="fa-IR"/>
+        </w:rPr>
+        <w:t>3:</w:t>
+      </w:r>
+      <w:r>
+        <w:rPr>
+          <w:sz w:val="44"/>
+          <w:szCs w:val="44"/>
+          <w:rtl/>
+          <w:lang w:bidi="fa-IR"/>
+        </w:rPr>
+        <w:br w:type="page"/>
+      </w:r>
+    </w:p>
+    <w:p>
+      <w:pPr>
+        <w:rPr>
+          <w:sz w:val="44"/>
+          <w:szCs w:val="44"/>
+          <w:lang w:bidi="fa-IR"/>
+        </w:rPr>
+      </w:pPr>
+      <w:r>
+        <w:rPr>
+          <w:b/>
+          <w:bCs/>
+          <w:sz w:val="44"/>
+          <w:szCs w:val="44"/>
+          <w:lang w:bidi="fa-IR"/>
+        </w:rPr>
+        <w:lastRenderedPageBreak/>
+        <w:t>Now, suppose</w:t>
+      </w:r>
+      <w:r>
+        <w:rPr>
+          <w:sz w:val="44"/>
+          <w:szCs w:val="44"/>
+          <w:lang w:bidi="fa-IR"/>
+        </w:rPr>
+        <w:t xml:space="preserve"> a\</w:t>
+      </w:r>
+      <w:proofErr w:type="spellStart"/>
+      <w:r>
+        <w:rPr>
+          <w:sz w:val="44"/>
+          <w:szCs w:val="44"/>
+          <w:lang w:bidi="fa-IR"/>
+        </w:rPr>
+        <w:t>mathbf</w:t>
+      </w:r>
+      <w:proofErr w:type="spellEnd"/>
+      <w:r>
+        <w:rPr>
+          <w:sz w:val="44"/>
+          <w:szCs w:val="44"/>
+          <w:lang w:bidi="fa-IR"/>
+        </w:rPr>
+        <w:t xml:space="preserve">{a}a </w:t>
+      </w:r>
+      <w:r>
+        <w:rPr>
+          <w:b/>
+          <w:bCs/>
+          <w:sz w:val="44"/>
+          <w:szCs w:val="44"/>
+          <w:lang w:bidi="fa-IR"/>
+        </w:rPr>
+        <w:t>and</w:t>
+      </w:r>
+      <w:r>
+        <w:rPr>
+          <w:sz w:val="44"/>
+          <w:szCs w:val="44"/>
+          <w:lang w:bidi="fa-IR"/>
+        </w:rPr>
+        <w:t xml:space="preserve"> b\</w:t>
+      </w:r>
+      <w:proofErr w:type="spellStart"/>
+      <w:r>
+        <w:rPr>
+          <w:sz w:val="44"/>
+          <w:szCs w:val="44"/>
+          <w:lang w:bidi="fa-IR"/>
+        </w:rPr>
+        <w:t>mathbf</w:t>
+      </w:r>
+      <w:proofErr w:type="spellEnd"/>
+      <w:r>
+        <w:rPr>
+          <w:sz w:val="44"/>
+          <w:szCs w:val="44"/>
+          <w:lang w:bidi="fa-IR"/>
+        </w:rPr>
+        <w:t xml:space="preserve">{b}b </w:t>
+      </w:r>
+      <w:r>
+        <w:rPr>
+          <w:b/>
+          <w:bCs/>
+          <w:sz w:val="44"/>
+          <w:szCs w:val="44"/>
+          <w:lang w:bidi="fa-IR"/>
+        </w:rPr>
+        <w:t xml:space="preserve">are two </w:t>
+      </w:r>
+      <w:proofErr w:type="spellStart"/>
+      <w:r>
+        <w:rPr>
+          <w:b/>
+          <w:bCs/>
+          <w:sz w:val="44"/>
+          <w:szCs w:val="44"/>
+          <w:lang w:bidi="fa-IR"/>
+        </w:rPr>
+        <w:t>nnn</w:t>
+      </w:r>
+      <w:proofErr w:type="spellEnd"/>
+      <w:r>
+        <w:rPr>
+          <w:b/>
+          <w:bCs/>
+          <w:sz w:val="44"/>
+          <w:szCs w:val="44"/>
+          <w:lang w:bidi="fa-IR"/>
+        </w:rPr>
+        <w:t>-dimensional vectors, as shown on the screen.</w:t>
+      </w:r>
+    </w:p>
+    <w:p>
+      <w:pPr>
+        <w:rPr>
+          <w:sz w:val="44"/>
+          <w:szCs w:val="44"/>
+          <w:lang w:bidi="fa-IR"/>
+        </w:rPr>
+      </w:pPr>
+      <w:r>
+        <w:rPr>
+          <w:sz w:val="44"/>
+          <w:szCs w:val="44"/>
+          <w:lang w:bidi="fa-IR"/>
+        </w:rPr>
+        <w:t>To compute their dot product, we use the following formula.</w:t>
+      </w:r>
+    </w:p>
+    <w:p>
+      <w:pPr>
+        <w:rPr>
+          <w:sz w:val="44"/>
+          <w:szCs w:val="44"/>
+          <w:lang w:bidi="fa-IR"/>
+        </w:rPr>
+      </w:pPr>
+      <w:r>
+        <w:rPr>
+          <w:sz w:val="44"/>
+          <w:szCs w:val="44"/>
+          <w:lang w:bidi="fa-IR"/>
+        </w:rPr>
+        <w:t>In other words, we multiply each pair of corresponding components and then add all the resulting products together.</w:t>
+      </w:r>
+    </w:p>
+    <w:p>
+      <w:pPr>
+        <w:rPr>
+          <w:sz w:val="44"/>
+          <w:szCs w:val="44"/>
+          <w:lang w:bidi="fa-IR"/>
+        </w:rPr>
+      </w:pPr>
+      <w:r>
+        <w:rPr>
+          <w:sz w:val="44"/>
+          <w:szCs w:val="44"/>
+          <w:lang w:bidi="fa-IR"/>
+        </w:rPr>
+        <w:t xml:space="preserve">4 : </w:t>
+      </w:r>
+    </w:p>
+    <w:p>
+      <w:pPr>
+        <w:rPr>
+          <w:sz w:val="44"/>
+          <w:szCs w:val="44"/>
+          <w:lang w:bidi="fa-IR"/>
+        </w:rPr>
+      </w:pPr>
+      <w:r>
+        <w:rPr>
+          <w:sz w:val="44"/>
+          <w:szCs w:val="44"/>
+          <w:lang w:bidi="fa-IR"/>
+        </w:rPr>
+        <w:t>At the same time, we can also use the dot product to determine the angle between two vectors.</w:t>
+      </w:r>
+    </w:p>
+    <w:p>
+      <w:pPr>
+        <w:rPr>
+          <w:sz w:val="44"/>
+          <w:szCs w:val="44"/>
+          <w:lang w:bidi="fa-IR"/>
+        </w:rPr>
+      </w:pPr>
+      <w:r>
+        <w:rPr>
+          <w:sz w:val="44"/>
+          <w:szCs w:val="44"/>
+          <w:lang w:bidi="fa-IR"/>
+        </w:rPr>
+        <w:t>To do that, let's start with the following formula.</w:t>
+      </w:r>
+    </w:p>
+    <w:p>
+      <w:pPr>
+        <w:rPr>
+          <w:sz w:val="44"/>
+          <w:szCs w:val="44"/>
+          <w:lang w:bidi="fa-IR"/>
+        </w:rPr>
+      </w:pPr>
+      <w:r>
+        <w:rPr>
+          <w:sz w:val="44"/>
+          <w:szCs w:val="44"/>
+          <w:lang w:bidi="fa-IR"/>
+        </w:rPr>
+        <w:t>Now, let's see what this formula represents geometrically in two-dimensional space.</w:t>
+      </w:r>
+    </w:p>
+    <w:p>
+      <w:pPr>
+        <w:rPr>
+          <w:sz w:val="44"/>
+          <w:szCs w:val="44"/>
+          <w:lang w:bidi="fa-IR"/>
+        </w:rPr>
+      </w:pPr>
+      <w:r>
+        <w:rPr>
+          <w:sz w:val="44"/>
+          <w:szCs w:val="44"/>
+          <w:lang w:bidi="fa-IR"/>
+        </w:rPr>
+        <w:t xml:space="preserve">Suppose we have two vectors, </w:t>
+      </w:r>
+      <w:r>
+        <w:rPr>
+          <w:b/>
+          <w:bCs/>
+          <w:sz w:val="44"/>
+          <w:szCs w:val="44"/>
+          <w:lang w:bidi="fa-IR"/>
+        </w:rPr>
+        <w:t>(\</w:t>
+      </w:r>
+      <w:proofErr w:type="spellStart"/>
+      <w:r>
+        <w:rPr>
+          <w:b/>
+          <w:bCs/>
+          <w:sz w:val="44"/>
+          <w:szCs w:val="44"/>
+          <w:lang w:bidi="fa-IR"/>
+        </w:rPr>
+        <w:t>mathbf</w:t>
+      </w:r>
+      <w:proofErr w:type="spellEnd"/>
+      <w:r>
+        <w:rPr>
+          <w:b/>
+          <w:bCs/>
+          <w:sz w:val="44"/>
+          <w:szCs w:val="44"/>
+          <w:lang w:bidi="fa-IR"/>
+        </w:rPr>
+        <w:t>{a})</w:t>
+      </w:r>
+      <w:r>
+        <w:rPr>
+          <w:sz w:val="44"/>
+          <w:szCs w:val="44"/>
+          <w:lang w:bidi="fa-IR"/>
+        </w:rPr>
+        <w:t xml:space="preserve"> and </w:t>
+      </w:r>
+      <w:r>
+        <w:rPr>
+          <w:b/>
+          <w:bCs/>
+          <w:sz w:val="44"/>
+          <w:szCs w:val="44"/>
+          <w:lang w:bidi="fa-IR"/>
+        </w:rPr>
+        <w:t>(\</w:t>
+      </w:r>
+      <w:proofErr w:type="spellStart"/>
+      <w:r>
+        <w:rPr>
+          <w:b/>
+          <w:bCs/>
+          <w:sz w:val="44"/>
+          <w:szCs w:val="44"/>
+          <w:lang w:bidi="fa-IR"/>
+        </w:rPr>
+        <w:t>mathbf</w:t>
+      </w:r>
+      <w:proofErr w:type="spellEnd"/>
+      <w:r>
+        <w:rPr>
+          <w:b/>
+          <w:bCs/>
+          <w:sz w:val="44"/>
+          <w:szCs w:val="44"/>
+          <w:lang w:bidi="fa-IR"/>
+        </w:rPr>
+        <w:t>{b})</w:t>
+      </w:r>
+      <w:r>
+        <w:rPr>
+          <w:sz w:val="44"/>
+          <w:szCs w:val="44"/>
+          <w:lang w:bidi="fa-IR"/>
+        </w:rPr>
+        <w:t xml:space="preserve">, with an angle </w:t>
+      </w:r>
+      <w:r>
+        <w:rPr>
+          <w:b/>
+          <w:bCs/>
+          <w:sz w:val="44"/>
+          <w:szCs w:val="44"/>
+          <w:lang w:bidi="fa-IR"/>
+        </w:rPr>
+        <w:t>(\theta)</w:t>
+      </w:r>
+      <w:r>
+        <w:rPr>
+          <w:sz w:val="44"/>
+          <w:szCs w:val="44"/>
+          <w:lang w:bidi="fa-IR"/>
+        </w:rPr>
+        <w:t xml:space="preserve"> between them.</w:t>
+      </w:r>
+    </w:p>
+    <w:p>
+      <w:pPr>
+        <w:rPr>
+          <w:sz w:val="44"/>
+          <w:szCs w:val="44"/>
+          <w:lang w:bidi="fa-IR"/>
+        </w:rPr>
+      </w:pPr>
+      <w:r>
+        <w:rPr>
+          <w:sz w:val="44"/>
+          <w:szCs w:val="44"/>
+          <w:lang w:bidi="fa-IR"/>
+        </w:rPr>
+        <w:t xml:space="preserve">As you can see, the term </w:t>
+      </w:r>
+      <w:r>
+        <w:rPr>
+          <w:b/>
+          <w:bCs/>
+          <w:sz w:val="44"/>
+          <w:szCs w:val="44"/>
+          <w:lang w:bidi="fa-IR"/>
+        </w:rPr>
+        <w:t>in blue</w:t>
+      </w:r>
+      <w:r>
+        <w:rPr>
+          <w:sz w:val="44"/>
+          <w:szCs w:val="44"/>
+          <w:lang w:bidi="fa-IR"/>
+        </w:rPr>
+        <w:t xml:space="preserve"> gives the projection of </w:t>
+      </w:r>
+      <w:r>
+        <w:rPr>
+          <w:b/>
+          <w:bCs/>
+          <w:sz w:val="44"/>
+          <w:szCs w:val="44"/>
+          <w:lang w:bidi="fa-IR"/>
+        </w:rPr>
+        <w:t>(\</w:t>
+      </w:r>
+      <w:proofErr w:type="spellStart"/>
+      <w:r>
+        <w:rPr>
+          <w:b/>
+          <w:bCs/>
+          <w:sz w:val="44"/>
+          <w:szCs w:val="44"/>
+          <w:lang w:bidi="fa-IR"/>
+        </w:rPr>
+        <w:t>mathbf</w:t>
+      </w:r>
+      <w:proofErr w:type="spellEnd"/>
+      <w:r>
+        <w:rPr>
+          <w:b/>
+          <w:bCs/>
+          <w:sz w:val="44"/>
+          <w:szCs w:val="44"/>
+          <w:lang w:bidi="fa-IR"/>
+        </w:rPr>
+        <w:t>{b})</w:t>
+      </w:r>
+      <w:r>
+        <w:rPr>
+          <w:sz w:val="44"/>
+          <w:szCs w:val="44"/>
+          <w:lang w:bidi="fa-IR"/>
+        </w:rPr>
+        <w:t xml:space="preserve"> onto </w:t>
+      </w:r>
+      <w:r>
+        <w:rPr>
+          <w:b/>
+          <w:bCs/>
+          <w:sz w:val="44"/>
+          <w:szCs w:val="44"/>
+          <w:lang w:bidi="fa-IR"/>
+        </w:rPr>
+        <w:t>(\</w:t>
+      </w:r>
+      <w:proofErr w:type="spellStart"/>
+      <w:r>
+        <w:rPr>
+          <w:b/>
+          <w:bCs/>
+          <w:sz w:val="44"/>
+          <w:szCs w:val="44"/>
+          <w:lang w:bidi="fa-IR"/>
+        </w:rPr>
+        <w:t>mathbf</w:t>
+      </w:r>
+      <w:proofErr w:type="spellEnd"/>
+      <w:r>
+        <w:rPr>
+          <w:b/>
+          <w:bCs/>
+          <w:sz w:val="44"/>
+          <w:szCs w:val="44"/>
+          <w:lang w:bidi="fa-IR"/>
+        </w:rPr>
+        <w:t>{a})</w:t>
+      </w:r>
+      <w:r>
+        <w:rPr>
+          <w:sz w:val="44"/>
+          <w:szCs w:val="44"/>
+          <w:lang w:bidi="fa-IR"/>
+        </w:rPr>
+        <w:t xml:space="preserve">. Multiplying this </w:t>
+      </w:r>
+      <w:r>
+        <w:rPr>
+          <w:sz w:val="44"/>
+          <w:szCs w:val="44"/>
+          <w:lang w:bidi="fa-IR"/>
+        </w:rPr>
+        <w:lastRenderedPageBreak/>
+        <w:t xml:space="preserve">projected length by the magnitude of </w:t>
+      </w:r>
+      <w:r>
+        <w:rPr>
+          <w:b/>
+          <w:bCs/>
+          <w:sz w:val="44"/>
+          <w:szCs w:val="44"/>
+          <w:lang w:bidi="fa-IR"/>
+        </w:rPr>
+        <w:t>(\</w:t>
+      </w:r>
+      <w:proofErr w:type="spellStart"/>
+      <w:r>
+        <w:rPr>
+          <w:b/>
+          <w:bCs/>
+          <w:sz w:val="44"/>
+          <w:szCs w:val="44"/>
+          <w:lang w:bidi="fa-IR"/>
+        </w:rPr>
+        <w:t>mathbf</w:t>
+      </w:r>
+      <w:proofErr w:type="spellEnd"/>
+      <w:r>
+        <w:rPr>
+          <w:b/>
+          <w:bCs/>
+          <w:sz w:val="44"/>
+          <w:szCs w:val="44"/>
+          <w:lang w:bidi="fa-IR"/>
+        </w:rPr>
+        <w:t>{a})</w:t>
+      </w:r>
+      <w:r>
+        <w:rPr>
+          <w:sz w:val="44"/>
+          <w:szCs w:val="44"/>
+          <w:lang w:bidi="fa-IR"/>
+        </w:rPr>
+        <w:t xml:space="preserve"> gives us the dot product of the two vectors.</w:t>
+      </w:r>
+    </w:p>
+    <w:p>
+      <w:pPr>
+        <w:rPr>
+          <w:sz w:val="44"/>
+          <w:szCs w:val="44"/>
+          <w:lang w:bidi="fa-IR"/>
+        </w:rPr>
+      </w:pPr>
+      <w:r>
+        <w:rPr>
+          <w:sz w:val="44"/>
+          <w:szCs w:val="44"/>
+          <w:lang w:bidi="fa-IR"/>
+        </w:rPr>
+        <w:t>The sign of the dot product depends on the angle between the vectors.</w:t>
+      </w:r>
+    </w:p>
+    <w:p>
+      <w:pPr>
+        <w:rPr>
+          <w:sz w:val="44"/>
+          <w:szCs w:val="44"/>
+          <w:lang w:bidi="fa-IR"/>
+        </w:rPr>
+      </w:pPr>
+      <w:r>
+        <w:rPr>
+          <w:sz w:val="44"/>
+          <w:szCs w:val="44"/>
+          <w:lang w:bidi="fa-IR"/>
+        </w:rPr>
+        <w:t xml:space="preserve">If the angle is </w:t>
+      </w:r>
+      <w:r>
+        <w:rPr>
+          <w:b/>
+          <w:bCs/>
+          <w:sz w:val="44"/>
+          <w:szCs w:val="44"/>
+          <w:lang w:bidi="fa-IR"/>
+        </w:rPr>
+        <w:t>less than (90^\circ)</w:t>
+      </w:r>
+      <w:r>
+        <w:rPr>
+          <w:sz w:val="44"/>
+          <w:szCs w:val="44"/>
+          <w:lang w:bidi="fa-IR"/>
+        </w:rPr>
+        <w:t xml:space="preserve">, the dot product is </w:t>
+      </w:r>
+      <w:r>
+        <w:rPr>
+          <w:b/>
+          <w:bCs/>
+          <w:sz w:val="44"/>
+          <w:szCs w:val="44"/>
+          <w:lang w:bidi="fa-IR"/>
+        </w:rPr>
+        <w:t>positive</w:t>
+      </w:r>
+      <w:r>
+        <w:rPr>
+          <w:sz w:val="44"/>
+          <w:szCs w:val="44"/>
+          <w:lang w:bidi="fa-IR"/>
+        </w:rPr>
+        <w:t>.</w:t>
+      </w:r>
+      <w:r>
+        <w:rPr>
+          <w:sz w:val="44"/>
+          <w:szCs w:val="44"/>
+          <w:lang w:bidi="fa-IR"/>
+        </w:rPr>
+        <w:br/>
+        <w:t xml:space="preserve">If the angle is </w:t>
+      </w:r>
+      <w:r>
+        <w:rPr>
+          <w:b/>
+          <w:bCs/>
+          <w:sz w:val="44"/>
+          <w:szCs w:val="44"/>
+          <w:lang w:bidi="fa-IR"/>
+        </w:rPr>
+        <w:t>exactly (90^\circ)</w:t>
+      </w:r>
+      <w:r>
+        <w:rPr>
+          <w:sz w:val="44"/>
+          <w:szCs w:val="44"/>
+          <w:lang w:bidi="fa-IR"/>
+        </w:rPr>
+        <w:t xml:space="preserve">, the dot product is </w:t>
+      </w:r>
+      <w:r>
+        <w:rPr>
+          <w:b/>
+          <w:bCs/>
+          <w:sz w:val="44"/>
+          <w:szCs w:val="44"/>
+          <w:lang w:bidi="fa-IR"/>
+        </w:rPr>
+        <w:t>zero</w:t>
+      </w:r>
+      <w:r>
+        <w:rPr>
+          <w:sz w:val="44"/>
+          <w:szCs w:val="44"/>
+          <w:lang w:bidi="fa-IR"/>
+        </w:rPr>
+        <w:t>.</w:t>
+      </w:r>
+      <w:r>
+        <w:rPr>
+          <w:sz w:val="44"/>
+          <w:szCs w:val="44"/>
+          <w:lang w:bidi="fa-IR"/>
+        </w:rPr>
+        <w:br/>
+        <w:t xml:space="preserve">And if the angle is </w:t>
+      </w:r>
+      <w:r>
+        <w:rPr>
+          <w:b/>
+          <w:bCs/>
+          <w:sz w:val="44"/>
+          <w:szCs w:val="44"/>
+          <w:lang w:bidi="fa-IR"/>
+        </w:rPr>
+        <w:t>greater than (90^\circ)</w:t>
+      </w:r>
+      <w:r>
+        <w:rPr>
+          <w:sz w:val="44"/>
+          <w:szCs w:val="44"/>
+          <w:lang w:bidi="fa-IR"/>
+        </w:rPr>
+        <w:t xml:space="preserve">, the dot product is </w:t>
+      </w:r>
+      <w:r>
+        <w:rPr>
+          <w:b/>
+          <w:bCs/>
+          <w:sz w:val="44"/>
+          <w:szCs w:val="44"/>
+          <w:lang w:bidi="fa-IR"/>
+        </w:rPr>
+        <w:t>negative</w:t>
+      </w:r>
+      <w:r>
+        <w:rPr>
+          <w:sz w:val="44"/>
+          <w:szCs w:val="44"/>
+          <w:lang w:bidi="fa-IR"/>
+        </w:rPr>
+        <w:t>.</w:t>
+      </w:r>
+    </w:p>
+    <w:p>
+      <w:pPr>
+        <w:rPr>
+          <w:sz w:val="44"/>
+          <w:szCs w:val="44"/>
+          <w:lang w:bidi="fa-IR"/>
+        </w:rPr>
+      </w:pPr>
+      <w:r>
+        <w:rPr>
+          <w:sz w:val="44"/>
+          <w:szCs w:val="44"/>
+          <w:lang w:bidi="fa-IR"/>
+        </w:rPr>
+        <w:t>Finally, by rearranging this equation as shown, we obtain a formula that allows us to compute the angle between any two vectors.</w:t>
+      </w:r>
+    </w:p>
+    <w:p>
+      <w:pPr>
+        <w:rPr>
+          <w:sz w:val="44"/>
+          <w:szCs w:val="44"/>
+          <w:lang w:bidi="fa-IR"/>
+        </w:rPr>
+      </w:pPr>
+      <w:r>
+        <w:rPr>
+          <w:sz w:val="44"/>
+          <w:szCs w:val="44"/>
+          <w:lang w:bidi="fa-IR"/>
+        </w:rPr>
+        <w:t xml:space="preserve">5 : </w:t>
+      </w:r>
+    </w:p>
+    <w:p>
+      <w:pPr>
+        <w:rPr>
+          <w:sz w:val="44"/>
+          <w:szCs w:val="44"/>
+          <w:lang w:bidi="fa-IR"/>
+        </w:rPr>
+      </w:pPr>
+      <w:r>
+        <w:rPr>
+          <w:sz w:val="44"/>
+          <w:szCs w:val="44"/>
+          <w:lang w:bidi="fa-IR"/>
+        </w:rPr>
+        <w:t>This question led mathematicians to define the concept of an inner product</w:t>
+      </w:r>
+    </w:p>
+    <w:p>
+      <w:pPr>
+        <w:rPr>
+          <w:sz w:val="44"/>
+          <w:szCs w:val="44"/>
+          <w:lang w:bidi="fa-IR"/>
+        </w:rPr>
+      </w:pPr>
+      <w:r>
+        <w:rPr>
+          <w:sz w:val="44"/>
+          <w:szCs w:val="44"/>
+          <w:lang w:bidi="fa-IR"/>
+        </w:rPr>
+        <w:t xml:space="preserve">n </w:t>
+      </w:r>
+      <w:r>
+        <w:rPr>
+          <w:b/>
+          <w:bCs/>
+          <w:sz w:val="44"/>
+          <w:szCs w:val="44"/>
+          <w:lang w:bidi="fa-IR"/>
+        </w:rPr>
+        <w:t>inner product</w:t>
+      </w:r>
+      <w:r>
+        <w:rPr>
+          <w:sz w:val="44"/>
+          <w:szCs w:val="44"/>
+          <w:lang w:bidi="fa-IR"/>
+        </w:rPr>
+        <w:t xml:space="preserve"> on a vector space X is a function</w:t>
+      </w:r>
+    </w:p>
+    <w:p>
+      <w:pPr>
+        <w:rPr>
+          <w:sz w:val="44"/>
+          <w:szCs w:val="44"/>
+          <w:lang w:bidi="fa-IR"/>
+        </w:rPr>
+      </w:pPr>
+      <w:r>
+        <w:rPr>
+          <w:rFonts w:ascii="Cambria Math" w:hAnsi="Cambria Math" w:cs="Cambria Math"/>
+          <w:sz w:val="44"/>
+          <w:szCs w:val="44"/>
+          <w:lang w:bidi="fa-IR"/>
+        </w:rPr>
+        <w:t>⟨⋅</w:t>
+      </w:r>
+      <w:r>
+        <w:rPr>
+          <w:sz w:val="44"/>
+          <w:szCs w:val="44"/>
+          <w:lang w:bidi="fa-IR"/>
+        </w:rPr>
+        <w:t>,</w:t>
+      </w:r>
+      <w:r>
+        <w:rPr>
+          <w:rFonts w:ascii="Cambria Math" w:hAnsi="Cambria Math" w:cs="Cambria Math"/>
+          <w:sz w:val="44"/>
+          <w:szCs w:val="44"/>
+          <w:lang w:bidi="fa-IR"/>
+        </w:rPr>
+        <w:t>⋅⟩</w:t>
+      </w:r>
+      <w:r>
+        <w:rPr>
+          <w:sz w:val="44"/>
+          <w:szCs w:val="44"/>
+          <w:lang w:bidi="fa-IR"/>
+        </w:rPr>
+        <w:t xml:space="preserve">:X×X→K </w:t>
+      </w:r>
+    </w:p>
+    <w:p>
+      <w:pPr>
+        <w:rPr>
+          <w:sz w:val="44"/>
+          <w:szCs w:val="44"/>
+          <w:lang w:bidi="fa-IR"/>
+        </w:rPr>
+      </w:pPr>
+      <w:r>
+        <w:rPr>
+          <w:sz w:val="44"/>
+          <w:szCs w:val="44"/>
+          <w:lang w:bidi="fa-IR"/>
+        </w:rPr>
+        <w:lastRenderedPageBreak/>
+        <w:t>that satisfies the following properties</w:t>
+      </w:r>
+      <w:r>
+        <w:rPr>
+          <w:sz w:val="44"/>
+          <w:szCs w:val="44"/>
+          <w:lang w:bidi="fa-IR"/>
+        </w:rPr>
+        <w:t>:</w:t>
+      </w:r>
+    </w:p>
+    <w:p>
+      <w:pPr>
+        <w:rPr>
+          <w:sz w:val="44"/>
+          <w:szCs w:val="44"/>
+          <w:lang w:bidi="fa-IR"/>
+        </w:rPr>
+      </w:pPr>
+      <w:r>
+        <w:rPr>
+          <w:sz w:val="44"/>
+          <w:szCs w:val="44"/>
+          <w:lang w:bidi="fa-IR"/>
+        </w:rPr>
+        <w:t xml:space="preserve">  </w:t>
+      </w:r>
+      <w:r>
+        <w:rPr>
+          <w:b/>
+          <w:bCs/>
+          <w:sz w:val="44"/>
+          <w:szCs w:val="44"/>
+          <w:lang w:bidi="fa-IR"/>
+        </w:rPr>
+        <w:t>IP1:</w:t>
+      </w:r>
+      <w:r>
+        <w:rPr>
+          <w:sz w:val="44"/>
+          <w:szCs w:val="44"/>
+          <w:lang w:bidi="fa-IR"/>
+        </w:rPr>
+        <w:t xml:space="preserve"> Additivity (or Linearity in the First Argument) </w:t>
+      </w:r>
+    </w:p>
+    <w:p>
+      <w:pPr>
+        <w:rPr>
+          <w:sz w:val="44"/>
+          <w:szCs w:val="44"/>
+          <w:lang w:bidi="fa-IR"/>
+        </w:rPr>
+      </w:pPr>
+      <w:r>
+        <w:rPr>
+          <w:sz w:val="44"/>
+          <w:szCs w:val="44"/>
+          <w:lang w:bidi="fa-IR"/>
+        </w:rPr>
+        <w:t xml:space="preserve">  </w:t>
+      </w:r>
+      <w:r>
+        <w:rPr>
+          <w:b/>
+          <w:bCs/>
+          <w:sz w:val="44"/>
+          <w:szCs w:val="44"/>
+          <w:lang w:bidi="fa-IR"/>
+        </w:rPr>
+        <w:t>IP2:</w:t>
+      </w:r>
+      <w:r>
+        <w:rPr>
+          <w:sz w:val="44"/>
+          <w:szCs w:val="44"/>
+          <w:lang w:bidi="fa-IR"/>
+        </w:rPr>
+        <w:t xml:space="preserve"> Homogeneity (or Scalar Homogeneity) </w:t>
+      </w:r>
+    </w:p>
+    <w:p>
+      <w:pPr>
+        <w:rPr>
+          <w:sz w:val="44"/>
+          <w:szCs w:val="44"/>
+          <w:lang w:bidi="fa-IR"/>
+        </w:rPr>
+      </w:pPr>
+      <w:r>
+        <w:rPr>
+          <w:sz w:val="44"/>
+          <w:szCs w:val="44"/>
+          <w:lang w:bidi="fa-IR"/>
+        </w:rPr>
+        <w:t xml:space="preserve">  </w:t>
+      </w:r>
+      <w:r>
+        <w:rPr>
+          <w:b/>
+          <w:bCs/>
+          <w:sz w:val="44"/>
+          <w:szCs w:val="44"/>
+          <w:lang w:bidi="fa-IR"/>
+        </w:rPr>
+        <w:t>IP3:</w:t>
+      </w:r>
+      <w:r>
+        <w:rPr>
+          <w:sz w:val="44"/>
+          <w:szCs w:val="44"/>
+          <w:lang w:bidi="fa-IR"/>
+        </w:rPr>
+        <w:t xml:space="preserve"> Conjugate Symmetry </w:t>
+      </w:r>
+      <w:r>
+        <w:rPr>
+          <w:i/>
+          <w:iCs/>
+          <w:sz w:val="44"/>
+          <w:szCs w:val="44"/>
+          <w:lang w:bidi="fa-IR"/>
+        </w:rPr>
+        <w:t>(Symmetry over real vector spaces)</w:t>
+      </w:r>
+      <w:r>
+        <w:rPr>
+          <w:sz w:val="44"/>
+          <w:szCs w:val="44"/>
+          <w:lang w:bidi="fa-IR"/>
+        </w:rPr>
+        <w:t xml:space="preserve"> </w:t>
+      </w:r>
+    </w:p>
+    <w:p>
+      <w:pPr>
+        <w:rPr>
           <w:rFonts w:hint="cs"/>
           <w:sz w:val="44"/>
           <w:szCs w:val="44"/>
@@ -5596,8 +6755,52 @@
           <w:szCs w:val="44"/>
           <w:lang w:bidi="fa-IR"/>
         </w:rPr>
-        <w:t>Thanks for watching, and I'll see you in the next video.</w:t>
-      </w:r>
+        <w:t xml:space="preserve">  </w:t>
+      </w:r>
+      <w:r>
+        <w:rPr>
+          <w:b/>
+          <w:bCs/>
+          <w:sz w:val="44"/>
+          <w:szCs w:val="44"/>
+          <w:lang w:bidi="fa-IR"/>
+        </w:rPr>
+        <w:t>IP4:</w:t>
+      </w:r>
+      <w:r>
+        <w:rPr>
+          <w:sz w:val="44"/>
+          <w:szCs w:val="44"/>
+          <w:lang w:bidi="fa-IR"/>
+        </w:rPr>
+        <w:t xml:space="preserve"> Positive Definiteness</w:t>
+      </w:r>
+      <w:r>
+        <w:rPr>
+          <w:sz w:val="44"/>
+          <w:szCs w:val="44"/>
+          <w:rtl/>
+          <w:lang w:bidi="fa-IR"/>
+        </w:rPr>
+        <w:br/>
+      </w:r>
+      <w:r>
+        <w:rPr>
+          <w:sz w:val="44"/>
+          <w:szCs w:val="44"/>
+          <w:lang w:bidi="fa-IR"/>
+        </w:rPr>
+        <w:t>This is also considered part of the Positive Definiteness property</w:t>
+      </w:r>
+    </w:p>
+    <w:p>
+      <w:pPr>
+        <w:rPr>
+          <w:sz w:val="44"/>
+          <w:szCs w:val="44"/>
+          <w:lang w:bidi="fa-IR"/>
+        </w:rPr>
+      </w:pPr>
     </w:p>
     <w:p>
       <w:pPr>
@@ -5610,122 +6813,15 @@
         <w:rPr>
           <w:lang w:bidi="fa-IR"/>
         </w:rPr>
-        <w:t>Inner products</w:t>
-      </w:r>
-    </w:p>
-    <w:p>
-      <w:pPr>
-        <w:rPr>
-          <w:sz w:val="44"/>
-          <w:szCs w:val="44"/>
-          <w:lang w:bidi="fa-IR"/>
-        </w:rPr>
-      </w:pPr>
-      <w:r>
-        <w:rPr>
-          <w:sz w:val="44"/>
-          <w:szCs w:val="44"/>
-          <w:lang w:bidi="fa-IR"/>
-        </w:rPr>
-        <w:t xml:space="preserve">1 : </w:t>
-      </w:r>
-    </w:p>
-    <w:p>
-      <w:pPr>
-        <w:rPr>
-          <w:sz w:val="44"/>
-          <w:szCs w:val="44"/>
-          <w:lang w:bidi="fa-IR"/>
-        </w:rPr>
-      </w:pPr>
-      <w:r>
-        <w:rPr>
-          <w:sz w:val="44"/>
-          <w:szCs w:val="44"/>
-          <w:lang w:bidi="fa-IR"/>
-        </w:rPr>
-        <w:t xml:space="preserve">In the previous video, we introduced </w:t>
-      </w:r>
-      <w:r>
-        <w:rPr>
-          <w:b/>
-          <w:bCs/>
-          <w:sz w:val="44"/>
-          <w:szCs w:val="44"/>
-          <w:lang w:bidi="fa-IR"/>
-        </w:rPr>
-        <w:t>Banach spaces</w:t>
-      </w:r>
-      <w:r>
-        <w:rPr>
-          <w:sz w:val="44"/>
-          <w:szCs w:val="44"/>
-          <w:lang w:bidi="fa-IR"/>
-        </w:rPr>
-        <w:t xml:space="preserve"> and learned why completeness is such an important property in functional analysis.</w:t>
-      </w:r>
-    </w:p>
-    <w:p>
-      <w:pPr>
-        <w:rPr>
-          <w:sz w:val="44"/>
-          <w:szCs w:val="44"/>
-          <w:lang w:bidi="fa-IR"/>
-        </w:rPr>
-      </w:pPr>
-      <w:r>
-        <w:rPr>
-          <w:sz w:val="44"/>
-          <w:szCs w:val="44"/>
-          <w:lang w:bidi="fa-IR"/>
-        </w:rPr>
-        <w:t xml:space="preserve">In this video, we'll take the next step by exploring </w:t>
-      </w:r>
-      <w:r>
-        <w:rPr>
-          <w:b/>
-          <w:bCs/>
-          <w:sz w:val="44"/>
-          <w:szCs w:val="44"/>
-          <w:lang w:bidi="fa-IR"/>
-        </w:rPr>
-        <w:t>inner products</w:t>
-      </w:r>
-      <w:r>
-        <w:rPr>
-          <w:sz w:val="44"/>
-          <w:szCs w:val="44"/>
-          <w:lang w:bidi="fa-IR"/>
-        </w:rPr>
-        <w:t xml:space="preserve"> and </w:t>
-      </w:r>
-      <w:r>
-        <w:rPr>
-          <w:b/>
-          <w:bCs/>
-          <w:sz w:val="44"/>
-          <w:szCs w:val="44"/>
-          <w:lang w:bidi="fa-IR"/>
-        </w:rPr>
-        <w:t>inner product spaces</w:t>
-      </w:r>
-    </w:p>
-    <w:p>
-      <w:pPr>
-        <w:rPr>
-          <w:sz w:val="44"/>
-          <w:szCs w:val="44"/>
-          <w:lang w:bidi="fa-IR"/>
-        </w:rPr>
-      </w:pPr>
-      <w:r>
-        <w:rPr>
-          <w:sz w:val="44"/>
-          <w:szCs w:val="44"/>
-          <w:lang w:bidi="fa-IR"/>
-        </w:rPr>
-        <w:t>So, if you're ready, let's get started.</w:t>
-      </w:r>
+        <w:t>Form inner products to norms</w:t>
+      </w:r>
+    </w:p>
+    <w:p>
+      <w:pPr>
+        <w:rPr>
+          <w:lang w:bidi="fa-IR"/>
+        </w:rPr>
+      </w:pPr>
     </w:p>
     <w:p>
       <w:pPr>
@@ -5738,7 +6834,7 @@
         <w:rPr>
           <w:lang w:bidi="fa-IR"/>
         </w:rPr>
-        <w:t>Form inner products to norms</w:t>
+        <w:t>Hilbert spaces</w:t>
       </w:r>
     </w:p>
     <w:p>
@@ -5759,28 +6855,6 @@
         <w:rPr>
           <w:lang w:bidi="fa-IR"/>
         </w:rPr>
-        <w:t>Hilbert spaces</w:t>
-      </w:r>
-    </w:p>
-    <w:p>
-      <w:pPr>
-        <w:rPr>
-          <w:lang w:bidi="fa-IR"/>
-        </w:rPr>
-      </w:pPr>
-    </w:p>
-    <w:p>
-      <w:pPr>
-        <w:pStyle w:val="Heading2"/>
-        <w:rPr>
-          <w:lang w:bidi="fa-IR"/>
-        </w:rPr>
-      </w:pPr>
-      <w:r>
-        <w:rPr>
-          <w:lang w:bidi="fa-IR"/>
-        </w:rPr>
-        <w:lastRenderedPageBreak/>
         <w:t>Orthogonality in inner product spaces</w:t>
       </w:r>
     </w:p>

</xml_diff>

<commit_message>
step 95 : finish part6 and start part 7
</commit_message>
<xml_diff>
--- a/video context/video_context_newVersion.docx
+++ b/video context/video_context_newVersion.docx
@@ -6742,65 +6742,840 @@
     <w:p>
       <w:pPr>
         <w:rPr>
+          <w:sz w:val="44"/>
+          <w:szCs w:val="44"/>
+          <w:rtl/>
+          <w:lang w:bidi="fa-IR"/>
+        </w:rPr>
+      </w:pPr>
+      <w:r>
+        <w:rPr>
+          <w:sz w:val="44"/>
+          <w:szCs w:val="44"/>
+          <w:lang w:bidi="fa-IR"/>
+        </w:rPr>
+        <w:t xml:space="preserve">  </w:t>
+      </w:r>
+      <w:r>
+        <w:rPr>
+          <w:b/>
+          <w:bCs/>
+          <w:sz w:val="44"/>
+          <w:szCs w:val="44"/>
+          <w:lang w:bidi="fa-IR"/>
+        </w:rPr>
+        <w:t>IP4:</w:t>
+      </w:r>
+      <w:r>
+        <w:rPr>
+          <w:sz w:val="44"/>
+          <w:szCs w:val="44"/>
+          <w:lang w:bidi="fa-IR"/>
+        </w:rPr>
+        <w:t xml:space="preserve"> Positive Definiteness</w:t>
+      </w:r>
+      <w:r>
+        <w:rPr>
+          <w:sz w:val="44"/>
+          <w:szCs w:val="44"/>
+          <w:rtl/>
+          <w:lang w:bidi="fa-IR"/>
+        </w:rPr>
+        <w:br/>
+      </w:r>
+      <w:r>
+        <w:rPr>
+          <w:sz w:val="44"/>
+          <w:szCs w:val="44"/>
+          <w:lang w:bidi="fa-IR"/>
+        </w:rPr>
+        <w:t>This is also considered part of the Positive Definiteness property</w:t>
+      </w:r>
+      <w:r>
+        <w:rPr>
           <w:rFonts w:hint="cs"/>
           <w:sz w:val="44"/>
           <w:szCs w:val="44"/>
           <w:rtl/>
           <w:lang w:bidi="fa-IR"/>
         </w:rPr>
-      </w:pPr>
-      <w:r>
-        <w:rPr>
-          <w:sz w:val="44"/>
-          <w:szCs w:val="44"/>
-          <w:lang w:bidi="fa-IR"/>
-        </w:rPr>
-        <w:t xml:space="preserve">  </w:t>
-      </w:r>
-      <w:r>
-        <w:rPr>
-          <w:b/>
-          <w:bCs/>
-          <w:sz w:val="44"/>
-          <w:szCs w:val="44"/>
-          <w:lang w:bidi="fa-IR"/>
-        </w:rPr>
-        <w:t>IP4:</w:t>
-      </w:r>
-      <w:r>
-        <w:rPr>
-          <w:sz w:val="44"/>
-          <w:szCs w:val="44"/>
-          <w:lang w:bidi="fa-IR"/>
-        </w:rPr>
-        <w:t xml:space="preserve"> Positive Definiteness</w:t>
-      </w:r>
-      <w:r>
-        <w:rPr>
+        <w:t>.</w:t>
+      </w:r>
+    </w:p>
+    <w:p>
+      <w:pPr>
+        <w:rPr>
+          <w:sz w:val="44"/>
+          <w:szCs w:val="44"/>
+          <w:lang w:bidi="fa-IR"/>
+        </w:rPr>
+      </w:pPr>
+      <w:r>
+        <w:rPr>
+          <w:sz w:val="44"/>
+          <w:szCs w:val="44"/>
+          <w:lang w:bidi="fa-IR"/>
+        </w:rPr>
+        <w:t xml:space="preserve">6 : </w:t>
+      </w:r>
+    </w:p>
+    <w:p>
+      <w:pPr>
+        <w:rPr>
+          <w:sz w:val="44"/>
+          <w:szCs w:val="44"/>
+          <w:lang w:bidi="fa-IR"/>
+        </w:rPr>
+      </w:pPr>
+      <w:r>
+        <w:rPr>
+          <w:b/>
+          <w:bCs/>
+          <w:sz w:val="44"/>
+          <w:szCs w:val="44"/>
+          <w:lang w:bidi="fa-IR"/>
+        </w:rPr>
+        <w:t>Now, let's take a closer look at the third property.</w:t>
+      </w:r>
+    </w:p>
+    <w:p>
+      <w:pPr>
+        <w:rPr>
+          <w:sz w:val="44"/>
+          <w:szCs w:val="44"/>
+          <w:lang w:bidi="fa-IR"/>
+        </w:rPr>
+      </w:pPr>
+      <w:r>
+        <w:rPr>
+          <w:sz w:val="44"/>
+          <w:szCs w:val="44"/>
+          <w:lang w:bidi="fa-IR"/>
+        </w:rPr>
+        <w:t xml:space="preserve">When working over the complex numbers, we must include the </w:t>
+      </w:r>
+      <w:r>
+        <w:rPr>
+          <w:b/>
+          <w:bCs/>
+          <w:sz w:val="44"/>
+          <w:szCs w:val="44"/>
+          <w:lang w:bidi="fa-IR"/>
+        </w:rPr>
+        <w:t>complex conjugate</w:t>
+      </w:r>
+      <w:r>
+        <w:rPr>
+          <w:sz w:val="44"/>
+          <w:szCs w:val="44"/>
+          <w:lang w:bidi="fa-IR"/>
+        </w:rPr>
+        <w:t xml:space="preserve"> in this property.</w:t>
+      </w:r>
+    </w:p>
+    <w:p>
+      <w:pPr>
+        <w:rPr>
+          <w:sz w:val="44"/>
+          <w:szCs w:val="44"/>
+          <w:lang w:bidi="fa-IR"/>
+        </w:rPr>
+      </w:pPr>
+      <w:r>
+        <w:rPr>
+          <w:sz w:val="44"/>
+          <w:szCs w:val="44"/>
+          <w:lang w:bidi="fa-IR"/>
+        </w:rPr>
+        <w:t>However, if we restrict ourselves to real vector spaces, the complex conjugate of every real number is simply the number itself. Therefore, the conjugation can be omitted, and the property reduces to ordinary symmetry.</w:t>
+      </w:r>
+    </w:p>
+    <w:p>
+      <w:pPr>
+        <w:rPr>
+          <w:sz w:val="44"/>
+          <w:szCs w:val="44"/>
+          <w:lang w:bidi="fa-IR"/>
+        </w:rPr>
+      </w:pPr>
+      <w:r>
+        <w:rPr>
+          <w:b/>
+          <w:bCs/>
+          <w:sz w:val="44"/>
+          <w:szCs w:val="44"/>
+          <w:lang w:bidi="fa-IR"/>
+        </w:rPr>
+        <w:t>Next, let's examine the first two properties.</w:t>
+      </w:r>
+    </w:p>
+    <w:p>
+      <w:pPr>
+        <w:rPr>
+          <w:sz w:val="44"/>
+          <w:szCs w:val="44"/>
+          <w:lang w:bidi="fa-IR"/>
+        </w:rPr>
+      </w:pPr>
+      <w:r>
+        <w:rPr>
+          <w:sz w:val="44"/>
+          <w:szCs w:val="44"/>
+          <w:lang w:bidi="fa-IR"/>
+        </w:rPr>
+        <w:lastRenderedPageBreak/>
+        <w:t>Suppose we replace the first argument with a linear combination.</w:t>
+      </w:r>
+    </w:p>
+    <w:p>
+      <w:pPr>
+        <w:rPr>
+          <w:sz w:val="44"/>
+          <w:szCs w:val="44"/>
+          <w:lang w:bidi="fa-IR"/>
+        </w:rPr>
+      </w:pPr>
+      <w:r>
+        <w:rPr>
+          <w:sz w:val="44"/>
+          <w:szCs w:val="44"/>
+          <w:lang w:bidi="fa-IR"/>
+        </w:rPr>
+        <w:t>We first apply the additivity property, and then the homogeneity property. Simplifying the result, we obtain</w:t>
+      </w:r>
+      <w:r>
+        <w:rPr>
+          <w:sz w:val="44"/>
+          <w:szCs w:val="44"/>
+          <w:lang w:bidi="fa-IR"/>
+        </w:rPr>
+        <w:t xml:space="preserve"> what you see on the screen.</w:t>
+      </w:r>
+    </w:p>
+    <w:p>
+      <w:pPr>
+        <w:rPr>
+          <w:sz w:val="44"/>
+          <w:szCs w:val="44"/>
+          <w:lang w:bidi="fa-IR"/>
+        </w:rPr>
+      </w:pPr>
+      <w:r>
+        <w:rPr>
+          <w:sz w:val="44"/>
+          <w:szCs w:val="44"/>
+          <w:lang w:bidi="fa-IR"/>
+        </w:rPr>
+        <w:t xml:space="preserve">This shows that the inner product is </w:t>
+      </w:r>
+      <w:r>
+        <w:rPr>
+          <w:b/>
+          <w:bCs/>
+          <w:sz w:val="44"/>
+          <w:szCs w:val="44"/>
+          <w:lang w:bidi="fa-IR"/>
+        </w:rPr>
+        <w:t>linear in its first argument</w:t>
+      </w:r>
+      <w:r>
+        <w:rPr>
+          <w:sz w:val="44"/>
+          <w:szCs w:val="44"/>
+          <w:lang w:bidi="fa-IR"/>
+        </w:rPr>
+        <w:t>.</w:t>
+      </w:r>
+    </w:p>
+    <w:p>
+      <w:pPr>
+        <w:rPr>
+          <w:sz w:val="44"/>
+          <w:szCs w:val="44"/>
+          <w:lang w:bidi="fa-IR"/>
+        </w:rPr>
+      </w:pPr>
+      <w:r>
+        <w:rPr>
+          <w:b/>
+          <w:bCs/>
+          <w:sz w:val="44"/>
+          <w:szCs w:val="44"/>
+          <w:lang w:bidi="fa-IR"/>
+        </w:rPr>
+        <w:t>Now, let's see what happens for the second argument.</w:t>
+      </w:r>
+    </w:p>
+    <w:p>
+      <w:pPr>
+        <w:rPr>
+          <w:sz w:val="44"/>
+          <w:szCs w:val="44"/>
+          <w:lang w:bidi="fa-IR"/>
+        </w:rPr>
+      </w:pPr>
+      <w:r>
+        <w:rPr>
+          <w:sz w:val="44"/>
+          <w:szCs w:val="44"/>
+          <w:lang w:bidi="fa-IR"/>
+        </w:rPr>
+        <w:t>We begin by applying the symmetry property to interchange the two arguments. Then, we use additivity and homogeneity, and finally apply complex conjugation.</w:t>
+      </w:r>
+    </w:p>
+    <w:p>
+      <w:pPr>
+        <w:rPr>
+          <w:rFonts w:hint="cs"/>
           <w:sz w:val="44"/>
           <w:szCs w:val="44"/>
           <w:rtl/>
           <w:lang w:bidi="fa-IR"/>
         </w:rPr>
-        <w:br/>
-      </w:r>
-      <w:r>
-        <w:rPr>
-          <w:sz w:val="44"/>
-          <w:szCs w:val="44"/>
-          <w:lang w:bidi="fa-IR"/>
-        </w:rPr>
-        <w:t>This is also considered part of the Positive Definiteness property</w:t>
-      </w:r>
-    </w:p>
-    <w:p>
-      <w:pPr>
-        <w:rPr>
-          <w:sz w:val="44"/>
-          <w:szCs w:val="44"/>
-          <w:lang w:bidi="fa-IR"/>
-        </w:rPr>
-      </w:pPr>
+      </w:pPr>
+      <w:r>
+        <w:rPr>
+          <w:sz w:val="44"/>
+          <w:szCs w:val="44"/>
+          <w:lang w:bidi="fa-IR"/>
+        </w:rPr>
+        <w:t>Applying the symmetry property once again, we obtain</w:t>
+      </w:r>
+      <w:r>
+        <w:rPr>
+          <w:sz w:val="44"/>
+          <w:szCs w:val="44"/>
+          <w:lang w:bidi="fa-IR"/>
+        </w:rPr>
+        <w:t xml:space="preserve"> </w:t>
+      </w:r>
+      <w:r>
+        <w:rPr>
+          <w:sz w:val="44"/>
+          <w:szCs w:val="44"/>
+          <w:lang w:bidi="fa-IR"/>
+        </w:rPr>
+        <w:t>what you see on the screen.</w:t>
+      </w:r>
+    </w:p>
+    <w:p>
+      <w:pPr>
+        <w:rPr>
+          <w:sz w:val="44"/>
+          <w:szCs w:val="44"/>
+          <w:lang w:bidi="fa-IR"/>
+        </w:rPr>
+      </w:pPr>
+      <w:r>
+        <w:rPr>
+          <w:sz w:val="44"/>
+          <w:szCs w:val="44"/>
+          <w:lang w:bidi="fa-IR"/>
+        </w:rPr>
+        <w:t xml:space="preserve">As you can see, the inner product is </w:t>
+      </w:r>
+      <w:r>
+        <w:rPr>
+          <w:b/>
+          <w:bCs/>
+          <w:sz w:val="44"/>
+          <w:szCs w:val="44"/>
+          <w:lang w:bidi="fa-IR"/>
+        </w:rPr>
+        <w:t>conjugate-linear</w:t>
+      </w:r>
+      <w:r>
+        <w:rPr>
+          <w:sz w:val="44"/>
+          <w:szCs w:val="44"/>
+          <w:lang w:bidi="fa-IR"/>
+        </w:rPr>
+        <w:t xml:space="preserve"> in its second argument. This property is also commonly referred to as </w:t>
+      </w:r>
+      <w:proofErr w:type="spellStart"/>
+      <w:r>
+        <w:rPr>
+          <w:b/>
+          <w:bCs/>
+          <w:sz w:val="44"/>
+          <w:szCs w:val="44"/>
+          <w:lang w:bidi="fa-IR"/>
+        </w:rPr>
+        <w:t>semilinearity</w:t>
+      </w:r>
+      <w:proofErr w:type="spellEnd"/>
+      <w:r>
+        <w:rPr>
+          <w:sz w:val="44"/>
+          <w:szCs w:val="44"/>
+          <w:lang w:bidi="fa-IR"/>
+        </w:rPr>
+        <w:t xml:space="preserve"> or </w:t>
+      </w:r>
+      <w:r>
+        <w:rPr>
+          <w:b/>
+          <w:bCs/>
+          <w:sz w:val="44"/>
+          <w:szCs w:val="44"/>
+          <w:lang w:bidi="fa-IR"/>
+        </w:rPr>
+        <w:t>half-linearity</w:t>
+      </w:r>
+      <w:r>
+        <w:rPr>
+          <w:sz w:val="44"/>
+          <w:szCs w:val="44"/>
+          <w:lang w:bidi="fa-IR"/>
+        </w:rPr>
+        <w:t>.</w:t>
+      </w:r>
+    </w:p>
+    <w:p>
+      <w:pPr>
+        <w:rPr>
+          <w:sz w:val="44"/>
+          <w:szCs w:val="44"/>
+          <w:lang w:bidi="fa-IR"/>
+        </w:rPr>
+      </w:pPr>
+      <w:r>
+        <w:rPr>
+          <w:b/>
+          <w:bCs/>
+          <w:sz w:val="44"/>
+          <w:szCs w:val="44"/>
+          <w:lang w:bidi="fa-IR"/>
+        </w:rPr>
+        <w:lastRenderedPageBreak/>
+        <w:t xml:space="preserve">Putting these two results together, we conclude that the inner product is </w:t>
+      </w:r>
+      <w:proofErr w:type="spellStart"/>
+      <w:r>
+        <w:rPr>
+          <w:b/>
+          <w:bCs/>
+          <w:sz w:val="44"/>
+          <w:szCs w:val="44"/>
+          <w:lang w:bidi="fa-IR"/>
+        </w:rPr>
+        <w:t>sesquilinear</w:t>
+      </w:r>
+      <w:proofErr w:type="spellEnd"/>
+    </w:p>
+    <w:p>
+      <w:pPr>
+        <w:rPr>
+          <w:sz w:val="44"/>
+          <w:szCs w:val="44"/>
+          <w:lang w:bidi="fa-IR"/>
+        </w:rPr>
+      </w:pPr>
+      <w:r>
+        <w:rPr>
+          <w:sz w:val="44"/>
+          <w:szCs w:val="44"/>
+          <w:lang w:bidi="fa-IR"/>
+        </w:rPr>
+        <w:t xml:space="preserve">7 : </w:t>
+      </w:r>
+    </w:p>
+    <w:p>
+      <w:pPr>
+        <w:rPr>
+          <w:sz w:val="44"/>
+          <w:szCs w:val="44"/>
+          <w:lang w:bidi="fa-IR"/>
+        </w:rPr>
+      </w:pPr>
+      <w:r>
+        <w:rPr>
+          <w:b/>
+          <w:bCs/>
+          <w:sz w:val="44"/>
+          <w:szCs w:val="44"/>
+          <w:lang w:bidi="fa-IR"/>
+        </w:rPr>
+        <w:t>Let's look at two common examples of inner products.</w:t>
+      </w:r>
+    </w:p>
+    <w:p>
+      <w:pPr>
+        <w:rPr>
+          <w:sz w:val="44"/>
+          <w:szCs w:val="44"/>
+          <w:lang w:bidi="fa-IR"/>
+        </w:rPr>
+      </w:pPr>
+      <w:r>
+        <w:rPr>
+          <w:b/>
+          <w:bCs/>
+          <w:sz w:val="44"/>
+          <w:szCs w:val="44"/>
+          <w:lang w:bidi="fa-IR"/>
+        </w:rPr>
+        <w:t>The first example is the Euclidean inner product.</w:t>
+      </w:r>
+    </w:p>
+    <w:p>
+      <w:pPr>
+        <w:rPr>
+          <w:sz w:val="44"/>
+          <w:szCs w:val="44"/>
+          <w:lang w:bidi="fa-IR"/>
+        </w:rPr>
+      </w:pPr>
+      <w:r>
+        <w:rPr>
+          <w:sz w:val="44"/>
+          <w:szCs w:val="44"/>
+          <w:lang w:bidi="fa-IR"/>
+        </w:rPr>
+        <w:t>For two vectors, the inner product is defined as the sum of the products of corresponding components, where the components of the second vector are complex conjugated.</w:t>
+      </w:r>
+    </w:p>
+    <w:p>
+      <w:pPr>
+        <w:rPr>
+          <w:sz w:val="44"/>
+          <w:szCs w:val="44"/>
+          <w:lang w:bidi="fa-IR"/>
+        </w:rPr>
+      </w:pPr>
+      <w:r>
+        <w:rPr>
+          <w:sz w:val="44"/>
+          <w:szCs w:val="44"/>
+          <w:lang w:bidi="fa-IR"/>
+        </w:rPr>
+        <w:t>In the special case of real vector spaces, the complex conjugates disappear, and this reduces to the familiar dot product that we introduced earlier.</w:t>
+      </w:r>
+    </w:p>
+    <w:p>
+      <w:pPr>
+        <w:rPr>
+          <w:sz w:val="44"/>
+          <w:szCs w:val="44"/>
+          <w:lang w:bidi="fa-IR"/>
+        </w:rPr>
+      </w:pPr>
+      <w:r>
+        <w:rPr>
+          <w:b/>
+          <w:bCs/>
+          <w:sz w:val="44"/>
+          <w:szCs w:val="44"/>
+          <w:lang w:bidi="fa-IR"/>
+        </w:rPr>
+        <w:t>Our second example is an inner product on the space of continuous functions.</w:t>
+      </w:r>
+    </w:p>
+    <w:p>
+      <w:pPr>
+        <w:rPr>
+          <w:sz w:val="44"/>
+          <w:szCs w:val="44"/>
+          <w:lang w:bidi="fa-IR"/>
+        </w:rPr>
+      </w:pPr>
+      <w:r>
+        <w:rPr>
+          <w:sz w:val="44"/>
+          <w:szCs w:val="44"/>
+          <w:lang w:bidi="fa-IR"/>
+        </w:rPr>
+        <w:t>Here, we multiply the two functions pointwise and integrate the result over the interval [−1,1][-1,1][−1,1].</w:t>
+      </w:r>
+    </w:p>
+    <w:p>
+      <w:pPr>
+        <w:rPr>
+          <w:sz w:val="44"/>
+          <w:szCs w:val="44"/>
+          <w:lang w:bidi="fa-IR"/>
+        </w:rPr>
+      </w:pPr>
+      <w:r>
+        <w:rPr>
+          <w:sz w:val="44"/>
+          <w:szCs w:val="44"/>
+          <w:lang w:bidi="fa-IR"/>
+        </w:rPr>
+        <w:lastRenderedPageBreak/>
+        <w:t>This integral defines the inner product of the two functions.</w:t>
+      </w:r>
+    </w:p>
+    <w:p>
+      <w:pPr>
+        <w:rPr>
+          <w:rFonts w:hint="cs"/>
+          <w:sz w:val="44"/>
+          <w:szCs w:val="44"/>
+          <w:rtl/>
+          <w:lang w:bidi="fa-IR"/>
+        </w:rPr>
+      </w:pPr>
+      <w:r>
+        <w:rPr>
+          <w:sz w:val="44"/>
+          <w:szCs w:val="44"/>
+          <w:lang w:bidi="fa-IR"/>
+        </w:rPr>
+        <w:t>These examples illustrate that the concept of an inner product extends far beyond ordinary vectors. It can also be defined on spaces of functions and many other mathematical</w:t>
+      </w:r>
+      <w:r>
+        <w:rPr>
+          <w:sz w:val="44"/>
+          <w:szCs w:val="44"/>
+          <w:lang w:bidi="fa-IR"/>
+        </w:rPr>
+        <w:t xml:space="preserve"> </w:t>
+      </w:r>
+      <w:r>
+        <w:rPr>
+          <w:sz w:val="44"/>
+          <w:szCs w:val="44"/>
+          <w:lang w:bidi="fa-IR"/>
+        </w:rPr>
+        <w:t>objects</w:t>
+      </w:r>
+      <w:r>
+        <w:rPr>
+          <w:sz w:val="44"/>
+          <w:szCs w:val="44"/>
+          <w:lang w:bidi="fa-IR"/>
+        </w:rPr>
+        <w:t>.</w:t>
+      </w:r>
+    </w:p>
+    <w:p>
+      <w:pPr>
+        <w:rPr>
+          <w:sz w:val="44"/>
+          <w:szCs w:val="44"/>
+          <w:lang w:bidi="fa-IR"/>
+        </w:rPr>
+      </w:pPr>
+      <w:r>
+        <w:rPr>
+          <w:sz w:val="44"/>
+          <w:szCs w:val="44"/>
+          <w:lang w:bidi="fa-IR"/>
+        </w:rPr>
+        <w:t xml:space="preserve">8 : </w:t>
+      </w:r>
+    </w:p>
+    <w:p>
+      <w:pPr>
+        <w:rPr>
+          <w:sz w:val="44"/>
+          <w:szCs w:val="44"/>
+          <w:lang w:bidi="fa-IR"/>
+        </w:rPr>
+      </w:pPr>
+      <w:r>
+        <w:rPr>
+          <w:b/>
+          <w:bCs/>
+          <w:sz w:val="44"/>
+          <w:szCs w:val="44"/>
+          <w:lang w:bidi="fa-IR"/>
+        </w:rPr>
+        <w:t>Now that we know what an inner product is, we are ready to define an inner product space.</w:t>
+      </w:r>
+    </w:p>
+    <w:p>
+      <w:pPr>
+        <w:rPr>
+          <w:sz w:val="44"/>
+          <w:szCs w:val="44"/>
+          <w:lang w:bidi="fa-IR"/>
+        </w:rPr>
+      </w:pPr>
+      <w:r>
+        <w:rPr>
+          <w:sz w:val="44"/>
+          <w:szCs w:val="44"/>
+          <w:lang w:bidi="fa-IR"/>
+        </w:rPr>
+        <w:t xml:space="preserve">An </w:t>
+      </w:r>
+      <w:r>
+        <w:rPr>
+          <w:b/>
+          <w:bCs/>
+          <w:sz w:val="44"/>
+          <w:szCs w:val="44"/>
+          <w:lang w:bidi="fa-IR"/>
+        </w:rPr>
+        <w:t>inner product space</w:t>
+      </w:r>
+      <w:r>
+        <w:rPr>
+          <w:sz w:val="44"/>
+          <w:szCs w:val="44"/>
+          <w:lang w:bidi="fa-IR"/>
+        </w:rPr>
+        <w:t xml:space="preserve"> consists of two components:</w:t>
+      </w:r>
+    </w:p>
+    <w:p>
+      <w:pPr>
+        <w:rPr>
+          <w:sz w:val="44"/>
+          <w:szCs w:val="44"/>
+          <w:lang w:bidi="fa-IR"/>
+        </w:rPr>
+      </w:pPr>
+      <w:r>
+        <w:rPr>
+          <w:sz w:val="44"/>
+          <w:szCs w:val="44"/>
+          <w:lang w:bidi="fa-IR"/>
+        </w:rPr>
+        <w:t xml:space="preserve">a </w:t>
+      </w:r>
+      <w:r>
+        <w:rPr>
+          <w:b/>
+          <w:bCs/>
+          <w:sz w:val="44"/>
+          <w:szCs w:val="44"/>
+          <w:lang w:bidi="fa-IR"/>
+        </w:rPr>
+        <w:t>vector space</w:t>
+      </w:r>
+      <w:r>
+        <w:rPr>
+          <w:sz w:val="44"/>
+          <w:szCs w:val="44"/>
+          <w:lang w:bidi="fa-IR"/>
+        </w:rPr>
+        <w:t xml:space="preserve"> X, together with an </w:t>
+      </w:r>
+      <w:r>
+        <w:rPr>
+          <w:b/>
+          <w:bCs/>
+          <w:sz w:val="44"/>
+          <w:szCs w:val="44"/>
+          <w:lang w:bidi="fa-IR"/>
+        </w:rPr>
+        <w:t>inner product</w:t>
+      </w:r>
+      <w:r>
+        <w:rPr>
+          <w:sz w:val="44"/>
+          <w:szCs w:val="44"/>
+          <w:lang w:bidi="fa-IR"/>
+        </w:rPr>
+        <w:t xml:space="preserve"> defined on that space.</w:t>
+      </w:r>
+    </w:p>
+    <w:p>
+      <w:pPr>
+        <w:rPr>
+          <w:sz w:val="44"/>
+          <w:szCs w:val="44"/>
+          <w:lang w:bidi="fa-IR"/>
+        </w:rPr>
+      </w:pPr>
+      <w:r>
+        <w:rPr>
+          <w:sz w:val="44"/>
+          <w:szCs w:val="44"/>
+          <w:lang w:bidi="fa-IR"/>
+        </w:rPr>
+        <w:t>In other words, an inner product space is simply a vector space equipped with an inner product.</w:t>
+      </w:r>
+    </w:p>
+    <w:p>
+      <w:pPr>
+        <w:rPr>
+          <w:sz w:val="44"/>
+          <w:szCs w:val="44"/>
+          <w:lang w:bidi="fa-IR"/>
+        </w:rPr>
+      </w:pPr>
+      <w:r>
+        <w:rPr>
+          <w:sz w:val="44"/>
+          <w:szCs w:val="44"/>
+          <w:lang w:bidi="fa-IR"/>
+        </w:rPr>
+        <w:t xml:space="preserve">9 : </w:t>
+      </w:r>
+    </w:p>
+    <w:p>
+      <w:pPr>
+        <w:rPr>
+          <w:sz w:val="44"/>
+          <w:szCs w:val="44"/>
+          <w:lang w:bidi="fa-IR"/>
+        </w:rPr>
+      </w:pPr>
+      <w:r>
+        <w:rPr>
+          <w:b/>
+          <w:bCs/>
+          <w:sz w:val="44"/>
+          <w:szCs w:val="44"/>
+          <w:lang w:bidi="fa-IR"/>
+        </w:rPr>
+        <w:t xml:space="preserve">In this video, we explored the concept of the inner product, developed its geometric intuition, looked </w:t>
+      </w:r>
+      <w:r>
+        <w:rPr>
+          <w:b/>
+          <w:bCs/>
+          <w:sz w:val="44"/>
+          <w:szCs w:val="44"/>
+          <w:lang w:bidi="fa-IR"/>
+        </w:rPr>
+        <w:lastRenderedPageBreak/>
+        <w:t>at some of its most important examples, and introduced the notion of an inner product space.</w:t>
+      </w:r>
+    </w:p>
+    <w:p>
+      <w:pPr>
+        <w:rPr>
+          <w:sz w:val="44"/>
+          <w:szCs w:val="44"/>
+          <w:lang w:bidi="fa-IR"/>
+        </w:rPr>
+      </w:pPr>
+      <w:r>
+        <w:rPr>
+          <w:b/>
+          <w:bCs/>
+          <w:sz w:val="44"/>
+          <w:szCs w:val="44"/>
+          <w:lang w:bidi="fa-IR"/>
+        </w:rPr>
+        <w:t>In the next video, we'll see how an inner product naturally gives rise to a norm, and how this connection leads to one of the most fundamental structures in mathematics.</w:t>
+      </w:r>
+    </w:p>
+    <w:p>
+      <w:pPr>
+        <w:rPr>
+          <w:rFonts w:hint="cs"/>
+          <w:sz w:val="44"/>
+          <w:szCs w:val="44"/>
+          <w:rtl/>
+          <w:lang w:bidi="fa-IR"/>
+        </w:rPr>
+      </w:pPr>
+      <w:r>
+        <w:rPr>
+          <w:b/>
+          <w:bCs/>
+          <w:sz w:val="44"/>
+          <w:szCs w:val="44"/>
+          <w:lang w:bidi="fa-IR"/>
+        </w:rPr>
+        <w:t>So, stay tuned, and I'll see you in the next video.</w:t>
+      </w:r>
     </w:p>
     <w:p>
       <w:pPr>
@@ -6819,6 +7594,82 @@
     <w:p>
       <w:pPr>
         <w:rPr>
+          <w:sz w:val="44"/>
+          <w:szCs w:val="44"/>
+          <w:lang w:bidi="fa-IR"/>
+        </w:rPr>
+      </w:pPr>
+      <w:r>
+        <w:rPr>
+          <w:sz w:val="44"/>
+          <w:szCs w:val="44"/>
+          <w:lang w:bidi="fa-IR"/>
+        </w:rPr>
+        <w:t xml:space="preserve">1 : </w:t>
+      </w:r>
+    </w:p>
+    <w:p>
+      <w:pPr>
+        <w:rPr>
+          <w:sz w:val="44"/>
+          <w:szCs w:val="44"/>
+          <w:lang w:bidi="fa-IR"/>
+        </w:rPr>
+      </w:pPr>
+      <w:r>
+        <w:rPr>
+          <w:b/>
+          <w:bCs/>
+          <w:sz w:val="44"/>
+          <w:szCs w:val="44"/>
+          <w:lang w:bidi="fa-IR"/>
+        </w:rPr>
+        <w:t>In the previous video, we explored the concept of the inner product.</w:t>
+      </w:r>
+    </w:p>
+    <w:p>
+      <w:pPr>
+        <w:rPr>
+          <w:sz w:val="44"/>
+          <w:szCs w:val="44"/>
+          <w:lang w:bidi="fa-IR"/>
+        </w:rPr>
+      </w:pPr>
+      <w:r>
+        <w:rPr>
+          <w:b/>
+          <w:bCs/>
+          <w:sz w:val="44"/>
+          <w:szCs w:val="44"/>
+          <w:lang w:bidi="fa-IR"/>
+        </w:rPr>
+        <w:t>Now, it's time to answer an important question: how can we construct a norm from an inner product?</w:t>
+      </w:r>
+    </w:p>
+    <w:p>
+      <w:pPr>
+        <w:rPr>
+          <w:sz w:val="44"/>
+          <w:szCs w:val="44"/>
+          <w:lang w:bidi="fa-IR"/>
+        </w:rPr>
+      </w:pPr>
+      <w:r>
+        <w:rPr>
+          <w:b/>
+          <w:bCs/>
+          <w:sz w:val="44"/>
+          <w:szCs w:val="44"/>
+          <w:lang w:bidi="fa-IR"/>
+        </w:rPr>
+        <w:t>Let's find out</w:t>
+      </w:r>
+    </w:p>
+    <w:p>
+      <w:pPr>
+        <w:rPr>
+          <w:sz w:val="44"/>
+          <w:szCs w:val="44"/>
           <w:lang w:bidi="fa-IR"/>
         </w:rPr>
       </w:pPr>
@@ -6855,6 +7706,7 @@
         <w:rPr>
           <w:lang w:bidi="fa-IR"/>
         </w:rPr>
+        <w:lastRenderedPageBreak/>
         <w:t>Orthogonality in inner product spaces</w:t>
       </w:r>
     </w:p>

</xml_diff>

<commit_message>
step 96 : finish part 7
</commit_message>
<xml_diff>
--- a/video context/video_context_newVersion.docx
+++ b/video context/video_context_newVersion.docx
@@ -518,11 +518,19 @@
           <w:lang w:bidi="fa-IR"/>
         </w:rPr>
       </w:pPr>
-      <w:r>
-        <w:rPr>
-          <w:lang w:bidi="fa-IR"/>
-        </w:rPr>
-        <w:t>So we need a different way to measure distance.</w:t>
+      <w:proofErr w:type="gramStart"/>
+      <w:r>
+        <w:rPr>
+          <w:lang w:bidi="fa-IR"/>
+        </w:rPr>
+        <w:t>So</w:t>
+      </w:r>
+      <w:proofErr w:type="gramEnd"/>
+      <w:r>
+        <w:rPr>
+          <w:lang w:bidi="fa-IR"/>
+        </w:rPr>
+        <w:t xml:space="preserve"> we need a different way to measure distance.</w:t>
       </w:r>
     </w:p>
     <w:p>
@@ -894,12 +902,20 @@
           <w:lang w:bidi="fa-IR"/>
         </w:rPr>
       </w:pPr>
+      <w:proofErr w:type="gramStart"/>
       <w:r>
         <w:rPr>
           <w:lang w:bidi="fa-IR"/>
         </w:rPr>
         <w:lastRenderedPageBreak/>
-        <w:t xml:space="preserve">8 : </w:t>
+        <w:t>8 :</w:t>
+      </w:r>
+      <w:proofErr w:type="gramEnd"/>
+      <w:r>
+        <w:rPr>
+          <w:lang w:bidi="fa-IR"/>
+        </w:rPr>
+        <w:t xml:space="preserve"> </w:t>
       </w:r>
     </w:p>
     <w:p>
@@ -1027,12 +1043,14 @@
           <w:lang w:bidi="fa-IR"/>
         </w:rPr>
       </w:pPr>
+      <w:proofErr w:type="gramStart"/>
       <w:r>
         <w:rPr>
           <w:lang w:bidi="fa-IR"/>
         </w:rPr>
         <w:t>9 :</w:t>
       </w:r>
+      <w:proofErr w:type="gramEnd"/>
     </w:p>
     <w:p>
       <w:pPr>
@@ -1438,17 +1456,33 @@
           <w:lang w:bidi="fa-IR"/>
         </w:rPr>
       </w:pPr>
-      <w:r>
-        <w:rPr>
-          <w:lang w:bidi="fa-IR"/>
-        </w:rPr>
-        <w:t xml:space="preserve">So , </w:t>
-      </w:r>
-      <w:r>
-        <w:rPr>
-          <w:lang w:bidi="fa-IR"/>
-        </w:rPr>
-        <w:t>Let's quickly recap.</w:t>
+      <w:proofErr w:type="gramStart"/>
+      <w:r>
+        <w:rPr>
+          <w:lang w:bidi="fa-IR"/>
+        </w:rPr>
+        <w:t>So ,</w:t>
+      </w:r>
+      <w:proofErr w:type="gramEnd"/>
+      <w:r>
+        <w:rPr>
+          <w:lang w:bidi="fa-IR"/>
+        </w:rPr>
+        <w:t xml:space="preserve"> </w:t>
+      </w:r>
+      <w:proofErr w:type="gramStart"/>
+      <w:r>
+        <w:rPr>
+          <w:lang w:bidi="fa-IR"/>
+        </w:rPr>
+        <w:t>Let's</w:t>
+      </w:r>
+      <w:proofErr w:type="gramEnd"/>
+      <w:r>
+        <w:rPr>
+          <w:lang w:bidi="fa-IR"/>
+        </w:rPr>
+        <w:t xml:space="preserve"> quickly recap.</w:t>
       </w:r>
     </w:p>
     <w:p>
@@ -1661,13 +1695,23 @@
           <w:lang w:bidi="fa-IR"/>
         </w:rPr>
       </w:pPr>
-      <w:r>
-        <w:rPr>
-          <w:b/>
-          <w:bCs/>
-          <w:lang w:bidi="fa-IR"/>
-        </w:rPr>
-        <w:t xml:space="preserve">10 : </w:t>
+      <w:proofErr w:type="gramStart"/>
+      <w:r>
+        <w:rPr>
+          <w:b/>
+          <w:bCs/>
+          <w:lang w:bidi="fa-IR"/>
+        </w:rPr>
+        <w:t>10 :</w:t>
+      </w:r>
+      <w:proofErr w:type="gramEnd"/>
+      <w:r>
+        <w:rPr>
+          <w:b/>
+          <w:bCs/>
+          <w:lang w:bidi="fa-IR"/>
+        </w:rPr>
+        <w:t xml:space="preserve"> </w:t>
       </w:r>
     </w:p>
     <w:p>
@@ -1763,11 +1807,19 @@
           <w:lang w:bidi="fa-IR"/>
         </w:rPr>
       </w:pPr>
-      <w:r>
-        <w:rPr>
-          <w:lang w:bidi="fa-IR"/>
-        </w:rPr>
-        <w:t xml:space="preserve">1 : </w:t>
+      <w:proofErr w:type="gramStart"/>
+      <w:r>
+        <w:rPr>
+          <w:lang w:bidi="fa-IR"/>
+        </w:rPr>
+        <w:t>1 :</w:t>
+      </w:r>
+      <w:proofErr w:type="gramEnd"/>
+      <w:r>
+        <w:rPr>
+          <w:lang w:bidi="fa-IR"/>
+        </w:rPr>
+        <w:t xml:space="preserve"> </w:t>
       </w:r>
     </w:p>
     <w:p>
@@ -2019,11 +2071,19 @@
           <w:lang w:bidi="fa-IR"/>
         </w:rPr>
       </w:pPr>
-      <w:r>
-        <w:rPr>
-          <w:lang w:bidi="fa-IR"/>
-        </w:rPr>
-        <w:t xml:space="preserve">3 : </w:t>
+      <w:proofErr w:type="gramStart"/>
+      <w:r>
+        <w:rPr>
+          <w:lang w:bidi="fa-IR"/>
+        </w:rPr>
+        <w:t>3 :</w:t>
+      </w:r>
+      <w:proofErr w:type="gramEnd"/>
+      <w:r>
+        <w:rPr>
+          <w:lang w:bidi="fa-IR"/>
+        </w:rPr>
+        <w:t xml:space="preserve"> </w:t>
       </w:r>
     </w:p>
     <w:p>
@@ -2113,11 +2173,19 @@
           <w:lang w:bidi="fa-IR"/>
         </w:rPr>
       </w:pPr>
-      <w:r>
-        <w:rPr>
-          <w:lang w:bidi="fa-IR"/>
-        </w:rPr>
-        <w:t xml:space="preserve">4 : </w:t>
+      <w:proofErr w:type="gramStart"/>
+      <w:r>
+        <w:rPr>
+          <w:lang w:bidi="fa-IR"/>
+        </w:rPr>
+        <w:t>4 :</w:t>
+      </w:r>
+      <w:proofErr w:type="gramEnd"/>
+      <w:r>
+        <w:rPr>
+          <w:lang w:bidi="fa-IR"/>
+        </w:rPr>
+        <w:t xml:space="preserve"> </w:t>
       </w:r>
     </w:p>
     <w:p>
@@ -2231,11 +2299,19 @@
           <w:lang w:bidi="fa-IR"/>
         </w:rPr>
       </w:pPr>
-      <w:r>
-        <w:rPr>
-          <w:lang w:bidi="fa-IR"/>
-        </w:rPr>
-        <w:t xml:space="preserve">5 : </w:t>
+      <w:proofErr w:type="gramStart"/>
+      <w:r>
+        <w:rPr>
+          <w:lang w:bidi="fa-IR"/>
+        </w:rPr>
+        <w:t>5 :</w:t>
+      </w:r>
+      <w:proofErr w:type="gramEnd"/>
+      <w:r>
+        <w:rPr>
+          <w:lang w:bidi="fa-IR"/>
+        </w:rPr>
+        <w:t xml:space="preserve"> </w:t>
       </w:r>
     </w:p>
     <w:p>
@@ -2302,11 +2378,19 @@
           <w:lang w:bidi="fa-IR"/>
         </w:rPr>
       </w:pPr>
-      <w:r>
-        <w:rPr>
-          <w:lang w:bidi="fa-IR"/>
-        </w:rPr>
-        <w:t xml:space="preserve">6 : </w:t>
+      <w:proofErr w:type="gramStart"/>
+      <w:r>
+        <w:rPr>
+          <w:lang w:bidi="fa-IR"/>
+        </w:rPr>
+        <w:t>6 :</w:t>
+      </w:r>
+      <w:proofErr w:type="gramEnd"/>
+      <w:r>
+        <w:rPr>
+          <w:lang w:bidi="fa-IR"/>
+        </w:rPr>
+        <w:t xml:space="preserve"> </w:t>
       </w:r>
     </w:p>
     <w:p>
@@ -2461,12 +2545,14 @@
           <w:lang w:bidi="fa-IR"/>
         </w:rPr>
       </w:pPr>
+      <w:proofErr w:type="gramStart"/>
       <w:r>
         <w:rPr>
           <w:lang w:bidi="fa-IR"/>
         </w:rPr>
         <w:t>7 :</w:t>
       </w:r>
+      <w:proofErr w:type="gramEnd"/>
     </w:p>
     <w:p>
       <w:pPr>
@@ -2557,11 +2643,19 @@
           <w:lang w:bidi="fa-IR"/>
         </w:rPr>
       </w:pPr>
-      <w:r>
-        <w:rPr>
-          <w:lang w:bidi="fa-IR"/>
-        </w:rPr>
-        <w:t xml:space="preserve">1 : </w:t>
+      <w:proofErr w:type="gramStart"/>
+      <w:r>
+        <w:rPr>
+          <w:lang w:bidi="fa-IR"/>
+        </w:rPr>
+        <w:t>1 :</w:t>
+      </w:r>
+      <w:proofErr w:type="gramEnd"/>
+      <w:r>
+        <w:rPr>
+          <w:lang w:bidi="fa-IR"/>
+        </w:rPr>
+        <w:t xml:space="preserve"> </w:t>
       </w:r>
     </w:p>
     <w:p>
@@ -2676,11 +2770,19 @@
           <w:lang w:bidi="fa-IR"/>
         </w:rPr>
       </w:pPr>
-      <w:r>
-        <w:rPr>
-          <w:lang w:bidi="fa-IR"/>
-        </w:rPr>
-        <w:t xml:space="preserve">2 : </w:t>
+      <w:proofErr w:type="gramStart"/>
+      <w:r>
+        <w:rPr>
+          <w:lang w:bidi="fa-IR"/>
+        </w:rPr>
+        <w:t>2 :</w:t>
+      </w:r>
+      <w:proofErr w:type="gramEnd"/>
+      <w:r>
+        <w:rPr>
+          <w:lang w:bidi="fa-IR"/>
+        </w:rPr>
+        <w:t xml:space="preserve"> </w:t>
       </w:r>
     </w:p>
     <w:p>
@@ -2700,6 +2802,7 @@
         <w:t>To begin, let (</w:t>
       </w:r>
       <w:proofErr w:type="spellStart"/>
+      <w:proofErr w:type="gramStart"/>
       <w:r>
         <w:rPr>
           <w:sz w:val="44"/>
@@ -2709,6 +2812,7 @@
         <w:t>X,d</w:t>
       </w:r>
       <w:proofErr w:type="spellEnd"/>
+      <w:proofErr w:type="gramEnd"/>
       <w:r>
         <w:rPr>
           <w:sz w:val="44"/>
@@ -2940,7 +3044,16 @@
           <w:szCs w:val="44"/>
           <w:lang w:bidi="fa-IR"/>
         </w:rPr>
-        <w:t>, because its limit does not belong to Y</w:t>
+        <w:t xml:space="preserve">, because its limit does not belong to </w:t>
+      </w:r>
+      <w:proofErr w:type="gramStart"/>
+      <w:r>
+        <w:rPr>
+          <w:sz w:val="44"/>
+          <w:szCs w:val="44"/>
+          <w:lang w:bidi="fa-IR"/>
+        </w:rPr>
+        <w:t>Y</w:t>
       </w:r>
       <w:r>
         <w:rPr>
@@ -2958,6 +3071,7 @@
         </w:rPr>
         <w:t>.</w:t>
       </w:r>
+      <w:proofErr w:type="gramEnd"/>
     </w:p>
     <w:p>
       <w:pPr>
@@ -2984,13 +3098,23 @@
           <w:lang w:bidi="fa-IR"/>
         </w:rPr>
       </w:pPr>
-      <w:r>
-        <w:rPr>
-          <w:sz w:val="44"/>
-          <w:szCs w:val="44"/>
-          <w:lang w:bidi="fa-IR"/>
-        </w:rPr>
-        <w:t xml:space="preserve">3 : </w:t>
+      <w:proofErr w:type="gramStart"/>
+      <w:r>
+        <w:rPr>
+          <w:sz w:val="44"/>
+          <w:szCs w:val="44"/>
+          <w:lang w:bidi="fa-IR"/>
+        </w:rPr>
+        <w:t>3 :</w:t>
+      </w:r>
+      <w:proofErr w:type="gramEnd"/>
+      <w:r>
+        <w:rPr>
+          <w:sz w:val="44"/>
+          <w:szCs w:val="44"/>
+          <w:lang w:bidi="fa-IR"/>
+        </w:rPr>
+        <w:t xml:space="preserve"> </w:t>
       </w:r>
     </w:p>
     <w:p>
@@ -3040,11 +3164,19 @@
           <w:lang w:bidi="fa-IR"/>
         </w:rPr>
       </w:pPr>
-      <w:r>
-        <w:rPr>
-          <w:lang w:bidi="fa-IR"/>
-        </w:rPr>
-        <w:t xml:space="preserve">4 : </w:t>
+      <w:proofErr w:type="gramStart"/>
+      <w:r>
+        <w:rPr>
+          <w:lang w:bidi="fa-IR"/>
+        </w:rPr>
+        <w:t>4 :</w:t>
+      </w:r>
+      <w:proofErr w:type="gramEnd"/>
+      <w:r>
+        <w:rPr>
+          <w:lang w:bidi="fa-IR"/>
+        </w:rPr>
+        <w:t xml:space="preserve"> </w:t>
       </w:r>
     </w:p>
     <w:p>
@@ -3154,6 +3286,7 @@
         <w:t>}) in a metric space ((</w:t>
       </w:r>
       <w:proofErr w:type="spellStart"/>
+      <w:proofErr w:type="gramStart"/>
       <w:r>
         <w:rPr>
           <w:sz w:val="44"/>
@@ -3163,6 +3296,7 @@
         <w:t>X,d</w:t>
       </w:r>
       <w:proofErr w:type="spellEnd"/>
+      <w:proofErr w:type="gramEnd"/>
       <w:r>
         <w:rPr>
           <w:sz w:val="44"/>
@@ -3231,9 +3365,18 @@
           <w:lang w:bidi="fa-IR"/>
         </w:rPr>
         <w:br/>
+      </w:r>
+      <w:proofErr w:type="gramStart"/>
+      <w:r>
+        <w:rPr>
+          <w:sz w:val="44"/>
+          <w:szCs w:val="44"/>
+          <w:lang w:bidi="fa-IR"/>
+        </w:rPr>
         <w:t>d(</w:t>
       </w:r>
       <w:proofErr w:type="spellStart"/>
+      <w:proofErr w:type="gramEnd"/>
       <w:r>
         <w:rPr>
           <w:sz w:val="44"/>
@@ -3306,6 +3449,7 @@
         <w:t>for every (</w:t>
       </w:r>
       <w:proofErr w:type="spellStart"/>
+      <w:proofErr w:type="gramStart"/>
       <w:r>
         <w:rPr>
           <w:sz w:val="44"/>
@@ -3315,6 +3459,7 @@
         <w:t>m,n</w:t>
       </w:r>
       <w:proofErr w:type="spellEnd"/>
+      <w:proofErr w:type="gramEnd"/>
       <w:r>
         <w:rPr>
           <w:sz w:val="44"/>
@@ -3465,13 +3610,23 @@
           <w:lang w:bidi="fa-IR"/>
         </w:rPr>
       </w:pPr>
-      <w:r>
-        <w:rPr>
-          <w:sz w:val="44"/>
-          <w:szCs w:val="44"/>
-          <w:lang w:bidi="fa-IR"/>
-        </w:rPr>
-        <w:t xml:space="preserve">5 : </w:t>
+      <w:proofErr w:type="gramStart"/>
+      <w:r>
+        <w:rPr>
+          <w:sz w:val="44"/>
+          <w:szCs w:val="44"/>
+          <w:lang w:bidi="fa-IR"/>
+        </w:rPr>
+        <w:t>5 :</w:t>
+      </w:r>
+      <w:proofErr w:type="gramEnd"/>
+      <w:r>
+        <w:rPr>
+          <w:sz w:val="44"/>
+          <w:szCs w:val="44"/>
+          <w:lang w:bidi="fa-IR"/>
+        </w:rPr>
+        <w:t xml:space="preserve"> </w:t>
       </w:r>
     </w:p>
     <w:p>
@@ -3729,13 +3884,23 @@
           <w:lang w:bidi="fa-IR"/>
         </w:rPr>
       </w:pPr>
-      <w:r>
-        <w:rPr>
-          <w:sz w:val="44"/>
-          <w:szCs w:val="44"/>
-          <w:lang w:bidi="fa-IR"/>
-        </w:rPr>
-        <w:t xml:space="preserve">6 : </w:t>
+      <w:proofErr w:type="gramStart"/>
+      <w:r>
+        <w:rPr>
+          <w:sz w:val="44"/>
+          <w:szCs w:val="44"/>
+          <w:lang w:bidi="fa-IR"/>
+        </w:rPr>
+        <w:t>6 :</w:t>
+      </w:r>
+      <w:proofErr w:type="gramEnd"/>
+      <w:r>
+        <w:rPr>
+          <w:sz w:val="44"/>
+          <w:szCs w:val="44"/>
+          <w:lang w:bidi="fa-IR"/>
+        </w:rPr>
+        <w:t xml:space="preserve"> </w:t>
       </w:r>
     </w:p>
     <w:p>
@@ -4097,6 +4262,7 @@
           <w:lang w:bidi="fa-IR"/>
         </w:rPr>
       </w:pPr>
+      <w:proofErr w:type="gramStart"/>
       <w:r>
         <w:rPr>
           <w:sz w:val="44"/>
@@ -4104,7 +4270,16 @@
           <w:lang w:bidi="fa-IR"/>
         </w:rPr>
         <w:lastRenderedPageBreak/>
-        <w:t xml:space="preserve">7 : </w:t>
+        <w:t>7 :</w:t>
+      </w:r>
+      <w:proofErr w:type="gramEnd"/>
+      <w:r>
+        <w:rPr>
+          <w:sz w:val="44"/>
+          <w:szCs w:val="44"/>
+          <w:lang w:bidi="fa-IR"/>
+        </w:rPr>
+        <w:t xml:space="preserve"> </w:t>
       </w:r>
     </w:p>
     <w:p>
@@ -4259,13 +4434,23 @@
           <w:lang w:bidi="fa-IR"/>
         </w:rPr>
       </w:pPr>
-      <w:r>
-        <w:rPr>
-          <w:sz w:val="44"/>
-          <w:szCs w:val="44"/>
-          <w:lang w:bidi="fa-IR"/>
-        </w:rPr>
-        <w:t xml:space="preserve">1 : </w:t>
+      <w:proofErr w:type="gramStart"/>
+      <w:r>
+        <w:rPr>
+          <w:sz w:val="44"/>
+          <w:szCs w:val="44"/>
+          <w:lang w:bidi="fa-IR"/>
+        </w:rPr>
+        <w:t>1 :</w:t>
+      </w:r>
+      <w:proofErr w:type="gramEnd"/>
+      <w:r>
+        <w:rPr>
+          <w:sz w:val="44"/>
+          <w:szCs w:val="44"/>
+          <w:lang w:bidi="fa-IR"/>
+        </w:rPr>
+        <w:t xml:space="preserve"> </w:t>
       </w:r>
     </w:p>
     <w:p>
@@ -4356,6 +4541,7 @@
           <w:lang w:bidi="fa-IR"/>
         </w:rPr>
       </w:pPr>
+      <w:proofErr w:type="gramStart"/>
       <w:r>
         <w:rPr>
           <w:sz w:val="44"/>
@@ -4363,7 +4549,16 @@
           <w:lang w:bidi="fa-IR"/>
         </w:rPr>
         <w:lastRenderedPageBreak/>
-        <w:t xml:space="preserve">2 : </w:t>
+        <w:t>2 :</w:t>
+      </w:r>
+      <w:proofErr w:type="gramEnd"/>
+      <w:r>
+        <w:rPr>
+          <w:sz w:val="44"/>
+          <w:szCs w:val="44"/>
+          <w:lang w:bidi="fa-IR"/>
+        </w:rPr>
+        <w:t xml:space="preserve"> </w:t>
       </w:r>
     </w:p>
     <w:p>
@@ -4539,6 +4734,7 @@
           <w:lang w:bidi="fa-IR"/>
         </w:rPr>
       </w:pPr>
+      <w:proofErr w:type="gramStart"/>
       <w:r>
         <w:rPr>
           <w:sz w:val="44"/>
@@ -4547,6 +4743,7 @@
         </w:rPr>
         <w:t>3 :</w:t>
       </w:r>
+      <w:proofErr w:type="gramEnd"/>
     </w:p>
     <w:p>
       <w:pPr>
@@ -4644,13 +4841,23 @@
           <w:lang w:bidi="fa-IR"/>
         </w:rPr>
       </w:pPr>
-      <w:r>
-        <w:rPr>
-          <w:sz w:val="44"/>
-          <w:szCs w:val="44"/>
-          <w:lang w:bidi="fa-IR"/>
-        </w:rPr>
-        <w:t xml:space="preserve">4 : </w:t>
+      <w:proofErr w:type="gramStart"/>
+      <w:r>
+        <w:rPr>
+          <w:sz w:val="44"/>
+          <w:szCs w:val="44"/>
+          <w:lang w:bidi="fa-IR"/>
+        </w:rPr>
+        <w:t>4 :</w:t>
+      </w:r>
+      <w:proofErr w:type="gramEnd"/>
+      <w:r>
+        <w:rPr>
+          <w:sz w:val="44"/>
+          <w:szCs w:val="44"/>
+          <w:lang w:bidi="fa-IR"/>
+        </w:rPr>
+        <w:t xml:space="preserve"> </w:t>
       </w:r>
     </w:p>
     <w:p>
@@ -4813,15 +5020,27 @@
           <w:lang w:bidi="fa-IR"/>
         </w:rPr>
       </w:pPr>
-      <w:r>
-        <w:rPr>
-          <w:b/>
-          <w:bCs/>
-          <w:sz w:val="44"/>
-          <w:szCs w:val="44"/>
-          <w:lang w:bidi="fa-IR"/>
-        </w:rPr>
-        <w:t xml:space="preserve">5 : </w:t>
+      <w:proofErr w:type="gramStart"/>
+      <w:r>
+        <w:rPr>
+          <w:b/>
+          <w:bCs/>
+          <w:sz w:val="44"/>
+          <w:szCs w:val="44"/>
+          <w:lang w:bidi="fa-IR"/>
+        </w:rPr>
+        <w:t>5 :</w:t>
+      </w:r>
+      <w:proofErr w:type="gramEnd"/>
+      <w:r>
+        <w:rPr>
+          <w:b/>
+          <w:bCs/>
+          <w:sz w:val="44"/>
+          <w:szCs w:val="44"/>
+          <w:lang w:bidi="fa-IR"/>
+        </w:rPr>
+        <w:t xml:space="preserve"> </w:t>
       </w:r>
     </w:p>
     <w:p>
@@ -5126,13 +5345,23 @@
           <w:lang w:bidi="fa-IR"/>
         </w:rPr>
       </w:pPr>
-      <w:r>
-        <w:rPr>
-          <w:sz w:val="44"/>
-          <w:szCs w:val="44"/>
-          <w:lang w:bidi="fa-IR"/>
-        </w:rPr>
-        <w:t xml:space="preserve">So , </w:t>
+      <w:proofErr w:type="gramStart"/>
+      <w:r>
+        <w:rPr>
+          <w:sz w:val="44"/>
+          <w:szCs w:val="44"/>
+          <w:lang w:bidi="fa-IR"/>
+        </w:rPr>
+        <w:t>So ,</w:t>
+      </w:r>
+      <w:proofErr w:type="gramEnd"/>
+      <w:r>
+        <w:rPr>
+          <w:sz w:val="44"/>
+          <w:szCs w:val="44"/>
+          <w:lang w:bidi="fa-IR"/>
+        </w:rPr>
+        <w:t xml:space="preserve"> </w:t>
       </w:r>
       <w:r>
         <w:rPr>
@@ -5169,13 +5398,23 @@
           <w:lang w:bidi="fa-IR"/>
         </w:rPr>
       </w:pPr>
-      <w:r>
-        <w:rPr>
-          <w:sz w:val="44"/>
-          <w:szCs w:val="44"/>
-          <w:lang w:bidi="fa-IR"/>
-        </w:rPr>
-        <w:t xml:space="preserve">6 : </w:t>
+      <w:proofErr w:type="gramStart"/>
+      <w:r>
+        <w:rPr>
+          <w:sz w:val="44"/>
+          <w:szCs w:val="44"/>
+          <w:lang w:bidi="fa-IR"/>
+        </w:rPr>
+        <w:t>6 :</w:t>
+      </w:r>
+      <w:proofErr w:type="gramEnd"/>
+      <w:r>
+        <w:rPr>
+          <w:sz w:val="44"/>
+          <w:szCs w:val="44"/>
+          <w:lang w:bidi="fa-IR"/>
+        </w:rPr>
+        <w:t xml:space="preserve"> </w:t>
       </w:r>
     </w:p>
     <w:p>
@@ -5357,7 +5596,25 @@
           <w:szCs w:val="44"/>
           <w:lang w:bidi="fa-IR"/>
         </w:rPr>
-        <w:t>The completion of (C([-1,1])) with respect to the (L^1) norm is the space (L^1([-1,1])).</w:t>
+        <w:t>The completion of (</w:t>
+      </w:r>
+      <w:proofErr w:type="gramStart"/>
+      <w:r>
+        <w:rPr>
+          <w:sz w:val="44"/>
+          <w:szCs w:val="44"/>
+          <w:lang w:bidi="fa-IR"/>
+        </w:rPr>
+        <w:t>C(</w:t>
+      </w:r>
+      <w:proofErr w:type="gramEnd"/>
+      <w:r>
+        <w:rPr>
+          <w:sz w:val="44"/>
+          <w:szCs w:val="44"/>
+          <w:lang w:bidi="fa-IR"/>
+        </w:rPr>
+        <w:t>[-1,1])) with respect to the (L^1) norm is the space (L^1([-1,1])).</w:t>
       </w:r>
     </w:p>
     <w:p>
@@ -5490,13 +5747,23 @@
           <w:lang w:bidi="fa-IR"/>
         </w:rPr>
       </w:pPr>
-      <w:r>
-        <w:rPr>
-          <w:sz w:val="44"/>
-          <w:szCs w:val="44"/>
-          <w:lang w:bidi="fa-IR"/>
-        </w:rPr>
-        <w:t xml:space="preserve">7 : </w:t>
+      <w:proofErr w:type="gramStart"/>
+      <w:r>
+        <w:rPr>
+          <w:sz w:val="44"/>
+          <w:szCs w:val="44"/>
+          <w:lang w:bidi="fa-IR"/>
+        </w:rPr>
+        <w:t>7 :</w:t>
+      </w:r>
+      <w:proofErr w:type="gramEnd"/>
+      <w:r>
+        <w:rPr>
+          <w:sz w:val="44"/>
+          <w:szCs w:val="44"/>
+          <w:lang w:bidi="fa-IR"/>
+        </w:rPr>
+        <w:t xml:space="preserve"> </w:t>
       </w:r>
     </w:p>
     <w:p>
@@ -5618,13 +5885,23 @@
           <w:lang w:bidi="fa-IR"/>
         </w:rPr>
       </w:pPr>
-      <w:r>
-        <w:rPr>
-          <w:sz w:val="44"/>
-          <w:szCs w:val="44"/>
-          <w:lang w:bidi="fa-IR"/>
-        </w:rPr>
-        <w:t xml:space="preserve">1 : </w:t>
+      <w:proofErr w:type="gramStart"/>
+      <w:r>
+        <w:rPr>
+          <w:sz w:val="44"/>
+          <w:szCs w:val="44"/>
+          <w:lang w:bidi="fa-IR"/>
+        </w:rPr>
+        <w:t>1 :</w:t>
+      </w:r>
+      <w:proofErr w:type="gramEnd"/>
+      <w:r>
+        <w:rPr>
+          <w:sz w:val="44"/>
+          <w:szCs w:val="44"/>
+          <w:lang w:bidi="fa-IR"/>
+        </w:rPr>
+        <w:t xml:space="preserve"> </w:t>
       </w:r>
     </w:p>
     <w:p>
@@ -5732,13 +6009,23 @@
           <w:lang w:bidi="fa-IR"/>
         </w:rPr>
       </w:pPr>
-      <w:r>
-        <w:rPr>
-          <w:sz w:val="44"/>
-          <w:szCs w:val="44"/>
-          <w:lang w:bidi="fa-IR"/>
-        </w:rPr>
-        <w:t xml:space="preserve">2 : </w:t>
+      <w:proofErr w:type="gramStart"/>
+      <w:r>
+        <w:rPr>
+          <w:sz w:val="44"/>
+          <w:szCs w:val="44"/>
+          <w:lang w:bidi="fa-IR"/>
+        </w:rPr>
+        <w:t>2 :</w:t>
+      </w:r>
+      <w:proofErr w:type="gramEnd"/>
+      <w:r>
+        <w:rPr>
+          <w:sz w:val="44"/>
+          <w:szCs w:val="44"/>
+          <w:lang w:bidi="fa-IR"/>
+        </w:rPr>
+        <w:t xml:space="preserve"> </w:t>
       </w:r>
     </w:p>
     <w:p>
@@ -5962,13 +6249,23 @@
           <w:lang w:bidi="fa-IR"/>
         </w:rPr>
       </w:pPr>
-      <w:r>
-        <w:rPr>
-          <w:sz w:val="44"/>
-          <w:szCs w:val="44"/>
-          <w:lang w:bidi="fa-IR"/>
-        </w:rPr>
-        <w:t xml:space="preserve">4 : </w:t>
+      <w:proofErr w:type="gramStart"/>
+      <w:r>
+        <w:rPr>
+          <w:sz w:val="44"/>
+          <w:szCs w:val="44"/>
+          <w:lang w:bidi="fa-IR"/>
+        </w:rPr>
+        <w:t>4 :</w:t>
+      </w:r>
+      <w:proofErr w:type="gramEnd"/>
+      <w:r>
+        <w:rPr>
+          <w:sz w:val="44"/>
+          <w:szCs w:val="44"/>
+          <w:lang w:bidi="fa-IR"/>
+        </w:rPr>
+        <w:t xml:space="preserve"> </w:t>
       </w:r>
     </w:p>
     <w:p>
@@ -6486,13 +6783,23 @@
           <w:lang w:bidi="fa-IR"/>
         </w:rPr>
       </w:pPr>
-      <w:r>
-        <w:rPr>
-          <w:sz w:val="44"/>
-          <w:szCs w:val="44"/>
-          <w:lang w:bidi="fa-IR"/>
-        </w:rPr>
-        <w:t xml:space="preserve">5 : </w:t>
+      <w:proofErr w:type="gramStart"/>
+      <w:r>
+        <w:rPr>
+          <w:sz w:val="44"/>
+          <w:szCs w:val="44"/>
+          <w:lang w:bidi="fa-IR"/>
+        </w:rPr>
+        <w:t>5 :</w:t>
+      </w:r>
+      <w:proofErr w:type="gramEnd"/>
+      <w:r>
+        <w:rPr>
+          <w:sz w:val="44"/>
+          <w:szCs w:val="44"/>
+          <w:lang w:bidi="fa-IR"/>
+        </w:rPr>
+        <w:t xml:space="preserve"> </w:t>
       </w:r>
     </w:p>
     <w:p>
@@ -6562,7 +6869,17 @@
           <w:szCs w:val="44"/>
           <w:lang w:bidi="fa-IR"/>
         </w:rPr>
-        <w:t>⟨⋅</w:t>
+        <w:t>⟨</w:t>
+      </w:r>
+      <w:proofErr w:type="gramStart"/>
+      <w:r>
+        <w:rPr>
+          <w:rFonts w:ascii="Cambria Math" w:hAnsi="Cambria Math" w:cs="Cambria Math"/>
+          <w:sz w:val="44"/>
+          <w:szCs w:val="44"/>
+          <w:lang w:bidi="fa-IR"/>
+        </w:rPr>
+        <w:t>⋅</w:t>
       </w:r>
       <w:r>
         <w:rPr>
@@ -6579,7 +6896,17 @@
           <w:szCs w:val="44"/>
           <w:lang w:bidi="fa-IR"/>
         </w:rPr>
-        <w:t>⋅⟩</w:t>
+        <w:t>⋅</w:t>
+      </w:r>
+      <w:proofErr w:type="gramEnd"/>
+      <w:r>
+        <w:rPr>
+          <w:rFonts w:ascii="Cambria Math" w:hAnsi="Cambria Math" w:cs="Cambria Math"/>
+          <w:sz w:val="44"/>
+          <w:szCs w:val="44"/>
+          <w:lang w:bidi="fa-IR"/>
+        </w:rPr>
+        <w:t>⟩</w:t>
       </w:r>
       <w:r>
         <w:rPr>
@@ -6624,6 +6951,7 @@
           <w:lang w:bidi="fa-IR"/>
         </w:rPr>
       </w:pPr>
+      <w:proofErr w:type="gramStart"/>
       <w:r>
         <w:rPr>
           <w:sz w:val="44"/>
@@ -6640,7 +6968,18 @@
           <w:szCs w:val="44"/>
           <w:lang w:bidi="fa-IR"/>
         </w:rPr>
-        <w:t>IP1:</w:t>
+        <w:t>IP</w:t>
+      </w:r>
+      <w:proofErr w:type="gramEnd"/>
+      <w:r>
+        <w:rPr>
+          <w:b/>
+          <w:bCs/>
+          <w:sz w:val="44"/>
+          <w:szCs w:val="44"/>
+          <w:lang w:bidi="fa-IR"/>
+        </w:rPr>
+        <w:t>1:</w:t>
       </w:r>
       <w:r>
         <w:rPr>
@@ -6659,6 +6998,7 @@
           <w:lang w:bidi="fa-IR"/>
         </w:rPr>
       </w:pPr>
+      <w:proofErr w:type="gramStart"/>
       <w:r>
         <w:rPr>
           <w:sz w:val="44"/>
@@ -6675,7 +7015,18 @@
           <w:szCs w:val="44"/>
           <w:lang w:bidi="fa-IR"/>
         </w:rPr>
-        <w:t>IP2:</w:t>
+        <w:t>IP</w:t>
+      </w:r>
+      <w:proofErr w:type="gramEnd"/>
+      <w:r>
+        <w:rPr>
+          <w:b/>
+          <w:bCs/>
+          <w:sz w:val="44"/>
+          <w:szCs w:val="44"/>
+          <w:lang w:bidi="fa-IR"/>
+        </w:rPr>
+        <w:t>2:</w:t>
       </w:r>
       <w:r>
         <w:rPr>
@@ -6694,6 +7045,7 @@
           <w:lang w:bidi="fa-IR"/>
         </w:rPr>
       </w:pPr>
+      <w:proofErr w:type="gramStart"/>
       <w:r>
         <w:rPr>
           <w:sz w:val="44"/>
@@ -6710,7 +7062,18 @@
           <w:szCs w:val="44"/>
           <w:lang w:bidi="fa-IR"/>
         </w:rPr>
-        <w:t>IP3:</w:t>
+        <w:t>IP</w:t>
+      </w:r>
+      <w:proofErr w:type="gramEnd"/>
+      <w:r>
+        <w:rPr>
+          <w:b/>
+          <w:bCs/>
+          <w:sz w:val="44"/>
+          <w:szCs w:val="44"/>
+          <w:lang w:bidi="fa-IR"/>
+        </w:rPr>
+        <w:t>3:</w:t>
       </w:r>
       <w:r>
         <w:rPr>
@@ -6748,6 +7111,7 @@
           <w:lang w:bidi="fa-IR"/>
         </w:rPr>
       </w:pPr>
+      <w:proofErr w:type="gramStart"/>
       <w:r>
         <w:rPr>
           <w:sz w:val="44"/>
@@ -6764,7 +7128,18 @@
           <w:szCs w:val="44"/>
           <w:lang w:bidi="fa-IR"/>
         </w:rPr>
-        <w:t>IP4:</w:t>
+        <w:t>IP</w:t>
+      </w:r>
+      <w:proofErr w:type="gramEnd"/>
+      <w:r>
+        <w:rPr>
+          <w:b/>
+          <w:bCs/>
+          <w:sz w:val="44"/>
+          <w:szCs w:val="44"/>
+          <w:lang w:bidi="fa-IR"/>
+        </w:rPr>
+        <w:t>4:</w:t>
       </w:r>
       <w:r>
         <w:rPr>
@@ -6810,13 +7185,23 @@
           <w:lang w:bidi="fa-IR"/>
         </w:rPr>
       </w:pPr>
-      <w:r>
-        <w:rPr>
-          <w:sz w:val="44"/>
-          <w:szCs w:val="44"/>
-          <w:lang w:bidi="fa-IR"/>
-        </w:rPr>
-        <w:t xml:space="preserve">6 : </w:t>
+      <w:proofErr w:type="gramStart"/>
+      <w:r>
+        <w:rPr>
+          <w:sz w:val="44"/>
+          <w:szCs w:val="44"/>
+          <w:lang w:bidi="fa-IR"/>
+        </w:rPr>
+        <w:t>6 :</w:t>
+      </w:r>
+      <w:proofErr w:type="gramEnd"/>
+      <w:r>
+        <w:rPr>
+          <w:sz w:val="44"/>
+          <w:szCs w:val="44"/>
+          <w:lang w:bidi="fa-IR"/>
+        </w:rPr>
+        <w:t xml:space="preserve"> </w:t>
       </w:r>
     </w:p>
     <w:p>
@@ -7026,7 +7411,6 @@
     <w:p>
       <w:pPr>
         <w:rPr>
-          <w:rFonts w:hint="cs"/>
           <w:sz w:val="44"/>
           <w:szCs w:val="44"/>
           <w:rtl/>
@@ -7047,15 +7431,7 @@
           <w:szCs w:val="44"/>
           <w:lang w:bidi="fa-IR"/>
         </w:rPr>
-        <w:t xml:space="preserve"> </w:t>
-      </w:r>
-      <w:r>
-        <w:rPr>
-          <w:sz w:val="44"/>
-          <w:szCs w:val="44"/>
-          <w:lang w:bidi="fa-IR"/>
-        </w:rPr>
-        <w:t>what you see on the screen.</w:t>
+        <w:t xml:space="preserve"> what you see on the screen.</w:t>
       </w:r>
     </w:p>
     <w:p>
@@ -7171,13 +7547,23 @@
           <w:lang w:bidi="fa-IR"/>
         </w:rPr>
       </w:pPr>
-      <w:r>
-        <w:rPr>
-          <w:sz w:val="44"/>
-          <w:szCs w:val="44"/>
-          <w:lang w:bidi="fa-IR"/>
-        </w:rPr>
-        <w:t xml:space="preserve">7 : </w:t>
+      <w:proofErr w:type="gramStart"/>
+      <w:r>
+        <w:rPr>
+          <w:sz w:val="44"/>
+          <w:szCs w:val="44"/>
+          <w:lang w:bidi="fa-IR"/>
+        </w:rPr>
+        <w:t>7 :</w:t>
+      </w:r>
+      <w:proofErr w:type="gramEnd"/>
+      <w:r>
+        <w:rPr>
+          <w:sz w:val="44"/>
+          <w:szCs w:val="44"/>
+          <w:lang w:bidi="fa-IR"/>
+        </w:rPr>
+        <w:t xml:space="preserve"> </w:t>
       </w:r>
     </w:p>
     <w:p>
@@ -7285,7 +7671,43 @@
           <w:szCs w:val="44"/>
           <w:lang w:bidi="fa-IR"/>
         </w:rPr>
-        <w:t>Here, we multiply the two functions pointwise and integrate the result over the interval [−1,1][-1,1][−1,1].</w:t>
+        <w:t>Here, we multiply the two functions pointwise and integrate the result over the interval [−1,</w:t>
+      </w:r>
+      <w:proofErr w:type="gramStart"/>
+      <w:r>
+        <w:rPr>
+          <w:sz w:val="44"/>
+          <w:szCs w:val="44"/>
+          <w:lang w:bidi="fa-IR"/>
+        </w:rPr>
+        <w:t>1][</w:t>
+      </w:r>
+      <w:proofErr w:type="gramEnd"/>
+      <w:r>
+        <w:rPr>
+          <w:sz w:val="44"/>
+          <w:szCs w:val="44"/>
+          <w:lang w:bidi="fa-IR"/>
+        </w:rPr>
+        <w:t>-1,</w:t>
+      </w:r>
+      <w:proofErr w:type="gramStart"/>
+      <w:r>
+        <w:rPr>
+          <w:sz w:val="44"/>
+          <w:szCs w:val="44"/>
+          <w:lang w:bidi="fa-IR"/>
+        </w:rPr>
+        <w:t>1][</w:t>
+      </w:r>
+      <w:proofErr w:type="gramEnd"/>
+      <w:r>
+        <w:rPr>
+          <w:sz w:val="44"/>
+          <w:szCs w:val="44"/>
+          <w:lang w:bidi="fa-IR"/>
+        </w:rPr>
+        <w:t>−1,1].</w:t>
       </w:r>
     </w:p>
     <w:p>
@@ -7309,7 +7731,6 @@
     <w:p>
       <w:pPr>
         <w:rPr>
-          <w:rFonts w:hint="cs"/>
           <w:sz w:val="44"/>
           <w:szCs w:val="44"/>
           <w:rtl/>
@@ -7357,13 +7778,23 @@
           <w:lang w:bidi="fa-IR"/>
         </w:rPr>
       </w:pPr>
-      <w:r>
-        <w:rPr>
-          <w:sz w:val="44"/>
-          <w:szCs w:val="44"/>
-          <w:lang w:bidi="fa-IR"/>
-        </w:rPr>
-        <w:t xml:space="preserve">8 : </w:t>
+      <w:proofErr w:type="gramStart"/>
+      <w:r>
+        <w:rPr>
+          <w:sz w:val="44"/>
+          <w:szCs w:val="44"/>
+          <w:lang w:bidi="fa-IR"/>
+        </w:rPr>
+        <w:t>8 :</w:t>
+      </w:r>
+      <w:proofErr w:type="gramEnd"/>
+      <w:r>
+        <w:rPr>
+          <w:sz w:val="44"/>
+          <w:szCs w:val="44"/>
+          <w:lang w:bidi="fa-IR"/>
+        </w:rPr>
+        <w:t xml:space="preserve"> </w:t>
       </w:r>
     </w:p>
     <w:p>
@@ -7498,13 +7929,23 @@
           <w:lang w:bidi="fa-IR"/>
         </w:rPr>
       </w:pPr>
-      <w:r>
-        <w:rPr>
-          <w:sz w:val="44"/>
-          <w:szCs w:val="44"/>
-          <w:lang w:bidi="fa-IR"/>
-        </w:rPr>
-        <w:t xml:space="preserve">9 : </w:t>
+      <w:proofErr w:type="gramStart"/>
+      <w:r>
+        <w:rPr>
+          <w:sz w:val="44"/>
+          <w:szCs w:val="44"/>
+          <w:lang w:bidi="fa-IR"/>
+        </w:rPr>
+        <w:t>9 :</w:t>
+      </w:r>
+      <w:proofErr w:type="gramEnd"/>
+      <w:r>
+        <w:rPr>
+          <w:sz w:val="44"/>
+          <w:szCs w:val="44"/>
+          <w:lang w:bidi="fa-IR"/>
+        </w:rPr>
+        <w:t xml:space="preserve"> </w:t>
       </w:r>
     </w:p>
     <w:p>
@@ -7559,6 +8000,785 @@
     <w:p>
       <w:pPr>
         <w:rPr>
+          <w:sz w:val="44"/>
+          <w:szCs w:val="44"/>
+          <w:rtl/>
+          <w:lang w:bidi="fa-IR"/>
+        </w:rPr>
+      </w:pPr>
+      <w:r>
+        <w:rPr>
+          <w:b/>
+          <w:bCs/>
+          <w:sz w:val="44"/>
+          <w:szCs w:val="44"/>
+          <w:lang w:bidi="fa-IR"/>
+        </w:rPr>
+        <w:t>So, stay tuned, and I'll see you in the next video.</w:t>
+      </w:r>
+    </w:p>
+    <w:p>
+      <w:pPr>
+        <w:pStyle w:val="Heading2"/>
+        <w:rPr>
+          <w:lang w:bidi="fa-IR"/>
+        </w:rPr>
+      </w:pPr>
+      <w:r>
+        <w:rPr>
+          <w:lang w:bidi="fa-IR"/>
+        </w:rPr>
+        <w:t>Form inner products to norms</w:t>
+      </w:r>
+    </w:p>
+    <w:p>
+      <w:pPr>
+        <w:rPr>
+          <w:sz w:val="44"/>
+          <w:szCs w:val="44"/>
+          <w:lang w:bidi="fa-IR"/>
+        </w:rPr>
+      </w:pPr>
+      <w:proofErr w:type="gramStart"/>
+      <w:r>
+        <w:rPr>
+          <w:sz w:val="44"/>
+          <w:szCs w:val="44"/>
+          <w:lang w:bidi="fa-IR"/>
+        </w:rPr>
+        <w:t>1 :</w:t>
+      </w:r>
+      <w:proofErr w:type="gramEnd"/>
+      <w:r>
+        <w:rPr>
+          <w:sz w:val="44"/>
+          <w:szCs w:val="44"/>
+          <w:lang w:bidi="fa-IR"/>
+        </w:rPr>
+        <w:t xml:space="preserve"> </w:t>
+      </w:r>
+    </w:p>
+    <w:p>
+      <w:pPr>
+        <w:rPr>
+          <w:sz w:val="44"/>
+          <w:szCs w:val="44"/>
+          <w:lang w:bidi="fa-IR"/>
+        </w:rPr>
+      </w:pPr>
+      <w:r>
+        <w:rPr>
+          <w:b/>
+          <w:bCs/>
+          <w:sz w:val="44"/>
+          <w:szCs w:val="44"/>
+          <w:lang w:bidi="fa-IR"/>
+        </w:rPr>
+        <w:t>In the previous video, we explored the concept of the inner product.</w:t>
+      </w:r>
+    </w:p>
+    <w:p>
+      <w:pPr>
+        <w:rPr>
+          <w:sz w:val="44"/>
+          <w:szCs w:val="44"/>
+          <w:lang w:bidi="fa-IR"/>
+        </w:rPr>
+      </w:pPr>
+      <w:r>
+        <w:rPr>
+          <w:b/>
+          <w:bCs/>
+          <w:sz w:val="44"/>
+          <w:szCs w:val="44"/>
+          <w:lang w:bidi="fa-IR"/>
+        </w:rPr>
+        <w:t>Now, it's time to answer an important question: how can we construct a norm from an inner product?</w:t>
+      </w:r>
+    </w:p>
+    <w:p>
+      <w:pPr>
+        <w:rPr>
+          <w:sz w:val="44"/>
+          <w:szCs w:val="44"/>
+          <w:lang w:bidi="fa-IR"/>
+        </w:rPr>
+      </w:pPr>
+      <w:r>
+        <w:rPr>
+          <w:b/>
+          <w:bCs/>
+          <w:sz w:val="44"/>
+          <w:szCs w:val="44"/>
+          <w:lang w:bidi="fa-IR"/>
+        </w:rPr>
+        <w:t>Let's find out</w:t>
+      </w:r>
+    </w:p>
+    <w:p>
+      <w:pPr>
+        <w:rPr>
+          <w:sz w:val="44"/>
+          <w:szCs w:val="44"/>
+          <w:lang w:bidi="fa-IR"/>
+        </w:rPr>
+      </w:pPr>
+      <w:proofErr w:type="gramStart"/>
+      <w:r>
+        <w:rPr>
+          <w:sz w:val="44"/>
+          <w:szCs w:val="44"/>
+          <w:lang w:bidi="fa-IR"/>
+        </w:rPr>
+        <w:t>2 :</w:t>
+      </w:r>
+      <w:proofErr w:type="gramEnd"/>
+      <w:r>
+        <w:rPr>
+          <w:sz w:val="44"/>
+          <w:szCs w:val="44"/>
+          <w:lang w:bidi="fa-IR"/>
+        </w:rPr>
+        <w:t xml:space="preserve"> </w:t>
+      </w:r>
+    </w:p>
+    <w:p>
+      <w:pPr>
+        <w:rPr>
+          <w:sz w:val="44"/>
+          <w:szCs w:val="44"/>
+          <w:lang w:bidi="fa-IR"/>
+        </w:rPr>
+      </w:pPr>
+      <w:r>
+        <w:rPr>
+          <w:sz w:val="44"/>
+          <w:szCs w:val="44"/>
+          <w:lang w:bidi="fa-IR"/>
+        </w:rPr>
+        <w:t>In general, a norm can be constructed from an inner product using the following formula.</w:t>
+      </w:r>
+    </w:p>
+    <w:p>
+      <w:pPr>
+        <w:rPr>
+          <w:sz w:val="44"/>
+          <w:szCs w:val="44"/>
+          <w:lang w:bidi="fa-IR"/>
+        </w:rPr>
+      </w:pPr>
+      <w:r>
+        <w:rPr>
+          <w:sz w:val="44"/>
+          <w:szCs w:val="44"/>
+          <w:lang w:bidi="fa-IR"/>
+        </w:rPr>
+        <w:lastRenderedPageBreak/>
+        <w:t>We claim that this formula indeed defines a norm. To verify this, we need to prove that it satisfies the three norm axioms.</w:t>
+      </w:r>
+    </w:p>
+    <w:p>
+      <w:pPr>
+        <w:rPr>
+          <w:sz w:val="44"/>
+          <w:szCs w:val="44"/>
+          <w:lang w:bidi="fa-IR"/>
+        </w:rPr>
+      </w:pPr>
+      <w:r>
+        <w:rPr>
+          <w:sz w:val="44"/>
+          <w:szCs w:val="44"/>
+          <w:lang w:bidi="fa-IR"/>
+        </w:rPr>
+        <w:t>Let's begin with the first property.</w:t>
+      </w:r>
+    </w:p>
+    <w:p>
+      <w:pPr>
+        <w:rPr>
+          <w:sz w:val="44"/>
+          <w:szCs w:val="44"/>
+          <w:lang w:bidi="fa-IR"/>
+        </w:rPr>
+      </w:pPr>
+      <w:r>
+        <w:rPr>
+          <w:sz w:val="44"/>
+          <w:szCs w:val="44"/>
+          <w:lang w:bidi="fa-IR"/>
+        </w:rPr>
+        <w:t>Starting from the left-hand side of the statement, we substitute the definition of the norm. Then, by applying the fourth property of the inner product, we obtain the desired result. Therefore, the first norm property is satisfied.</w:t>
+      </w:r>
+    </w:p>
+    <w:p>
+      <w:pPr>
+        <w:rPr>
+          <w:sz w:val="44"/>
+          <w:szCs w:val="44"/>
+          <w:lang w:bidi="fa-IR"/>
+        </w:rPr>
+      </w:pPr>
+      <w:r>
+        <w:rPr>
+          <w:sz w:val="44"/>
+          <w:szCs w:val="44"/>
+          <w:lang w:bidi="fa-IR"/>
+        </w:rPr>
+        <w:t>Now, let's prove the second property.</w:t>
+      </w:r>
+    </w:p>
+    <w:p>
+      <w:pPr>
+        <w:rPr>
+          <w:sz w:val="44"/>
+          <w:szCs w:val="44"/>
+          <w:lang w:bidi="fa-IR"/>
+        </w:rPr>
+      </w:pPr>
+      <w:r>
+        <w:rPr>
+          <w:sz w:val="44"/>
+          <w:szCs w:val="44"/>
+          <w:lang w:bidi="fa-IR"/>
+        </w:rPr>
+        <w:t>Again, we start from the left-hand side and substitute the definition of the norm. Next, we use the second property of the inner product, together with Facts 1 and 2 introduced in the previous video. After simplifying the expression, we arrive at the required equality, proving the second norm property.</w:t>
+      </w:r>
+    </w:p>
+    <w:p>
+      <w:pPr>
+        <w:rPr>
+          <w:sz w:val="44"/>
+          <w:szCs w:val="44"/>
+          <w:lang w:bidi="fa-IR"/>
+        </w:rPr>
+      </w:pPr>
+      <w:r>
+        <w:rPr>
+          <w:sz w:val="44"/>
+          <w:szCs w:val="44"/>
+          <w:lang w:bidi="fa-IR"/>
+        </w:rPr>
+        <w:t>Finally, let's prove the third property.</w:t>
+      </w:r>
+    </w:p>
+    <w:p>
+      <w:pPr>
+        <w:rPr>
+          <w:sz w:val="44"/>
+          <w:szCs w:val="44"/>
+          <w:lang w:bidi="fa-IR"/>
+        </w:rPr>
+      </w:pPr>
+      <w:r>
+        <w:rPr>
+          <w:sz w:val="44"/>
+          <w:szCs w:val="44"/>
+          <w:lang w:bidi="fa-IR"/>
+        </w:rPr>
+        <w:lastRenderedPageBreak/>
+        <w:t>We begin with the square of the left-hand side of the inequality. Using Facts 1 and 2, we expand and simplify the expression. We then apply the triangle inequality for real numbers, followed by the Cauchy--Schwarz inequality. This leads directly to the desired inequality, completing the proof of the third norm property.</w:t>
+      </w:r>
+    </w:p>
+    <w:p>
+      <w:pPr>
+        <w:rPr>
+          <w:sz w:val="44"/>
+          <w:szCs w:val="44"/>
+          <w:rtl/>
+          <w:lang w:bidi="fa-IR"/>
+        </w:rPr>
+      </w:pPr>
+      <w:r>
+        <w:rPr>
+          <w:sz w:val="44"/>
+          <w:szCs w:val="44"/>
+          <w:lang w:bidi="fa-IR"/>
+        </w:rPr>
+        <w:t>Therefore, the function defined by the inner product satisfies all three norm axioms and is indeed a norm.</w:t>
+      </w:r>
+    </w:p>
+    <w:p>
+      <w:pPr>
+        <w:rPr>
+          <w:sz w:val="44"/>
+          <w:szCs w:val="44"/>
+          <w:lang w:bidi="fa-IR"/>
+        </w:rPr>
+      </w:pPr>
+      <w:proofErr w:type="gramStart"/>
+      <w:r>
+        <w:rPr>
+          <w:sz w:val="44"/>
+          <w:szCs w:val="44"/>
+          <w:lang w:bidi="fa-IR"/>
+        </w:rPr>
+        <w:t>3 :</w:t>
+      </w:r>
+      <w:proofErr w:type="gramEnd"/>
+      <w:r>
+        <w:rPr>
+          <w:sz w:val="44"/>
+          <w:szCs w:val="44"/>
+          <w:lang w:bidi="fa-IR"/>
+        </w:rPr>
+        <w:t xml:space="preserve"> </w:t>
+      </w:r>
+    </w:p>
+    <w:p>
+      <w:pPr>
+        <w:rPr>
+          <w:sz w:val="44"/>
+          <w:szCs w:val="44"/>
+          <w:lang w:bidi="fa-IR"/>
+        </w:rPr>
+      </w:pPr>
+      <w:r>
+        <w:rPr>
+          <w:sz w:val="44"/>
+          <w:szCs w:val="44"/>
+          <w:lang w:bidi="fa-IR"/>
+        </w:rPr>
+        <w:t>So, as we've just shown, every inner product induces a norm.</w:t>
+      </w:r>
+    </w:p>
+    <w:p>
+      <w:pPr>
+        <w:rPr>
+          <w:sz w:val="44"/>
+          <w:szCs w:val="44"/>
+          <w:lang w:bidi="fa-IR"/>
+        </w:rPr>
+      </w:pPr>
+      <w:r>
+        <w:rPr>
+          <w:sz w:val="44"/>
+          <w:szCs w:val="44"/>
+          <w:lang w:bidi="fa-IR"/>
+        </w:rPr>
+        <w:t>For example, consider the Euclidean inner product. The norm induced by this inner product is exactly the Euclidean norm, as shown here.</w:t>
+      </w:r>
+    </w:p>
+    <w:p>
+      <w:pPr>
+        <w:rPr>
+          <w:sz w:val="44"/>
+          <w:szCs w:val="44"/>
+          <w:lang w:bidi="fa-IR"/>
+        </w:rPr>
+      </w:pPr>
+      <w:r>
+        <w:rPr>
+          <w:sz w:val="44"/>
+          <w:szCs w:val="44"/>
+          <w:lang w:bidi="fa-IR"/>
+        </w:rPr>
+        <w:t>However, the converse is not true.</w:t>
+      </w:r>
+    </w:p>
+    <w:p>
+      <w:pPr>
+        <w:rPr>
+          <w:sz w:val="44"/>
+          <w:szCs w:val="44"/>
+          <w:lang w:bidi="fa-IR"/>
+        </w:rPr>
+      </w:pPr>
+      <w:r>
+        <w:rPr>
+          <w:sz w:val="44"/>
+          <w:szCs w:val="44"/>
+          <w:lang w:bidi="fa-IR"/>
+        </w:rPr>
+        <w:t>Not every norm is induced by an inner product.</w:t>
+      </w:r>
+    </w:p>
+    <w:p>
+      <w:pPr>
+        <w:rPr>
+          <w:sz w:val="44"/>
+          <w:szCs w:val="44"/>
+          <w:lang w:bidi="fa-IR"/>
+        </w:rPr>
+      </w:pPr>
+      <w:r>
+        <w:rPr>
+          <w:sz w:val="44"/>
+          <w:szCs w:val="44"/>
+          <w:lang w:bidi="fa-IR"/>
+        </w:rPr>
+        <w:lastRenderedPageBreak/>
+        <w:t>For instance, the (</w:t>
+      </w:r>
+      <w:proofErr w:type="spellStart"/>
+      <w:r>
+        <w:rPr>
+          <w:sz w:val="44"/>
+          <w:szCs w:val="44"/>
+          <w:lang w:bidi="fa-IR"/>
+        </w:rPr>
+        <w:t>L^p</w:t>
+      </w:r>
+      <w:proofErr w:type="spellEnd"/>
+      <w:r>
+        <w:rPr>
+          <w:sz w:val="44"/>
+          <w:szCs w:val="44"/>
+          <w:lang w:bidi="fa-IR"/>
+        </w:rPr>
+        <w:t>) norms for (p \</w:t>
+      </w:r>
+      <w:proofErr w:type="spellStart"/>
+      <w:r>
+        <w:rPr>
+          <w:sz w:val="44"/>
+          <w:szCs w:val="44"/>
+          <w:lang w:bidi="fa-IR"/>
+        </w:rPr>
+        <w:t>neq</w:t>
+      </w:r>
+      <w:proofErr w:type="spellEnd"/>
+      <w:r>
+        <w:rPr>
+          <w:sz w:val="44"/>
+          <w:szCs w:val="44"/>
+          <w:lang w:bidi="fa-IR"/>
+        </w:rPr>
+        <w:t xml:space="preserve"> 2) cannot be generated by any inner product. In other words, only the (L^2) norm arises from an inner product.</w:t>
+      </w:r>
+    </w:p>
+    <w:p>
+      <w:pPr>
+        <w:rPr>
+          <w:sz w:val="44"/>
+          <w:szCs w:val="44"/>
+          <w:lang w:bidi="fa-IR"/>
+        </w:rPr>
+      </w:pPr>
+      <w:proofErr w:type="gramStart"/>
+      <w:r>
+        <w:rPr>
+          <w:sz w:val="44"/>
+          <w:szCs w:val="44"/>
+          <w:lang w:bidi="fa-IR"/>
+        </w:rPr>
+        <w:t>4 :</w:t>
+      </w:r>
+      <w:proofErr w:type="gramEnd"/>
+      <w:r>
+        <w:rPr>
+          <w:sz w:val="44"/>
+          <w:szCs w:val="44"/>
+          <w:lang w:bidi="fa-IR"/>
+        </w:rPr>
+        <w:t xml:space="preserve"> </w:t>
+      </w:r>
+    </w:p>
+    <w:p>
+      <w:pPr>
+        <w:rPr>
+          <w:sz w:val="44"/>
+          <w:szCs w:val="44"/>
+          <w:lang w:bidi="fa-IR"/>
+        </w:rPr>
+      </w:pPr>
+      <w:r>
+        <w:rPr>
+          <w:b/>
+          <w:bCs/>
+          <w:sz w:val="44"/>
+          <w:szCs w:val="44"/>
+          <w:lang w:bidi="fa-IR"/>
+        </w:rPr>
+        <w:t>The answer is the parallelogram equality.</w:t>
+      </w:r>
+    </w:p>
+    <w:p>
+      <w:pPr>
+        <w:rPr>
+          <w:sz w:val="44"/>
+          <w:szCs w:val="44"/>
+          <w:lang w:bidi="fa-IR"/>
+        </w:rPr>
+      </w:pPr>
+      <w:r>
+        <w:rPr>
+          <w:b/>
+          <w:bCs/>
+          <w:sz w:val="44"/>
+          <w:szCs w:val="44"/>
+          <w:lang w:bidi="fa-IR"/>
+        </w:rPr>
+        <w:t>A norm is induced by an inner product if and only if it satisfies the parallelogram equality.</w:t>
+      </w:r>
+    </w:p>
+    <w:p>
+      <w:pPr>
+        <w:rPr>
+          <w:sz w:val="44"/>
+          <w:szCs w:val="44"/>
+          <w:lang w:bidi="fa-IR"/>
+        </w:rPr>
+      </w:pPr>
+      <w:r>
+        <w:rPr>
+          <w:b/>
+          <w:bCs/>
+          <w:sz w:val="44"/>
+          <w:szCs w:val="44"/>
+          <w:lang w:bidi="fa-IR"/>
+        </w:rPr>
+        <w:t>So, whenever this identity holds, we can construct an inner product that induces the given norm</w:t>
+      </w:r>
+    </w:p>
+    <w:p>
+      <w:pPr>
+        <w:rPr>
+          <w:sz w:val="44"/>
+          <w:szCs w:val="44"/>
+          <w:lang w:bidi="fa-IR"/>
+        </w:rPr>
+      </w:pPr>
+      <w:r>
+        <w:rPr>
+          <w:sz w:val="44"/>
+          <w:szCs w:val="44"/>
+          <w:lang w:bidi="fa-IR"/>
+        </w:rPr>
+        <w:t xml:space="preserve">Now, let's prove the </w:t>
+      </w:r>
+      <w:r>
+        <w:rPr>
+          <w:b/>
+          <w:bCs/>
+          <w:sz w:val="44"/>
+          <w:szCs w:val="44"/>
+          <w:lang w:bidi="fa-IR"/>
+        </w:rPr>
+        <w:t>parallelogram equality</w:t>
+      </w:r>
+      <w:r>
+        <w:rPr>
+          <w:sz w:val="44"/>
+          <w:szCs w:val="44"/>
+          <w:lang w:bidi="fa-IR"/>
+        </w:rPr>
+        <w:t>.</w:t>
+      </w:r>
+    </w:p>
+    <w:p>
+      <w:pPr>
+        <w:rPr>
+          <w:sz w:val="44"/>
+          <w:szCs w:val="44"/>
+          <w:lang w:bidi="fa-IR"/>
+        </w:rPr>
+      </w:pPr>
+      <w:r>
+        <w:rPr>
+          <w:sz w:val="44"/>
+          <w:szCs w:val="44"/>
+          <w:lang w:bidi="fa-IR"/>
+        </w:rPr>
+        <w:t>We'll start from the left-hand side of the identity.</w:t>
+      </w:r>
+    </w:p>
+    <w:p>
+      <w:pPr>
+        <w:rPr>
+          <w:sz w:val="44"/>
+          <w:szCs w:val="44"/>
+          <w:lang w:bidi="fa-IR"/>
+        </w:rPr>
+      </w:pPr>
+      <w:r>
+        <w:rPr>
+          <w:sz w:val="44"/>
+          <w:szCs w:val="44"/>
+          <w:lang w:bidi="fa-IR"/>
+        </w:rPr>
+        <w:t>Using the definition of the norm induced by an inner product, we rewrite each squared norm as an inner product.</w:t>
+      </w:r>
+    </w:p>
+    <w:p>
+      <w:pPr>
+        <w:rPr>
+          <w:sz w:val="44"/>
+          <w:szCs w:val="44"/>
+          <w:lang w:bidi="fa-IR"/>
+        </w:rPr>
+      </w:pPr>
+      <w:r>
+        <w:rPr>
+          <w:sz w:val="44"/>
+          <w:szCs w:val="44"/>
+          <w:lang w:bidi="fa-IR"/>
+        </w:rPr>
+        <w:t>Next, we expand both inner products using linearity.</w:t>
+      </w:r>
+    </w:p>
+    <w:p>
+      <w:pPr>
+        <w:rPr>
+          <w:sz w:val="44"/>
+          <w:szCs w:val="44"/>
+          <w:lang w:bidi="fa-IR"/>
+        </w:rPr>
+      </w:pPr>
+      <w:r>
+        <w:rPr>
+          <w:sz w:val="44"/>
+          <w:szCs w:val="44"/>
+          <w:lang w:bidi="fa-IR"/>
+        </w:rPr>
+        <w:t>What remains is simply</w:t>
+      </w:r>
+    </w:p>
+    <w:p>
+      <w:pPr>
+        <w:rPr>
+          <w:sz w:val="44"/>
+          <w:szCs w:val="44"/>
+          <w:lang w:bidi="fa-IR"/>
+        </w:rPr>
+      </w:pPr>
+      <w:r>
+        <w:rPr>
+          <w:b/>
+          <w:bCs/>
+          <w:sz w:val="44"/>
+          <w:szCs w:val="44"/>
+          <w:lang w:bidi="fa-IR"/>
+        </w:rPr>
+        <w:t>two times the sum of the squared norms of x and y.</w:t>
+      </w:r>
+    </w:p>
+    <w:p>
+      <w:pPr>
+        <w:rPr>
+          <w:sz w:val="44"/>
+          <w:szCs w:val="44"/>
+          <w:lang w:bidi="fa-IR"/>
+        </w:rPr>
+      </w:pPr>
+      <w:r>
+        <w:rPr>
+          <w:sz w:val="44"/>
+          <w:szCs w:val="44"/>
+          <w:lang w:bidi="fa-IR"/>
+        </w:rPr>
+        <w:lastRenderedPageBreak/>
+        <w:t>Therefore, the parallelogram equality holds</w:t>
+      </w:r>
+    </w:p>
+    <w:p>
+      <w:pPr>
+        <w:rPr>
+          <w:sz w:val="44"/>
+          <w:szCs w:val="44"/>
+          <w:lang w:bidi="fa-IR"/>
+        </w:rPr>
+      </w:pPr>
+      <w:r>
+        <w:rPr>
+          <w:sz w:val="44"/>
+          <w:szCs w:val="44"/>
+          <w:lang w:bidi="fa-IR"/>
+        </w:rPr>
+        <w:t xml:space="preserve">But why is this identity called the </w:t>
+      </w:r>
+      <w:r>
+        <w:rPr>
+          <w:b/>
+          <w:bCs/>
+          <w:sz w:val="44"/>
+          <w:szCs w:val="44"/>
+          <w:lang w:bidi="fa-IR"/>
+        </w:rPr>
+        <w:t>parallelogram equality</w:t>
+      </w:r>
+      <w:r>
+        <w:rPr>
+          <w:sz w:val="44"/>
+          <w:szCs w:val="44"/>
+          <w:lang w:bidi="fa-IR"/>
+        </w:rPr>
+        <w:t>?</w:t>
+      </w:r>
+    </w:p>
+    <w:p>
+      <w:pPr>
+        <w:rPr>
+          <w:sz w:val="44"/>
+          <w:szCs w:val="44"/>
+          <w:lang w:bidi="fa-IR"/>
+        </w:rPr>
+      </w:pPr>
+      <w:r>
+        <w:rPr>
+          <w:sz w:val="44"/>
+          <w:szCs w:val="44"/>
+          <w:lang w:bidi="fa-IR"/>
+        </w:rPr>
+        <w:t>The answer becomes clear from its geometric interpretation.</w:t>
+      </w:r>
+    </w:p>
+    <w:p>
+      <w:pPr>
+        <w:rPr>
+          <w:sz w:val="44"/>
+          <w:szCs w:val="44"/>
+          <w:lang w:bidi="fa-IR"/>
+        </w:rPr>
+      </w:pPr>
+      <w:r>
+        <w:rPr>
+          <w:sz w:val="44"/>
+          <w:szCs w:val="44"/>
+          <w:lang w:bidi="fa-IR"/>
+        </w:rPr>
+        <w:t xml:space="preserve">Consider the parallelogram determined by the vectors </w:t>
+      </w:r>
+      <w:r>
+        <w:rPr>
+          <w:b/>
+          <w:bCs/>
+          <w:sz w:val="44"/>
+          <w:szCs w:val="44"/>
+          <w:lang w:bidi="fa-IR"/>
+        </w:rPr>
+        <w:t>x</w:t>
+      </w:r>
+      <w:r>
+        <w:rPr>
+          <w:sz w:val="44"/>
+          <w:szCs w:val="44"/>
+          <w:lang w:bidi="fa-IR"/>
+        </w:rPr>
+        <w:t xml:space="preserve"> and </w:t>
+      </w:r>
+      <w:r>
+        <w:rPr>
+          <w:b/>
+          <w:bCs/>
+          <w:sz w:val="44"/>
+          <w:szCs w:val="44"/>
+          <w:lang w:bidi="fa-IR"/>
+        </w:rPr>
+        <w:t>y</w:t>
+      </w:r>
+      <w:r>
+        <w:rPr>
+          <w:sz w:val="44"/>
+          <w:szCs w:val="44"/>
+          <w:lang w:bidi="fa-IR"/>
+        </w:rPr>
+        <w:t>.</w:t>
+      </w:r>
+    </w:p>
+    <w:p>
+      <w:pPr>
+        <w:rPr>
           <w:rFonts w:hint="cs"/>
           <w:sz w:val="44"/>
           <w:szCs w:val="44"/>
@@ -7568,13 +8788,340 @@
       </w:pPr>
       <w:r>
         <w:rPr>
-          <w:b/>
-          <w:bCs/>
-          <w:sz w:val="44"/>
-          <w:szCs w:val="44"/>
-          <w:lang w:bidi="fa-IR"/>
-        </w:rPr>
-        <w:t>So, stay tuned, and I'll see you in the next video.</w:t>
+          <w:sz w:val="44"/>
+          <w:szCs w:val="44"/>
+          <w:lang w:bidi="fa-IR"/>
+        </w:rPr>
+        <w:t xml:space="preserve">The vectors </w:t>
+      </w:r>
+      <w:r>
+        <w:rPr>
+          <w:b/>
+          <w:bCs/>
+          <w:sz w:val="44"/>
+          <w:szCs w:val="44"/>
+          <w:lang w:bidi="fa-IR"/>
+        </w:rPr>
+        <w:t>x+</w:t>
+      </w:r>
+      <w:r>
+        <w:rPr>
+          <w:b/>
+          <w:bCs/>
+          <w:sz w:val="44"/>
+          <w:szCs w:val="44"/>
+          <w:lang w:bidi="fa-IR"/>
+        </w:rPr>
+        <w:t xml:space="preserve"> </w:t>
+      </w:r>
+      <w:r>
+        <w:rPr>
+          <w:b/>
+          <w:bCs/>
+          <w:sz w:val="44"/>
+          <w:szCs w:val="44"/>
+          <w:lang w:bidi="fa-IR"/>
+        </w:rPr>
+        <w:t>y</w:t>
+      </w:r>
+      <w:r>
+        <w:rPr>
+          <w:sz w:val="44"/>
+          <w:szCs w:val="44"/>
+          <w:lang w:bidi="fa-IR"/>
+        </w:rPr>
+        <w:t xml:space="preserve"> and </w:t>
+      </w:r>
+      <w:r>
+        <w:rPr>
+          <w:b/>
+          <w:bCs/>
+          <w:sz w:val="44"/>
+          <w:szCs w:val="44"/>
+          <w:lang w:bidi="fa-IR"/>
+        </w:rPr>
+        <w:t>x−</w:t>
+      </w:r>
+      <w:r>
+        <w:rPr>
+          <w:b/>
+          <w:bCs/>
+          <w:sz w:val="44"/>
+          <w:szCs w:val="44"/>
+          <w:lang w:bidi="fa-IR"/>
+        </w:rPr>
+        <w:t xml:space="preserve"> </w:t>
+      </w:r>
+      <w:r>
+        <w:rPr>
+          <w:b/>
+          <w:bCs/>
+          <w:sz w:val="44"/>
+          <w:szCs w:val="44"/>
+          <w:lang w:bidi="fa-IR"/>
+        </w:rPr>
+        <w:t>y</w:t>
+      </w:r>
+      <w:r>
+        <w:rPr>
+          <w:sz w:val="44"/>
+          <w:szCs w:val="44"/>
+          <w:lang w:bidi="fa-IR"/>
+        </w:rPr>
+        <w:t xml:space="preserve"> are exactly the two diagonals of this parallelogram.</w:t>
+      </w:r>
+    </w:p>
+    <w:p>
+      <w:pPr>
+        <w:rPr>
+          <w:sz w:val="44"/>
+          <w:szCs w:val="44"/>
+          <w:lang w:bidi="fa-IR"/>
+        </w:rPr>
+      </w:pPr>
+      <w:r>
+        <w:rPr>
+          <w:sz w:val="44"/>
+          <w:szCs w:val="44"/>
+          <w:lang w:bidi="fa-IR"/>
+        </w:rPr>
+        <w:t xml:space="preserve">The parallelogram equality tells us that </w:t>
+      </w:r>
+      <w:r>
+        <w:rPr>
+          <w:b/>
+          <w:bCs/>
+          <w:sz w:val="44"/>
+          <w:szCs w:val="44"/>
+          <w:lang w:bidi="fa-IR"/>
+        </w:rPr>
+        <w:t>the sum of the squares of the lengths of the two diagonals is equal to the sum of the squares of the lengths of all four sides.</w:t>
+      </w:r>
+    </w:p>
+    <w:p>
+      <w:pPr>
+        <w:rPr>
+          <w:sz w:val="44"/>
+          <w:szCs w:val="44"/>
+          <w:lang w:bidi="fa-IR"/>
+        </w:rPr>
+      </w:pPr>
+      <w:r>
+        <w:rPr>
+          <w:sz w:val="44"/>
+          <w:szCs w:val="44"/>
+          <w:lang w:bidi="fa-IR"/>
+        </w:rPr>
+        <w:t xml:space="preserve">This is why the identity is known as the </w:t>
+      </w:r>
+      <w:r>
+        <w:rPr>
+          <w:b/>
+          <w:bCs/>
+          <w:sz w:val="44"/>
+          <w:szCs w:val="44"/>
+          <w:lang w:bidi="fa-IR"/>
+        </w:rPr>
+        <w:t>parallelogram equality</w:t>
+      </w:r>
+    </w:p>
+    <w:p>
+      <w:pPr>
+        <w:rPr>
+          <w:sz w:val="44"/>
+          <w:szCs w:val="44"/>
+          <w:lang w:bidi="fa-IR"/>
+        </w:rPr>
+      </w:pPr>
+      <w:proofErr w:type="gramStart"/>
+      <w:r>
+        <w:rPr>
+          <w:sz w:val="44"/>
+          <w:szCs w:val="44"/>
+          <w:lang w:bidi="fa-IR"/>
+        </w:rPr>
+        <w:t>5 :</w:t>
+      </w:r>
+      <w:proofErr w:type="gramEnd"/>
+      <w:r>
+        <w:rPr>
+          <w:sz w:val="44"/>
+          <w:szCs w:val="44"/>
+          <w:lang w:bidi="fa-IR"/>
+        </w:rPr>
+        <w:t xml:space="preserve"> </w:t>
+      </w:r>
+    </w:p>
+    <w:p>
+      <w:pPr>
+        <w:rPr>
+          <w:sz w:val="44"/>
+          <w:szCs w:val="44"/>
+          <w:lang w:bidi="fa-IR"/>
+        </w:rPr>
+      </w:pPr>
+      <w:r>
+        <w:rPr>
+          <w:sz w:val="44"/>
+          <w:szCs w:val="44"/>
+          <w:lang w:bidi="fa-IR"/>
+        </w:rPr>
+        <w:t>So, based on everything we've learned so far, we can now see the relationship between these spaces.</w:t>
+      </w:r>
+    </w:p>
+    <w:p>
+      <w:pPr>
+        <w:rPr>
+          <w:sz w:val="44"/>
+          <w:szCs w:val="44"/>
+          <w:lang w:bidi="fa-IR"/>
+        </w:rPr>
+      </w:pPr>
+    </w:p>
+    <w:p>
+      <w:pPr>
+        <w:rPr>
+          <w:sz w:val="44"/>
+          <w:szCs w:val="44"/>
+          <w:lang w:bidi="fa-IR"/>
+        </w:rPr>
+      </w:pPr>
+      <w:r>
+        <w:rPr>
+          <w:sz w:val="44"/>
+          <w:szCs w:val="44"/>
+          <w:lang w:bidi="fa-IR"/>
+        </w:rPr>
+        <w:t>The collection of all inner product spaces is a subset of the collection of all normed spaces.</w:t>
+      </w:r>
+    </w:p>
+    <w:p>
+      <w:pPr>
+        <w:rPr>
+          <w:sz w:val="44"/>
+          <w:szCs w:val="44"/>
+          <w:lang w:bidi="fa-IR"/>
+        </w:rPr>
+      </w:pPr>
+      <w:r>
+        <w:rPr>
+          <w:sz w:val="44"/>
+          <w:szCs w:val="44"/>
+          <w:lang w:bidi="fa-IR"/>
+        </w:rPr>
+        <w:t>And, as we learned in the previous videos, every normed space is also a metric space.</w:t>
+      </w:r>
+    </w:p>
+    <w:p>
+      <w:pPr>
+        <w:rPr>
+          <w:sz w:val="44"/>
+          <w:szCs w:val="44"/>
+          <w:rtl/>
+          <w:lang w:bidi="fa-IR"/>
+        </w:rPr>
+      </w:pPr>
+      <w:r>
+        <w:rPr>
+          <w:sz w:val="44"/>
+          <w:szCs w:val="44"/>
+          <w:lang w:bidi="fa-IR"/>
+        </w:rPr>
+        <w:t>Therefore, the collection of all inner product spaces is contained within the collection of all normed spaces, which in turn is contained within the collection of all metric spaces</w:t>
+      </w:r>
+    </w:p>
+    <w:p>
+      <w:pPr>
+        <w:rPr>
+          <w:sz w:val="44"/>
+          <w:szCs w:val="44"/>
+          <w:lang w:bidi="fa-IR"/>
+        </w:rPr>
+      </w:pPr>
+      <w:proofErr w:type="gramStart"/>
+      <w:r>
+        <w:rPr>
+          <w:sz w:val="44"/>
+          <w:szCs w:val="44"/>
+          <w:lang w:bidi="fa-IR"/>
+        </w:rPr>
+        <w:t>6 :</w:t>
+      </w:r>
+      <w:proofErr w:type="gramEnd"/>
+      <w:r>
+        <w:rPr>
+          <w:sz w:val="44"/>
+          <w:szCs w:val="44"/>
+          <w:lang w:bidi="fa-IR"/>
+        </w:rPr>
+        <w:t xml:space="preserve"> </w:t>
+      </w:r>
+    </w:p>
+    <w:p>
+      <w:pPr>
+        <w:rPr>
+          <w:sz w:val="44"/>
+          <w:szCs w:val="44"/>
+          <w:lang w:bidi="fa-IR"/>
+        </w:rPr>
+      </w:pPr>
+      <w:r>
+        <w:rPr>
+          <w:b/>
+          <w:bCs/>
+          <w:sz w:val="44"/>
+          <w:szCs w:val="44"/>
+          <w:lang w:bidi="fa-IR"/>
+        </w:rPr>
+        <w:t>In this video, we learned how to construct a norm from an inner product.</w:t>
+      </w:r>
+    </w:p>
+    <w:p>
+      <w:pPr>
+        <w:rPr>
+          <w:sz w:val="44"/>
+          <w:szCs w:val="44"/>
+          <w:lang w:bidi="fa-IR"/>
+        </w:rPr>
+      </w:pPr>
+      <w:r>
+        <w:rPr>
+          <w:b/>
+          <w:bCs/>
+          <w:sz w:val="44"/>
+          <w:szCs w:val="44"/>
+          <w:lang w:bidi="fa-IR"/>
+        </w:rPr>
+        <w:t>In the next video, we'll begin our journey into Hilbert spaces.</w:t>
+      </w:r>
+    </w:p>
+    <w:p>
+      <w:pPr>
+        <w:rPr>
+          <w:sz w:val="44"/>
+          <w:szCs w:val="44"/>
+          <w:lang w:bidi="fa-IR"/>
+        </w:rPr>
+      </w:pPr>
+      <w:r>
+        <w:rPr>
+          <w:b/>
+          <w:bCs/>
+          <w:sz w:val="44"/>
+          <w:szCs w:val="44"/>
+          <w:lang w:bidi="fa-IR"/>
+        </w:rPr>
+        <w:t>See you in the next video</w:t>
+      </w:r>
+      <w:r>
+        <w:rPr>
+          <w:b/>
+          <w:bCs/>
+          <w:sz w:val="44"/>
+          <w:szCs w:val="44"/>
+          <w:lang w:bidi="fa-IR"/>
+        </w:rPr>
+        <w:t>.</w:t>
       </w:r>
     </w:p>
     <w:p>
@@ -7588,91 +9135,1134 @@
         <w:rPr>
           <w:lang w:bidi="fa-IR"/>
         </w:rPr>
-        <w:t>Form inner products to norms</w:t>
-      </w:r>
-    </w:p>
-    <w:p>
-      <w:pPr>
-        <w:rPr>
-          <w:sz w:val="44"/>
-          <w:szCs w:val="44"/>
-          <w:lang w:bidi="fa-IR"/>
-        </w:rPr>
-      </w:pPr>
-      <w:r>
-        <w:rPr>
-          <w:sz w:val="44"/>
-          <w:szCs w:val="44"/>
-          <w:lang w:bidi="fa-IR"/>
-        </w:rPr>
-        <w:t xml:space="preserve">1 : </w:t>
-      </w:r>
-    </w:p>
-    <w:p>
-      <w:pPr>
-        <w:rPr>
-          <w:sz w:val="44"/>
-          <w:szCs w:val="44"/>
-          <w:lang w:bidi="fa-IR"/>
-        </w:rPr>
-      </w:pPr>
-      <w:r>
-        <w:rPr>
-          <w:b/>
-          <w:bCs/>
-          <w:sz w:val="44"/>
-          <w:szCs w:val="44"/>
-          <w:lang w:bidi="fa-IR"/>
-        </w:rPr>
-        <w:t>In the previous video, we explored the concept of the inner product.</w:t>
-      </w:r>
-    </w:p>
-    <w:p>
-      <w:pPr>
-        <w:rPr>
-          <w:sz w:val="44"/>
-          <w:szCs w:val="44"/>
-          <w:lang w:bidi="fa-IR"/>
-        </w:rPr>
-      </w:pPr>
-      <w:r>
-        <w:rPr>
-          <w:b/>
-          <w:bCs/>
-          <w:sz w:val="44"/>
-          <w:szCs w:val="44"/>
-          <w:lang w:bidi="fa-IR"/>
-        </w:rPr>
-        <w:t>Now, it's time to answer an important question: how can we construct a norm from an inner product?</w:t>
-      </w:r>
-    </w:p>
-    <w:p>
-      <w:pPr>
-        <w:rPr>
-          <w:sz w:val="44"/>
-          <w:szCs w:val="44"/>
-          <w:lang w:bidi="fa-IR"/>
-        </w:rPr>
-      </w:pPr>
-      <w:r>
-        <w:rPr>
-          <w:b/>
-          <w:bCs/>
-          <w:sz w:val="44"/>
-          <w:szCs w:val="44"/>
-          <w:lang w:bidi="fa-IR"/>
-        </w:rPr>
-        <w:t>Let's find out</w:t>
-      </w:r>
-    </w:p>
-    <w:p>
-      <w:pPr>
-        <w:rPr>
-          <w:sz w:val="44"/>
-          <w:szCs w:val="44"/>
-          <w:lang w:bidi="fa-IR"/>
-        </w:rPr>
-      </w:pPr>
+        <w:t>Hilbert spaces</w:t>
+      </w:r>
+    </w:p>
+    <w:p>
+      <w:pPr>
+        <w:rPr>
+          <w:sz w:val="44"/>
+          <w:szCs w:val="44"/>
+          <w:lang w:bidi="fa-IR"/>
+        </w:rPr>
+      </w:pPr>
+      <w:proofErr w:type="gramStart"/>
+      <w:r>
+        <w:rPr>
+          <w:sz w:val="44"/>
+          <w:szCs w:val="44"/>
+          <w:lang w:bidi="fa-IR"/>
+        </w:rPr>
+        <w:t>1 :</w:t>
+      </w:r>
+      <w:proofErr w:type="gramEnd"/>
+      <w:r>
+        <w:rPr>
+          <w:sz w:val="44"/>
+          <w:szCs w:val="44"/>
+          <w:lang w:bidi="fa-IR"/>
+        </w:rPr>
+        <w:t xml:space="preserve"> </w:t>
+      </w:r>
+    </w:p>
+    <w:p>
+      <w:pPr>
+        <w:rPr>
+          <w:sz w:val="44"/>
+          <w:szCs w:val="44"/>
+          <w:lang w:bidi="fa-IR"/>
+        </w:rPr>
+      </w:pPr>
+      <w:r>
+        <w:rPr>
+          <w:b/>
+          <w:bCs/>
+          <w:sz w:val="44"/>
+          <w:szCs w:val="44"/>
+          <w:lang w:bidi="fa-IR"/>
+        </w:rPr>
+        <w:lastRenderedPageBreak/>
+        <w:t>In the previous video, we learned how a norm can be constructed from an inner product.</w:t>
+      </w:r>
+    </w:p>
+    <w:p>
+      <w:pPr>
+        <w:rPr>
+          <w:sz w:val="44"/>
+          <w:szCs w:val="44"/>
+          <w:lang w:bidi="fa-IR"/>
+        </w:rPr>
+      </w:pPr>
+      <w:r>
+        <w:rPr>
+          <w:b/>
+          <w:bCs/>
+          <w:sz w:val="44"/>
+          <w:szCs w:val="44"/>
+          <w:lang w:bidi="fa-IR"/>
+        </w:rPr>
+        <w:t>In this video, we'll introduce Hilbert spaces and explore what makes them one of the most important classes of spaces in mathematics.</w:t>
+      </w:r>
+    </w:p>
+    <w:p>
+      <w:pPr>
+        <w:rPr>
+          <w:sz w:val="44"/>
+          <w:szCs w:val="44"/>
+          <w:lang w:bidi="fa-IR"/>
+        </w:rPr>
+      </w:pPr>
+      <w:proofErr w:type="gramStart"/>
+      <w:r>
+        <w:rPr>
+          <w:sz w:val="44"/>
+          <w:szCs w:val="44"/>
+          <w:lang w:bidi="fa-IR"/>
+        </w:rPr>
+        <w:t>2 :</w:t>
+      </w:r>
+      <w:proofErr w:type="gramEnd"/>
+      <w:r>
+        <w:rPr>
+          <w:sz w:val="44"/>
+          <w:szCs w:val="44"/>
+          <w:lang w:bidi="fa-IR"/>
+        </w:rPr>
+        <w:t xml:space="preserve"> </w:t>
+      </w:r>
+    </w:p>
+    <w:p>
+      <w:pPr>
+        <w:rPr>
+          <w:sz w:val="44"/>
+          <w:szCs w:val="44"/>
+          <w:lang w:bidi="fa-IR"/>
+        </w:rPr>
+      </w:pPr>
+      <w:r>
+        <w:rPr>
+          <w:sz w:val="44"/>
+          <w:szCs w:val="44"/>
+          <w:lang w:bidi="fa-IR"/>
+        </w:rPr>
+        <w:t>Before we dive into Hilbert spaces, let's take a moment to meet the man behind the name.</w:t>
+      </w:r>
+    </w:p>
+    <w:p>
+      <w:pPr>
+        <w:rPr>
+          <w:sz w:val="44"/>
+          <w:szCs w:val="44"/>
+          <w:lang w:bidi="fa-IR"/>
+        </w:rPr>
+      </w:pPr>
+      <w:r>
+        <w:rPr>
+          <w:sz w:val="44"/>
+          <w:szCs w:val="44"/>
+          <w:lang w:bidi="fa-IR"/>
+        </w:rPr>
+        <w:t xml:space="preserve">David Hilbert was born in 1862 in </w:t>
+      </w:r>
+      <w:r>
+        <w:rPr>
+          <w:sz w:val="44"/>
+          <w:szCs w:val="44"/>
+          <w:lang w:bidi="fa-IR"/>
+        </w:rPr>
+        <w:t>Germany</w:t>
+      </w:r>
+      <w:r>
+        <w:rPr>
+          <w:sz w:val="44"/>
+          <w:szCs w:val="44"/>
+          <w:lang w:bidi="fa-IR"/>
+        </w:rPr>
+        <w:t>. From an early age, he showed an extraordinary talent for mathematics, but what truly made him remarkable was not just his ability to solve problems—it was his vision. Hilbert dreamed of organizing all of mathematics into a clear, logical system built on solid foundations.</w:t>
+      </w:r>
+    </w:p>
+    <w:p>
+      <w:pPr>
+        <w:rPr>
+          <w:sz w:val="44"/>
+          <w:szCs w:val="44"/>
+          <w:lang w:bidi="fa-IR"/>
+        </w:rPr>
+      </w:pPr>
+      <w:r>
+        <w:rPr>
+          <w:sz w:val="44"/>
+          <w:szCs w:val="44"/>
+          <w:lang w:bidi="fa-IR"/>
+        </w:rPr>
+        <w:t xml:space="preserve">At the turn of the twentieth century, he gave one of the most influential talks in the history of mathematics. Instead of presenting his latest discoveries, he challenged the world with </w:t>
+      </w:r>
+      <w:r>
+        <w:rPr>
+          <w:b/>
+          <w:bCs/>
+          <w:sz w:val="44"/>
+          <w:szCs w:val="44"/>
+          <w:lang w:bidi="fa-IR"/>
+        </w:rPr>
+        <w:t xml:space="preserve">23 </w:t>
+      </w:r>
+      <w:r>
+        <w:rPr>
+          <w:b/>
+          <w:bCs/>
+          <w:sz w:val="44"/>
+          <w:szCs w:val="44"/>
+          <w:lang w:bidi="fa-IR"/>
+        </w:rPr>
+        <w:lastRenderedPageBreak/>
+        <w:t>unsolved mathematical problems</w:t>
+      </w:r>
+      <w:r>
+        <w:rPr>
+          <w:sz w:val="44"/>
+          <w:szCs w:val="44"/>
+          <w:lang w:bidi="fa-IR"/>
+        </w:rPr>
+        <w:t>. These questions became a roadmap for generations of mathematicians, inspiring some of the greatest breakthroughs of the last century.</w:t>
+      </w:r>
+    </w:p>
+    <w:p>
+      <w:pPr>
+        <w:rPr>
+          <w:sz w:val="44"/>
+          <w:szCs w:val="44"/>
+          <w:lang w:bidi="fa-IR"/>
+        </w:rPr>
+      </w:pPr>
+      <w:r>
+        <w:rPr>
+          <w:sz w:val="44"/>
+          <w:szCs w:val="44"/>
+          <w:lang w:bidi="fa-IR"/>
+        </w:rPr>
+        <w:t xml:space="preserve">Hilbert also believed deeply in the power of human reason. One of his most famous quotes is, </w:t>
+      </w:r>
+      <w:r>
+        <w:rPr>
+          <w:i/>
+          <w:iCs/>
+          <w:sz w:val="44"/>
+          <w:szCs w:val="44"/>
+          <w:lang w:bidi="fa-IR"/>
+        </w:rPr>
+        <w:t>"We must know. We will know."</w:t>
+      </w:r>
+      <w:r>
+        <w:rPr>
+          <w:sz w:val="44"/>
+          <w:szCs w:val="44"/>
+          <w:lang w:bidi="fa-IR"/>
+        </w:rPr>
+        <w:t xml:space="preserve"> It perfectly reflects his confidence that every mathematical mystery could eventually be understood.</w:t>
+      </w:r>
+    </w:p>
+    <w:p>
+      <w:pPr>
+        <w:rPr>
+          <w:sz w:val="44"/>
+          <w:szCs w:val="44"/>
+          <w:lang w:bidi="fa-IR"/>
+        </w:rPr>
+      </w:pPr>
+      <w:r>
+        <w:rPr>
+          <w:sz w:val="44"/>
+          <w:szCs w:val="44"/>
+          <w:lang w:bidi="fa-IR"/>
+        </w:rPr>
+        <w:t xml:space="preserve">Today, his name lives on through </w:t>
+      </w:r>
+      <w:r>
+        <w:rPr>
+          <w:b/>
+          <w:bCs/>
+          <w:sz w:val="44"/>
+          <w:szCs w:val="44"/>
+          <w:lang w:bidi="fa-IR"/>
+        </w:rPr>
+        <w:t>Hilbert spaces</w:t>
+      </w:r>
+      <w:r>
+        <w:rPr>
+          <w:sz w:val="44"/>
+          <w:szCs w:val="44"/>
+          <w:lang w:bidi="fa-IR"/>
+        </w:rPr>
+        <w:t>, one of the most important ideas in modern mathematics. These spaces have become essential not only in pure mathematics but also in quantum mechanics, signal processing, and many other scientific fields. Every time we study a Hilbert space, we are building on the legacy of a mathematician whose ideas changed the course of mathematics forever.</w:t>
+      </w:r>
+    </w:p>
+    <w:p>
+      <w:pPr>
+        <w:rPr>
+          <w:sz w:val="44"/>
+          <w:szCs w:val="44"/>
+          <w:lang w:bidi="fa-IR"/>
+        </w:rPr>
+      </w:pPr>
+      <w:proofErr w:type="gramStart"/>
+      <w:r>
+        <w:rPr>
+          <w:sz w:val="44"/>
+          <w:szCs w:val="44"/>
+          <w:lang w:bidi="fa-IR"/>
+        </w:rPr>
+        <w:t>3 :</w:t>
+      </w:r>
+      <w:proofErr w:type="gramEnd"/>
+      <w:r>
+        <w:rPr>
+          <w:sz w:val="44"/>
+          <w:szCs w:val="44"/>
+          <w:lang w:bidi="fa-IR"/>
+        </w:rPr>
+        <w:t xml:space="preserve"> </w:t>
+      </w:r>
+    </w:p>
+    <w:p>
+      <w:pPr>
+        <w:rPr>
+          <w:sz w:val="44"/>
+          <w:szCs w:val="44"/>
+          <w:lang w:bidi="fa-IR"/>
+        </w:rPr>
+      </w:pPr>
+      <w:r>
+        <w:rPr>
+          <w:sz w:val="44"/>
+          <w:szCs w:val="44"/>
+          <w:lang w:bidi="fa-IR"/>
+        </w:rPr>
+        <w:lastRenderedPageBreak/>
+        <w:t xml:space="preserve">Now, let's define what a </w:t>
+      </w:r>
+      <w:r>
+        <w:rPr>
+          <w:b/>
+          <w:bCs/>
+          <w:sz w:val="44"/>
+          <w:szCs w:val="44"/>
+          <w:lang w:bidi="fa-IR"/>
+        </w:rPr>
+        <w:t>Hilbert space</w:t>
+      </w:r>
+      <w:r>
+        <w:rPr>
+          <w:sz w:val="44"/>
+          <w:szCs w:val="44"/>
+          <w:lang w:bidi="fa-IR"/>
+        </w:rPr>
+        <w:t xml:space="preserve"> is.</w:t>
+      </w:r>
+    </w:p>
+    <w:p>
+      <w:pPr>
+        <w:rPr>
+          <w:sz w:val="44"/>
+          <w:szCs w:val="44"/>
+          <w:lang w:bidi="fa-IR"/>
+        </w:rPr>
+      </w:pPr>
+      <w:r>
+        <w:rPr>
+          <w:sz w:val="44"/>
+          <w:szCs w:val="44"/>
+          <w:lang w:bidi="fa-IR"/>
+        </w:rPr>
+        <w:t xml:space="preserve">A </w:t>
+      </w:r>
+      <w:r>
+        <w:rPr>
+          <w:b/>
+          <w:bCs/>
+          <w:sz w:val="44"/>
+          <w:szCs w:val="44"/>
+          <w:lang w:bidi="fa-IR"/>
+        </w:rPr>
+        <w:t>Hilbert space</w:t>
+      </w:r>
+      <w:r>
+        <w:rPr>
+          <w:sz w:val="44"/>
+          <w:szCs w:val="44"/>
+          <w:lang w:bidi="fa-IR"/>
+        </w:rPr>
+        <w:t xml:space="preserve"> is an </w:t>
+      </w:r>
+      <w:r>
+        <w:rPr>
+          <w:b/>
+          <w:bCs/>
+          <w:sz w:val="44"/>
+          <w:szCs w:val="44"/>
+          <w:lang w:bidi="fa-IR"/>
+        </w:rPr>
+        <w:t>inner product space</w:t>
+      </w:r>
+      <w:r>
+        <w:rPr>
+          <w:sz w:val="44"/>
+          <w:szCs w:val="44"/>
+          <w:lang w:bidi="fa-IR"/>
+        </w:rPr>
+        <w:t xml:space="preserve"> that is </w:t>
+      </w:r>
+      <w:r>
+        <w:rPr>
+          <w:b/>
+          <w:bCs/>
+          <w:sz w:val="44"/>
+          <w:szCs w:val="44"/>
+          <w:lang w:bidi="fa-IR"/>
+        </w:rPr>
+        <w:t>complete</w:t>
+      </w:r>
+      <w:r>
+        <w:rPr>
+          <w:sz w:val="44"/>
+          <w:szCs w:val="44"/>
+          <w:lang w:bidi="fa-IR"/>
+        </w:rPr>
+        <w:t xml:space="preserve"> with respect to the norm induced by its inner product. In other words, if an inner product space has no "missing points"—meaning every Cauchy sequence converges to a point within the space—then we call it a Hilbert space.</w:t>
+      </w:r>
+    </w:p>
+    <w:p>
+      <w:pPr>
+        <w:rPr>
+          <w:sz w:val="44"/>
+          <w:szCs w:val="44"/>
+          <w:lang w:bidi="fa-IR"/>
+        </w:rPr>
+      </w:pPr>
+      <w:r>
+        <w:rPr>
+          <w:sz w:val="44"/>
+          <w:szCs w:val="44"/>
+          <w:lang w:bidi="fa-IR"/>
+        </w:rPr>
+        <w:t>Now, let's see how Hilbert spaces fit into the hierarchy of the spaces we've learned so far.</w:t>
+      </w:r>
+    </w:p>
+    <w:p>
+      <w:pPr>
+        <w:rPr>
+          <w:sz w:val="44"/>
+          <w:szCs w:val="44"/>
+          <w:lang w:bidi="fa-IR"/>
+        </w:rPr>
+      </w:pPr>
+      <w:r>
+        <w:rPr>
+          <w:sz w:val="44"/>
+          <w:szCs w:val="44"/>
+          <w:lang w:bidi="fa-IR"/>
+        </w:rPr>
+        <w:t xml:space="preserve">We already know that </w:t>
+      </w:r>
+      <w:r>
+        <w:rPr>
+          <w:b/>
+          <w:bCs/>
+          <w:sz w:val="44"/>
+          <w:szCs w:val="44"/>
+          <w:lang w:bidi="fa-IR"/>
+        </w:rPr>
+        <w:t>every normed space is a metric space</w:t>
+      </w:r>
+      <w:r>
+        <w:rPr>
+          <w:sz w:val="44"/>
+          <w:szCs w:val="44"/>
+          <w:lang w:bidi="fa-IR"/>
+        </w:rPr>
+        <w:t xml:space="preserve">. We also know that </w:t>
+      </w:r>
+      <w:r>
+        <w:rPr>
+          <w:b/>
+          <w:bCs/>
+          <w:sz w:val="44"/>
+          <w:szCs w:val="44"/>
+          <w:lang w:bidi="fa-IR"/>
+        </w:rPr>
+        <w:t>every inner product space is a normed space</w:t>
+      </w:r>
+      <w:r>
+        <w:rPr>
+          <w:sz w:val="44"/>
+          <w:szCs w:val="44"/>
+          <w:lang w:bidi="fa-IR"/>
+        </w:rPr>
+        <w:t xml:space="preserve">. On the other hand, </w:t>
+      </w:r>
+      <w:r>
+        <w:rPr>
+          <w:b/>
+          <w:bCs/>
+          <w:sz w:val="44"/>
+          <w:szCs w:val="44"/>
+          <w:lang w:bidi="fa-IR"/>
+        </w:rPr>
+        <w:t>Banach spaces</w:t>
+      </w:r>
+      <w:r>
+        <w:rPr>
+          <w:sz w:val="44"/>
+          <w:szCs w:val="44"/>
+          <w:lang w:bidi="fa-IR"/>
+        </w:rPr>
+        <w:t xml:space="preserve"> are simply </w:t>
+      </w:r>
+      <w:r>
+        <w:rPr>
+          <w:b/>
+          <w:bCs/>
+          <w:sz w:val="44"/>
+          <w:szCs w:val="44"/>
+          <w:lang w:bidi="fa-IR"/>
+        </w:rPr>
+        <w:t>complete normed spaces</w:t>
+      </w:r>
+      <w:r>
+        <w:rPr>
+          <w:sz w:val="44"/>
+          <w:szCs w:val="44"/>
+          <w:lang w:bidi="fa-IR"/>
+        </w:rPr>
+        <w:t>, so they form a subset of normed spaces as well.</w:t>
+      </w:r>
+    </w:p>
+    <w:p>
+      <w:pPr>
+        <w:rPr>
+          <w:sz w:val="44"/>
+          <w:szCs w:val="44"/>
+          <w:lang w:bidi="fa-IR"/>
+        </w:rPr>
+      </w:pPr>
+      <w:r>
+        <w:rPr>
+          <w:sz w:val="44"/>
+          <w:szCs w:val="44"/>
+          <w:lang w:bidi="fa-IR"/>
+        </w:rPr>
+        <w:t>This brings us to Hilbert spaces.</w:t>
+      </w:r>
+    </w:p>
+    <w:p>
+      <w:pPr>
+        <w:rPr>
+          <w:sz w:val="44"/>
+          <w:szCs w:val="44"/>
+          <w:lang w:bidi="fa-IR"/>
+        </w:rPr>
+      </w:pPr>
+      <w:r>
+        <w:rPr>
+          <w:sz w:val="44"/>
+          <w:szCs w:val="44"/>
+          <w:lang w:bidi="fa-IR"/>
+        </w:rPr>
+        <w:t xml:space="preserve">A Hilbert space is both an </w:t>
+      </w:r>
+      <w:r>
+        <w:rPr>
+          <w:b/>
+          <w:bCs/>
+          <w:sz w:val="44"/>
+          <w:szCs w:val="44"/>
+          <w:lang w:bidi="fa-IR"/>
+        </w:rPr>
+        <w:t>inner product space</w:t>
+      </w:r>
+      <w:r>
+        <w:rPr>
+          <w:sz w:val="44"/>
+          <w:szCs w:val="44"/>
+          <w:lang w:bidi="fa-IR"/>
+        </w:rPr>
+        <w:t xml:space="preserve"> and a </w:t>
+      </w:r>
+      <w:r>
+        <w:rPr>
+          <w:b/>
+          <w:bCs/>
+          <w:sz w:val="44"/>
+          <w:szCs w:val="44"/>
+          <w:lang w:bidi="fa-IR"/>
+        </w:rPr>
+        <w:t>Banach space</w:t>
+      </w:r>
+      <w:r>
+        <w:rPr>
+          <w:sz w:val="44"/>
+          <w:szCs w:val="44"/>
+          <w:lang w:bidi="fa-IR"/>
+        </w:rPr>
+        <w:t xml:space="preserve">. In other words, it is an inner product space whose induced norm is complete. </w:t>
+      </w:r>
+      <w:r>
+        <w:rPr>
+          <w:sz w:val="44"/>
+          <w:szCs w:val="44"/>
+          <w:lang w:bidi="fa-IR"/>
+        </w:rPr>
+        <w:lastRenderedPageBreak/>
+        <w:t>Therefore, Hilbert spaces are exactly the intersection of the set of all inner product spaces and the set of all Banach spaces.</w:t>
+      </w:r>
+    </w:p>
+    <w:p>
+      <w:pPr>
+        <w:rPr>
+          <w:sz w:val="44"/>
+          <w:szCs w:val="44"/>
+          <w:lang w:bidi="fa-IR"/>
+        </w:rPr>
+      </w:pPr>
+      <w:proofErr w:type="gramStart"/>
+      <w:r>
+        <w:rPr>
+          <w:sz w:val="44"/>
+          <w:szCs w:val="44"/>
+          <w:lang w:bidi="fa-IR"/>
+        </w:rPr>
+        <w:t>4 :</w:t>
+      </w:r>
+      <w:proofErr w:type="gramEnd"/>
+      <w:r>
+        <w:rPr>
+          <w:sz w:val="44"/>
+          <w:szCs w:val="44"/>
+          <w:lang w:bidi="fa-IR"/>
+        </w:rPr>
+        <w:t xml:space="preserve"> </w:t>
+      </w:r>
+    </w:p>
+    <w:p>
+      <w:pPr>
+        <w:rPr>
+          <w:sz w:val="44"/>
+          <w:szCs w:val="44"/>
+          <w:lang w:bidi="fa-IR"/>
+        </w:rPr>
+      </w:pPr>
+      <w:r>
+        <w:rPr>
+          <w:sz w:val="44"/>
+          <w:szCs w:val="44"/>
+          <w:lang w:bidi="fa-IR"/>
+        </w:rPr>
+        <w:t>Now, let's look at a few examples.</w:t>
+      </w:r>
+    </w:p>
+    <w:p>
+      <w:pPr>
+        <w:rPr>
+          <w:sz w:val="44"/>
+          <w:szCs w:val="44"/>
+          <w:lang w:bidi="fa-IR"/>
+        </w:rPr>
+      </w:pPr>
+      <w:r>
+        <w:rPr>
+          <w:sz w:val="44"/>
+          <w:szCs w:val="44"/>
+          <w:lang w:bidi="fa-IR"/>
+        </w:rPr>
+        <w:t>First, consider the space of continuous functions.</w:t>
+      </w:r>
+    </w:p>
+    <w:p>
+      <w:pPr>
+        <w:rPr>
+          <w:sz w:val="44"/>
+          <w:szCs w:val="44"/>
+          <w:lang w:bidi="fa-IR"/>
+        </w:rPr>
+      </w:pPr>
+      <w:r>
+        <w:rPr>
+          <w:sz w:val="44"/>
+          <w:szCs w:val="44"/>
+          <w:lang w:bidi="fa-IR"/>
+        </w:rPr>
+        <w:t xml:space="preserve">We have already shown that </w:t>
+      </w:r>
+      <w:r>
+        <w:rPr>
+          <w:sz w:val="44"/>
+          <w:szCs w:val="44"/>
+          <w:lang w:bidi="fa-IR"/>
+        </w:rPr>
+        <w:t>this space</w:t>
+      </w:r>
+      <w:r>
+        <w:rPr>
+          <w:sz w:val="44"/>
+          <w:szCs w:val="44"/>
+          <w:lang w:bidi="fa-IR"/>
+        </w:rPr>
+        <w:t xml:space="preserve">, equipped with the (L^1)-norm, is </w:t>
+      </w:r>
+      <w:r>
+        <w:rPr>
+          <w:b/>
+          <w:bCs/>
+          <w:sz w:val="44"/>
+          <w:szCs w:val="44"/>
+          <w:lang w:bidi="fa-IR"/>
+        </w:rPr>
+        <w:t>not</w:t>
+      </w:r>
+      <w:r>
+        <w:rPr>
+          <w:sz w:val="44"/>
+          <w:szCs w:val="44"/>
+          <w:lang w:bidi="fa-IR"/>
+        </w:rPr>
+        <w:t xml:space="preserve"> a Banach space. Since every Hilbert space must first be a Banach space, it immediately follows that </w:t>
+      </w:r>
+      <w:r>
+        <w:rPr>
+          <w:sz w:val="44"/>
+          <w:szCs w:val="44"/>
+          <w:lang w:bidi="fa-IR"/>
+        </w:rPr>
+        <w:t xml:space="preserve">this space </w:t>
+      </w:r>
+      <w:r>
+        <w:rPr>
+          <w:sz w:val="44"/>
+          <w:szCs w:val="44"/>
+          <w:lang w:bidi="fa-IR"/>
+        </w:rPr>
+        <w:t>with the (L^1)-norm cannot be a Hilbert space.</w:t>
+      </w:r>
+    </w:p>
+    <w:p>
+      <w:pPr>
+        <w:rPr>
+          <w:sz w:val="44"/>
+          <w:szCs w:val="44"/>
+          <w:lang w:bidi="fa-IR"/>
+        </w:rPr>
+      </w:pPr>
+      <w:r>
+        <w:rPr>
+          <w:sz w:val="44"/>
+          <w:szCs w:val="44"/>
+          <w:lang w:bidi="fa-IR"/>
+        </w:rPr>
+        <w:t xml:space="preserve">Next, let's equip the same space with the </w:t>
+      </w:r>
+      <w:r>
+        <w:rPr>
+          <w:b/>
+          <w:bCs/>
+          <w:sz w:val="44"/>
+          <w:szCs w:val="44"/>
+          <w:lang w:bidi="fa-IR"/>
+        </w:rPr>
+        <w:t>supremum norm</w:t>
+      </w:r>
+      <w:r>
+        <w:rPr>
+          <w:sz w:val="44"/>
+          <w:szCs w:val="44"/>
+          <w:lang w:bidi="fa-IR"/>
+        </w:rPr>
+        <w:t>.</w:t>
+      </w:r>
+    </w:p>
+    <w:p>
+      <w:pPr>
+        <w:rPr>
+          <w:sz w:val="44"/>
+          <w:szCs w:val="44"/>
+          <w:lang w:bidi="fa-IR"/>
+        </w:rPr>
+      </w:pPr>
+      <w:r>
+        <w:rPr>
+          <w:sz w:val="44"/>
+          <w:szCs w:val="44"/>
+          <w:lang w:bidi="fa-IR"/>
+        </w:rPr>
+        <w:t>Although (C[</w:t>
+      </w:r>
+      <w:proofErr w:type="spellStart"/>
+      <w:proofErr w:type="gramStart"/>
+      <w:r>
+        <w:rPr>
+          <w:sz w:val="44"/>
+          <w:szCs w:val="44"/>
+          <w:lang w:bidi="fa-IR"/>
+        </w:rPr>
+        <w:t>a,b</w:t>
+      </w:r>
+      <w:proofErr w:type="spellEnd"/>
+      <w:proofErr w:type="gramEnd"/>
+      <w:r>
+        <w:rPr>
+          <w:sz w:val="44"/>
+          <w:szCs w:val="44"/>
+          <w:lang w:bidi="fa-IR"/>
+        </w:rPr>
+        <w:t xml:space="preserve">]) with the supremum norm </w:t>
+      </w:r>
+      <w:r>
+        <w:rPr>
+          <w:b/>
+          <w:bCs/>
+          <w:sz w:val="44"/>
+          <w:szCs w:val="44"/>
+          <w:lang w:bidi="fa-IR"/>
+        </w:rPr>
+        <w:t>is</w:t>
+      </w:r>
+      <w:r>
+        <w:rPr>
+          <w:sz w:val="44"/>
+          <w:szCs w:val="44"/>
+          <w:lang w:bidi="fa-IR"/>
+        </w:rPr>
+        <w:t xml:space="preserve"> a Banach space, being complete alone is not enough. To be a Hilbert space, the norm must also come from an inner product.</w:t>
+      </w:r>
+    </w:p>
+    <w:p>
+      <w:pPr>
+        <w:rPr>
+          <w:sz w:val="44"/>
+          <w:szCs w:val="44"/>
+          <w:lang w:bidi="fa-IR"/>
+        </w:rPr>
+      </w:pPr>
+      <w:r>
+        <w:rPr>
+          <w:sz w:val="44"/>
+          <w:szCs w:val="44"/>
+          <w:lang w:bidi="fa-IR"/>
+        </w:rPr>
+        <w:t xml:space="preserve">Now, consider the following two functions. It can be shown that they do </w:t>
+      </w:r>
+      <w:r>
+        <w:rPr>
+          <w:b/>
+          <w:bCs/>
+          <w:sz w:val="44"/>
+          <w:szCs w:val="44"/>
+          <w:lang w:bidi="fa-IR"/>
+        </w:rPr>
+        <w:t>not</w:t>
+      </w:r>
+      <w:r>
+        <w:rPr>
+          <w:sz w:val="44"/>
+          <w:szCs w:val="44"/>
+          <w:lang w:bidi="fa-IR"/>
+        </w:rPr>
+        <w:t xml:space="preserve"> satisfy the </w:t>
+      </w:r>
+      <w:r>
+        <w:rPr>
+          <w:b/>
+          <w:bCs/>
+          <w:sz w:val="44"/>
+          <w:szCs w:val="44"/>
+          <w:lang w:bidi="fa-IR"/>
+        </w:rPr>
+        <w:t xml:space="preserve">parallelogram </w:t>
+      </w:r>
+      <w:r>
+        <w:rPr>
+          <w:b/>
+          <w:bCs/>
+          <w:sz w:val="44"/>
+          <w:szCs w:val="44"/>
+          <w:lang w:bidi="fa-IR"/>
+        </w:rPr>
+        <w:lastRenderedPageBreak/>
+        <w:t>law</w:t>
+      </w:r>
+      <w:r>
+        <w:rPr>
+          <w:sz w:val="44"/>
+          <w:szCs w:val="44"/>
+          <w:lang w:bidi="fa-IR"/>
+        </w:rPr>
+        <w:t>. Since every norm induced by an inner product must satisfy the parallelogram identity, we conclude that the supremum norm cannot be generated by any inner product.</w:t>
+      </w:r>
+    </w:p>
+    <w:p>
+      <w:pPr>
+        <w:rPr>
+          <w:sz w:val="44"/>
+          <w:szCs w:val="44"/>
+          <w:lang w:bidi="fa-IR"/>
+        </w:rPr>
+      </w:pPr>
+      <w:r>
+        <w:rPr>
+          <w:sz w:val="44"/>
+          <w:szCs w:val="44"/>
+          <w:lang w:bidi="fa-IR"/>
+        </w:rPr>
+        <w:t>Therefore, (C[</w:t>
+      </w:r>
+      <w:proofErr w:type="spellStart"/>
+      <w:proofErr w:type="gramStart"/>
+      <w:r>
+        <w:rPr>
+          <w:sz w:val="44"/>
+          <w:szCs w:val="44"/>
+          <w:lang w:bidi="fa-IR"/>
+        </w:rPr>
+        <w:t>a,b</w:t>
+      </w:r>
+      <w:proofErr w:type="spellEnd"/>
+      <w:proofErr w:type="gramEnd"/>
+      <w:r>
+        <w:rPr>
+          <w:sz w:val="44"/>
+          <w:szCs w:val="44"/>
+          <w:lang w:bidi="fa-IR"/>
+        </w:rPr>
+        <w:t xml:space="preserve">]) equipped with the supremum norm is </w:t>
+      </w:r>
+      <w:r>
+        <w:rPr>
+          <w:b/>
+          <w:bCs/>
+          <w:sz w:val="44"/>
+          <w:szCs w:val="44"/>
+          <w:lang w:bidi="fa-IR"/>
+        </w:rPr>
+        <w:t>not</w:t>
+      </w:r>
+      <w:r>
+        <w:rPr>
+          <w:sz w:val="44"/>
+          <w:szCs w:val="44"/>
+          <w:lang w:bidi="fa-IR"/>
+        </w:rPr>
+        <w:t xml:space="preserve"> a Hilbert space either.</w:t>
+      </w:r>
+    </w:p>
+    <w:p>
+      <w:pPr>
+        <w:rPr>
+          <w:sz w:val="44"/>
+          <w:szCs w:val="44"/>
+          <w:lang w:bidi="fa-IR"/>
+        </w:rPr>
+      </w:pPr>
+      <w:r>
+        <w:rPr>
+          <w:sz w:val="44"/>
+          <w:szCs w:val="44"/>
+          <w:lang w:bidi="fa-IR"/>
+        </w:rPr>
+        <w:t>Finally, let's look at the space (\ell^2) equipped with the (L^2)-norm.</w:t>
+      </w:r>
+    </w:p>
+    <w:p>
+      <w:pPr>
+        <w:rPr>
+          <w:sz w:val="44"/>
+          <w:szCs w:val="44"/>
+          <w:lang w:bidi="fa-IR"/>
+        </w:rPr>
+      </w:pPr>
+      <w:r>
+        <w:rPr>
+          <w:sz w:val="44"/>
+          <w:szCs w:val="44"/>
+          <w:lang w:bidi="fa-IR"/>
+        </w:rPr>
+        <w:t xml:space="preserve">In this case, the norm is induced by the standard inner product, and the space is complete. Therefore, (\ell^2) satisfies both requirements in the definition, making it a </w:t>
+      </w:r>
+      <w:r>
+        <w:rPr>
+          <w:b/>
+          <w:bCs/>
+          <w:sz w:val="44"/>
+          <w:szCs w:val="44"/>
+          <w:lang w:bidi="fa-IR"/>
+        </w:rPr>
+        <w:t>Hilbert space</w:t>
+      </w:r>
+      <w:r>
+        <w:rPr>
+          <w:sz w:val="44"/>
+          <w:szCs w:val="44"/>
+          <w:lang w:bidi="fa-IR"/>
+        </w:rPr>
+        <w:t>.</w:t>
+      </w:r>
+    </w:p>
+    <w:p>
+      <w:pPr>
+        <w:rPr>
+          <w:sz w:val="44"/>
+          <w:szCs w:val="44"/>
+          <w:rtl/>
+          <w:lang w:bidi="fa-IR"/>
+        </w:rPr>
+      </w:pPr>
+      <w:r>
+        <w:rPr>
+          <w:sz w:val="44"/>
+          <w:szCs w:val="44"/>
+          <w:lang w:bidi="fa-IR"/>
+        </w:rPr>
+        <w:t xml:space="preserve">These examples show that being complete is not sufficient, and having an inner product is not sufficient either. A Hilbert space must satisfy </w:t>
+      </w:r>
+      <w:r>
+        <w:rPr>
+          <w:b/>
+          <w:bCs/>
+          <w:sz w:val="44"/>
+          <w:szCs w:val="44"/>
+          <w:lang w:bidi="fa-IR"/>
+        </w:rPr>
+        <w:t>both</w:t>
+      </w:r>
+      <w:r>
+        <w:rPr>
+          <w:sz w:val="44"/>
+          <w:szCs w:val="44"/>
+          <w:lang w:bidi="fa-IR"/>
+        </w:rPr>
+        <w:t xml:space="preserve"> conditions.</w:t>
+      </w:r>
+    </w:p>
+    <w:p>
+      <w:pPr>
+        <w:rPr>
+          <w:sz w:val="44"/>
+          <w:szCs w:val="44"/>
+          <w:lang w:bidi="fa-IR"/>
+        </w:rPr>
+      </w:pPr>
+      <w:proofErr w:type="gramStart"/>
+      <w:r>
+        <w:rPr>
+          <w:sz w:val="44"/>
+          <w:szCs w:val="44"/>
+          <w:lang w:bidi="fa-IR"/>
+        </w:rPr>
+        <w:t>5 :</w:t>
+      </w:r>
+      <w:proofErr w:type="gramEnd"/>
+      <w:r>
+        <w:rPr>
+          <w:sz w:val="44"/>
+          <w:szCs w:val="44"/>
+          <w:lang w:bidi="fa-IR"/>
+        </w:rPr>
+        <w:t xml:space="preserve"> </w:t>
+      </w:r>
+    </w:p>
+    <w:p>
+      <w:pPr>
+        <w:rPr>
+          <w:sz w:val="44"/>
+          <w:szCs w:val="44"/>
+          <w:lang w:bidi="fa-IR"/>
+        </w:rPr>
+      </w:pPr>
+      <w:r>
+        <w:rPr>
+          <w:sz w:val="44"/>
+          <w:szCs w:val="44"/>
+          <w:lang w:bidi="fa-IR"/>
+        </w:rPr>
+        <w:t xml:space="preserve">In this video, we introduced </w:t>
+      </w:r>
+      <w:r>
+        <w:rPr>
+          <w:b/>
+          <w:bCs/>
+          <w:sz w:val="44"/>
+          <w:szCs w:val="44"/>
+          <w:lang w:bidi="fa-IR"/>
+        </w:rPr>
+        <w:t>Hilbert spaces</w:t>
+      </w:r>
+      <w:r>
+        <w:rPr>
+          <w:sz w:val="44"/>
+          <w:szCs w:val="44"/>
+          <w:lang w:bidi="fa-IR"/>
+        </w:rPr>
+        <w:t xml:space="preserve">, explored their definition, and saw how they fit into </w:t>
+      </w:r>
+      <w:r>
+        <w:rPr>
+          <w:sz w:val="44"/>
+          <w:szCs w:val="44"/>
+          <w:lang w:bidi="fa-IR"/>
+        </w:rPr>
+        <w:lastRenderedPageBreak/>
+        <w:t>the hierarchy of the spaces we've studied so far. We also looked at several examples to understand why some spaces are Hilbert spaces while others are not.</w:t>
+      </w:r>
+    </w:p>
+    <w:p>
+      <w:pPr>
+        <w:rPr>
+          <w:sz w:val="44"/>
+          <w:szCs w:val="44"/>
+          <w:lang w:bidi="fa-IR"/>
+        </w:rPr>
+      </w:pPr>
+      <w:r>
+        <w:rPr>
+          <w:sz w:val="44"/>
+          <w:szCs w:val="44"/>
+          <w:lang w:bidi="fa-IR"/>
+        </w:rPr>
+        <w:t xml:space="preserve">In the next video, we'll explore one of the most important geometric concepts in inner product spaces: </w:t>
+      </w:r>
+      <w:r>
+        <w:rPr>
+          <w:b/>
+          <w:bCs/>
+          <w:sz w:val="44"/>
+          <w:szCs w:val="44"/>
+          <w:lang w:bidi="fa-IR"/>
+        </w:rPr>
+        <w:t>orthogonality</w:t>
+      </w:r>
+      <w:r>
+        <w:rPr>
+          <w:sz w:val="44"/>
+          <w:szCs w:val="44"/>
+          <w:lang w:bidi="fa-IR"/>
+        </w:rPr>
+        <w:t xml:space="preserve">. </w:t>
+      </w:r>
+    </w:p>
+    <w:p>
+      <w:pPr>
+        <w:rPr>
+          <w:sz w:val="44"/>
+          <w:szCs w:val="44"/>
+          <w:lang w:bidi="fa-IR"/>
+        </w:rPr>
+      </w:pPr>
+      <w:r>
+        <w:rPr>
+          <w:sz w:val="44"/>
+          <w:szCs w:val="44"/>
+          <w:lang w:bidi="fa-IR"/>
+        </w:rPr>
+        <w:t>So, I'll see you in the next video!</w:t>
+      </w:r>
     </w:p>
     <w:p>
       <w:pPr>
@@ -7685,34 +10275,14 @@
         <w:rPr>
           <w:lang w:bidi="fa-IR"/>
         </w:rPr>
-        <w:t>Hilbert spaces</w:t>
-      </w:r>
-    </w:p>
-    <w:p>
-      <w:pPr>
-        <w:rPr>
-          <w:lang w:bidi="fa-IR"/>
-        </w:rPr>
-      </w:pPr>
-    </w:p>
-    <w:p>
-      <w:pPr>
-        <w:pStyle w:val="Heading2"/>
-        <w:rPr>
-          <w:lang w:bidi="fa-IR"/>
-        </w:rPr>
-      </w:pPr>
-      <w:r>
-        <w:rPr>
-          <w:lang w:bidi="fa-IR"/>
-        </w:rPr>
-        <w:lastRenderedPageBreak/>
         <w:t>Orthogonality in inner product spaces</w:t>
       </w:r>
     </w:p>
     <w:p>
       <w:pPr>
         <w:rPr>
+          <w:sz w:val="44"/>
+          <w:szCs w:val="44"/>
           <w:lang w:bidi="fa-IR"/>
         </w:rPr>
       </w:pPr>

</xml_diff>

<commit_message>
step 97 : finish part 8 and start part 9
</commit_message>
<xml_diff>
--- a/video context/video_context_newVersion.docx
+++ b/video context/video_context_newVersion.docx
@@ -8779,7 +8779,6 @@
     <w:p>
       <w:pPr>
         <w:rPr>
-          <w:rFonts w:hint="cs"/>
           <w:sz w:val="44"/>
           <w:szCs w:val="44"/>
           <w:rtl/>
@@ -10286,21 +10285,1022 @@
           <w:lang w:bidi="fa-IR"/>
         </w:rPr>
       </w:pPr>
+      <w:proofErr w:type="gramStart"/>
+      <w:r>
+        <w:rPr>
+          <w:sz w:val="44"/>
+          <w:szCs w:val="44"/>
+          <w:lang w:bidi="fa-IR"/>
+        </w:rPr>
+        <w:t>1 :</w:t>
+      </w:r>
+      <w:proofErr w:type="gramEnd"/>
+      <w:r>
+        <w:rPr>
+          <w:sz w:val="44"/>
+          <w:szCs w:val="44"/>
+          <w:lang w:bidi="fa-IR"/>
+        </w:rPr>
+        <w:t xml:space="preserve"> </w:t>
+      </w:r>
+    </w:p>
+    <w:p>
+      <w:pPr>
+        <w:rPr>
+          <w:sz w:val="44"/>
+          <w:szCs w:val="44"/>
+          <w:rtl/>
+          <w:lang w:bidi="fa-IR"/>
+        </w:rPr>
+      </w:pPr>
+      <w:r>
+        <w:rPr>
+          <w:sz w:val="44"/>
+          <w:szCs w:val="44"/>
+          <w:lang w:bidi="fa-IR"/>
+        </w:rPr>
+        <w:t>In the previous videos, we covered all the prerequisites we needed. Now, we're ready to learn about orthogonality.</w:t>
+      </w:r>
+    </w:p>
+    <w:p>
+      <w:pPr>
+        <w:rPr>
+          <w:sz w:val="44"/>
+          <w:szCs w:val="44"/>
+          <w:lang w:bidi="fa-IR"/>
+        </w:rPr>
+      </w:pPr>
+      <w:proofErr w:type="gramStart"/>
+      <w:r>
+        <w:rPr>
+          <w:sz w:val="44"/>
+          <w:szCs w:val="44"/>
+          <w:lang w:bidi="fa-IR"/>
+        </w:rPr>
+        <w:t>2 :</w:t>
+      </w:r>
+      <w:proofErr w:type="gramEnd"/>
+      <w:r>
+        <w:rPr>
+          <w:sz w:val="44"/>
+          <w:szCs w:val="44"/>
+          <w:lang w:bidi="fa-IR"/>
+        </w:rPr>
+        <w:t xml:space="preserve"> </w:t>
+      </w:r>
+    </w:p>
+    <w:p>
+      <w:pPr>
+        <w:rPr>
+          <w:sz w:val="44"/>
+          <w:szCs w:val="44"/>
+          <w:lang w:bidi="fa-IR"/>
+        </w:rPr>
+      </w:pPr>
+      <w:r>
+        <w:rPr>
+          <w:sz w:val="44"/>
+          <w:szCs w:val="44"/>
+          <w:lang w:bidi="fa-IR"/>
+        </w:rPr>
+        <w:t>In this series, we'll study orthogonality in two different settings.</w:t>
+      </w:r>
+    </w:p>
+    <w:p>
+      <w:pPr>
+        <w:rPr>
+          <w:sz w:val="44"/>
+          <w:szCs w:val="44"/>
+          <w:lang w:bidi="fa-IR"/>
+        </w:rPr>
+      </w:pPr>
+      <w:r>
+        <w:rPr>
+          <w:sz w:val="44"/>
+          <w:szCs w:val="44"/>
+          <w:lang w:bidi="fa-IR"/>
+        </w:rPr>
+        <w:t xml:space="preserve">We'll begin with </w:t>
+      </w:r>
+      <w:r>
+        <w:rPr>
+          <w:b/>
+          <w:bCs/>
+          <w:sz w:val="44"/>
+          <w:szCs w:val="44"/>
+          <w:lang w:bidi="fa-IR"/>
+        </w:rPr>
+        <w:t>inner product spaces</w:t>
+      </w:r>
+      <w:r>
+        <w:rPr>
+          <w:sz w:val="44"/>
+          <w:szCs w:val="44"/>
+          <w:lang w:bidi="fa-IR"/>
+        </w:rPr>
+        <w:t xml:space="preserve">, and then move on to </w:t>
+      </w:r>
+      <w:r>
+        <w:rPr>
+          <w:b/>
+          <w:bCs/>
+          <w:sz w:val="44"/>
+          <w:szCs w:val="44"/>
+          <w:lang w:bidi="fa-IR"/>
+        </w:rPr>
+        <w:t>normed spaces</w:t>
+      </w:r>
+      <w:r>
+        <w:rPr>
+          <w:sz w:val="44"/>
+          <w:szCs w:val="44"/>
+          <w:lang w:bidi="fa-IR"/>
+        </w:rPr>
+        <w:t>.</w:t>
+      </w:r>
+    </w:p>
+    <w:p>
+      <w:pPr>
+        <w:rPr>
+          <w:sz w:val="44"/>
+          <w:szCs w:val="44"/>
+          <w:lang w:bidi="fa-IR"/>
+        </w:rPr>
+      </w:pPr>
+      <w:r>
+        <w:rPr>
+          <w:sz w:val="44"/>
+          <w:szCs w:val="44"/>
+          <w:lang w:bidi="fa-IR"/>
+        </w:rPr>
+        <w:lastRenderedPageBreak/>
+        <w:t>In each setting, we'll define the notion of orthogonality, develop an intuitive understanding of what it means, explore several examples, and examine its key properties.</w:t>
+      </w:r>
+    </w:p>
+    <w:p>
+      <w:pPr>
+        <w:rPr>
+          <w:sz w:val="44"/>
+          <w:szCs w:val="44"/>
+          <w:rtl/>
+          <w:lang w:bidi="fa-IR"/>
+        </w:rPr>
+      </w:pPr>
+      <w:proofErr w:type="gramStart"/>
+      <w:r>
+        <w:rPr>
+          <w:sz w:val="44"/>
+          <w:szCs w:val="44"/>
+          <w:lang w:bidi="fa-IR"/>
+        </w:rPr>
+        <w:t>3 :</w:t>
+      </w:r>
+      <w:proofErr w:type="gramEnd"/>
+      <w:r>
+        <w:rPr>
+          <w:sz w:val="44"/>
+          <w:szCs w:val="44"/>
+          <w:lang w:bidi="fa-IR"/>
+        </w:rPr>
+        <w:t xml:space="preserve"> </w:t>
+      </w:r>
+    </w:p>
+    <w:p>
+      <w:pPr>
+        <w:rPr>
+          <w:sz w:val="44"/>
+          <w:szCs w:val="44"/>
+          <w:lang w:bidi="fa-IR"/>
+        </w:rPr>
+      </w:pPr>
+      <w:r>
+        <w:rPr>
+          <w:sz w:val="44"/>
+          <w:szCs w:val="44"/>
+          <w:lang w:bidi="fa-IR"/>
+        </w:rPr>
+        <w:t>To begin, let's start with the mathematical definition.</w:t>
+      </w:r>
+    </w:p>
+    <w:p>
+      <w:pPr>
+        <w:rPr>
+          <w:sz w:val="44"/>
+          <w:szCs w:val="44"/>
+          <w:lang w:bidi="fa-IR"/>
+        </w:rPr>
+      </w:pPr>
+      <w:r>
+        <w:rPr>
+          <w:sz w:val="44"/>
+          <w:szCs w:val="44"/>
+          <w:lang w:bidi="fa-IR"/>
+        </w:rPr>
+        <w:t xml:space="preserve">In an inner product space (X), we say that an element (x \in X) is </w:t>
+      </w:r>
+      <w:r>
+        <w:rPr>
+          <w:b/>
+          <w:bCs/>
+          <w:sz w:val="44"/>
+          <w:szCs w:val="44"/>
+          <w:lang w:bidi="fa-IR"/>
+        </w:rPr>
+        <w:t>orthogonal</w:t>
+      </w:r>
+      <w:r>
+        <w:rPr>
+          <w:sz w:val="44"/>
+          <w:szCs w:val="44"/>
+          <w:lang w:bidi="fa-IR"/>
+        </w:rPr>
+        <w:t xml:space="preserve"> to another element (y \in X) if their inner product is equal to zero:</w:t>
+      </w:r>
+    </w:p>
+    <w:p>
+      <w:pPr>
+        <w:rPr>
+          <w:sz w:val="44"/>
+          <w:szCs w:val="44"/>
+          <w:lang w:bidi="fa-IR"/>
+        </w:rPr>
+      </w:pPr>
+      <w:r>
+        <w:rPr>
+          <w:sz w:val="44"/>
+          <w:szCs w:val="44"/>
+          <w:lang w:bidi="fa-IR"/>
+        </w:rPr>
+        <w:t xml:space="preserve">When this condition holds, we say that </w:t>
+      </w:r>
+      <w:r>
+        <w:rPr>
+          <w:b/>
+          <w:bCs/>
+          <w:sz w:val="44"/>
+          <w:szCs w:val="44"/>
+          <w:lang w:bidi="fa-IR"/>
+        </w:rPr>
+        <w:t>(x) and (y) are orthogonal</w:t>
+      </w:r>
+      <w:r>
+        <w:rPr>
+          <w:sz w:val="44"/>
+          <w:szCs w:val="44"/>
+          <w:lang w:bidi="fa-IR"/>
+        </w:rPr>
+        <w:t>, and we write</w:t>
+      </w:r>
+    </w:p>
+    <w:p>
+      <w:pPr>
+        <w:rPr>
+          <w:rFonts w:hint="cs"/>
+          <w:sz w:val="44"/>
+          <w:szCs w:val="44"/>
+          <w:rtl/>
+          <w:lang w:bidi="fa-IR"/>
+        </w:rPr>
+      </w:pPr>
+      <w:r>
+        <w:rPr>
+          <w:sz w:val="44"/>
+          <w:szCs w:val="44"/>
+          <w:lang w:bidi="fa-IR"/>
+        </w:rPr>
+        <w:t>[</w:t>
+      </w:r>
+      <w:r>
+        <w:rPr>
+          <w:sz w:val="44"/>
+          <w:szCs w:val="44"/>
+          <w:lang w:bidi="fa-IR"/>
+        </w:rPr>
+        <w:br/>
+      </w:r>
+      <w:r>
+        <w:rPr>
+          <w:sz w:val="44"/>
+          <w:szCs w:val="44"/>
+          <w:lang w:bidi="fa-IR"/>
+        </w:rPr>
+        <w:t>x is orthogonal to y</w:t>
+      </w:r>
+    </w:p>
+    <w:p>
+      <w:pPr>
+        <w:rPr>
+          <w:sz w:val="44"/>
+          <w:szCs w:val="44"/>
+          <w:rtl/>
+          <w:lang w:bidi="fa-IR"/>
+        </w:rPr>
+      </w:pPr>
+      <w:r>
+        <w:rPr>
+          <w:sz w:val="44"/>
+          <w:szCs w:val="44"/>
+          <w:lang w:bidi="fa-IR"/>
+        </w:rPr>
+        <w:t>]</w:t>
+      </w:r>
+    </w:p>
+    <w:p>
+      <w:pPr>
+        <w:rPr>
+          <w:sz w:val="44"/>
+          <w:szCs w:val="44"/>
+          <w:lang w:bidi="fa-IR"/>
+        </w:rPr>
+      </w:pPr>
+      <w:proofErr w:type="gramStart"/>
+      <w:r>
+        <w:rPr>
+          <w:sz w:val="44"/>
+          <w:szCs w:val="44"/>
+          <w:lang w:bidi="fa-IR"/>
+        </w:rPr>
+        <w:t>4 :</w:t>
+      </w:r>
+      <w:proofErr w:type="gramEnd"/>
+      <w:r>
+        <w:rPr>
+          <w:sz w:val="44"/>
+          <w:szCs w:val="44"/>
+          <w:lang w:bidi="fa-IR"/>
+        </w:rPr>
+        <w:t xml:space="preserve"> </w:t>
+      </w:r>
+    </w:p>
+    <w:p>
+      <w:pPr>
+        <w:rPr>
+          <w:sz w:val="44"/>
+          <w:szCs w:val="44"/>
+          <w:lang w:bidi="fa-IR"/>
+        </w:rPr>
+      </w:pPr>
+      <w:r>
+        <w:rPr>
+          <w:sz w:val="44"/>
+          <w:szCs w:val="44"/>
+          <w:lang w:bidi="fa-IR"/>
+        </w:rPr>
+        <w:t xml:space="preserve">If we think about this concept in the familiar two-dimensional Euclidean space, orthogonality simply </w:t>
+      </w:r>
+      <w:r>
+        <w:rPr>
+          <w:sz w:val="44"/>
+          <w:szCs w:val="44"/>
+          <w:lang w:bidi="fa-IR"/>
+        </w:rPr>
+        <w:lastRenderedPageBreak/>
+        <w:t xml:space="preserve">means that the two vectors meet at a </w:t>
+      </w:r>
+      <w:r>
+        <w:rPr>
+          <w:b/>
+          <w:bCs/>
+          <w:sz w:val="44"/>
+          <w:szCs w:val="44"/>
+          <w:lang w:bidi="fa-IR"/>
+        </w:rPr>
+        <w:t>right angle</w:t>
+      </w:r>
+      <w:r>
+        <w:rPr>
+          <w:sz w:val="44"/>
+          <w:szCs w:val="44"/>
+          <w:lang w:bidi="fa-IR"/>
+        </w:rPr>
+        <w:t xml:space="preserve">. In other words, the angle between them is exactly </w:t>
+      </w:r>
+      <w:r>
+        <w:rPr>
+          <w:b/>
+          <w:bCs/>
+          <w:sz w:val="44"/>
+          <w:szCs w:val="44"/>
+          <w:lang w:bidi="fa-IR"/>
+        </w:rPr>
+        <w:t>90 degrees</w:t>
+      </w:r>
+      <w:r>
+        <w:rPr>
+          <w:sz w:val="44"/>
+          <w:szCs w:val="44"/>
+          <w:lang w:bidi="fa-IR"/>
+        </w:rPr>
+        <w:t>.</w:t>
+      </w:r>
+    </w:p>
+    <w:p>
+      <w:pPr>
+        <w:rPr>
+          <w:sz w:val="44"/>
+          <w:szCs w:val="44"/>
+          <w:lang w:bidi="fa-IR"/>
+        </w:rPr>
+      </w:pPr>
+      <w:proofErr w:type="gramStart"/>
+      <w:r>
+        <w:rPr>
+          <w:sz w:val="44"/>
+          <w:szCs w:val="44"/>
+          <w:lang w:bidi="fa-IR"/>
+        </w:rPr>
+        <w:t>5 :</w:t>
+      </w:r>
+      <w:proofErr w:type="gramEnd"/>
+      <w:r>
+        <w:rPr>
+          <w:sz w:val="44"/>
+          <w:szCs w:val="44"/>
+          <w:lang w:bidi="fa-IR"/>
+        </w:rPr>
+        <w:t xml:space="preserve"> </w:t>
+      </w:r>
+    </w:p>
+    <w:p>
+      <w:pPr>
+        <w:rPr>
+          <w:sz w:val="44"/>
+          <w:szCs w:val="44"/>
+          <w:lang w:bidi="fa-IR"/>
+        </w:rPr>
+      </w:pPr>
+      <w:r>
+        <w:rPr>
+          <w:sz w:val="44"/>
+          <w:szCs w:val="44"/>
+          <w:lang w:bidi="fa-IR"/>
+        </w:rPr>
+        <w:t>Now that we understand what orthogonality is, let's explore its fundamental properties in inner product spaces.</w:t>
+      </w:r>
+    </w:p>
+    <w:p>
+      <w:pPr>
+        <w:rPr>
+          <w:sz w:val="44"/>
+          <w:szCs w:val="44"/>
+          <w:lang w:bidi="fa-IR"/>
+        </w:rPr>
+      </w:pPr>
+      <w:proofErr w:type="gramStart"/>
+      <w:r>
+        <w:rPr>
+          <w:sz w:val="44"/>
+          <w:szCs w:val="44"/>
+          <w:lang w:bidi="fa-IR"/>
+        </w:rPr>
+        <w:t>6 :</w:t>
+      </w:r>
+      <w:proofErr w:type="gramEnd"/>
+      <w:r>
+        <w:rPr>
+          <w:sz w:val="44"/>
+          <w:szCs w:val="44"/>
+          <w:lang w:bidi="fa-IR"/>
+        </w:rPr>
+        <w:t xml:space="preserve"> </w:t>
+      </w:r>
+    </w:p>
+    <w:p>
+      <w:pPr>
+        <w:rPr>
+          <w:sz w:val="44"/>
+          <w:szCs w:val="44"/>
+          <w:lang w:bidi="fa-IR"/>
+        </w:rPr>
+      </w:pPr>
+      <w:r>
+        <w:rPr>
+          <w:sz w:val="44"/>
+          <w:szCs w:val="44"/>
+          <w:lang w:bidi="fa-IR"/>
+        </w:rPr>
+        <w:t xml:space="preserve">The first property is </w:t>
+      </w:r>
+      <w:r>
+        <w:rPr>
+          <w:b/>
+          <w:bCs/>
+          <w:sz w:val="44"/>
+          <w:szCs w:val="44"/>
+          <w:lang w:bidi="fa-IR"/>
+        </w:rPr>
+        <w:t>Nondegeneracy</w:t>
+      </w:r>
+      <w:r>
+        <w:rPr>
+          <w:sz w:val="44"/>
+          <w:szCs w:val="44"/>
+          <w:lang w:bidi="fa-IR"/>
+        </w:rPr>
+        <w:t>. A vector is orthogonal to itself if and only if it is the zero vector.</w:t>
+      </w:r>
+    </w:p>
+    <w:p>
+      <w:pPr>
+        <w:rPr>
+          <w:sz w:val="44"/>
+          <w:szCs w:val="44"/>
+          <w:lang w:bidi="fa-IR"/>
+        </w:rPr>
+      </w:pPr>
+      <w:r>
+        <w:rPr>
+          <w:sz w:val="44"/>
+          <w:szCs w:val="44"/>
+          <w:lang w:bidi="fa-IR"/>
+        </w:rPr>
+        <w:t xml:space="preserve">The second property is </w:t>
+      </w:r>
+      <w:r>
+        <w:rPr>
+          <w:b/>
+          <w:bCs/>
+          <w:sz w:val="44"/>
+          <w:szCs w:val="44"/>
+          <w:lang w:bidi="fa-IR"/>
+        </w:rPr>
+        <w:t>Simplification</w:t>
+      </w:r>
+      <w:r>
+        <w:rPr>
+          <w:sz w:val="44"/>
+          <w:szCs w:val="44"/>
+          <w:lang w:bidi="fa-IR"/>
+        </w:rPr>
+        <w:t xml:space="preserve">. If two vectors are orthogonal, then multiplying both of them by the same scalar </w:t>
+      </w:r>
+      <w:proofErr w:type="gramStart"/>
+      <w:r>
+        <w:rPr>
+          <w:sz w:val="44"/>
+          <w:szCs w:val="44"/>
+          <w:lang w:bidi="fa-IR"/>
+        </w:rPr>
+        <w:t>preserves</w:t>
+      </w:r>
+      <w:proofErr w:type="gramEnd"/>
+      <w:r>
+        <w:rPr>
+          <w:sz w:val="44"/>
+          <w:szCs w:val="44"/>
+          <w:lang w:bidi="fa-IR"/>
+        </w:rPr>
+        <w:t xml:space="preserve"> orthogonality.</w:t>
+      </w:r>
+    </w:p>
+    <w:p>
+      <w:pPr>
+        <w:rPr>
+          <w:sz w:val="44"/>
+          <w:szCs w:val="44"/>
+          <w:lang w:bidi="fa-IR"/>
+        </w:rPr>
+      </w:pPr>
+      <w:r>
+        <w:rPr>
+          <w:sz w:val="44"/>
+          <w:szCs w:val="44"/>
+          <w:lang w:bidi="fa-IR"/>
+        </w:rPr>
+        <w:t xml:space="preserve">Next comes </w:t>
+      </w:r>
+      <w:r>
+        <w:rPr>
+          <w:b/>
+          <w:bCs/>
+          <w:sz w:val="44"/>
+          <w:szCs w:val="44"/>
+          <w:lang w:bidi="fa-IR"/>
+        </w:rPr>
+        <w:t>Continuity</w:t>
+      </w:r>
+      <w:r>
+        <w:rPr>
+          <w:sz w:val="44"/>
+          <w:szCs w:val="44"/>
+          <w:lang w:bidi="fa-IR"/>
+        </w:rPr>
+        <w:t>. If two sequences of orthogonal vectors converge, then their limit vectors remain orthogonal.</w:t>
+      </w:r>
+    </w:p>
+    <w:p>
+      <w:pPr>
+        <w:rPr>
+          <w:sz w:val="44"/>
+          <w:szCs w:val="44"/>
+          <w:lang w:bidi="fa-IR"/>
+        </w:rPr>
+      </w:pPr>
+      <w:r>
+        <w:rPr>
+          <w:sz w:val="44"/>
+          <w:szCs w:val="44"/>
+          <w:lang w:bidi="fa-IR"/>
+        </w:rPr>
+        <w:t xml:space="preserve">The fourth property is </w:t>
+      </w:r>
+      <w:r>
+        <w:rPr>
+          <w:b/>
+          <w:bCs/>
+          <w:sz w:val="44"/>
+          <w:szCs w:val="44"/>
+          <w:lang w:bidi="fa-IR"/>
+        </w:rPr>
+        <w:t>Homogeneity</w:t>
+      </w:r>
+      <w:r>
+        <w:rPr>
+          <w:sz w:val="44"/>
+          <w:szCs w:val="44"/>
+          <w:lang w:bidi="fa-IR"/>
+        </w:rPr>
+        <w:t>. If two vectors are orthogonal, then multiplying each of them by arbitrary scalars also preserves orthogonality.</w:t>
+      </w:r>
+    </w:p>
+    <w:p>
+      <w:pPr>
+        <w:rPr>
+          <w:sz w:val="44"/>
+          <w:szCs w:val="44"/>
+          <w:lang w:bidi="fa-IR"/>
+        </w:rPr>
+      </w:pPr>
+      <w:r>
+        <w:rPr>
+          <w:sz w:val="44"/>
+          <w:szCs w:val="44"/>
+          <w:lang w:bidi="fa-IR"/>
+        </w:rPr>
+        <w:lastRenderedPageBreak/>
+        <w:t xml:space="preserve">The next property is </w:t>
+      </w:r>
+      <w:r>
+        <w:rPr>
+          <w:b/>
+          <w:bCs/>
+          <w:sz w:val="44"/>
+          <w:szCs w:val="44"/>
+          <w:lang w:bidi="fa-IR"/>
+        </w:rPr>
+        <w:t>Symmetry</w:t>
+      </w:r>
+      <w:r>
+        <w:rPr>
+          <w:sz w:val="44"/>
+          <w:szCs w:val="44"/>
+          <w:lang w:bidi="fa-IR"/>
+        </w:rPr>
+        <w:t>. If (x) is orthogonal to (y), then (y) is also orthogonal to (x).</w:t>
+      </w:r>
+    </w:p>
+    <w:p>
+      <w:pPr>
+        <w:rPr>
+          <w:sz w:val="44"/>
+          <w:szCs w:val="44"/>
+          <w:lang w:bidi="fa-IR"/>
+        </w:rPr>
+      </w:pPr>
+      <w:r>
+        <w:rPr>
+          <w:sz w:val="44"/>
+          <w:szCs w:val="44"/>
+          <w:lang w:bidi="fa-IR"/>
+        </w:rPr>
+        <w:t xml:space="preserve">Another important property is </w:t>
+      </w:r>
+      <w:r>
+        <w:rPr>
+          <w:b/>
+          <w:bCs/>
+          <w:sz w:val="44"/>
+          <w:szCs w:val="44"/>
+          <w:lang w:bidi="fa-IR"/>
+        </w:rPr>
+        <w:t>Additivity</w:t>
+      </w:r>
+      <w:r>
+        <w:rPr>
+          <w:sz w:val="44"/>
+          <w:szCs w:val="44"/>
+          <w:lang w:bidi="fa-IR"/>
+        </w:rPr>
+        <w:t>. If (x) is orthogonal to both (y) and (z), then it is also orthogonal to their sum, (y + z).</w:t>
+      </w:r>
+    </w:p>
+    <w:p>
+      <w:pPr>
+        <w:rPr>
+          <w:sz w:val="44"/>
+          <w:szCs w:val="44"/>
+          <w:lang w:bidi="fa-IR"/>
+        </w:rPr>
+      </w:pPr>
+      <w:r>
+        <w:rPr>
+          <w:sz w:val="44"/>
+          <w:szCs w:val="44"/>
+          <w:lang w:bidi="fa-IR"/>
+        </w:rPr>
+        <w:t xml:space="preserve">The next property is </w:t>
+      </w:r>
+      <w:r>
+        <w:rPr>
+          <w:b/>
+          <w:bCs/>
+          <w:sz w:val="44"/>
+          <w:szCs w:val="44"/>
+          <w:lang w:bidi="fa-IR"/>
+        </w:rPr>
+        <w:t>Existence</w:t>
+      </w:r>
+      <w:r>
+        <w:rPr>
+          <w:sz w:val="44"/>
+          <w:szCs w:val="44"/>
+          <w:lang w:bidi="fa-IR"/>
+        </w:rPr>
+        <w:t>. Given any vector and any prescribed length, there always exists a vector of that length that is orthogonal to the given vector.</w:t>
+      </w:r>
+    </w:p>
+    <w:p>
+      <w:pPr>
+        <w:rPr>
+          <w:sz w:val="44"/>
+          <w:szCs w:val="44"/>
+          <w:lang w:bidi="fa-IR"/>
+        </w:rPr>
+      </w:pPr>
+      <w:r>
+        <w:rPr>
+          <w:sz w:val="44"/>
+          <w:szCs w:val="44"/>
+          <w:lang w:bidi="fa-IR"/>
+        </w:rPr>
+        <w:t xml:space="preserve">The eighth property is </w:t>
+      </w:r>
+      <w:r>
+        <w:rPr>
+          <w:b/>
+          <w:bCs/>
+          <w:sz w:val="44"/>
+          <w:szCs w:val="44"/>
+          <w:lang w:bidi="fa-IR"/>
+        </w:rPr>
+        <w:t>Uniqueness</w:t>
+      </w:r>
+      <w:r>
+        <w:rPr>
+          <w:sz w:val="44"/>
+          <w:szCs w:val="44"/>
+          <w:lang w:bidi="fa-IR"/>
+        </w:rPr>
+        <w:t>. Once an orientation is fixed, the orthogonal vector is uniquely determined.</w:t>
+      </w:r>
+    </w:p>
+    <w:p>
+      <w:pPr>
+        <w:rPr>
+          <w:sz w:val="44"/>
+          <w:szCs w:val="44"/>
+          <w:lang w:bidi="fa-IR"/>
+        </w:rPr>
+      </w:pPr>
+      <w:r>
+        <w:rPr>
+          <w:sz w:val="44"/>
+          <w:szCs w:val="44"/>
+          <w:lang w:bidi="fa-IR"/>
+        </w:rPr>
+        <w:t xml:space="preserve">Finally, we have </w:t>
+      </w:r>
+      <w:r>
+        <w:rPr>
+          <w:b/>
+          <w:bCs/>
+          <w:sz w:val="44"/>
+          <w:szCs w:val="44"/>
+          <w:lang w:bidi="fa-IR"/>
+        </w:rPr>
+        <w:t>Scalar Existence</w:t>
+      </w:r>
+      <w:r>
+        <w:rPr>
+          <w:sz w:val="44"/>
+          <w:szCs w:val="44"/>
+          <w:lang w:bidi="fa-IR"/>
+        </w:rPr>
+        <w:t>. For every pair of vectors, there exists a scalar (a) such that (x) is orthogonal to (ax + y).</w:t>
+      </w:r>
+    </w:p>
+    <w:p>
+      <w:pPr>
+        <w:rPr>
+          <w:sz w:val="44"/>
+          <w:szCs w:val="44"/>
+          <w:rtl/>
+          <w:lang w:bidi="fa-IR"/>
+        </w:rPr>
+      </w:pPr>
+    </w:p>
+    <w:p>
+      <w:pPr>
+        <w:rPr>
+          <w:sz w:val="44"/>
+          <w:szCs w:val="44"/>
+          <w:lang w:bidi="fa-IR"/>
+        </w:rPr>
+      </w:pPr>
+      <w:proofErr w:type="gramStart"/>
+      <w:r>
+        <w:rPr>
+          <w:sz w:val="44"/>
+          <w:szCs w:val="44"/>
+          <w:lang w:bidi="fa-IR"/>
+        </w:rPr>
+        <w:t>7 :</w:t>
+      </w:r>
+      <w:proofErr w:type="gramEnd"/>
+      <w:r>
+        <w:rPr>
+          <w:sz w:val="44"/>
+          <w:szCs w:val="44"/>
+          <w:lang w:bidi="fa-IR"/>
+        </w:rPr>
+        <w:t xml:space="preserve"> </w:t>
+      </w:r>
+    </w:p>
+    <w:p>
+      <w:pPr>
+        <w:rPr>
+          <w:sz w:val="44"/>
+          <w:szCs w:val="44"/>
+          <w:lang w:bidi="fa-IR"/>
+        </w:rPr>
+      </w:pPr>
+      <w:r>
+        <w:rPr>
+          <w:sz w:val="44"/>
+          <w:szCs w:val="44"/>
+          <w:lang w:bidi="fa-IR"/>
+        </w:rPr>
+        <w:t>So far, we have defined orthogonality using the inner product, which means we have been working entirely within inner product spaces.</w:t>
+      </w:r>
+    </w:p>
+    <w:p>
+      <w:pPr>
+        <w:rPr>
+          <w:sz w:val="44"/>
+          <w:szCs w:val="44"/>
+          <w:lang w:bidi="fa-IR"/>
+        </w:rPr>
+      </w:pPr>
+      <w:r>
+        <w:rPr>
+          <w:sz w:val="44"/>
+          <w:szCs w:val="44"/>
+          <w:lang w:bidi="fa-IR"/>
+        </w:rPr>
+        <w:lastRenderedPageBreak/>
+        <w:t>Now, our goal is to extend this notion to normed spaces, where an inner product may not exist. To do that, we need a definition of orthogonality that relies only on the norm.</w:t>
+      </w:r>
+    </w:p>
+    <w:p>
+      <w:pPr>
+        <w:rPr>
+          <w:sz w:val="44"/>
+          <w:szCs w:val="44"/>
+          <w:lang w:bidi="fa-IR"/>
+        </w:rPr>
+      </w:pPr>
+      <w:proofErr w:type="gramStart"/>
+      <w:r>
+        <w:rPr>
+          <w:sz w:val="44"/>
+          <w:szCs w:val="44"/>
+          <w:lang w:bidi="fa-IR"/>
+        </w:rPr>
+        <w:t>8 :</w:t>
+      </w:r>
+      <w:proofErr w:type="gramEnd"/>
+      <w:r>
+        <w:rPr>
+          <w:sz w:val="44"/>
+          <w:szCs w:val="44"/>
+          <w:lang w:bidi="fa-IR"/>
+        </w:rPr>
+        <w:t xml:space="preserve"> </w:t>
+      </w:r>
+    </w:p>
+    <w:p>
+      <w:pPr>
+        <w:rPr>
+          <w:sz w:val="44"/>
+          <w:szCs w:val="44"/>
+          <w:lang w:bidi="fa-IR"/>
+        </w:rPr>
+      </w:pPr>
+      <w:r>
+        <w:rPr>
+          <w:sz w:val="44"/>
+          <w:szCs w:val="44"/>
+          <w:lang w:bidi="fa-IR"/>
+        </w:rPr>
+        <w:t>In this video, we explored orthogonality in inner product spaces and discussed its fundamental properties.</w:t>
+      </w:r>
+    </w:p>
+    <w:p>
+      <w:pPr>
+        <w:rPr>
+          <w:sz w:val="44"/>
+          <w:szCs w:val="44"/>
+          <w:lang w:bidi="fa-IR"/>
+        </w:rPr>
+      </w:pPr>
+      <w:r>
+        <w:rPr>
+          <w:sz w:val="44"/>
+          <w:szCs w:val="44"/>
+          <w:lang w:bidi="fa-IR"/>
+        </w:rPr>
+        <w:t>In the next video, we'll begin our journey into normed spaces by introducing the different notions of orthogonality. See you there!</w:t>
+      </w:r>
     </w:p>
     <w:p>
       <w:pPr>
         <w:pStyle w:val="Heading2"/>
         <w:rPr>
+          <w:lang w:bidi="fa-IR"/>
+        </w:rPr>
+      </w:pPr>
+      <w:r>
+        <w:rPr>
+          <w:lang w:bidi="fa-IR"/>
+        </w:rPr>
+        <w:t>Orthogonality in normed spaces</w:t>
+      </w:r>
+    </w:p>
+    <w:p>
+      <w:pPr>
+        <w:rPr>
+          <w:sz w:val="44"/>
+          <w:szCs w:val="44"/>
           <w:rtl/>
           <w:lang w:bidi="fa-IR"/>
         </w:rPr>
       </w:pPr>
-      <w:r>
-        <w:rPr>
-          <w:lang w:bidi="fa-IR"/>
-        </w:rPr>
-        <w:t>Orthogonality in normed spaces</w:t>
-      </w:r>
+      <w:proofErr w:type="gramStart"/>
+      <w:r>
+        <w:rPr>
+          <w:sz w:val="44"/>
+          <w:szCs w:val="44"/>
+          <w:lang w:bidi="fa-IR"/>
+        </w:rPr>
+        <w:t>1 :</w:t>
+      </w:r>
+      <w:proofErr w:type="gramEnd"/>
+      <w:r>
+        <w:rPr>
+          <w:sz w:val="44"/>
+          <w:szCs w:val="44"/>
+          <w:lang w:bidi="fa-IR"/>
+        </w:rPr>
+        <w:t xml:space="preserve"> </w:t>
+      </w:r>
+    </w:p>
+    <w:p>
+      <w:pPr>
+        <w:rPr>
+          <w:sz w:val="44"/>
+          <w:szCs w:val="44"/>
+          <w:lang w:bidi="fa-IR"/>
+        </w:rPr>
+      </w:pPr>
+      <w:r>
+        <w:rPr>
+          <w:sz w:val="44"/>
+          <w:szCs w:val="44"/>
+          <w:lang w:bidi="fa-IR"/>
+        </w:rPr>
+        <w:t>In this video, we are going to introduce different types of orthogonality in normed spaces.</w:t>
+      </w:r>
+    </w:p>
+    <w:p>
+      <w:pPr>
+        <w:rPr>
+          <w:rFonts w:hint="cs"/>
+          <w:sz w:val="44"/>
+          <w:szCs w:val="44"/>
+          <w:rtl/>
+          <w:lang w:bidi="fa-IR"/>
+        </w:rPr>
+      </w:pPr>
     </w:p>
     <w:sectPr>
       <w:pgSz w:w="12240" w:h="15840"/>

</xml_diff>

<commit_message>
step 98 : add notes
</commit_message>
<xml_diff>
--- a/video context/video_context_newVersion.docx
+++ b/video context/video_context_newVersion.docx
@@ -11289,6 +11289,182 @@
           <w:lang w:bidi="fa-IR"/>
         </w:rPr>
         <w:t>In this video, we are going to introduce different types of orthogonality in normed spaces.</w:t>
+      </w:r>
+    </w:p>
+    <w:p>
+      <w:pPr>
+        <w:rPr>
+          <w:sz w:val="44"/>
+          <w:szCs w:val="44"/>
+          <w:lang w:bidi="fa-IR"/>
+        </w:rPr>
+      </w:pPr>
+      <w:r>
+        <w:rPr>
+          <w:sz w:val="44"/>
+          <w:szCs w:val="44"/>
+          <w:lang w:bidi="fa-IR"/>
+        </w:rPr>
+        <w:t xml:space="preserve">We will start with </w:t>
+      </w:r>
+      <w:r>
+        <w:rPr>
+          <w:b/>
+          <w:bCs/>
+          <w:sz w:val="44"/>
+          <w:szCs w:val="44"/>
+          <w:lang w:bidi="fa-IR"/>
+        </w:rPr>
+        <w:t>Roberts Orthogonality</w:t>
+      </w:r>
+      <w:r>
+        <w:rPr>
+          <w:sz w:val="44"/>
+          <w:szCs w:val="44"/>
+          <w:lang w:bidi="fa-IR"/>
+        </w:rPr>
+        <w:t>.</w:t>
+      </w:r>
+    </w:p>
+    <w:p>
+      <w:pPr>
+        <w:rPr>
+          <w:sz w:val="44"/>
+          <w:szCs w:val="44"/>
+          <w:lang w:bidi="fa-IR"/>
+        </w:rPr>
+      </w:pPr>
+      <w:r>
+        <w:rPr>
+          <w:sz w:val="44"/>
+          <w:szCs w:val="44"/>
+          <w:lang w:bidi="fa-IR"/>
+        </w:rPr>
+        <w:t xml:space="preserve">Then, we will continue with </w:t>
+      </w:r>
+      <w:r>
+        <w:rPr>
+          <w:b/>
+          <w:bCs/>
+          <w:sz w:val="44"/>
+          <w:szCs w:val="44"/>
+          <w:lang w:bidi="fa-IR"/>
+        </w:rPr>
+        <w:t>Birkhoff–James Orthogonality</w:t>
+      </w:r>
+      <w:r>
+        <w:rPr>
+          <w:sz w:val="44"/>
+          <w:szCs w:val="44"/>
+          <w:lang w:bidi="fa-IR"/>
+        </w:rPr>
+        <w:t>.</w:t>
+      </w:r>
+    </w:p>
+    <w:p>
+      <w:pPr>
+        <w:rPr>
+          <w:sz w:val="44"/>
+          <w:szCs w:val="44"/>
+          <w:lang w:bidi="fa-IR"/>
+        </w:rPr>
+      </w:pPr>
+      <w:r>
+        <w:rPr>
+          <w:sz w:val="44"/>
+          <w:szCs w:val="44"/>
+          <w:lang w:bidi="fa-IR"/>
+        </w:rPr>
+        <w:lastRenderedPageBreak/>
+        <w:t xml:space="preserve">After that, we will move on to </w:t>
+      </w:r>
+      <w:r>
+        <w:rPr>
+          <w:b/>
+          <w:bCs/>
+          <w:sz w:val="44"/>
+          <w:szCs w:val="44"/>
+          <w:lang w:bidi="fa-IR"/>
+        </w:rPr>
+        <w:t>Isosceles Orthogonality</w:t>
+      </w:r>
+      <w:r>
+        <w:rPr>
+          <w:sz w:val="44"/>
+          <w:szCs w:val="44"/>
+          <w:lang w:bidi="fa-IR"/>
+        </w:rPr>
+        <w:t>.</w:t>
+      </w:r>
+    </w:p>
+    <w:p>
+      <w:pPr>
+        <w:rPr>
+          <w:sz w:val="44"/>
+          <w:szCs w:val="44"/>
+          <w:lang w:bidi="fa-IR"/>
+        </w:rPr>
+      </w:pPr>
+      <w:r>
+        <w:rPr>
+          <w:sz w:val="44"/>
+          <w:szCs w:val="44"/>
+          <w:lang w:bidi="fa-IR"/>
+        </w:rPr>
+        <w:t xml:space="preserve">And finally, we will discuss </w:t>
+      </w:r>
+      <w:r>
+        <w:rPr>
+          <w:b/>
+          <w:bCs/>
+          <w:sz w:val="44"/>
+          <w:szCs w:val="44"/>
+          <w:lang w:bidi="fa-IR"/>
+        </w:rPr>
+        <w:t>Pythagorean Orthogonality</w:t>
+      </w:r>
+      <w:r>
+        <w:rPr>
+          <w:sz w:val="44"/>
+          <w:szCs w:val="44"/>
+          <w:lang w:bidi="fa-IR"/>
+        </w:rPr>
+        <w:t>.</w:t>
+      </w:r>
+    </w:p>
+    <w:p>
+      <w:pPr>
+        <w:rPr>
+          <w:sz w:val="44"/>
+          <w:szCs w:val="44"/>
+          <w:lang w:bidi="fa-IR"/>
+        </w:rPr>
+      </w:pPr>
+      <w:r>
+        <w:rPr>
+          <w:sz w:val="44"/>
+          <w:szCs w:val="44"/>
+          <w:lang w:bidi="fa-IR"/>
+        </w:rPr>
+        <w:t xml:space="preserve">So, if you are ready, join me in the next video as we begin our discussion with </w:t>
+      </w:r>
+      <w:r>
+        <w:rPr>
+          <w:b/>
+          <w:bCs/>
+          <w:sz w:val="44"/>
+          <w:szCs w:val="44"/>
+          <w:lang w:bidi="fa-IR"/>
+        </w:rPr>
+        <w:t>Roberts Orthogonality</w:t>
+      </w:r>
+      <w:r>
+        <w:rPr>
+          <w:sz w:val="44"/>
+          <w:szCs w:val="44"/>
+          <w:lang w:bidi="fa-IR"/>
+        </w:rPr>
+        <w:t>.</w:t>
       </w:r>
     </w:p>
     <w:p>

</xml_diff>

<commit_message>
step 100 : add notes and start part 10
</commit_message>
<xml_diff>
--- a/video context/video_context_newVersion.docx
+++ b/video context/video_context_newVersion.docx
@@ -685,23 +685,13 @@
           <w:lang w:bidi="fa-IR"/>
         </w:rPr>
       </w:pPr>
-      <w:proofErr w:type="gramStart"/>
-      <w:r>
-        <w:rPr>
-          <w:sz w:val="44"/>
-          <w:szCs w:val="44"/>
-          <w:lang w:bidi="fa-IR"/>
-        </w:rPr>
-        <w:t>So</w:t>
-      </w:r>
-      <w:proofErr w:type="gramEnd"/>
-      <w:r>
-        <w:rPr>
-          <w:sz w:val="44"/>
-          <w:szCs w:val="44"/>
-          <w:lang w:bidi="fa-IR"/>
-        </w:rPr>
-        <w:t xml:space="preserve"> we need a different way to measure distance.</w:t>
+      <w:r>
+        <w:rPr>
+          <w:sz w:val="44"/>
+          <w:szCs w:val="44"/>
+          <w:lang w:bidi="fa-IR"/>
+        </w:rPr>
+        <w:t>So we need a different way to measure distance.</w:t>
       </w:r>
     </w:p>
     <w:p>
@@ -1184,23 +1174,13 @@
           <w:lang w:bidi="fa-IR"/>
         </w:rPr>
       </w:pPr>
-      <w:proofErr w:type="gramStart"/>
-      <w:r>
-        <w:rPr>
-          <w:sz w:val="44"/>
-          <w:szCs w:val="44"/>
-          <w:lang w:bidi="fa-IR"/>
-        </w:rPr>
-        <w:t>8 :</w:t>
-      </w:r>
-      <w:proofErr w:type="gramEnd"/>
-      <w:r>
-        <w:rPr>
-          <w:sz w:val="44"/>
-          <w:szCs w:val="44"/>
-          <w:lang w:bidi="fa-IR"/>
-        </w:rPr>
-        <w:t xml:space="preserve"> </w:t>
+      <w:r>
+        <w:rPr>
+          <w:sz w:val="44"/>
+          <w:szCs w:val="44"/>
+          <w:lang w:bidi="fa-IR"/>
+        </w:rPr>
+        <w:t xml:space="preserve">8 : </w:t>
       </w:r>
     </w:p>
     <w:p>
@@ -1367,7 +1347,6 @@
           <w:lang w:bidi="fa-IR"/>
         </w:rPr>
       </w:pPr>
-      <w:proofErr w:type="gramStart"/>
       <w:r>
         <w:rPr>
           <w:sz w:val="44"/>
@@ -1376,7 +1355,6 @@
         </w:rPr>
         <w:t>9 :</w:t>
       </w:r>
-      <w:proofErr w:type="gramEnd"/>
     </w:p>
     <w:p>
       <w:pPr>
@@ -1893,41 +1871,21 @@
           <w:lang w:bidi="fa-IR"/>
         </w:rPr>
       </w:pPr>
-      <w:proofErr w:type="gramStart"/>
-      <w:r>
-        <w:rPr>
-          <w:sz w:val="44"/>
-          <w:szCs w:val="44"/>
-          <w:lang w:bidi="fa-IR"/>
-        </w:rPr>
-        <w:t>So ,</w:t>
-      </w:r>
-      <w:proofErr w:type="gramEnd"/>
-      <w:r>
-        <w:rPr>
-          <w:sz w:val="44"/>
-          <w:szCs w:val="44"/>
-          <w:lang w:bidi="fa-IR"/>
-        </w:rPr>
-        <w:t xml:space="preserve"> </w:t>
-      </w:r>
-      <w:proofErr w:type="gramStart"/>
-      <w:r>
-        <w:rPr>
-          <w:sz w:val="44"/>
-          <w:szCs w:val="44"/>
-          <w:lang w:bidi="fa-IR"/>
-        </w:rPr>
-        <w:t>Let's</w:t>
-      </w:r>
-      <w:proofErr w:type="gramEnd"/>
-      <w:r>
-        <w:rPr>
-          <w:sz w:val="44"/>
-          <w:szCs w:val="44"/>
-          <w:lang w:bidi="fa-IR"/>
-        </w:rPr>
-        <w:t xml:space="preserve"> quickly recap.</w:t>
+      <w:r>
+        <w:rPr>
+          <w:sz w:val="44"/>
+          <w:szCs w:val="44"/>
+          <w:lang w:bidi="fa-IR"/>
+        </w:rPr>
+        <w:t xml:space="preserve">So , </w:t>
+      </w:r>
+      <w:r>
+        <w:rPr>
+          <w:sz w:val="44"/>
+          <w:szCs w:val="44"/>
+          <w:lang w:bidi="fa-IR"/>
+        </w:rPr>
+        <w:t>Let's quickly recap.</w:t>
       </w:r>
     </w:p>
     <w:p>
@@ -2198,27 +2156,15 @@
           <w:lang w:bidi="fa-IR"/>
         </w:rPr>
       </w:pPr>
-      <w:proofErr w:type="gramStart"/>
-      <w:r>
-        <w:rPr>
-          <w:b/>
-          <w:bCs/>
-          <w:sz w:val="44"/>
-          <w:szCs w:val="44"/>
-          <w:lang w:bidi="fa-IR"/>
-        </w:rPr>
-        <w:t>10 :</w:t>
-      </w:r>
-      <w:proofErr w:type="gramEnd"/>
-      <w:r>
-        <w:rPr>
-          <w:b/>
-          <w:bCs/>
-          <w:sz w:val="44"/>
-          <w:szCs w:val="44"/>
-          <w:lang w:bidi="fa-IR"/>
-        </w:rPr>
-        <w:t xml:space="preserve"> </w:t>
+      <w:r>
+        <w:rPr>
+          <w:b/>
+          <w:bCs/>
+          <w:sz w:val="44"/>
+          <w:szCs w:val="44"/>
+          <w:lang w:bidi="fa-IR"/>
+        </w:rPr>
+        <w:t xml:space="preserve">10 : </w:t>
       </w:r>
     </w:p>
     <w:p>
@@ -2338,23 +2284,13 @@
           <w:lang w:bidi="fa-IR"/>
         </w:rPr>
       </w:pPr>
-      <w:proofErr w:type="gramStart"/>
-      <w:r>
-        <w:rPr>
-          <w:sz w:val="44"/>
-          <w:szCs w:val="44"/>
-          <w:lang w:bidi="fa-IR"/>
-        </w:rPr>
-        <w:t>1 :</w:t>
-      </w:r>
-      <w:proofErr w:type="gramEnd"/>
-      <w:r>
-        <w:rPr>
-          <w:sz w:val="44"/>
-          <w:szCs w:val="44"/>
-          <w:lang w:bidi="fa-IR"/>
-        </w:rPr>
-        <w:t xml:space="preserve"> </w:t>
+      <w:r>
+        <w:rPr>
+          <w:sz w:val="44"/>
+          <w:szCs w:val="44"/>
+          <w:lang w:bidi="fa-IR"/>
+        </w:rPr>
+        <w:t xml:space="preserve">1 : </w:t>
       </w:r>
     </w:p>
     <w:p>
@@ -2683,23 +2619,13 @@
           <w:lang w:bidi="fa-IR"/>
         </w:rPr>
       </w:pPr>
-      <w:proofErr w:type="gramStart"/>
-      <w:r>
-        <w:rPr>
-          <w:sz w:val="44"/>
-          <w:szCs w:val="44"/>
-          <w:lang w:bidi="fa-IR"/>
-        </w:rPr>
-        <w:t>3 :</w:t>
-      </w:r>
-      <w:proofErr w:type="gramEnd"/>
-      <w:r>
-        <w:rPr>
-          <w:sz w:val="44"/>
-          <w:szCs w:val="44"/>
-          <w:lang w:bidi="fa-IR"/>
-        </w:rPr>
-        <w:t xml:space="preserve"> </w:t>
+      <w:r>
+        <w:rPr>
+          <w:sz w:val="44"/>
+          <w:szCs w:val="44"/>
+          <w:lang w:bidi="fa-IR"/>
+        </w:rPr>
+        <w:t xml:space="preserve">3 : </w:t>
       </w:r>
     </w:p>
     <w:p>
@@ -2815,23 +2741,13 @@
           <w:lang w:bidi="fa-IR"/>
         </w:rPr>
       </w:pPr>
-      <w:proofErr w:type="gramStart"/>
-      <w:r>
-        <w:rPr>
-          <w:sz w:val="44"/>
-          <w:szCs w:val="44"/>
-          <w:lang w:bidi="fa-IR"/>
-        </w:rPr>
-        <w:t>4 :</w:t>
-      </w:r>
-      <w:proofErr w:type="gramEnd"/>
-      <w:r>
-        <w:rPr>
-          <w:sz w:val="44"/>
-          <w:szCs w:val="44"/>
-          <w:lang w:bidi="fa-IR"/>
-        </w:rPr>
-        <w:t xml:space="preserve"> </w:t>
+      <w:r>
+        <w:rPr>
+          <w:sz w:val="44"/>
+          <w:szCs w:val="44"/>
+          <w:lang w:bidi="fa-IR"/>
+        </w:rPr>
+        <w:t xml:space="preserve">4 : </w:t>
       </w:r>
     </w:p>
     <w:p>
@@ -2980,23 +2896,13 @@
           <w:lang w:bidi="fa-IR"/>
         </w:rPr>
       </w:pPr>
-      <w:proofErr w:type="gramStart"/>
-      <w:r>
-        <w:rPr>
-          <w:sz w:val="44"/>
-          <w:szCs w:val="44"/>
-          <w:lang w:bidi="fa-IR"/>
-        </w:rPr>
-        <w:t>5 :</w:t>
-      </w:r>
-      <w:proofErr w:type="gramEnd"/>
-      <w:r>
-        <w:rPr>
-          <w:sz w:val="44"/>
-          <w:szCs w:val="44"/>
-          <w:lang w:bidi="fa-IR"/>
-        </w:rPr>
-        <w:t xml:space="preserve"> </w:t>
+      <w:r>
+        <w:rPr>
+          <w:sz w:val="44"/>
+          <w:szCs w:val="44"/>
+          <w:lang w:bidi="fa-IR"/>
+        </w:rPr>
+        <w:t xml:space="preserve">5 : </w:t>
       </w:r>
     </w:p>
     <w:p>
@@ -3092,23 +2998,13 @@
           <w:lang w:bidi="fa-IR"/>
         </w:rPr>
       </w:pPr>
-      <w:proofErr w:type="gramStart"/>
-      <w:r>
-        <w:rPr>
-          <w:sz w:val="44"/>
-          <w:szCs w:val="44"/>
-          <w:lang w:bidi="fa-IR"/>
-        </w:rPr>
-        <w:t>6 :</w:t>
-      </w:r>
-      <w:proofErr w:type="gramEnd"/>
-      <w:r>
-        <w:rPr>
-          <w:sz w:val="44"/>
-          <w:szCs w:val="44"/>
-          <w:lang w:bidi="fa-IR"/>
-        </w:rPr>
-        <w:t xml:space="preserve"> </w:t>
+      <w:r>
+        <w:rPr>
+          <w:sz w:val="44"/>
+          <w:szCs w:val="44"/>
+          <w:lang w:bidi="fa-IR"/>
+        </w:rPr>
+        <w:t xml:space="preserve">6 : </w:t>
       </w:r>
     </w:p>
     <w:p>
@@ -3257,7 +3153,6 @@
           <w:lang w:bidi="fa-IR"/>
         </w:rPr>
       </w:pPr>
-      <w:proofErr w:type="gramStart"/>
       <w:r>
         <w:rPr>
           <w:sz w:val="44"/>
@@ -3266,7 +3161,6 @@
         </w:rPr>
         <w:t>7 :</w:t>
       </w:r>
-      <w:proofErr w:type="gramEnd"/>
     </w:p>
     <w:p>
       <w:pPr>
@@ -3363,23 +3257,13 @@
           <w:lang w:bidi="fa-IR"/>
         </w:rPr>
       </w:pPr>
-      <w:proofErr w:type="gramStart"/>
-      <w:r>
-        <w:rPr>
-          <w:sz w:val="44"/>
-          <w:szCs w:val="44"/>
-          <w:lang w:bidi="fa-IR"/>
-        </w:rPr>
-        <w:t>1 :</w:t>
-      </w:r>
-      <w:proofErr w:type="gramEnd"/>
-      <w:r>
-        <w:rPr>
-          <w:sz w:val="44"/>
-          <w:szCs w:val="44"/>
-          <w:lang w:bidi="fa-IR"/>
-        </w:rPr>
-        <w:t xml:space="preserve"> </w:t>
+      <w:r>
+        <w:rPr>
+          <w:sz w:val="44"/>
+          <w:szCs w:val="44"/>
+          <w:lang w:bidi="fa-IR"/>
+        </w:rPr>
+        <w:t xml:space="preserve">1 : </w:t>
       </w:r>
     </w:p>
     <w:p>
@@ -3496,23 +3380,13 @@
           <w:lang w:bidi="fa-IR"/>
         </w:rPr>
       </w:pPr>
-      <w:proofErr w:type="gramStart"/>
-      <w:r>
-        <w:rPr>
-          <w:sz w:val="44"/>
-          <w:szCs w:val="44"/>
-          <w:lang w:bidi="fa-IR"/>
-        </w:rPr>
-        <w:t>2 :</w:t>
-      </w:r>
-      <w:proofErr w:type="gramEnd"/>
-      <w:r>
-        <w:rPr>
-          <w:sz w:val="44"/>
-          <w:szCs w:val="44"/>
-          <w:lang w:bidi="fa-IR"/>
-        </w:rPr>
-        <w:t xml:space="preserve"> </w:t>
+      <w:r>
+        <w:rPr>
+          <w:sz w:val="44"/>
+          <w:szCs w:val="44"/>
+          <w:lang w:bidi="fa-IR"/>
+        </w:rPr>
+        <w:t xml:space="preserve">2 : </w:t>
       </w:r>
     </w:p>
     <w:p>
@@ -3532,7 +3406,6 @@
         <w:t>To begin, let (</w:t>
       </w:r>
       <w:proofErr w:type="spellStart"/>
-      <w:proofErr w:type="gramStart"/>
       <w:r>
         <w:rPr>
           <w:sz w:val="44"/>
@@ -3542,7 +3415,6 @@
         <w:t>X,d</w:t>
       </w:r>
       <w:proofErr w:type="spellEnd"/>
-      <w:proofErr w:type="gramEnd"/>
       <w:r>
         <w:rPr>
           <w:sz w:val="44"/>
@@ -3758,16 +3630,7 @@
           <w:szCs w:val="44"/>
           <w:lang w:bidi="fa-IR"/>
         </w:rPr>
-        <w:t xml:space="preserve">, because its limit does not belong to </w:t>
-      </w:r>
-      <w:proofErr w:type="gramStart"/>
-      <w:r>
-        <w:rPr>
-          <w:sz w:val="44"/>
-          <w:szCs w:val="44"/>
-          <w:lang w:bidi="fa-IR"/>
-        </w:rPr>
-        <w:t>Y</w:t>
+        <w:t>, because its limit does not belong to Y</w:t>
       </w:r>
       <w:r>
         <w:rPr>
@@ -3785,7 +3648,6 @@
         </w:rPr>
         <w:t>.</w:t>
       </w:r>
-      <w:proofErr w:type="gramEnd"/>
     </w:p>
     <w:p>
       <w:pPr>
@@ -3812,23 +3674,13 @@
           <w:lang w:bidi="fa-IR"/>
         </w:rPr>
       </w:pPr>
-      <w:proofErr w:type="gramStart"/>
-      <w:r>
-        <w:rPr>
-          <w:sz w:val="44"/>
-          <w:szCs w:val="44"/>
-          <w:lang w:bidi="fa-IR"/>
-        </w:rPr>
-        <w:t>3 :</w:t>
-      </w:r>
-      <w:proofErr w:type="gramEnd"/>
-      <w:r>
-        <w:rPr>
-          <w:sz w:val="44"/>
-          <w:szCs w:val="44"/>
-          <w:lang w:bidi="fa-IR"/>
-        </w:rPr>
-        <w:t xml:space="preserve"> </w:t>
+      <w:r>
+        <w:rPr>
+          <w:sz w:val="44"/>
+          <w:szCs w:val="44"/>
+          <w:lang w:bidi="fa-IR"/>
+        </w:rPr>
+        <w:t xml:space="preserve">3 : </w:t>
       </w:r>
     </w:p>
     <w:p>
@@ -3872,23 +3724,13 @@
           <w:lang w:bidi="fa-IR"/>
         </w:rPr>
       </w:pPr>
-      <w:proofErr w:type="gramStart"/>
-      <w:r>
-        <w:rPr>
-          <w:sz w:val="44"/>
-          <w:szCs w:val="44"/>
-          <w:lang w:bidi="fa-IR"/>
-        </w:rPr>
-        <w:t>4 :</w:t>
-      </w:r>
-      <w:proofErr w:type="gramEnd"/>
-      <w:r>
-        <w:rPr>
-          <w:sz w:val="44"/>
-          <w:szCs w:val="44"/>
-          <w:lang w:bidi="fa-IR"/>
-        </w:rPr>
-        <w:t xml:space="preserve"> </w:t>
+      <w:r>
+        <w:rPr>
+          <w:sz w:val="44"/>
+          <w:szCs w:val="44"/>
+          <w:lang w:bidi="fa-IR"/>
+        </w:rPr>
+        <w:t xml:space="preserve">4 : </w:t>
       </w:r>
     </w:p>
     <w:p>
@@ -3998,7 +3840,6 @@
         <w:t>}) in a metric space ((</w:t>
       </w:r>
       <w:proofErr w:type="spellStart"/>
-      <w:proofErr w:type="gramStart"/>
       <w:r>
         <w:rPr>
           <w:sz w:val="44"/>
@@ -4008,7 +3849,6 @@
         <w:t>X,d</w:t>
       </w:r>
       <w:proofErr w:type="spellEnd"/>
-      <w:proofErr w:type="gramEnd"/>
       <w:r>
         <w:rPr>
           <w:sz w:val="44"/>
@@ -4198,7 +4038,6 @@
         <w:t>for every (</w:t>
       </w:r>
       <w:proofErr w:type="spellStart"/>
-      <w:proofErr w:type="gramStart"/>
       <w:r>
         <w:rPr>
           <w:sz w:val="44"/>
@@ -4208,7 +4047,6 @@
         <w:t>m,n</w:t>
       </w:r>
       <w:proofErr w:type="spellEnd"/>
-      <w:proofErr w:type="gramEnd"/>
       <w:r>
         <w:rPr>
           <w:sz w:val="44"/>
@@ -4359,23 +4197,13 @@
           <w:lang w:bidi="fa-IR"/>
         </w:rPr>
       </w:pPr>
-      <w:proofErr w:type="gramStart"/>
-      <w:r>
-        <w:rPr>
-          <w:sz w:val="44"/>
-          <w:szCs w:val="44"/>
-          <w:lang w:bidi="fa-IR"/>
-        </w:rPr>
-        <w:t>5 :</w:t>
-      </w:r>
-      <w:proofErr w:type="gramEnd"/>
-      <w:r>
-        <w:rPr>
-          <w:sz w:val="44"/>
-          <w:szCs w:val="44"/>
-          <w:lang w:bidi="fa-IR"/>
-        </w:rPr>
-        <w:t xml:space="preserve"> </w:t>
+      <w:r>
+        <w:rPr>
+          <w:sz w:val="44"/>
+          <w:szCs w:val="44"/>
+          <w:lang w:bidi="fa-IR"/>
+        </w:rPr>
+        <w:t xml:space="preserve">5 : </w:t>
       </w:r>
     </w:p>
     <w:p>
@@ -4633,23 +4461,13 @@
           <w:lang w:bidi="fa-IR"/>
         </w:rPr>
       </w:pPr>
-      <w:proofErr w:type="gramStart"/>
-      <w:r>
-        <w:rPr>
-          <w:sz w:val="44"/>
-          <w:szCs w:val="44"/>
-          <w:lang w:bidi="fa-IR"/>
-        </w:rPr>
-        <w:t>6 :</w:t>
-      </w:r>
-      <w:proofErr w:type="gramEnd"/>
-      <w:r>
-        <w:rPr>
-          <w:sz w:val="44"/>
-          <w:szCs w:val="44"/>
-          <w:lang w:bidi="fa-IR"/>
-        </w:rPr>
-        <w:t xml:space="preserve"> </w:t>
+      <w:r>
+        <w:rPr>
+          <w:sz w:val="44"/>
+          <w:szCs w:val="44"/>
+          <w:lang w:bidi="fa-IR"/>
+        </w:rPr>
+        <w:t xml:space="preserve">6 : </w:t>
       </w:r>
     </w:p>
     <w:p>
@@ -5011,23 +4829,13 @@
           <w:lang w:bidi="fa-IR"/>
         </w:rPr>
       </w:pPr>
-      <w:proofErr w:type="gramStart"/>
-      <w:r>
-        <w:rPr>
-          <w:sz w:val="44"/>
-          <w:szCs w:val="44"/>
-          <w:lang w:bidi="fa-IR"/>
-        </w:rPr>
-        <w:t>7 :</w:t>
-      </w:r>
-      <w:proofErr w:type="gramEnd"/>
-      <w:r>
-        <w:rPr>
-          <w:sz w:val="44"/>
-          <w:szCs w:val="44"/>
-          <w:lang w:bidi="fa-IR"/>
-        </w:rPr>
-        <w:t xml:space="preserve"> </w:t>
+      <w:r>
+        <w:rPr>
+          <w:sz w:val="44"/>
+          <w:szCs w:val="44"/>
+          <w:lang w:bidi="fa-IR"/>
+        </w:rPr>
+        <w:t xml:space="preserve">7 : </w:t>
       </w:r>
     </w:p>
     <w:p>
@@ -5189,23 +4997,13 @@
           <w:lang w:bidi="fa-IR"/>
         </w:rPr>
       </w:pPr>
-      <w:proofErr w:type="gramStart"/>
-      <w:r>
-        <w:rPr>
-          <w:sz w:val="44"/>
-          <w:szCs w:val="44"/>
-          <w:lang w:bidi="fa-IR"/>
-        </w:rPr>
-        <w:t>1 :</w:t>
-      </w:r>
-      <w:proofErr w:type="gramEnd"/>
-      <w:r>
-        <w:rPr>
-          <w:sz w:val="44"/>
-          <w:szCs w:val="44"/>
-          <w:lang w:bidi="fa-IR"/>
-        </w:rPr>
-        <w:t xml:space="preserve"> </w:t>
+      <w:r>
+        <w:rPr>
+          <w:sz w:val="44"/>
+          <w:szCs w:val="44"/>
+          <w:lang w:bidi="fa-IR"/>
+        </w:rPr>
+        <w:t xml:space="preserve">1 : </w:t>
       </w:r>
     </w:p>
     <w:p>
@@ -5296,7 +5094,6 @@
           <w:lang w:bidi="fa-IR"/>
         </w:rPr>
       </w:pPr>
-      <w:proofErr w:type="gramStart"/>
       <w:r>
         <w:rPr>
           <w:sz w:val="44"/>
@@ -5304,16 +5101,7 @@
           <w:lang w:bidi="fa-IR"/>
         </w:rPr>
         <w:lastRenderedPageBreak/>
-        <w:t>2 :</w:t>
-      </w:r>
-      <w:proofErr w:type="gramEnd"/>
-      <w:r>
-        <w:rPr>
-          <w:sz w:val="44"/>
-          <w:szCs w:val="44"/>
-          <w:lang w:bidi="fa-IR"/>
-        </w:rPr>
-        <w:t xml:space="preserve"> </w:t>
+        <w:t xml:space="preserve">2 : </w:t>
       </w:r>
     </w:p>
     <w:p>
@@ -5489,7 +5277,6 @@
           <w:lang w:bidi="fa-IR"/>
         </w:rPr>
       </w:pPr>
-      <w:proofErr w:type="gramStart"/>
       <w:r>
         <w:rPr>
           <w:sz w:val="44"/>
@@ -5498,7 +5285,6 @@
         </w:rPr>
         <w:t>3 :</w:t>
       </w:r>
-      <w:proofErr w:type="gramEnd"/>
     </w:p>
     <w:p>
       <w:pPr>
@@ -5596,23 +5382,13 @@
           <w:lang w:bidi="fa-IR"/>
         </w:rPr>
       </w:pPr>
-      <w:proofErr w:type="gramStart"/>
-      <w:r>
-        <w:rPr>
-          <w:sz w:val="44"/>
-          <w:szCs w:val="44"/>
-          <w:lang w:bidi="fa-IR"/>
-        </w:rPr>
-        <w:t>4 :</w:t>
-      </w:r>
-      <w:proofErr w:type="gramEnd"/>
-      <w:r>
-        <w:rPr>
-          <w:sz w:val="44"/>
-          <w:szCs w:val="44"/>
-          <w:lang w:bidi="fa-IR"/>
-        </w:rPr>
-        <w:t xml:space="preserve"> </w:t>
+      <w:r>
+        <w:rPr>
+          <w:sz w:val="44"/>
+          <w:szCs w:val="44"/>
+          <w:lang w:bidi="fa-IR"/>
+        </w:rPr>
+        <w:t xml:space="preserve">4 : </w:t>
       </w:r>
     </w:p>
     <w:p>
@@ -5775,27 +5551,15 @@
           <w:lang w:bidi="fa-IR"/>
         </w:rPr>
       </w:pPr>
-      <w:proofErr w:type="gramStart"/>
-      <w:r>
-        <w:rPr>
-          <w:b/>
-          <w:bCs/>
-          <w:sz w:val="44"/>
-          <w:szCs w:val="44"/>
-          <w:lang w:bidi="fa-IR"/>
-        </w:rPr>
-        <w:t>5 :</w:t>
-      </w:r>
-      <w:proofErr w:type="gramEnd"/>
-      <w:r>
-        <w:rPr>
-          <w:b/>
-          <w:bCs/>
-          <w:sz w:val="44"/>
-          <w:szCs w:val="44"/>
-          <w:lang w:bidi="fa-IR"/>
-        </w:rPr>
-        <w:t xml:space="preserve"> </w:t>
+      <w:r>
+        <w:rPr>
+          <w:b/>
+          <w:bCs/>
+          <w:sz w:val="44"/>
+          <w:szCs w:val="44"/>
+          <w:lang w:bidi="fa-IR"/>
+        </w:rPr>
+        <w:t xml:space="preserve">5 : </w:t>
       </w:r>
     </w:p>
     <w:p>
@@ -6100,23 +5864,13 @@
           <w:lang w:bidi="fa-IR"/>
         </w:rPr>
       </w:pPr>
-      <w:proofErr w:type="gramStart"/>
-      <w:r>
-        <w:rPr>
-          <w:sz w:val="44"/>
-          <w:szCs w:val="44"/>
-          <w:lang w:bidi="fa-IR"/>
-        </w:rPr>
-        <w:t>So ,</w:t>
-      </w:r>
-      <w:proofErr w:type="gramEnd"/>
-      <w:r>
-        <w:rPr>
-          <w:sz w:val="44"/>
-          <w:szCs w:val="44"/>
-          <w:lang w:bidi="fa-IR"/>
-        </w:rPr>
-        <w:t xml:space="preserve"> </w:t>
+      <w:r>
+        <w:rPr>
+          <w:sz w:val="44"/>
+          <w:szCs w:val="44"/>
+          <w:lang w:bidi="fa-IR"/>
+        </w:rPr>
+        <w:t xml:space="preserve">So , </w:t>
       </w:r>
       <w:r>
         <w:rPr>
@@ -6153,23 +5907,13 @@
           <w:lang w:bidi="fa-IR"/>
         </w:rPr>
       </w:pPr>
-      <w:proofErr w:type="gramStart"/>
-      <w:r>
-        <w:rPr>
-          <w:sz w:val="44"/>
-          <w:szCs w:val="44"/>
-          <w:lang w:bidi="fa-IR"/>
-        </w:rPr>
-        <w:t>6 :</w:t>
-      </w:r>
-      <w:proofErr w:type="gramEnd"/>
-      <w:r>
-        <w:rPr>
-          <w:sz w:val="44"/>
-          <w:szCs w:val="44"/>
-          <w:lang w:bidi="fa-IR"/>
-        </w:rPr>
-        <w:t xml:space="preserve"> </w:t>
+      <w:r>
+        <w:rPr>
+          <w:sz w:val="44"/>
+          <w:szCs w:val="44"/>
+          <w:lang w:bidi="fa-IR"/>
+        </w:rPr>
+        <w:t xml:space="preserve">6 : </w:t>
       </w:r>
     </w:p>
     <w:p>
@@ -6351,25 +6095,7 @@
           <w:szCs w:val="44"/>
           <w:lang w:bidi="fa-IR"/>
         </w:rPr>
-        <w:t>The completion of (</w:t>
-      </w:r>
-      <w:proofErr w:type="gramStart"/>
-      <w:r>
-        <w:rPr>
-          <w:sz w:val="44"/>
-          <w:szCs w:val="44"/>
-          <w:lang w:bidi="fa-IR"/>
-        </w:rPr>
-        <w:t>C(</w:t>
-      </w:r>
-      <w:proofErr w:type="gramEnd"/>
-      <w:r>
-        <w:rPr>
-          <w:sz w:val="44"/>
-          <w:szCs w:val="44"/>
-          <w:lang w:bidi="fa-IR"/>
-        </w:rPr>
-        <w:t>[-1,1])) with respect to the (L^1) norm is the space (L^1([-1,1])).</w:t>
+        <w:t>The completion of (C([-1,1])) with respect to the (L^1) norm is the space (L^1([-1,1])).</w:t>
       </w:r>
     </w:p>
     <w:p>
@@ -6502,23 +6228,13 @@
           <w:lang w:bidi="fa-IR"/>
         </w:rPr>
       </w:pPr>
-      <w:proofErr w:type="gramStart"/>
-      <w:r>
-        <w:rPr>
-          <w:sz w:val="44"/>
-          <w:szCs w:val="44"/>
-          <w:lang w:bidi="fa-IR"/>
-        </w:rPr>
-        <w:t>7 :</w:t>
-      </w:r>
-      <w:proofErr w:type="gramEnd"/>
-      <w:r>
-        <w:rPr>
-          <w:sz w:val="44"/>
-          <w:szCs w:val="44"/>
-          <w:lang w:bidi="fa-IR"/>
-        </w:rPr>
-        <w:t xml:space="preserve"> </w:t>
+      <w:r>
+        <w:rPr>
+          <w:sz w:val="44"/>
+          <w:szCs w:val="44"/>
+          <w:lang w:bidi="fa-IR"/>
+        </w:rPr>
+        <w:t xml:space="preserve">7 : </w:t>
       </w:r>
     </w:p>
     <w:p>
@@ -6644,23 +6360,13 @@
           <w:lang w:bidi="fa-IR"/>
         </w:rPr>
       </w:pPr>
-      <w:proofErr w:type="gramStart"/>
-      <w:r>
-        <w:rPr>
-          <w:sz w:val="44"/>
-          <w:szCs w:val="44"/>
-          <w:lang w:bidi="fa-IR"/>
-        </w:rPr>
-        <w:t>1 :</w:t>
-      </w:r>
-      <w:proofErr w:type="gramEnd"/>
-      <w:r>
-        <w:rPr>
-          <w:sz w:val="44"/>
-          <w:szCs w:val="44"/>
-          <w:lang w:bidi="fa-IR"/>
-        </w:rPr>
-        <w:t xml:space="preserve"> </w:t>
+      <w:r>
+        <w:rPr>
+          <w:sz w:val="44"/>
+          <w:szCs w:val="44"/>
+          <w:lang w:bidi="fa-IR"/>
+        </w:rPr>
+        <w:t xml:space="preserve">1 : </w:t>
       </w:r>
     </w:p>
     <w:p>
@@ -6768,23 +6474,13 @@
           <w:lang w:bidi="fa-IR"/>
         </w:rPr>
       </w:pPr>
-      <w:proofErr w:type="gramStart"/>
-      <w:r>
-        <w:rPr>
-          <w:sz w:val="44"/>
-          <w:szCs w:val="44"/>
-          <w:lang w:bidi="fa-IR"/>
-        </w:rPr>
-        <w:t>2 :</w:t>
-      </w:r>
-      <w:proofErr w:type="gramEnd"/>
-      <w:r>
-        <w:rPr>
-          <w:sz w:val="44"/>
-          <w:szCs w:val="44"/>
-          <w:lang w:bidi="fa-IR"/>
-        </w:rPr>
-        <w:t xml:space="preserve"> </w:t>
+      <w:r>
+        <w:rPr>
+          <w:sz w:val="44"/>
+          <w:szCs w:val="44"/>
+          <w:lang w:bidi="fa-IR"/>
+        </w:rPr>
+        <w:t xml:space="preserve">2 : </w:t>
       </w:r>
     </w:p>
     <w:p>
@@ -6950,23 +6646,13 @@
           <w:lang w:bidi="fa-IR"/>
         </w:rPr>
       </w:pPr>
-      <w:proofErr w:type="gramStart"/>
-      <w:r>
-        <w:rPr>
-          <w:sz w:val="44"/>
-          <w:szCs w:val="44"/>
-          <w:lang w:bidi="fa-IR"/>
-        </w:rPr>
-        <w:t>4 :</w:t>
-      </w:r>
-      <w:proofErr w:type="gramEnd"/>
-      <w:r>
-        <w:rPr>
-          <w:sz w:val="44"/>
-          <w:szCs w:val="44"/>
-          <w:lang w:bidi="fa-IR"/>
-        </w:rPr>
-        <w:t xml:space="preserve"> </w:t>
+      <w:r>
+        <w:rPr>
+          <w:sz w:val="44"/>
+          <w:szCs w:val="44"/>
+          <w:lang w:bidi="fa-IR"/>
+        </w:rPr>
+        <w:t xml:space="preserve">4 : </w:t>
       </w:r>
     </w:p>
     <w:p>
@@ -7626,23 +7312,13 @@
           <w:lang w:bidi="fa-IR"/>
         </w:rPr>
       </w:pPr>
-      <w:proofErr w:type="gramStart"/>
-      <w:r>
-        <w:rPr>
-          <w:sz w:val="44"/>
-          <w:szCs w:val="44"/>
-          <w:lang w:bidi="fa-IR"/>
-        </w:rPr>
-        <w:t>5 :</w:t>
-      </w:r>
-      <w:proofErr w:type="gramEnd"/>
-      <w:r>
-        <w:rPr>
-          <w:sz w:val="44"/>
-          <w:szCs w:val="44"/>
-          <w:lang w:bidi="fa-IR"/>
-        </w:rPr>
-        <w:t xml:space="preserve"> </w:t>
+      <w:r>
+        <w:rPr>
+          <w:sz w:val="44"/>
+          <w:szCs w:val="44"/>
+          <w:lang w:bidi="fa-IR"/>
+        </w:rPr>
+        <w:t xml:space="preserve">5 : </w:t>
       </w:r>
     </w:p>
     <w:p>
@@ -7712,9 +7388,16 @@
           <w:szCs w:val="44"/>
           <w:lang w:bidi="fa-IR"/>
         </w:rPr>
-        <w:t>⟨</w:t>
-      </w:r>
-      <w:proofErr w:type="gramStart"/>
+        <w:t>⟨⋅</w:t>
+      </w:r>
+      <w:r>
+        <w:rPr>
+          <w:sz w:val="44"/>
+          <w:szCs w:val="44"/>
+          <w:lang w:bidi="fa-IR"/>
+        </w:rPr>
+        <w:t>,</w:t>
+      </w:r>
       <w:r>
         <w:rPr>
           <w:rFonts w:ascii="Cambria Math" w:hAnsi="Cambria Math" w:cs="Cambria Math"/>
@@ -7722,34 +7405,7 @@
           <w:szCs w:val="44"/>
           <w:lang w:bidi="fa-IR"/>
         </w:rPr>
-        <w:t>⋅</w:t>
-      </w:r>
-      <w:r>
-        <w:rPr>
-          <w:sz w:val="44"/>
-          <w:szCs w:val="44"/>
-          <w:lang w:bidi="fa-IR"/>
-        </w:rPr>
-        <w:t>,</w:t>
-      </w:r>
-      <w:r>
-        <w:rPr>
-          <w:rFonts w:ascii="Cambria Math" w:hAnsi="Cambria Math" w:cs="Cambria Math"/>
-          <w:sz w:val="44"/>
-          <w:szCs w:val="44"/>
-          <w:lang w:bidi="fa-IR"/>
-        </w:rPr>
-        <w:t>⋅</w:t>
-      </w:r>
-      <w:proofErr w:type="gramEnd"/>
-      <w:r>
-        <w:rPr>
-          <w:rFonts w:ascii="Cambria Math" w:hAnsi="Cambria Math" w:cs="Cambria Math"/>
-          <w:sz w:val="44"/>
-          <w:szCs w:val="44"/>
-          <w:lang w:bidi="fa-IR"/>
-        </w:rPr>
-        <w:t>⟩</w:t>
+        <w:t>⋅⟩</w:t>
       </w:r>
       <w:r>
         <w:rPr>
@@ -7960,23 +7616,13 @@
           <w:lang w:bidi="fa-IR"/>
         </w:rPr>
       </w:pPr>
-      <w:proofErr w:type="gramStart"/>
-      <w:r>
-        <w:rPr>
-          <w:sz w:val="44"/>
-          <w:szCs w:val="44"/>
-          <w:lang w:bidi="fa-IR"/>
-        </w:rPr>
-        <w:t>6 :</w:t>
-      </w:r>
-      <w:proofErr w:type="gramEnd"/>
-      <w:r>
-        <w:rPr>
-          <w:sz w:val="44"/>
-          <w:szCs w:val="44"/>
-          <w:lang w:bidi="fa-IR"/>
-        </w:rPr>
-        <w:t xml:space="preserve"> </w:t>
+      <w:r>
+        <w:rPr>
+          <w:sz w:val="44"/>
+          <w:szCs w:val="44"/>
+          <w:lang w:bidi="fa-IR"/>
+        </w:rPr>
+        <w:t xml:space="preserve">6 : </w:t>
       </w:r>
     </w:p>
     <w:p>
@@ -8306,23 +7952,13 @@
           <w:lang w:bidi="fa-IR"/>
         </w:rPr>
       </w:pPr>
-      <w:proofErr w:type="gramStart"/>
-      <w:r>
-        <w:rPr>
-          <w:sz w:val="44"/>
-          <w:szCs w:val="44"/>
-          <w:lang w:bidi="fa-IR"/>
-        </w:rPr>
-        <w:t>7 :</w:t>
-      </w:r>
-      <w:proofErr w:type="gramEnd"/>
-      <w:r>
-        <w:rPr>
-          <w:sz w:val="44"/>
-          <w:szCs w:val="44"/>
-          <w:lang w:bidi="fa-IR"/>
-        </w:rPr>
-        <w:t xml:space="preserve"> </w:t>
+      <w:r>
+        <w:rPr>
+          <w:sz w:val="44"/>
+          <w:szCs w:val="44"/>
+          <w:lang w:bidi="fa-IR"/>
+        </w:rPr>
+        <w:t xml:space="preserve">7 : </w:t>
       </w:r>
     </w:p>
     <w:p>
@@ -8485,23 +8121,13 @@
           <w:lang w:bidi="fa-IR"/>
         </w:rPr>
       </w:pPr>
-      <w:proofErr w:type="gramStart"/>
-      <w:r>
-        <w:rPr>
-          <w:sz w:val="44"/>
-          <w:szCs w:val="44"/>
-          <w:lang w:bidi="fa-IR"/>
-        </w:rPr>
-        <w:t>8 :</w:t>
-      </w:r>
-      <w:proofErr w:type="gramEnd"/>
-      <w:r>
-        <w:rPr>
-          <w:sz w:val="44"/>
-          <w:szCs w:val="44"/>
-          <w:lang w:bidi="fa-IR"/>
-        </w:rPr>
-        <w:t xml:space="preserve"> </w:t>
+      <w:r>
+        <w:rPr>
+          <w:sz w:val="44"/>
+          <w:szCs w:val="44"/>
+          <w:lang w:bidi="fa-IR"/>
+        </w:rPr>
+        <w:t xml:space="preserve">8 : </w:t>
       </w:r>
     </w:p>
     <w:p>
@@ -8636,23 +8262,13 @@
           <w:lang w:bidi="fa-IR"/>
         </w:rPr>
       </w:pPr>
-      <w:proofErr w:type="gramStart"/>
-      <w:r>
-        <w:rPr>
-          <w:sz w:val="44"/>
-          <w:szCs w:val="44"/>
-          <w:lang w:bidi="fa-IR"/>
-        </w:rPr>
-        <w:t>9 :</w:t>
-      </w:r>
-      <w:proofErr w:type="gramEnd"/>
-      <w:r>
-        <w:rPr>
-          <w:sz w:val="44"/>
-          <w:szCs w:val="44"/>
-          <w:lang w:bidi="fa-IR"/>
-        </w:rPr>
-        <w:t xml:space="preserve"> </w:t>
+      <w:r>
+        <w:rPr>
+          <w:sz w:val="44"/>
+          <w:szCs w:val="44"/>
+          <w:lang w:bidi="fa-IR"/>
+        </w:rPr>
+        <w:t xml:space="preserve">9 : </w:t>
       </w:r>
     </w:p>
     <w:p>
@@ -8750,23 +8366,13 @@
           <w:lang w:bidi="fa-IR"/>
         </w:rPr>
       </w:pPr>
-      <w:proofErr w:type="gramStart"/>
-      <w:r>
-        <w:rPr>
-          <w:sz w:val="44"/>
-          <w:szCs w:val="44"/>
-          <w:lang w:bidi="fa-IR"/>
-        </w:rPr>
-        <w:t>1 :</w:t>
-      </w:r>
-      <w:proofErr w:type="gramEnd"/>
-      <w:r>
-        <w:rPr>
-          <w:sz w:val="44"/>
-          <w:szCs w:val="44"/>
-          <w:lang w:bidi="fa-IR"/>
-        </w:rPr>
-        <w:t xml:space="preserve"> </w:t>
+      <w:r>
+        <w:rPr>
+          <w:sz w:val="44"/>
+          <w:szCs w:val="44"/>
+          <w:lang w:bidi="fa-IR"/>
+        </w:rPr>
+        <w:t xml:space="preserve">1 : </w:t>
       </w:r>
     </w:p>
     <w:p>
@@ -8834,23 +8440,13 @@
           <w:lang w:bidi="fa-IR"/>
         </w:rPr>
       </w:pPr>
-      <w:proofErr w:type="gramStart"/>
-      <w:r>
-        <w:rPr>
-          <w:sz w:val="44"/>
-          <w:szCs w:val="44"/>
-          <w:lang w:bidi="fa-IR"/>
-        </w:rPr>
-        <w:t>2 :</w:t>
-      </w:r>
-      <w:proofErr w:type="gramEnd"/>
-      <w:r>
-        <w:rPr>
-          <w:sz w:val="44"/>
-          <w:szCs w:val="44"/>
-          <w:lang w:bidi="fa-IR"/>
-        </w:rPr>
-        <w:t xml:space="preserve"> </w:t>
+      <w:r>
+        <w:rPr>
+          <w:sz w:val="44"/>
+          <w:szCs w:val="44"/>
+          <w:lang w:bidi="fa-IR"/>
+        </w:rPr>
+        <w:t xml:space="preserve">2 : </w:t>
       </w:r>
     </w:p>
     <w:p>
@@ -9017,23 +8613,13 @@
           <w:lang w:bidi="fa-IR"/>
         </w:rPr>
       </w:pPr>
-      <w:proofErr w:type="gramStart"/>
-      <w:r>
-        <w:rPr>
-          <w:sz w:val="44"/>
-          <w:szCs w:val="44"/>
-          <w:lang w:bidi="fa-IR"/>
-        </w:rPr>
-        <w:t>3 :</w:t>
-      </w:r>
-      <w:proofErr w:type="gramEnd"/>
-      <w:r>
-        <w:rPr>
-          <w:sz w:val="44"/>
-          <w:szCs w:val="44"/>
-          <w:lang w:bidi="fa-IR"/>
-        </w:rPr>
-        <w:t xml:space="preserve"> </w:t>
+      <w:r>
+        <w:rPr>
+          <w:sz w:val="44"/>
+          <w:szCs w:val="44"/>
+          <w:lang w:bidi="fa-IR"/>
+        </w:rPr>
+        <w:t xml:space="preserve">3 : </w:t>
       </w:r>
     </w:p>
     <w:p>
@@ -9167,23 +8753,13 @@
           <w:lang w:bidi="fa-IR"/>
         </w:rPr>
       </w:pPr>
-      <w:proofErr w:type="gramStart"/>
-      <w:r>
-        <w:rPr>
-          <w:sz w:val="44"/>
-          <w:szCs w:val="44"/>
-          <w:lang w:bidi="fa-IR"/>
-        </w:rPr>
-        <w:t>4 :</w:t>
-      </w:r>
-      <w:proofErr w:type="gramEnd"/>
-      <w:r>
-        <w:rPr>
-          <w:sz w:val="44"/>
-          <w:szCs w:val="44"/>
-          <w:lang w:bidi="fa-IR"/>
-        </w:rPr>
-        <w:t xml:space="preserve"> </w:t>
+      <w:r>
+        <w:rPr>
+          <w:sz w:val="44"/>
+          <w:szCs w:val="44"/>
+          <w:lang w:bidi="fa-IR"/>
+        </w:rPr>
+        <w:t xml:space="preserve">4 : </w:t>
       </w:r>
     </w:p>
     <w:p>
@@ -9644,23 +9220,13 @@
           <w:lang w:bidi="fa-IR"/>
         </w:rPr>
       </w:pPr>
-      <w:proofErr w:type="gramStart"/>
-      <w:r>
-        <w:rPr>
-          <w:sz w:val="44"/>
-          <w:szCs w:val="44"/>
-          <w:lang w:bidi="fa-IR"/>
-        </w:rPr>
-        <w:t>5 :</w:t>
-      </w:r>
-      <w:proofErr w:type="gramEnd"/>
-      <w:r>
-        <w:rPr>
-          <w:sz w:val="44"/>
-          <w:szCs w:val="44"/>
-          <w:lang w:bidi="fa-IR"/>
-        </w:rPr>
-        <w:t xml:space="preserve"> </w:t>
+      <w:r>
+        <w:rPr>
+          <w:sz w:val="44"/>
+          <w:szCs w:val="44"/>
+          <w:lang w:bidi="fa-IR"/>
+        </w:rPr>
+        <w:t xml:space="preserve">5 : </w:t>
       </w:r>
     </w:p>
     <w:p>
@@ -9749,23 +9315,13 @@
           <w:lang w:bidi="fa-IR"/>
         </w:rPr>
       </w:pPr>
-      <w:proofErr w:type="gramStart"/>
-      <w:r>
-        <w:rPr>
-          <w:sz w:val="44"/>
-          <w:szCs w:val="44"/>
-          <w:lang w:bidi="fa-IR"/>
-        </w:rPr>
-        <w:t>6 :</w:t>
-      </w:r>
-      <w:proofErr w:type="gramEnd"/>
-      <w:r>
-        <w:rPr>
-          <w:sz w:val="44"/>
-          <w:szCs w:val="44"/>
-          <w:lang w:bidi="fa-IR"/>
-        </w:rPr>
-        <w:t xml:space="preserve"> </w:t>
+      <w:r>
+        <w:rPr>
+          <w:sz w:val="44"/>
+          <w:szCs w:val="44"/>
+          <w:lang w:bidi="fa-IR"/>
+        </w:rPr>
+        <w:t xml:space="preserve">6 : </w:t>
       </w:r>
     </w:p>
     <w:p>
@@ -9861,23 +9417,13 @@
           <w:lang w:bidi="fa-IR"/>
         </w:rPr>
       </w:pPr>
-      <w:proofErr w:type="gramStart"/>
-      <w:r>
-        <w:rPr>
-          <w:sz w:val="44"/>
-          <w:szCs w:val="44"/>
-          <w:lang w:bidi="fa-IR"/>
-        </w:rPr>
-        <w:t>1 :</w:t>
-      </w:r>
-      <w:proofErr w:type="gramEnd"/>
-      <w:r>
-        <w:rPr>
-          <w:sz w:val="44"/>
-          <w:szCs w:val="44"/>
-          <w:lang w:bidi="fa-IR"/>
-        </w:rPr>
-        <w:t xml:space="preserve"> </w:t>
+      <w:r>
+        <w:rPr>
+          <w:sz w:val="44"/>
+          <w:szCs w:val="44"/>
+          <w:lang w:bidi="fa-IR"/>
+        </w:rPr>
+        <w:t xml:space="preserve">1 : </w:t>
       </w:r>
     </w:p>
     <w:p>
@@ -9927,23 +9473,13 @@
           <w:lang w:bidi="fa-IR"/>
         </w:rPr>
       </w:pPr>
-      <w:proofErr w:type="gramStart"/>
-      <w:r>
-        <w:rPr>
-          <w:sz w:val="44"/>
-          <w:szCs w:val="44"/>
-          <w:lang w:bidi="fa-IR"/>
-        </w:rPr>
-        <w:t>2 :</w:t>
-      </w:r>
-      <w:proofErr w:type="gramEnd"/>
-      <w:r>
-        <w:rPr>
-          <w:sz w:val="44"/>
-          <w:szCs w:val="44"/>
-          <w:lang w:bidi="fa-IR"/>
-        </w:rPr>
-        <w:t xml:space="preserve"> </w:t>
+      <w:r>
+        <w:rPr>
+          <w:sz w:val="44"/>
+          <w:szCs w:val="44"/>
+          <w:lang w:bidi="fa-IR"/>
+        </w:rPr>
+        <w:t xml:space="preserve">2 : </w:t>
       </w:r>
     </w:p>
     <w:p>
@@ -10120,23 +9656,13 @@
           <w:lang w:bidi="fa-IR"/>
         </w:rPr>
       </w:pPr>
-      <w:proofErr w:type="gramStart"/>
-      <w:r>
-        <w:rPr>
-          <w:sz w:val="44"/>
-          <w:szCs w:val="44"/>
-          <w:lang w:bidi="fa-IR"/>
-        </w:rPr>
-        <w:t>3 :</w:t>
-      </w:r>
-      <w:proofErr w:type="gramEnd"/>
-      <w:r>
-        <w:rPr>
-          <w:sz w:val="44"/>
-          <w:szCs w:val="44"/>
-          <w:lang w:bidi="fa-IR"/>
-        </w:rPr>
-        <w:t xml:space="preserve"> </w:t>
+      <w:r>
+        <w:rPr>
+          <w:sz w:val="44"/>
+          <w:szCs w:val="44"/>
+          <w:lang w:bidi="fa-IR"/>
+        </w:rPr>
+        <w:t xml:space="preserve">3 : </w:t>
       </w:r>
     </w:p>
     <w:p>
@@ -10439,23 +9965,13 @@
           <w:lang w:bidi="fa-IR"/>
         </w:rPr>
       </w:pPr>
-      <w:proofErr w:type="gramStart"/>
-      <w:r>
-        <w:rPr>
-          <w:sz w:val="44"/>
-          <w:szCs w:val="44"/>
-          <w:lang w:bidi="fa-IR"/>
-        </w:rPr>
-        <w:t>4 :</w:t>
-      </w:r>
-      <w:proofErr w:type="gramEnd"/>
-      <w:r>
-        <w:rPr>
-          <w:sz w:val="44"/>
-          <w:szCs w:val="44"/>
-          <w:lang w:bidi="fa-IR"/>
-        </w:rPr>
-        <w:t xml:space="preserve"> </w:t>
+      <w:r>
+        <w:rPr>
+          <w:sz w:val="44"/>
+          <w:szCs w:val="44"/>
+          <w:lang w:bidi="fa-IR"/>
+        </w:rPr>
+        <w:t xml:space="preserve">4 : </w:t>
       </w:r>
     </w:p>
     <w:p>
@@ -10611,7 +10127,6 @@
         <w:t>Although (C[</w:t>
       </w:r>
       <w:proofErr w:type="spellStart"/>
-      <w:proofErr w:type="gramStart"/>
       <w:r>
         <w:rPr>
           <w:sz w:val="44"/>
@@ -10621,7 +10136,6 @@
         <w:t>a,b</w:t>
       </w:r>
       <w:proofErr w:type="spellEnd"/>
-      <w:proofErr w:type="gramEnd"/>
       <w:r>
         <w:rPr>
           <w:sz w:val="44"/>
@@ -10730,7 +10244,6 @@
         <w:t>Therefore, (C[</w:t>
       </w:r>
       <w:proofErr w:type="spellStart"/>
-      <w:proofErr w:type="gramStart"/>
       <w:r>
         <w:rPr>
           <w:sz w:val="44"/>
@@ -10740,7 +10253,6 @@
         <w:t>a,b</w:t>
       </w:r>
       <w:proofErr w:type="spellEnd"/>
-      <w:proofErr w:type="gramEnd"/>
       <w:r>
         <w:rPr>
           <w:sz w:val="44"/>
@@ -10998,23 +10510,13 @@
           <w:lang w:bidi="fa-IR"/>
         </w:rPr>
       </w:pPr>
-      <w:proofErr w:type="gramStart"/>
-      <w:r>
-        <w:rPr>
-          <w:sz w:val="44"/>
-          <w:szCs w:val="44"/>
-          <w:lang w:bidi="fa-IR"/>
-        </w:rPr>
-        <w:t>5 :</w:t>
-      </w:r>
-      <w:proofErr w:type="gramEnd"/>
-      <w:r>
-        <w:rPr>
-          <w:sz w:val="44"/>
-          <w:szCs w:val="44"/>
-          <w:lang w:bidi="fa-IR"/>
-        </w:rPr>
-        <w:t xml:space="preserve"> </w:t>
+      <w:r>
+        <w:rPr>
+          <w:sz w:val="44"/>
+          <w:szCs w:val="44"/>
+          <w:lang w:bidi="fa-IR"/>
+        </w:rPr>
+        <w:t xml:space="preserve">5 : </w:t>
       </w:r>
     </w:p>
     <w:p>
@@ -11139,23 +10641,13 @@
           <w:lang w:bidi="fa-IR"/>
         </w:rPr>
       </w:pPr>
-      <w:proofErr w:type="gramStart"/>
-      <w:r>
-        <w:rPr>
-          <w:sz w:val="44"/>
-          <w:szCs w:val="44"/>
-          <w:lang w:bidi="fa-IR"/>
-        </w:rPr>
-        <w:t>1 :</w:t>
-      </w:r>
-      <w:proofErr w:type="gramEnd"/>
-      <w:r>
-        <w:rPr>
-          <w:sz w:val="44"/>
-          <w:szCs w:val="44"/>
-          <w:lang w:bidi="fa-IR"/>
-        </w:rPr>
-        <w:t xml:space="preserve"> </w:t>
+      <w:r>
+        <w:rPr>
+          <w:sz w:val="44"/>
+          <w:szCs w:val="44"/>
+          <w:lang w:bidi="fa-IR"/>
+        </w:rPr>
+        <w:t xml:space="preserve">1 : </w:t>
       </w:r>
     </w:p>
     <w:p>
@@ -11184,23 +10676,13 @@
           <w:lang w:bidi="fa-IR"/>
         </w:rPr>
       </w:pPr>
-      <w:proofErr w:type="gramStart"/>
-      <w:r>
-        <w:rPr>
-          <w:sz w:val="44"/>
-          <w:szCs w:val="44"/>
-          <w:lang w:bidi="fa-IR"/>
-        </w:rPr>
-        <w:t>2 :</w:t>
-      </w:r>
-      <w:proofErr w:type="gramEnd"/>
-      <w:r>
-        <w:rPr>
-          <w:sz w:val="44"/>
-          <w:szCs w:val="44"/>
-          <w:lang w:bidi="fa-IR"/>
-        </w:rPr>
-        <w:t xml:space="preserve"> </w:t>
+      <w:r>
+        <w:rPr>
+          <w:sz w:val="44"/>
+          <w:szCs w:val="44"/>
+          <w:lang w:bidi="fa-IR"/>
+        </w:rPr>
+        <w:t xml:space="preserve">2 : </w:t>
       </w:r>
     </w:p>
     <w:p>
@@ -11300,23 +10782,13 @@
           <w:lang w:bidi="fa-IR"/>
         </w:rPr>
       </w:pPr>
-      <w:proofErr w:type="gramStart"/>
-      <w:r>
-        <w:rPr>
-          <w:sz w:val="44"/>
-          <w:szCs w:val="44"/>
-          <w:lang w:bidi="fa-IR"/>
-        </w:rPr>
-        <w:t>3 :</w:t>
-      </w:r>
-      <w:proofErr w:type="gramEnd"/>
-      <w:r>
-        <w:rPr>
-          <w:sz w:val="44"/>
-          <w:szCs w:val="44"/>
-          <w:lang w:bidi="fa-IR"/>
-        </w:rPr>
-        <w:t xml:space="preserve"> </w:t>
+      <w:r>
+        <w:rPr>
+          <w:sz w:val="44"/>
+          <w:szCs w:val="44"/>
+          <w:lang w:bidi="fa-IR"/>
+        </w:rPr>
+        <w:t xml:space="preserve">3 : </w:t>
       </w:r>
     </w:p>
     <w:p>
@@ -11466,23 +10938,13 @@
           <w:lang w:bidi="fa-IR"/>
         </w:rPr>
       </w:pPr>
-      <w:proofErr w:type="gramStart"/>
-      <w:r>
-        <w:rPr>
-          <w:sz w:val="44"/>
-          <w:szCs w:val="44"/>
-          <w:lang w:bidi="fa-IR"/>
-        </w:rPr>
-        <w:t>4 :</w:t>
-      </w:r>
-      <w:proofErr w:type="gramEnd"/>
-      <w:r>
-        <w:rPr>
-          <w:sz w:val="44"/>
-          <w:szCs w:val="44"/>
-          <w:lang w:bidi="fa-IR"/>
-        </w:rPr>
-        <w:t xml:space="preserve"> </w:t>
+      <w:r>
+        <w:rPr>
+          <w:sz w:val="44"/>
+          <w:szCs w:val="44"/>
+          <w:lang w:bidi="fa-IR"/>
+        </w:rPr>
+        <w:t xml:space="preserve">4 : </w:t>
       </w:r>
     </w:p>
     <w:p>
@@ -11555,23 +11017,13 @@
           <w:lang w:bidi="fa-IR"/>
         </w:rPr>
       </w:pPr>
-      <w:proofErr w:type="gramStart"/>
-      <w:r>
-        <w:rPr>
-          <w:sz w:val="44"/>
-          <w:szCs w:val="44"/>
-          <w:lang w:bidi="fa-IR"/>
-        </w:rPr>
-        <w:t>5 :</w:t>
-      </w:r>
-      <w:proofErr w:type="gramEnd"/>
-      <w:r>
-        <w:rPr>
-          <w:sz w:val="44"/>
-          <w:szCs w:val="44"/>
-          <w:lang w:bidi="fa-IR"/>
-        </w:rPr>
-        <w:t xml:space="preserve"> </w:t>
+      <w:r>
+        <w:rPr>
+          <w:sz w:val="44"/>
+          <w:szCs w:val="44"/>
+          <w:lang w:bidi="fa-IR"/>
+        </w:rPr>
+        <w:t xml:space="preserve">5 : </w:t>
       </w:r>
     </w:p>
     <w:p>
@@ -11599,23 +11051,13 @@
           <w:lang w:bidi="fa-IR"/>
         </w:rPr>
       </w:pPr>
-      <w:proofErr w:type="gramStart"/>
-      <w:r>
-        <w:rPr>
-          <w:sz w:val="44"/>
-          <w:szCs w:val="44"/>
-          <w:lang w:bidi="fa-IR"/>
-        </w:rPr>
-        <w:t>6 :</w:t>
-      </w:r>
-      <w:proofErr w:type="gramEnd"/>
-      <w:r>
-        <w:rPr>
-          <w:sz w:val="44"/>
-          <w:szCs w:val="44"/>
-          <w:lang w:bidi="fa-IR"/>
-        </w:rPr>
-        <w:t xml:space="preserve"> </w:t>
+      <w:r>
+        <w:rPr>
+          <w:sz w:val="44"/>
+          <w:szCs w:val="44"/>
+          <w:lang w:bidi="fa-IR"/>
+        </w:rPr>
+        <w:t xml:space="preserve">6 : </w:t>
       </w:r>
     </w:p>
     <w:p>
@@ -11685,25 +11127,7 @@
           <w:szCs w:val="44"/>
           <w:lang w:bidi="fa-IR"/>
         </w:rPr>
-        <w:t xml:space="preserve">. If two vectors are orthogonal, then multiplying both of them by the same scalar </w:t>
-      </w:r>
-      <w:proofErr w:type="gramStart"/>
-      <w:r>
-        <w:rPr>
-          <w:sz w:val="44"/>
-          <w:szCs w:val="44"/>
-          <w:lang w:bidi="fa-IR"/>
-        </w:rPr>
-        <w:t>preserves</w:t>
-      </w:r>
-      <w:proofErr w:type="gramEnd"/>
-      <w:r>
-        <w:rPr>
-          <w:sz w:val="44"/>
-          <w:szCs w:val="44"/>
-          <w:lang w:bidi="fa-IR"/>
-        </w:rPr>
-        <w:t xml:space="preserve"> orthogonality.</w:t>
+        <w:t>. If two vectors are orthogonal, then multiplying both of them by the same scalar preserves orthogonality.</w:t>
       </w:r>
     </w:p>
     <w:p>
@@ -11970,23 +11394,13 @@
           <w:lang w:bidi="fa-IR"/>
         </w:rPr>
       </w:pPr>
-      <w:proofErr w:type="gramStart"/>
-      <w:r>
-        <w:rPr>
-          <w:sz w:val="44"/>
-          <w:szCs w:val="44"/>
-          <w:lang w:bidi="fa-IR"/>
-        </w:rPr>
-        <w:t>7 :</w:t>
-      </w:r>
-      <w:proofErr w:type="gramEnd"/>
-      <w:r>
-        <w:rPr>
-          <w:sz w:val="44"/>
-          <w:szCs w:val="44"/>
-          <w:lang w:bidi="fa-IR"/>
-        </w:rPr>
-        <w:t xml:space="preserve"> </w:t>
+      <w:r>
+        <w:rPr>
+          <w:sz w:val="44"/>
+          <w:szCs w:val="44"/>
+          <w:lang w:bidi="fa-IR"/>
+        </w:rPr>
+        <w:t xml:space="preserve">7 : </w:t>
       </w:r>
     </w:p>
     <w:p>
@@ -12032,23 +11446,13 @@
           <w:lang w:bidi="fa-IR"/>
         </w:rPr>
       </w:pPr>
-      <w:proofErr w:type="gramStart"/>
-      <w:r>
-        <w:rPr>
-          <w:sz w:val="44"/>
-          <w:szCs w:val="44"/>
-          <w:lang w:bidi="fa-IR"/>
-        </w:rPr>
-        <w:t>8 :</w:t>
-      </w:r>
-      <w:proofErr w:type="gramEnd"/>
-      <w:r>
-        <w:rPr>
-          <w:sz w:val="44"/>
-          <w:szCs w:val="44"/>
-          <w:lang w:bidi="fa-IR"/>
-        </w:rPr>
-        <w:t xml:space="preserve"> </w:t>
+      <w:r>
+        <w:rPr>
+          <w:sz w:val="44"/>
+          <w:szCs w:val="44"/>
+          <w:lang w:bidi="fa-IR"/>
+        </w:rPr>
+        <w:t xml:space="preserve">8 : </w:t>
       </w:r>
     </w:p>
     <w:p>
@@ -12112,23 +11516,13 @@
           <w:lang w:bidi="fa-IR"/>
         </w:rPr>
       </w:pPr>
-      <w:proofErr w:type="gramStart"/>
-      <w:r>
-        <w:rPr>
-          <w:sz w:val="44"/>
-          <w:szCs w:val="44"/>
-          <w:lang w:bidi="fa-IR"/>
-        </w:rPr>
-        <w:t>1 :</w:t>
-      </w:r>
-      <w:proofErr w:type="gramEnd"/>
-      <w:r>
-        <w:rPr>
-          <w:sz w:val="44"/>
-          <w:szCs w:val="44"/>
-          <w:lang w:bidi="fa-IR"/>
-        </w:rPr>
-        <w:t xml:space="preserve"> </w:t>
+      <w:r>
+        <w:rPr>
+          <w:sz w:val="44"/>
+          <w:szCs w:val="44"/>
+          <w:lang w:bidi="fa-IR"/>
+        </w:rPr>
+        <w:t xml:space="preserve">1 : </w:t>
       </w:r>
     </w:p>
     <w:p>
@@ -12332,41 +11726,13 @@
           <w:lang w:bidi="fa-IR"/>
         </w:rPr>
       </w:pPr>
-      <w:proofErr w:type="gramStart"/>
-      <w:r>
-        <w:rPr>
-          <w:sz w:val="44"/>
-          <w:szCs w:val="44"/>
-          <w:lang w:bidi="fa-IR"/>
-        </w:rPr>
-        <w:t>2 :</w:t>
-      </w:r>
-      <w:proofErr w:type="gramEnd"/>
-      <w:r>
-        <w:rPr>
-          <w:sz w:val="44"/>
-          <w:szCs w:val="44"/>
-          <w:lang w:bidi="fa-IR"/>
-        </w:rPr>
-        <w:t xml:space="preserve"> </w:t>
-      </w:r>
-      <w:proofErr w:type="gramStart"/>
-      <w:r>
-        <w:rPr>
-          <w:sz w:val="44"/>
-          <w:szCs w:val="44"/>
-          <w:lang w:bidi="fa-IR"/>
-        </w:rPr>
-        <w:t>Roberts</w:t>
-      </w:r>
-      <w:proofErr w:type="gramEnd"/>
-      <w:r>
-        <w:rPr>
-          <w:sz w:val="44"/>
-          <w:szCs w:val="44"/>
-          <w:lang w:bidi="fa-IR"/>
-        </w:rPr>
-        <w:t xml:space="preserve"> orthogonality</w:t>
+      <w:r>
+        <w:rPr>
+          <w:sz w:val="44"/>
+          <w:szCs w:val="44"/>
+          <w:lang w:bidi="fa-IR"/>
+        </w:rPr>
+        <w:t>2 : Roberts orthogonality</w:t>
       </w:r>
     </w:p>
     <w:p>
@@ -12586,17 +11952,7 @@
           <w:szCs w:val="44"/>
           <w:lang w:bidi="fa-IR"/>
         </w:rPr>
-        <w:t>"The norm of x+</w:t>
-      </w:r>
-      <w:r>
-        <w:rPr>
-          <w:b/>
-          <w:bCs/>
-          <w:sz w:val="44"/>
-          <w:szCs w:val="44"/>
-          <w:lang w:bidi="fa-IR"/>
-        </w:rPr>
-        <w:t xml:space="preserve"> </w:t>
+        <w:t xml:space="preserve">"The norm of x+ </w:t>
       </w:r>
       <w:proofErr w:type="spellStart"/>
       <w:r>
@@ -12877,25 +12233,7 @@
           <w:szCs w:val="44"/>
           <w:lang w:bidi="fa-IR"/>
         </w:rPr>
-        <w:t xml:space="preserve"> This is exactly the geometric intuition behind </w:t>
-      </w:r>
-      <w:proofErr w:type="gramStart"/>
-      <w:r>
-        <w:rPr>
-          <w:sz w:val="44"/>
-          <w:szCs w:val="44"/>
-          <w:lang w:bidi="fa-IR"/>
-        </w:rPr>
-        <w:t>Roberts</w:t>
-      </w:r>
-      <w:proofErr w:type="gramEnd"/>
-      <w:r>
-        <w:rPr>
-          <w:sz w:val="44"/>
-          <w:szCs w:val="44"/>
-          <w:lang w:bidi="fa-IR"/>
-        </w:rPr>
-        <w:t xml:space="preserve"> orthogonality.</w:t>
+        <w:t xml:space="preserve"> This is exactly the geometric intuition behind Roberts orthogonality.</w:t>
       </w:r>
     </w:p>
     <w:p>
@@ -13114,27 +12452,15 @@
         </w:rPr>
         <w:t xml:space="preserve">Now, we claim that </w:t>
       </w:r>
-      <w:proofErr w:type="gramStart"/>
-      <w:r>
-        <w:rPr>
-          <w:b/>
-          <w:bCs/>
-          <w:sz w:val="44"/>
-          <w:szCs w:val="44"/>
-          <w:lang w:bidi="fa-IR"/>
-        </w:rPr>
-        <w:t>Roberts</w:t>
-      </w:r>
-      <w:proofErr w:type="gramEnd"/>
-      <w:r>
-        <w:rPr>
-          <w:b/>
-          <w:bCs/>
-          <w:sz w:val="44"/>
-          <w:szCs w:val="44"/>
-          <w:lang w:bidi="fa-IR"/>
-        </w:rPr>
-        <w:t xml:space="preserve"> orthogonality satisfies the symmetry property</w:t>
+      <w:r>
+        <w:rPr>
+          <w:b/>
+          <w:bCs/>
+          <w:sz w:val="44"/>
+          <w:szCs w:val="44"/>
+          <w:lang w:bidi="fa-IR"/>
+        </w:rPr>
+        <w:t>Roberts orthogonality satisfies the symmetry property</w:t>
       </w:r>
       <w:r>
         <w:rPr>
@@ -13257,27 +12583,15 @@
         </w:rPr>
         <w:t xml:space="preserve">Next, we will show that </w:t>
       </w:r>
-      <w:proofErr w:type="gramStart"/>
-      <w:r>
-        <w:rPr>
-          <w:b/>
-          <w:bCs/>
-          <w:sz w:val="44"/>
-          <w:szCs w:val="44"/>
-          <w:lang w:bidi="fa-IR"/>
-        </w:rPr>
-        <w:t>Roberts</w:t>
-      </w:r>
-      <w:proofErr w:type="gramEnd"/>
-      <w:r>
-        <w:rPr>
-          <w:b/>
-          <w:bCs/>
-          <w:sz w:val="44"/>
-          <w:szCs w:val="44"/>
-          <w:lang w:bidi="fa-IR"/>
-        </w:rPr>
-        <w:t xml:space="preserve"> orthogonality satisfies the homogeneity property</w:t>
+      <w:r>
+        <w:rPr>
+          <w:b/>
+          <w:bCs/>
+          <w:sz w:val="44"/>
+          <w:szCs w:val="44"/>
+          <w:lang w:bidi="fa-IR"/>
+        </w:rPr>
+        <w:t>Roberts orthogonality satisfies the homogeneity property</w:t>
       </w:r>
       <w:r>
         <w:rPr>
@@ -13339,27 +12653,15 @@
         </w:rPr>
         <w:t xml:space="preserve">Therefore, </w:t>
       </w:r>
-      <w:proofErr w:type="gramStart"/>
-      <w:r>
-        <w:rPr>
-          <w:b/>
-          <w:bCs/>
-          <w:sz w:val="44"/>
-          <w:szCs w:val="44"/>
-          <w:lang w:bidi="fa-IR"/>
-        </w:rPr>
-        <w:t>Roberts</w:t>
-      </w:r>
-      <w:proofErr w:type="gramEnd"/>
-      <w:r>
-        <w:rPr>
-          <w:b/>
-          <w:bCs/>
-          <w:sz w:val="44"/>
-          <w:szCs w:val="44"/>
-          <w:lang w:bidi="fa-IR"/>
-        </w:rPr>
-        <w:t xml:space="preserve"> orthogonality is homogeneous.</w:t>
+      <w:r>
+        <w:rPr>
+          <w:b/>
+          <w:bCs/>
+          <w:sz w:val="44"/>
+          <w:szCs w:val="44"/>
+          <w:lang w:bidi="fa-IR"/>
+        </w:rPr>
+        <w:t>Roberts orthogonality is homogeneous.</w:t>
       </w:r>
     </w:p>
     <w:p>
@@ -13429,25 +12731,7 @@
           <w:szCs w:val="44"/>
           <w:lang w:bidi="fa-IR"/>
         </w:rPr>
-        <w:t xml:space="preserve"> hold for </w:t>
-      </w:r>
-      <w:proofErr w:type="gramStart"/>
-      <w:r>
-        <w:rPr>
-          <w:sz w:val="44"/>
-          <w:szCs w:val="44"/>
-          <w:lang w:bidi="fa-IR"/>
-        </w:rPr>
-        <w:t>Roberts</w:t>
-      </w:r>
-      <w:proofErr w:type="gramEnd"/>
-      <w:r>
-        <w:rPr>
-          <w:sz w:val="44"/>
-          <w:szCs w:val="44"/>
-          <w:lang w:bidi="fa-IR"/>
-        </w:rPr>
-        <w:t xml:space="preserve"> orthogonality.</w:t>
+        <w:t xml:space="preserve"> hold for Roberts orthogonality.</w:t>
       </w:r>
     </w:p>
     <w:p>
@@ -13568,25 +12852,7 @@
           <w:szCs w:val="44"/>
           <w:lang w:bidi="fa-IR"/>
         </w:rPr>
-        <w:t xml:space="preserve">Therefore, the additivity property does not hold for </w:t>
-      </w:r>
-      <w:proofErr w:type="gramStart"/>
-      <w:r>
-        <w:rPr>
-          <w:sz w:val="44"/>
-          <w:szCs w:val="44"/>
-          <w:lang w:bidi="fa-IR"/>
-        </w:rPr>
-        <w:t>Roberts</w:t>
-      </w:r>
-      <w:proofErr w:type="gramEnd"/>
-      <w:r>
-        <w:rPr>
-          <w:sz w:val="44"/>
-          <w:szCs w:val="44"/>
-          <w:lang w:bidi="fa-IR"/>
-        </w:rPr>
-        <w:t xml:space="preserve"> orthogonality.</w:t>
+        <w:t>Therefore, the additivity property does not hold for Roberts orthogonality.</w:t>
       </w:r>
     </w:p>
     <w:p>
@@ -13666,25 +12932,7 @@
           <w:szCs w:val="44"/>
           <w:lang w:bidi="fa-IR"/>
         </w:rPr>
-        <w:t xml:space="preserve"> hold for </w:t>
-      </w:r>
-      <w:proofErr w:type="gramStart"/>
-      <w:r>
-        <w:rPr>
-          <w:sz w:val="44"/>
-          <w:szCs w:val="44"/>
-          <w:lang w:bidi="fa-IR"/>
-        </w:rPr>
-        <w:t>Roberts</w:t>
-      </w:r>
-      <w:proofErr w:type="gramEnd"/>
-      <w:r>
-        <w:rPr>
-          <w:sz w:val="44"/>
-          <w:szCs w:val="44"/>
-          <w:lang w:bidi="fa-IR"/>
-        </w:rPr>
-        <w:t xml:space="preserve"> orthogonality.</w:t>
+        <w:t xml:space="preserve"> hold for Roberts orthogonality.</w:t>
       </w:r>
     </w:p>
     <w:p>
@@ -13788,25 +13036,7 @@
           <w:szCs w:val="44"/>
           <w:lang w:bidi="fa-IR"/>
         </w:rPr>
-        <w:t xml:space="preserve">As you can see, </w:t>
-      </w:r>
-      <w:proofErr w:type="gramStart"/>
-      <w:r>
-        <w:rPr>
-          <w:sz w:val="44"/>
-          <w:szCs w:val="44"/>
-          <w:lang w:bidi="fa-IR"/>
-        </w:rPr>
-        <w:t>this forces (a)</w:t>
-      </w:r>
-      <w:proofErr w:type="gramEnd"/>
-      <w:r>
-        <w:rPr>
-          <w:sz w:val="44"/>
-          <w:szCs w:val="44"/>
-          <w:lang w:bidi="fa-IR"/>
-        </w:rPr>
-        <w:t xml:space="preserve"> to be equal to zero.</w:t>
+        <w:t>As you can see, this forces (a) to be equal to zero.</w:t>
       </w:r>
     </w:p>
     <w:p>
@@ -13840,25 +13070,7 @@
           <w:szCs w:val="44"/>
           <w:lang w:bidi="fa-IR"/>
         </w:rPr>
-        <w:t xml:space="preserve">Therefore, the scalar existence property does not hold for </w:t>
-      </w:r>
-      <w:proofErr w:type="gramStart"/>
-      <w:r>
-        <w:rPr>
-          <w:sz w:val="44"/>
-          <w:szCs w:val="44"/>
-          <w:lang w:bidi="fa-IR"/>
-        </w:rPr>
-        <w:t>Roberts</w:t>
-      </w:r>
-      <w:proofErr w:type="gramEnd"/>
-      <w:r>
-        <w:rPr>
-          <w:sz w:val="44"/>
-          <w:szCs w:val="44"/>
-          <w:lang w:bidi="fa-IR"/>
-        </w:rPr>
-        <w:t xml:space="preserve"> orthogonality.</w:t>
+        <w:t>Therefore, the scalar existence property does not hold for Roberts orthogonality.</w:t>
       </w:r>
     </w:p>
     <w:p>
@@ -13912,27 +13124,15 @@
         <w:lastRenderedPageBreak/>
         <w:t xml:space="preserve">As you can see, </w:t>
       </w:r>
-      <w:proofErr w:type="gramStart"/>
-      <w:r>
-        <w:rPr>
-          <w:b/>
-          <w:bCs/>
-          <w:sz w:val="44"/>
-          <w:szCs w:val="44"/>
-          <w:lang w:bidi="fa-IR"/>
-        </w:rPr>
-        <w:t>Roberts</w:t>
-      </w:r>
-      <w:proofErr w:type="gramEnd"/>
-      <w:r>
-        <w:rPr>
-          <w:b/>
-          <w:bCs/>
-          <w:sz w:val="44"/>
-          <w:szCs w:val="44"/>
-          <w:lang w:bidi="fa-IR"/>
-        </w:rPr>
-        <w:t xml:space="preserve"> orthogonality</w:t>
+      <w:r>
+        <w:rPr>
+          <w:b/>
+          <w:bCs/>
+          <w:sz w:val="44"/>
+          <w:szCs w:val="44"/>
+          <w:lang w:bidi="fa-IR"/>
+        </w:rPr>
+        <w:t>Roberts orthogonality</w:t>
       </w:r>
       <w:r>
         <w:rPr>
@@ -14100,27 +13300,15 @@
         </w:rPr>
         <w:t xml:space="preserve">As we have seen, </w:t>
       </w:r>
-      <w:proofErr w:type="gramStart"/>
-      <w:r>
-        <w:rPr>
-          <w:b/>
-          <w:bCs/>
-          <w:sz w:val="44"/>
-          <w:szCs w:val="44"/>
-          <w:lang w:bidi="fa-IR"/>
-        </w:rPr>
-        <w:t>Roberts</w:t>
-      </w:r>
-      <w:proofErr w:type="gramEnd"/>
-      <w:r>
-        <w:rPr>
-          <w:b/>
-          <w:bCs/>
-          <w:sz w:val="44"/>
-          <w:szCs w:val="44"/>
-          <w:lang w:bidi="fa-IR"/>
-        </w:rPr>
-        <w:t xml:space="preserve"> orthogonality does not satisfy the additivity property</w:t>
+      <w:r>
+        <w:rPr>
+          <w:b/>
+          <w:bCs/>
+          <w:sz w:val="44"/>
+          <w:szCs w:val="44"/>
+          <w:lang w:bidi="fa-IR"/>
+        </w:rPr>
+        <w:t>Roberts orthogonality does not satisfy the additivity property</w:t>
       </w:r>
       <w:r>
         <w:rPr>
@@ -14205,29 +13393,7 @@
           <w:szCs w:val="44"/>
           <w:lang w:bidi="fa-IR"/>
         </w:rPr>
-        <w:t xml:space="preserve">inner product space if and only if </w:t>
-      </w:r>
-      <w:proofErr w:type="gramStart"/>
-      <w:r>
-        <w:rPr>
-          <w:b/>
-          <w:bCs/>
-          <w:sz w:val="44"/>
-          <w:szCs w:val="44"/>
-          <w:lang w:bidi="fa-IR"/>
-        </w:rPr>
-        <w:t>Roberts</w:t>
-      </w:r>
-      <w:proofErr w:type="gramEnd"/>
-      <w:r>
-        <w:rPr>
-          <w:b/>
-          <w:bCs/>
-          <w:sz w:val="44"/>
-          <w:szCs w:val="44"/>
-          <w:lang w:bidi="fa-IR"/>
-        </w:rPr>
-        <w:t xml:space="preserve"> orthogonality is additive with respect to the second variable</w:t>
+        <w:t>inner product space if and only if Roberts orthogonality is additive with respect to the second variable</w:t>
       </w:r>
       <w:r>
         <w:rPr>
@@ -14270,25 +13436,7 @@
           <w:szCs w:val="44"/>
           <w:lang w:bidi="fa-IR"/>
         </w:rPr>
-        <w:t xml:space="preserve"> </w:t>
-      </w:r>
-      <w:proofErr w:type="gramStart"/>
-      <w:r>
-        <w:rPr>
-          <w:sz w:val="44"/>
-          <w:szCs w:val="44"/>
-          <w:lang w:bidi="fa-IR"/>
-        </w:rPr>
-        <w:t>Roberts</w:t>
-      </w:r>
-      <w:proofErr w:type="gramEnd"/>
-      <w:r>
-        <w:rPr>
-          <w:sz w:val="44"/>
-          <w:szCs w:val="44"/>
-          <w:lang w:bidi="fa-IR"/>
-        </w:rPr>
-        <w:t xml:space="preserve"> orthogonality happens to be </w:t>
+        <w:t xml:space="preserve"> Roberts orthogonality happens to be </w:t>
       </w:r>
       <w:r>
         <w:rPr>
@@ -14348,25 +13496,7 @@
           <w:szCs w:val="44"/>
           <w:lang w:bidi="fa-IR"/>
         </w:rPr>
-        <w:t xml:space="preserve">Suppose we want to determine whether </w:t>
-      </w:r>
-      <w:proofErr w:type="gramStart"/>
-      <w:r>
-        <w:rPr>
-          <w:sz w:val="44"/>
-          <w:szCs w:val="44"/>
-          <w:lang w:bidi="fa-IR"/>
-        </w:rPr>
-        <w:t>Roberts</w:t>
-      </w:r>
-      <w:proofErr w:type="gramEnd"/>
-      <w:r>
-        <w:rPr>
-          <w:sz w:val="44"/>
-          <w:szCs w:val="44"/>
-          <w:lang w:bidi="fa-IR"/>
-        </w:rPr>
-        <w:t xml:space="preserve"> orthogonality exists between these two vectors.</w:t>
+        <w:t>Suppose we want to determine whether Roberts orthogonality exists between these two vectors.</w:t>
       </w:r>
     </w:p>
     <w:p>
@@ -14664,23 +13794,13 @@
         </w:rPr>
         <w:t xml:space="preserve"> </w:t>
       </w:r>
-      <w:proofErr w:type="gramStart"/>
-      <w:r>
-        <w:rPr>
-          <w:sz w:val="44"/>
-          <w:szCs w:val="44"/>
-          <w:lang w:bidi="fa-IR"/>
-        </w:rPr>
-        <w:t>Roberts</w:t>
-      </w:r>
-      <w:proofErr w:type="gramEnd"/>
-      <w:r>
-        <w:rPr>
-          <w:sz w:val="44"/>
-          <w:szCs w:val="44"/>
-          <w:lang w:bidi="fa-IR"/>
-        </w:rPr>
-        <w:t xml:space="preserve"> orthogonality is not just a simple relation between two vectors (x) and (y); it imposes a strong </w:t>
+      <w:r>
+        <w:rPr>
+          <w:sz w:val="44"/>
+          <w:szCs w:val="44"/>
+          <w:lang w:bidi="fa-IR"/>
+        </w:rPr>
+        <w:t xml:space="preserve">Roberts orthogonality is not just a simple relation between two vectors (x) and (y); it imposes a strong </w:t>
       </w:r>
       <w:r>
         <w:rPr>
@@ -14767,25 +13887,7 @@
           <w:szCs w:val="44"/>
           <w:lang w:bidi="fa-IR"/>
         </w:rPr>
-        <w:t xml:space="preserve">In other words, </w:t>
-      </w:r>
-      <w:proofErr w:type="gramStart"/>
-      <w:r>
-        <w:rPr>
-          <w:sz w:val="44"/>
-          <w:szCs w:val="44"/>
-          <w:lang w:bidi="fa-IR"/>
-        </w:rPr>
-        <w:t>Roberts</w:t>
-      </w:r>
-      <w:proofErr w:type="gramEnd"/>
-      <w:r>
-        <w:rPr>
-          <w:sz w:val="44"/>
-          <w:szCs w:val="44"/>
-          <w:lang w:bidi="fa-IR"/>
-        </w:rPr>
-        <w:t xml:space="preserve"> orthogonality forces a perfect reflectional symmetry, similar to Euclidean geometry, onto a possibly distorted non-Euclidean space.</w:t>
+        <w:t>In other words, Roberts orthogonality forces a perfect reflectional symmetry, similar to Euclidean geometry, onto a possibly distorted non-Euclidean space.</w:t>
       </w:r>
     </w:p>
     <w:p>
@@ -14822,27 +13924,15 @@
         <w:lastRenderedPageBreak/>
         <w:t xml:space="preserve">In this video, we explored </w:t>
       </w:r>
-      <w:proofErr w:type="gramStart"/>
-      <w:r>
-        <w:rPr>
-          <w:b/>
-          <w:bCs/>
-          <w:sz w:val="44"/>
-          <w:szCs w:val="44"/>
-          <w:lang w:bidi="fa-IR"/>
-        </w:rPr>
-        <w:t>Roberts</w:t>
-      </w:r>
-      <w:proofErr w:type="gramEnd"/>
-      <w:r>
-        <w:rPr>
-          <w:b/>
-          <w:bCs/>
-          <w:sz w:val="44"/>
-          <w:szCs w:val="44"/>
-          <w:lang w:bidi="fa-IR"/>
-        </w:rPr>
-        <w:t xml:space="preserve"> orthogonality</w:t>
+      <w:r>
+        <w:rPr>
+          <w:b/>
+          <w:bCs/>
+          <w:sz w:val="44"/>
+          <w:szCs w:val="44"/>
+          <w:lang w:bidi="fa-IR"/>
+        </w:rPr>
+        <w:t>Roberts orthogonality</w:t>
       </w:r>
       <w:r>
         <w:rPr>
@@ -14877,82 +13967,32 @@
           <w:szCs w:val="44"/>
           <w:lang w:bidi="fa-IR"/>
         </w:rPr>
-        <w:t>Birkhoff–</w:t>
-      </w:r>
-      <w:proofErr w:type="gramStart"/>
-      <w:r>
-        <w:rPr>
-          <w:b/>
-          <w:bCs/>
-          <w:sz w:val="44"/>
-          <w:szCs w:val="44"/>
-          <w:lang w:bidi="fa-IR"/>
-        </w:rPr>
-        <w:t>James</w:t>
-      </w:r>
-      <w:proofErr w:type="gramEnd"/>
-      <w:r>
-        <w:rPr>
-          <w:b/>
-          <w:bCs/>
-          <w:sz w:val="44"/>
-          <w:szCs w:val="44"/>
-          <w:lang w:bidi="fa-IR"/>
-        </w:rPr>
-        <w:t xml:space="preserve"> orthogonality</w:t>
-      </w:r>
-      <w:r>
-        <w:rPr>
-          <w:sz w:val="44"/>
-          <w:szCs w:val="44"/>
-          <w:lang w:bidi="fa-IR"/>
-        </w:rPr>
-        <w:t xml:space="preserve"> and see how it differs from </w:t>
-      </w:r>
-      <w:proofErr w:type="gramStart"/>
-      <w:r>
-        <w:rPr>
-          <w:sz w:val="44"/>
-          <w:szCs w:val="44"/>
-          <w:lang w:bidi="fa-IR"/>
-        </w:rPr>
-        <w:t>Roberts</w:t>
-      </w:r>
-      <w:proofErr w:type="gramEnd"/>
-      <w:r>
-        <w:rPr>
-          <w:sz w:val="44"/>
-          <w:szCs w:val="44"/>
-          <w:lang w:bidi="fa-IR"/>
-        </w:rPr>
-        <w:t xml:space="preserve"> orthogonality.</w:t>
-      </w:r>
-    </w:p>
-    <w:p>
-      <w:pPr>
-        <w:rPr>
-          <w:sz w:val="44"/>
-          <w:szCs w:val="44"/>
-          <w:lang w:bidi="fa-IR"/>
-        </w:rPr>
-      </w:pPr>
-      <w:proofErr w:type="gramStart"/>
-      <w:r>
-        <w:rPr>
-          <w:sz w:val="44"/>
-          <w:szCs w:val="44"/>
-          <w:lang w:bidi="fa-IR"/>
-        </w:rPr>
-        <w:t>3 :</w:t>
-      </w:r>
-      <w:proofErr w:type="gramEnd"/>
-      <w:r>
-        <w:rPr>
-          <w:sz w:val="44"/>
-          <w:szCs w:val="44"/>
-          <w:lang w:bidi="fa-IR"/>
-        </w:rPr>
-        <w:t xml:space="preserve"> BJ orthogonality</w:t>
+        <w:t>Birkhoff–James orthogonality</w:t>
+      </w:r>
+      <w:r>
+        <w:rPr>
+          <w:sz w:val="44"/>
+          <w:szCs w:val="44"/>
+          <w:lang w:bidi="fa-IR"/>
+        </w:rPr>
+        <w:t xml:space="preserve"> and see how it differs from Roberts orthogonality.</w:t>
+      </w:r>
+    </w:p>
+    <w:p>
+      <w:pPr>
+        <w:rPr>
+          <w:sz w:val="44"/>
+          <w:szCs w:val="44"/>
+          <w:lang w:bidi="fa-IR"/>
+        </w:rPr>
+      </w:pPr>
+      <w:r>
+        <w:rPr>
+          <w:sz w:val="44"/>
+          <w:szCs w:val="44"/>
+          <w:lang w:bidi="fa-IR"/>
+        </w:rPr>
+        <w:t>3 : BJ orthogonality</w:t>
       </w:r>
     </w:p>
     <w:p>
@@ -14970,6 +14010,1378 @@
           <w:lang w:bidi="fa-IR"/>
         </w:rPr>
         <w:t>3-1:</w:t>
+      </w:r>
+    </w:p>
+    <w:p>
+      <w:pPr>
+        <w:rPr>
+          <w:sz w:val="44"/>
+          <w:szCs w:val="44"/>
+          <w:lang w:bidi="fa-IR"/>
+        </w:rPr>
+      </w:pPr>
+      <w:r>
+        <w:rPr>
+          <w:sz w:val="44"/>
+          <w:szCs w:val="44"/>
+          <w:lang w:bidi="fa-IR"/>
+        </w:rPr>
+        <w:t xml:space="preserve">In this video, we're going to talk about </w:t>
+      </w:r>
+      <w:r>
+        <w:rPr>
+          <w:b/>
+          <w:bCs/>
+          <w:sz w:val="44"/>
+          <w:szCs w:val="44"/>
+          <w:lang w:bidi="fa-IR"/>
+        </w:rPr>
+        <w:t>Birkhoff–James orthogonality</w:t>
+      </w:r>
+      <w:r>
+        <w:rPr>
+          <w:sz w:val="44"/>
+          <w:szCs w:val="44"/>
+          <w:lang w:bidi="fa-IR"/>
+        </w:rPr>
+        <w:t>.</w:t>
+      </w:r>
+    </w:p>
+    <w:p>
+      <w:pPr>
+        <w:rPr>
+          <w:sz w:val="44"/>
+          <w:szCs w:val="44"/>
+          <w:lang w:bidi="fa-IR"/>
+        </w:rPr>
+      </w:pPr>
+      <w:r>
+        <w:rPr>
+          <w:sz w:val="44"/>
+          <w:szCs w:val="44"/>
+          <w:lang w:bidi="fa-IR"/>
+        </w:rPr>
+        <w:t xml:space="preserve">This notion of orthogonality was first introduced by </w:t>
+      </w:r>
+      <w:r>
+        <w:rPr>
+          <w:b/>
+          <w:bCs/>
+          <w:sz w:val="44"/>
+          <w:szCs w:val="44"/>
+          <w:lang w:bidi="fa-IR"/>
+        </w:rPr>
+        <w:t>George David Birkhoff</w:t>
+      </w:r>
+      <w:r>
+        <w:rPr>
+          <w:sz w:val="44"/>
+          <w:szCs w:val="44"/>
+          <w:lang w:bidi="fa-IR"/>
+        </w:rPr>
+        <w:t xml:space="preserve"> in </w:t>
+      </w:r>
+      <w:r>
+        <w:rPr>
+          <w:b/>
+          <w:bCs/>
+          <w:sz w:val="44"/>
+          <w:szCs w:val="44"/>
+          <w:lang w:bidi="fa-IR"/>
+        </w:rPr>
+        <w:t>1935</w:t>
+      </w:r>
+      <w:r>
+        <w:rPr>
+          <w:sz w:val="44"/>
+          <w:szCs w:val="44"/>
+          <w:lang w:bidi="fa-IR"/>
+        </w:rPr>
+        <w:t xml:space="preserve">. Later, </w:t>
+      </w:r>
+      <w:r>
+        <w:rPr>
+          <w:b/>
+          <w:bCs/>
+          <w:sz w:val="44"/>
+          <w:szCs w:val="44"/>
+          <w:lang w:bidi="fa-IR"/>
+        </w:rPr>
+        <w:t>Robert C. James</w:t>
+      </w:r>
+      <w:r>
+        <w:rPr>
+          <w:sz w:val="44"/>
+          <w:szCs w:val="44"/>
+          <w:lang w:bidi="fa-IR"/>
+        </w:rPr>
+        <w:t xml:space="preserve"> extended the concept and established several deeper and more powerful results about it.</w:t>
+      </w:r>
+    </w:p>
+    <w:p>
+      <w:pPr>
+        <w:rPr>
+          <w:sz w:val="44"/>
+          <w:szCs w:val="44"/>
+          <w:lang w:bidi="fa-IR"/>
+        </w:rPr>
+      </w:pPr>
+      <w:r>
+        <w:rPr>
+          <w:sz w:val="44"/>
+          <w:szCs w:val="44"/>
+          <w:lang w:bidi="fa-IR"/>
+        </w:rPr>
+        <w:t>That's why this type of orthogonality is named after both of them.</w:t>
+      </w:r>
+    </w:p>
+    <w:p>
+      <w:pPr>
+        <w:rPr>
+          <w:sz w:val="44"/>
+          <w:szCs w:val="44"/>
+          <w:lang w:bidi="fa-IR"/>
+        </w:rPr>
+      </w:pPr>
+      <w:r>
+        <w:rPr>
+          <w:sz w:val="44"/>
+          <w:szCs w:val="44"/>
+          <w:lang w:bidi="fa-IR"/>
+        </w:rPr>
+        <w:t xml:space="preserve">On the screen, you can see a picture of </w:t>
+      </w:r>
+      <w:r>
+        <w:rPr>
+          <w:b/>
+          <w:bCs/>
+          <w:sz w:val="44"/>
+          <w:szCs w:val="44"/>
+          <w:lang w:bidi="fa-IR"/>
+        </w:rPr>
+        <w:t>George David Birkhoff</w:t>
+      </w:r>
+      <w:r>
+        <w:rPr>
+          <w:sz w:val="44"/>
+          <w:szCs w:val="44"/>
+          <w:lang w:bidi="fa-IR"/>
+        </w:rPr>
+        <w:t xml:space="preserve">. Unfortunately, I couldn't find a reliable photograph of </w:t>
+      </w:r>
+      <w:r>
+        <w:rPr>
+          <w:b/>
+          <w:bCs/>
+          <w:sz w:val="44"/>
+          <w:szCs w:val="44"/>
+          <w:lang w:bidi="fa-IR"/>
+        </w:rPr>
+        <w:t>Robert C. James</w:t>
+      </w:r>
+      <w:r>
+        <w:rPr>
+          <w:sz w:val="44"/>
+          <w:szCs w:val="44"/>
+          <w:lang w:bidi="fa-IR"/>
+        </w:rPr>
+        <w:t>.</w:t>
+      </w:r>
+    </w:p>
+    <w:p>
+      <w:pPr>
+        <w:rPr>
+          <w:sz w:val="44"/>
+          <w:szCs w:val="44"/>
+          <w:lang w:bidi="fa-IR"/>
+        </w:rPr>
+      </w:pPr>
+      <w:r>
+        <w:rPr>
+          <w:sz w:val="44"/>
+          <w:szCs w:val="44"/>
+          <w:lang w:bidi="fa-IR"/>
+        </w:rPr>
+        <w:lastRenderedPageBreak/>
+        <w:t>3-2:</w:t>
+      </w:r>
+    </w:p>
+    <w:p>
+      <w:pPr>
+        <w:rPr>
+          <w:sz w:val="44"/>
+          <w:szCs w:val="44"/>
+          <w:lang w:bidi="fa-IR"/>
+        </w:rPr>
+      </w:pPr>
+      <w:r>
+        <w:rPr>
+          <w:sz w:val="44"/>
+          <w:szCs w:val="44"/>
+          <w:lang w:bidi="fa-IR"/>
+        </w:rPr>
+        <w:t xml:space="preserve"> </w:t>
+      </w:r>
+      <w:r>
+        <w:rPr>
+          <w:sz w:val="44"/>
+          <w:szCs w:val="44"/>
+          <w:lang w:bidi="fa-IR"/>
+        </w:rPr>
+        <w:t>Let's begin with the mathematical definition.</w:t>
+      </w:r>
+    </w:p>
+    <w:p>
+      <w:pPr>
+        <w:rPr>
+          <w:sz w:val="44"/>
+          <w:szCs w:val="44"/>
+          <w:lang w:bidi="fa-IR"/>
+        </w:rPr>
+      </w:pPr>
+      <w:r>
+        <w:rPr>
+          <w:sz w:val="44"/>
+          <w:szCs w:val="44"/>
+          <w:lang w:bidi="fa-IR"/>
+        </w:rPr>
+        <w:t xml:space="preserve">Let (x) and (y) be two elements of a normed space (X). We say that (x) is </w:t>
+      </w:r>
+      <w:r>
+        <w:rPr>
+          <w:b/>
+          <w:bCs/>
+          <w:sz w:val="44"/>
+          <w:szCs w:val="44"/>
+          <w:lang w:bidi="fa-IR"/>
+        </w:rPr>
+        <w:t>orthogonal to (y) in the sense of Birkhoff–James</w:t>
+      </w:r>
+      <w:r>
+        <w:rPr>
+          <w:sz w:val="44"/>
+          <w:szCs w:val="44"/>
+          <w:lang w:bidi="fa-IR"/>
+        </w:rPr>
+        <w:t xml:space="preserve"> if and only if</w:t>
+      </w:r>
+    </w:p>
+    <w:p>
+      <w:pPr>
+        <w:rPr>
+          <w:sz w:val="44"/>
+          <w:szCs w:val="44"/>
+          <w:lang w:bidi="fa-IR"/>
+        </w:rPr>
+      </w:pPr>
+      <w:r>
+        <w:rPr>
+          <w:sz w:val="44"/>
+          <w:szCs w:val="44"/>
+          <w:lang w:bidi="fa-IR"/>
+        </w:rPr>
+        <w:t>[</w:t>
+      </w:r>
+      <w:r>
+        <w:rPr>
+          <w:sz w:val="44"/>
+          <w:szCs w:val="44"/>
+          <w:lang w:bidi="fa-IR"/>
+        </w:rPr>
+        <w:br/>
+      </w:r>
+      <w:r>
+        <w:rPr>
+          <w:sz w:val="44"/>
+          <w:szCs w:val="44"/>
+          <w:lang w:bidi="fa-IR"/>
+        </w:rPr>
+        <w:t>The norm of x is less than or equal to the norm of x plus lambda y, for every real number lambda</w:t>
+      </w:r>
+      <w:r>
+        <w:rPr>
+          <w:sz w:val="44"/>
+          <w:szCs w:val="44"/>
+          <w:lang w:bidi="fa-IR"/>
+        </w:rPr>
+        <w:br/>
+        <w:t>]</w:t>
+      </w:r>
+    </w:p>
+    <w:p>
+      <w:pPr>
+        <w:rPr>
+          <w:sz w:val="44"/>
+          <w:szCs w:val="44"/>
+          <w:lang w:bidi="fa-IR"/>
+        </w:rPr>
+      </w:pPr>
+      <w:r>
+        <w:rPr>
+          <w:sz w:val="44"/>
+          <w:szCs w:val="44"/>
+          <w:lang w:bidi="fa-IR"/>
+        </w:rPr>
+        <w:t>We denote this relationship by</w:t>
+      </w:r>
+    </w:p>
+    <w:p>
+      <w:pPr>
+        <w:rPr>
+          <w:b/>
+          <w:bCs/>
+          <w:sz w:val="44"/>
+          <w:szCs w:val="44"/>
+          <w:rtl/>
+          <w:lang w:bidi="fa-IR"/>
+        </w:rPr>
+      </w:pPr>
+      <w:r>
+        <w:rPr>
+          <w:sz w:val="44"/>
+          <w:szCs w:val="44"/>
+          <w:lang w:bidi="fa-IR"/>
+        </w:rPr>
+        <w:t>[</w:t>
+      </w:r>
+      <w:r>
+        <w:rPr>
+          <w:sz w:val="44"/>
+          <w:szCs w:val="44"/>
+          <w:lang w:bidi="fa-IR"/>
+        </w:rPr>
+        <w:br/>
+        <w:t xml:space="preserve">(x) is </w:t>
+      </w:r>
+      <w:r>
+        <w:rPr>
+          <w:b/>
+          <w:bCs/>
+          <w:sz w:val="44"/>
+          <w:szCs w:val="44"/>
+          <w:lang w:bidi="fa-IR"/>
+        </w:rPr>
+        <w:t>orthogonal to (y) in the sense of Birkhoff–James</w:t>
+      </w:r>
+    </w:p>
+    <w:p>
+      <w:pPr>
+        <w:rPr>
+          <w:sz w:val="44"/>
+          <w:szCs w:val="44"/>
+          <w:lang w:bidi="fa-IR"/>
+        </w:rPr>
+      </w:pPr>
+      <w:r>
+        <w:rPr>
+          <w:sz w:val="44"/>
+          <w:szCs w:val="44"/>
+          <w:lang w:bidi="fa-IR"/>
+        </w:rPr>
+        <w:t>]</w:t>
+      </w:r>
+    </w:p>
+    <w:p>
+      <w:pPr>
+        <w:rPr>
+          <w:sz w:val="44"/>
+          <w:szCs w:val="44"/>
+          <w:lang w:bidi="fa-IR"/>
+        </w:rPr>
+      </w:pPr>
+      <w:r>
+        <w:rPr>
+          <w:sz w:val="44"/>
+          <w:szCs w:val="44"/>
+          <w:lang w:bidi="fa-IR"/>
+        </w:rPr>
+        <w:t>In other words, no matter which real number (\lambda) we choose, adding (\lambda y) to (x) can never decrease the norm of (x). The norm of (x) is already the smallest among all vectors of the form (x + \lambda y).</w:t>
+      </w:r>
+    </w:p>
+    <w:p>
+      <w:pPr>
+        <w:rPr>
+          <w:sz w:val="44"/>
+          <w:szCs w:val="44"/>
+          <w:lang w:bidi="fa-IR"/>
+        </w:rPr>
+      </w:pPr>
+      <w:r>
+        <w:rPr>
+          <w:rFonts w:hint="cs"/>
+          <w:sz w:val="44"/>
+          <w:szCs w:val="44"/>
+          <w:rtl/>
+          <w:lang w:bidi="fa-IR"/>
+        </w:rPr>
+        <w:lastRenderedPageBreak/>
+        <w:t xml:space="preserve"> </w:t>
+      </w:r>
+      <w:r>
+        <w:rPr>
+          <w:sz w:val="44"/>
+          <w:szCs w:val="44"/>
+          <w:lang w:bidi="fa-IR"/>
+        </w:rPr>
+        <w:t>3-3:</w:t>
+      </w:r>
+    </w:p>
+    <w:p>
+      <w:pPr>
+        <w:rPr>
+          <w:sz w:val="44"/>
+          <w:szCs w:val="44"/>
+          <w:lang w:bidi="fa-IR"/>
+        </w:rPr>
+      </w:pPr>
+      <w:r>
+        <w:rPr>
+          <w:sz w:val="44"/>
+          <w:szCs w:val="44"/>
+          <w:lang w:bidi="fa-IR"/>
+        </w:rPr>
+        <w:t>To build some intuition, let's visualize this in two dimensions.</w:t>
+      </w:r>
+    </w:p>
+    <w:p>
+      <w:pPr>
+        <w:rPr>
+          <w:sz w:val="44"/>
+          <w:szCs w:val="44"/>
+          <w:lang w:bidi="fa-IR"/>
+        </w:rPr>
+      </w:pPr>
+      <w:r>
+        <w:rPr>
+          <w:sz w:val="44"/>
+          <w:szCs w:val="44"/>
+          <w:lang w:bidi="fa-IR"/>
+        </w:rPr>
+        <w:t>Suppose we have the vector (x). We draw a circle centered at the origin with radius equal to the norm of (x).</w:t>
+      </w:r>
+    </w:p>
+    <w:p>
+      <w:pPr>
+        <w:rPr>
+          <w:sz w:val="44"/>
+          <w:szCs w:val="44"/>
+          <w:lang w:bidi="fa-IR"/>
+        </w:rPr>
+      </w:pPr>
+      <w:r>
+        <w:rPr>
+          <w:sz w:val="44"/>
+          <w:szCs w:val="44"/>
+          <w:lang w:bidi="fa-IR"/>
+        </w:rPr>
+        <w:t xml:space="preserve">Now, choose a vector (y) that is orthogonal to (x) in the </w:t>
+      </w:r>
+      <w:r>
+        <w:rPr>
+          <w:b/>
+          <w:bCs/>
+          <w:sz w:val="44"/>
+          <w:szCs w:val="44"/>
+          <w:lang w:bidi="fa-IR"/>
+        </w:rPr>
+        <w:t>Birkhoff–James</w:t>
+      </w:r>
+      <w:r>
+        <w:rPr>
+          <w:sz w:val="44"/>
+          <w:szCs w:val="44"/>
+          <w:lang w:bidi="fa-IR"/>
+        </w:rPr>
+        <w:t xml:space="preserve"> sense.</w:t>
+      </w:r>
+    </w:p>
+    <w:p>
+      <w:pPr>
+        <w:rPr>
+          <w:sz w:val="44"/>
+          <w:szCs w:val="44"/>
+          <w:lang w:bidi="fa-IR"/>
+        </w:rPr>
+      </w:pPr>
+      <w:r>
+        <w:rPr>
+          <w:sz w:val="44"/>
+          <w:szCs w:val="44"/>
+          <w:lang w:bidi="fa-IR"/>
+        </w:rPr>
+        <w:t>Next, consider the vector (x + \lambda y), where (\lambda) can be any real number.</w:t>
+      </w:r>
+    </w:p>
+    <w:p>
+      <w:pPr>
+        <w:rPr>
+          <w:sz w:val="44"/>
+          <w:szCs w:val="44"/>
+          <w:lang w:bidi="fa-IR"/>
+        </w:rPr>
+      </w:pPr>
+      <w:r>
+        <w:rPr>
+          <w:sz w:val="44"/>
+          <w:szCs w:val="44"/>
+          <w:lang w:bidi="fa-IR"/>
+        </w:rPr>
+        <w:t>As you can see, no matter what value of (\lambda) we choose, the length of (x + \lambda y) is always greater than or equal to the length of (x).</w:t>
+      </w:r>
+    </w:p>
+    <w:p>
+      <w:pPr>
+        <w:rPr>
+          <w:sz w:val="44"/>
+          <w:szCs w:val="44"/>
+          <w:lang w:bidi="fa-IR"/>
+        </w:rPr>
+      </w:pPr>
+      <w:r>
+        <w:rPr>
+          <w:sz w:val="44"/>
+          <w:szCs w:val="44"/>
+          <w:lang w:bidi="fa-IR"/>
+        </w:rPr>
+        <w:t>In other words, moving from (x) in the direction of (y) never takes us inside the circle. The vector (x) already has the minimum norm along the entire line (x + \lambda y).</w:t>
+      </w:r>
+    </w:p>
+    <w:p>
+      <w:pPr>
+        <w:rPr>
+          <w:sz w:val="44"/>
+          <w:szCs w:val="44"/>
+          <w:lang w:bidi="fa-IR"/>
+        </w:rPr>
+      </w:pPr>
+      <w:r>
+        <w:rPr>
+          <w:sz w:val="44"/>
+          <w:szCs w:val="44"/>
+          <w:lang w:bidi="fa-IR"/>
+        </w:rPr>
+        <w:t>3-4:</w:t>
+      </w:r>
+    </w:p>
+    <w:p>
+      <w:pPr>
+        <w:rPr>
+          <w:sz w:val="44"/>
+          <w:szCs w:val="44"/>
+          <w:lang w:bidi="fa-IR"/>
+        </w:rPr>
+      </w:pPr>
+      <w:r>
+        <w:rPr>
+          <w:sz w:val="44"/>
+          <w:szCs w:val="44"/>
+          <w:lang w:bidi="fa-IR"/>
+        </w:rPr>
+        <w:lastRenderedPageBreak/>
+        <w:t xml:space="preserve">Now, let's show that </w:t>
+      </w:r>
+      <w:r>
+        <w:rPr>
+          <w:b/>
+          <w:bCs/>
+          <w:sz w:val="44"/>
+          <w:szCs w:val="44"/>
+          <w:lang w:bidi="fa-IR"/>
+        </w:rPr>
+        <w:t>Birkhoff–James orthogonality is not symmetric</w:t>
+      </w:r>
+      <w:r>
+        <w:rPr>
+          <w:sz w:val="44"/>
+          <w:szCs w:val="44"/>
+          <w:lang w:bidi="fa-IR"/>
+        </w:rPr>
+        <w:t xml:space="preserve"> by using a counterexample.</w:t>
+      </w:r>
+    </w:p>
+    <w:p>
+      <w:pPr>
+        <w:rPr>
+          <w:sz w:val="44"/>
+          <w:szCs w:val="44"/>
+          <w:lang w:bidi="fa-IR"/>
+        </w:rPr>
+      </w:pPr>
+      <w:r>
+        <w:rPr>
+          <w:sz w:val="44"/>
+          <w:szCs w:val="44"/>
+          <w:lang w:bidi="fa-IR"/>
+        </w:rPr>
+        <w:t>We'll work in the space (\</w:t>
+      </w:r>
+      <w:proofErr w:type="spellStart"/>
+      <w:r>
+        <w:rPr>
+          <w:sz w:val="44"/>
+          <w:szCs w:val="44"/>
+          <w:lang w:bidi="fa-IR"/>
+        </w:rPr>
+        <w:t>mathbb</w:t>
+      </w:r>
+      <w:proofErr w:type="spellEnd"/>
+      <w:r>
+        <w:rPr>
+          <w:sz w:val="44"/>
+          <w:szCs w:val="44"/>
+          <w:lang w:bidi="fa-IR"/>
+        </w:rPr>
+        <w:t>{R}^2) equipped with the (\ell_1) norm.</w:t>
+      </w:r>
+    </w:p>
+    <w:p>
+      <w:pPr>
+        <w:rPr>
+          <w:sz w:val="44"/>
+          <w:szCs w:val="44"/>
+          <w:lang w:bidi="fa-IR"/>
+        </w:rPr>
+      </w:pPr>
+      <w:r>
+        <w:rPr>
+          <w:sz w:val="44"/>
+          <w:szCs w:val="44"/>
+          <w:lang w:bidi="fa-IR"/>
+        </w:rPr>
+        <w:t>Consider the following two vectors.</w:t>
+      </w:r>
+    </w:p>
+    <w:p>
+      <w:pPr>
+        <w:rPr>
+          <w:sz w:val="44"/>
+          <w:szCs w:val="44"/>
+          <w:lang w:bidi="fa-IR"/>
+        </w:rPr>
+      </w:pPr>
+      <w:r>
+        <w:rPr>
+          <w:sz w:val="44"/>
+          <w:szCs w:val="44"/>
+          <w:lang w:bidi="fa-IR"/>
+        </w:rPr>
+        <w:t>As you can see, (x) is Birkhoff–James orthogonal to (y), that is,</w:t>
+      </w:r>
+    </w:p>
+    <w:p>
+      <w:pPr>
+        <w:rPr>
+          <w:sz w:val="44"/>
+          <w:szCs w:val="44"/>
+          <w:lang w:bidi="fa-IR"/>
+        </w:rPr>
+      </w:pPr>
+      <w:r>
+        <w:rPr>
+          <w:sz w:val="44"/>
+          <w:szCs w:val="44"/>
+          <w:lang w:bidi="fa-IR"/>
+        </w:rPr>
+        <w:t>However, when we reverse the roles of the vectors, the condition no longer holds. In other words,</w:t>
+      </w:r>
+    </w:p>
+    <w:p>
+      <w:pPr>
+        <w:rPr>
+          <w:sz w:val="44"/>
+          <w:szCs w:val="44"/>
+          <w:lang w:bidi="fa-IR"/>
+        </w:rPr>
+      </w:pPr>
+      <w:r>
+        <w:rPr>
+          <w:sz w:val="44"/>
+          <w:szCs w:val="44"/>
+          <w:lang w:bidi="fa-IR"/>
+        </w:rPr>
+        <w:t xml:space="preserve">Therefore, we have found a counterexample showing that </w:t>
+      </w:r>
+      <w:r>
+        <w:rPr>
+          <w:b/>
+          <w:bCs/>
+          <w:sz w:val="44"/>
+          <w:szCs w:val="44"/>
+          <w:lang w:bidi="fa-IR"/>
+        </w:rPr>
+        <w:t>Birkhoff–James orthogonality is not symmetric in general</w:t>
+      </w:r>
+      <w:r>
+        <w:rPr>
+          <w:sz w:val="44"/>
+          <w:szCs w:val="44"/>
+          <w:lang w:bidi="fa-IR"/>
+        </w:rPr>
+        <w:t>.</w:t>
+      </w:r>
+    </w:p>
+    <w:p>
+      <w:pPr>
+        <w:rPr>
+          <w:sz w:val="44"/>
+          <w:szCs w:val="44"/>
+          <w:lang w:bidi="fa-IR"/>
+        </w:rPr>
+      </w:pPr>
+      <w:r>
+        <w:rPr>
+          <w:sz w:val="44"/>
+          <w:szCs w:val="44"/>
+          <w:lang w:bidi="fa-IR"/>
+        </w:rPr>
+        <w:t>3-5:</w:t>
+      </w:r>
+    </w:p>
+    <w:p>
+      <w:pPr>
+        <w:rPr>
+          <w:sz w:val="44"/>
+          <w:szCs w:val="44"/>
+          <w:lang w:bidi="fa-IR"/>
+        </w:rPr>
+      </w:pPr>
+      <w:r>
+        <w:rPr>
+          <w:sz w:val="44"/>
+          <w:szCs w:val="44"/>
+          <w:lang w:bidi="fa-IR"/>
+        </w:rPr>
+        <w:t xml:space="preserve"> </w:t>
+      </w:r>
+      <w:r>
+        <w:rPr>
+          <w:sz w:val="44"/>
+          <w:szCs w:val="44"/>
+          <w:lang w:bidi="fa-IR"/>
+        </w:rPr>
+        <w:t xml:space="preserve">Now, let's prove that </w:t>
+      </w:r>
+      <w:r>
+        <w:rPr>
+          <w:b/>
+          <w:bCs/>
+          <w:sz w:val="44"/>
+          <w:szCs w:val="44"/>
+          <w:lang w:bidi="fa-IR"/>
+        </w:rPr>
+        <w:t>Birkhoff–James orthogonality satisfies homogeneity</w:t>
+      </w:r>
+      <w:r>
+        <w:rPr>
+          <w:sz w:val="44"/>
+          <w:szCs w:val="44"/>
+          <w:lang w:bidi="fa-IR"/>
+        </w:rPr>
+        <w:t>.</w:t>
+      </w:r>
+    </w:p>
+    <w:p>
+      <w:pPr>
+        <w:rPr>
+          <w:sz w:val="44"/>
+          <w:szCs w:val="44"/>
+          <w:lang w:bidi="fa-IR"/>
+        </w:rPr>
+      </w:pPr>
+      <w:r>
+        <w:rPr>
+          <w:sz w:val="44"/>
+          <w:szCs w:val="44"/>
+          <w:lang w:bidi="fa-IR"/>
+        </w:rPr>
+        <w:t>We'll consider two separate cases.</w:t>
+      </w:r>
+    </w:p>
+    <w:p>
+      <w:pPr>
+        <w:rPr>
+          <w:sz w:val="44"/>
+          <w:szCs w:val="44"/>
+          <w:lang w:bidi="fa-IR"/>
+        </w:rPr>
+      </w:pPr>
+      <w:r>
+        <w:rPr>
+          <w:sz w:val="44"/>
+          <w:szCs w:val="44"/>
+          <w:lang w:bidi="fa-IR"/>
+        </w:rPr>
+        <w:lastRenderedPageBreak/>
+        <w:t>First, suppose that (\alpha \</w:t>
+      </w:r>
+      <w:proofErr w:type="spellStart"/>
+      <w:r>
+        <w:rPr>
+          <w:sz w:val="44"/>
+          <w:szCs w:val="44"/>
+          <w:lang w:bidi="fa-IR"/>
+        </w:rPr>
+        <w:t>neq</w:t>
+      </w:r>
+      <w:proofErr w:type="spellEnd"/>
+      <w:r>
+        <w:rPr>
+          <w:sz w:val="44"/>
+          <w:szCs w:val="44"/>
+          <w:lang w:bidi="fa-IR"/>
+        </w:rPr>
+        <w:t xml:space="preserve"> 0). By factoring out (\alpha) from the norm and making a simple change of variables, we obtain the desired result.</w:t>
+      </w:r>
+    </w:p>
+    <w:p>
+      <w:pPr>
+        <w:rPr>
+          <w:sz w:val="44"/>
+          <w:szCs w:val="44"/>
+          <w:lang w:bidi="fa-IR"/>
+        </w:rPr>
+      </w:pPr>
+      <w:r>
+        <w:rPr>
+          <w:sz w:val="44"/>
+          <w:szCs w:val="44"/>
+          <w:lang w:bidi="fa-IR"/>
+        </w:rPr>
+        <w:t>Next, consider the case where (\alpha = 0). In this case, the statement is immediate, as you can see, and the property holds trivially.</w:t>
+      </w:r>
+    </w:p>
+    <w:p>
+      <w:pPr>
+        <w:rPr>
+          <w:sz w:val="44"/>
+          <w:szCs w:val="44"/>
+          <w:lang w:bidi="fa-IR"/>
+        </w:rPr>
+      </w:pPr>
+      <w:r>
+        <w:rPr>
+          <w:sz w:val="44"/>
+          <w:szCs w:val="44"/>
+          <w:lang w:bidi="fa-IR"/>
+        </w:rPr>
+        <w:t xml:space="preserve">Therefore, </w:t>
+      </w:r>
+      <w:r>
+        <w:rPr>
+          <w:b/>
+          <w:bCs/>
+          <w:sz w:val="44"/>
+          <w:szCs w:val="44"/>
+          <w:lang w:bidi="fa-IR"/>
+        </w:rPr>
+        <w:t>Birkhoff–James orthogonality is homogeneous</w:t>
+      </w:r>
+      <w:r>
+        <w:rPr>
+          <w:sz w:val="44"/>
+          <w:szCs w:val="44"/>
+          <w:lang w:bidi="fa-IR"/>
+        </w:rPr>
+        <w:t>.</w:t>
+      </w:r>
+    </w:p>
+    <w:p>
+      <w:pPr>
+        <w:rPr>
+          <w:sz w:val="44"/>
+          <w:szCs w:val="44"/>
+          <w:lang w:bidi="fa-IR"/>
+        </w:rPr>
+      </w:pPr>
+      <w:r>
+        <w:rPr>
+          <w:sz w:val="44"/>
+          <w:szCs w:val="44"/>
+          <w:lang w:bidi="fa-IR"/>
+        </w:rPr>
+        <w:t>3-6:</w:t>
+      </w:r>
+    </w:p>
+    <w:p>
+      <w:pPr>
+        <w:rPr>
+          <w:sz w:val="44"/>
+          <w:szCs w:val="44"/>
+          <w:lang w:bidi="fa-IR"/>
+        </w:rPr>
+      </w:pPr>
+      <w:r>
+        <w:rPr>
+          <w:sz w:val="44"/>
+          <w:szCs w:val="44"/>
+          <w:lang w:bidi="fa-IR"/>
+        </w:rPr>
+        <w:t xml:space="preserve">Now, let's show that </w:t>
+      </w:r>
+      <w:r>
+        <w:rPr>
+          <w:b/>
+          <w:bCs/>
+          <w:sz w:val="44"/>
+          <w:szCs w:val="44"/>
+          <w:lang w:bidi="fa-IR"/>
+        </w:rPr>
+        <w:t>additivity does not hold</w:t>
+      </w:r>
+      <w:r>
+        <w:rPr>
+          <w:sz w:val="44"/>
+          <w:szCs w:val="44"/>
+          <w:lang w:bidi="fa-IR"/>
+        </w:rPr>
+        <w:t xml:space="preserve"> by constructing a counterexample.</w:t>
+      </w:r>
+    </w:p>
+    <w:p>
+      <w:pPr>
+        <w:rPr>
+          <w:sz w:val="44"/>
+          <w:szCs w:val="44"/>
+          <w:lang w:bidi="fa-IR"/>
+        </w:rPr>
+      </w:pPr>
+      <w:r>
+        <w:rPr>
+          <w:sz w:val="44"/>
+          <w:szCs w:val="44"/>
+          <w:lang w:bidi="fa-IR"/>
+        </w:rPr>
+        <w:t>We'll use the same counterexample that we used earlier to show that Birkhoff–James orthogonality is not symmetric.</w:t>
+      </w:r>
+    </w:p>
+    <w:p>
+      <w:pPr>
+        <w:rPr>
+          <w:sz w:val="44"/>
+          <w:szCs w:val="44"/>
+          <w:lang w:bidi="fa-IR"/>
+        </w:rPr>
+      </w:pPr>
+      <w:r>
+        <w:rPr>
+          <w:sz w:val="44"/>
+          <w:szCs w:val="44"/>
+          <w:lang w:bidi="fa-IR"/>
+        </w:rPr>
+        <w:t>We have already shown that</w:t>
+      </w:r>
+    </w:p>
+    <w:p>
+      <w:pPr>
+        <w:rPr>
+          <w:sz w:val="44"/>
+          <w:szCs w:val="44"/>
+          <w:lang w:bidi="fa-IR"/>
+        </w:rPr>
+      </w:pPr>
+      <w:r>
+        <w:rPr>
+          <w:sz w:val="44"/>
+          <w:szCs w:val="44"/>
+          <w:lang w:bidi="fa-IR"/>
+        </w:rPr>
+        <w:t>Next, we show that</w:t>
+      </w:r>
+    </w:p>
+    <w:p>
+      <w:pPr>
+        <w:rPr>
+          <w:sz w:val="44"/>
+          <w:szCs w:val="44"/>
+          <w:lang w:bidi="fa-IR"/>
+        </w:rPr>
+      </w:pPr>
+      <w:r>
+        <w:rPr>
+          <w:sz w:val="44"/>
+          <w:szCs w:val="44"/>
+          <w:lang w:bidi="fa-IR"/>
+        </w:rPr>
+        <w:t>as well.</w:t>
+      </w:r>
+    </w:p>
+    <w:p>
+      <w:pPr>
+        <w:rPr>
+          <w:sz w:val="44"/>
+          <w:szCs w:val="44"/>
+          <w:lang w:bidi="fa-IR"/>
+        </w:rPr>
+      </w:pPr>
+      <w:r>
+        <w:rPr>
+          <w:sz w:val="44"/>
+          <w:szCs w:val="44"/>
+          <w:lang w:bidi="fa-IR"/>
+        </w:rPr>
+        <w:lastRenderedPageBreak/>
+        <w:t>However, when we consider the sum of these two vectors, we find that</w:t>
+      </w:r>
+    </w:p>
+    <w:p>
+      <w:pPr>
+        <w:rPr>
+          <w:sz w:val="44"/>
+          <w:szCs w:val="44"/>
+          <w:lang w:bidi="fa-IR"/>
+        </w:rPr>
+      </w:pPr>
+      <w:r>
+        <w:rPr>
+          <w:sz w:val="44"/>
+          <w:szCs w:val="44"/>
+          <w:lang w:bidi="fa-IR"/>
+        </w:rPr>
+        <w:t xml:space="preserve">Therefore, even though (x) is Birkhoff–James orthogonal to both (y) and (z) individually, it is </w:t>
+      </w:r>
+      <w:r>
+        <w:rPr>
+          <w:b/>
+          <w:bCs/>
+          <w:sz w:val="44"/>
+          <w:szCs w:val="44"/>
+          <w:lang w:bidi="fa-IR"/>
+        </w:rPr>
+        <w:t>not</w:t>
+      </w:r>
+      <w:r>
+        <w:rPr>
+          <w:sz w:val="44"/>
+          <w:szCs w:val="44"/>
+          <w:lang w:bidi="fa-IR"/>
+        </w:rPr>
+        <w:t xml:space="preserve"> orthogonal to their sum.</w:t>
+      </w:r>
+    </w:p>
+    <w:p>
+      <w:pPr>
+        <w:rPr>
+          <w:sz w:val="44"/>
+          <w:szCs w:val="44"/>
+          <w:lang w:bidi="fa-IR"/>
+        </w:rPr>
+      </w:pPr>
+      <w:r>
+        <w:rPr>
+          <w:sz w:val="44"/>
+          <w:szCs w:val="44"/>
+          <w:lang w:bidi="fa-IR"/>
+        </w:rPr>
+        <w:t xml:space="preserve">This counterexample shows that </w:t>
+      </w:r>
+      <w:r>
+        <w:rPr>
+          <w:b/>
+          <w:bCs/>
+          <w:sz w:val="44"/>
+          <w:szCs w:val="44"/>
+          <w:lang w:bidi="fa-IR"/>
+        </w:rPr>
+        <w:t>Birkhoff–James orthogonality is not additive</w:t>
+      </w:r>
+      <w:r>
+        <w:rPr>
+          <w:sz w:val="44"/>
+          <w:szCs w:val="44"/>
+          <w:lang w:bidi="fa-IR"/>
+        </w:rPr>
+        <w:t>.</w:t>
+      </w:r>
+    </w:p>
+    <w:p>
+      <w:pPr>
+        <w:rPr>
+          <w:sz w:val="44"/>
+          <w:szCs w:val="44"/>
+          <w:lang w:bidi="fa-IR"/>
+        </w:rPr>
+      </w:pPr>
+      <w:r>
+        <w:rPr>
+          <w:sz w:val="44"/>
+          <w:szCs w:val="44"/>
+          <w:lang w:bidi="fa-IR"/>
+        </w:rPr>
+        <w:t>3-7:</w:t>
+      </w:r>
+    </w:p>
+    <w:p>
+      <w:pPr>
+        <w:rPr>
+          <w:sz w:val="44"/>
+          <w:szCs w:val="44"/>
+          <w:rtl/>
+          <w:lang w:bidi="fa-IR"/>
+        </w:rPr>
+      </w:pPr>
+    </w:p>
+    <w:p>
+      <w:pPr>
+        <w:rPr>
+          <w:sz w:val="44"/>
+          <w:szCs w:val="44"/>
+          <w:rtl/>
+          <w:lang w:bidi="fa-IR"/>
+        </w:rPr>
+      </w:pPr>
+    </w:p>
+    <w:p>
+      <w:pPr>
+        <w:rPr>
+          <w:sz w:val="44"/>
+          <w:szCs w:val="44"/>
+          <w:lang w:bidi="fa-IR"/>
+        </w:rPr>
+      </w:pPr>
+      <w:r>
+        <w:rPr>
+          <w:sz w:val="44"/>
+          <w:szCs w:val="44"/>
+          <w:lang w:bidi="fa-IR"/>
+        </w:rPr>
+        <w:t>3- :</w:t>
+      </w:r>
+    </w:p>
+    <w:p>
+      <w:pPr>
+        <w:rPr>
+          <w:sz w:val="44"/>
+          <w:szCs w:val="44"/>
+          <w:lang w:bidi="fa-IR"/>
+        </w:rPr>
+      </w:pPr>
+      <w:r>
+        <w:rPr>
+          <w:sz w:val="44"/>
+          <w:szCs w:val="44"/>
+          <w:lang w:bidi="fa-IR"/>
+        </w:rPr>
+        <w:t>Now, let's take another look at our summary table.</w:t>
+      </w:r>
+    </w:p>
+    <w:p>
+      <w:pPr>
+        <w:rPr>
+          <w:sz w:val="44"/>
+          <w:szCs w:val="44"/>
+          <w:lang w:bidi="fa-IR"/>
+        </w:rPr>
+      </w:pPr>
+      <w:r>
+        <w:rPr>
+          <w:sz w:val="44"/>
+          <w:szCs w:val="44"/>
+          <w:lang w:bidi="fa-IR"/>
+        </w:rPr>
+        <w:t xml:space="preserve">As we mentioned earlier, </w:t>
+      </w:r>
+      <w:r>
+        <w:rPr>
+          <w:b/>
+          <w:bCs/>
+          <w:sz w:val="44"/>
+          <w:szCs w:val="44"/>
+          <w:lang w:bidi="fa-IR"/>
+        </w:rPr>
+        <w:t>Birkhoff–James orthogonality is not symmetric in general</w:t>
+      </w:r>
+      <w:r>
+        <w:rPr>
+          <w:sz w:val="44"/>
+          <w:szCs w:val="44"/>
+          <w:lang w:bidi="fa-IR"/>
+        </w:rPr>
+        <w:t>.</w:t>
+      </w:r>
+    </w:p>
+    <w:p>
+      <w:pPr>
+        <w:rPr>
+          <w:sz w:val="44"/>
+          <w:szCs w:val="44"/>
+          <w:lang w:bidi="fa-IR"/>
+        </w:rPr>
+      </w:pPr>
+      <w:r>
+        <w:rPr>
+          <w:sz w:val="44"/>
+          <w:szCs w:val="44"/>
+          <w:lang w:bidi="fa-IR"/>
+        </w:rPr>
+        <w:t>However, just like Roberts orthogonality, there is an important characterization theorem:</w:t>
+      </w:r>
+    </w:p>
+    <w:p>
+      <w:pPr>
+        <w:rPr>
+          <w:sz w:val="44"/>
+          <w:szCs w:val="44"/>
+          <w:lang w:bidi="fa-IR"/>
+        </w:rPr>
+      </w:pPr>
+      <w:r>
+        <w:rPr>
+          <w:sz w:val="44"/>
+          <w:szCs w:val="44"/>
+          <w:lang w:bidi="fa-IR"/>
+        </w:rPr>
+        <w:t xml:space="preserve">Let (X) be a real normed space with dimension at least three. Then (X) is an inner product space </w:t>
+      </w:r>
+      <w:r>
+        <w:rPr>
+          <w:b/>
+          <w:bCs/>
+          <w:sz w:val="44"/>
+          <w:szCs w:val="44"/>
+          <w:lang w:bidi="fa-IR"/>
+        </w:rPr>
+        <w:t xml:space="preserve">if and </w:t>
+      </w:r>
+      <w:r>
+        <w:rPr>
+          <w:b/>
+          <w:bCs/>
+          <w:sz w:val="44"/>
+          <w:szCs w:val="44"/>
+          <w:lang w:bidi="fa-IR"/>
+        </w:rPr>
+        <w:lastRenderedPageBreak/>
+        <w:t>only if</w:t>
+      </w:r>
+      <w:r>
+        <w:rPr>
+          <w:sz w:val="44"/>
+          <w:szCs w:val="44"/>
+          <w:lang w:bidi="fa-IR"/>
+        </w:rPr>
+        <w:t xml:space="preserve"> Birkhoff–James orthogonality is symmetric on (X).</w:t>
+      </w:r>
+    </w:p>
+    <w:p>
+      <w:pPr>
+        <w:rPr>
+          <w:sz w:val="44"/>
+          <w:szCs w:val="44"/>
+          <w:lang w:bidi="fa-IR"/>
+        </w:rPr>
+      </w:pPr>
+      <w:r>
+        <w:rPr>
+          <w:sz w:val="44"/>
+          <w:szCs w:val="44"/>
+          <w:lang w:bidi="fa-IR"/>
+        </w:rPr>
+        <w:t>In other words, when the dimension of the space is three or higher, symmetry of Birkhoff–James orthogonality completely characterizes inner product spaces.</w:t>
+      </w:r>
+    </w:p>
+    <w:p>
+      <w:pPr>
+        <w:rPr>
+          <w:sz w:val="44"/>
+          <w:szCs w:val="44"/>
+          <w:lang w:bidi="fa-IR"/>
+        </w:rPr>
+      </w:pPr>
+      <w:r>
+        <w:rPr>
+          <w:sz w:val="44"/>
+          <w:szCs w:val="44"/>
+          <w:lang w:bidi="fa-IR"/>
+        </w:rPr>
+        <w:t xml:space="preserve">But this result does </w:t>
+      </w:r>
+      <w:r>
+        <w:rPr>
+          <w:b/>
+          <w:bCs/>
+          <w:sz w:val="44"/>
+          <w:szCs w:val="44"/>
+          <w:lang w:bidi="fa-IR"/>
+        </w:rPr>
+        <w:t>not</w:t>
+      </w:r>
+      <w:r>
+        <w:rPr>
+          <w:sz w:val="44"/>
+          <w:szCs w:val="44"/>
+          <w:lang w:bidi="fa-IR"/>
+        </w:rPr>
+        <w:t xml:space="preserve"> extend to two-dimensional spaces.</w:t>
+      </w:r>
+    </w:p>
+    <w:p>
+      <w:pPr>
+        <w:rPr>
+          <w:sz w:val="44"/>
+          <w:szCs w:val="44"/>
+          <w:lang w:bidi="fa-IR"/>
+        </w:rPr>
+      </w:pPr>
+      <w:r>
+        <w:rPr>
+          <w:sz w:val="44"/>
+          <w:szCs w:val="44"/>
+          <w:lang w:bidi="fa-IR"/>
+        </w:rPr>
+        <w:t xml:space="preserve">As a counterexample, consider </w:t>
+      </w:r>
+      <w:r>
+        <w:rPr>
+          <w:b/>
+          <w:bCs/>
+          <w:sz w:val="44"/>
+          <w:szCs w:val="44"/>
+          <w:lang w:bidi="fa-IR"/>
+        </w:rPr>
+        <w:t>Radon planes</w:t>
+      </w:r>
+      <w:r>
+        <w:rPr>
+          <w:sz w:val="44"/>
+          <w:szCs w:val="44"/>
+          <w:lang w:bidi="fa-IR"/>
+        </w:rPr>
+        <w:t xml:space="preserve">. In a Radon plane, Birkhoff–James orthogonality is symmetric, even though the space is </w:t>
+      </w:r>
+      <w:r>
+        <w:rPr>
+          <w:b/>
+          <w:bCs/>
+          <w:sz w:val="44"/>
+          <w:szCs w:val="44"/>
+          <w:lang w:bidi="fa-IR"/>
+        </w:rPr>
+        <w:t>not</w:t>
+      </w:r>
+      <w:r>
+        <w:rPr>
+          <w:sz w:val="44"/>
+          <w:szCs w:val="44"/>
+          <w:lang w:bidi="fa-IR"/>
+        </w:rPr>
+        <w:t xml:space="preserve"> an inner product space.</w:t>
+      </w:r>
+    </w:p>
+    <w:p>
+      <w:pPr>
+        <w:rPr>
+          <w:sz w:val="44"/>
+          <w:szCs w:val="44"/>
+          <w:lang w:bidi="fa-IR"/>
+        </w:rPr>
+      </w:pPr>
+      <w:r>
+        <w:rPr>
+          <w:sz w:val="44"/>
+          <w:szCs w:val="44"/>
+          <w:lang w:bidi="fa-IR"/>
+        </w:rPr>
+        <w:t>So, the dimension assumption in the theorem is essential.</w:t>
       </w:r>
     </w:p>
     <w:p>

</xml_diff>

<commit_message>
step 101 : add notes
</commit_message>
<xml_diff>
--- a/video context/video_context_newVersion.docx
+++ b/video context/video_context_newVersion.docx
@@ -2304,27 +2304,15 @@
           <w:lang w:bidi="fa-IR"/>
         </w:rPr>
       </w:pPr>
-      <w:proofErr w:type="spellStart"/>
-      <w:r>
-        <w:rPr>
-          <w:b/>
-          <w:bCs/>
-          <w:sz w:val="44"/>
-          <w:szCs w:val="44"/>
-          <w:lang w:bidi="fa-IR"/>
-        </w:rPr>
-        <w:t>Hellooo</w:t>
-      </w:r>
-      <w:proofErr w:type="spellEnd"/>
-      <w:r>
-        <w:rPr>
-          <w:b/>
-          <w:bCs/>
-          <w:sz w:val="44"/>
-          <w:szCs w:val="44"/>
-          <w:lang w:bidi="fa-IR"/>
-        </w:rPr>
-        <w:t>, and welcome back!</w:t>
+      <w:r>
+        <w:rPr>
+          <w:b/>
+          <w:bCs/>
+          <w:sz w:val="44"/>
+          <w:szCs w:val="44"/>
+          <w:lang w:bidi="fa-IR"/>
+        </w:rPr>
+        <w:t>Hellooo, and welcome back!</w:t>
       </w:r>
       <w:r>
         <w:rPr>
@@ -2765,25 +2753,7 @@
           <w:lang w:bidi="fa-IR"/>
         </w:rPr>
         <w:lastRenderedPageBreak/>
-        <w:t xml:space="preserve">Next, we show that the distance from x </w:t>
-      </w:r>
-      <w:proofErr w:type="spellStart"/>
-      <w:r>
-        <w:rPr>
-          <w:sz w:val="44"/>
-          <w:szCs w:val="44"/>
-          <w:lang w:bidi="fa-IR"/>
-        </w:rPr>
-        <w:t>to y</w:t>
-      </w:r>
-      <w:proofErr w:type="spellEnd"/>
-      <w:r>
-        <w:rPr>
-          <w:sz w:val="44"/>
-          <w:szCs w:val="44"/>
-          <w:lang w:bidi="fa-IR"/>
-        </w:rPr>
-        <w:t xml:space="preserve"> is equal to the distance from y to x.</w:t>
+        <w:t>Next, we show that the distance from x to y is equal to the distance from y to x.</w:t>
       </w:r>
     </w:p>
     <w:p>
@@ -2817,18 +2787,8 @@
           <w:szCs w:val="44"/>
           <w:lang w:bidi="fa-IR"/>
         </w:rPr>
-        <w:t xml:space="preserve">To gain some geometric intuition, consider two points, x and y, in the two-dimensional plane. We first represent the distance from x </w:t>
-      </w:r>
-      <w:proofErr w:type="spellStart"/>
-      <w:r>
-        <w:rPr>
-          <w:sz w:val="44"/>
-          <w:szCs w:val="44"/>
-          <w:lang w:bidi="fa-IR"/>
-        </w:rPr>
-        <w:t>to y</w:t>
-      </w:r>
-      <w:proofErr w:type="spellEnd"/>
+        <w:t>To gain some geometric intuition, consider two points, x and y, in the two-dimensional plane. We first represent the distance from x to y</w:t>
+      </w:r>
       <w:r>
         <w:rPr>
           <w:sz w:val="44"/>
@@ -3403,78 +3363,24 @@
           <w:szCs w:val="44"/>
           <w:lang w:bidi="fa-IR"/>
         </w:rPr>
-        <w:t>To begin, let (</w:t>
-      </w:r>
-      <w:proofErr w:type="spellStart"/>
-      <w:r>
-        <w:rPr>
-          <w:sz w:val="44"/>
-          <w:szCs w:val="44"/>
-          <w:lang w:bidi="fa-IR"/>
-        </w:rPr>
-        <w:t>X,d</w:t>
-      </w:r>
-      <w:proofErr w:type="spellEnd"/>
-      <w:r>
-        <w:rPr>
-          <w:sz w:val="44"/>
-          <w:szCs w:val="44"/>
-          <w:lang w:bidi="fa-IR"/>
-        </w:rPr>
-        <w:t xml:space="preserve">) be a metric space, and let </w:t>
-      </w:r>
-      <w:proofErr w:type="spellStart"/>
-      <w:r>
-        <w:rPr>
-          <w:sz w:val="44"/>
-          <w:szCs w:val="44"/>
-          <w:lang w:bidi="fa-IR"/>
-        </w:rPr>
-        <w:t>y_n</w:t>
-      </w:r>
-      <w:proofErr w:type="spellEnd"/>
-      <w:r>
-        <w:rPr>
-          <w:sz w:val="44"/>
-          <w:szCs w:val="44"/>
-          <w:lang w:bidi="fa-IR"/>
-        </w:rPr>
-        <w:t xml:space="preserve"> be a sequence in X.</w:t>
-      </w:r>
-    </w:p>
-    <w:p>
-      <w:pPr>
-        <w:rPr>
-          <w:sz w:val="44"/>
-          <w:szCs w:val="44"/>
-          <w:lang w:bidi="fa-IR"/>
-        </w:rPr>
-      </w:pPr>
-      <w:r>
-        <w:rPr>
-          <w:sz w:val="44"/>
-          <w:szCs w:val="44"/>
-          <w:lang w:bidi="fa-IR"/>
-        </w:rPr>
-        <w:t xml:space="preserve">We say that the sequence </w:t>
-      </w:r>
-      <w:proofErr w:type="spellStart"/>
-      <w:r>
-        <w:rPr>
-          <w:sz w:val="44"/>
-          <w:szCs w:val="44"/>
-          <w:lang w:bidi="fa-IR"/>
-        </w:rPr>
-        <w:t>y_n</w:t>
-      </w:r>
-      <w:proofErr w:type="spellEnd"/>
-      <w:r>
-        <w:rPr>
-          <w:sz w:val="44"/>
-          <w:szCs w:val="44"/>
-          <w:lang w:bidi="fa-IR"/>
-        </w:rPr>
-        <w:t xml:space="preserve"> converges</w:t>
+        <w:t>To begin, let (X,d) be a metric space, and let y_n be a sequence in X.</w:t>
+      </w:r>
+    </w:p>
+    <w:p>
+      <w:pPr>
+        <w:rPr>
+          <w:sz w:val="44"/>
+          <w:szCs w:val="44"/>
+          <w:lang w:bidi="fa-IR"/>
+        </w:rPr>
+      </w:pPr>
+      <w:r>
+        <w:rPr>
+          <w:sz w:val="44"/>
+          <w:szCs w:val="44"/>
+          <w:lang w:bidi="fa-IR"/>
+        </w:rPr>
+        <w:t>We say that the sequence y_n converges</w:t>
       </w:r>
       <w:r>
         <w:rPr>
@@ -3596,7 +3502,6 @@
         <w:lastRenderedPageBreak/>
         <w:t xml:space="preserve">In this case, something interesting happens. The very same sequence </w:t>
       </w:r>
-      <w:proofErr w:type="spellStart"/>
       <w:r>
         <w:rPr>
           <w:sz w:val="44"/>
@@ -3605,7 +3510,6 @@
         </w:rPr>
         <w:t>y_n</w:t>
       </w:r>
-      <w:proofErr w:type="spellEnd"/>
       <w:r>
         <w:rPr>
           <w:sz w:val="44"/>
@@ -3819,43 +3723,7 @@
           <w:lang w:bidi="fa-IR"/>
         </w:rPr>
         <w:lastRenderedPageBreak/>
-        <w:t>Formally, a sequence ({</w:t>
-      </w:r>
-      <w:proofErr w:type="spellStart"/>
-      <w:r>
-        <w:rPr>
-          <w:sz w:val="44"/>
-          <w:szCs w:val="44"/>
-          <w:lang w:bidi="fa-IR"/>
-        </w:rPr>
-        <w:t>x_n</w:t>
-      </w:r>
-      <w:proofErr w:type="spellEnd"/>
-      <w:r>
-        <w:rPr>
-          <w:sz w:val="44"/>
-          <w:szCs w:val="44"/>
-          <w:lang w:bidi="fa-IR"/>
-        </w:rPr>
-        <w:t>}) in a metric space ((</w:t>
-      </w:r>
-      <w:proofErr w:type="spellStart"/>
-      <w:r>
-        <w:rPr>
-          <w:sz w:val="44"/>
-          <w:szCs w:val="44"/>
-          <w:lang w:bidi="fa-IR"/>
-        </w:rPr>
-        <w:t>X,d</w:t>
-      </w:r>
-      <w:proofErr w:type="spellEnd"/>
-      <w:r>
-        <w:rPr>
-          <w:sz w:val="44"/>
-          <w:szCs w:val="44"/>
-          <w:lang w:bidi="fa-IR"/>
-        </w:rPr>
-        <w:t xml:space="preserve">)) is called </w:t>
+        <w:t xml:space="preserve">Formally, a sequence ({x_n}) in a metric space ((X,d)) is called </w:t>
       </w:r>
       <w:r>
         <w:rPr>
@@ -3873,25 +3741,7 @@
           <w:szCs w:val="44"/>
           <w:lang w:bidi="fa-IR"/>
         </w:rPr>
-        <w:t xml:space="preserve"> if, for every (\</w:t>
-      </w:r>
-      <w:proofErr w:type="spellStart"/>
-      <w:r>
-        <w:rPr>
-          <w:sz w:val="44"/>
-          <w:szCs w:val="44"/>
-          <w:lang w:bidi="fa-IR"/>
-        </w:rPr>
-        <w:t>varepsilon</w:t>
-      </w:r>
-      <w:proofErr w:type="spellEnd"/>
-      <w:r>
-        <w:rPr>
-          <w:sz w:val="44"/>
-          <w:szCs w:val="44"/>
-          <w:lang w:bidi="fa-IR"/>
-        </w:rPr>
-        <w:t xml:space="preserve"> &gt; 0), there exists an integer (N) such that</w:t>
+        <w:t xml:space="preserve"> if, for every (\varepsilon &gt; 0), there exists an integer (N) such that</w:t>
       </w:r>
     </w:p>
     <w:p>
@@ -4035,60 +3885,24 @@
           <w:szCs w:val="44"/>
           <w:lang w:bidi="fa-IR"/>
         </w:rPr>
-        <w:t>for every (</w:t>
-      </w:r>
-      <w:proofErr w:type="spellStart"/>
-      <w:r>
-        <w:rPr>
-          <w:sz w:val="44"/>
-          <w:szCs w:val="44"/>
-          <w:lang w:bidi="fa-IR"/>
-        </w:rPr>
-        <w:t>m,n</w:t>
-      </w:r>
-      <w:proofErr w:type="spellEnd"/>
-      <w:r>
-        <w:rPr>
-          <w:sz w:val="44"/>
-          <w:szCs w:val="44"/>
-          <w:lang w:bidi="fa-IR"/>
-        </w:rPr>
-        <w:t xml:space="preserve"> &gt; N).</w:t>
-      </w:r>
-    </w:p>
-    <w:p>
-      <w:pPr>
-        <w:rPr>
-          <w:sz w:val="44"/>
-          <w:szCs w:val="44"/>
-          <w:lang w:bidi="fa-IR"/>
-        </w:rPr>
-      </w:pPr>
-      <w:r>
-        <w:rPr>
-          <w:sz w:val="44"/>
-          <w:szCs w:val="44"/>
-          <w:lang w:bidi="fa-IR"/>
-        </w:rPr>
-        <w:t>Now let's look again at our sequence ({</w:t>
-      </w:r>
-      <w:proofErr w:type="spellStart"/>
-      <w:r>
-        <w:rPr>
-          <w:sz w:val="44"/>
-          <w:szCs w:val="44"/>
-          <w:lang w:bidi="fa-IR"/>
-        </w:rPr>
-        <w:t>y_n</w:t>
-      </w:r>
-      <w:proofErr w:type="spellEnd"/>
-      <w:r>
-        <w:rPr>
-          <w:sz w:val="44"/>
-          <w:szCs w:val="44"/>
-          <w:lang w:bidi="fa-IR"/>
-        </w:rPr>
-        <w:t>}).</w:t>
+        <w:t>for every (m,n &gt; N).</w:t>
+      </w:r>
+    </w:p>
+    <w:p>
+      <w:pPr>
+        <w:rPr>
+          <w:sz w:val="44"/>
+          <w:szCs w:val="44"/>
+          <w:lang w:bidi="fa-IR"/>
+        </w:rPr>
+      </w:pPr>
+      <w:r>
+        <w:rPr>
+          <w:sz w:val="44"/>
+          <w:szCs w:val="44"/>
+          <w:lang w:bidi="fa-IR"/>
+        </w:rPr>
+        <w:t>Now let's look again at our sequence ({y_n}).</w:t>
       </w:r>
     </w:p>
     <w:p>
@@ -4642,25 +4456,7 @@
           <w:lang w:bidi="fa-IR"/>
         </w:rPr>
         <w:lastRenderedPageBreak/>
-        <w:t>Go back to our previous metric space (X), and consider the same Cauchy sequence ({</w:t>
-      </w:r>
-      <w:proofErr w:type="spellStart"/>
-      <w:r>
-        <w:rPr>
-          <w:sz w:val="44"/>
-          <w:szCs w:val="44"/>
-          <w:lang w:bidi="fa-IR"/>
-        </w:rPr>
-        <w:t>y_n</w:t>
-      </w:r>
-      <w:proofErr w:type="spellEnd"/>
-      <w:r>
-        <w:rPr>
-          <w:sz w:val="44"/>
-          <w:szCs w:val="44"/>
-          <w:lang w:bidi="fa-IR"/>
-        </w:rPr>
-        <w:t>}).</w:t>
+        <w:t>Go back to our previous metric space (X), and consider the same Cauchy sequence ({y_n}).</w:t>
       </w:r>
     </w:p>
     <w:p>
@@ -6722,7 +6518,6 @@
         </w:rPr>
         <w:t xml:space="preserve">Suppose we have two vectors, </w:t>
       </w:r>
-      <w:proofErr w:type="spellStart"/>
       <w:r>
         <w:rPr>
           <w:b/>
@@ -6739,16 +6534,7 @@
           <w:szCs w:val="44"/>
           <w:lang w:bidi="fa-IR"/>
         </w:rPr>
-        <w:t>and</w:t>
-      </w:r>
-      <w:proofErr w:type="spellEnd"/>
-      <w:r>
-        <w:rPr>
-          <w:sz w:val="44"/>
-          <w:szCs w:val="44"/>
-          <w:lang w:bidi="fa-IR"/>
-        </w:rPr>
-        <w:t xml:space="preserve"> </w:t>
+        <w:t xml:space="preserve">and </w:t>
       </w:r>
       <w:r>
         <w:rPr>
@@ -7873,7 +7659,6 @@
         </w:rPr>
         <w:t xml:space="preserve"> in its second argument. This property is also commonly referred to as </w:t>
       </w:r>
-      <w:proofErr w:type="spellStart"/>
       <w:r>
         <w:rPr>
           <w:b/>
@@ -7884,7 +7669,6 @@
         </w:rPr>
         <w:t>semilinearity</w:t>
       </w:r>
-      <w:proofErr w:type="spellEnd"/>
       <w:r>
         <w:rPr>
           <w:sz w:val="44"/>
@@ -7929,20 +7713,8 @@
           <w:lang w:bidi="fa-IR"/>
         </w:rPr>
         <w:lastRenderedPageBreak/>
-        <w:t xml:space="preserve">Putting these two results together, we conclude that the inner product is </w:t>
-      </w:r>
-      <w:proofErr w:type="spellStart"/>
-      <w:r>
-        <w:rPr>
-          <w:b/>
-          <w:bCs/>
-          <w:sz w:val="44"/>
-          <w:szCs w:val="44"/>
-          <w:lang w:bidi="fa-IR"/>
-        </w:rPr>
-        <w:t>sesquilinear</w:t>
-      </w:r>
-      <w:proofErr w:type="spellEnd"/>
+        <w:t>Putting these two results together, we conclude that the inner product is sesquilinear</w:t>
+      </w:r>
     </w:p>
     <w:p>
       <w:pPr>
@@ -8705,25 +8477,7 @@
           <w:lang w:bidi="fa-IR"/>
         </w:rPr>
         <w:lastRenderedPageBreak/>
-        <w:t>For instance, the (</w:t>
-      </w:r>
-      <w:proofErr w:type="spellStart"/>
-      <w:r>
-        <w:rPr>
-          <w:sz w:val="44"/>
-          <w:szCs w:val="44"/>
-          <w:lang w:bidi="fa-IR"/>
-        </w:rPr>
-        <w:t>L^p</w:t>
-      </w:r>
-      <w:proofErr w:type="spellEnd"/>
-      <w:r>
-        <w:rPr>
-          <w:sz w:val="44"/>
-          <w:szCs w:val="44"/>
-          <w:lang w:bidi="fa-IR"/>
-        </w:rPr>
-        <w:t xml:space="preserve">) norms for (p </w:t>
+        <w:t xml:space="preserve">For instance, the (L^p) norms for (p </w:t>
       </w:r>
       <m:oMath>
         <m:r>
@@ -10124,25 +9878,7 @@
           <w:szCs w:val="44"/>
           <w:lang w:bidi="fa-IR"/>
         </w:rPr>
-        <w:t>Although (C[</w:t>
-      </w:r>
-      <w:proofErr w:type="spellStart"/>
-      <w:r>
-        <w:rPr>
-          <w:sz w:val="44"/>
-          <w:szCs w:val="44"/>
-          <w:lang w:bidi="fa-IR"/>
-        </w:rPr>
-        <w:t>a,b</w:t>
-      </w:r>
-      <w:proofErr w:type="spellEnd"/>
-      <w:r>
-        <w:rPr>
-          <w:sz w:val="44"/>
-          <w:szCs w:val="44"/>
-          <w:lang w:bidi="fa-IR"/>
-        </w:rPr>
-        <w:t xml:space="preserve">]) with the supremum norm </w:t>
+        <w:t xml:space="preserve">Although (C[a,b]) with the supremum norm </w:t>
       </w:r>
       <w:r>
         <w:rPr>
@@ -10241,25 +9977,7 @@
           <w:szCs w:val="44"/>
           <w:lang w:bidi="fa-IR"/>
         </w:rPr>
-        <w:t>Therefore, (C[</w:t>
-      </w:r>
-      <w:proofErr w:type="spellStart"/>
-      <w:r>
-        <w:rPr>
-          <w:sz w:val="44"/>
-          <w:szCs w:val="44"/>
-          <w:lang w:bidi="fa-IR"/>
-        </w:rPr>
-        <w:t>a,b</w:t>
-      </w:r>
-      <w:proofErr w:type="spellEnd"/>
-      <w:r>
-        <w:rPr>
-          <w:sz w:val="44"/>
-          <w:szCs w:val="44"/>
-          <w:lang w:bidi="fa-IR"/>
-        </w:rPr>
-        <w:t xml:space="preserve">]) equipped with the supremum norm is </w:t>
+        <w:t xml:space="preserve">Therefore, (C[a,b]) equipped with the supremum norm is </w:t>
       </w:r>
       <w:r>
         <w:rPr>
@@ -11952,51 +11670,7 @@
           <w:szCs w:val="44"/>
           <w:lang w:bidi="fa-IR"/>
         </w:rPr>
-        <w:t xml:space="preserve">"The norm of x+ </w:t>
-      </w:r>
-      <w:proofErr w:type="spellStart"/>
-      <w:r>
-        <w:rPr>
-          <w:b/>
-          <w:bCs/>
-          <w:sz w:val="44"/>
-          <w:szCs w:val="44"/>
-          <w:lang w:bidi="fa-IR"/>
-        </w:rPr>
-        <w:t>ky</w:t>
-      </w:r>
-      <w:proofErr w:type="spellEnd"/>
-      <w:r>
-        <w:rPr>
-          <w:b/>
-          <w:bCs/>
-          <w:sz w:val="44"/>
-          <w:szCs w:val="44"/>
-          <w:lang w:bidi="fa-IR"/>
-        </w:rPr>
-        <w:t xml:space="preserve"> equals the norm of x−</w:t>
-      </w:r>
-      <w:proofErr w:type="spellStart"/>
-      <w:r>
-        <w:rPr>
-          <w:b/>
-          <w:bCs/>
-          <w:sz w:val="44"/>
-          <w:szCs w:val="44"/>
-          <w:lang w:bidi="fa-IR"/>
-        </w:rPr>
-        <w:t>ky</w:t>
-      </w:r>
-      <w:proofErr w:type="spellEnd"/>
-      <w:r>
-        <w:rPr>
-          <w:b/>
-          <w:bCs/>
-          <w:sz w:val="44"/>
-          <w:szCs w:val="44"/>
-          <w:lang w:bidi="fa-IR"/>
-        </w:rPr>
-        <w:t xml:space="preserve"> for all real numbers k."</w:t>
+        <w:t>"The norm of x+ ky equals the norm of x−ky for all real numbers k."</w:t>
       </w:r>
     </w:p>
     <w:p>
@@ -12038,25 +11712,7 @@
           <w:szCs w:val="44"/>
           <w:lang w:bidi="fa-IR"/>
         </w:rPr>
-        <w:t xml:space="preserve">x is orthogonal </w:t>
-      </w:r>
-      <w:proofErr w:type="spellStart"/>
-      <w:r>
-        <w:rPr>
-          <w:sz w:val="44"/>
-          <w:szCs w:val="44"/>
-          <w:lang w:bidi="fa-IR"/>
-        </w:rPr>
-        <w:t>to y</w:t>
-      </w:r>
-      <w:proofErr w:type="spellEnd"/>
-      <w:r>
-        <w:rPr>
-          <w:sz w:val="44"/>
-          <w:szCs w:val="44"/>
-          <w:lang w:bidi="fa-IR"/>
-        </w:rPr>
-        <w:t xml:space="preserve"> in the sense of Roberts</w:t>
+        <w:t>x is orthogonal to y in the sense of Roberts</w:t>
       </w:r>
       <w:r>
         <w:rPr>
@@ -12098,79 +11754,7 @@
           <w:szCs w:val="44"/>
           <w:lang w:bidi="fa-IR"/>
         </w:rPr>
-        <w:t>Suppose we have two vectors, (x) and (y), that are orthogonal in the sense of Roberts. For an arbitrary real number (k), draw the vector (</w:t>
-      </w:r>
-      <w:proofErr w:type="spellStart"/>
-      <w:r>
-        <w:rPr>
-          <w:sz w:val="44"/>
-          <w:szCs w:val="44"/>
-          <w:lang w:bidi="fa-IR"/>
-        </w:rPr>
-        <w:t>ky</w:t>
-      </w:r>
-      <w:proofErr w:type="spellEnd"/>
-      <w:r>
-        <w:rPr>
-          <w:sz w:val="44"/>
-          <w:szCs w:val="44"/>
-          <w:lang w:bidi="fa-IR"/>
-        </w:rPr>
-        <w:t>). The vectors (x) and (</w:t>
-      </w:r>
-      <w:proofErr w:type="spellStart"/>
-      <w:r>
-        <w:rPr>
-          <w:sz w:val="44"/>
-          <w:szCs w:val="44"/>
-          <w:lang w:bidi="fa-IR"/>
-        </w:rPr>
-        <w:t>ky</w:t>
-      </w:r>
-      <w:proofErr w:type="spellEnd"/>
-      <w:r>
-        <w:rPr>
-          <w:sz w:val="44"/>
-          <w:szCs w:val="44"/>
-          <w:lang w:bidi="fa-IR"/>
-        </w:rPr>
-        <w:t xml:space="preserve">) form a parallelogram, and when this parallelogram happens to be a rectangle, its diagonals are (x + </w:t>
-      </w:r>
-      <w:proofErr w:type="spellStart"/>
-      <w:r>
-        <w:rPr>
-          <w:sz w:val="44"/>
-          <w:szCs w:val="44"/>
-          <w:lang w:bidi="fa-IR"/>
-        </w:rPr>
-        <w:t>ky</w:t>
-      </w:r>
-      <w:proofErr w:type="spellEnd"/>
-      <w:r>
-        <w:rPr>
-          <w:sz w:val="44"/>
-          <w:szCs w:val="44"/>
-          <w:lang w:bidi="fa-IR"/>
-        </w:rPr>
-        <w:t xml:space="preserve">) and (x - </w:t>
-      </w:r>
-      <w:proofErr w:type="spellStart"/>
-      <w:r>
-        <w:rPr>
-          <w:sz w:val="44"/>
-          <w:szCs w:val="44"/>
-          <w:lang w:bidi="fa-IR"/>
-        </w:rPr>
-        <w:t>ky</w:t>
-      </w:r>
-      <w:proofErr w:type="spellEnd"/>
-      <w:r>
-        <w:rPr>
-          <w:sz w:val="44"/>
-          <w:szCs w:val="44"/>
-          <w:lang w:bidi="fa-IR"/>
-        </w:rPr>
-        <w:t>).</w:t>
+        <w:t>Suppose we have two vectors, (x) and (y), that are orthogonal in the sense of Roberts. For an arbitrary real number (k), draw the vector (ky). The vectors (x) and (ky) form a parallelogram, and when this parallelogram happens to be a rectangle, its diagonals are (x + ky) and (x - ky).</w:t>
       </w:r>
     </w:p>
     <w:p>
@@ -12748,25 +12332,7 @@
           <w:szCs w:val="44"/>
           <w:lang w:bidi="fa-IR"/>
         </w:rPr>
-        <w:t>Consider the following vectors in (\</w:t>
-      </w:r>
-      <w:proofErr w:type="spellStart"/>
-      <w:r>
-        <w:rPr>
-          <w:sz w:val="44"/>
-          <w:szCs w:val="44"/>
-          <w:lang w:bidi="fa-IR"/>
-        </w:rPr>
-        <w:t>mathbb</w:t>
-      </w:r>
-      <w:proofErr w:type="spellEnd"/>
-      <w:r>
-        <w:rPr>
-          <w:sz w:val="44"/>
-          <w:szCs w:val="44"/>
-          <w:lang w:bidi="fa-IR"/>
-        </w:rPr>
-        <w:t>{R}^3) equipped with the infinity norm.</w:t>
+        <w:t>Consider the following vectors in (\mathbb{R}^3) equipped with the infinity norm.</w:t>
       </w:r>
     </w:p>
     <w:p>
@@ -12949,25 +12515,7 @@
           <w:szCs w:val="44"/>
           <w:lang w:bidi="fa-IR"/>
         </w:rPr>
-        <w:t>We work in (\</w:t>
-      </w:r>
-      <w:proofErr w:type="spellStart"/>
-      <w:r>
-        <w:rPr>
-          <w:sz w:val="44"/>
-          <w:szCs w:val="44"/>
-          <w:lang w:bidi="fa-IR"/>
-        </w:rPr>
-        <w:t>mathbb</w:t>
-      </w:r>
-      <w:proofErr w:type="spellEnd"/>
-      <w:r>
-        <w:rPr>
-          <w:sz w:val="44"/>
-          <w:szCs w:val="44"/>
-          <w:lang w:bidi="fa-IR"/>
-        </w:rPr>
-        <w:t>{R}^2) equipped with the infinity norm.</w:t>
+        <w:t>We work in (\mathbb{R}^2) equipped with the infinity norm.</w:t>
       </w:r>
     </w:p>
     <w:p>
@@ -14613,25 +14161,7 @@
           <w:szCs w:val="44"/>
           <w:lang w:bidi="fa-IR"/>
         </w:rPr>
-        <w:t>We'll work in the space (\</w:t>
-      </w:r>
-      <w:proofErr w:type="spellStart"/>
-      <w:r>
-        <w:rPr>
-          <w:sz w:val="44"/>
-          <w:szCs w:val="44"/>
-          <w:lang w:bidi="fa-IR"/>
-        </w:rPr>
-        <w:t>mathbb</w:t>
-      </w:r>
-      <w:proofErr w:type="spellEnd"/>
-      <w:r>
-        <w:rPr>
-          <w:sz w:val="44"/>
-          <w:szCs w:val="44"/>
-          <w:lang w:bidi="fa-IR"/>
-        </w:rPr>
-        <w:t>{R}^2) equipped with the (\ell_1) norm.</w:t>
+        <w:t>We'll work in the space (\mathbb{R}^2) equipped with the (\ell_1) norm.</w:t>
       </w:r>
     </w:p>
     <w:p>
@@ -14812,25 +14342,7 @@
           <w:lang w:bidi="fa-IR"/>
         </w:rPr>
         <w:lastRenderedPageBreak/>
-        <w:t>First, suppose that (\alpha \</w:t>
-      </w:r>
-      <w:proofErr w:type="spellStart"/>
-      <w:r>
-        <w:rPr>
-          <w:sz w:val="44"/>
-          <w:szCs w:val="44"/>
-          <w:lang w:bidi="fa-IR"/>
-        </w:rPr>
-        <w:t>neq</w:t>
-      </w:r>
-      <w:proofErr w:type="spellEnd"/>
-      <w:r>
-        <w:rPr>
-          <w:sz w:val="44"/>
-          <w:szCs w:val="44"/>
-          <w:lang w:bidi="fa-IR"/>
-        </w:rPr>
-        <w:t xml:space="preserve"> 0). By factoring out (\alpha) from the norm and making a simple change of variables, we obtain the desired result.</w:t>
+        <w:t>First, suppose that (\alpha \neq 0). By factoring out (\alpha) from the norm and making a simple change of variables, we obtain the desired result.</w:t>
       </w:r>
     </w:p>
     <w:p>
@@ -15115,36 +14627,867 @@
         <w:rPr>
           <w:sz w:val="44"/>
           <w:szCs w:val="44"/>
+          <w:lang w:bidi="fa-IR"/>
+        </w:rPr>
+      </w:pPr>
+      <w:r>
+        <w:rPr>
+          <w:sz w:val="44"/>
+          <w:szCs w:val="44"/>
+          <w:lang w:bidi="fa-IR"/>
+        </w:rPr>
+        <w:t xml:space="preserve">Now, let's prove that the </w:t>
+      </w:r>
+      <w:r>
+        <w:rPr>
+          <w:b/>
+          <w:bCs/>
+          <w:sz w:val="44"/>
+          <w:szCs w:val="44"/>
+          <w:lang w:bidi="fa-IR"/>
+        </w:rPr>
+        <w:t>Scalar Existence Property</w:t>
+      </w:r>
+      <w:r>
+        <w:rPr>
+          <w:sz w:val="44"/>
+          <w:szCs w:val="44"/>
+          <w:lang w:bidi="fa-IR"/>
+        </w:rPr>
+        <w:t xml:space="preserve"> holds for this notion of orthogonality.</w:t>
+      </w:r>
+    </w:p>
+    <w:p>
+      <w:pPr>
+        <w:rPr>
+          <w:sz w:val="44"/>
+          <w:szCs w:val="44"/>
+          <w:lang w:bidi="fa-IR"/>
+        </w:rPr>
+      </w:pPr>
+      <w:r>
+        <w:rPr>
+          <w:sz w:val="44"/>
+          <w:szCs w:val="44"/>
+          <w:lang w:bidi="fa-IR"/>
+        </w:rPr>
+        <w:t xml:space="preserve">To do this, we first need one of the most fundamental results in Functional Analysis: the </w:t>
+      </w:r>
+      <w:r>
+        <w:rPr>
+          <w:b/>
+          <w:bCs/>
+          <w:sz w:val="44"/>
+          <w:szCs w:val="44"/>
+          <w:lang w:bidi="fa-IR"/>
+        </w:rPr>
+        <w:t>Hahn–Banach Theorem</w:t>
+      </w:r>
+      <w:r>
+        <w:rPr>
+          <w:sz w:val="44"/>
+          <w:szCs w:val="44"/>
+          <w:lang w:bidi="fa-IR"/>
+        </w:rPr>
+        <w:t>.</w:t>
+      </w:r>
+    </w:p>
+    <w:p>
+      <w:pPr>
+        <w:rPr>
+          <w:sz w:val="44"/>
+          <w:szCs w:val="44"/>
+          <w:lang w:bidi="fa-IR"/>
+        </w:rPr>
+      </w:pPr>
+      <w:r>
+        <w:rPr>
+          <w:sz w:val="44"/>
+          <w:szCs w:val="44"/>
+          <w:lang w:bidi="fa-IR"/>
+        </w:rPr>
+        <w:t>Let (X) be a vector space, and let</w:t>
+      </w:r>
+      <w:r>
+        <w:rPr>
+          <w:sz w:val="44"/>
+          <w:szCs w:val="44"/>
+          <w:lang w:bidi="fa-IR"/>
+        </w:rPr>
+        <w:br/>
+        <w:t>p</w:t>
+      </w:r>
+      <w:r>
+        <w:rPr>
+          <w:sz w:val="44"/>
+          <w:szCs w:val="44"/>
+          <w:lang w:bidi="fa-IR"/>
+        </w:rPr>
+        <w:br/>
+        <w:t>be a sublinear function (for our purposes, you can think of (p) as a norm).</w:t>
+      </w:r>
+    </w:p>
+    <w:p>
+      <w:pPr>
+        <w:rPr>
+          <w:rFonts w:eastAsiaTheme="minorEastAsia" w:hint="cs"/>
+          <w:sz w:val="44"/>
+          <w:szCs w:val="44"/>
           <w:rtl/>
           <w:lang w:bidi="fa-IR"/>
         </w:rPr>
       </w:pPr>
-    </w:p>
-    <w:p>
-      <w:pPr>
-        <w:rPr>
+      <w:r>
+        <w:rPr>
+          <w:sz w:val="44"/>
+          <w:szCs w:val="44"/>
+          <w:lang w:bidi="fa-IR"/>
+        </w:rPr>
+        <w:t>Let (M) be a subspace of (X), and let</w:t>
+      </w:r>
+      <w:r>
+        <w:rPr>
+          <w:sz w:val="44"/>
+          <w:szCs w:val="44"/>
+          <w:lang w:bidi="fa-IR"/>
+        </w:rPr>
+        <w:br/>
+        <w:t>f</w:t>
+      </w:r>
+      <w:r>
+        <w:rPr>
+          <w:sz w:val="44"/>
+          <w:szCs w:val="44"/>
+          <w:lang w:bidi="fa-IR"/>
+        </w:rPr>
+        <w:br/>
+      </w:r>
+      <w:r>
+        <w:rPr>
+          <w:sz w:val="44"/>
+          <w:szCs w:val="44"/>
+          <w:lang w:bidi="fa-IR"/>
+        </w:rPr>
+        <w:lastRenderedPageBreak/>
+        <w:t xml:space="preserve">be a linear functional </w:t>
+      </w:r>
+      <w:r>
+        <w:rPr>
+          <w:sz w:val="44"/>
+          <w:szCs w:val="44"/>
+          <w:lang w:bidi="fa-IR"/>
+        </w:rPr>
+        <w:t>.</w:t>
+      </w:r>
+      <w:r>
+        <w:t xml:space="preserve"> </w:t>
+      </w:r>
+      <w:r>
+        <w:rPr>
+          <w:sz w:val="44"/>
+          <w:szCs w:val="44"/>
+          <w:lang w:bidi="fa-IR"/>
+        </w:rPr>
+        <w:t>which must always remain below p</w:t>
+      </w:r>
+      <w:r>
+        <w:rPr>
+          <w:rFonts w:hint="cs"/>
           <w:sz w:val="44"/>
           <w:szCs w:val="44"/>
           <w:rtl/>
           <w:lang w:bidi="fa-IR"/>
         </w:rPr>
-      </w:pPr>
-    </w:p>
-    <w:p>
-      <w:pPr>
-        <w:rPr>
-          <w:sz w:val="44"/>
-          <w:szCs w:val="44"/>
-          <w:lang w:bidi="fa-IR"/>
-        </w:rPr>
-      </w:pPr>
-      <w:r>
-        <w:rPr>
-          <w:sz w:val="44"/>
-          <w:szCs w:val="44"/>
-          <w:lang w:bidi="fa-IR"/>
-        </w:rPr>
-        <w:t>3- :</w:t>
+        <w:t>.</w:t>
+      </w:r>
+    </w:p>
+    <w:p>
+      <w:pPr>
+        <w:rPr>
+          <w:rFonts w:eastAsiaTheme="minorEastAsia"/>
+          <w:sz w:val="44"/>
+          <w:szCs w:val="44"/>
+          <w:lang w:bidi="fa-IR"/>
+        </w:rPr>
+      </w:pPr>
+      <w:r>
+        <w:rPr>
+          <w:sz w:val="44"/>
+          <w:szCs w:val="44"/>
+          <w:lang w:bidi="fa-IR"/>
+        </w:rPr>
+        <w:t>Then there exists a linear functional</w:t>
+      </w:r>
+      <w:r>
+        <w:rPr>
+          <w:sz w:val="44"/>
+          <w:szCs w:val="44"/>
+          <w:lang w:bidi="fa-IR"/>
+        </w:rPr>
+        <w:br/>
+        <w:t>F</w:t>
+      </w:r>
+      <w:r>
+        <w:rPr>
+          <w:sz w:val="44"/>
+          <w:szCs w:val="44"/>
+          <w:lang w:bidi="fa-IR"/>
+        </w:rPr>
+        <w:br/>
+        <w:t>such that</w:t>
+      </w:r>
+    </w:p>
+    <w:p>
+      <w:pPr>
+        <w:rPr>
+          <w:sz w:val="44"/>
+          <w:szCs w:val="44"/>
+          <w:lang w:bidi="fa-IR"/>
+        </w:rPr>
+      </w:pPr>
+      <w:r>
+        <w:rPr>
+          <w:sz w:val="44"/>
+          <w:szCs w:val="44"/>
+          <w:lang w:bidi="fa-IR"/>
+        </w:rPr>
+        <w:t>t</w:t>
+      </w:r>
+      <w:r>
+        <w:rPr>
+          <w:sz w:val="44"/>
+          <w:szCs w:val="44"/>
+          <w:lang w:bidi="fa-IR"/>
+        </w:rPr>
+        <w:t>he following two properties always hold for</w:t>
+      </w:r>
+      <w:r>
+        <w:rPr>
+          <w:sz w:val="44"/>
+          <w:szCs w:val="44"/>
+          <w:lang w:bidi="fa-IR"/>
+        </w:rPr>
+        <w:t xml:space="preserve"> </w:t>
+      </w:r>
+      <w:r>
+        <w:rPr>
+          <w:sz w:val="44"/>
+          <w:szCs w:val="44"/>
+          <w:lang w:bidi="fa-IR"/>
+        </w:rPr>
+        <w:t>it.</w:t>
+      </w:r>
+    </w:p>
+    <w:p>
+      <w:pPr>
+        <w:rPr>
+          <w:sz w:val="44"/>
+          <w:szCs w:val="44"/>
+          <w:lang w:bidi="fa-IR"/>
+        </w:rPr>
+      </w:pPr>
+      <w:r>
+        <w:rPr>
+          <w:sz w:val="44"/>
+          <w:szCs w:val="44"/>
+          <w:lang w:bidi="fa-IR"/>
+        </w:rPr>
+        <w:t>Let's understand this theorem geometrically.</w:t>
+      </w:r>
+    </w:p>
+    <w:p>
+      <w:pPr>
+        <w:rPr>
+          <w:sz w:val="44"/>
+          <w:szCs w:val="44"/>
+          <w:lang w:bidi="fa-IR"/>
+        </w:rPr>
+      </w:pPr>
+      <w:r>
+        <w:rPr>
+          <w:sz w:val="44"/>
+          <w:szCs w:val="44"/>
+          <w:lang w:bidi="fa-IR"/>
+        </w:rPr>
+        <w:t>Imagine that the floor of this room represents our entire vector space, (X). However, we only know what happens along a single line drawn on the floor. That line represents the subspace (M). Everything outside this line is still unknown.</w:t>
+      </w:r>
+    </w:p>
+    <w:p>
+      <w:pPr>
+        <w:rPr>
+          <w:sz w:val="44"/>
+          <w:szCs w:val="44"/>
+          <w:lang w:bidi="fa-IR"/>
+        </w:rPr>
+      </w:pPr>
+      <w:r>
+        <w:rPr>
+          <w:sz w:val="44"/>
+          <w:szCs w:val="44"/>
+          <w:lang w:bidi="fa-IR"/>
+        </w:rPr>
+        <w:t>Now imagine a large roof or tent covering the entire room. This roof represents the sublinear function (p). Nothing is allowed to rise above this roof.</w:t>
+      </w:r>
+    </w:p>
+    <w:p>
+      <w:pPr>
+        <w:rPr>
+          <w:sz w:val="44"/>
+          <w:szCs w:val="44"/>
+          <w:lang w:bidi="fa-IR"/>
+        </w:rPr>
+      </w:pPr>
+      <w:r>
+        <w:rPr>
+          <w:sz w:val="44"/>
+          <w:szCs w:val="44"/>
+          <w:lang w:bidi="fa-IR"/>
+        </w:rPr>
+        <w:t xml:space="preserve">Along our line (M), we already have a linear functional (f). Since it is linear, its graph is simply a straight inclined line. The only requirement is that this line must always remain below the roof. </w:t>
+      </w:r>
+    </w:p>
+    <w:p>
+      <w:pPr>
+        <w:rPr>
+          <w:sz w:val="44"/>
+          <w:szCs w:val="44"/>
+          <w:lang w:bidi="fa-IR"/>
+        </w:rPr>
+      </w:pPr>
+      <w:r>
+        <w:rPr>
+          <w:sz w:val="44"/>
+          <w:szCs w:val="44"/>
+          <w:lang w:bidi="fa-IR"/>
+        </w:rPr>
+        <w:lastRenderedPageBreak/>
+        <w:t>This is exactly where the Hahn–Banach Theorem comes into play.</w:t>
+      </w:r>
+    </w:p>
+    <w:p>
+      <w:pPr>
+        <w:rPr>
+          <w:sz w:val="44"/>
+          <w:szCs w:val="44"/>
+          <w:lang w:bidi="fa-IR"/>
+        </w:rPr>
+      </w:pPr>
+      <w:r>
+        <w:rPr>
+          <w:sz w:val="44"/>
+          <w:szCs w:val="44"/>
+          <w:lang w:bidi="fa-IR"/>
+        </w:rPr>
+        <w:t>The theorem tells us that no matter how complicated the roof may be, as long as our original line stays below it, we can always extend that line to a linear functional (F) defined on the entire space.</w:t>
+      </w:r>
+    </w:p>
+    <w:p>
+      <w:pPr>
+        <w:rPr>
+          <w:sz w:val="44"/>
+          <w:szCs w:val="44"/>
+          <w:lang w:bidi="fa-IR"/>
+        </w:rPr>
+      </w:pPr>
+      <w:r>
+        <w:rPr>
+          <w:sz w:val="44"/>
+          <w:szCs w:val="44"/>
+          <w:lang w:bidi="fa-IR"/>
+        </w:rPr>
+        <w:t>This extension satisfies two important properties:</w:t>
+      </w:r>
+    </w:p>
+    <w:p>
+      <w:pPr>
+        <w:numPr>
+          <w:ilvl w:val="0"/>
+          <w:numId w:val="7"/>
+        </w:numPr>
+        <w:rPr>
+          <w:sz w:val="44"/>
+          <w:szCs w:val="44"/>
+          <w:lang w:bidi="fa-IR"/>
+        </w:rPr>
+      </w:pPr>
+      <w:r>
+        <w:rPr>
+          <w:sz w:val="44"/>
+          <w:szCs w:val="44"/>
+          <w:lang w:bidi="fa-IR"/>
+        </w:rPr>
+        <w:t>It agrees with the original functional on the subspace</w:t>
+      </w:r>
+      <w:r>
+        <w:rPr>
+          <w:sz w:val="44"/>
+          <w:szCs w:val="44"/>
+          <w:lang w:bidi="fa-IR"/>
+        </w:rPr>
+        <w:t>.</w:t>
+      </w:r>
+    </w:p>
+    <w:p>
+      <w:pPr>
+        <w:numPr>
+          <w:ilvl w:val="0"/>
+          <w:numId w:val="7"/>
+        </w:numPr>
+        <w:rPr>
+          <w:sz w:val="44"/>
+          <w:szCs w:val="44"/>
+          <w:lang w:bidi="fa-IR"/>
+        </w:rPr>
+      </w:pPr>
+      <w:r>
+        <w:rPr>
+          <w:sz w:val="44"/>
+          <w:szCs w:val="44"/>
+          <w:lang w:bidi="fa-IR"/>
+        </w:rPr>
+        <w:t>It never rises above the roof anywhere in the whole space</w:t>
+      </w:r>
+      <w:r>
+        <w:rPr>
+          <w:sz w:val="44"/>
+          <w:szCs w:val="44"/>
+          <w:lang w:bidi="fa-IR"/>
+        </w:rPr>
+        <w:t>.</w:t>
+      </w:r>
+    </w:p>
+    <w:p>
+      <w:pPr>
+        <w:rPr>
+          <w:sz w:val="44"/>
+          <w:szCs w:val="44"/>
+          <w:lang w:bidi="fa-IR"/>
+        </w:rPr>
+      </w:pPr>
+      <w:r>
+        <w:rPr>
+          <w:sz w:val="44"/>
+          <w:szCs w:val="44"/>
+          <w:lang w:bidi="fa-IR"/>
+        </w:rPr>
+        <w:t>In other words, we have successfully extended our information from a smaller subspace to the entire vector space without violating the original bound.</w:t>
+      </w:r>
+    </w:p>
+    <w:p>
+      <w:pPr>
+        <w:rPr>
+          <w:sz w:val="44"/>
+          <w:szCs w:val="44"/>
+          <w:lang w:bidi="fa-IR"/>
+        </w:rPr>
+      </w:pPr>
+      <w:r>
+        <w:rPr>
+          <w:sz w:val="44"/>
+          <w:szCs w:val="44"/>
+          <w:lang w:bidi="fa-IR"/>
+        </w:rPr>
+        <w:t>Now, let's return to our proof.</w:t>
+      </w:r>
+    </w:p>
+    <w:p>
+      <w:pPr>
+        <w:rPr>
+          <w:sz w:val="44"/>
+          <w:szCs w:val="44"/>
+          <w:lang w:bidi="fa-IR"/>
+        </w:rPr>
+      </w:pPr>
+      <w:r>
+        <w:rPr>
+          <w:sz w:val="44"/>
+          <w:szCs w:val="44"/>
+          <w:lang w:bidi="fa-IR"/>
+        </w:rPr>
+        <w:t>If (x=0), then the result is immediate.</w:t>
+      </w:r>
+    </w:p>
+    <w:p>
+      <w:pPr>
+        <w:rPr>
+          <w:sz w:val="44"/>
+          <w:szCs w:val="44"/>
+          <w:lang w:bidi="fa-IR"/>
+        </w:rPr>
+      </w:pPr>
+      <w:r>
+        <w:rPr>
+          <w:sz w:val="44"/>
+          <w:szCs w:val="44"/>
+          <w:lang w:bidi="fa-IR"/>
+        </w:rPr>
+        <w:t>So, assume that (x\neq0).</w:t>
+      </w:r>
+    </w:p>
+    <w:p>
+      <w:pPr>
+        <w:rPr>
+          <w:sz w:val="44"/>
+          <w:szCs w:val="44"/>
+          <w:lang w:bidi="fa-IR"/>
+        </w:rPr>
+      </w:pPr>
+      <w:r>
+        <w:rPr>
+          <w:sz w:val="44"/>
+          <w:szCs w:val="44"/>
+          <w:lang w:bidi="fa-IR"/>
+        </w:rPr>
+        <w:lastRenderedPageBreak/>
+        <w:t>By the Hahn–Banach Theorem, we can define a linear functional (f) as follows.</w:t>
+      </w:r>
+    </w:p>
+    <w:p>
+      <w:pPr>
+        <w:rPr>
+          <w:sz w:val="44"/>
+          <w:szCs w:val="44"/>
+          <w:lang w:bidi="fa-IR"/>
+        </w:rPr>
+      </w:pPr>
+      <w:r>
+        <w:rPr>
+          <w:sz w:val="44"/>
+          <w:szCs w:val="44"/>
+          <w:lang w:bidi="fa-IR"/>
+        </w:rPr>
+        <w:t>Our first goal is to compute the scalar (a).</w:t>
+      </w:r>
+    </w:p>
+    <w:p>
+      <w:pPr>
+        <w:rPr>
+          <w:sz w:val="44"/>
+          <w:szCs w:val="44"/>
+          <w:lang w:bidi="fa-IR"/>
+        </w:rPr>
+      </w:pPr>
+      <w:r>
+        <w:rPr>
+          <w:sz w:val="44"/>
+          <w:szCs w:val="44"/>
+          <w:lang w:bidi="fa-IR"/>
+        </w:rPr>
+        <w:t>We choose (a) so that the functional vanishes on a new vector. This is completely analogous to Euclidean geometry, where we choose a scalar so that the inner product of two vectors becomes zero.</w:t>
+      </w:r>
+    </w:p>
+    <w:p>
+      <w:pPr>
+        <w:rPr>
+          <w:sz w:val="44"/>
+          <w:szCs w:val="44"/>
+          <w:lang w:bidi="fa-IR"/>
+        </w:rPr>
+      </w:pPr>
+      <w:r>
+        <w:rPr>
+          <w:sz w:val="44"/>
+          <w:szCs w:val="44"/>
+          <w:lang w:bidi="fa-IR"/>
+        </w:rPr>
+        <w:t>Since (f) is linear, computing (a) is straightforward.</w:t>
+      </w:r>
+    </w:p>
+    <w:p>
+      <w:pPr>
+        <w:rPr>
+          <w:sz w:val="44"/>
+          <w:szCs w:val="44"/>
+          <w:lang w:bidi="fa-IR"/>
+        </w:rPr>
+      </w:pPr>
+      <w:r>
+        <w:rPr>
+          <w:sz w:val="44"/>
+          <w:szCs w:val="44"/>
+          <w:lang w:bidi="fa-IR"/>
+        </w:rPr>
+        <w:t>Next, we define the vector (v) as follows.</w:t>
+      </w:r>
+    </w:p>
+    <w:p>
+      <w:pPr>
+        <w:rPr>
+          <w:sz w:val="44"/>
+          <w:szCs w:val="44"/>
+          <w:lang w:bidi="fa-IR"/>
+        </w:rPr>
+      </w:pPr>
+      <w:r>
+        <w:rPr>
+          <w:sz w:val="44"/>
+          <w:szCs w:val="44"/>
+          <w:lang w:bidi="fa-IR"/>
+        </w:rPr>
+        <w:t xml:space="preserve">Finally, by applying the result obtained in </w:t>
+      </w:r>
+      <w:r>
+        <w:rPr>
+          <w:b/>
+          <w:bCs/>
+          <w:sz w:val="44"/>
+          <w:szCs w:val="44"/>
+          <w:lang w:bidi="fa-IR"/>
+        </w:rPr>
+        <w:t>Step 1</w:t>
+      </w:r>
+      <w:r>
+        <w:rPr>
+          <w:sz w:val="44"/>
+          <w:szCs w:val="44"/>
+          <w:lang w:bidi="fa-IR"/>
+        </w:rPr>
+        <w:t>, together with the Hahn–Banach Theorem, the desired conclusion follows.</w:t>
+      </w:r>
+    </w:p>
+    <w:p>
+      <w:pPr>
+        <w:rPr>
+          <w:sz w:val="44"/>
+          <w:szCs w:val="44"/>
+          <w:lang w:bidi="fa-IR"/>
+        </w:rPr>
+      </w:pPr>
+      <w:r>
+        <w:rPr>
+          <w:sz w:val="44"/>
+          <w:szCs w:val="44"/>
+          <w:lang w:bidi="fa-IR"/>
+        </w:rPr>
+        <w:t xml:space="preserve">Hence, the </w:t>
+      </w:r>
+      <w:r>
+        <w:rPr>
+          <w:b/>
+          <w:bCs/>
+          <w:sz w:val="44"/>
+          <w:szCs w:val="44"/>
+          <w:lang w:bidi="fa-IR"/>
+        </w:rPr>
+        <w:t>Scalar Existence Property</w:t>
+      </w:r>
+      <w:r>
+        <w:rPr>
+          <w:sz w:val="44"/>
+          <w:szCs w:val="44"/>
+          <w:lang w:bidi="fa-IR"/>
+        </w:rPr>
+        <w:t xml:space="preserve"> is proved.</w:t>
+      </w:r>
+    </w:p>
+    <w:p>
+      <w:pPr>
+        <w:rPr>
+          <w:sz w:val="44"/>
+          <w:szCs w:val="44"/>
+          <w:lang w:bidi="fa-IR"/>
+        </w:rPr>
+      </w:pPr>
+      <w:r>
+        <w:rPr>
+          <w:sz w:val="44"/>
+          <w:szCs w:val="44"/>
+          <w:lang w:bidi="fa-IR"/>
+        </w:rPr>
+        <w:t>Now, let's briefly summarize everything using the following table.</w:t>
+      </w:r>
+    </w:p>
+    <w:p>
+      <w:pPr>
+        <w:rPr>
+          <w:sz w:val="44"/>
+          <w:szCs w:val="44"/>
+          <w:lang w:bidi="fa-IR"/>
+        </w:rPr>
+      </w:pPr>
+      <w:r>
+        <w:rPr>
+          <w:sz w:val="44"/>
+          <w:szCs w:val="44"/>
+          <w:lang w:bidi="fa-IR"/>
+        </w:rPr>
+        <w:t xml:space="preserve">As we have seen, </w:t>
+      </w:r>
+      <w:r>
+        <w:rPr>
+          <w:b/>
+          <w:bCs/>
+          <w:sz w:val="44"/>
+          <w:szCs w:val="44"/>
+          <w:lang w:bidi="fa-IR"/>
+        </w:rPr>
+        <w:t>Birkhoff–James orthogonality</w:t>
+      </w:r>
+      <w:r>
+        <w:rPr>
+          <w:sz w:val="44"/>
+          <w:szCs w:val="44"/>
+          <w:lang w:bidi="fa-IR"/>
+        </w:rPr>
+        <w:t xml:space="preserve"> satisfies the </w:t>
+      </w:r>
+      <w:r>
+        <w:rPr>
+          <w:b/>
+          <w:bCs/>
+          <w:sz w:val="44"/>
+          <w:szCs w:val="44"/>
+          <w:lang w:bidi="fa-IR"/>
+        </w:rPr>
+        <w:t>Homogeneity</w:t>
+      </w:r>
+      <w:r>
+        <w:rPr>
+          <w:sz w:val="44"/>
+          <w:szCs w:val="44"/>
+          <w:lang w:bidi="fa-IR"/>
+        </w:rPr>
+        <w:t xml:space="preserve"> and </w:t>
+      </w:r>
+      <w:r>
+        <w:rPr>
+          <w:b/>
+          <w:bCs/>
+          <w:sz w:val="44"/>
+          <w:szCs w:val="44"/>
+          <w:lang w:bidi="fa-IR"/>
+        </w:rPr>
+        <w:t>Scalar Existence</w:t>
+      </w:r>
+      <w:r>
+        <w:rPr>
+          <w:sz w:val="44"/>
+          <w:szCs w:val="44"/>
+          <w:lang w:bidi="fa-IR"/>
+        </w:rPr>
+        <w:t xml:space="preserve"> properties.</w:t>
+      </w:r>
+    </w:p>
+    <w:p>
+      <w:pPr>
+        <w:rPr>
+          <w:sz w:val="44"/>
+          <w:szCs w:val="44"/>
+          <w:lang w:bidi="fa-IR"/>
+        </w:rPr>
+      </w:pPr>
+      <w:r>
+        <w:rPr>
+          <w:sz w:val="44"/>
+          <w:szCs w:val="44"/>
+          <w:lang w:bidi="fa-IR"/>
+        </w:rPr>
+        <w:lastRenderedPageBreak/>
+        <w:t xml:space="preserve">However, the </w:t>
+      </w:r>
+      <w:r>
+        <w:rPr>
+          <w:b/>
+          <w:bCs/>
+          <w:sz w:val="44"/>
+          <w:szCs w:val="44"/>
+          <w:lang w:bidi="fa-IR"/>
+        </w:rPr>
+        <w:t>Symmetry</w:t>
+      </w:r>
+      <w:r>
+        <w:rPr>
+          <w:sz w:val="44"/>
+          <w:szCs w:val="44"/>
+          <w:lang w:bidi="fa-IR"/>
+        </w:rPr>
+        <w:t xml:space="preserve"> and </w:t>
+      </w:r>
+      <w:r>
+        <w:rPr>
+          <w:b/>
+          <w:bCs/>
+          <w:sz w:val="44"/>
+          <w:szCs w:val="44"/>
+          <w:lang w:bidi="fa-IR"/>
+        </w:rPr>
+        <w:t>Additivity</w:t>
+      </w:r>
+      <w:r>
+        <w:rPr>
+          <w:sz w:val="44"/>
+          <w:szCs w:val="44"/>
+          <w:lang w:bidi="fa-IR"/>
+        </w:rPr>
+        <w:t xml:space="preserve"> properties do </w:t>
+      </w:r>
+      <w:r>
+        <w:rPr>
+          <w:b/>
+          <w:bCs/>
+          <w:sz w:val="44"/>
+          <w:szCs w:val="44"/>
+          <w:lang w:bidi="fa-IR"/>
+        </w:rPr>
+        <w:t>not</w:t>
+      </w:r>
+      <w:r>
+        <w:rPr>
+          <w:sz w:val="44"/>
+          <w:szCs w:val="44"/>
+          <w:lang w:bidi="fa-IR"/>
+        </w:rPr>
+        <w:t xml:space="preserve"> hold in general.</w:t>
+      </w:r>
+    </w:p>
+    <w:p>
+      <w:pPr>
+        <w:rPr>
+          <w:sz w:val="44"/>
+          <w:szCs w:val="44"/>
+          <w:lang w:bidi="fa-IR"/>
+        </w:rPr>
+      </w:pPr>
+      <w:r>
+        <w:rPr>
+          <w:sz w:val="44"/>
+          <w:szCs w:val="44"/>
+          <w:lang w:bidi="fa-IR"/>
+        </w:rPr>
+        <w:t>So, among these four fundamental properties, Birkhoff–James orthogonality satisfies exactly two and fails to satisfy the other two.</w:t>
+      </w:r>
+    </w:p>
+    <w:p>
+      <w:pPr>
+        <w:rPr>
+          <w:sz w:val="44"/>
+          <w:szCs w:val="44"/>
+          <w:lang w:bidi="fa-IR"/>
+        </w:rPr>
+      </w:pPr>
+      <w:r>
+        <w:rPr>
+          <w:sz w:val="44"/>
+          <w:szCs w:val="44"/>
+          <w:lang w:bidi="fa-IR"/>
+        </w:rPr>
+        <w:t>3-</w:t>
+      </w:r>
+      <w:r>
+        <w:rPr>
+          <w:sz w:val="44"/>
+          <w:szCs w:val="44"/>
+          <w:lang w:bidi="fa-IR"/>
+        </w:rPr>
+        <w:t>8</w:t>
+      </w:r>
+      <w:r>
+        <w:rPr>
+          <w:sz w:val="44"/>
+          <w:szCs w:val="44"/>
+          <w:lang w:bidi="fa-IR"/>
+        </w:rPr>
+        <w:t>:</w:t>
       </w:r>
     </w:p>
     <w:p>
@@ -15240,59 +15583,49 @@
           <w:szCs w:val="44"/>
           <w:lang w:bidi="fa-IR"/>
         </w:rPr>
-        <w:t xml:space="preserve">if and </w:t>
-      </w:r>
-      <w:r>
-        <w:rPr>
-          <w:b/>
-          <w:bCs/>
+        <w:t>if and only if</w:t>
+      </w:r>
+      <w:r>
+        <w:rPr>
+          <w:sz w:val="44"/>
+          <w:szCs w:val="44"/>
+          <w:lang w:bidi="fa-IR"/>
+        </w:rPr>
+        <w:t xml:space="preserve"> Birkhoff–James orthogonality is symmetric on (X).</w:t>
+      </w:r>
+    </w:p>
+    <w:p>
+      <w:pPr>
+        <w:rPr>
+          <w:sz w:val="44"/>
+          <w:szCs w:val="44"/>
+          <w:lang w:bidi="fa-IR"/>
+        </w:rPr>
+      </w:pPr>
+      <w:r>
+        <w:rPr>
+          <w:sz w:val="44"/>
+          <w:szCs w:val="44"/>
+          <w:lang w:bidi="fa-IR"/>
+        </w:rPr>
+        <w:t>In other words, when the dimension of the space is three or higher, symmetry of Birkhoff–James orthogonality completely characterizes inner product spaces.</w:t>
+      </w:r>
+    </w:p>
+    <w:p>
+      <w:pPr>
+        <w:rPr>
+          <w:sz w:val="44"/>
+          <w:szCs w:val="44"/>
+          <w:lang w:bidi="fa-IR"/>
+        </w:rPr>
+      </w:pPr>
+      <w:r>
+        <w:rPr>
           <w:sz w:val="44"/>
           <w:szCs w:val="44"/>
           <w:lang w:bidi="fa-IR"/>
         </w:rPr>
         <w:lastRenderedPageBreak/>
-        <w:t>only if</w:t>
-      </w:r>
-      <w:r>
-        <w:rPr>
-          <w:sz w:val="44"/>
-          <w:szCs w:val="44"/>
-          <w:lang w:bidi="fa-IR"/>
-        </w:rPr>
-        <w:t xml:space="preserve"> Birkhoff–James orthogonality is symmetric on (X).</w:t>
-      </w:r>
-    </w:p>
-    <w:p>
-      <w:pPr>
-        <w:rPr>
-          <w:sz w:val="44"/>
-          <w:szCs w:val="44"/>
-          <w:lang w:bidi="fa-IR"/>
-        </w:rPr>
-      </w:pPr>
-      <w:r>
-        <w:rPr>
-          <w:sz w:val="44"/>
-          <w:szCs w:val="44"/>
-          <w:lang w:bidi="fa-IR"/>
-        </w:rPr>
-        <w:t>In other words, when the dimension of the space is three or higher, symmetry of Birkhoff–James orthogonality completely characterizes inner product spaces.</w:t>
-      </w:r>
-    </w:p>
-    <w:p>
-      <w:pPr>
-        <w:rPr>
-          <w:sz w:val="44"/>
-          <w:szCs w:val="44"/>
-          <w:lang w:bidi="fa-IR"/>
-        </w:rPr>
-      </w:pPr>
-      <w:r>
-        <w:rPr>
-          <w:sz w:val="44"/>
-          <w:szCs w:val="44"/>
-          <w:lang w:bidi="fa-IR"/>
-        </w:rPr>
         <w:t xml:space="preserve">But this result does </w:t>
       </w:r>
       <w:r>
@@ -15382,6 +15715,836 @@
           <w:lang w:bidi="fa-IR"/>
         </w:rPr>
         <w:t>So, the dimension assumption in the theorem is essential.</w:t>
+      </w:r>
+    </w:p>
+    <w:p>
+      <w:pPr>
+        <w:rPr>
+          <w:sz w:val="44"/>
+          <w:szCs w:val="44"/>
+          <w:lang w:bidi="fa-IR"/>
+        </w:rPr>
+      </w:pPr>
+      <w:r>
+        <w:rPr>
+          <w:sz w:val="44"/>
+          <w:szCs w:val="44"/>
+          <w:lang w:bidi="fa-IR"/>
+        </w:rPr>
+        <w:t>3-9:</w:t>
+      </w:r>
+    </w:p>
+    <w:p>
+      <w:pPr>
+        <w:rPr>
+          <w:sz w:val="44"/>
+          <w:szCs w:val="44"/>
+          <w:lang w:bidi="fa-IR"/>
+        </w:rPr>
+      </w:pPr>
+      <w:r>
+        <w:rPr>
+          <w:sz w:val="44"/>
+          <w:szCs w:val="44"/>
+          <w:lang w:bidi="fa-IR"/>
+        </w:rPr>
+        <w:t xml:space="preserve">One interesting aspect of </w:t>
+      </w:r>
+      <w:r>
+        <w:rPr>
+          <w:b/>
+          <w:bCs/>
+          <w:sz w:val="44"/>
+          <w:szCs w:val="44"/>
+          <w:lang w:bidi="fa-IR"/>
+        </w:rPr>
+        <w:t>Birkhoff–James orthogonality</w:t>
+      </w:r>
+      <w:r>
+        <w:rPr>
+          <w:sz w:val="44"/>
+          <w:szCs w:val="44"/>
+          <w:lang w:bidi="fa-IR"/>
+        </w:rPr>
+        <w:t xml:space="preserve"> is that it does not suffer from the severe limitations we encountered with </w:t>
+      </w:r>
+      <w:r>
+        <w:rPr>
+          <w:b/>
+          <w:bCs/>
+          <w:sz w:val="44"/>
+          <w:szCs w:val="44"/>
+          <w:lang w:bidi="fa-IR"/>
+        </w:rPr>
+        <w:t>Roberts orthogonality</w:t>
+      </w:r>
+      <w:r>
+        <w:rPr>
+          <w:sz w:val="44"/>
+          <w:szCs w:val="44"/>
+          <w:lang w:bidi="fa-IR"/>
+        </w:rPr>
+        <w:t>.</w:t>
+      </w:r>
+    </w:p>
+    <w:p>
+      <w:pPr>
+        <w:rPr>
+          <w:sz w:val="44"/>
+          <w:szCs w:val="44"/>
+          <w:lang w:bidi="fa-IR"/>
+        </w:rPr>
+      </w:pPr>
+      <w:r>
+        <w:rPr>
+          <w:sz w:val="44"/>
+          <w:szCs w:val="44"/>
+          <w:lang w:bidi="fa-IR"/>
+        </w:rPr>
+        <w:t xml:space="preserve">In fact, there is an important result known as the </w:t>
+      </w:r>
+      <w:r>
+        <w:rPr>
+          <w:b/>
+          <w:bCs/>
+          <w:sz w:val="44"/>
+          <w:szCs w:val="44"/>
+          <w:lang w:bidi="fa-IR"/>
+        </w:rPr>
+        <w:t>Existence Theorem</w:t>
+      </w:r>
+      <w:r>
+        <w:rPr>
+          <w:sz w:val="44"/>
+          <w:szCs w:val="44"/>
+          <w:lang w:bidi="fa-IR"/>
+        </w:rPr>
+        <w:t>.</w:t>
+      </w:r>
+    </w:p>
+    <w:p>
+      <w:pPr>
+        <w:rPr>
+          <w:sz w:val="44"/>
+          <w:szCs w:val="44"/>
+          <w:lang w:bidi="fa-IR"/>
+        </w:rPr>
+      </w:pPr>
+      <w:r>
+        <w:rPr>
+          <w:sz w:val="44"/>
+          <w:szCs w:val="44"/>
+          <w:lang w:bidi="fa-IR"/>
+        </w:rPr>
+        <w:t xml:space="preserve">The theorem says that for every nonzero vector, we can always find vectors that are Birkhoff–James orthogonal to it, both from the left and from the right. </w:t>
+      </w:r>
+      <w:r>
+        <w:rPr>
+          <w:sz w:val="44"/>
+          <w:szCs w:val="44"/>
+          <w:lang w:bidi="fa-IR"/>
+        </w:rPr>
+        <w:t xml:space="preserve"> </w:t>
+      </w:r>
+    </w:p>
+    <w:p>
+      <w:pPr>
+        <w:rPr>
+          <w:sz w:val="44"/>
+          <w:szCs w:val="44"/>
+          <w:lang w:bidi="fa-IR"/>
+        </w:rPr>
+      </w:pPr>
+      <w:r>
+        <w:rPr>
+          <w:sz w:val="44"/>
+          <w:szCs w:val="44"/>
+          <w:lang w:bidi="fa-IR"/>
+        </w:rPr>
+        <w:lastRenderedPageBreak/>
+        <w:t xml:space="preserve">There is another important result called the </w:t>
+      </w:r>
+      <w:r>
+        <w:rPr>
+          <w:b/>
+          <w:bCs/>
+          <w:sz w:val="44"/>
+          <w:szCs w:val="44"/>
+          <w:lang w:bidi="fa-IR"/>
+        </w:rPr>
+        <w:t>Existence Theorem for Scalars</w:t>
+      </w:r>
+      <w:r>
+        <w:rPr>
+          <w:sz w:val="44"/>
+          <w:szCs w:val="44"/>
+          <w:lang w:bidi="fa-IR"/>
+        </w:rPr>
+        <w:t>.</w:t>
+      </w:r>
+    </w:p>
+    <w:p>
+      <w:pPr>
+        <w:rPr>
+          <w:sz w:val="44"/>
+          <w:szCs w:val="44"/>
+          <w:lang w:bidi="fa-IR"/>
+        </w:rPr>
+      </w:pPr>
+      <w:r>
+        <w:rPr>
+          <w:sz w:val="44"/>
+          <w:szCs w:val="44"/>
+          <w:lang w:bidi="fa-IR"/>
+        </w:rPr>
+        <w:t>The main idea of this theorem is that for any two vectors, we can always adjust one of them by choosing an appropriate scalar so that the resulting vector becomes Birkhoff–James orthogonal to the other. Moreover, the theorem guarantees that these scalars lie within certain bounds.</w:t>
+      </w:r>
+    </w:p>
+    <w:p>
+      <w:pPr>
+        <w:rPr>
+          <w:sz w:val="44"/>
+          <w:szCs w:val="44"/>
+          <w:lang w:bidi="fa-IR"/>
+        </w:rPr>
+      </w:pPr>
+      <w:r>
+        <w:rPr>
+          <w:sz w:val="44"/>
+          <w:szCs w:val="44"/>
+          <w:lang w:bidi="fa-IR"/>
+        </w:rPr>
+        <w:t xml:space="preserve">This naturally leads us to the concepts of </w:t>
+      </w:r>
+      <w:r>
+        <w:rPr>
+          <w:b/>
+          <w:bCs/>
+          <w:sz w:val="44"/>
+          <w:szCs w:val="44"/>
+          <w:lang w:bidi="fa-IR"/>
+        </w:rPr>
+        <w:t>right uniqueness</w:t>
+      </w:r>
+      <w:r>
+        <w:rPr>
+          <w:sz w:val="44"/>
+          <w:szCs w:val="44"/>
+          <w:lang w:bidi="fa-IR"/>
+        </w:rPr>
+        <w:t xml:space="preserve"> and </w:t>
+      </w:r>
+      <w:r>
+        <w:rPr>
+          <w:b/>
+          <w:bCs/>
+          <w:sz w:val="44"/>
+          <w:szCs w:val="44"/>
+          <w:lang w:bidi="fa-IR"/>
+        </w:rPr>
+        <w:t>left uniqueness</w:t>
+      </w:r>
+      <w:r>
+        <w:rPr>
+          <w:sz w:val="44"/>
+          <w:szCs w:val="44"/>
+          <w:lang w:bidi="fa-IR"/>
+        </w:rPr>
+        <w:t>.</w:t>
+      </w:r>
+    </w:p>
+    <w:p>
+      <w:pPr>
+        <w:rPr>
+          <w:sz w:val="44"/>
+          <w:szCs w:val="44"/>
+          <w:lang w:bidi="fa-IR"/>
+        </w:rPr>
+      </w:pPr>
+      <w:r>
+        <w:rPr>
+          <w:sz w:val="44"/>
+          <w:szCs w:val="44"/>
+          <w:lang w:bidi="fa-IR"/>
+        </w:rPr>
+        <w:t>If there is exactly one scalar that makes</w:t>
+      </w:r>
+      <w:r>
+        <w:rPr>
+          <w:sz w:val="44"/>
+          <w:szCs w:val="44"/>
+          <w:lang w:bidi="fa-IR"/>
+        </w:rPr>
+        <w:br/>
+        <w:t>[</w:t>
+      </w:r>
+      <w:r>
+        <w:rPr>
+          <w:sz w:val="44"/>
+          <w:szCs w:val="44"/>
+          <w:lang w:bidi="fa-IR"/>
+        </w:rPr>
+        <w:br/>
+        <w:t xml:space="preserve">x </w:t>
+      </w:r>
+      <w:r>
+        <w:rPr>
+          <w:sz w:val="44"/>
+          <w:szCs w:val="44"/>
+          <w:lang w:bidi="fa-IR"/>
+        </w:rPr>
+        <w:t xml:space="preserve">orthogonal to </w:t>
+      </w:r>
+      <w:r>
+        <w:rPr>
+          <w:sz w:val="44"/>
+          <w:szCs w:val="44"/>
+          <w:lang w:bidi="fa-IR"/>
+        </w:rPr>
+        <w:t>\lambda x + y</w:t>
+      </w:r>
+      <w:r>
+        <w:rPr>
+          <w:sz w:val="44"/>
+          <w:szCs w:val="44"/>
+          <w:lang w:bidi="fa-IR"/>
+        </w:rPr>
+        <w:t xml:space="preserve"> </w:t>
+      </w:r>
+      <w:r>
+        <w:rPr>
+          <w:sz w:val="44"/>
+          <w:szCs w:val="44"/>
+          <w:lang w:bidi="fa-IR"/>
+        </w:rPr>
+        <w:t>,</w:t>
+      </w:r>
+      <w:r>
+        <w:rPr>
+          <w:sz w:val="44"/>
+          <w:szCs w:val="44"/>
+          <w:lang w:bidi="fa-IR"/>
+        </w:rPr>
+        <w:br/>
+        <w:t>]</w:t>
+      </w:r>
+      <w:r>
+        <w:rPr>
+          <w:sz w:val="44"/>
+          <w:szCs w:val="44"/>
+          <w:lang w:bidi="fa-IR"/>
+        </w:rPr>
+        <w:br/>
+        <w:t xml:space="preserve">then we say the orthogonality is </w:t>
+      </w:r>
+      <w:r>
+        <w:rPr>
+          <w:b/>
+          <w:bCs/>
+          <w:sz w:val="44"/>
+          <w:szCs w:val="44"/>
+          <w:lang w:bidi="fa-IR"/>
+        </w:rPr>
+        <w:t>right-unique</w:t>
+      </w:r>
+      <w:r>
+        <w:rPr>
+          <w:sz w:val="44"/>
+          <w:szCs w:val="44"/>
+          <w:lang w:bidi="fa-IR"/>
+        </w:rPr>
+        <w:t>.</w:t>
+      </w:r>
+    </w:p>
+    <w:p>
+      <w:pPr>
+        <w:rPr>
+          <w:sz w:val="44"/>
+          <w:szCs w:val="44"/>
+          <w:lang w:bidi="fa-IR"/>
+        </w:rPr>
+      </w:pPr>
+      <w:r>
+        <w:rPr>
+          <w:sz w:val="44"/>
+          <w:szCs w:val="44"/>
+          <w:lang w:bidi="fa-IR"/>
+        </w:rPr>
+        <w:t>Similarly, if there is exactly one scalar that makes</w:t>
+      </w:r>
+      <w:r>
+        <w:rPr>
+          <w:sz w:val="44"/>
+          <w:szCs w:val="44"/>
+          <w:lang w:bidi="fa-IR"/>
+        </w:rPr>
+        <w:br/>
+        <w:t>[</w:t>
+      </w:r>
+      <w:r>
+        <w:rPr>
+          <w:sz w:val="44"/>
+          <w:szCs w:val="44"/>
+          <w:lang w:bidi="fa-IR"/>
+        </w:rPr>
+        <w:br/>
+        <w:t>(\mu x + y</w:t>
+      </w:r>
+      <w:r>
+        <w:rPr>
+          <w:sz w:val="44"/>
+          <w:szCs w:val="44"/>
+          <w:lang w:bidi="fa-IR"/>
+        </w:rPr>
+        <w:t xml:space="preserve">) </w:t>
+      </w:r>
+      <w:r>
+        <w:rPr>
+          <w:sz w:val="44"/>
+          <w:szCs w:val="44"/>
+          <w:lang w:bidi="fa-IR"/>
+        </w:rPr>
+        <w:t>orthogonal to</w:t>
+      </w:r>
+      <w:r>
+        <w:rPr>
+          <w:sz w:val="44"/>
+          <w:szCs w:val="44"/>
+          <w:lang w:bidi="fa-IR"/>
+        </w:rPr>
+        <w:t xml:space="preserve"> </w:t>
+      </w:r>
+      <w:r>
+        <w:rPr>
+          <w:sz w:val="44"/>
+          <w:szCs w:val="44"/>
+          <w:lang w:bidi="fa-IR"/>
+        </w:rPr>
+        <w:t xml:space="preserve"> </w:t>
+      </w:r>
+      <w:r>
+        <w:rPr>
+          <w:sz w:val="44"/>
+          <w:szCs w:val="44"/>
+          <w:lang w:bidi="fa-IR"/>
+        </w:rPr>
+        <w:t>x,</w:t>
+      </w:r>
+      <w:r>
+        <w:rPr>
+          <w:sz w:val="44"/>
+          <w:szCs w:val="44"/>
+          <w:lang w:bidi="fa-IR"/>
+        </w:rPr>
+        <w:br/>
+      </w:r>
+      <w:r>
+        <w:rPr>
+          <w:sz w:val="44"/>
+          <w:szCs w:val="44"/>
+          <w:lang w:bidi="fa-IR"/>
+        </w:rPr>
+        <w:lastRenderedPageBreak/>
+        <w:t>]</w:t>
+      </w:r>
+      <w:r>
+        <w:rPr>
+          <w:sz w:val="44"/>
+          <w:szCs w:val="44"/>
+          <w:lang w:bidi="fa-IR"/>
+        </w:rPr>
+        <w:br/>
+        <w:t xml:space="preserve">then we say it is </w:t>
+      </w:r>
+      <w:r>
+        <w:rPr>
+          <w:b/>
+          <w:bCs/>
+          <w:sz w:val="44"/>
+          <w:szCs w:val="44"/>
+          <w:lang w:bidi="fa-IR"/>
+        </w:rPr>
+        <w:t>left-unique</w:t>
+      </w:r>
+      <w:r>
+        <w:rPr>
+          <w:sz w:val="44"/>
+          <w:szCs w:val="44"/>
+          <w:lang w:bidi="fa-IR"/>
+        </w:rPr>
+        <w:t>.</w:t>
+      </w:r>
+    </w:p>
+    <w:p>
+      <w:pPr>
+        <w:rPr>
+          <w:sz w:val="44"/>
+          <w:szCs w:val="44"/>
+          <w:lang w:bidi="fa-IR"/>
+        </w:rPr>
+      </w:pPr>
+      <w:r>
+        <w:rPr>
+          <w:sz w:val="44"/>
+          <w:szCs w:val="44"/>
+          <w:lang w:bidi="fa-IR"/>
+        </w:rPr>
+        <w:t>Now the natural question is:</w:t>
+      </w:r>
+    </w:p>
+    <w:p>
+      <w:pPr>
+        <w:rPr>
+          <w:sz w:val="44"/>
+          <w:szCs w:val="44"/>
+          <w:lang w:bidi="fa-IR"/>
+        </w:rPr>
+      </w:pPr>
+      <w:r>
+        <w:rPr>
+          <w:b/>
+          <w:bCs/>
+          <w:sz w:val="44"/>
+          <w:szCs w:val="44"/>
+          <w:lang w:bidi="fa-IR"/>
+        </w:rPr>
+        <w:t>Under what conditions do these uniqueness properties hold?</w:t>
+      </w:r>
+    </w:p>
+    <w:p>
+      <w:pPr>
+        <w:rPr>
+          <w:sz w:val="44"/>
+          <w:szCs w:val="44"/>
+          <w:lang w:bidi="fa-IR"/>
+        </w:rPr>
+      </w:pPr>
+      <w:r>
+        <w:rPr>
+          <w:sz w:val="44"/>
+          <w:szCs w:val="44"/>
+          <w:lang w:bidi="fa-IR"/>
+        </w:rPr>
+        <w:t xml:space="preserve">Let's begin with </w:t>
+      </w:r>
+      <w:r>
+        <w:rPr>
+          <w:b/>
+          <w:bCs/>
+          <w:sz w:val="44"/>
+          <w:szCs w:val="44"/>
+          <w:lang w:bidi="fa-IR"/>
+        </w:rPr>
+        <w:t>right uniqueness</w:t>
+      </w:r>
+      <w:r>
+        <w:rPr>
+          <w:sz w:val="44"/>
+          <w:szCs w:val="44"/>
+          <w:lang w:bidi="fa-IR"/>
+        </w:rPr>
+        <w:t>.</w:t>
+      </w:r>
+    </w:p>
+    <w:p>
+      <w:pPr>
+        <w:rPr>
+          <w:sz w:val="44"/>
+          <w:szCs w:val="44"/>
+          <w:lang w:bidi="fa-IR"/>
+        </w:rPr>
+      </w:pPr>
+      <w:r>
+        <w:rPr>
+          <w:sz w:val="44"/>
+          <w:szCs w:val="44"/>
+          <w:lang w:bidi="fa-IR"/>
+        </w:rPr>
+        <w:t xml:space="preserve">A beautiful theorem tells us that right uniqueness is equivalent to the </w:t>
+      </w:r>
+      <w:r>
+        <w:rPr>
+          <w:b/>
+          <w:bCs/>
+          <w:sz w:val="44"/>
+          <w:szCs w:val="44"/>
+          <w:lang w:bidi="fa-IR"/>
+        </w:rPr>
+        <w:t>additivity</w:t>
+      </w:r>
+      <w:r>
+        <w:rPr>
+          <w:sz w:val="44"/>
+          <w:szCs w:val="44"/>
+          <w:lang w:bidi="fa-IR"/>
+        </w:rPr>
+        <w:t xml:space="preserve"> property.</w:t>
+      </w:r>
+    </w:p>
+    <w:p>
+      <w:pPr>
+        <w:rPr>
+          <w:sz w:val="44"/>
+          <w:szCs w:val="44"/>
+          <w:lang w:bidi="fa-IR"/>
+        </w:rPr>
+      </w:pPr>
+      <w:r>
+        <w:rPr>
+          <w:sz w:val="44"/>
+          <w:szCs w:val="44"/>
+          <w:lang w:bidi="fa-IR"/>
+        </w:rPr>
+        <w:t xml:space="preserve">Now let's move on to </w:t>
+      </w:r>
+      <w:r>
+        <w:rPr>
+          <w:b/>
+          <w:bCs/>
+          <w:sz w:val="44"/>
+          <w:szCs w:val="44"/>
+          <w:lang w:bidi="fa-IR"/>
+        </w:rPr>
+        <w:t>left uniqueness</w:t>
+      </w:r>
+      <w:r>
+        <w:rPr>
+          <w:sz w:val="44"/>
+          <w:szCs w:val="44"/>
+          <w:lang w:bidi="fa-IR"/>
+        </w:rPr>
+        <w:t>.</w:t>
+      </w:r>
+    </w:p>
+    <w:p>
+      <w:pPr>
+        <w:rPr>
+          <w:sz w:val="44"/>
+          <w:szCs w:val="44"/>
+          <w:lang w:bidi="fa-IR"/>
+        </w:rPr>
+      </w:pPr>
+      <w:r>
+        <w:rPr>
+          <w:sz w:val="44"/>
+          <w:szCs w:val="44"/>
+          <w:lang w:bidi="fa-IR"/>
+        </w:rPr>
+        <w:t xml:space="preserve">Before stating the corresponding theorem, we first need to introduce the notion of </w:t>
+      </w:r>
+      <w:r>
+        <w:rPr>
+          <w:b/>
+          <w:bCs/>
+          <w:sz w:val="44"/>
+          <w:szCs w:val="44"/>
+          <w:lang w:bidi="fa-IR"/>
+        </w:rPr>
+        <w:t>strict convexity</w:t>
+      </w:r>
+      <w:r>
+        <w:rPr>
+          <w:sz w:val="44"/>
+          <w:szCs w:val="44"/>
+          <w:lang w:bidi="fa-IR"/>
+        </w:rPr>
+        <w:t>.</w:t>
+      </w:r>
+    </w:p>
+    <w:p>
+      <w:pPr>
+        <w:rPr>
+          <w:sz w:val="44"/>
+          <w:szCs w:val="44"/>
+          <w:rtl/>
+          <w:lang w:bidi="fa-IR"/>
+        </w:rPr>
+      </w:pPr>
+      <w:r>
+        <w:rPr>
+          <w:sz w:val="44"/>
+          <w:szCs w:val="44"/>
+          <w:lang w:bidi="fa-IR"/>
+        </w:rPr>
+        <w:t>A normed space is called strictly convex if, whenever we pick two distinct points on the boundary of the unit ball, the line segment joining them lies entirely inside the unit ball, except for its two endpoints</w:t>
+      </w:r>
+      <w:r>
+        <w:rPr>
+          <w:rFonts w:hint="cs"/>
+          <w:sz w:val="44"/>
+          <w:szCs w:val="44"/>
+          <w:rtl/>
+          <w:lang w:bidi="fa-IR"/>
+        </w:rPr>
+        <w:t>.</w:t>
+      </w:r>
+    </w:p>
+    <w:p>
+      <w:pPr>
+        <w:rPr>
+          <w:sz w:val="44"/>
+          <w:szCs w:val="44"/>
+          <w:lang w:bidi="fa-IR"/>
+        </w:rPr>
+      </w:pPr>
+      <w:r>
+        <w:rPr>
+          <w:sz w:val="44"/>
+          <w:szCs w:val="44"/>
+          <w:lang w:bidi="fa-IR"/>
+        </w:rPr>
+        <w:t>To understand this geometrically, look at the following two figures.</w:t>
+      </w:r>
+    </w:p>
+    <w:p>
+      <w:pPr>
+        <w:rPr>
+          <w:sz w:val="44"/>
+          <w:szCs w:val="44"/>
+          <w:rtl/>
+          <w:lang w:bidi="fa-IR"/>
+        </w:rPr>
+      </w:pPr>
+      <w:r>
+        <w:rPr>
+          <w:sz w:val="44"/>
+          <w:szCs w:val="44"/>
+          <w:lang w:bidi="fa-IR"/>
+        </w:rPr>
+        <w:lastRenderedPageBreak/>
+        <w:t>In the first figure, the condition we just discussed is satisfied</w:t>
+      </w:r>
+      <w:r>
+        <w:rPr>
+          <w:rFonts w:hint="cs"/>
+          <w:sz w:val="44"/>
+          <w:szCs w:val="44"/>
+          <w:rtl/>
+          <w:lang w:bidi="fa-IR"/>
+        </w:rPr>
+        <w:t>.</w:t>
+      </w:r>
+    </w:p>
+    <w:p>
+      <w:pPr>
+        <w:rPr>
+          <w:sz w:val="44"/>
+          <w:szCs w:val="44"/>
+          <w:lang w:bidi="fa-IR"/>
+        </w:rPr>
+      </w:pPr>
+      <w:r>
+        <w:rPr>
+          <w:sz w:val="44"/>
+          <w:szCs w:val="44"/>
+          <w:lang w:bidi="fa-IR"/>
+        </w:rPr>
+        <w:t>In the second figure, however, that entire line segment lies on the boundary itself.</w:t>
+      </w:r>
+    </w:p>
+    <w:p>
+      <w:pPr>
+        <w:rPr>
+          <w:sz w:val="44"/>
+          <w:szCs w:val="44"/>
+          <w:lang w:bidi="fa-IR"/>
+        </w:rPr>
+      </w:pPr>
+      <w:r>
+        <w:rPr>
+          <w:sz w:val="44"/>
+          <w:szCs w:val="44"/>
+          <w:lang w:bidi="fa-IR"/>
+        </w:rPr>
+        <w:t xml:space="preserve">Only the first situation represents a </w:t>
+      </w:r>
+      <w:r>
+        <w:rPr>
+          <w:b/>
+          <w:bCs/>
+          <w:sz w:val="44"/>
+          <w:szCs w:val="44"/>
+          <w:lang w:bidi="fa-IR"/>
+        </w:rPr>
+        <w:t>strictly convex</w:t>
+      </w:r>
+      <w:r>
+        <w:rPr>
+          <w:sz w:val="44"/>
+          <w:szCs w:val="44"/>
+          <w:lang w:bidi="fa-IR"/>
+        </w:rPr>
+        <w:t xml:space="preserve"> unit ball.</w:t>
+      </w:r>
+    </w:p>
+    <w:p>
+      <w:pPr>
+        <w:rPr>
+          <w:sz w:val="44"/>
+          <w:szCs w:val="44"/>
+          <w:lang w:bidi="fa-IR"/>
+        </w:rPr>
+      </w:pPr>
+      <w:r>
+        <w:rPr>
+          <w:sz w:val="44"/>
+          <w:szCs w:val="44"/>
+          <w:lang w:bidi="fa-IR"/>
+        </w:rPr>
+        <w:t>With this concept in hand, we can now state the theorem.</w:t>
+      </w:r>
+    </w:p>
+    <w:p>
+      <w:pPr>
+        <w:rPr>
+          <w:sz w:val="44"/>
+          <w:szCs w:val="44"/>
+          <w:lang w:bidi="fa-IR"/>
+        </w:rPr>
+      </w:pPr>
+      <w:r>
+        <w:rPr>
+          <w:sz w:val="44"/>
+          <w:szCs w:val="44"/>
+          <w:lang w:bidi="fa-IR"/>
+        </w:rPr>
+        <w:t xml:space="preserve">It says that </w:t>
+      </w:r>
+      <w:r>
+        <w:rPr>
+          <w:b/>
+          <w:bCs/>
+          <w:sz w:val="44"/>
+          <w:szCs w:val="44"/>
+          <w:lang w:bidi="fa-IR"/>
+        </w:rPr>
+        <w:t>left uniqueness</w:t>
+      </w:r>
+      <w:r>
+        <w:rPr>
+          <w:sz w:val="44"/>
+          <w:szCs w:val="44"/>
+          <w:lang w:bidi="fa-IR"/>
+        </w:rPr>
+        <w:t xml:space="preserve"> holds if and only if the underlying normed space is </w:t>
+      </w:r>
+      <w:r>
+        <w:rPr>
+          <w:b/>
+          <w:bCs/>
+          <w:sz w:val="44"/>
+          <w:szCs w:val="44"/>
+          <w:lang w:bidi="fa-IR"/>
+        </w:rPr>
+        <w:t>strictly convex</w:t>
+      </w:r>
+      <w:r>
+        <w:rPr>
+          <w:sz w:val="44"/>
+          <w:szCs w:val="44"/>
+          <w:lang w:bidi="fa-IR"/>
+        </w:rPr>
+        <w:t>.</w:t>
       </w:r>
     </w:p>
     <w:p>
@@ -16155,6 +17318,155 @@
       </w:rPr>
     </w:lvl>
   </w:abstractNum>
+  <w:abstractNum w:abstractNumId="6" w15:restartNumberingAfterBreak="0">
+    <w:nsid w:val="70927354"/>
+    <w:multiLevelType w:val="multilevel"/>
+    <w:tmpl w:val="3F02BCDE"/>
+    <w:lvl w:ilvl="0">
+      <w:start w:val="1"/>
+      <w:numFmt w:val="bullet"/>
+      <w:lvlText w:val=""/>
+      <w:lvlJc w:val="left"/>
+      <w:pPr>
+        <w:tabs>
+          <w:tab w:val="num" w:pos="720"/>
+        </w:tabs>
+        <w:ind w:left="720" w:hanging="360"/>
+      </w:pPr>
+      <w:rPr>
+        <w:rFonts w:ascii="Symbol" w:hAnsi="Symbol" w:hint="default"/>
+        <w:sz w:val="20"/>
+      </w:rPr>
+    </w:lvl>
+    <w:lvl w:ilvl="1" w:tentative="1">
+      <w:start w:val="1"/>
+      <w:numFmt w:val="bullet"/>
+      <w:lvlText w:val="o"/>
+      <w:lvlJc w:val="left"/>
+      <w:pPr>
+        <w:tabs>
+          <w:tab w:val="num" w:pos="1440"/>
+        </w:tabs>
+        <w:ind w:left="1440" w:hanging="360"/>
+      </w:pPr>
+      <w:rPr>
+        <w:rFonts w:ascii="Courier New" w:hAnsi="Courier New" w:hint="default"/>
+        <w:sz w:val="20"/>
+      </w:rPr>
+    </w:lvl>
+    <w:lvl w:ilvl="2" w:tentative="1">
+      <w:start w:val="1"/>
+      <w:numFmt w:val="bullet"/>
+      <w:lvlText w:val=""/>
+      <w:lvlJc w:val="left"/>
+      <w:pPr>
+        <w:tabs>
+          <w:tab w:val="num" w:pos="2160"/>
+        </w:tabs>
+        <w:ind w:left="2160" w:hanging="360"/>
+      </w:pPr>
+      <w:rPr>
+        <w:rFonts w:ascii="Wingdings" w:hAnsi="Wingdings" w:hint="default"/>
+        <w:sz w:val="20"/>
+      </w:rPr>
+    </w:lvl>
+    <w:lvl w:ilvl="3" w:tentative="1">
+      <w:start w:val="1"/>
+      <w:numFmt w:val="bullet"/>
+      <w:lvlText w:val=""/>
+      <w:lvlJc w:val="left"/>
+      <w:pPr>
+        <w:tabs>
+          <w:tab w:val="num" w:pos="2880"/>
+        </w:tabs>
+        <w:ind w:left="2880" w:hanging="360"/>
+      </w:pPr>
+      <w:rPr>
+        <w:rFonts w:ascii="Wingdings" w:hAnsi="Wingdings" w:hint="default"/>
+        <w:sz w:val="20"/>
+      </w:rPr>
+    </w:lvl>
+    <w:lvl w:ilvl="4" w:tentative="1">
+      <w:start w:val="1"/>
+      <w:numFmt w:val="bullet"/>
+      <w:lvlText w:val=""/>
+      <w:lvlJc w:val="left"/>
+      <w:pPr>
+        <w:tabs>
+          <w:tab w:val="num" w:pos="3600"/>
+        </w:tabs>
+        <w:ind w:left="3600" w:hanging="360"/>
+      </w:pPr>
+      <w:rPr>
+        <w:rFonts w:ascii="Wingdings" w:hAnsi="Wingdings" w:hint="default"/>
+        <w:sz w:val="20"/>
+      </w:rPr>
+    </w:lvl>
+    <w:lvl w:ilvl="5" w:tentative="1">
+      <w:start w:val="1"/>
+      <w:numFmt w:val="bullet"/>
+      <w:lvlText w:val=""/>
+      <w:lvlJc w:val="left"/>
+      <w:pPr>
+        <w:tabs>
+          <w:tab w:val="num" w:pos="4320"/>
+        </w:tabs>
+        <w:ind w:left="4320" w:hanging="360"/>
+      </w:pPr>
+      <w:rPr>
+        <w:rFonts w:ascii="Wingdings" w:hAnsi="Wingdings" w:hint="default"/>
+        <w:sz w:val="20"/>
+      </w:rPr>
+    </w:lvl>
+    <w:lvl w:ilvl="6" w:tentative="1">
+      <w:start w:val="1"/>
+      <w:numFmt w:val="bullet"/>
+      <w:lvlText w:val=""/>
+      <w:lvlJc w:val="left"/>
+      <w:pPr>
+        <w:tabs>
+          <w:tab w:val="num" w:pos="5040"/>
+        </w:tabs>
+        <w:ind w:left="5040" w:hanging="360"/>
+      </w:pPr>
+      <w:rPr>
+        <w:rFonts w:ascii="Wingdings" w:hAnsi="Wingdings" w:hint="default"/>
+        <w:sz w:val="20"/>
+      </w:rPr>
+    </w:lvl>
+    <w:lvl w:ilvl="7" w:tentative="1">
+      <w:start w:val="1"/>
+      <w:numFmt w:val="bullet"/>
+      <w:lvlText w:val=""/>
+      <w:lvlJc w:val="left"/>
+      <w:pPr>
+        <w:tabs>
+          <w:tab w:val="num" w:pos="5760"/>
+        </w:tabs>
+        <w:ind w:left="5760" w:hanging="360"/>
+      </w:pPr>
+      <w:rPr>
+        <w:rFonts w:ascii="Wingdings" w:hAnsi="Wingdings" w:hint="default"/>
+        <w:sz w:val="20"/>
+      </w:rPr>
+    </w:lvl>
+    <w:lvl w:ilvl="8" w:tentative="1">
+      <w:start w:val="1"/>
+      <w:numFmt w:val="bullet"/>
+      <w:lvlText w:val=""/>
+      <w:lvlJc w:val="left"/>
+      <w:pPr>
+        <w:tabs>
+          <w:tab w:val="num" w:pos="6480"/>
+        </w:tabs>
+        <w:ind w:left="6480" w:hanging="360"/>
+      </w:pPr>
+      <w:rPr>
+        <w:rFonts w:ascii="Wingdings" w:hAnsi="Wingdings" w:hint="default"/>
+        <w:sz w:val="20"/>
+      </w:rPr>
+    </w:lvl>
+  </w:abstractNum>
   <w:num w:numId="1" w16cid:durableId="2069986366">
     <w:abstractNumId w:val="0"/>
   </w:num>
@@ -16172,6 +17484,9 @@
   </w:num>
   <w:num w:numId="6" w16cid:durableId="846552986">
     <w:abstractNumId w:val="5"/>
+  </w:num>
+  <w:num w:numId="7" w16cid:durableId="603342871">
+    <w:abstractNumId w:val="6"/>
   </w:num>
 </w:numbering>
 </file>

</xml_diff>

<commit_message>
step 102: finish part 10
</commit_message>
<xml_diff>
--- a/video context/video_context_newVersion.docx
+++ b/video context/video_context_newVersion.docx
@@ -2304,15 +2304,27 @@
           <w:lang w:bidi="fa-IR"/>
         </w:rPr>
       </w:pPr>
-      <w:r>
-        <w:rPr>
-          <w:b/>
-          <w:bCs/>
-          <w:sz w:val="44"/>
-          <w:szCs w:val="44"/>
-          <w:lang w:bidi="fa-IR"/>
-        </w:rPr>
-        <w:t>Hellooo, and welcome back!</w:t>
+      <w:proofErr w:type="spellStart"/>
+      <w:r>
+        <w:rPr>
+          <w:b/>
+          <w:bCs/>
+          <w:sz w:val="44"/>
+          <w:szCs w:val="44"/>
+          <w:lang w:bidi="fa-IR"/>
+        </w:rPr>
+        <w:t>Hellooo</w:t>
+      </w:r>
+      <w:proofErr w:type="spellEnd"/>
+      <w:r>
+        <w:rPr>
+          <w:b/>
+          <w:bCs/>
+          <w:sz w:val="44"/>
+          <w:szCs w:val="44"/>
+          <w:lang w:bidi="fa-IR"/>
+        </w:rPr>
+        <w:t>, and welcome back!</w:t>
       </w:r>
       <w:r>
         <w:rPr>
@@ -2753,7 +2765,25 @@
           <w:lang w:bidi="fa-IR"/>
         </w:rPr>
         <w:lastRenderedPageBreak/>
-        <w:t>Next, we show that the distance from x to y is equal to the distance from y to x.</w:t>
+        <w:t xml:space="preserve">Next, we show that the distance from x </w:t>
+      </w:r>
+      <w:proofErr w:type="spellStart"/>
+      <w:r>
+        <w:rPr>
+          <w:sz w:val="44"/>
+          <w:szCs w:val="44"/>
+          <w:lang w:bidi="fa-IR"/>
+        </w:rPr>
+        <w:t>to y</w:t>
+      </w:r>
+      <w:proofErr w:type="spellEnd"/>
+      <w:r>
+        <w:rPr>
+          <w:sz w:val="44"/>
+          <w:szCs w:val="44"/>
+          <w:lang w:bidi="fa-IR"/>
+        </w:rPr>
+        <w:t xml:space="preserve"> is equal to the distance from y to x.</w:t>
       </w:r>
     </w:p>
     <w:p>
@@ -2787,8 +2817,18 @@
           <w:szCs w:val="44"/>
           <w:lang w:bidi="fa-IR"/>
         </w:rPr>
-        <w:t>To gain some geometric intuition, consider two points, x and y, in the two-dimensional plane. We first represent the distance from x to y</w:t>
-      </w:r>
+        <w:t xml:space="preserve">To gain some geometric intuition, consider two points, x and y, in the two-dimensional plane. We first represent the distance from x </w:t>
+      </w:r>
+      <w:proofErr w:type="spellStart"/>
+      <w:r>
+        <w:rPr>
+          <w:sz w:val="44"/>
+          <w:szCs w:val="44"/>
+          <w:lang w:bidi="fa-IR"/>
+        </w:rPr>
+        <w:t>to y</w:t>
+      </w:r>
+      <w:proofErr w:type="spellEnd"/>
       <w:r>
         <w:rPr>
           <w:sz w:val="44"/>
@@ -3363,24 +3403,78 @@
           <w:szCs w:val="44"/>
           <w:lang w:bidi="fa-IR"/>
         </w:rPr>
-        <w:t>To begin, let (X,d) be a metric space, and let y_n be a sequence in X.</w:t>
-      </w:r>
-    </w:p>
-    <w:p>
-      <w:pPr>
-        <w:rPr>
-          <w:sz w:val="44"/>
-          <w:szCs w:val="44"/>
-          <w:lang w:bidi="fa-IR"/>
-        </w:rPr>
-      </w:pPr>
-      <w:r>
-        <w:rPr>
-          <w:sz w:val="44"/>
-          <w:szCs w:val="44"/>
-          <w:lang w:bidi="fa-IR"/>
-        </w:rPr>
-        <w:t>We say that the sequence y_n converges</w:t>
+        <w:t>To begin, let (</w:t>
+      </w:r>
+      <w:proofErr w:type="spellStart"/>
+      <w:r>
+        <w:rPr>
+          <w:sz w:val="44"/>
+          <w:szCs w:val="44"/>
+          <w:lang w:bidi="fa-IR"/>
+        </w:rPr>
+        <w:t>X,d</w:t>
+      </w:r>
+      <w:proofErr w:type="spellEnd"/>
+      <w:r>
+        <w:rPr>
+          <w:sz w:val="44"/>
+          <w:szCs w:val="44"/>
+          <w:lang w:bidi="fa-IR"/>
+        </w:rPr>
+        <w:t xml:space="preserve">) be a metric space, and let </w:t>
+      </w:r>
+      <w:proofErr w:type="spellStart"/>
+      <w:r>
+        <w:rPr>
+          <w:sz w:val="44"/>
+          <w:szCs w:val="44"/>
+          <w:lang w:bidi="fa-IR"/>
+        </w:rPr>
+        <w:t>y_n</w:t>
+      </w:r>
+      <w:proofErr w:type="spellEnd"/>
+      <w:r>
+        <w:rPr>
+          <w:sz w:val="44"/>
+          <w:szCs w:val="44"/>
+          <w:lang w:bidi="fa-IR"/>
+        </w:rPr>
+        <w:t xml:space="preserve"> be a sequence in X.</w:t>
+      </w:r>
+    </w:p>
+    <w:p>
+      <w:pPr>
+        <w:rPr>
+          <w:sz w:val="44"/>
+          <w:szCs w:val="44"/>
+          <w:lang w:bidi="fa-IR"/>
+        </w:rPr>
+      </w:pPr>
+      <w:r>
+        <w:rPr>
+          <w:sz w:val="44"/>
+          <w:szCs w:val="44"/>
+          <w:lang w:bidi="fa-IR"/>
+        </w:rPr>
+        <w:t xml:space="preserve">We say that the sequence </w:t>
+      </w:r>
+      <w:proofErr w:type="spellStart"/>
+      <w:r>
+        <w:rPr>
+          <w:sz w:val="44"/>
+          <w:szCs w:val="44"/>
+          <w:lang w:bidi="fa-IR"/>
+        </w:rPr>
+        <w:t>y_n</w:t>
+      </w:r>
+      <w:proofErr w:type="spellEnd"/>
+      <w:r>
+        <w:rPr>
+          <w:sz w:val="44"/>
+          <w:szCs w:val="44"/>
+          <w:lang w:bidi="fa-IR"/>
+        </w:rPr>
+        <w:t xml:space="preserve"> converges</w:t>
       </w:r>
       <w:r>
         <w:rPr>
@@ -3502,6 +3596,7 @@
         <w:lastRenderedPageBreak/>
         <w:t xml:space="preserve">In this case, something interesting happens. The very same sequence </w:t>
       </w:r>
+      <w:proofErr w:type="spellStart"/>
       <w:r>
         <w:rPr>
           <w:sz w:val="44"/>
@@ -3510,6 +3605,7 @@
         </w:rPr>
         <w:t>y_n</w:t>
       </w:r>
+      <w:proofErr w:type="spellEnd"/>
       <w:r>
         <w:rPr>
           <w:sz w:val="44"/>
@@ -3723,7 +3819,43 @@
           <w:lang w:bidi="fa-IR"/>
         </w:rPr>
         <w:lastRenderedPageBreak/>
-        <w:t xml:space="preserve">Formally, a sequence ({x_n}) in a metric space ((X,d)) is called </w:t>
+        <w:t>Formally, a sequence ({</w:t>
+      </w:r>
+      <w:proofErr w:type="spellStart"/>
+      <w:r>
+        <w:rPr>
+          <w:sz w:val="44"/>
+          <w:szCs w:val="44"/>
+          <w:lang w:bidi="fa-IR"/>
+        </w:rPr>
+        <w:t>x_n</w:t>
+      </w:r>
+      <w:proofErr w:type="spellEnd"/>
+      <w:r>
+        <w:rPr>
+          <w:sz w:val="44"/>
+          <w:szCs w:val="44"/>
+          <w:lang w:bidi="fa-IR"/>
+        </w:rPr>
+        <w:t>}) in a metric space ((</w:t>
+      </w:r>
+      <w:proofErr w:type="spellStart"/>
+      <w:r>
+        <w:rPr>
+          <w:sz w:val="44"/>
+          <w:szCs w:val="44"/>
+          <w:lang w:bidi="fa-IR"/>
+        </w:rPr>
+        <w:t>X,d</w:t>
+      </w:r>
+      <w:proofErr w:type="spellEnd"/>
+      <w:r>
+        <w:rPr>
+          <w:sz w:val="44"/>
+          <w:szCs w:val="44"/>
+          <w:lang w:bidi="fa-IR"/>
+        </w:rPr>
+        <w:t xml:space="preserve">)) is called </w:t>
       </w:r>
       <w:r>
         <w:rPr>
@@ -3741,7 +3873,25 @@
           <w:szCs w:val="44"/>
           <w:lang w:bidi="fa-IR"/>
         </w:rPr>
-        <w:t xml:space="preserve"> if, for every (\varepsilon &gt; 0), there exists an integer (N) such that</w:t>
+        <w:t xml:space="preserve"> if, for every (\</w:t>
+      </w:r>
+      <w:proofErr w:type="spellStart"/>
+      <w:r>
+        <w:rPr>
+          <w:sz w:val="44"/>
+          <w:szCs w:val="44"/>
+          <w:lang w:bidi="fa-IR"/>
+        </w:rPr>
+        <w:t>varepsilon</w:t>
+      </w:r>
+      <w:proofErr w:type="spellEnd"/>
+      <w:r>
+        <w:rPr>
+          <w:sz w:val="44"/>
+          <w:szCs w:val="44"/>
+          <w:lang w:bidi="fa-IR"/>
+        </w:rPr>
+        <w:t xml:space="preserve"> &gt; 0), there exists an integer (N) such that</w:t>
       </w:r>
     </w:p>
     <w:p>
@@ -3885,24 +4035,60 @@
           <w:szCs w:val="44"/>
           <w:lang w:bidi="fa-IR"/>
         </w:rPr>
-        <w:t>for every (m,n &gt; N).</w:t>
-      </w:r>
-    </w:p>
-    <w:p>
-      <w:pPr>
-        <w:rPr>
-          <w:sz w:val="44"/>
-          <w:szCs w:val="44"/>
-          <w:lang w:bidi="fa-IR"/>
-        </w:rPr>
-      </w:pPr>
-      <w:r>
-        <w:rPr>
-          <w:sz w:val="44"/>
-          <w:szCs w:val="44"/>
-          <w:lang w:bidi="fa-IR"/>
-        </w:rPr>
-        <w:t>Now let's look again at our sequence ({y_n}).</w:t>
+        <w:t>for every (</w:t>
+      </w:r>
+      <w:proofErr w:type="spellStart"/>
+      <w:r>
+        <w:rPr>
+          <w:sz w:val="44"/>
+          <w:szCs w:val="44"/>
+          <w:lang w:bidi="fa-IR"/>
+        </w:rPr>
+        <w:t>m,n</w:t>
+      </w:r>
+      <w:proofErr w:type="spellEnd"/>
+      <w:r>
+        <w:rPr>
+          <w:sz w:val="44"/>
+          <w:szCs w:val="44"/>
+          <w:lang w:bidi="fa-IR"/>
+        </w:rPr>
+        <w:t xml:space="preserve"> &gt; N).</w:t>
+      </w:r>
+    </w:p>
+    <w:p>
+      <w:pPr>
+        <w:rPr>
+          <w:sz w:val="44"/>
+          <w:szCs w:val="44"/>
+          <w:lang w:bidi="fa-IR"/>
+        </w:rPr>
+      </w:pPr>
+      <w:r>
+        <w:rPr>
+          <w:sz w:val="44"/>
+          <w:szCs w:val="44"/>
+          <w:lang w:bidi="fa-IR"/>
+        </w:rPr>
+        <w:t>Now let's look again at our sequence ({</w:t>
+      </w:r>
+      <w:proofErr w:type="spellStart"/>
+      <w:r>
+        <w:rPr>
+          <w:sz w:val="44"/>
+          <w:szCs w:val="44"/>
+          <w:lang w:bidi="fa-IR"/>
+        </w:rPr>
+        <w:t>y_n</w:t>
+      </w:r>
+      <w:proofErr w:type="spellEnd"/>
+      <w:r>
+        <w:rPr>
+          <w:sz w:val="44"/>
+          <w:szCs w:val="44"/>
+          <w:lang w:bidi="fa-IR"/>
+        </w:rPr>
+        <w:t>}).</w:t>
       </w:r>
     </w:p>
     <w:p>
@@ -4456,7 +4642,25 @@
           <w:lang w:bidi="fa-IR"/>
         </w:rPr>
         <w:lastRenderedPageBreak/>
-        <w:t>Go back to our previous metric space (X), and consider the same Cauchy sequence ({y_n}).</w:t>
+        <w:t>Go back to our previous metric space (X), and consider the same Cauchy sequence ({</w:t>
+      </w:r>
+      <w:proofErr w:type="spellStart"/>
+      <w:r>
+        <w:rPr>
+          <w:sz w:val="44"/>
+          <w:szCs w:val="44"/>
+          <w:lang w:bidi="fa-IR"/>
+        </w:rPr>
+        <w:t>y_n</w:t>
+      </w:r>
+      <w:proofErr w:type="spellEnd"/>
+      <w:r>
+        <w:rPr>
+          <w:sz w:val="44"/>
+          <w:szCs w:val="44"/>
+          <w:lang w:bidi="fa-IR"/>
+        </w:rPr>
+        <w:t>}).</w:t>
       </w:r>
     </w:p>
     <w:p>
@@ -6518,6 +6722,7 @@
         </w:rPr>
         <w:t xml:space="preserve">Suppose we have two vectors, </w:t>
       </w:r>
+      <w:proofErr w:type="spellStart"/>
       <w:r>
         <w:rPr>
           <w:b/>
@@ -6534,7 +6739,16 @@
           <w:szCs w:val="44"/>
           <w:lang w:bidi="fa-IR"/>
         </w:rPr>
-        <w:t xml:space="preserve">and </w:t>
+        <w:t>and</w:t>
+      </w:r>
+      <w:proofErr w:type="spellEnd"/>
+      <w:r>
+        <w:rPr>
+          <w:sz w:val="44"/>
+          <w:szCs w:val="44"/>
+          <w:lang w:bidi="fa-IR"/>
+        </w:rPr>
+        <w:t xml:space="preserve"> </w:t>
       </w:r>
       <w:r>
         <w:rPr>
@@ -7659,6 +7873,7 @@
         </w:rPr>
         <w:t xml:space="preserve"> in its second argument. This property is also commonly referred to as </w:t>
       </w:r>
+      <w:proofErr w:type="spellStart"/>
       <w:r>
         <w:rPr>
           <w:b/>
@@ -7669,6 +7884,7 @@
         </w:rPr>
         <w:t>semilinearity</w:t>
       </w:r>
+      <w:proofErr w:type="spellEnd"/>
       <w:r>
         <w:rPr>
           <w:sz w:val="44"/>
@@ -7713,8 +7929,20 @@
           <w:lang w:bidi="fa-IR"/>
         </w:rPr>
         <w:lastRenderedPageBreak/>
-        <w:t>Putting these two results together, we conclude that the inner product is sesquilinear</w:t>
-      </w:r>
+        <w:t xml:space="preserve">Putting these two results together, we conclude that the inner product is </w:t>
+      </w:r>
+      <w:proofErr w:type="spellStart"/>
+      <w:r>
+        <w:rPr>
+          <w:b/>
+          <w:bCs/>
+          <w:sz w:val="44"/>
+          <w:szCs w:val="44"/>
+          <w:lang w:bidi="fa-IR"/>
+        </w:rPr>
+        <w:t>sesquilinear</w:t>
+      </w:r>
+      <w:proofErr w:type="spellEnd"/>
     </w:p>
     <w:p>
       <w:pPr>
@@ -8477,7 +8705,25 @@
           <w:lang w:bidi="fa-IR"/>
         </w:rPr>
         <w:lastRenderedPageBreak/>
-        <w:t xml:space="preserve">For instance, the (L^p) norms for (p </w:t>
+        <w:t>For instance, the (</w:t>
+      </w:r>
+      <w:proofErr w:type="spellStart"/>
+      <w:r>
+        <w:rPr>
+          <w:sz w:val="44"/>
+          <w:szCs w:val="44"/>
+          <w:lang w:bidi="fa-IR"/>
+        </w:rPr>
+        <w:t>L^p</w:t>
+      </w:r>
+      <w:proofErr w:type="spellEnd"/>
+      <w:r>
+        <w:rPr>
+          <w:sz w:val="44"/>
+          <w:szCs w:val="44"/>
+          <w:lang w:bidi="fa-IR"/>
+        </w:rPr>
+        <w:t xml:space="preserve">) norms for (p </w:t>
       </w:r>
       <m:oMath>
         <m:r>
@@ -9878,7 +10124,25 @@
           <w:szCs w:val="44"/>
           <w:lang w:bidi="fa-IR"/>
         </w:rPr>
-        <w:t xml:space="preserve">Although (C[a,b]) with the supremum norm </w:t>
+        <w:t>Although (C[</w:t>
+      </w:r>
+      <w:proofErr w:type="spellStart"/>
+      <w:r>
+        <w:rPr>
+          <w:sz w:val="44"/>
+          <w:szCs w:val="44"/>
+          <w:lang w:bidi="fa-IR"/>
+        </w:rPr>
+        <w:t>a,b</w:t>
+      </w:r>
+      <w:proofErr w:type="spellEnd"/>
+      <w:r>
+        <w:rPr>
+          <w:sz w:val="44"/>
+          <w:szCs w:val="44"/>
+          <w:lang w:bidi="fa-IR"/>
+        </w:rPr>
+        <w:t xml:space="preserve">]) with the supremum norm </w:t>
       </w:r>
       <w:r>
         <w:rPr>
@@ -9977,7 +10241,25 @@
           <w:szCs w:val="44"/>
           <w:lang w:bidi="fa-IR"/>
         </w:rPr>
-        <w:t xml:space="preserve">Therefore, (C[a,b]) equipped with the supremum norm is </w:t>
+        <w:t>Therefore, (C[</w:t>
+      </w:r>
+      <w:proofErr w:type="spellStart"/>
+      <w:r>
+        <w:rPr>
+          <w:sz w:val="44"/>
+          <w:szCs w:val="44"/>
+          <w:lang w:bidi="fa-IR"/>
+        </w:rPr>
+        <w:t>a,b</w:t>
+      </w:r>
+      <w:proofErr w:type="spellEnd"/>
+      <w:r>
+        <w:rPr>
+          <w:sz w:val="44"/>
+          <w:szCs w:val="44"/>
+          <w:lang w:bidi="fa-IR"/>
+        </w:rPr>
+        <w:t xml:space="preserve">]) equipped with the supremum norm is </w:t>
       </w:r>
       <w:r>
         <w:rPr>
@@ -11670,7 +11952,51 @@
           <w:szCs w:val="44"/>
           <w:lang w:bidi="fa-IR"/>
         </w:rPr>
-        <w:t>"The norm of x+ ky equals the norm of x−ky for all real numbers k."</w:t>
+        <w:t xml:space="preserve">"The norm of x+ </w:t>
+      </w:r>
+      <w:proofErr w:type="spellStart"/>
+      <w:r>
+        <w:rPr>
+          <w:b/>
+          <w:bCs/>
+          <w:sz w:val="44"/>
+          <w:szCs w:val="44"/>
+          <w:lang w:bidi="fa-IR"/>
+        </w:rPr>
+        <w:t>ky</w:t>
+      </w:r>
+      <w:proofErr w:type="spellEnd"/>
+      <w:r>
+        <w:rPr>
+          <w:b/>
+          <w:bCs/>
+          <w:sz w:val="44"/>
+          <w:szCs w:val="44"/>
+          <w:lang w:bidi="fa-IR"/>
+        </w:rPr>
+        <w:t xml:space="preserve"> equals the norm of x−</w:t>
+      </w:r>
+      <w:proofErr w:type="spellStart"/>
+      <w:r>
+        <w:rPr>
+          <w:b/>
+          <w:bCs/>
+          <w:sz w:val="44"/>
+          <w:szCs w:val="44"/>
+          <w:lang w:bidi="fa-IR"/>
+        </w:rPr>
+        <w:t>ky</w:t>
+      </w:r>
+      <w:proofErr w:type="spellEnd"/>
+      <w:r>
+        <w:rPr>
+          <w:b/>
+          <w:bCs/>
+          <w:sz w:val="44"/>
+          <w:szCs w:val="44"/>
+          <w:lang w:bidi="fa-IR"/>
+        </w:rPr>
+        <w:t xml:space="preserve"> for all real numbers k."</w:t>
       </w:r>
     </w:p>
     <w:p>
@@ -11712,7 +12038,25 @@
           <w:szCs w:val="44"/>
           <w:lang w:bidi="fa-IR"/>
         </w:rPr>
-        <w:t>x is orthogonal to y in the sense of Roberts</w:t>
+        <w:t xml:space="preserve">x is orthogonal </w:t>
+      </w:r>
+      <w:proofErr w:type="spellStart"/>
+      <w:r>
+        <w:rPr>
+          <w:sz w:val="44"/>
+          <w:szCs w:val="44"/>
+          <w:lang w:bidi="fa-IR"/>
+        </w:rPr>
+        <w:t>to y</w:t>
+      </w:r>
+      <w:proofErr w:type="spellEnd"/>
+      <w:r>
+        <w:rPr>
+          <w:sz w:val="44"/>
+          <w:szCs w:val="44"/>
+          <w:lang w:bidi="fa-IR"/>
+        </w:rPr>
+        <w:t xml:space="preserve"> in the sense of Roberts</w:t>
       </w:r>
       <w:r>
         <w:rPr>
@@ -11754,7 +12098,79 @@
           <w:szCs w:val="44"/>
           <w:lang w:bidi="fa-IR"/>
         </w:rPr>
-        <w:t>Suppose we have two vectors, (x) and (y), that are orthogonal in the sense of Roberts. For an arbitrary real number (k), draw the vector (ky). The vectors (x) and (ky) form a parallelogram, and when this parallelogram happens to be a rectangle, its diagonals are (x + ky) and (x - ky).</w:t>
+        <w:t>Suppose we have two vectors, (x) and (y), that are orthogonal in the sense of Roberts. For an arbitrary real number (k), draw the vector (</w:t>
+      </w:r>
+      <w:proofErr w:type="spellStart"/>
+      <w:r>
+        <w:rPr>
+          <w:sz w:val="44"/>
+          <w:szCs w:val="44"/>
+          <w:lang w:bidi="fa-IR"/>
+        </w:rPr>
+        <w:t>ky</w:t>
+      </w:r>
+      <w:proofErr w:type="spellEnd"/>
+      <w:r>
+        <w:rPr>
+          <w:sz w:val="44"/>
+          <w:szCs w:val="44"/>
+          <w:lang w:bidi="fa-IR"/>
+        </w:rPr>
+        <w:t>). The vectors (x) and (</w:t>
+      </w:r>
+      <w:proofErr w:type="spellStart"/>
+      <w:r>
+        <w:rPr>
+          <w:sz w:val="44"/>
+          <w:szCs w:val="44"/>
+          <w:lang w:bidi="fa-IR"/>
+        </w:rPr>
+        <w:t>ky</w:t>
+      </w:r>
+      <w:proofErr w:type="spellEnd"/>
+      <w:r>
+        <w:rPr>
+          <w:sz w:val="44"/>
+          <w:szCs w:val="44"/>
+          <w:lang w:bidi="fa-IR"/>
+        </w:rPr>
+        <w:t xml:space="preserve">) form a parallelogram, and when this parallelogram happens to be a rectangle, its diagonals are (x + </w:t>
+      </w:r>
+      <w:proofErr w:type="spellStart"/>
+      <w:r>
+        <w:rPr>
+          <w:sz w:val="44"/>
+          <w:szCs w:val="44"/>
+          <w:lang w:bidi="fa-IR"/>
+        </w:rPr>
+        <w:t>ky</w:t>
+      </w:r>
+      <w:proofErr w:type="spellEnd"/>
+      <w:r>
+        <w:rPr>
+          <w:sz w:val="44"/>
+          <w:szCs w:val="44"/>
+          <w:lang w:bidi="fa-IR"/>
+        </w:rPr>
+        <w:t xml:space="preserve">) and (x - </w:t>
+      </w:r>
+      <w:proofErr w:type="spellStart"/>
+      <w:r>
+        <w:rPr>
+          <w:sz w:val="44"/>
+          <w:szCs w:val="44"/>
+          <w:lang w:bidi="fa-IR"/>
+        </w:rPr>
+        <w:t>ky</w:t>
+      </w:r>
+      <w:proofErr w:type="spellEnd"/>
+      <w:r>
+        <w:rPr>
+          <w:sz w:val="44"/>
+          <w:szCs w:val="44"/>
+          <w:lang w:bidi="fa-IR"/>
+        </w:rPr>
+        <w:t>).</w:t>
       </w:r>
     </w:p>
     <w:p>
@@ -12332,7 +12748,25 @@
           <w:szCs w:val="44"/>
           <w:lang w:bidi="fa-IR"/>
         </w:rPr>
-        <w:t>Consider the following vectors in (\mathbb{R}^3) equipped with the infinity norm.</w:t>
+        <w:t>Consider the following vectors in (\</w:t>
+      </w:r>
+      <w:proofErr w:type="spellStart"/>
+      <w:r>
+        <w:rPr>
+          <w:sz w:val="44"/>
+          <w:szCs w:val="44"/>
+          <w:lang w:bidi="fa-IR"/>
+        </w:rPr>
+        <w:t>mathbb</w:t>
+      </w:r>
+      <w:proofErr w:type="spellEnd"/>
+      <w:r>
+        <w:rPr>
+          <w:sz w:val="44"/>
+          <w:szCs w:val="44"/>
+          <w:lang w:bidi="fa-IR"/>
+        </w:rPr>
+        <w:t>{R}^3) equipped with the infinity norm.</w:t>
       </w:r>
     </w:p>
     <w:p>
@@ -12515,7 +12949,25 @@
           <w:szCs w:val="44"/>
           <w:lang w:bidi="fa-IR"/>
         </w:rPr>
-        <w:t>We work in (\mathbb{R}^2) equipped with the infinity norm.</w:t>
+        <w:t>We work in (\</w:t>
+      </w:r>
+      <w:proofErr w:type="spellStart"/>
+      <w:r>
+        <w:rPr>
+          <w:sz w:val="44"/>
+          <w:szCs w:val="44"/>
+          <w:lang w:bidi="fa-IR"/>
+        </w:rPr>
+        <w:t>mathbb</w:t>
+      </w:r>
+      <w:proofErr w:type="spellEnd"/>
+      <w:r>
+        <w:rPr>
+          <w:sz w:val="44"/>
+          <w:szCs w:val="44"/>
+          <w:lang w:bidi="fa-IR"/>
+        </w:rPr>
+        <w:t>{R}^2) equipped with the infinity norm.</w:t>
       </w:r>
     </w:p>
     <w:p>
@@ -14161,7 +14613,25 @@
           <w:szCs w:val="44"/>
           <w:lang w:bidi="fa-IR"/>
         </w:rPr>
-        <w:t>We'll work in the space (\mathbb{R}^2) equipped with the (\ell_1) norm.</w:t>
+        <w:t>We'll work in the space (\</w:t>
+      </w:r>
+      <w:proofErr w:type="spellStart"/>
+      <w:r>
+        <w:rPr>
+          <w:sz w:val="44"/>
+          <w:szCs w:val="44"/>
+          <w:lang w:bidi="fa-IR"/>
+        </w:rPr>
+        <w:t>mathbb</w:t>
+      </w:r>
+      <w:proofErr w:type="spellEnd"/>
+      <w:r>
+        <w:rPr>
+          <w:sz w:val="44"/>
+          <w:szCs w:val="44"/>
+          <w:lang w:bidi="fa-IR"/>
+        </w:rPr>
+        <w:t>{R}^2) equipped with the (\ell_1) norm.</w:t>
       </w:r>
     </w:p>
     <w:p>
@@ -14342,7 +14812,25 @@
           <w:lang w:bidi="fa-IR"/>
         </w:rPr>
         <w:lastRenderedPageBreak/>
-        <w:t>First, suppose that (\alpha \neq 0). By factoring out (\alpha) from the norm and making a simple change of variables, we obtain the desired result.</w:t>
+        <w:t>First, suppose that (\alpha \</w:t>
+      </w:r>
+      <w:proofErr w:type="spellStart"/>
+      <w:r>
+        <w:rPr>
+          <w:sz w:val="44"/>
+          <w:szCs w:val="44"/>
+          <w:lang w:bidi="fa-IR"/>
+        </w:rPr>
+        <w:t>neq</w:t>
+      </w:r>
+      <w:proofErr w:type="spellEnd"/>
+      <w:r>
+        <w:rPr>
+          <w:sz w:val="44"/>
+          <w:szCs w:val="44"/>
+          <w:lang w:bidi="fa-IR"/>
+        </w:rPr>
+        <w:t xml:space="preserve"> 0). By factoring out (\alpha) from the norm and making a simple change of variables, we obtain the desired result.</w:t>
       </w:r>
     </w:p>
     <w:p>
@@ -16552,6 +17040,768 @@
         <w:rPr>
           <w:sz w:val="44"/>
           <w:szCs w:val="44"/>
+          <w:lang w:bidi="fa-IR"/>
+        </w:rPr>
+      </w:pPr>
+      <w:r>
+        <w:rPr>
+          <w:sz w:val="44"/>
+          <w:szCs w:val="44"/>
+          <w:lang w:bidi="fa-IR"/>
+        </w:rPr>
+        <w:t>3-10:</w:t>
+      </w:r>
+    </w:p>
+    <w:p>
+      <w:pPr>
+        <w:rPr>
+          <w:sz w:val="44"/>
+          <w:szCs w:val="44"/>
+          <w:lang w:bidi="fa-IR"/>
+        </w:rPr>
+      </w:pPr>
+      <w:r>
+        <w:rPr>
+          <w:sz w:val="44"/>
+          <w:szCs w:val="44"/>
+          <w:lang w:bidi="fa-IR"/>
+        </w:rPr>
+        <w:t xml:space="preserve">Suppose we have two vectors, (x) and (y), in an (n)-dimensional vector space. Let's see what </w:t>
+      </w:r>
+      <w:r>
+        <w:rPr>
+          <w:b/>
+          <w:bCs/>
+          <w:sz w:val="44"/>
+          <w:szCs w:val="44"/>
+          <w:lang w:bidi="fa-IR"/>
+        </w:rPr>
+        <w:t>Birkhoff–James orthogonality</w:t>
+      </w:r>
+      <w:r>
+        <w:rPr>
+          <w:sz w:val="44"/>
+          <w:szCs w:val="44"/>
+          <w:lang w:bidi="fa-IR"/>
+        </w:rPr>
+        <w:t xml:space="preserve"> means.</w:t>
+      </w:r>
+    </w:p>
+    <w:p>
+      <w:pPr>
+        <w:rPr>
+          <w:sz w:val="44"/>
+          <w:szCs w:val="44"/>
+          <w:lang w:bidi="fa-IR"/>
+        </w:rPr>
+      </w:pPr>
+      <w:r>
+        <w:rPr>
+          <w:sz w:val="44"/>
+          <w:szCs w:val="44"/>
+          <w:lang w:bidi="fa-IR"/>
+        </w:rPr>
+        <w:t>To analyze this definition more carefully, we introduce an auxiliary function:</w:t>
+      </w:r>
+      <w:r>
+        <w:rPr>
+          <w:sz w:val="44"/>
+          <w:szCs w:val="44"/>
+          <w:lang w:bidi="fa-IR"/>
+        </w:rPr>
+        <w:br/>
+        <w:t>[</w:t>
+      </w:r>
+      <w:r>
+        <w:rPr>
+          <w:sz w:val="44"/>
+          <w:szCs w:val="44"/>
+          <w:lang w:bidi="fa-IR"/>
+        </w:rPr>
+        <w:br/>
+      </w:r>
+      <w:r>
+        <w:rPr>
+          <w:b/>
+          <w:bCs/>
+          <w:sz w:val="44"/>
+          <w:szCs w:val="44"/>
+          <w:lang w:bidi="fa-IR"/>
+        </w:rPr>
+        <w:t>We define f of lambda to be the norm of x+</w:t>
+      </w:r>
+      <w:r>
+        <w:rPr>
+          <w:b/>
+          <w:bCs/>
+          <w:sz w:val="44"/>
+          <w:szCs w:val="44"/>
+          <w:lang w:bidi="fa-IR"/>
+        </w:rPr>
+        <w:t xml:space="preserve"> </w:t>
+      </w:r>
+      <w:proofErr w:type="spellStart"/>
+      <w:r>
+        <w:rPr>
+          <w:b/>
+          <w:bCs/>
+          <w:sz w:val="44"/>
+          <w:szCs w:val="44"/>
+          <w:lang w:bidi="fa-IR"/>
+        </w:rPr>
+        <w:t>λy</w:t>
+      </w:r>
+      <w:proofErr w:type="spellEnd"/>
+      <w:r>
+        <w:rPr>
+          <w:b/>
+          <w:bCs/>
+          <w:sz w:val="44"/>
+          <w:szCs w:val="44"/>
+          <w:lang w:bidi="fa-IR"/>
+        </w:rPr>
+        <w:t xml:space="preserve">, </w:t>
+      </w:r>
+      <w:r>
+        <w:rPr>
+          <w:b/>
+          <w:bCs/>
+          <w:sz w:val="44"/>
+          <w:szCs w:val="44"/>
+          <w:lang w:bidi="fa-IR"/>
+        </w:rPr>
+        <w:lastRenderedPageBreak/>
+        <w:t>raised to the power p."</w:t>
+      </w:r>
+      <w:r>
+        <w:rPr>
+          <w:sz w:val="44"/>
+          <w:szCs w:val="44"/>
+          <w:lang w:bidi="fa-IR"/>
+        </w:rPr>
+        <w:t>.</w:t>
+      </w:r>
+      <w:r>
+        <w:rPr>
+          <w:sz w:val="44"/>
+          <w:szCs w:val="44"/>
+          <w:lang w:bidi="fa-IR"/>
+        </w:rPr>
+        <w:br/>
+        <w:t>]</w:t>
+      </w:r>
+    </w:p>
+    <w:p>
+      <w:pPr>
+        <w:rPr>
+          <w:sz w:val="44"/>
+          <w:szCs w:val="44"/>
+          <w:lang w:bidi="fa-IR"/>
+        </w:rPr>
+      </w:pPr>
+      <w:r>
+        <w:rPr>
+          <w:sz w:val="44"/>
+          <w:szCs w:val="44"/>
+          <w:lang w:bidi="fa-IR"/>
+        </w:rPr>
+        <w:t>Why do we raise the norm to the power (p) instead of using the norm itself?</w:t>
+      </w:r>
+    </w:p>
+    <w:p>
+      <w:pPr>
+        <w:rPr>
+          <w:sz w:val="44"/>
+          <w:szCs w:val="44"/>
+          <w:lang w:bidi="fa-IR"/>
+        </w:rPr>
+      </w:pPr>
+      <w:r>
+        <w:rPr>
+          <w:sz w:val="44"/>
+          <w:szCs w:val="44"/>
+          <w:lang w:bidi="fa-IR"/>
+        </w:rPr>
+        <w:t>Because this makes the function differentiable, allowing us to use calculus. Our goal is to find the minimum value of this function.</w:t>
+      </w:r>
+    </w:p>
+    <w:p>
+      <w:pPr>
+        <w:rPr>
+          <w:sz w:val="44"/>
+          <w:szCs w:val="44"/>
+          <w:lang w:bidi="fa-IR"/>
+        </w:rPr>
+      </w:pPr>
+      <w:r>
+        <w:rPr>
+          <w:sz w:val="44"/>
+          <w:szCs w:val="44"/>
+          <w:lang w:bidi="fa-IR"/>
+        </w:rPr>
+        <w:t>Now let's look at the geometry behind it.</w:t>
+      </w:r>
+    </w:p>
+    <w:p>
+      <w:pPr>
+        <w:rPr>
+          <w:sz w:val="44"/>
+          <w:szCs w:val="44"/>
+          <w:lang w:bidi="fa-IR"/>
+        </w:rPr>
+      </w:pPr>
+      <w:r>
+        <w:rPr>
+          <w:sz w:val="44"/>
+          <w:szCs w:val="44"/>
+          <w:lang w:bidi="fa-IR"/>
+        </w:rPr>
+        <w:t>This vector starts at the origin and ends at the point (x). The gray line passing through the tip of (x) is drawn in the direction of the vector (y). Every point on this line represents a vector of the form</w:t>
+      </w:r>
+      <w:r>
+        <w:rPr>
+          <w:sz w:val="44"/>
+          <w:szCs w:val="44"/>
+          <w:lang w:bidi="fa-IR"/>
+        </w:rPr>
+        <w:br/>
+        <w:t>[</w:t>
+      </w:r>
+      <w:r>
+        <w:rPr>
+          <w:sz w:val="44"/>
+          <w:szCs w:val="44"/>
+          <w:lang w:bidi="fa-IR"/>
+        </w:rPr>
+        <w:br/>
+        <w:t>x+\lambda y,</w:t>
+      </w:r>
+      <w:r>
+        <w:rPr>
+          <w:sz w:val="44"/>
+          <w:szCs w:val="44"/>
+          <w:lang w:bidi="fa-IR"/>
+        </w:rPr>
+        <w:br/>
+        <w:t>]</w:t>
+      </w:r>
+      <w:r>
+        <w:rPr>
+          <w:sz w:val="44"/>
+          <w:szCs w:val="44"/>
+          <w:lang w:bidi="fa-IR"/>
+        </w:rPr>
+        <w:br/>
+        <w:t>for a different value of (\lambda).</w:t>
+      </w:r>
+    </w:p>
+    <w:p>
+      <w:pPr>
+        <w:rPr>
+          <w:sz w:val="44"/>
+          <w:szCs w:val="44"/>
+          <w:lang w:bidi="fa-IR"/>
+        </w:rPr>
+      </w:pPr>
+      <w:r>
+        <w:rPr>
+          <w:sz w:val="44"/>
+          <w:szCs w:val="44"/>
+          <w:lang w:bidi="fa-IR"/>
+        </w:rPr>
+        <w:t>Now imagine moving along this line by changing the value of (\lambda).</w:t>
+      </w:r>
+    </w:p>
+    <w:p>
+      <w:pPr>
+        <w:rPr>
+          <w:sz w:val="44"/>
+          <w:szCs w:val="44"/>
+          <w:lang w:bidi="fa-IR"/>
+        </w:rPr>
+      </w:pPr>
+      <w:r>
+        <w:rPr>
+          <w:sz w:val="44"/>
+          <w:szCs w:val="44"/>
+          <w:lang w:bidi="fa-IR"/>
+        </w:rPr>
+        <w:lastRenderedPageBreak/>
+        <w:t>When (\lambda) is exactly zero, we are back at the vector (x). Notice that this point is precisely where our function reaches its minimum.</w:t>
+      </w:r>
+    </w:p>
+    <w:p>
+      <w:pPr>
+        <w:rPr>
+          <w:sz w:val="44"/>
+          <w:szCs w:val="44"/>
+          <w:lang w:bidi="fa-IR"/>
+        </w:rPr>
+      </w:pPr>
+      <w:r>
+        <w:rPr>
+          <w:sz w:val="44"/>
+          <w:szCs w:val="44"/>
+          <w:lang w:bidi="fa-IR"/>
+        </w:rPr>
+        <w:t xml:space="preserve">According to </w:t>
+      </w:r>
+      <w:r>
+        <w:rPr>
+          <w:b/>
+          <w:bCs/>
+          <w:sz w:val="44"/>
+          <w:szCs w:val="44"/>
+          <w:lang w:bidi="fa-IR"/>
+        </w:rPr>
+        <w:t>Fermat's Theorem</w:t>
+      </w:r>
+      <w:r>
+        <w:rPr>
+          <w:sz w:val="44"/>
+          <w:szCs w:val="44"/>
+          <w:lang w:bidi="fa-IR"/>
+        </w:rPr>
+        <w:t>, whenever a differentiable function attains a local minimum, its derivative at that point must be zero.</w:t>
+      </w:r>
+    </w:p>
+    <w:p>
+      <w:pPr>
+        <w:rPr>
+          <w:sz w:val="44"/>
+          <w:szCs w:val="44"/>
+          <w:lang w:bidi="fa-IR"/>
+        </w:rPr>
+      </w:pPr>
+      <w:r>
+        <w:rPr>
+          <w:sz w:val="44"/>
+          <w:szCs w:val="44"/>
+          <w:lang w:bidi="fa-IR"/>
+        </w:rPr>
+        <w:t>Therefore, we immediately obtain</w:t>
+      </w:r>
+      <w:r>
+        <w:rPr>
+          <w:sz w:val="44"/>
+          <w:szCs w:val="44"/>
+          <w:lang w:bidi="fa-IR"/>
+        </w:rPr>
+        <w:br/>
+        <w:t>[</w:t>
+      </w:r>
+      <w:r>
+        <w:rPr>
+          <w:sz w:val="44"/>
+          <w:szCs w:val="44"/>
+          <w:lang w:bidi="fa-IR"/>
+        </w:rPr>
+        <w:br/>
+      </w:r>
+      <w:r>
+        <w:rPr>
+          <w:sz w:val="44"/>
+          <w:szCs w:val="44"/>
+          <w:lang w:bidi="fa-IR"/>
+        </w:rPr>
+        <w:t xml:space="preserve">The derivative </w:t>
+      </w:r>
+      <w:proofErr w:type="spellStart"/>
+      <w:r>
+        <w:rPr>
+          <w:sz w:val="44"/>
+          <w:szCs w:val="44"/>
+          <w:lang w:bidi="fa-IR"/>
+        </w:rPr>
+        <w:t>of f</w:t>
+      </w:r>
+      <w:proofErr w:type="spellEnd"/>
+      <w:r>
+        <w:rPr>
+          <w:sz w:val="44"/>
+          <w:szCs w:val="44"/>
+          <w:lang w:bidi="fa-IR"/>
+        </w:rPr>
+        <w:t xml:space="preserve"> at zero is equal to zero</w:t>
+      </w:r>
+      <w:r>
+        <w:rPr>
+          <w:sz w:val="44"/>
+          <w:szCs w:val="44"/>
+          <w:lang w:bidi="fa-IR"/>
+        </w:rPr>
+        <w:t>.</w:t>
+      </w:r>
+      <w:r>
+        <w:rPr>
+          <w:sz w:val="44"/>
+          <w:szCs w:val="44"/>
+          <w:lang w:bidi="fa-IR"/>
+        </w:rPr>
+        <w:br/>
+        <w:t>]</w:t>
+      </w:r>
+    </w:p>
+    <w:p>
+      <w:pPr>
+        <w:rPr>
+          <w:sz w:val="44"/>
+          <w:szCs w:val="44"/>
+          <w:lang w:bidi="fa-IR"/>
+        </w:rPr>
+      </w:pPr>
+      <w:r>
+        <w:rPr>
+          <w:sz w:val="44"/>
+          <w:szCs w:val="44"/>
+          <w:lang w:bidi="fa-IR"/>
+        </w:rPr>
+        <w:t>Now let's substitute the (\</w:t>
+      </w:r>
+      <w:proofErr w:type="spellStart"/>
+      <w:r>
+        <w:rPr>
+          <w:sz w:val="44"/>
+          <w:szCs w:val="44"/>
+          <w:lang w:bidi="fa-IR"/>
+        </w:rPr>
+        <w:t>ell_p</w:t>
+      </w:r>
+      <w:proofErr w:type="spellEnd"/>
+      <w:r>
+        <w:rPr>
+          <w:sz w:val="44"/>
+          <w:szCs w:val="44"/>
+          <w:lang w:bidi="fa-IR"/>
+        </w:rPr>
+        <w:t>)-norm into our function.</w:t>
+      </w:r>
+    </w:p>
+    <w:p>
+      <w:pPr>
+        <w:rPr>
+          <w:sz w:val="44"/>
+          <w:szCs w:val="44"/>
+          <w:lang w:bidi="fa-IR"/>
+        </w:rPr>
+      </w:pPr>
+      <w:r>
+        <w:rPr>
+          <w:sz w:val="44"/>
+          <w:szCs w:val="44"/>
+          <w:lang w:bidi="fa-IR"/>
+        </w:rPr>
+        <w:t xml:space="preserve">Differentiating with respect to (\lambda), </w:t>
+      </w:r>
+      <w:r>
+        <w:rPr>
+          <w:rFonts w:hint="cs"/>
+          <w:sz w:val="44"/>
+          <w:szCs w:val="44"/>
+          <w:rtl/>
+          <w:lang w:bidi="fa-IR"/>
+        </w:rPr>
+        <w:t xml:space="preserve">  </w:t>
+      </w:r>
+    </w:p>
+    <w:p>
+      <w:pPr>
+        <w:rPr>
+          <w:sz w:val="44"/>
+          <w:szCs w:val="44"/>
+          <w:lang w:bidi="fa-IR"/>
+        </w:rPr>
+      </w:pPr>
+      <w:r>
+        <w:rPr>
+          <w:sz w:val="44"/>
+          <w:szCs w:val="44"/>
+          <w:lang w:bidi="fa-IR"/>
+        </w:rPr>
+        <w:t>, by setting</w:t>
+      </w:r>
+      <w:r>
+        <w:rPr>
+          <w:sz w:val="44"/>
+          <w:szCs w:val="44"/>
+          <w:lang w:bidi="fa-IR"/>
+        </w:rPr>
+        <w:br/>
+        <w:t>[</w:t>
+      </w:r>
+      <w:r>
+        <w:rPr>
+          <w:sz w:val="44"/>
+          <w:szCs w:val="44"/>
+          <w:lang w:bidi="fa-IR"/>
+        </w:rPr>
+        <w:br/>
+        <w:t>\lambda=0,</w:t>
+      </w:r>
+      <w:r>
+        <w:rPr>
+          <w:sz w:val="44"/>
+          <w:szCs w:val="44"/>
+          <w:lang w:bidi="fa-IR"/>
+        </w:rPr>
+        <w:br/>
+        <w:t>]</w:t>
+      </w:r>
+      <w:r>
+        <w:rPr>
+          <w:sz w:val="44"/>
+          <w:szCs w:val="44"/>
+          <w:lang w:bidi="fa-IR"/>
+        </w:rPr>
+        <w:br/>
+        <w:t>we arrive at the desired characterization of Birkhoff–James orthogonality in (\</w:t>
+      </w:r>
+      <w:proofErr w:type="spellStart"/>
+      <w:r>
+        <w:rPr>
+          <w:sz w:val="44"/>
+          <w:szCs w:val="44"/>
+          <w:lang w:bidi="fa-IR"/>
+        </w:rPr>
+        <w:t>ell_p</w:t>
+      </w:r>
+      <w:proofErr w:type="spellEnd"/>
+      <w:r>
+        <w:rPr>
+          <w:sz w:val="44"/>
+          <w:szCs w:val="44"/>
+          <w:lang w:bidi="fa-IR"/>
+        </w:rPr>
+        <w:t>) spaces.</w:t>
+      </w:r>
+    </w:p>
+    <w:p>
+      <w:pPr>
+        <w:rPr>
+          <w:sz w:val="44"/>
+          <w:szCs w:val="44"/>
+          <w:lang w:bidi="fa-IR"/>
+        </w:rPr>
+      </w:pPr>
+      <w:r>
+        <w:rPr>
+          <w:sz w:val="44"/>
+          <w:szCs w:val="44"/>
+          <w:lang w:bidi="fa-IR"/>
+        </w:rPr>
+        <w:lastRenderedPageBreak/>
+        <w:t>Now let's examine a familiar special case by choosing</w:t>
+      </w:r>
+      <w:r>
+        <w:rPr>
+          <w:sz w:val="44"/>
+          <w:szCs w:val="44"/>
+          <w:lang w:bidi="fa-IR"/>
+        </w:rPr>
+        <w:br/>
+        <w:t>[</w:t>
+      </w:r>
+      <w:r>
+        <w:rPr>
+          <w:sz w:val="44"/>
+          <w:szCs w:val="44"/>
+          <w:lang w:bidi="fa-IR"/>
+        </w:rPr>
+        <w:br/>
+        <w:t>p=2.</w:t>
+      </w:r>
+      <w:r>
+        <w:rPr>
+          <w:sz w:val="44"/>
+          <w:szCs w:val="44"/>
+          <w:lang w:bidi="fa-IR"/>
+        </w:rPr>
+        <w:br/>
+        <w:t>]</w:t>
+      </w:r>
+    </w:p>
+    <w:p>
+      <w:pPr>
+        <w:rPr>
+          <w:sz w:val="44"/>
+          <w:szCs w:val="44"/>
+          <w:lang w:bidi="fa-IR"/>
+        </w:rPr>
+      </w:pPr>
+      <w:r>
+        <w:rPr>
+          <w:sz w:val="44"/>
+          <w:szCs w:val="44"/>
+          <w:lang w:bidi="fa-IR"/>
+        </w:rPr>
+        <w:t>After simplifying the formula, we recover the standard inner product condition.</w:t>
+      </w:r>
+    </w:p>
+    <w:p>
+      <w:pPr>
+        <w:rPr>
+          <w:sz w:val="44"/>
+          <w:szCs w:val="44"/>
+          <w:lang w:bidi="fa-IR"/>
+        </w:rPr>
+      </w:pPr>
+      <w:r>
+        <w:rPr>
+          <w:sz w:val="44"/>
+          <w:szCs w:val="44"/>
+          <w:lang w:bidi="fa-IR"/>
+        </w:rPr>
+        <w:t xml:space="preserve">In other words, when (p=2), </w:t>
+      </w:r>
+      <w:r>
+        <w:rPr>
+          <w:b/>
+          <w:bCs/>
+          <w:sz w:val="44"/>
+          <w:szCs w:val="44"/>
+          <w:lang w:bidi="fa-IR"/>
+        </w:rPr>
+        <w:t>Birkhoff–James orthogonality coincides with the usual notion of orthogonality in Euclidean spaces.</w:t>
+      </w:r>
+    </w:p>
+    <w:p>
+      <w:pPr>
+        <w:rPr>
+          <w:sz w:val="44"/>
+          <w:szCs w:val="44"/>
+          <w:lang w:bidi="fa-IR"/>
+        </w:rPr>
+      </w:pPr>
+      <w:r>
+        <w:rPr>
+          <w:sz w:val="44"/>
+          <w:szCs w:val="44"/>
+          <w:lang w:bidi="fa-IR"/>
+        </w:rPr>
+        <w:t>3-11:</w:t>
+      </w:r>
+    </w:p>
+    <w:p>
+      <w:pPr>
+        <w:rPr>
+          <w:sz w:val="44"/>
+          <w:szCs w:val="44"/>
+          <w:lang w:bidi="fa-IR"/>
+        </w:rPr>
+      </w:pPr>
+      <w:r>
+        <w:rPr>
+          <w:sz w:val="44"/>
+          <w:szCs w:val="44"/>
+          <w:lang w:bidi="fa-IR"/>
+        </w:rPr>
+        <w:t xml:space="preserve">In this video, we studied </w:t>
+      </w:r>
+      <w:r>
+        <w:rPr>
+          <w:b/>
+          <w:bCs/>
+          <w:sz w:val="44"/>
+          <w:szCs w:val="44"/>
+          <w:lang w:bidi="fa-IR"/>
+        </w:rPr>
+        <w:t>Birkhoff–James orthogonality</w:t>
+      </w:r>
+      <w:r>
+        <w:rPr>
+          <w:sz w:val="44"/>
+          <w:szCs w:val="44"/>
+          <w:lang w:bidi="fa-IR"/>
+        </w:rPr>
+        <w:t xml:space="preserve"> and explored its definition, properties, and geometric interpretation.</w:t>
+      </w:r>
+    </w:p>
+    <w:p>
+      <w:pPr>
+        <w:rPr>
+          <w:sz w:val="44"/>
+          <w:szCs w:val="44"/>
+          <w:rtl/>
+          <w:lang w:bidi="fa-IR"/>
+        </w:rPr>
+      </w:pPr>
+      <w:r>
+        <w:rPr>
+          <w:sz w:val="44"/>
+          <w:szCs w:val="44"/>
+          <w:lang w:bidi="fa-IR"/>
+        </w:rPr>
+        <w:t xml:space="preserve">In the next video, we will move on to </w:t>
+      </w:r>
+      <w:r>
+        <w:rPr>
+          <w:b/>
+          <w:bCs/>
+          <w:sz w:val="44"/>
+          <w:szCs w:val="44"/>
+          <w:lang w:bidi="fa-IR"/>
+        </w:rPr>
+        <w:t>Isosceles orthogonality</w:t>
+      </w:r>
+      <w:r>
+        <w:rPr>
+          <w:sz w:val="44"/>
+          <w:szCs w:val="44"/>
+          <w:lang w:bidi="fa-IR"/>
+        </w:rPr>
+        <w:t xml:space="preserve"> and examine its definition and properties in normed spaces.</w:t>
+      </w:r>
+    </w:p>
+    <w:p>
+      <w:pPr>
+        <w:rPr>
+          <w:sz w:val="44"/>
+          <w:szCs w:val="44"/>
+          <w:lang w:bidi="fa-IR"/>
+        </w:rPr>
+      </w:pPr>
+      <w:r>
+        <w:rPr>
+          <w:sz w:val="44"/>
+          <w:szCs w:val="44"/>
+          <w:lang w:bidi="fa-IR"/>
+        </w:rPr>
+        <w:t>4 : isosceles orthogonality</w:t>
+      </w:r>
+    </w:p>
+    <w:p>
+      <w:pPr>
+        <w:rPr>
+          <w:sz w:val="44"/>
+          <w:szCs w:val="44"/>
+          <w:lang w:bidi="fa-IR"/>
+        </w:rPr>
+      </w:pPr>
+      <w:r>
+        <w:rPr>
+          <w:sz w:val="44"/>
+          <w:szCs w:val="44"/>
+          <w:lang w:bidi="fa-IR"/>
+        </w:rPr>
+        <w:t>4-1:</w:t>
+      </w:r>
+    </w:p>
+    <w:p>
+      <w:pPr>
+        <w:rPr>
+          <w:sz w:val="44"/>
+          <w:szCs w:val="44"/>
+          <w:lang w:bidi="fa-IR"/>
+        </w:rPr>
+      </w:pPr>
+    </w:p>
+    <w:p>
+      <w:pPr>
+        <w:rPr>
+          <w:rFonts w:hint="cs"/>
+          <w:sz w:val="44"/>
+          <w:szCs w:val="44"/>
+          <w:rtl/>
           <w:lang w:bidi="fa-IR"/>
         </w:rPr>
       </w:pPr>

</xml_diff>

<commit_message>
step 103 : add notes and start part 11
</commit_message>
<xml_diff>
--- a/video context/video_context_newVersion.docx
+++ b/video context/video_context_newVersion.docx
@@ -2304,27 +2304,15 @@
           <w:lang w:bidi="fa-IR"/>
         </w:rPr>
       </w:pPr>
-      <w:proofErr w:type="spellStart"/>
-      <w:r>
-        <w:rPr>
-          <w:b/>
-          <w:bCs/>
-          <w:sz w:val="44"/>
-          <w:szCs w:val="44"/>
-          <w:lang w:bidi="fa-IR"/>
-        </w:rPr>
-        <w:t>Hellooo</w:t>
-      </w:r>
-      <w:proofErr w:type="spellEnd"/>
-      <w:r>
-        <w:rPr>
-          <w:b/>
-          <w:bCs/>
-          <w:sz w:val="44"/>
-          <w:szCs w:val="44"/>
-          <w:lang w:bidi="fa-IR"/>
-        </w:rPr>
-        <w:t>, and welcome back!</w:t>
+      <w:r>
+        <w:rPr>
+          <w:b/>
+          <w:bCs/>
+          <w:sz w:val="44"/>
+          <w:szCs w:val="44"/>
+          <w:lang w:bidi="fa-IR"/>
+        </w:rPr>
+        <w:t>Hellooo, and welcome back!</w:t>
       </w:r>
       <w:r>
         <w:rPr>
@@ -2765,25 +2753,7 @@
           <w:lang w:bidi="fa-IR"/>
         </w:rPr>
         <w:lastRenderedPageBreak/>
-        <w:t xml:space="preserve">Next, we show that the distance from x </w:t>
-      </w:r>
-      <w:proofErr w:type="spellStart"/>
-      <w:r>
-        <w:rPr>
-          <w:sz w:val="44"/>
-          <w:szCs w:val="44"/>
-          <w:lang w:bidi="fa-IR"/>
-        </w:rPr>
-        <w:t>to y</w:t>
-      </w:r>
-      <w:proofErr w:type="spellEnd"/>
-      <w:r>
-        <w:rPr>
-          <w:sz w:val="44"/>
-          <w:szCs w:val="44"/>
-          <w:lang w:bidi="fa-IR"/>
-        </w:rPr>
-        <w:t xml:space="preserve"> is equal to the distance from y to x.</w:t>
+        <w:t>Next, we show that the distance from x to y is equal to the distance from y to x.</w:t>
       </w:r>
     </w:p>
     <w:p>
@@ -2817,18 +2787,8 @@
           <w:szCs w:val="44"/>
           <w:lang w:bidi="fa-IR"/>
         </w:rPr>
-        <w:t xml:space="preserve">To gain some geometric intuition, consider two points, x and y, in the two-dimensional plane. We first represent the distance from x </w:t>
-      </w:r>
-      <w:proofErr w:type="spellStart"/>
-      <w:r>
-        <w:rPr>
-          <w:sz w:val="44"/>
-          <w:szCs w:val="44"/>
-          <w:lang w:bidi="fa-IR"/>
-        </w:rPr>
-        <w:t>to y</w:t>
-      </w:r>
-      <w:proofErr w:type="spellEnd"/>
+        <w:t>To gain some geometric intuition, consider two points, x and y, in the two-dimensional plane. We first represent the distance from x to y</w:t>
+      </w:r>
       <w:r>
         <w:rPr>
           <w:sz w:val="44"/>
@@ -3403,78 +3363,24 @@
           <w:szCs w:val="44"/>
           <w:lang w:bidi="fa-IR"/>
         </w:rPr>
-        <w:t>To begin, let (</w:t>
-      </w:r>
-      <w:proofErr w:type="spellStart"/>
-      <w:r>
-        <w:rPr>
-          <w:sz w:val="44"/>
-          <w:szCs w:val="44"/>
-          <w:lang w:bidi="fa-IR"/>
-        </w:rPr>
-        <w:t>X,d</w:t>
-      </w:r>
-      <w:proofErr w:type="spellEnd"/>
-      <w:r>
-        <w:rPr>
-          <w:sz w:val="44"/>
-          <w:szCs w:val="44"/>
-          <w:lang w:bidi="fa-IR"/>
-        </w:rPr>
-        <w:t xml:space="preserve">) be a metric space, and let </w:t>
-      </w:r>
-      <w:proofErr w:type="spellStart"/>
-      <w:r>
-        <w:rPr>
-          <w:sz w:val="44"/>
-          <w:szCs w:val="44"/>
-          <w:lang w:bidi="fa-IR"/>
-        </w:rPr>
-        <w:t>y_n</w:t>
-      </w:r>
-      <w:proofErr w:type="spellEnd"/>
-      <w:r>
-        <w:rPr>
-          <w:sz w:val="44"/>
-          <w:szCs w:val="44"/>
-          <w:lang w:bidi="fa-IR"/>
-        </w:rPr>
-        <w:t xml:space="preserve"> be a sequence in X.</w:t>
-      </w:r>
-    </w:p>
-    <w:p>
-      <w:pPr>
-        <w:rPr>
-          <w:sz w:val="44"/>
-          <w:szCs w:val="44"/>
-          <w:lang w:bidi="fa-IR"/>
-        </w:rPr>
-      </w:pPr>
-      <w:r>
-        <w:rPr>
-          <w:sz w:val="44"/>
-          <w:szCs w:val="44"/>
-          <w:lang w:bidi="fa-IR"/>
-        </w:rPr>
-        <w:t xml:space="preserve">We say that the sequence </w:t>
-      </w:r>
-      <w:proofErr w:type="spellStart"/>
-      <w:r>
-        <w:rPr>
-          <w:sz w:val="44"/>
-          <w:szCs w:val="44"/>
-          <w:lang w:bidi="fa-IR"/>
-        </w:rPr>
-        <w:t>y_n</w:t>
-      </w:r>
-      <w:proofErr w:type="spellEnd"/>
-      <w:r>
-        <w:rPr>
-          <w:sz w:val="44"/>
-          <w:szCs w:val="44"/>
-          <w:lang w:bidi="fa-IR"/>
-        </w:rPr>
-        <w:t xml:space="preserve"> converges</w:t>
+        <w:t>To begin, let (X,d) be a metric space, and let y_n be a sequence in X.</w:t>
+      </w:r>
+    </w:p>
+    <w:p>
+      <w:pPr>
+        <w:rPr>
+          <w:sz w:val="44"/>
+          <w:szCs w:val="44"/>
+          <w:lang w:bidi="fa-IR"/>
+        </w:rPr>
+      </w:pPr>
+      <w:r>
+        <w:rPr>
+          <w:sz w:val="44"/>
+          <w:szCs w:val="44"/>
+          <w:lang w:bidi="fa-IR"/>
+        </w:rPr>
+        <w:t>We say that the sequence y_n converges</w:t>
       </w:r>
       <w:r>
         <w:rPr>
@@ -3596,7 +3502,6 @@
         <w:lastRenderedPageBreak/>
         <w:t xml:space="preserve">In this case, something interesting happens. The very same sequence </w:t>
       </w:r>
-      <w:proofErr w:type="spellStart"/>
       <w:r>
         <w:rPr>
           <w:sz w:val="44"/>
@@ -3605,7 +3510,6 @@
         </w:rPr>
         <w:t>y_n</w:t>
       </w:r>
-      <w:proofErr w:type="spellEnd"/>
       <w:r>
         <w:rPr>
           <w:sz w:val="44"/>
@@ -3819,43 +3723,7 @@
           <w:lang w:bidi="fa-IR"/>
         </w:rPr>
         <w:lastRenderedPageBreak/>
-        <w:t>Formally, a sequence ({</w:t>
-      </w:r>
-      <w:proofErr w:type="spellStart"/>
-      <w:r>
-        <w:rPr>
-          <w:sz w:val="44"/>
-          <w:szCs w:val="44"/>
-          <w:lang w:bidi="fa-IR"/>
-        </w:rPr>
-        <w:t>x_n</w:t>
-      </w:r>
-      <w:proofErr w:type="spellEnd"/>
-      <w:r>
-        <w:rPr>
-          <w:sz w:val="44"/>
-          <w:szCs w:val="44"/>
-          <w:lang w:bidi="fa-IR"/>
-        </w:rPr>
-        <w:t>}) in a metric space ((</w:t>
-      </w:r>
-      <w:proofErr w:type="spellStart"/>
-      <w:r>
-        <w:rPr>
-          <w:sz w:val="44"/>
-          <w:szCs w:val="44"/>
-          <w:lang w:bidi="fa-IR"/>
-        </w:rPr>
-        <w:t>X,d</w:t>
-      </w:r>
-      <w:proofErr w:type="spellEnd"/>
-      <w:r>
-        <w:rPr>
-          <w:sz w:val="44"/>
-          <w:szCs w:val="44"/>
-          <w:lang w:bidi="fa-IR"/>
-        </w:rPr>
-        <w:t xml:space="preserve">)) is called </w:t>
+        <w:t xml:space="preserve">Formally, a sequence ({x_n}) in a metric space ((X,d)) is called </w:t>
       </w:r>
       <w:r>
         <w:rPr>
@@ -3873,25 +3741,7 @@
           <w:szCs w:val="44"/>
           <w:lang w:bidi="fa-IR"/>
         </w:rPr>
-        <w:t xml:space="preserve"> if, for every (\</w:t>
-      </w:r>
-      <w:proofErr w:type="spellStart"/>
-      <w:r>
-        <w:rPr>
-          <w:sz w:val="44"/>
-          <w:szCs w:val="44"/>
-          <w:lang w:bidi="fa-IR"/>
-        </w:rPr>
-        <w:t>varepsilon</w:t>
-      </w:r>
-      <w:proofErr w:type="spellEnd"/>
-      <w:r>
-        <w:rPr>
-          <w:sz w:val="44"/>
-          <w:szCs w:val="44"/>
-          <w:lang w:bidi="fa-IR"/>
-        </w:rPr>
-        <w:t xml:space="preserve"> &gt; 0), there exists an integer (N) such that</w:t>
+        <w:t xml:space="preserve"> if, for every (\varepsilon &gt; 0), there exists an integer (N) such that</w:t>
       </w:r>
     </w:p>
     <w:p>
@@ -4035,60 +3885,24 @@
           <w:szCs w:val="44"/>
           <w:lang w:bidi="fa-IR"/>
         </w:rPr>
-        <w:t>for every (</w:t>
-      </w:r>
-      <w:proofErr w:type="spellStart"/>
-      <w:r>
-        <w:rPr>
-          <w:sz w:val="44"/>
-          <w:szCs w:val="44"/>
-          <w:lang w:bidi="fa-IR"/>
-        </w:rPr>
-        <w:t>m,n</w:t>
-      </w:r>
-      <w:proofErr w:type="spellEnd"/>
-      <w:r>
-        <w:rPr>
-          <w:sz w:val="44"/>
-          <w:szCs w:val="44"/>
-          <w:lang w:bidi="fa-IR"/>
-        </w:rPr>
-        <w:t xml:space="preserve"> &gt; N).</w:t>
-      </w:r>
-    </w:p>
-    <w:p>
-      <w:pPr>
-        <w:rPr>
-          <w:sz w:val="44"/>
-          <w:szCs w:val="44"/>
-          <w:lang w:bidi="fa-IR"/>
-        </w:rPr>
-      </w:pPr>
-      <w:r>
-        <w:rPr>
-          <w:sz w:val="44"/>
-          <w:szCs w:val="44"/>
-          <w:lang w:bidi="fa-IR"/>
-        </w:rPr>
-        <w:t>Now let's look again at our sequence ({</w:t>
-      </w:r>
-      <w:proofErr w:type="spellStart"/>
-      <w:r>
-        <w:rPr>
-          <w:sz w:val="44"/>
-          <w:szCs w:val="44"/>
-          <w:lang w:bidi="fa-IR"/>
-        </w:rPr>
-        <w:t>y_n</w:t>
-      </w:r>
-      <w:proofErr w:type="spellEnd"/>
-      <w:r>
-        <w:rPr>
-          <w:sz w:val="44"/>
-          <w:szCs w:val="44"/>
-          <w:lang w:bidi="fa-IR"/>
-        </w:rPr>
-        <w:t>}).</w:t>
+        <w:t>for every (m,n &gt; N).</w:t>
+      </w:r>
+    </w:p>
+    <w:p>
+      <w:pPr>
+        <w:rPr>
+          <w:sz w:val="44"/>
+          <w:szCs w:val="44"/>
+          <w:lang w:bidi="fa-IR"/>
+        </w:rPr>
+      </w:pPr>
+      <w:r>
+        <w:rPr>
+          <w:sz w:val="44"/>
+          <w:szCs w:val="44"/>
+          <w:lang w:bidi="fa-IR"/>
+        </w:rPr>
+        <w:t>Now let's look again at our sequence ({y_n}).</w:t>
       </w:r>
     </w:p>
     <w:p>
@@ -4642,25 +4456,7 @@
           <w:lang w:bidi="fa-IR"/>
         </w:rPr>
         <w:lastRenderedPageBreak/>
-        <w:t>Go back to our previous metric space (X), and consider the same Cauchy sequence ({</w:t>
-      </w:r>
-      <w:proofErr w:type="spellStart"/>
-      <w:r>
-        <w:rPr>
-          <w:sz w:val="44"/>
-          <w:szCs w:val="44"/>
-          <w:lang w:bidi="fa-IR"/>
-        </w:rPr>
-        <w:t>y_n</w:t>
-      </w:r>
-      <w:proofErr w:type="spellEnd"/>
-      <w:r>
-        <w:rPr>
-          <w:sz w:val="44"/>
-          <w:szCs w:val="44"/>
-          <w:lang w:bidi="fa-IR"/>
-        </w:rPr>
-        <w:t>}).</w:t>
+        <w:t>Go back to our previous metric space (X), and consider the same Cauchy sequence ({y_n}).</w:t>
       </w:r>
     </w:p>
     <w:p>
@@ -6722,7 +6518,6 @@
         </w:rPr>
         <w:t xml:space="preserve">Suppose we have two vectors, </w:t>
       </w:r>
-      <w:proofErr w:type="spellStart"/>
       <w:r>
         <w:rPr>
           <w:b/>
@@ -6739,16 +6534,7 @@
           <w:szCs w:val="44"/>
           <w:lang w:bidi="fa-IR"/>
         </w:rPr>
-        <w:t>and</w:t>
-      </w:r>
-      <w:proofErr w:type="spellEnd"/>
-      <w:r>
-        <w:rPr>
-          <w:sz w:val="44"/>
-          <w:szCs w:val="44"/>
-          <w:lang w:bidi="fa-IR"/>
-        </w:rPr>
-        <w:t xml:space="preserve"> </w:t>
+        <w:t xml:space="preserve">and </w:t>
       </w:r>
       <w:r>
         <w:rPr>
@@ -7873,7 +7659,6 @@
         </w:rPr>
         <w:t xml:space="preserve"> in its second argument. This property is also commonly referred to as </w:t>
       </w:r>
-      <w:proofErr w:type="spellStart"/>
       <w:r>
         <w:rPr>
           <w:b/>
@@ -7884,7 +7669,6 @@
         </w:rPr>
         <w:t>semilinearity</w:t>
       </w:r>
-      <w:proofErr w:type="spellEnd"/>
       <w:r>
         <w:rPr>
           <w:sz w:val="44"/>
@@ -7929,20 +7713,8 @@
           <w:lang w:bidi="fa-IR"/>
         </w:rPr>
         <w:lastRenderedPageBreak/>
-        <w:t xml:space="preserve">Putting these two results together, we conclude that the inner product is </w:t>
-      </w:r>
-      <w:proofErr w:type="spellStart"/>
-      <w:r>
-        <w:rPr>
-          <w:b/>
-          <w:bCs/>
-          <w:sz w:val="44"/>
-          <w:szCs w:val="44"/>
-          <w:lang w:bidi="fa-IR"/>
-        </w:rPr>
-        <w:t>sesquilinear</w:t>
-      </w:r>
-      <w:proofErr w:type="spellEnd"/>
+        <w:t>Putting these two results together, we conclude that the inner product is sesquilinear</w:t>
+      </w:r>
     </w:p>
     <w:p>
       <w:pPr>
@@ -8705,25 +8477,7 @@
           <w:lang w:bidi="fa-IR"/>
         </w:rPr>
         <w:lastRenderedPageBreak/>
-        <w:t>For instance, the (</w:t>
-      </w:r>
-      <w:proofErr w:type="spellStart"/>
-      <w:r>
-        <w:rPr>
-          <w:sz w:val="44"/>
-          <w:szCs w:val="44"/>
-          <w:lang w:bidi="fa-IR"/>
-        </w:rPr>
-        <w:t>L^p</w:t>
-      </w:r>
-      <w:proofErr w:type="spellEnd"/>
-      <w:r>
-        <w:rPr>
-          <w:sz w:val="44"/>
-          <w:szCs w:val="44"/>
-          <w:lang w:bidi="fa-IR"/>
-        </w:rPr>
-        <w:t xml:space="preserve">) norms for (p </w:t>
+        <w:t xml:space="preserve">For instance, the (L^p) norms for (p </w:t>
       </w:r>
       <m:oMath>
         <m:r>
@@ -10124,25 +9878,7 @@
           <w:szCs w:val="44"/>
           <w:lang w:bidi="fa-IR"/>
         </w:rPr>
-        <w:t>Although (C[</w:t>
-      </w:r>
-      <w:proofErr w:type="spellStart"/>
-      <w:r>
-        <w:rPr>
-          <w:sz w:val="44"/>
-          <w:szCs w:val="44"/>
-          <w:lang w:bidi="fa-IR"/>
-        </w:rPr>
-        <w:t>a,b</w:t>
-      </w:r>
-      <w:proofErr w:type="spellEnd"/>
-      <w:r>
-        <w:rPr>
-          <w:sz w:val="44"/>
-          <w:szCs w:val="44"/>
-          <w:lang w:bidi="fa-IR"/>
-        </w:rPr>
-        <w:t xml:space="preserve">]) with the supremum norm </w:t>
+        <w:t xml:space="preserve">Although (C[a,b]) with the supremum norm </w:t>
       </w:r>
       <w:r>
         <w:rPr>
@@ -10241,25 +9977,7 @@
           <w:szCs w:val="44"/>
           <w:lang w:bidi="fa-IR"/>
         </w:rPr>
-        <w:t>Therefore, (C[</w:t>
-      </w:r>
-      <w:proofErr w:type="spellStart"/>
-      <w:r>
-        <w:rPr>
-          <w:sz w:val="44"/>
-          <w:szCs w:val="44"/>
-          <w:lang w:bidi="fa-IR"/>
-        </w:rPr>
-        <w:t>a,b</w:t>
-      </w:r>
-      <w:proofErr w:type="spellEnd"/>
-      <w:r>
-        <w:rPr>
-          <w:sz w:val="44"/>
-          <w:szCs w:val="44"/>
-          <w:lang w:bidi="fa-IR"/>
-        </w:rPr>
-        <w:t xml:space="preserve">]) equipped with the supremum norm is </w:t>
+        <w:t xml:space="preserve">Therefore, (C[a,b]) equipped with the supremum norm is </w:t>
       </w:r>
       <w:r>
         <w:rPr>
@@ -11952,51 +11670,7 @@
           <w:szCs w:val="44"/>
           <w:lang w:bidi="fa-IR"/>
         </w:rPr>
-        <w:t xml:space="preserve">"The norm of x+ </w:t>
-      </w:r>
-      <w:proofErr w:type="spellStart"/>
-      <w:r>
-        <w:rPr>
-          <w:b/>
-          <w:bCs/>
-          <w:sz w:val="44"/>
-          <w:szCs w:val="44"/>
-          <w:lang w:bidi="fa-IR"/>
-        </w:rPr>
-        <w:t>ky</w:t>
-      </w:r>
-      <w:proofErr w:type="spellEnd"/>
-      <w:r>
-        <w:rPr>
-          <w:b/>
-          <w:bCs/>
-          <w:sz w:val="44"/>
-          <w:szCs w:val="44"/>
-          <w:lang w:bidi="fa-IR"/>
-        </w:rPr>
-        <w:t xml:space="preserve"> equals the norm of x−</w:t>
-      </w:r>
-      <w:proofErr w:type="spellStart"/>
-      <w:r>
-        <w:rPr>
-          <w:b/>
-          <w:bCs/>
-          <w:sz w:val="44"/>
-          <w:szCs w:val="44"/>
-          <w:lang w:bidi="fa-IR"/>
-        </w:rPr>
-        <w:t>ky</w:t>
-      </w:r>
-      <w:proofErr w:type="spellEnd"/>
-      <w:r>
-        <w:rPr>
-          <w:b/>
-          <w:bCs/>
-          <w:sz w:val="44"/>
-          <w:szCs w:val="44"/>
-          <w:lang w:bidi="fa-IR"/>
-        </w:rPr>
-        <w:t xml:space="preserve"> for all real numbers k."</w:t>
+        <w:t>"The norm of x+ ky equals the norm of x−ky for all real numbers k."</w:t>
       </w:r>
     </w:p>
     <w:p>
@@ -12038,25 +11712,7 @@
           <w:szCs w:val="44"/>
           <w:lang w:bidi="fa-IR"/>
         </w:rPr>
-        <w:t xml:space="preserve">x is orthogonal </w:t>
-      </w:r>
-      <w:proofErr w:type="spellStart"/>
-      <w:r>
-        <w:rPr>
-          <w:sz w:val="44"/>
-          <w:szCs w:val="44"/>
-          <w:lang w:bidi="fa-IR"/>
-        </w:rPr>
-        <w:t>to y</w:t>
-      </w:r>
-      <w:proofErr w:type="spellEnd"/>
-      <w:r>
-        <w:rPr>
-          <w:sz w:val="44"/>
-          <w:szCs w:val="44"/>
-          <w:lang w:bidi="fa-IR"/>
-        </w:rPr>
-        <w:t xml:space="preserve"> in the sense of Roberts</w:t>
+        <w:t>x is orthogonal to y in the sense of Roberts</w:t>
       </w:r>
       <w:r>
         <w:rPr>
@@ -12098,79 +11754,7 @@
           <w:szCs w:val="44"/>
           <w:lang w:bidi="fa-IR"/>
         </w:rPr>
-        <w:t>Suppose we have two vectors, (x) and (y), that are orthogonal in the sense of Roberts. For an arbitrary real number (k), draw the vector (</w:t>
-      </w:r>
-      <w:proofErr w:type="spellStart"/>
-      <w:r>
-        <w:rPr>
-          <w:sz w:val="44"/>
-          <w:szCs w:val="44"/>
-          <w:lang w:bidi="fa-IR"/>
-        </w:rPr>
-        <w:t>ky</w:t>
-      </w:r>
-      <w:proofErr w:type="spellEnd"/>
-      <w:r>
-        <w:rPr>
-          <w:sz w:val="44"/>
-          <w:szCs w:val="44"/>
-          <w:lang w:bidi="fa-IR"/>
-        </w:rPr>
-        <w:t>). The vectors (x) and (</w:t>
-      </w:r>
-      <w:proofErr w:type="spellStart"/>
-      <w:r>
-        <w:rPr>
-          <w:sz w:val="44"/>
-          <w:szCs w:val="44"/>
-          <w:lang w:bidi="fa-IR"/>
-        </w:rPr>
-        <w:t>ky</w:t>
-      </w:r>
-      <w:proofErr w:type="spellEnd"/>
-      <w:r>
-        <w:rPr>
-          <w:sz w:val="44"/>
-          <w:szCs w:val="44"/>
-          <w:lang w:bidi="fa-IR"/>
-        </w:rPr>
-        <w:t xml:space="preserve">) form a parallelogram, and when this parallelogram happens to be a rectangle, its diagonals are (x + </w:t>
-      </w:r>
-      <w:proofErr w:type="spellStart"/>
-      <w:r>
-        <w:rPr>
-          <w:sz w:val="44"/>
-          <w:szCs w:val="44"/>
-          <w:lang w:bidi="fa-IR"/>
-        </w:rPr>
-        <w:t>ky</w:t>
-      </w:r>
-      <w:proofErr w:type="spellEnd"/>
-      <w:r>
-        <w:rPr>
-          <w:sz w:val="44"/>
-          <w:szCs w:val="44"/>
-          <w:lang w:bidi="fa-IR"/>
-        </w:rPr>
-        <w:t xml:space="preserve">) and (x - </w:t>
-      </w:r>
-      <w:proofErr w:type="spellStart"/>
-      <w:r>
-        <w:rPr>
-          <w:sz w:val="44"/>
-          <w:szCs w:val="44"/>
-          <w:lang w:bidi="fa-IR"/>
-        </w:rPr>
-        <w:t>ky</w:t>
-      </w:r>
-      <w:proofErr w:type="spellEnd"/>
-      <w:r>
-        <w:rPr>
-          <w:sz w:val="44"/>
-          <w:szCs w:val="44"/>
-          <w:lang w:bidi="fa-IR"/>
-        </w:rPr>
-        <w:t>).</w:t>
+        <w:t>Suppose we have two vectors, (x) and (y), that are orthogonal in the sense of Roberts. For an arbitrary real number (k), draw the vector (ky). The vectors (x) and (ky) form a parallelogram, and when this parallelogram happens to be a rectangle, its diagonals are (x + ky) and (x - ky).</w:t>
       </w:r>
     </w:p>
     <w:p>
@@ -12748,25 +12332,7 @@
           <w:szCs w:val="44"/>
           <w:lang w:bidi="fa-IR"/>
         </w:rPr>
-        <w:t>Consider the following vectors in (\</w:t>
-      </w:r>
-      <w:proofErr w:type="spellStart"/>
-      <w:r>
-        <w:rPr>
-          <w:sz w:val="44"/>
-          <w:szCs w:val="44"/>
-          <w:lang w:bidi="fa-IR"/>
-        </w:rPr>
-        <w:t>mathbb</w:t>
-      </w:r>
-      <w:proofErr w:type="spellEnd"/>
-      <w:r>
-        <w:rPr>
-          <w:sz w:val="44"/>
-          <w:szCs w:val="44"/>
-          <w:lang w:bidi="fa-IR"/>
-        </w:rPr>
-        <w:t>{R}^3) equipped with the infinity norm.</w:t>
+        <w:t>Consider the following vectors in (\mathbb{R}^3) equipped with the infinity norm.</w:t>
       </w:r>
     </w:p>
     <w:p>
@@ -12949,25 +12515,7 @@
           <w:szCs w:val="44"/>
           <w:lang w:bidi="fa-IR"/>
         </w:rPr>
-        <w:t>We work in (\</w:t>
-      </w:r>
-      <w:proofErr w:type="spellStart"/>
-      <w:r>
-        <w:rPr>
-          <w:sz w:val="44"/>
-          <w:szCs w:val="44"/>
-          <w:lang w:bidi="fa-IR"/>
-        </w:rPr>
-        <w:t>mathbb</w:t>
-      </w:r>
-      <w:proofErr w:type="spellEnd"/>
-      <w:r>
-        <w:rPr>
-          <w:sz w:val="44"/>
-          <w:szCs w:val="44"/>
-          <w:lang w:bidi="fa-IR"/>
-        </w:rPr>
-        <w:t>{R}^2) equipped with the infinity norm.</w:t>
+        <w:t>We work in (\mathbb{R}^2) equipped with the infinity norm.</w:t>
       </w:r>
     </w:p>
     <w:p>
@@ -14613,25 +14161,7 @@
           <w:szCs w:val="44"/>
           <w:lang w:bidi="fa-IR"/>
         </w:rPr>
-        <w:t>We'll work in the space (\</w:t>
-      </w:r>
-      <w:proofErr w:type="spellStart"/>
-      <w:r>
-        <w:rPr>
-          <w:sz w:val="44"/>
-          <w:szCs w:val="44"/>
-          <w:lang w:bidi="fa-IR"/>
-        </w:rPr>
-        <w:t>mathbb</w:t>
-      </w:r>
-      <w:proofErr w:type="spellEnd"/>
-      <w:r>
-        <w:rPr>
-          <w:sz w:val="44"/>
-          <w:szCs w:val="44"/>
-          <w:lang w:bidi="fa-IR"/>
-        </w:rPr>
-        <w:t>{R}^2) equipped with the (\ell_1) norm.</w:t>
+        <w:t>We'll work in the space (\mathbb{R}^2) equipped with the (\ell_1) norm.</w:t>
       </w:r>
     </w:p>
     <w:p>
@@ -14812,25 +14342,7 @@
           <w:lang w:bidi="fa-IR"/>
         </w:rPr>
         <w:lastRenderedPageBreak/>
-        <w:t>First, suppose that (\alpha \</w:t>
-      </w:r>
-      <w:proofErr w:type="spellStart"/>
-      <w:r>
-        <w:rPr>
-          <w:sz w:val="44"/>
-          <w:szCs w:val="44"/>
-          <w:lang w:bidi="fa-IR"/>
-        </w:rPr>
-        <w:t>neq</w:t>
-      </w:r>
-      <w:proofErr w:type="spellEnd"/>
-      <w:r>
-        <w:rPr>
-          <w:sz w:val="44"/>
-          <w:szCs w:val="44"/>
-          <w:lang w:bidi="fa-IR"/>
-        </w:rPr>
-        <w:t xml:space="preserve"> 0). By factoring out (\alpha) from the norm and making a simple change of variables, we obtain the desired result.</w:t>
+        <w:t>First, suppose that (\alpha \neq 0). By factoring out (\alpha) from the norm and making a simple change of variables, we obtain the desired result.</w:t>
       </w:r>
     </w:p>
     <w:p>
@@ -17140,27 +16652,15 @@
         </w:rPr>
         <w:t xml:space="preserve"> </w:t>
       </w:r>
-      <w:proofErr w:type="spellStart"/>
-      <w:r>
-        <w:rPr>
-          <w:b/>
-          <w:bCs/>
-          <w:sz w:val="44"/>
-          <w:szCs w:val="44"/>
-          <w:lang w:bidi="fa-IR"/>
-        </w:rPr>
-        <w:t>λy</w:t>
-      </w:r>
-      <w:proofErr w:type="spellEnd"/>
-      <w:r>
-        <w:rPr>
-          <w:b/>
-          <w:bCs/>
-          <w:sz w:val="44"/>
-          <w:szCs w:val="44"/>
-          <w:lang w:bidi="fa-IR"/>
-        </w:rPr>
-        <w:t xml:space="preserve">, </w:t>
+      <w:r>
+        <w:rPr>
+          <w:b/>
+          <w:bCs/>
+          <w:sz w:val="44"/>
+          <w:szCs w:val="44"/>
+          <w:lang w:bidi="fa-IR"/>
+        </w:rPr>
+        <w:t xml:space="preserve">λy, </w:t>
       </w:r>
       <w:r>
         <w:rPr>
@@ -17404,25 +16904,7 @@
           <w:szCs w:val="44"/>
           <w:lang w:bidi="fa-IR"/>
         </w:rPr>
-        <w:t xml:space="preserve">The derivative </w:t>
-      </w:r>
-      <w:proofErr w:type="spellStart"/>
-      <w:r>
-        <w:rPr>
-          <w:sz w:val="44"/>
-          <w:szCs w:val="44"/>
-          <w:lang w:bidi="fa-IR"/>
-        </w:rPr>
-        <w:t>of f</w:t>
-      </w:r>
-      <w:proofErr w:type="spellEnd"/>
-      <w:r>
-        <w:rPr>
-          <w:sz w:val="44"/>
-          <w:szCs w:val="44"/>
-          <w:lang w:bidi="fa-IR"/>
-        </w:rPr>
-        <w:t xml:space="preserve"> at zero is equal to zero</w:t>
+        <w:t>The derivative of f at zero is equal to zero</w:t>
       </w:r>
       <w:r>
         <w:rPr>
@@ -17456,25 +16938,7 @@
           <w:szCs w:val="44"/>
           <w:lang w:bidi="fa-IR"/>
         </w:rPr>
-        <w:t>Now let's substitute the (\</w:t>
-      </w:r>
-      <w:proofErr w:type="spellStart"/>
-      <w:r>
-        <w:rPr>
-          <w:sz w:val="44"/>
-          <w:szCs w:val="44"/>
-          <w:lang w:bidi="fa-IR"/>
-        </w:rPr>
-        <w:t>ell_p</w:t>
-      </w:r>
-      <w:proofErr w:type="spellEnd"/>
-      <w:r>
-        <w:rPr>
-          <w:sz w:val="44"/>
-          <w:szCs w:val="44"/>
-          <w:lang w:bidi="fa-IR"/>
-        </w:rPr>
-        <w:t>)-norm into our function.</w:t>
+        <w:t>Now let's substitute the (\ell_p)-norm into our function.</w:t>
       </w:r>
     </w:p>
     <w:p>
@@ -17554,25 +17018,7 @@
           <w:lang w:bidi="fa-IR"/>
         </w:rPr>
         <w:br/>
-        <w:t>we arrive at the desired characterization of Birkhoff–James orthogonality in (\</w:t>
-      </w:r>
-      <w:proofErr w:type="spellStart"/>
-      <w:r>
-        <w:rPr>
-          <w:sz w:val="44"/>
-          <w:szCs w:val="44"/>
-          <w:lang w:bidi="fa-IR"/>
-        </w:rPr>
-        <w:t>ell_p</w:t>
-      </w:r>
-      <w:proofErr w:type="spellEnd"/>
-      <w:r>
-        <w:rPr>
-          <w:sz w:val="44"/>
-          <w:szCs w:val="44"/>
-          <w:lang w:bidi="fa-IR"/>
-        </w:rPr>
-        <w:t>) spaces.</w:t>
+        <w:t>we arrive at the desired characterization of Birkhoff–James orthogonality in (\ell_p) spaces.</w:t>
       </w:r>
     </w:p>
     <w:p>
@@ -17791,9 +17237,231 @@
         <w:rPr>
           <w:sz w:val="44"/>
           <w:szCs w:val="44"/>
-          <w:lang w:bidi="fa-IR"/>
-        </w:rPr>
-      </w:pPr>
+          <w:rtl/>
+          <w:lang w:bidi="fa-IR"/>
+        </w:rPr>
+      </w:pPr>
+      <w:r>
+        <w:rPr>
+          <w:sz w:val="44"/>
+          <w:szCs w:val="44"/>
+          <w:lang w:bidi="fa-IR"/>
+        </w:rPr>
+        <w:lastRenderedPageBreak/>
+        <w:t xml:space="preserve">In this video, we're going to study </w:t>
+      </w:r>
+      <w:r>
+        <w:rPr>
+          <w:b/>
+          <w:bCs/>
+          <w:sz w:val="44"/>
+          <w:szCs w:val="44"/>
+          <w:lang w:bidi="fa-IR"/>
+        </w:rPr>
+        <w:t>Isosceles Orthogonality</w:t>
+      </w:r>
+      <w:r>
+        <w:rPr>
+          <w:sz w:val="44"/>
+          <w:szCs w:val="44"/>
+          <w:lang w:bidi="fa-IR"/>
+        </w:rPr>
+        <w:t xml:space="preserve"> in normed spaces.</w:t>
+      </w:r>
+      <w:r>
+        <w:rPr>
+          <w:sz w:val="44"/>
+          <w:szCs w:val="44"/>
+          <w:lang w:bidi="fa-IR"/>
+        </w:rPr>
+        <w:br/>
+        <w:t xml:space="preserve">Both </w:t>
+      </w:r>
+      <w:r>
+        <w:rPr>
+          <w:b/>
+          <w:bCs/>
+          <w:sz w:val="44"/>
+          <w:szCs w:val="44"/>
+          <w:lang w:bidi="fa-IR"/>
+        </w:rPr>
+        <w:t>Isosceles Orthogonality</w:t>
+      </w:r>
+      <w:r>
+        <w:rPr>
+          <w:sz w:val="44"/>
+          <w:szCs w:val="44"/>
+          <w:lang w:bidi="fa-IR"/>
+        </w:rPr>
+        <w:t xml:space="preserve"> and </w:t>
+      </w:r>
+      <w:r>
+        <w:rPr>
+          <w:b/>
+          <w:bCs/>
+          <w:sz w:val="44"/>
+          <w:szCs w:val="44"/>
+          <w:lang w:bidi="fa-IR"/>
+        </w:rPr>
+        <w:t>Pythagorean Orthogonality</w:t>
+      </w:r>
+      <w:r>
+        <w:rPr>
+          <w:sz w:val="44"/>
+          <w:szCs w:val="44"/>
+          <w:lang w:bidi="fa-IR"/>
+        </w:rPr>
+        <w:t xml:space="preserve">, which we'll discuss in the next video, were introduced by </w:t>
+      </w:r>
+      <w:r>
+        <w:rPr>
+          <w:b/>
+          <w:bCs/>
+          <w:sz w:val="44"/>
+          <w:szCs w:val="44"/>
+          <w:lang w:bidi="fa-IR"/>
+        </w:rPr>
+        <w:t>Robert C. James</w:t>
+      </w:r>
+      <w:r>
+        <w:rPr>
+          <w:sz w:val="44"/>
+          <w:szCs w:val="44"/>
+          <w:lang w:bidi="fa-IR"/>
+        </w:rPr>
+        <w:t xml:space="preserve"> in </w:t>
+      </w:r>
+      <w:r>
+        <w:rPr>
+          <w:b/>
+          <w:bCs/>
+          <w:sz w:val="44"/>
+          <w:szCs w:val="44"/>
+          <w:lang w:bidi="fa-IR"/>
+        </w:rPr>
+        <w:t>1945</w:t>
+      </w:r>
+      <w:r>
+        <w:rPr>
+          <w:sz w:val="44"/>
+          <w:szCs w:val="44"/>
+          <w:lang w:bidi="fa-IR"/>
+        </w:rPr>
+        <w:t>. These concepts provide alternative ways of defining orthogonality without relying on an inner product, making them especially useful in the study of general normed spaces.</w:t>
+      </w:r>
+    </w:p>
+    <w:p>
+      <w:pPr>
+        <w:rPr>
+          <w:sz w:val="44"/>
+          <w:szCs w:val="44"/>
+          <w:lang w:bidi="fa-IR"/>
+        </w:rPr>
+      </w:pPr>
+      <w:r>
+        <w:rPr>
+          <w:sz w:val="44"/>
+          <w:szCs w:val="44"/>
+          <w:lang w:bidi="fa-IR"/>
+        </w:rPr>
+        <w:t>4-2:</w:t>
+      </w:r>
+      <w:r>
+        <w:rPr>
+          <w:sz w:val="44"/>
+          <w:szCs w:val="44"/>
+          <w:lang w:bidi="fa-IR"/>
+        </w:rPr>
+        <w:br/>
+      </w:r>
+      <w:r>
+        <w:rPr>
+          <w:sz w:val="44"/>
+          <w:szCs w:val="44"/>
+          <w:lang w:bidi="fa-IR"/>
+        </w:rPr>
+        <w:t>Let's begin with the mathematical definition.</w:t>
+      </w:r>
+      <w:r>
+        <w:rPr>
+          <w:sz w:val="44"/>
+          <w:szCs w:val="44"/>
+          <w:lang w:bidi="fa-IR"/>
+        </w:rPr>
+        <w:br/>
+        <w:t xml:space="preserve">Let x and y be two vectors in a normed space X. We say that x is </w:t>
+      </w:r>
+      <w:r>
+        <w:rPr>
+          <w:b/>
+          <w:bCs/>
+          <w:sz w:val="44"/>
+          <w:szCs w:val="44"/>
+          <w:lang w:bidi="fa-IR"/>
+        </w:rPr>
+        <w:t>orthogonal to</w:t>
+      </w:r>
+      <w:r>
+        <w:rPr>
+          <w:sz w:val="44"/>
+          <w:szCs w:val="44"/>
+          <w:lang w:bidi="fa-IR"/>
+        </w:rPr>
+        <w:t xml:space="preserve"> y in the sense of </w:t>
+      </w:r>
+      <w:r>
+        <w:rPr>
+          <w:b/>
+          <w:bCs/>
+          <w:sz w:val="44"/>
+          <w:szCs w:val="44"/>
+          <w:lang w:bidi="fa-IR"/>
+        </w:rPr>
+        <w:t>Isosceles Orthogonality</w:t>
+      </w:r>
+      <w:r>
+        <w:rPr>
+          <w:sz w:val="44"/>
+          <w:szCs w:val="44"/>
+          <w:lang w:bidi="fa-IR"/>
+        </w:rPr>
+        <w:t xml:space="preserve"> if and only if the norm of x+y is equal to the norm of x−y.</w:t>
+      </w:r>
+      <w:r>
+        <w:rPr>
+          <w:sz w:val="44"/>
+          <w:szCs w:val="44"/>
+          <w:lang w:bidi="fa-IR"/>
+        </w:rPr>
+        <w:br/>
+        <w:t>In other words, adding or subtracting y from x results in vectors with exactly the same length.</w:t>
+      </w:r>
+      <w:r>
+        <w:rPr>
+          <w:sz w:val="44"/>
+          <w:szCs w:val="44"/>
+          <w:lang w:bidi="fa-IR"/>
+        </w:rPr>
+        <w:br/>
+        <w:t>When this condition holds, we write we say that x is orthogonal to y in the isosceles sense.</w:t>
+      </w:r>
+    </w:p>
+    <w:p>
+      <w:pPr>
+        <w:rPr>
+          <w:sz w:val="44"/>
+          <w:szCs w:val="44"/>
+          <w:lang w:bidi="fa-IR"/>
+        </w:rPr>
+      </w:pPr>
+      <w:r>
+        <w:rPr>
+          <w:sz w:val="44"/>
+          <w:szCs w:val="44"/>
+          <w:lang w:bidi="fa-IR"/>
+        </w:rPr>
+        <w:t>4-3:</w:t>
+      </w:r>
     </w:p>
     <w:p>
       <w:pPr>
@@ -17802,6 +17470,902 @@
           <w:sz w:val="44"/>
           <w:szCs w:val="44"/>
           <w:rtl/>
+          <w:lang w:bidi="fa-IR"/>
+        </w:rPr>
+      </w:pPr>
+      <w:r>
+        <w:rPr>
+          <w:sz w:val="44"/>
+          <w:szCs w:val="44"/>
+          <w:lang w:bidi="fa-IR"/>
+        </w:rPr>
+        <w:lastRenderedPageBreak/>
+        <w:t>Now let's look at the geometric picture to better understand this definition.</w:t>
+      </w:r>
+      <w:r>
+        <w:rPr>
+          <w:sz w:val="44"/>
+          <w:szCs w:val="44"/>
+          <w:lang w:bidi="fa-IR"/>
+        </w:rPr>
+        <w:br/>
+        <w:t xml:space="preserve">First, draw the vector </w:t>
+      </w:r>
+      <w:r>
+        <w:rPr>
+          <w:sz w:val="44"/>
+          <w:szCs w:val="44"/>
+          <w:lang w:bidi="fa-IR"/>
+        </w:rPr>
+        <w:t>y</w:t>
+      </w:r>
+      <w:r>
+        <w:rPr>
+          <w:sz w:val="44"/>
+          <w:szCs w:val="44"/>
+          <w:lang w:bidi="fa-IR"/>
+        </w:rPr>
+        <w:t xml:space="preserve">. Then draw the vector </w:t>
+      </w:r>
+      <w:r>
+        <w:rPr>
+          <w:sz w:val="44"/>
+          <w:szCs w:val="44"/>
+          <w:lang w:bidi="fa-IR"/>
+        </w:rPr>
+        <w:t>x</w:t>
+      </w:r>
+      <w:r>
+        <w:rPr>
+          <w:sz w:val="44"/>
+          <w:szCs w:val="44"/>
+          <w:lang w:bidi="fa-IR"/>
+        </w:rPr>
+        <w:t xml:space="preserve"> so that it is perpendicular to </w:t>
+      </w:r>
+      <w:r>
+        <w:rPr>
+          <w:sz w:val="44"/>
+          <w:szCs w:val="44"/>
+          <w:lang w:bidi="fa-IR"/>
+        </w:rPr>
+        <w:t>y</w:t>
+      </w:r>
+      <w:r>
+        <w:rPr>
+          <w:sz w:val="44"/>
+          <w:szCs w:val="44"/>
+          <w:lang w:bidi="fa-IR"/>
+        </w:rPr>
+        <w:t>. Next, draw the vector −</w:t>
+      </w:r>
+      <w:r>
+        <w:rPr>
+          <w:sz w:val="44"/>
+          <w:szCs w:val="44"/>
+          <w:lang w:bidi="fa-IR"/>
+        </w:rPr>
+        <w:t>y</w:t>
+      </w:r>
+      <w:r>
+        <w:rPr>
+          <w:sz w:val="44"/>
+          <w:szCs w:val="44"/>
+          <w:lang w:bidi="fa-IR"/>
+        </w:rPr>
+        <w:t>. Finally, construct the vectors x+y and x−</w:t>
+      </w:r>
+      <w:r>
+        <w:rPr>
+          <w:sz w:val="44"/>
+          <w:szCs w:val="44"/>
+          <w:lang w:bidi="fa-IR"/>
+        </w:rPr>
+        <w:t>y</w:t>
+      </w:r>
+      <w:r>
+        <w:rPr>
+          <w:sz w:val="44"/>
+          <w:szCs w:val="44"/>
+          <w:lang w:bidi="fa-IR"/>
+        </w:rPr>
+        <w:t>.</w:t>
+      </w:r>
+      <w:r>
+        <w:rPr>
+          <w:sz w:val="44"/>
+          <w:szCs w:val="44"/>
+          <w:lang w:bidi="fa-IR"/>
+        </w:rPr>
+        <w:br/>
+        <w:t>Notice what happens: the vectors x+y and x−</w:t>
+      </w:r>
+      <w:r>
+        <w:rPr>
+          <w:sz w:val="44"/>
+          <w:szCs w:val="44"/>
+          <w:lang w:bidi="fa-IR"/>
+        </w:rPr>
+        <w:t>y</w:t>
+      </w:r>
+      <w:r>
+        <w:rPr>
+          <w:sz w:val="44"/>
+          <w:szCs w:val="44"/>
+          <w:lang w:bidi="fa-IR"/>
+        </w:rPr>
+        <w:t xml:space="preserve"> have the same length, so they form an </w:t>
+      </w:r>
+      <w:r>
+        <w:rPr>
+          <w:b/>
+          <w:bCs/>
+          <w:sz w:val="44"/>
+          <w:szCs w:val="44"/>
+          <w:lang w:bidi="fa-IR"/>
+        </w:rPr>
+        <w:t>isosceles triangle</w:t>
+      </w:r>
+      <w:r>
+        <w:rPr>
+          <w:sz w:val="44"/>
+          <w:szCs w:val="44"/>
+          <w:lang w:bidi="fa-IR"/>
+        </w:rPr>
+        <w:t xml:space="preserve">. This geometric observation is exactly where the name </w:t>
+      </w:r>
+      <w:r>
+        <w:rPr>
+          <w:b/>
+          <w:bCs/>
+          <w:sz w:val="44"/>
+          <w:szCs w:val="44"/>
+          <w:lang w:bidi="fa-IR"/>
+        </w:rPr>
+        <w:t>Isosceles Orthogonality</w:t>
+      </w:r>
+      <w:r>
+        <w:rPr>
+          <w:sz w:val="44"/>
+          <w:szCs w:val="44"/>
+          <w:lang w:bidi="fa-IR"/>
+        </w:rPr>
+        <w:t xml:space="preserve"> comes from.</w:t>
+      </w:r>
+    </w:p>
+    <w:p>
+      <w:pPr>
+        <w:rPr>
+          <w:sz w:val="44"/>
+          <w:szCs w:val="44"/>
+          <w:lang w:bidi="fa-IR"/>
+        </w:rPr>
+      </w:pPr>
+      <w:r>
+        <w:rPr>
+          <w:sz w:val="44"/>
+          <w:szCs w:val="44"/>
+          <w:lang w:bidi="fa-IR"/>
+        </w:rPr>
+        <w:t>4-4:</w:t>
+      </w:r>
+    </w:p>
+    <w:p>
+      <w:pPr>
+        <w:rPr>
+          <w:sz w:val="44"/>
+          <w:szCs w:val="44"/>
+          <w:lang w:bidi="fa-IR"/>
+        </w:rPr>
+      </w:pPr>
+      <w:r>
+        <w:rPr>
+          <w:sz w:val="44"/>
+          <w:szCs w:val="44"/>
+          <w:lang w:bidi="fa-IR"/>
+        </w:rPr>
+        <w:t xml:space="preserve">Next, let's show that </w:t>
+      </w:r>
+      <w:r>
+        <w:rPr>
+          <w:b/>
+          <w:bCs/>
+          <w:sz w:val="44"/>
+          <w:szCs w:val="44"/>
+          <w:lang w:bidi="fa-IR"/>
+        </w:rPr>
+        <w:t>homogeneity does not hold</w:t>
+      </w:r>
+      <w:r>
+        <w:rPr>
+          <w:sz w:val="44"/>
+          <w:szCs w:val="44"/>
+          <w:lang w:bidi="fa-IR"/>
+        </w:rPr>
+        <w:t xml:space="preserve"> for Isosceles Orthogonality by using a counterexample.</w:t>
+      </w:r>
+      <w:r>
+        <w:rPr>
+          <w:sz w:val="44"/>
+          <w:szCs w:val="44"/>
+          <w:lang w:bidi="fa-IR"/>
+        </w:rPr>
+        <w:br/>
+        <w:t>We consider the space (\mathbb{R}^2) equipped with the (\ell_1)-norm, and define the vectors (x) and (y) as follows.</w:t>
+      </w:r>
+      <w:r>
+        <w:rPr>
+          <w:sz w:val="44"/>
+          <w:szCs w:val="44"/>
+          <w:lang w:bidi="fa-IR"/>
+        </w:rPr>
+        <w:br/>
+        <w:t>As you can see, (x) is orthogonal to (y) in the isosceles sense. However, if we scale (x) by a factor of (2), the condition no longer holds.</w:t>
+      </w:r>
+      <w:r>
+        <w:rPr>
+          <w:sz w:val="44"/>
+          <w:szCs w:val="44"/>
+          <w:lang w:bidi="fa-IR"/>
+        </w:rPr>
+        <w:t xml:space="preserve"> </w:t>
+      </w:r>
+      <w:r>
+        <w:rPr>
+          <w:sz w:val="44"/>
+          <w:szCs w:val="44"/>
+          <w:lang w:bidi="fa-IR"/>
+        </w:rPr>
+        <w:br/>
+      </w:r>
+      <w:r>
+        <w:rPr>
+          <w:sz w:val="44"/>
+          <w:szCs w:val="44"/>
+          <w:lang w:bidi="fa-IR"/>
+        </w:rPr>
+        <w:lastRenderedPageBreak/>
+        <w:t xml:space="preserve">Therefore, this example shows that Isosceles Orthogonality is </w:t>
+      </w:r>
+      <w:r>
+        <w:rPr>
+          <w:b/>
+          <w:bCs/>
+          <w:sz w:val="44"/>
+          <w:szCs w:val="44"/>
+          <w:lang w:bidi="fa-IR"/>
+        </w:rPr>
+        <w:t>not homogeneous</w:t>
+      </w:r>
+      <w:r>
+        <w:rPr>
+          <w:sz w:val="44"/>
+          <w:szCs w:val="44"/>
+          <w:lang w:bidi="fa-IR"/>
+        </w:rPr>
+        <w:t xml:space="preserve"> in general.</w:t>
+      </w:r>
+    </w:p>
+    <w:p>
+      <w:pPr>
+        <w:rPr>
+          <w:sz w:val="44"/>
+          <w:szCs w:val="44"/>
+          <w:lang w:bidi="fa-IR"/>
+        </w:rPr>
+      </w:pPr>
+      <w:r>
+        <w:rPr>
+          <w:sz w:val="44"/>
+          <w:szCs w:val="44"/>
+          <w:lang w:bidi="fa-IR"/>
+        </w:rPr>
+        <w:t>4-5:</w:t>
+      </w:r>
+    </w:p>
+    <w:p>
+      <w:pPr>
+        <w:rPr>
+          <w:sz w:val="44"/>
+          <w:szCs w:val="44"/>
+          <w:lang w:bidi="fa-IR"/>
+        </w:rPr>
+      </w:pPr>
+      <w:r>
+        <w:rPr>
+          <w:sz w:val="44"/>
+          <w:szCs w:val="44"/>
+          <w:lang w:bidi="fa-IR"/>
+        </w:rPr>
+        <w:t xml:space="preserve">Now let's show that </w:t>
+      </w:r>
+      <w:r>
+        <w:rPr>
+          <w:b/>
+          <w:bCs/>
+          <w:sz w:val="44"/>
+          <w:szCs w:val="44"/>
+          <w:lang w:bidi="fa-IR"/>
+        </w:rPr>
+        <w:t>additivity</w:t>
+      </w:r>
+      <w:r>
+        <w:rPr>
+          <w:sz w:val="44"/>
+          <w:szCs w:val="44"/>
+          <w:lang w:bidi="fa-IR"/>
+        </w:rPr>
+        <w:t xml:space="preserve"> does not hold either.</w:t>
+      </w:r>
+      <w:r>
+        <w:rPr>
+          <w:sz w:val="44"/>
+          <w:szCs w:val="44"/>
+          <w:lang w:bidi="fa-IR"/>
+        </w:rPr>
+        <w:br/>
+        <w:t>We'll work in the same space, (\mathbb{R}^2) equipped with the (\ell_1)-norm. We define the vectors (x), (y), and (z) as shown.</w:t>
+      </w:r>
+      <w:r>
+        <w:rPr>
+          <w:sz w:val="44"/>
+          <w:szCs w:val="44"/>
+          <w:lang w:bidi="fa-IR"/>
+        </w:rPr>
+        <w:br/>
+        <w:t xml:space="preserve">It is easy to verify that (x) is orthogonal to both (y) and (z) in the isosceles sense. However, when we add the two vectors together, the result changes. The vector (x) is </w:t>
+      </w:r>
+      <w:r>
+        <w:rPr>
+          <w:b/>
+          <w:bCs/>
+          <w:sz w:val="44"/>
+          <w:szCs w:val="44"/>
+          <w:lang w:bidi="fa-IR"/>
+        </w:rPr>
+        <w:t>not</w:t>
+      </w:r>
+      <w:r>
+        <w:rPr>
+          <w:sz w:val="44"/>
+          <w:szCs w:val="44"/>
+          <w:lang w:bidi="fa-IR"/>
+        </w:rPr>
+        <w:t xml:space="preserve"> orthogonal to (y+z).</w:t>
+      </w:r>
+      <w:r>
+        <w:rPr>
+          <w:sz w:val="44"/>
+          <w:szCs w:val="44"/>
+          <w:lang w:bidi="fa-IR"/>
+        </w:rPr>
+        <w:br/>
+        <w:t xml:space="preserve">Therefore, Isosceles Orthogonality does </w:t>
+      </w:r>
+      <w:r>
+        <w:rPr>
+          <w:b/>
+          <w:bCs/>
+          <w:sz w:val="44"/>
+          <w:szCs w:val="44"/>
+          <w:lang w:bidi="fa-IR"/>
+        </w:rPr>
+        <w:t>not</w:t>
+      </w:r>
+      <w:r>
+        <w:rPr>
+          <w:sz w:val="44"/>
+          <w:szCs w:val="44"/>
+          <w:lang w:bidi="fa-IR"/>
+        </w:rPr>
+        <w:t xml:space="preserve"> satisfy the additivity property in general.</w:t>
+      </w:r>
+    </w:p>
+    <w:p>
+      <w:pPr>
+        <w:rPr>
+          <w:sz w:val="44"/>
+          <w:szCs w:val="44"/>
+          <w:lang w:bidi="fa-IR"/>
+        </w:rPr>
+      </w:pPr>
+      <w:r>
+        <w:rPr>
+          <w:sz w:val="44"/>
+          <w:szCs w:val="44"/>
+          <w:lang w:bidi="fa-IR"/>
+        </w:rPr>
+        <w:t>4-6:</w:t>
+      </w:r>
+    </w:p>
+    <w:p>
+      <w:pPr>
+        <w:rPr>
+          <w:sz w:val="44"/>
+          <w:szCs w:val="44"/>
+          <w:lang w:bidi="fa-IR"/>
+        </w:rPr>
+      </w:pPr>
+      <w:r>
+        <w:rPr>
+          <w:sz w:val="44"/>
+          <w:szCs w:val="44"/>
+          <w:lang w:bidi="fa-IR"/>
+        </w:rPr>
+        <w:t>Lets prove that</w:t>
+      </w:r>
+      <w:r>
+        <w:rPr>
+          <w:sz w:val="44"/>
+          <w:szCs w:val="44"/>
+          <w:lang w:bidi="fa-IR"/>
+        </w:rPr>
+        <w:t xml:space="preserve"> </w:t>
+      </w:r>
+      <w:r>
+        <w:rPr>
+          <w:b/>
+          <w:bCs/>
+          <w:sz w:val="44"/>
+          <w:szCs w:val="44"/>
+          <w:lang w:bidi="fa-IR"/>
+        </w:rPr>
+        <w:t>Scalar Existence</w:t>
+      </w:r>
+      <w:r>
+        <w:rPr>
+          <w:sz w:val="44"/>
+          <w:szCs w:val="44"/>
+          <w:lang w:bidi="fa-IR"/>
+        </w:rPr>
+        <w:t xml:space="preserve"> holds for isosceles orthogonality</w:t>
+      </w:r>
+      <w:r>
+        <w:rPr>
+          <w:rFonts w:hint="cs"/>
+          <w:sz w:val="44"/>
+          <w:szCs w:val="44"/>
+          <w:rtl/>
+          <w:lang w:bidi="fa-IR"/>
+        </w:rPr>
+        <w:t>.</w:t>
+      </w:r>
+    </w:p>
+    <w:p>
+      <w:pPr>
+        <w:rPr>
+          <w:sz w:val="44"/>
+          <w:szCs w:val="44"/>
+          <w:lang w:bidi="fa-IR"/>
+        </w:rPr>
+      </w:pPr>
+      <w:r>
+        <w:rPr>
+          <w:sz w:val="44"/>
+          <w:szCs w:val="44"/>
+          <w:lang w:bidi="fa-IR"/>
+        </w:rPr>
+        <w:t>If (x=0), the proof is immediate. We can simply choose (a=0), and the required equality is satisfied automatically.</w:t>
+      </w:r>
+    </w:p>
+    <w:p>
+      <w:pPr>
+        <w:rPr>
+          <w:sz w:val="44"/>
+          <w:szCs w:val="44"/>
+          <w:lang w:bidi="fa-IR"/>
+        </w:rPr>
+      </w:pPr>
+      <w:r>
+        <w:rPr>
+          <w:sz w:val="44"/>
+          <w:szCs w:val="44"/>
+          <w:lang w:bidi="fa-IR"/>
+        </w:rPr>
+        <w:lastRenderedPageBreak/>
+        <w:t>So, let's focus on the more interesting case where (x\neq0).</w:t>
+      </w:r>
+    </w:p>
+    <w:p>
+      <w:pPr>
+        <w:rPr>
+          <w:sz w:val="44"/>
+          <w:szCs w:val="44"/>
+          <w:lang w:bidi="fa-IR"/>
+        </w:rPr>
+      </w:pPr>
+      <w:r>
+        <w:rPr>
+          <w:sz w:val="44"/>
+          <w:szCs w:val="44"/>
+          <w:lang w:bidi="fa-IR"/>
+        </w:rPr>
+        <w:t xml:space="preserve">We define a function (f(a)) </w:t>
+      </w:r>
+      <w:r>
+        <w:rPr>
+          <w:sz w:val="44"/>
+          <w:szCs w:val="44"/>
+          <w:lang w:bidi="fa-IR"/>
+        </w:rPr>
+        <w:t>as shown</w:t>
+      </w:r>
+      <w:r>
+        <w:rPr>
+          <w:sz w:val="44"/>
+          <w:szCs w:val="44"/>
+          <w:lang w:bidi="fa-IR"/>
+        </w:rPr>
+        <w:t>.</w:t>
+      </w:r>
+    </w:p>
+    <w:p>
+      <w:pPr>
+        <w:rPr>
+          <w:sz w:val="44"/>
+          <w:szCs w:val="44"/>
+          <w:lang w:bidi="fa-IR"/>
+        </w:rPr>
+      </w:pPr>
+      <w:r>
+        <w:rPr>
+          <w:sz w:val="44"/>
+          <w:szCs w:val="44"/>
+          <w:lang w:bidi="fa-IR"/>
+        </w:rPr>
+        <w:t xml:space="preserve">The first important observation is that this function is </w:t>
+      </w:r>
+      <w:r>
+        <w:rPr>
+          <w:b/>
+          <w:bCs/>
+          <w:sz w:val="44"/>
+          <w:szCs w:val="44"/>
+          <w:lang w:bidi="fa-IR"/>
+        </w:rPr>
+        <w:t>continuous</w:t>
+      </w:r>
+      <w:r>
+        <w:rPr>
+          <w:sz w:val="44"/>
+          <w:szCs w:val="44"/>
+          <w:lang w:bidi="fa-IR"/>
+        </w:rPr>
+        <w:t>, because it is built only from vector addition, scalar multiplication, and the norm, all of which are continuous operations.</w:t>
+      </w:r>
+    </w:p>
+    <w:p>
+      <w:pPr>
+        <w:rPr>
+          <w:sz w:val="44"/>
+          <w:szCs w:val="44"/>
+          <w:lang w:bidi="fa-IR"/>
+        </w:rPr>
+      </w:pPr>
+      <w:r>
+        <w:rPr>
+          <w:sz w:val="44"/>
+          <w:szCs w:val="44"/>
+          <w:lang w:bidi="fa-IR"/>
+        </w:rPr>
+        <w:t>Next, we examine the behavior of this function as (a) becomes very large in the positive and negative directions. We find that the function has opposite signs at the two extremes.</w:t>
+      </w:r>
+    </w:p>
+    <w:p>
+      <w:pPr>
+        <w:rPr>
+          <w:sz w:val="44"/>
+          <w:szCs w:val="44"/>
+          <w:lang w:bidi="fa-IR"/>
+        </w:rPr>
+      </w:pPr>
+      <w:r>
+        <w:rPr>
+          <w:sz w:val="44"/>
+          <w:szCs w:val="44"/>
+          <w:lang w:bidi="fa-IR"/>
+        </w:rPr>
+        <w:t xml:space="preserve">Since the function is continuous and changes sign, the </w:t>
+      </w:r>
+      <w:r>
+        <w:rPr>
+          <w:b/>
+          <w:bCs/>
+          <w:sz w:val="44"/>
+          <w:szCs w:val="44"/>
+          <w:lang w:bidi="fa-IR"/>
+        </w:rPr>
+        <w:t>Intermediate Value Theorem</w:t>
+      </w:r>
+      <w:r>
+        <w:rPr>
+          <w:sz w:val="44"/>
+          <w:szCs w:val="44"/>
+          <w:lang w:bidi="fa-IR"/>
+        </w:rPr>
+        <w:t xml:space="preserve"> guarantees that there must be some real number (a) for which (f(a)=0).</w:t>
+      </w:r>
+    </w:p>
+    <w:p>
+      <w:pPr>
+        <w:rPr>
+          <w:sz w:val="44"/>
+          <w:szCs w:val="44"/>
+          <w:rtl/>
+          <w:lang w:bidi="fa-IR"/>
+        </w:rPr>
+      </w:pPr>
+      <w:r>
+        <w:rPr>
+          <w:sz w:val="44"/>
+          <w:szCs w:val="44"/>
+          <w:lang w:bidi="fa-IR"/>
+        </w:rPr>
+        <w:t>At that point, the two norms become equal, which is exactly the condition for isosceles orthogonality.</w:t>
+      </w:r>
+    </w:p>
+    <w:p>
+      <w:pPr>
+        <w:rPr>
+          <w:sz w:val="44"/>
+          <w:szCs w:val="44"/>
+          <w:lang w:bidi="fa-IR"/>
+        </w:rPr>
+      </w:pPr>
+      <w:r>
+        <w:rPr>
+          <w:sz w:val="44"/>
+          <w:szCs w:val="44"/>
+          <w:lang w:bidi="fa-IR"/>
+        </w:rPr>
+        <w:t>4-7:</w:t>
+      </w:r>
+    </w:p>
+    <w:p>
+      <w:pPr>
+        <w:rPr>
+          <w:sz w:val="44"/>
+          <w:szCs w:val="44"/>
+          <w:lang w:bidi="fa-IR"/>
+        </w:rPr>
+      </w:pPr>
+      <w:r>
+        <w:rPr>
+          <w:sz w:val="44"/>
+          <w:szCs w:val="44"/>
+          <w:lang w:bidi="fa-IR"/>
+        </w:rPr>
+        <w:t>Now, let's summarize everything in this table.</w:t>
+      </w:r>
+    </w:p>
+    <w:p>
+      <w:pPr>
+        <w:rPr>
+          <w:rFonts w:hint="cs"/>
+          <w:sz w:val="44"/>
+          <w:szCs w:val="44"/>
+          <w:rtl/>
+          <w:lang w:bidi="fa-IR"/>
+        </w:rPr>
+      </w:pPr>
+      <w:r>
+        <w:rPr>
+          <w:sz w:val="44"/>
+          <w:szCs w:val="44"/>
+          <w:lang w:bidi="fa-IR"/>
+        </w:rPr>
+        <w:lastRenderedPageBreak/>
+        <w:t xml:space="preserve">As you can see, </w:t>
+      </w:r>
+      <w:r>
+        <w:rPr>
+          <w:b/>
+          <w:bCs/>
+          <w:sz w:val="44"/>
+          <w:szCs w:val="44"/>
+          <w:lang w:bidi="fa-IR"/>
+        </w:rPr>
+        <w:t>symmetry</w:t>
+      </w:r>
+      <w:r>
+        <w:rPr>
+          <w:sz w:val="44"/>
+          <w:szCs w:val="44"/>
+          <w:lang w:bidi="fa-IR"/>
+        </w:rPr>
+        <w:t xml:space="preserve"> and </w:t>
+      </w:r>
+      <w:r>
+        <w:rPr>
+          <w:b/>
+          <w:bCs/>
+          <w:sz w:val="44"/>
+          <w:szCs w:val="44"/>
+          <w:lang w:bidi="fa-IR"/>
+        </w:rPr>
+        <w:t>scalar existence</w:t>
+      </w:r>
+      <w:r>
+        <w:rPr>
+          <w:sz w:val="44"/>
+          <w:szCs w:val="44"/>
+          <w:lang w:bidi="fa-IR"/>
+        </w:rPr>
+        <w:t xml:space="preserve"> hold for isosceles orthogonality, while </w:t>
+      </w:r>
+      <w:r>
+        <w:rPr>
+          <w:b/>
+          <w:bCs/>
+          <w:sz w:val="44"/>
+          <w:szCs w:val="44"/>
+          <w:lang w:bidi="fa-IR"/>
+        </w:rPr>
+        <w:t>homogeneity</w:t>
+      </w:r>
+      <w:r>
+        <w:rPr>
+          <w:sz w:val="44"/>
+          <w:szCs w:val="44"/>
+          <w:lang w:bidi="fa-IR"/>
+        </w:rPr>
+        <w:t xml:space="preserve"> and </w:t>
+      </w:r>
+      <w:r>
+        <w:rPr>
+          <w:b/>
+          <w:bCs/>
+          <w:sz w:val="44"/>
+          <w:szCs w:val="44"/>
+          <w:lang w:bidi="fa-IR"/>
+        </w:rPr>
+        <w:t>additivity</w:t>
+      </w:r>
+      <w:r>
+        <w:rPr>
+          <w:sz w:val="44"/>
+          <w:szCs w:val="44"/>
+          <w:lang w:bidi="fa-IR"/>
+        </w:rPr>
+        <w:t xml:space="preserve"> do not.</w:t>
+      </w:r>
+    </w:p>
+    <w:p>
+      <w:pPr>
+        <w:rPr>
+          <w:sz w:val="44"/>
+          <w:szCs w:val="44"/>
+          <w:lang w:bidi="fa-IR"/>
+        </w:rPr>
+      </w:pPr>
+      <w:r>
+        <w:rPr>
+          <w:sz w:val="44"/>
+          <w:szCs w:val="44"/>
+          <w:lang w:bidi="fa-IR"/>
+        </w:rPr>
+        <w:t>4-8:</w:t>
+      </w:r>
+    </w:p>
+    <w:p>
+      <w:pPr>
+        <w:rPr>
+          <w:sz w:val="44"/>
+          <w:szCs w:val="44"/>
+          <w:lang w:bidi="fa-IR"/>
+        </w:rPr>
+      </w:pPr>
+      <w:r>
+        <w:rPr>
+          <w:sz w:val="44"/>
+          <w:szCs w:val="44"/>
+          <w:lang w:bidi="fa-IR"/>
+        </w:rPr>
+        <w:t>Just as we saw for the previous two orthogonality notions, there is also a characterization theorem for isosceles orthogonality.</w:t>
+      </w:r>
+    </w:p>
+    <w:p>
+      <w:pPr>
+        <w:rPr>
+          <w:sz w:val="44"/>
+          <w:szCs w:val="44"/>
+          <w:lang w:bidi="fa-IR"/>
+        </w:rPr>
+      </w:pPr>
+      <w:r>
+        <w:rPr>
+          <w:sz w:val="44"/>
+          <w:szCs w:val="44"/>
+          <w:lang w:bidi="fa-IR"/>
+        </w:rPr>
+        <w:t xml:space="preserve">This theorem states that a real normed space is an inner product space </w:t>
+      </w:r>
+      <w:r>
+        <w:rPr>
+          <w:b/>
+          <w:bCs/>
+          <w:sz w:val="44"/>
+          <w:szCs w:val="44"/>
+          <w:lang w:bidi="fa-IR"/>
+        </w:rPr>
+        <w:t>if and only if</w:t>
+      </w:r>
+      <w:r>
+        <w:rPr>
+          <w:sz w:val="44"/>
+          <w:szCs w:val="44"/>
+          <w:lang w:bidi="fa-IR"/>
+        </w:rPr>
+        <w:t xml:space="preserve"> isosceles orthogonality is homogeneous.</w:t>
+      </w:r>
+    </w:p>
+    <w:p>
+      <w:pPr>
+        <w:rPr>
+          <w:sz w:val="44"/>
+          <w:szCs w:val="44"/>
+          <w:lang w:bidi="fa-IR"/>
+        </w:rPr>
+      </w:pPr>
+      <w:r>
+        <w:rPr>
+          <w:sz w:val="44"/>
+          <w:szCs w:val="44"/>
+          <w:lang w:bidi="fa-IR"/>
+        </w:rPr>
+        <w:t>In other words, the homogeneity property is not only sufficient but also necessary to characterize inner product spaces.</w:t>
+      </w:r>
+    </w:p>
+    <w:p>
+      <w:pPr>
+        <w:rPr>
+          <w:sz w:val="44"/>
+          <w:szCs w:val="44"/>
+          <w:lang w:bidi="fa-IR"/>
+        </w:rPr>
+      </w:pPr>
+      <w:r>
+        <w:rPr>
+          <w:sz w:val="44"/>
+          <w:szCs w:val="44"/>
+          <w:lang w:bidi="fa-IR"/>
+        </w:rPr>
+        <w:t>Similarly, there is an analogous characterization theorem for the additivity property.</w:t>
+      </w:r>
+    </w:p>
+    <w:p>
+      <w:pPr>
+        <w:rPr>
+          <w:sz w:val="44"/>
+          <w:szCs w:val="44"/>
+          <w:lang w:bidi="fa-IR"/>
+        </w:rPr>
+      </w:pPr>
+      <w:r>
+        <w:rPr>
+          <w:sz w:val="44"/>
+          <w:szCs w:val="44"/>
+          <w:lang w:bidi="fa-IR"/>
+        </w:rPr>
+        <w:t>So, just like homogeneity, the additivity property also characterizes inner product spaces.</w:t>
+      </w:r>
+    </w:p>
+    <w:p>
+      <w:pPr>
+        <w:rPr>
+          <w:rFonts w:hint="cs"/>
+          <w:sz w:val="44"/>
+          <w:szCs w:val="44"/>
+          <w:rtl/>
+          <w:lang w:bidi="fa-IR"/>
+        </w:rPr>
+      </w:pPr>
+    </w:p>
+    <w:p>
+      <w:pPr>
+        <w:rPr>
+          <w:sz w:val="44"/>
+          <w:szCs w:val="44"/>
           <w:lang w:bidi="fa-IR"/>
         </w:rPr>
       </w:pPr>

</xml_diff>

<commit_message>
step 104 : finish part 11
</commit_message>
<xml_diff>
--- a/video context/video_context_newVersion.docx
+++ b/video context/video_context_newVersion.docx
@@ -14730,7 +14730,7 @@
     <w:p>
       <w:pPr>
         <w:rPr>
-          <w:rFonts w:eastAsiaTheme="minorEastAsia" w:hint="cs"/>
+          <w:rFonts w:eastAsiaTheme="minorEastAsia"/>
           <w:sz w:val="44"/>
           <w:szCs w:val="44"/>
           <w:rtl/>
@@ -14859,15 +14859,7 @@
           <w:szCs w:val="44"/>
           <w:lang w:bidi="fa-IR"/>
         </w:rPr>
-        <w:t>he following two properties always hold for</w:t>
-      </w:r>
-      <w:r>
-        <w:rPr>
-          <w:sz w:val="44"/>
-          <w:szCs w:val="44"/>
-          <w:lang w:bidi="fa-IR"/>
-        </w:rPr>
-        <w:t xml:space="preserve"> </w:t>
+        <w:t xml:space="preserve">he following two properties always hold for </w:t>
       </w:r>
       <w:r>
         <w:rPr>
@@ -16096,15 +16088,7 @@
           <w:szCs w:val="44"/>
           <w:lang w:bidi="fa-IR"/>
         </w:rPr>
-        <w:t xml:space="preserve">) </w:t>
-      </w:r>
-      <w:r>
-        <w:rPr>
-          <w:sz w:val="44"/>
-          <w:szCs w:val="44"/>
-          <w:lang w:bidi="fa-IR"/>
-        </w:rPr>
-        <w:t>orthogonal to</w:t>
+        <w:t>) orthogonal to</w:t>
       </w:r>
       <w:r>
         <w:rPr>
@@ -16640,27 +16624,7 @@
           <w:szCs w:val="44"/>
           <w:lang w:bidi="fa-IR"/>
         </w:rPr>
-        <w:t>We define f of lambda to be the norm of x+</w:t>
-      </w:r>
-      <w:r>
-        <w:rPr>
-          <w:b/>
-          <w:bCs/>
-          <w:sz w:val="44"/>
-          <w:szCs w:val="44"/>
-          <w:lang w:bidi="fa-IR"/>
-        </w:rPr>
-        <w:t xml:space="preserve"> </w:t>
-      </w:r>
-      <w:r>
-        <w:rPr>
-          <w:b/>
-          <w:bCs/>
-          <w:sz w:val="44"/>
-          <w:szCs w:val="44"/>
-          <w:lang w:bidi="fa-IR"/>
-        </w:rPr>
-        <w:t xml:space="preserve">λy, </w:t>
+        <w:t xml:space="preserve">We define f of lambda to be the norm of x+ λy, </w:t>
       </w:r>
       <w:r>
         <w:rPr>
@@ -17466,7 +17430,6 @@
     <w:p>
       <w:pPr>
         <w:rPr>
-          <w:rFonts w:hint="cs"/>
           <w:sz w:val="44"/>
           <w:szCs w:val="44"/>
           <w:rtl/>
@@ -18141,7 +18104,6 @@
     <w:p>
       <w:pPr>
         <w:rPr>
-          <w:rFonts w:hint="cs"/>
           <w:sz w:val="44"/>
           <w:szCs w:val="44"/>
           <w:rtl/>
@@ -18353,17 +18315,2275 @@
     <w:p>
       <w:pPr>
         <w:rPr>
+          <w:sz w:val="44"/>
+          <w:szCs w:val="44"/>
+          <w:lang w:bidi="fa-IR"/>
+        </w:rPr>
+      </w:pPr>
+      <w:r>
+        <w:rPr>
+          <w:sz w:val="44"/>
+          <w:szCs w:val="44"/>
+          <w:lang w:bidi="fa-IR"/>
+        </w:rPr>
+        <w:t>4-9:</w:t>
+      </w:r>
+    </w:p>
+    <w:p>
+      <w:pPr>
+        <w:rPr>
+          <w:sz w:val="44"/>
+          <w:szCs w:val="44"/>
+          <w:lang w:bidi="fa-IR"/>
+        </w:rPr>
+      </w:pPr>
+      <w:r>
+        <w:rPr>
+          <w:sz w:val="44"/>
+          <w:szCs w:val="44"/>
+          <w:lang w:bidi="fa-IR"/>
+        </w:rPr>
+        <w:lastRenderedPageBreak/>
+        <w:t>Before introducing the next theorem</w:t>
+      </w:r>
+      <w:r>
+        <w:rPr>
+          <w:sz w:val="44"/>
+          <w:szCs w:val="44"/>
+          <w:lang w:bidi="fa-IR"/>
+        </w:rPr>
+        <w:t>,</w:t>
+      </w:r>
+      <w:r>
+        <w:rPr>
+          <w:sz w:val="44"/>
+          <w:szCs w:val="44"/>
+          <w:lang w:bidi="fa-IR"/>
+        </w:rPr>
+        <w:t xml:space="preserve">let's quickly review the concept of a </w:t>
+      </w:r>
+      <w:r>
+        <w:rPr>
+          <w:b/>
+          <w:bCs/>
+          <w:sz w:val="44"/>
+          <w:szCs w:val="44"/>
+          <w:lang w:bidi="fa-IR"/>
+        </w:rPr>
+        <w:t>linear transformation</w:t>
+      </w:r>
+      <w:r>
+        <w:rPr>
+          <w:b/>
+          <w:bCs/>
+          <w:sz w:val="44"/>
+          <w:szCs w:val="44"/>
+          <w:lang w:bidi="fa-IR"/>
+        </w:rPr>
+        <w:t xml:space="preserve"> and orthogonality preserving</w:t>
+      </w:r>
+      <w:r>
+        <w:rPr>
+          <w:sz w:val="44"/>
+          <w:szCs w:val="44"/>
+          <w:lang w:bidi="fa-IR"/>
+        </w:rPr>
+        <w:t>.</w:t>
+      </w:r>
+    </w:p>
+    <w:p>
+      <w:pPr>
+        <w:rPr>
+          <w:sz w:val="44"/>
+          <w:szCs w:val="44"/>
+          <w:lang w:bidi="fa-IR"/>
+        </w:rPr>
+      </w:pPr>
+      <w:r>
+        <w:rPr>
+          <w:sz w:val="44"/>
+          <w:szCs w:val="44"/>
+          <w:lang w:bidi="fa-IR"/>
+        </w:rPr>
+        <w:t>A linear transformation is simply a function that preserves the vector space structure. In other words, it satisfies two fundamental properties: it preserves vector addition, and it preserves scalar multiplication.</w:t>
+      </w:r>
+    </w:p>
+    <w:p>
+      <w:pPr>
+        <w:rPr>
+          <w:sz w:val="44"/>
+          <w:szCs w:val="44"/>
+          <w:lang w:bidi="fa-IR"/>
+        </w:rPr>
+      </w:pPr>
+      <w:r>
+        <w:rPr>
+          <w:sz w:val="44"/>
+          <w:szCs w:val="44"/>
+          <w:lang w:bidi="fa-IR"/>
+        </w:rPr>
+        <w:t>To build some intuition, let's look at a two-dimensional example.</w:t>
+      </w:r>
+    </w:p>
+    <w:p>
+      <w:pPr>
+        <w:rPr>
+          <w:sz w:val="44"/>
+          <w:szCs w:val="44"/>
+          <w:lang w:bidi="fa-IR"/>
+        </w:rPr>
+      </w:pPr>
+      <w:r>
+        <w:rPr>
+          <w:sz w:val="44"/>
+          <w:szCs w:val="44"/>
+          <w:lang w:bidi="fa-IR"/>
+        </w:rPr>
+        <w:t xml:space="preserve">Consider the standard basis vectors </w:t>
+      </w:r>
+      <w:r>
+        <w:rPr>
+          <w:b/>
+          <w:bCs/>
+          <w:sz w:val="44"/>
+          <w:szCs w:val="44"/>
+          <w:lang w:bidi="fa-IR"/>
+        </w:rPr>
+        <w:t>(i)</w:t>
+      </w:r>
+      <w:r>
+        <w:rPr>
+          <w:sz w:val="44"/>
+          <w:szCs w:val="44"/>
+          <w:lang w:bidi="fa-IR"/>
+        </w:rPr>
+        <w:t xml:space="preserve"> and </w:t>
+      </w:r>
+      <w:r>
+        <w:rPr>
+          <w:b/>
+          <w:bCs/>
+          <w:sz w:val="44"/>
+          <w:szCs w:val="44"/>
+          <w:lang w:bidi="fa-IR"/>
+        </w:rPr>
+        <w:t>(j)</w:t>
+      </w:r>
+      <w:r>
+        <w:rPr>
+          <w:sz w:val="44"/>
+          <w:szCs w:val="44"/>
+          <w:lang w:bidi="fa-IR"/>
+        </w:rPr>
+        <w:t xml:space="preserve">, together with another vector </w:t>
+      </w:r>
+      <w:r>
+        <w:rPr>
+          <w:b/>
+          <w:bCs/>
+          <w:sz w:val="44"/>
+          <w:szCs w:val="44"/>
+          <w:lang w:bidi="fa-IR"/>
+        </w:rPr>
+        <w:t>(x)</w:t>
+      </w:r>
+      <w:r>
+        <w:rPr>
+          <w:sz w:val="44"/>
+          <w:szCs w:val="44"/>
+          <w:lang w:bidi="fa-IR"/>
+        </w:rPr>
+        <w:t xml:space="preserve"> and </w:t>
+      </w:r>
+      <w:r>
+        <w:rPr>
+          <w:b/>
+          <w:bCs/>
+          <w:sz w:val="44"/>
+          <w:szCs w:val="44"/>
+          <w:lang w:bidi="fa-IR"/>
+        </w:rPr>
+        <w:t>(y)</w:t>
+      </w:r>
+      <w:r>
+        <w:rPr>
+          <w:sz w:val="44"/>
+          <w:szCs w:val="44"/>
+          <w:lang w:bidi="fa-IR"/>
+        </w:rPr>
+        <w:t>. Now, apply a linear transformation (T) to all of them.</w:t>
+      </w:r>
+    </w:p>
+    <w:p>
+      <w:pPr>
+        <w:rPr>
+          <w:sz w:val="44"/>
+          <w:szCs w:val="44"/>
+          <w:lang w:bidi="fa-IR"/>
+        </w:rPr>
+      </w:pPr>
+      <w:r>
+        <w:rPr>
+          <w:sz w:val="44"/>
+          <w:szCs w:val="44"/>
+          <w:lang w:bidi="fa-IR"/>
+        </w:rPr>
+        <w:t>As you can see, the entire figure changes its shape, but the relationships imposed by linearity are preserved. Straight lines remain straight, and vector addition and scalar multiplication behave exactly as expected.</w:t>
+      </w:r>
+    </w:p>
+    <w:p>
+      <w:pPr>
+        <w:rPr>
+          <w:sz w:val="44"/>
+          <w:szCs w:val="44"/>
+          <w:rtl/>
+          <w:lang w:bidi="fa-IR"/>
+        </w:rPr>
+      </w:pPr>
+    </w:p>
+    <w:p>
+      <w:pPr>
+        <w:rPr>
+          <w:sz w:val="44"/>
+          <w:szCs w:val="44"/>
+          <w:lang w:bidi="fa-IR"/>
+        </w:rPr>
+      </w:pPr>
+      <w:r>
+        <w:rPr>
+          <w:sz w:val="44"/>
+          <w:szCs w:val="44"/>
+          <w:lang w:bidi="fa-IR"/>
+        </w:rPr>
+        <w:lastRenderedPageBreak/>
+        <w:t xml:space="preserve">Now, let's move on to the concept of </w:t>
+      </w:r>
+      <w:r>
+        <w:rPr>
+          <w:b/>
+          <w:bCs/>
+          <w:sz w:val="44"/>
+          <w:szCs w:val="44"/>
+          <w:lang w:bidi="fa-IR"/>
+        </w:rPr>
+        <w:t>orthogonality-preserving transformations</w:t>
+      </w:r>
+      <w:r>
+        <w:rPr>
+          <w:sz w:val="44"/>
+          <w:szCs w:val="44"/>
+          <w:lang w:bidi="fa-IR"/>
+        </w:rPr>
+        <w:t>.</w:t>
+      </w:r>
+    </w:p>
+    <w:p>
+      <w:pPr>
+        <w:rPr>
+          <w:sz w:val="44"/>
+          <w:szCs w:val="44"/>
+          <w:lang w:bidi="fa-IR"/>
+        </w:rPr>
+      </w:pPr>
+      <w:r>
+        <w:rPr>
+          <w:sz w:val="44"/>
+          <w:szCs w:val="44"/>
+          <w:lang w:bidi="fa-IR"/>
+        </w:rPr>
+        <w:t xml:space="preserve">A linear transformation is called </w:t>
+      </w:r>
+      <w:r>
+        <w:rPr>
+          <w:b/>
+          <w:bCs/>
+          <w:sz w:val="44"/>
+          <w:szCs w:val="44"/>
+          <w:lang w:bidi="fa-IR"/>
+        </w:rPr>
+        <w:t>orthogonality preserving</w:t>
+      </w:r>
+      <w:r>
+        <w:rPr>
+          <w:sz w:val="44"/>
+          <w:szCs w:val="44"/>
+          <w:lang w:bidi="fa-IR"/>
+        </w:rPr>
+        <w:t xml:space="preserve"> if whenever two vectors are orthogonal, their images under the transformation remain orthogonal as well.</w:t>
+      </w:r>
+    </w:p>
+    <w:p>
+      <w:pPr>
+        <w:rPr>
+          <w:sz w:val="44"/>
+          <w:szCs w:val="44"/>
+          <w:lang w:bidi="fa-IR"/>
+        </w:rPr>
+      </w:pPr>
+      <w:r>
+        <w:rPr>
+          <w:sz w:val="44"/>
+          <w:szCs w:val="44"/>
+          <w:lang w:bidi="fa-IR"/>
+        </w:rPr>
+        <w:t>To visualize this, consider the following figure.</w:t>
+      </w:r>
+    </w:p>
+    <w:p>
+      <w:pPr>
+        <w:rPr>
+          <w:sz w:val="44"/>
+          <w:szCs w:val="44"/>
+          <w:lang w:bidi="fa-IR"/>
+        </w:rPr>
+      </w:pPr>
+      <w:r>
+        <w:rPr>
+          <w:sz w:val="44"/>
+          <w:szCs w:val="44"/>
+          <w:lang w:bidi="fa-IR"/>
+        </w:rPr>
+        <w:t xml:space="preserve">Suppose the vectors </w:t>
+      </w:r>
+      <w:r>
+        <w:rPr>
+          <w:b/>
+          <w:bCs/>
+          <w:sz w:val="44"/>
+          <w:szCs w:val="44"/>
+          <w:lang w:bidi="fa-IR"/>
+        </w:rPr>
+        <w:t>x</w:t>
+      </w:r>
+      <w:r>
+        <w:rPr>
+          <w:sz w:val="44"/>
+          <w:szCs w:val="44"/>
+          <w:lang w:bidi="fa-IR"/>
+        </w:rPr>
+        <w:t xml:space="preserve"> and </w:t>
+      </w:r>
+      <w:r>
+        <w:rPr>
+          <w:b/>
+          <w:bCs/>
+          <w:sz w:val="44"/>
+          <w:szCs w:val="44"/>
+          <w:lang w:bidi="fa-IR"/>
+        </w:rPr>
+        <w:t>y</w:t>
+      </w:r>
+      <w:r>
+        <w:rPr>
+          <w:sz w:val="44"/>
+          <w:szCs w:val="44"/>
+          <w:lang w:bidi="fa-IR"/>
+        </w:rPr>
+        <w:t xml:space="preserve"> are orthogonal in the sense of </w:t>
+      </w:r>
+      <w:r>
+        <w:rPr>
+          <w:b/>
+          <w:bCs/>
+          <w:sz w:val="44"/>
+          <w:szCs w:val="44"/>
+          <w:lang w:bidi="fa-IR"/>
+        </w:rPr>
+        <w:t>isosceles orthogonality</w:t>
+      </w:r>
+      <w:r>
+        <w:rPr>
+          <w:sz w:val="44"/>
+          <w:szCs w:val="44"/>
+          <w:lang w:bidi="fa-IR"/>
+        </w:rPr>
+        <w:t xml:space="preserve">. As you can see, the lengths of </w:t>
+      </w:r>
+      <w:r>
+        <w:rPr>
+          <w:b/>
+          <w:bCs/>
+          <w:sz w:val="44"/>
+          <w:szCs w:val="44"/>
+          <w:lang w:bidi="fa-IR"/>
+        </w:rPr>
+        <w:t>x+y</w:t>
+      </w:r>
+      <w:r>
+        <w:rPr>
+          <w:sz w:val="44"/>
+          <w:szCs w:val="44"/>
+          <w:lang w:bidi="fa-IR"/>
+        </w:rPr>
+        <w:t xml:space="preserve"> and </w:t>
+      </w:r>
+      <w:r>
+        <w:rPr>
+          <w:b/>
+          <w:bCs/>
+          <w:sz w:val="44"/>
+          <w:szCs w:val="44"/>
+          <w:lang w:bidi="fa-IR"/>
+        </w:rPr>
+        <w:t>x−y</w:t>
+      </w:r>
+      <w:r>
+        <w:rPr>
+          <w:sz w:val="44"/>
+          <w:szCs w:val="44"/>
+          <w:lang w:bidi="fa-IR"/>
+        </w:rPr>
+        <w:t xml:space="preserve"> are equal, which is exactly what this notion of orthogonality means.</w:t>
+      </w:r>
+    </w:p>
+    <w:p>
+      <w:pPr>
+        <w:rPr>
+          <w:sz w:val="44"/>
+          <w:szCs w:val="44"/>
+          <w:lang w:bidi="fa-IR"/>
+        </w:rPr>
+      </w:pPr>
+      <w:r>
+        <w:rPr>
+          <w:sz w:val="44"/>
+          <w:szCs w:val="44"/>
+          <w:lang w:bidi="fa-IR"/>
+        </w:rPr>
+        <w:t xml:space="preserve">Now, let's apply a linear transformation </w:t>
+      </w:r>
+      <w:r>
+        <w:rPr>
+          <w:b/>
+          <w:bCs/>
+          <w:sz w:val="44"/>
+          <w:szCs w:val="44"/>
+          <w:lang w:bidi="fa-IR"/>
+        </w:rPr>
+        <w:t>T</w:t>
+      </w:r>
+      <w:r>
+        <w:rPr>
+          <w:sz w:val="44"/>
+          <w:szCs w:val="44"/>
+          <w:lang w:bidi="fa-IR"/>
+        </w:rPr>
+        <w:t xml:space="preserve"> to these vectors.</w:t>
+      </w:r>
+    </w:p>
+    <w:p>
+      <w:pPr>
+        <w:rPr>
+          <w:sz w:val="44"/>
+          <w:szCs w:val="44"/>
+          <w:lang w:bidi="fa-IR"/>
+        </w:rPr>
+      </w:pPr>
+      <w:r>
+        <w:rPr>
+          <w:sz w:val="44"/>
+          <w:szCs w:val="44"/>
+          <w:lang w:bidi="fa-IR"/>
+        </w:rPr>
+        <w:t xml:space="preserve">In this example, the transformation is designed so that after the transformation, the two vectors are still isosceles orthogonal. As the figure shows, the equality between the lengths of </w:t>
+      </w:r>
+      <w:r>
+        <w:rPr>
+          <w:b/>
+          <w:bCs/>
+          <w:sz w:val="44"/>
+          <w:szCs w:val="44"/>
+          <w:lang w:bidi="fa-IR"/>
+        </w:rPr>
+        <w:t>T(x)+T(y)</w:t>
+      </w:r>
+      <w:r>
+        <w:rPr>
+          <w:sz w:val="44"/>
+          <w:szCs w:val="44"/>
+          <w:lang w:bidi="fa-IR"/>
+        </w:rPr>
+        <w:t xml:space="preserve">and </w:t>
+      </w:r>
+      <w:r>
+        <w:rPr>
+          <w:b/>
+          <w:bCs/>
+          <w:sz w:val="44"/>
+          <w:szCs w:val="44"/>
+          <w:lang w:bidi="fa-IR"/>
+        </w:rPr>
+        <w:t>T(x)−T(y)</w:t>
+      </w:r>
+      <w:r>
+        <w:rPr>
+          <w:sz w:val="44"/>
+          <w:szCs w:val="44"/>
+          <w:lang w:bidi="fa-IR"/>
+        </w:rPr>
+        <w:t xml:space="preserve"> is preserved.</w:t>
+      </w:r>
+    </w:p>
+    <w:p>
+      <w:pPr>
+        <w:rPr>
+          <w:sz w:val="44"/>
+          <w:szCs w:val="44"/>
+          <w:lang w:bidi="fa-IR"/>
+        </w:rPr>
+      </w:pPr>
+      <w:r>
+        <w:rPr>
+          <w:sz w:val="44"/>
+          <w:szCs w:val="44"/>
+          <w:lang w:bidi="fa-IR"/>
+        </w:rPr>
+        <w:t>This naturally leads us to a remarkable theorem.</w:t>
+      </w:r>
+    </w:p>
+    <w:p>
+      <w:pPr>
+        <w:rPr>
+          <w:sz w:val="44"/>
+          <w:szCs w:val="44"/>
+          <w:lang w:bidi="fa-IR"/>
+        </w:rPr>
+      </w:pPr>
+      <w:r>
+        <w:rPr>
+          <w:sz w:val="44"/>
+          <w:szCs w:val="44"/>
+          <w:lang w:bidi="fa-IR"/>
+        </w:rPr>
+        <w:lastRenderedPageBreak/>
+        <w:t xml:space="preserve">It turns out that if an </w:t>
+      </w:r>
+      <w:r>
+        <w:rPr>
+          <w:b/>
+          <w:bCs/>
+          <w:sz w:val="44"/>
+          <w:szCs w:val="44"/>
+          <w:lang w:bidi="fa-IR"/>
+        </w:rPr>
+        <w:t>invertible linear transformation</w:t>
+      </w:r>
+      <w:r>
+        <w:rPr>
+          <w:sz w:val="44"/>
+          <w:szCs w:val="44"/>
+          <w:lang w:bidi="fa-IR"/>
+        </w:rPr>
+        <w:t xml:space="preserve"> preserves isosceles orthogonality, then it must have a very special form.</w:t>
+      </w:r>
+    </w:p>
+    <w:p>
+      <w:pPr>
+        <w:rPr>
+          <w:sz w:val="44"/>
+          <w:szCs w:val="44"/>
+          <w:rtl/>
+          <w:lang w:bidi="fa-IR"/>
+        </w:rPr>
+      </w:pPr>
+      <w:r>
+        <w:rPr>
+          <w:sz w:val="44"/>
+          <w:szCs w:val="44"/>
+          <w:lang w:bidi="fa-IR"/>
+        </w:rPr>
+        <w:t>Specifically, there exists a positive constant c such that every vector is scaled by exactly the same factor</w:t>
+      </w:r>
+      <w:r>
+        <w:rPr>
           <w:rFonts w:hint="cs"/>
           <w:sz w:val="44"/>
           <w:szCs w:val="44"/>
           <w:rtl/>
           <w:lang w:bidi="fa-IR"/>
         </w:rPr>
-      </w:pPr>
-    </w:p>
-    <w:p>
-      <w:pPr>
-        <w:rPr>
+        <w:t>.</w:t>
+      </w:r>
+    </w:p>
+    <w:p>
+      <w:pPr>
+        <w:rPr>
+          <w:sz w:val="44"/>
+          <w:szCs w:val="44"/>
+          <w:rtl/>
+          <w:lang w:bidi="fa-IR"/>
+        </w:rPr>
+      </w:pPr>
+      <w:r>
+        <w:rPr>
+          <w:sz w:val="44"/>
+          <w:szCs w:val="44"/>
+          <w:lang w:bidi="fa-IR"/>
+        </w:rPr>
+        <w:t xml:space="preserve">In other words, the transformation cannot stretch the space differently in different directions. It may rotate the space, reflect it, or uniformly enlarge or shrink it, but every direction must be scaled by the same constant. This is precisely what it means for the transformation to be a </w:t>
+      </w:r>
+      <w:r>
+        <w:rPr>
+          <w:b/>
+          <w:bCs/>
+          <w:sz w:val="44"/>
+          <w:szCs w:val="44"/>
+          <w:lang w:bidi="fa-IR"/>
+        </w:rPr>
+        <w:t>scalar multiple of an isometry</w:t>
+      </w:r>
+      <w:r>
+        <w:rPr>
+          <w:sz w:val="44"/>
+          <w:szCs w:val="44"/>
+          <w:lang w:bidi="fa-IR"/>
+        </w:rPr>
+        <w:t>.</w:t>
+      </w:r>
+    </w:p>
+    <w:p>
+      <w:pPr>
+        <w:rPr>
+          <w:sz w:val="44"/>
+          <w:szCs w:val="44"/>
+          <w:lang w:bidi="fa-IR"/>
+        </w:rPr>
+      </w:pPr>
+      <w:r>
+        <w:rPr>
+          <w:sz w:val="44"/>
+          <w:szCs w:val="44"/>
+          <w:lang w:bidi="fa-IR"/>
+        </w:rPr>
+        <w:t>4-10:</w:t>
+      </w:r>
+    </w:p>
+    <w:p>
+      <w:pPr>
+        <w:rPr>
+          <w:sz w:val="44"/>
+          <w:szCs w:val="44"/>
+          <w:lang w:bidi="fa-IR"/>
+        </w:rPr>
+      </w:pPr>
+      <w:r>
+        <w:rPr>
+          <w:sz w:val="44"/>
+          <w:szCs w:val="44"/>
+          <w:lang w:bidi="fa-IR"/>
+        </w:rPr>
+        <w:t xml:space="preserve">In this video, we explored </w:t>
+      </w:r>
+      <w:r>
+        <w:rPr>
+          <w:b/>
+          <w:bCs/>
+          <w:sz w:val="44"/>
+          <w:szCs w:val="44"/>
+          <w:lang w:bidi="fa-IR"/>
+        </w:rPr>
+        <w:t>isosceles orthogonality</w:t>
+      </w:r>
+      <w:r>
+        <w:rPr>
+          <w:sz w:val="44"/>
+          <w:szCs w:val="44"/>
+          <w:lang w:bidi="fa-IR"/>
+        </w:rPr>
+        <w:t>, developed an intuitive understanding of its definition, and examined its most important properties.</w:t>
+      </w:r>
+    </w:p>
+    <w:p>
+      <w:pPr>
+        <w:rPr>
+          <w:sz w:val="44"/>
+          <w:szCs w:val="44"/>
+          <w:lang w:bidi="fa-IR"/>
+        </w:rPr>
+      </w:pPr>
+      <w:r>
+        <w:rPr>
+          <w:sz w:val="44"/>
+          <w:szCs w:val="44"/>
+          <w:lang w:bidi="fa-IR"/>
+        </w:rPr>
+        <w:lastRenderedPageBreak/>
+        <w:t xml:space="preserve">In the next video, we'll continue our journey by introducing </w:t>
+      </w:r>
+      <w:r>
+        <w:rPr>
+          <w:b/>
+          <w:bCs/>
+          <w:sz w:val="44"/>
+          <w:szCs w:val="44"/>
+          <w:lang w:bidi="fa-IR"/>
+        </w:rPr>
+        <w:t>Pythagorean orthogonality</w:t>
+      </w:r>
+      <w:r>
+        <w:rPr>
+          <w:sz w:val="44"/>
+          <w:szCs w:val="44"/>
+          <w:lang w:bidi="fa-IR"/>
+        </w:rPr>
+        <w:t>, another fundamental notion of orthogonality in normed spaces, and explore how it differs from the concepts we've studied so far.</w:t>
+      </w:r>
+    </w:p>
+    <w:p>
+      <w:pPr>
+        <w:rPr>
+          <w:sz w:val="44"/>
+          <w:szCs w:val="44"/>
+          <w:lang w:bidi="fa-IR"/>
+        </w:rPr>
+      </w:pPr>
+      <w:r>
+        <w:rPr>
+          <w:sz w:val="44"/>
+          <w:szCs w:val="44"/>
+          <w:lang w:bidi="fa-IR"/>
+        </w:rPr>
+        <w:t>Thanks for watching, and I'll see you in the next video.</w:t>
+      </w:r>
+    </w:p>
+    <w:p>
+      <w:pPr>
+        <w:rPr>
+          <w:sz w:val="44"/>
+          <w:szCs w:val="44"/>
+          <w:lang w:bidi="fa-IR"/>
+        </w:rPr>
+      </w:pPr>
+      <w:r>
+        <w:rPr>
+          <w:sz w:val="44"/>
+          <w:szCs w:val="44"/>
+          <w:lang w:bidi="fa-IR"/>
+        </w:rPr>
+        <w:t>5 : Pythagorean orthogonality</w:t>
+      </w:r>
+    </w:p>
+    <w:p>
+      <w:pPr>
+        <w:rPr>
+          <w:sz w:val="44"/>
+          <w:szCs w:val="44"/>
+          <w:lang w:bidi="fa-IR"/>
+        </w:rPr>
+      </w:pPr>
+      <w:r>
+        <w:rPr>
+          <w:sz w:val="44"/>
+          <w:szCs w:val="44"/>
+          <w:lang w:bidi="fa-IR"/>
+        </w:rPr>
+        <w:t>5-1:</w:t>
+      </w:r>
+    </w:p>
+    <w:p>
+      <w:pPr>
+        <w:rPr>
+          <w:sz w:val="44"/>
+          <w:szCs w:val="44"/>
+          <w:rtl/>
+          <w:lang w:bidi="fa-IR"/>
+        </w:rPr>
+      </w:pPr>
+      <w:r>
+        <w:rPr>
+          <w:sz w:val="44"/>
+          <w:szCs w:val="44"/>
+          <w:lang w:bidi="fa-IR"/>
+        </w:rPr>
+        <w:t xml:space="preserve">In this video, we are going to introduce </w:t>
+      </w:r>
+      <w:r>
+        <w:rPr>
+          <w:b/>
+          <w:bCs/>
+          <w:sz w:val="44"/>
+          <w:szCs w:val="44"/>
+          <w:lang w:bidi="fa-IR"/>
+        </w:rPr>
+        <w:t>Pythagorean Orthogonality</w:t>
+      </w:r>
+      <w:r>
+        <w:rPr>
+          <w:sz w:val="44"/>
+          <w:szCs w:val="44"/>
+          <w:lang w:bidi="fa-IR"/>
+        </w:rPr>
+        <w:t>, one of the fundamental notions of orthogonality in normed spaces.</w:t>
+      </w:r>
+    </w:p>
+    <w:p>
+      <w:pPr>
+        <w:rPr>
+          <w:sz w:val="44"/>
+          <w:szCs w:val="44"/>
+          <w:lang w:bidi="fa-IR"/>
+        </w:rPr>
+      </w:pPr>
+      <w:r>
+        <w:rPr>
+          <w:sz w:val="44"/>
+          <w:szCs w:val="44"/>
+          <w:lang w:bidi="fa-IR"/>
+        </w:rPr>
+        <w:t xml:space="preserve">Pythagorean Orthogonality was first introduced by </w:t>
+      </w:r>
+      <w:r>
+        <w:rPr>
+          <w:b/>
+          <w:bCs/>
+          <w:sz w:val="44"/>
+          <w:szCs w:val="44"/>
+          <w:lang w:bidi="fa-IR"/>
+        </w:rPr>
+        <w:t>Robert C. James</w:t>
+      </w:r>
+      <w:r>
+        <w:rPr>
+          <w:sz w:val="44"/>
+          <w:szCs w:val="44"/>
+          <w:lang w:bidi="fa-IR"/>
+        </w:rPr>
+        <w:t xml:space="preserve"> in </w:t>
+      </w:r>
+      <w:r>
+        <w:rPr>
+          <w:b/>
+          <w:bCs/>
+          <w:sz w:val="44"/>
+          <w:szCs w:val="44"/>
+          <w:lang w:bidi="fa-IR"/>
+        </w:rPr>
+        <w:t>1945</w:t>
+      </w:r>
+      <w:r>
+        <w:rPr>
+          <w:sz w:val="44"/>
+          <w:szCs w:val="44"/>
+          <w:lang w:bidi="fa-IR"/>
+        </w:rPr>
+        <w:t xml:space="preserve"> as one of the fundamental notions of orthogonality in normed spaces.</w:t>
+      </w:r>
+    </w:p>
+    <w:p>
+      <w:pPr>
+        <w:rPr>
+          <w:sz w:val="44"/>
+          <w:szCs w:val="44"/>
+          <w:rtl/>
+          <w:lang w:bidi="fa-IR"/>
+        </w:rPr>
+      </w:pPr>
+      <w:r>
+        <w:rPr>
+          <w:sz w:val="44"/>
+          <w:szCs w:val="44"/>
+          <w:lang w:bidi="fa-IR"/>
+        </w:rPr>
+        <w:t>So, if you're ready, let's get started.</w:t>
+      </w:r>
+    </w:p>
+    <w:p>
+      <w:pPr>
+        <w:rPr>
+          <w:sz w:val="44"/>
+          <w:szCs w:val="44"/>
+          <w:rtl/>
+          <w:lang w:bidi="fa-IR"/>
+        </w:rPr>
+      </w:pPr>
+      <w:r>
+        <w:rPr>
+          <w:sz w:val="44"/>
+          <w:szCs w:val="44"/>
+          <w:lang w:bidi="fa-IR"/>
+        </w:rPr>
+        <w:t>5-2:</w:t>
+      </w:r>
+    </w:p>
+    <w:p>
+      <w:pPr>
+        <w:rPr>
+          <w:sz w:val="44"/>
+          <w:szCs w:val="44"/>
+          <w:lang w:bidi="fa-IR"/>
+        </w:rPr>
+      </w:pPr>
+      <w:r>
+        <w:rPr>
+          <w:sz w:val="44"/>
+          <w:szCs w:val="44"/>
+          <w:lang w:bidi="fa-IR"/>
+        </w:rPr>
+        <w:lastRenderedPageBreak/>
+        <w:t xml:space="preserve">Now, let's start with the mathematical definition of </w:t>
+      </w:r>
+      <w:r>
+        <w:rPr>
+          <w:b/>
+          <w:bCs/>
+          <w:sz w:val="44"/>
+          <w:szCs w:val="44"/>
+          <w:lang w:bidi="fa-IR"/>
+        </w:rPr>
+        <w:t>Pythagorean Orthogonality</w:t>
+      </w:r>
+      <w:r>
+        <w:rPr>
+          <w:sz w:val="44"/>
+          <w:szCs w:val="44"/>
+          <w:lang w:bidi="fa-IR"/>
+        </w:rPr>
+        <w:t>.</w:t>
+      </w:r>
+    </w:p>
+    <w:p>
+      <w:pPr>
+        <w:rPr>
+          <w:sz w:val="44"/>
+          <w:szCs w:val="44"/>
+          <w:lang w:bidi="fa-IR"/>
+        </w:rPr>
+      </w:pPr>
+      <w:r>
+        <w:rPr>
+          <w:sz w:val="44"/>
+          <w:szCs w:val="44"/>
+          <w:lang w:bidi="fa-IR"/>
+        </w:rPr>
+        <w:t>Consider two vectors (x) and (y) in a normed space (X). We say that these two vectors are orthogonal in the Pythagorean sense if the norm of their sum satisfies the same relation that appears in the classical Pythagorean theorem.</w:t>
+      </w:r>
+    </w:p>
+    <w:p>
+      <w:pPr>
+        <w:rPr>
+          <w:sz w:val="44"/>
+          <w:szCs w:val="44"/>
+          <w:lang w:bidi="fa-IR"/>
+        </w:rPr>
+      </w:pPr>
+      <w:r>
+        <w:rPr>
+          <w:sz w:val="44"/>
+          <w:szCs w:val="44"/>
+          <w:lang w:bidi="fa-IR"/>
+        </w:rPr>
+        <w:t>So, the main idea behind this definition is that the lengths of two orthogonal vectors combine according to the Pythagorean formula, even when we are working in a general normed space.</w:t>
+      </w:r>
+    </w:p>
+    <w:p>
+      <w:pPr>
+        <w:rPr>
+          <w:sz w:val="44"/>
+          <w:szCs w:val="44"/>
+          <w:lang w:bidi="fa-IR"/>
+        </w:rPr>
+      </w:pPr>
+      <w:r>
+        <w:rPr>
+          <w:sz w:val="44"/>
+          <w:szCs w:val="44"/>
+          <w:lang w:bidi="fa-IR"/>
+        </w:rPr>
+        <w:t>5-3:</w:t>
+      </w:r>
+    </w:p>
+    <w:p>
+      <w:pPr>
+        <w:rPr>
+          <w:sz w:val="44"/>
+          <w:szCs w:val="44"/>
+          <w:lang w:bidi="fa-IR"/>
+        </w:rPr>
+      </w:pPr>
+      <w:r>
+        <w:rPr>
+          <w:sz w:val="44"/>
+          <w:szCs w:val="44"/>
+          <w:lang w:bidi="fa-IR"/>
+        </w:rPr>
+        <w:t>This concept is something we have already encountered many times in the two-dimensional Euclidean space.</w:t>
+      </w:r>
+    </w:p>
+    <w:p>
+      <w:pPr>
+        <w:rPr>
+          <w:sz w:val="44"/>
+          <w:szCs w:val="44"/>
+          <w:lang w:bidi="fa-IR"/>
+        </w:rPr>
+      </w:pPr>
+      <w:r>
+        <w:rPr>
+          <w:sz w:val="44"/>
+          <w:szCs w:val="44"/>
+          <w:lang w:bidi="fa-IR"/>
+        </w:rPr>
+        <w:t>If we consider two vectors (x) and (y), and draw these two vectors together with their sum (x+y), we obtain a triangle.</w:t>
+      </w:r>
+    </w:p>
+    <w:p>
+      <w:pPr>
+        <w:rPr>
+          <w:sz w:val="44"/>
+          <w:szCs w:val="44"/>
+          <w:lang w:bidi="fa-IR"/>
+        </w:rPr>
+      </w:pPr>
+      <w:r>
+        <w:rPr>
+          <w:sz w:val="44"/>
+          <w:szCs w:val="44"/>
+          <w:lang w:bidi="fa-IR"/>
+        </w:rPr>
+        <w:lastRenderedPageBreak/>
+        <w:t>As we can see, in the classical Euclidean setting, these three vectors form a right triangle. Therefore, the lengths of the sides satisfy the well-known Pythagorean relation</w:t>
+      </w:r>
+      <w:r>
+        <w:rPr>
+          <w:sz w:val="44"/>
+          <w:szCs w:val="44"/>
+          <w:lang w:bidi="fa-IR"/>
+        </w:rPr>
+        <w:t>.</w:t>
+      </w:r>
+    </w:p>
+    <w:p>
+      <w:pPr>
+        <w:rPr>
+          <w:sz w:val="44"/>
+          <w:szCs w:val="44"/>
+          <w:lang w:bidi="fa-IR"/>
+        </w:rPr>
+      </w:pPr>
+      <w:r>
+        <w:rPr>
+          <w:sz w:val="44"/>
+          <w:szCs w:val="44"/>
+          <w:lang w:bidi="fa-IR"/>
+        </w:rPr>
+        <w:t>This geometric interpretation is exactly the intuition behind Pythagorean Orthogonality. The idea is to extend this familiar property from Euclidean spaces to general normed spaces.</w:t>
+      </w:r>
+    </w:p>
+    <w:p>
+      <w:pPr>
+        <w:rPr>
+          <w:sz w:val="44"/>
+          <w:szCs w:val="44"/>
+          <w:lang w:bidi="fa-IR"/>
+        </w:rPr>
+      </w:pPr>
+      <w:r>
+        <w:rPr>
+          <w:sz w:val="44"/>
+          <w:szCs w:val="44"/>
+          <w:lang w:bidi="fa-IR"/>
+        </w:rPr>
+        <w:t>5-4:</w:t>
+      </w:r>
+    </w:p>
+    <w:p>
+      <w:pPr>
+        <w:rPr>
+          <w:sz w:val="44"/>
+          <w:szCs w:val="44"/>
+          <w:lang w:bidi="fa-IR"/>
+        </w:rPr>
+      </w:pPr>
+      <w:r>
+        <w:rPr>
+          <w:sz w:val="44"/>
+          <w:szCs w:val="44"/>
+          <w:lang w:bidi="fa-IR"/>
+        </w:rPr>
+        <w:t xml:space="preserve"> </w:t>
+      </w:r>
+      <w:r>
+        <w:rPr>
+          <w:sz w:val="44"/>
+          <w:szCs w:val="44"/>
+          <w:lang w:bidi="fa-IR"/>
+        </w:rPr>
+        <w:t>Now, let's show that homogeneity does not hold for Pythagorean Orthogonality.</w:t>
+      </w:r>
+    </w:p>
+    <w:p>
+      <w:pPr>
+        <w:rPr>
+          <w:sz w:val="44"/>
+          <w:szCs w:val="44"/>
+          <w:lang w:bidi="fa-IR"/>
+        </w:rPr>
+      </w:pPr>
+      <w:r>
+        <w:rPr>
+          <w:sz w:val="44"/>
+          <w:szCs w:val="44"/>
+          <w:lang w:bidi="fa-IR"/>
+        </w:rPr>
+        <w:t>Consider the space (\mathbb{R}^2) equipped with the given norm, and let the vectors (x) and (y) be defined as shown.</w:t>
+      </w:r>
+    </w:p>
+    <w:p>
+      <w:pPr>
+        <w:rPr>
+          <w:sz w:val="44"/>
+          <w:szCs w:val="44"/>
+          <w:lang w:bidi="fa-IR"/>
+        </w:rPr>
+      </w:pPr>
+      <w:r>
+        <w:rPr>
+          <w:sz w:val="44"/>
+          <w:szCs w:val="44"/>
+          <w:lang w:bidi="fa-IR"/>
+        </w:rPr>
+        <w:t xml:space="preserve">First, we verify that (x) is Pythagorean orthogonal to (y). </w:t>
+      </w:r>
+    </w:p>
+    <w:p>
+      <w:pPr>
+        <w:rPr>
+          <w:rFonts w:hint="cs"/>
+          <w:sz w:val="44"/>
+          <w:szCs w:val="44"/>
+          <w:rtl/>
+          <w:lang w:bidi="fa-IR"/>
+        </w:rPr>
+      </w:pPr>
+      <w:r>
+        <w:rPr>
+          <w:sz w:val="44"/>
+          <w:szCs w:val="44"/>
+          <w:lang w:bidi="fa-IR"/>
+        </w:rPr>
+        <w:t xml:space="preserve">However, after scaling the vectors, we </w:t>
+      </w:r>
+      <w:r>
+        <w:rPr>
+          <w:sz w:val="44"/>
+          <w:szCs w:val="44"/>
+          <w:lang w:bidi="fa-IR"/>
+        </w:rPr>
+        <w:t>find that -x is not orthogonal to y.</w:t>
+      </w:r>
+    </w:p>
+    <w:p>
+      <w:pPr>
+        <w:rPr>
+          <w:sz w:val="44"/>
+          <w:szCs w:val="44"/>
+          <w:lang w:bidi="fa-IR"/>
+        </w:rPr>
+      </w:pPr>
+      <w:r>
+        <w:rPr>
+          <w:sz w:val="44"/>
+          <w:szCs w:val="44"/>
+          <w:lang w:bidi="fa-IR"/>
+        </w:rPr>
+        <w:lastRenderedPageBreak/>
+        <w:t>An interesting point that we observe here is the difference between Pythagorean Orthogonality</w:t>
+      </w:r>
+      <w:r>
+        <w:rPr>
+          <w:rFonts w:hint="cs"/>
+          <w:sz w:val="44"/>
+          <w:szCs w:val="44"/>
+          <w:rtl/>
+          <w:lang w:bidi="fa-IR"/>
+        </w:rPr>
+        <w:t xml:space="preserve"> </w:t>
+      </w:r>
+      <w:r>
+        <w:rPr>
+          <w:sz w:val="44"/>
+          <w:szCs w:val="44"/>
+          <w:lang w:bidi="fa-IR"/>
+        </w:rPr>
+        <w:t>in normed spaces</w:t>
+      </w:r>
+      <w:r>
+        <w:rPr>
+          <w:sz w:val="44"/>
+          <w:szCs w:val="44"/>
+          <w:lang w:bidi="fa-IR"/>
+        </w:rPr>
+        <w:t xml:space="preserve"> and the familiar orthogonality in inner product spaces.</w:t>
+      </w:r>
+    </w:p>
+    <w:p>
+      <w:pPr>
+        <w:rPr>
+          <w:sz w:val="44"/>
+          <w:szCs w:val="44"/>
+          <w:lang w:bidi="fa-IR"/>
+        </w:rPr>
+      </w:pPr>
+      <w:r>
+        <w:rPr>
+          <w:sz w:val="44"/>
+          <w:szCs w:val="44"/>
+          <w:lang w:bidi="fa-IR"/>
+        </w:rPr>
+        <w:t xml:space="preserve">In an inner product space, we know that if (x) is orthogonal to (y), then (x) is also orthogonal to (-y). </w:t>
+      </w:r>
+    </w:p>
+    <w:p>
+      <w:pPr>
+        <w:rPr>
+          <w:sz w:val="44"/>
+          <w:szCs w:val="44"/>
+          <w:lang w:bidi="fa-IR"/>
+        </w:rPr>
+      </w:pPr>
+      <w:r>
+        <w:rPr>
+          <w:sz w:val="44"/>
+          <w:szCs w:val="44"/>
+          <w:lang w:bidi="fa-IR"/>
+        </w:rPr>
+        <w:t>However, for Pythagorean Orthogonality in general normed spaces, this property is not necessarily true.</w:t>
+      </w:r>
+    </w:p>
+    <w:p>
+      <w:pPr>
+        <w:rPr>
+          <w:sz w:val="44"/>
+          <w:szCs w:val="44"/>
+          <w:lang w:bidi="fa-IR"/>
+        </w:rPr>
+      </w:pPr>
+      <w:r>
+        <w:rPr>
+          <w:sz w:val="44"/>
+          <w:szCs w:val="44"/>
+          <w:lang w:bidi="fa-IR"/>
+        </w:rPr>
+        <w:t>5-5:</w:t>
+      </w:r>
+    </w:p>
+    <w:p>
+      <w:pPr>
+        <w:rPr>
+          <w:sz w:val="44"/>
+          <w:szCs w:val="44"/>
+          <w:lang w:bidi="fa-IR"/>
+        </w:rPr>
+      </w:pPr>
+      <w:r>
+        <w:rPr>
+          <w:sz w:val="44"/>
+          <w:szCs w:val="44"/>
+          <w:lang w:bidi="fa-IR"/>
+        </w:rPr>
+        <w:t xml:space="preserve">Similarly, we can show that </w:t>
+      </w:r>
+      <w:r>
+        <w:rPr>
+          <w:b/>
+          <w:bCs/>
+          <w:sz w:val="44"/>
+          <w:szCs w:val="44"/>
+          <w:lang w:bidi="fa-IR"/>
+        </w:rPr>
+        <w:t>additivity does not hold</w:t>
+      </w:r>
+      <w:r>
+        <w:rPr>
+          <w:sz w:val="44"/>
+          <w:szCs w:val="44"/>
+          <w:lang w:bidi="fa-IR"/>
+        </w:rPr>
+        <w:t xml:space="preserve"> for Pythagorean Orthogonality.</w:t>
+      </w:r>
+    </w:p>
+    <w:p>
+      <w:pPr>
+        <w:rPr>
+          <w:sz w:val="44"/>
+          <w:szCs w:val="44"/>
+          <w:lang w:bidi="fa-IR"/>
+        </w:rPr>
+      </w:pPr>
+      <w:r>
+        <w:rPr>
+          <w:sz w:val="44"/>
+          <w:szCs w:val="44"/>
+          <w:lang w:bidi="fa-IR"/>
+        </w:rPr>
+        <w:t>Consider the space (\mathbb{R}^2) equipped with the infinity norm, and let (x), (y), and (z) be the three vectors defined as shown.</w:t>
+      </w:r>
+    </w:p>
+    <w:p>
+      <w:pPr>
+        <w:rPr>
+          <w:sz w:val="44"/>
+          <w:szCs w:val="44"/>
+          <w:lang w:bidi="fa-IR"/>
+        </w:rPr>
+      </w:pPr>
+      <w:r>
+        <w:rPr>
+          <w:sz w:val="44"/>
+          <w:szCs w:val="44"/>
+          <w:lang w:bidi="fa-IR"/>
+        </w:rPr>
+        <w:t xml:space="preserve">First, we verify that (x) is Pythagorean orthogonal to (y), and also (x) is Pythagorean orthogonal to (z). In </w:t>
+      </w:r>
+    </w:p>
+    <w:p>
+      <w:pPr>
+        <w:rPr>
+          <w:sz w:val="44"/>
+          <w:szCs w:val="44"/>
+          <w:rtl/>
+          <w:lang w:bidi="fa-IR"/>
+        </w:rPr>
+      </w:pPr>
+      <w:r>
+        <w:rPr>
+          <w:sz w:val="44"/>
+          <w:szCs w:val="44"/>
+          <w:lang w:bidi="fa-IR"/>
+        </w:rPr>
+        <w:t>However, when we consider the sum (y+z), we can see that the required Pythagorean relation is no longer satisfied</w:t>
+      </w:r>
+      <w:r>
+        <w:rPr>
+          <w:rFonts w:hint="cs"/>
+          <w:sz w:val="44"/>
+          <w:szCs w:val="44"/>
+          <w:rtl/>
+          <w:lang w:bidi="fa-IR"/>
+        </w:rPr>
+        <w:t>.</w:t>
+      </w:r>
+    </w:p>
+    <w:p>
+      <w:pPr>
+        <w:rPr>
+          <w:sz w:val="44"/>
+          <w:szCs w:val="44"/>
+          <w:lang w:bidi="fa-IR"/>
+        </w:rPr>
+      </w:pPr>
+      <w:r>
+        <w:rPr>
+          <w:sz w:val="44"/>
+          <w:szCs w:val="44"/>
+          <w:lang w:bidi="fa-IR"/>
+        </w:rPr>
+        <w:lastRenderedPageBreak/>
+        <w:t>5-6:</w:t>
+      </w:r>
+    </w:p>
+    <w:p>
+      <w:pPr>
+        <w:rPr>
+          <w:sz w:val="44"/>
+          <w:szCs w:val="44"/>
+          <w:lang w:bidi="fa-IR"/>
+        </w:rPr>
+      </w:pPr>
+      <w:r>
+        <w:rPr>
+          <w:sz w:val="44"/>
+          <w:szCs w:val="44"/>
+          <w:lang w:bidi="fa-IR"/>
+        </w:rPr>
+        <w:t xml:space="preserve">Now, similar to what we did for </w:t>
+      </w:r>
+      <w:r>
+        <w:rPr>
+          <w:b/>
+          <w:bCs/>
+          <w:sz w:val="44"/>
+          <w:szCs w:val="44"/>
+          <w:lang w:bidi="fa-IR"/>
+        </w:rPr>
+        <w:t>Isosceles Orthogonality</w:t>
+      </w:r>
+      <w:r>
+        <w:rPr>
+          <w:sz w:val="44"/>
+          <w:szCs w:val="44"/>
+          <w:lang w:bidi="fa-IR"/>
+        </w:rPr>
+        <w:t xml:space="preserve">, we want to prove that the </w:t>
+      </w:r>
+      <w:r>
+        <w:rPr>
+          <w:b/>
+          <w:bCs/>
+          <w:sz w:val="44"/>
+          <w:szCs w:val="44"/>
+          <w:lang w:bidi="fa-IR"/>
+        </w:rPr>
+        <w:t>Scalar Existence property</w:t>
+      </w:r>
+      <w:r>
+        <w:rPr>
+          <w:sz w:val="44"/>
+          <w:szCs w:val="44"/>
+          <w:lang w:bidi="fa-IR"/>
+        </w:rPr>
+        <w:t xml:space="preserve"> holds for Pythagorean Orthogonality.</w:t>
+      </w:r>
+    </w:p>
+    <w:p>
+      <w:pPr>
+        <w:rPr>
+          <w:sz w:val="44"/>
+          <w:szCs w:val="44"/>
+          <w:lang w:bidi="fa-IR"/>
+        </w:rPr>
+      </w:pPr>
+      <w:r>
+        <w:rPr>
+          <w:sz w:val="44"/>
+          <w:szCs w:val="44"/>
+          <w:lang w:bidi="fa-IR"/>
+        </w:rPr>
+        <w:t>We want to show that for every (x,y\in X) with (x\neq0), there exists a scalar (a\in\mathbb{R}) such that</w:t>
+      </w:r>
+    </w:p>
+    <w:p>
+      <w:pPr>
+        <w:rPr>
+          <w:sz w:val="44"/>
+          <w:szCs w:val="44"/>
+          <w:lang w:bidi="fa-IR"/>
+        </w:rPr>
+      </w:pPr>
+      <w:r>
+        <w:rPr>
+          <w:sz w:val="44"/>
+          <w:szCs w:val="44"/>
+          <w:lang w:bidi="fa-IR"/>
+        </w:rPr>
+        <w:t>[</w:t>
+      </w:r>
+      <w:r>
+        <w:rPr>
+          <w:sz w:val="44"/>
+          <w:szCs w:val="44"/>
+          <w:lang w:bidi="fa-IR"/>
+        </w:rPr>
+        <w:br/>
+        <w:t>x</w:t>
+      </w:r>
+      <w:r>
+        <w:rPr>
+          <w:sz w:val="44"/>
+          <w:szCs w:val="44"/>
+          <w:lang w:bidi="fa-IR"/>
+        </w:rPr>
+        <w:t xml:space="preserve"> is orthogonal to </w:t>
+      </w:r>
+      <w:r>
+        <w:rPr>
+          <w:sz w:val="44"/>
+          <w:szCs w:val="44"/>
+          <w:lang w:bidi="fa-IR"/>
+        </w:rPr>
+        <w:t>(ax+y).</w:t>
+      </w:r>
+      <w:r>
+        <w:rPr>
+          <w:sz w:val="44"/>
+          <w:szCs w:val="44"/>
+          <w:lang w:bidi="fa-IR"/>
+        </w:rPr>
+        <w:br/>
+        <w:t>]</w:t>
+      </w:r>
+    </w:p>
+    <w:p>
+      <w:pPr>
+        <w:rPr>
+          <w:sz w:val="44"/>
+          <w:szCs w:val="44"/>
+          <w:lang w:bidi="fa-IR"/>
+        </w:rPr>
+      </w:pPr>
+      <w:r>
+        <w:rPr>
+          <w:sz w:val="44"/>
+          <w:szCs w:val="44"/>
+          <w:lang w:bidi="fa-IR"/>
+        </w:rPr>
+        <w:t>Based on the definition of Pythagorean Orthogonality, our goal is to find a scalar (a) such that the following equality is satisfied.</w:t>
+      </w:r>
+    </w:p>
+    <w:p>
+      <w:pPr>
+        <w:rPr>
+          <w:sz w:val="44"/>
+          <w:szCs w:val="44"/>
+          <w:lang w:bidi="fa-IR"/>
+        </w:rPr>
+      </w:pPr>
+      <w:r>
+        <w:rPr>
+          <w:sz w:val="44"/>
+          <w:szCs w:val="44"/>
+          <w:lang w:bidi="fa-IR"/>
+        </w:rPr>
+        <w:t>After simplifying the expression, this is equivalent to finding a root of the function</w:t>
+      </w:r>
+      <w:r>
+        <w:rPr>
+          <w:sz w:val="44"/>
+          <w:szCs w:val="44"/>
+          <w:lang w:bidi="fa-IR"/>
+        </w:rPr>
+        <w:t xml:space="preserve"> f(a).</w:t>
+      </w:r>
+    </w:p>
+    <w:p>
+      <w:pPr>
+        <w:rPr>
+          <w:sz w:val="44"/>
+          <w:szCs w:val="44"/>
+          <w:lang w:bidi="fa-IR"/>
+        </w:rPr>
+      </w:pPr>
+      <w:r>
+        <w:rPr>
+          <w:sz w:val="44"/>
+          <w:szCs w:val="44"/>
+          <w:lang w:bidi="fa-IR"/>
+        </w:rPr>
+        <w:t>Now, we analyze this function in two steps.</w:t>
+      </w:r>
+    </w:p>
+    <w:p>
+      <w:pPr>
+        <w:rPr>
+          <w:sz w:val="44"/>
+          <w:szCs w:val="44"/>
+          <w:lang w:bidi="fa-IR"/>
+        </w:rPr>
+      </w:pPr>
+      <w:r>
+        <w:rPr>
+          <w:sz w:val="44"/>
+          <w:szCs w:val="44"/>
+          <w:lang w:bidi="fa-IR"/>
+        </w:rPr>
+        <w:t xml:space="preserve">First, we study its continuity. Since this function is constructed using only vector addition, scalar </w:t>
+      </w:r>
+      <w:r>
+        <w:rPr>
+          <w:sz w:val="44"/>
+          <w:szCs w:val="44"/>
+          <w:lang w:bidi="fa-IR"/>
+        </w:rPr>
+        <w:lastRenderedPageBreak/>
+        <w:t xml:space="preserve">multiplication, and the norm, all of which are continuous operations, (f) is also a continuous function </w:t>
+      </w:r>
+      <w:r>
+        <w:rPr>
+          <w:rFonts w:hint="cs"/>
+          <w:sz w:val="44"/>
+          <w:szCs w:val="44"/>
+          <w:rtl/>
+          <w:lang w:bidi="fa-IR"/>
+        </w:rPr>
+        <w:t>.</w:t>
+      </w:r>
+    </w:p>
+    <w:p>
+      <w:pPr>
+        <w:rPr>
+          <w:sz w:val="44"/>
+          <w:szCs w:val="44"/>
+          <w:rtl/>
+          <w:lang w:bidi="fa-IR"/>
+        </w:rPr>
+      </w:pPr>
+      <w:r>
+        <w:rPr>
+          <w:sz w:val="44"/>
+          <w:szCs w:val="44"/>
+          <w:lang w:bidi="fa-IR"/>
+        </w:rPr>
+        <w:t>Next, we investigate the behavior of (f(a)) when (a) tends to positive and negative infinity.</w:t>
+      </w:r>
+    </w:p>
+    <w:p>
+      <w:pPr>
+        <w:rPr>
+          <w:sz w:val="44"/>
+          <w:szCs w:val="44"/>
+          <w:lang w:bidi="fa-IR"/>
+        </w:rPr>
+      </w:pPr>
+      <w:r>
+        <w:rPr>
+          <w:sz w:val="44"/>
+          <w:szCs w:val="44"/>
+          <w:lang w:bidi="fa-IR"/>
+        </w:rPr>
+        <w:t>As we can see, a change of sign occurs due to the asymptotic behavior of the function.</w:t>
+      </w:r>
+    </w:p>
+    <w:p>
+      <w:pPr>
+        <w:rPr>
+          <w:sz w:val="44"/>
+          <w:szCs w:val="44"/>
+          <w:lang w:bidi="fa-IR"/>
+        </w:rPr>
+      </w:pPr>
+      <w:r>
+        <w:rPr>
+          <w:sz w:val="44"/>
+          <w:szCs w:val="44"/>
+          <w:lang w:bidi="fa-IR"/>
+        </w:rPr>
+        <w:t>Hence, the continuous function (f) takes both positive and negative values. By the Intermediate Value Theorem, there exists some such that</w:t>
+      </w:r>
+    </w:p>
+    <w:p>
+      <w:pPr>
+        <w:rPr>
+          <w:sz w:val="44"/>
+          <w:szCs w:val="44"/>
+          <w:lang w:bidi="fa-IR"/>
+        </w:rPr>
+      </w:pPr>
+      <w:r>
+        <w:rPr>
+          <w:sz w:val="44"/>
+          <w:szCs w:val="44"/>
+          <w:lang w:bidi="fa-IR"/>
+        </w:rPr>
+        <w:t>[</w:t>
+      </w:r>
+      <w:r>
+        <w:rPr>
+          <w:sz w:val="44"/>
+          <w:szCs w:val="44"/>
+          <w:lang w:bidi="fa-IR"/>
+        </w:rPr>
+        <w:br/>
+        <w:t>f(a)=0.</w:t>
+      </w:r>
+      <w:r>
+        <w:rPr>
+          <w:sz w:val="44"/>
+          <w:szCs w:val="44"/>
+          <w:lang w:bidi="fa-IR"/>
+        </w:rPr>
+        <w:br/>
+        <w:t>]</w:t>
+      </w:r>
+    </w:p>
+    <w:p>
+      <w:pPr>
+        <w:rPr>
+          <w:sz w:val="44"/>
+          <w:szCs w:val="44"/>
+          <w:lang w:bidi="fa-IR"/>
+        </w:rPr>
+      </w:pPr>
+      <w:r>
+        <w:rPr>
+          <w:sz w:val="44"/>
+          <w:szCs w:val="44"/>
+          <w:lang w:bidi="fa-IR"/>
+        </w:rPr>
+        <w:t>For this value of (a), the defining condition of Pythagorean Orthogonality is satisfied</w:t>
+      </w:r>
+      <w:r>
+        <w:rPr>
+          <w:sz w:val="44"/>
+          <w:szCs w:val="44"/>
+          <w:lang w:bidi="fa-IR"/>
+        </w:rPr>
+        <w:t>.</w:t>
+      </w:r>
+    </w:p>
+    <w:p>
+      <w:pPr>
+        <w:rPr>
+          <w:sz w:val="44"/>
+          <w:szCs w:val="44"/>
+          <w:lang w:bidi="fa-IR"/>
+        </w:rPr>
+      </w:pPr>
+      <w:r>
+        <w:rPr>
+          <w:sz w:val="44"/>
+          <w:szCs w:val="44"/>
+          <w:lang w:bidi="fa-IR"/>
+        </w:rPr>
+        <w:t>This proves that the Scalar Existence property holds for Pythagorean Orthogonality.</w:t>
+      </w:r>
+    </w:p>
+    <w:p>
+      <w:pPr>
+        <w:rPr>
+          <w:sz w:val="44"/>
+          <w:szCs w:val="44"/>
+          <w:lang w:bidi="fa-IR"/>
+        </w:rPr>
+      </w:pPr>
+      <w:r>
+        <w:rPr>
+          <w:sz w:val="44"/>
+          <w:szCs w:val="44"/>
+          <w:lang w:bidi="fa-IR"/>
+        </w:rPr>
+        <w:t>5-7:</w:t>
+      </w:r>
+    </w:p>
+    <w:p>
+      <w:pPr>
+        <w:rPr>
+          <w:sz w:val="44"/>
+          <w:szCs w:val="44"/>
+          <w:lang w:bidi="fa-IR"/>
+        </w:rPr>
+      </w:pPr>
+      <w:r>
+        <w:rPr>
+          <w:sz w:val="44"/>
+          <w:szCs w:val="44"/>
+          <w:lang w:bidi="fa-IR"/>
+        </w:rPr>
+        <w:lastRenderedPageBreak/>
+        <w:t>Now, let's summarize the properties of Pythagorean Orthogonality in this table.</w:t>
+      </w:r>
+    </w:p>
+    <w:p>
+      <w:pPr>
+        <w:rPr>
+          <w:sz w:val="44"/>
+          <w:szCs w:val="44"/>
+          <w:lang w:bidi="fa-IR"/>
+        </w:rPr>
+      </w:pPr>
+      <w:r>
+        <w:rPr>
+          <w:sz w:val="44"/>
+          <w:szCs w:val="44"/>
+          <w:lang w:bidi="fa-IR"/>
+        </w:rPr>
+        <w:t xml:space="preserve">As we discussed, </w:t>
+      </w:r>
+      <w:r>
+        <w:rPr>
+          <w:b/>
+          <w:bCs/>
+          <w:sz w:val="44"/>
+          <w:szCs w:val="44"/>
+          <w:lang w:bidi="fa-IR"/>
+        </w:rPr>
+        <w:t>symmetry</w:t>
+      </w:r>
+      <w:r>
+        <w:rPr>
+          <w:sz w:val="44"/>
+          <w:szCs w:val="44"/>
+          <w:lang w:bidi="fa-IR"/>
+        </w:rPr>
+        <w:t xml:space="preserve"> and </w:t>
+      </w:r>
+      <w:r>
+        <w:rPr>
+          <w:b/>
+          <w:bCs/>
+          <w:sz w:val="44"/>
+          <w:szCs w:val="44"/>
+          <w:lang w:bidi="fa-IR"/>
+        </w:rPr>
+        <w:t>scalar existence</w:t>
+      </w:r>
+      <w:r>
+        <w:rPr>
+          <w:sz w:val="44"/>
+          <w:szCs w:val="44"/>
+          <w:lang w:bidi="fa-IR"/>
+        </w:rPr>
+        <w:t xml:space="preserve"> hold for this type of orthogonality.</w:t>
+      </w:r>
+    </w:p>
+    <w:p>
+      <w:pPr>
+        <w:rPr>
+          <w:sz w:val="44"/>
+          <w:szCs w:val="44"/>
+          <w:lang w:bidi="fa-IR"/>
+        </w:rPr>
+      </w:pPr>
+      <w:r>
+        <w:rPr>
+          <w:sz w:val="44"/>
+          <w:szCs w:val="44"/>
+          <w:lang w:bidi="fa-IR"/>
+        </w:rPr>
+        <w:t xml:space="preserve">However, the other two properties, </w:t>
+      </w:r>
+      <w:r>
+        <w:rPr>
+          <w:b/>
+          <w:bCs/>
+          <w:sz w:val="44"/>
+          <w:szCs w:val="44"/>
+          <w:lang w:bidi="fa-IR"/>
+        </w:rPr>
+        <w:t>homogeneity</w:t>
+      </w:r>
+      <w:r>
+        <w:rPr>
+          <w:sz w:val="44"/>
+          <w:szCs w:val="44"/>
+          <w:lang w:bidi="fa-IR"/>
+        </w:rPr>
+        <w:t xml:space="preserve"> and </w:t>
+      </w:r>
+      <w:r>
+        <w:rPr>
+          <w:b/>
+          <w:bCs/>
+          <w:sz w:val="44"/>
+          <w:szCs w:val="44"/>
+          <w:lang w:bidi="fa-IR"/>
+        </w:rPr>
+        <w:t>additivity</w:t>
+      </w:r>
+      <w:r>
+        <w:rPr>
+          <w:sz w:val="44"/>
+          <w:szCs w:val="44"/>
+          <w:lang w:bidi="fa-IR"/>
+        </w:rPr>
+        <w:t>, do not hold in general.</w:t>
+      </w:r>
+    </w:p>
+    <w:p>
+      <w:pPr>
+        <w:rPr>
+          <w:sz w:val="44"/>
+          <w:szCs w:val="44"/>
+          <w:lang w:bidi="fa-IR"/>
+        </w:rPr>
+      </w:pPr>
+      <w:r>
+        <w:rPr>
+          <w:sz w:val="44"/>
+          <w:szCs w:val="44"/>
+          <w:lang w:bidi="fa-IR"/>
+        </w:rPr>
+        <w:t>5-8:</w:t>
+      </w:r>
+    </w:p>
+    <w:p>
+      <w:pPr>
+        <w:rPr>
+          <w:sz w:val="44"/>
+          <w:szCs w:val="44"/>
+          <w:lang w:bidi="fa-IR"/>
+        </w:rPr>
+      </w:pPr>
+      <w:r>
+        <w:rPr>
+          <w:sz w:val="44"/>
+          <w:szCs w:val="44"/>
+          <w:lang w:bidi="fa-IR"/>
+        </w:rPr>
+        <w:t xml:space="preserve">Just as we saw for the previous </w:t>
+      </w:r>
+      <w:r>
+        <w:rPr>
+          <w:sz w:val="44"/>
+          <w:szCs w:val="44"/>
+          <w:lang w:bidi="fa-IR"/>
+        </w:rPr>
+        <w:t>3</w:t>
+      </w:r>
+      <w:r>
+        <w:rPr>
+          <w:sz w:val="44"/>
+          <w:szCs w:val="44"/>
+          <w:lang w:bidi="fa-IR"/>
+        </w:rPr>
+        <w:t xml:space="preserve"> orthogonality notions, there is also a characterization theorem for </w:t>
+      </w:r>
+      <w:r>
+        <w:rPr>
+          <w:sz w:val="44"/>
+          <w:szCs w:val="44"/>
+          <w:lang w:bidi="fa-IR"/>
+        </w:rPr>
+        <w:t xml:space="preserve">Pythagorean </w:t>
+      </w:r>
+      <w:r>
+        <w:rPr>
+          <w:sz w:val="44"/>
+          <w:szCs w:val="44"/>
+          <w:lang w:bidi="fa-IR"/>
+        </w:rPr>
+        <w:t>orthogonality.</w:t>
+      </w:r>
+    </w:p>
+    <w:p>
+      <w:pPr>
+        <w:rPr>
+          <w:sz w:val="44"/>
+          <w:szCs w:val="44"/>
+          <w:lang w:bidi="fa-IR"/>
+        </w:rPr>
+      </w:pPr>
+      <w:r>
+        <w:rPr>
+          <w:sz w:val="44"/>
+          <w:szCs w:val="44"/>
+          <w:lang w:bidi="fa-IR"/>
+        </w:rPr>
+        <w:t xml:space="preserve">This theorem states that a real normed space is an inner product space </w:t>
+      </w:r>
+      <w:r>
+        <w:rPr>
+          <w:b/>
+          <w:bCs/>
+          <w:sz w:val="44"/>
+          <w:szCs w:val="44"/>
+          <w:lang w:bidi="fa-IR"/>
+        </w:rPr>
+        <w:t>if and only if</w:t>
+      </w:r>
+      <w:r>
+        <w:rPr>
+          <w:sz w:val="44"/>
+          <w:szCs w:val="44"/>
+          <w:lang w:bidi="fa-IR"/>
+        </w:rPr>
+        <w:t xml:space="preserve"> </w:t>
+      </w:r>
+      <w:r>
+        <w:rPr>
+          <w:sz w:val="44"/>
+          <w:szCs w:val="44"/>
+          <w:lang w:bidi="fa-IR"/>
+        </w:rPr>
+        <w:t xml:space="preserve">Pythagorean </w:t>
+      </w:r>
+      <w:r>
+        <w:rPr>
+          <w:sz w:val="44"/>
+          <w:szCs w:val="44"/>
+          <w:lang w:bidi="fa-IR"/>
+        </w:rPr>
+        <w:t>orthogonality is homogeneous.</w:t>
+      </w:r>
+    </w:p>
+    <w:p>
+      <w:pPr>
+        <w:rPr>
+          <w:sz w:val="44"/>
+          <w:szCs w:val="44"/>
+          <w:lang w:bidi="fa-IR"/>
+        </w:rPr>
+      </w:pPr>
+      <w:r>
+        <w:rPr>
+          <w:sz w:val="44"/>
+          <w:szCs w:val="44"/>
+          <w:lang w:bidi="fa-IR"/>
+        </w:rPr>
+        <w:t>In other words, the homogeneity property is not only sufficient but also necessary to characterize inner product spaces.</w:t>
+      </w:r>
+    </w:p>
+    <w:p>
+      <w:pPr>
+        <w:rPr>
+          <w:sz w:val="44"/>
+          <w:szCs w:val="44"/>
+          <w:lang w:bidi="fa-IR"/>
+        </w:rPr>
+      </w:pPr>
+      <w:r>
+        <w:rPr>
+          <w:sz w:val="44"/>
+          <w:szCs w:val="44"/>
+          <w:lang w:bidi="fa-IR"/>
+        </w:rPr>
+        <w:t>Similarly, there is an analogous characterization theorem for the additivity property.</w:t>
+      </w:r>
+    </w:p>
+    <w:p>
+      <w:pPr>
+        <w:rPr>
+          <w:sz w:val="44"/>
+          <w:szCs w:val="44"/>
+          <w:lang w:bidi="fa-IR"/>
+        </w:rPr>
+      </w:pPr>
+      <w:r>
+        <w:rPr>
+          <w:sz w:val="44"/>
+          <w:szCs w:val="44"/>
+          <w:lang w:bidi="fa-IR"/>
+        </w:rPr>
+        <w:lastRenderedPageBreak/>
+        <w:t>So, just like homogeneity, the additivity property also characterizes inner product spaces.</w:t>
+      </w:r>
+    </w:p>
+    <w:p>
+      <w:pPr>
+        <w:rPr>
+          <w:sz w:val="44"/>
+          <w:szCs w:val="44"/>
+          <w:lang w:bidi="fa-IR"/>
+        </w:rPr>
+      </w:pPr>
+      <w:r>
+        <w:rPr>
+          <w:sz w:val="44"/>
+          <w:szCs w:val="44"/>
+          <w:lang w:bidi="fa-IR"/>
+        </w:rPr>
+        <w:t>5-</w:t>
+      </w:r>
+      <w:r>
+        <w:rPr>
+          <w:sz w:val="44"/>
+          <w:szCs w:val="44"/>
+          <w:lang w:bidi="fa-IR"/>
+        </w:rPr>
+        <w:t>9</w:t>
+      </w:r>
+      <w:r>
+        <w:rPr>
+          <w:sz w:val="44"/>
+          <w:szCs w:val="44"/>
+          <w:lang w:bidi="fa-IR"/>
+        </w:rPr>
+        <w:t>:</w:t>
+      </w:r>
+    </w:p>
+    <w:p>
+      <w:pPr>
+        <w:rPr>
+          <w:sz w:val="44"/>
+          <w:szCs w:val="44"/>
+          <w:lang w:bidi="fa-IR"/>
+        </w:rPr>
+      </w:pPr>
+      <w:r>
+        <w:rPr>
+          <w:sz w:val="44"/>
+          <w:szCs w:val="44"/>
+          <w:lang w:bidi="fa-IR"/>
+        </w:rPr>
+        <w:t xml:space="preserve">Before introducing the next theorem, let's briefly review the concept of </w:t>
+      </w:r>
+      <w:r>
+        <w:rPr>
+          <w:b/>
+          <w:bCs/>
+          <w:sz w:val="44"/>
+          <w:szCs w:val="44"/>
+          <w:lang w:bidi="fa-IR"/>
+        </w:rPr>
+        <w:t>linear independence</w:t>
+      </w:r>
+      <w:r>
+        <w:rPr>
+          <w:sz w:val="44"/>
+          <w:szCs w:val="44"/>
+          <w:lang w:bidi="fa-IR"/>
+        </w:rPr>
+        <w:t>.</w:t>
+      </w:r>
+    </w:p>
+    <w:p>
+      <w:pPr>
+        <w:rPr>
+          <w:sz w:val="44"/>
+          <w:szCs w:val="44"/>
+          <w:lang w:bidi="fa-IR"/>
+        </w:rPr>
+      </w:pPr>
+      <w:r>
+        <w:rPr>
+          <w:sz w:val="44"/>
+          <w:szCs w:val="44"/>
+          <w:lang w:bidi="fa-IR"/>
+        </w:rPr>
+        <w:t xml:space="preserve">A collection of vectors is said to be </w:t>
+      </w:r>
+      <w:r>
+        <w:rPr>
+          <w:b/>
+          <w:bCs/>
+          <w:sz w:val="44"/>
+          <w:szCs w:val="44"/>
+          <w:lang w:bidi="fa-IR"/>
+        </w:rPr>
+        <w:t>linearly independent</w:t>
+      </w:r>
+      <w:r>
+        <w:rPr>
+          <w:sz w:val="44"/>
+          <w:szCs w:val="44"/>
+          <w:lang w:bidi="fa-IR"/>
+        </w:rPr>
+        <w:t xml:space="preserve"> if none of the vectors can be expressed as a linear combination of the others. Equivalently, the only way to combine them and obtain the zero vector is by choosing all the coefficients to be zero.</w:t>
+      </w:r>
+    </w:p>
+    <w:p>
+      <w:pPr>
+        <w:rPr>
+          <w:sz w:val="44"/>
+          <w:szCs w:val="44"/>
+          <w:lang w:bidi="fa-IR"/>
+        </w:rPr>
+      </w:pPr>
+      <w:r>
+        <w:rPr>
+          <w:sz w:val="44"/>
+          <w:szCs w:val="44"/>
+          <w:lang w:bidi="fa-IR"/>
+        </w:rPr>
+        <w:t>Let's make this idea more intuitive using the following figure.</w:t>
+      </w:r>
+    </w:p>
+    <w:p>
+      <w:pPr>
+        <w:rPr>
+          <w:sz w:val="44"/>
+          <w:szCs w:val="44"/>
+          <w:lang w:bidi="fa-IR"/>
+        </w:rPr>
+      </w:pPr>
+      <w:r>
+        <w:rPr>
+          <w:sz w:val="44"/>
+          <w:szCs w:val="44"/>
+          <w:lang w:bidi="fa-IR"/>
+        </w:rPr>
+        <w:t xml:space="preserve">Notice that the </w:t>
+      </w:r>
+      <w:r>
+        <w:rPr>
+          <w:b/>
+          <w:bCs/>
+          <w:sz w:val="44"/>
+          <w:szCs w:val="44"/>
+          <w:lang w:bidi="fa-IR"/>
+        </w:rPr>
+        <w:t>blue</w:t>
+      </w:r>
+      <w:r>
+        <w:rPr>
+          <w:sz w:val="44"/>
+          <w:szCs w:val="44"/>
+          <w:lang w:bidi="fa-IR"/>
+        </w:rPr>
+        <w:t xml:space="preserve"> and </w:t>
+      </w:r>
+      <w:r>
+        <w:rPr>
+          <w:b/>
+          <w:bCs/>
+          <w:sz w:val="44"/>
+          <w:szCs w:val="44"/>
+          <w:lang w:bidi="fa-IR"/>
+        </w:rPr>
+        <w:t>green</w:t>
+      </w:r>
+      <w:r>
+        <w:rPr>
+          <w:sz w:val="44"/>
+          <w:szCs w:val="44"/>
+          <w:lang w:bidi="fa-IR"/>
+        </w:rPr>
+        <w:t xml:space="preserve"> vectors are linearly dependent. </w:t>
+      </w:r>
+      <w:r>
+        <w:rPr>
+          <w:color w:val="EE0000"/>
+          <w:sz w:val="44"/>
+          <w:szCs w:val="44"/>
+          <w:lang w:bidi="fa-IR"/>
+        </w:rPr>
+        <w:t>They lie on the same line, so one is simply a scalar multiple of the other</w:t>
+      </w:r>
+      <w:r>
+        <w:rPr>
+          <w:sz w:val="44"/>
+          <w:szCs w:val="44"/>
+          <w:lang w:bidi="fa-IR"/>
+        </w:rPr>
+        <w:t>. In other words, they point in the same direction, differing only in magnitude and possibly orientation.</w:t>
+      </w:r>
+    </w:p>
+    <w:p>
+      <w:pPr>
+        <w:rPr>
+          <w:sz w:val="44"/>
+          <w:szCs w:val="44"/>
+          <w:lang w:bidi="fa-IR"/>
+        </w:rPr>
+      </w:pPr>
+      <w:r>
+        <w:rPr>
+          <w:sz w:val="44"/>
+          <w:szCs w:val="44"/>
+          <w:lang w:bidi="fa-IR"/>
+        </w:rPr>
+        <w:lastRenderedPageBreak/>
+        <w:t xml:space="preserve">The </w:t>
+      </w:r>
+      <w:r>
+        <w:rPr>
+          <w:b/>
+          <w:bCs/>
+          <w:sz w:val="44"/>
+          <w:szCs w:val="44"/>
+          <w:lang w:bidi="fa-IR"/>
+        </w:rPr>
+        <w:t>red</w:t>
+      </w:r>
+      <w:r>
+        <w:rPr>
+          <w:sz w:val="44"/>
+          <w:szCs w:val="44"/>
+          <w:lang w:bidi="fa-IR"/>
+        </w:rPr>
+        <w:t xml:space="preserve"> vector, however, points in a different direction. It cannot be written as a scalar multiple of either the blue or the green vector, so it is linearly independent of both.</w:t>
+      </w:r>
+    </w:p>
+    <w:p>
+      <w:pPr>
+        <w:rPr>
+          <w:sz w:val="44"/>
+          <w:szCs w:val="44"/>
+          <w:lang w:bidi="fa-IR"/>
+        </w:rPr>
+      </w:pPr>
+      <w:r>
+        <w:rPr>
+          <w:sz w:val="44"/>
+          <w:szCs w:val="44"/>
+          <w:lang w:bidi="fa-IR"/>
+        </w:rPr>
+        <w:t>In two-dimensional space, this is exactly what we need to span the entire plane: two vectors that point in different directions and are linearly independent.</w:t>
+      </w:r>
+    </w:p>
+    <w:p>
+      <w:pPr>
+        <w:rPr>
+          <w:rFonts w:hint="cs"/>
           <w:sz w:val="44"/>
           <w:szCs w:val="44"/>
           <w:lang w:bidi="fa-IR"/>
@@ -19705,6 +21925,7 @@
   <w:style w:type="paragraph" w:default="1" w:styleId="Normal">
     <w:name w:val="Normal"/>
     <w:qFormat/>
+    <w:rsid w:val="00A36E87"/>
   </w:style>
   <w:style w:type="paragraph" w:styleId="Heading1">
     <w:name w:val="heading 1"/>
@@ -20526,4 +22747,16 @@
     </a:ext>
   </a:extLst>
 </a:theme>
+</file>
+
+<file path=customXml/item1.xml><?xml version="1.0" encoding="utf-8"?>
+<b:Sources xmlns:b="http://schemas.openxmlformats.org/officeDocument/2006/bibliography" xmlns="http://schemas.openxmlformats.org/officeDocument/2006/bibliography" SelectedStyle="\APASixthEditionOfficeOnline.xsl" StyleName="APA" Version="6"/>
+</file>
+
+<file path=customXml/itemProps1.xml><?xml version="1.0" encoding="utf-8"?>
+<ds:datastoreItem xmlns:ds="http://schemas.openxmlformats.org/officeDocument/2006/customXml" ds:itemID="{5134C6AA-4B68-4A01-9141-0A7E21F069F2}">
+  <ds:schemaRefs>
+    <ds:schemaRef ds:uri="http://schemas.openxmlformats.org/officeDocument/2006/bibliography"/>
+  </ds:schemaRefs>
+</ds:datastoreItem>
 </file>
</xml_diff>

<commit_message>
step 105 : finish part 12 and start part 13
</commit_message>
<xml_diff>
--- a/video context/video_context_newVersion.docx
+++ b/video context/video_context_newVersion.docx
@@ -2304,15 +2304,27 @@
           <w:lang w:bidi="fa-IR"/>
         </w:rPr>
       </w:pPr>
-      <w:r>
-        <w:rPr>
-          <w:b/>
-          <w:bCs/>
-          <w:sz w:val="44"/>
-          <w:szCs w:val="44"/>
-          <w:lang w:bidi="fa-IR"/>
-        </w:rPr>
-        <w:t>Hellooo, and welcome back!</w:t>
+      <w:proofErr w:type="spellStart"/>
+      <w:r>
+        <w:rPr>
+          <w:b/>
+          <w:bCs/>
+          <w:sz w:val="44"/>
+          <w:szCs w:val="44"/>
+          <w:lang w:bidi="fa-IR"/>
+        </w:rPr>
+        <w:t>Hellooo</w:t>
+      </w:r>
+      <w:proofErr w:type="spellEnd"/>
+      <w:r>
+        <w:rPr>
+          <w:b/>
+          <w:bCs/>
+          <w:sz w:val="44"/>
+          <w:szCs w:val="44"/>
+          <w:lang w:bidi="fa-IR"/>
+        </w:rPr>
+        <w:t>, and welcome back!</w:t>
       </w:r>
       <w:r>
         <w:rPr>
@@ -2753,7 +2765,25 @@
           <w:lang w:bidi="fa-IR"/>
         </w:rPr>
         <w:lastRenderedPageBreak/>
-        <w:t>Next, we show that the distance from x to y is equal to the distance from y to x.</w:t>
+        <w:t xml:space="preserve">Next, we show that the distance from x </w:t>
+      </w:r>
+      <w:proofErr w:type="spellStart"/>
+      <w:r>
+        <w:rPr>
+          <w:sz w:val="44"/>
+          <w:szCs w:val="44"/>
+          <w:lang w:bidi="fa-IR"/>
+        </w:rPr>
+        <w:t>to y</w:t>
+      </w:r>
+      <w:proofErr w:type="spellEnd"/>
+      <w:r>
+        <w:rPr>
+          <w:sz w:val="44"/>
+          <w:szCs w:val="44"/>
+          <w:lang w:bidi="fa-IR"/>
+        </w:rPr>
+        <w:t xml:space="preserve"> is equal to the distance from y to x.</w:t>
       </w:r>
     </w:p>
     <w:p>
@@ -2787,8 +2817,18 @@
           <w:szCs w:val="44"/>
           <w:lang w:bidi="fa-IR"/>
         </w:rPr>
-        <w:t>To gain some geometric intuition, consider two points, x and y, in the two-dimensional plane. We first represent the distance from x to y</w:t>
-      </w:r>
+        <w:t xml:space="preserve">To gain some geometric intuition, consider two points, x and y, in the two-dimensional plane. We first represent the distance from x </w:t>
+      </w:r>
+      <w:proofErr w:type="spellStart"/>
+      <w:r>
+        <w:rPr>
+          <w:sz w:val="44"/>
+          <w:szCs w:val="44"/>
+          <w:lang w:bidi="fa-IR"/>
+        </w:rPr>
+        <w:t>to y</w:t>
+      </w:r>
+      <w:proofErr w:type="spellEnd"/>
       <w:r>
         <w:rPr>
           <w:sz w:val="44"/>
@@ -3363,24 +3403,78 @@
           <w:szCs w:val="44"/>
           <w:lang w:bidi="fa-IR"/>
         </w:rPr>
-        <w:t>To begin, let (X,d) be a metric space, and let y_n be a sequence in X.</w:t>
-      </w:r>
-    </w:p>
-    <w:p>
-      <w:pPr>
-        <w:rPr>
-          <w:sz w:val="44"/>
-          <w:szCs w:val="44"/>
-          <w:lang w:bidi="fa-IR"/>
-        </w:rPr>
-      </w:pPr>
-      <w:r>
-        <w:rPr>
-          <w:sz w:val="44"/>
-          <w:szCs w:val="44"/>
-          <w:lang w:bidi="fa-IR"/>
-        </w:rPr>
-        <w:t>We say that the sequence y_n converges</w:t>
+        <w:t>To begin, let (</w:t>
+      </w:r>
+      <w:proofErr w:type="spellStart"/>
+      <w:r>
+        <w:rPr>
+          <w:sz w:val="44"/>
+          <w:szCs w:val="44"/>
+          <w:lang w:bidi="fa-IR"/>
+        </w:rPr>
+        <w:t>X,d</w:t>
+      </w:r>
+      <w:proofErr w:type="spellEnd"/>
+      <w:r>
+        <w:rPr>
+          <w:sz w:val="44"/>
+          <w:szCs w:val="44"/>
+          <w:lang w:bidi="fa-IR"/>
+        </w:rPr>
+        <w:t xml:space="preserve">) be a metric space, and let </w:t>
+      </w:r>
+      <w:proofErr w:type="spellStart"/>
+      <w:r>
+        <w:rPr>
+          <w:sz w:val="44"/>
+          <w:szCs w:val="44"/>
+          <w:lang w:bidi="fa-IR"/>
+        </w:rPr>
+        <w:t>y_n</w:t>
+      </w:r>
+      <w:proofErr w:type="spellEnd"/>
+      <w:r>
+        <w:rPr>
+          <w:sz w:val="44"/>
+          <w:szCs w:val="44"/>
+          <w:lang w:bidi="fa-IR"/>
+        </w:rPr>
+        <w:t xml:space="preserve"> be a sequence in X.</w:t>
+      </w:r>
+    </w:p>
+    <w:p>
+      <w:pPr>
+        <w:rPr>
+          <w:sz w:val="44"/>
+          <w:szCs w:val="44"/>
+          <w:lang w:bidi="fa-IR"/>
+        </w:rPr>
+      </w:pPr>
+      <w:r>
+        <w:rPr>
+          <w:sz w:val="44"/>
+          <w:szCs w:val="44"/>
+          <w:lang w:bidi="fa-IR"/>
+        </w:rPr>
+        <w:t xml:space="preserve">We say that the sequence </w:t>
+      </w:r>
+      <w:proofErr w:type="spellStart"/>
+      <w:r>
+        <w:rPr>
+          <w:sz w:val="44"/>
+          <w:szCs w:val="44"/>
+          <w:lang w:bidi="fa-IR"/>
+        </w:rPr>
+        <w:t>y_n</w:t>
+      </w:r>
+      <w:proofErr w:type="spellEnd"/>
+      <w:r>
+        <w:rPr>
+          <w:sz w:val="44"/>
+          <w:szCs w:val="44"/>
+          <w:lang w:bidi="fa-IR"/>
+        </w:rPr>
+        <w:t xml:space="preserve"> converges</w:t>
       </w:r>
       <w:r>
         <w:rPr>
@@ -3502,6 +3596,7 @@
         <w:lastRenderedPageBreak/>
         <w:t xml:space="preserve">In this case, something interesting happens. The very same sequence </w:t>
       </w:r>
+      <w:proofErr w:type="spellStart"/>
       <w:r>
         <w:rPr>
           <w:sz w:val="44"/>
@@ -3510,6 +3605,7 @@
         </w:rPr>
         <w:t>y_n</w:t>
       </w:r>
+      <w:proofErr w:type="spellEnd"/>
       <w:r>
         <w:rPr>
           <w:sz w:val="44"/>
@@ -3723,7 +3819,43 @@
           <w:lang w:bidi="fa-IR"/>
         </w:rPr>
         <w:lastRenderedPageBreak/>
-        <w:t xml:space="preserve">Formally, a sequence ({x_n}) in a metric space ((X,d)) is called </w:t>
+        <w:t>Formally, a sequence ({</w:t>
+      </w:r>
+      <w:proofErr w:type="spellStart"/>
+      <w:r>
+        <w:rPr>
+          <w:sz w:val="44"/>
+          <w:szCs w:val="44"/>
+          <w:lang w:bidi="fa-IR"/>
+        </w:rPr>
+        <w:t>x_n</w:t>
+      </w:r>
+      <w:proofErr w:type="spellEnd"/>
+      <w:r>
+        <w:rPr>
+          <w:sz w:val="44"/>
+          <w:szCs w:val="44"/>
+          <w:lang w:bidi="fa-IR"/>
+        </w:rPr>
+        <w:t>}) in a metric space ((</w:t>
+      </w:r>
+      <w:proofErr w:type="spellStart"/>
+      <w:r>
+        <w:rPr>
+          <w:sz w:val="44"/>
+          <w:szCs w:val="44"/>
+          <w:lang w:bidi="fa-IR"/>
+        </w:rPr>
+        <w:t>X,d</w:t>
+      </w:r>
+      <w:proofErr w:type="spellEnd"/>
+      <w:r>
+        <w:rPr>
+          <w:sz w:val="44"/>
+          <w:szCs w:val="44"/>
+          <w:lang w:bidi="fa-IR"/>
+        </w:rPr>
+        <w:t xml:space="preserve">)) is called </w:t>
       </w:r>
       <w:r>
         <w:rPr>
@@ -3741,7 +3873,25 @@
           <w:szCs w:val="44"/>
           <w:lang w:bidi="fa-IR"/>
         </w:rPr>
-        <w:t xml:space="preserve"> if, for every (\varepsilon &gt; 0), there exists an integer (N) such that</w:t>
+        <w:t xml:space="preserve"> if, for every (\</w:t>
+      </w:r>
+      <w:proofErr w:type="spellStart"/>
+      <w:r>
+        <w:rPr>
+          <w:sz w:val="44"/>
+          <w:szCs w:val="44"/>
+          <w:lang w:bidi="fa-IR"/>
+        </w:rPr>
+        <w:t>varepsilon</w:t>
+      </w:r>
+      <w:proofErr w:type="spellEnd"/>
+      <w:r>
+        <w:rPr>
+          <w:sz w:val="44"/>
+          <w:szCs w:val="44"/>
+          <w:lang w:bidi="fa-IR"/>
+        </w:rPr>
+        <w:t xml:space="preserve"> &gt; 0), there exists an integer (N) such that</w:t>
       </w:r>
     </w:p>
     <w:p>
@@ -3885,24 +4035,60 @@
           <w:szCs w:val="44"/>
           <w:lang w:bidi="fa-IR"/>
         </w:rPr>
-        <w:t>for every (m,n &gt; N).</w:t>
-      </w:r>
-    </w:p>
-    <w:p>
-      <w:pPr>
-        <w:rPr>
-          <w:sz w:val="44"/>
-          <w:szCs w:val="44"/>
-          <w:lang w:bidi="fa-IR"/>
-        </w:rPr>
-      </w:pPr>
-      <w:r>
-        <w:rPr>
-          <w:sz w:val="44"/>
-          <w:szCs w:val="44"/>
-          <w:lang w:bidi="fa-IR"/>
-        </w:rPr>
-        <w:t>Now let's look again at our sequence ({y_n}).</w:t>
+        <w:t>for every (</w:t>
+      </w:r>
+      <w:proofErr w:type="spellStart"/>
+      <w:r>
+        <w:rPr>
+          <w:sz w:val="44"/>
+          <w:szCs w:val="44"/>
+          <w:lang w:bidi="fa-IR"/>
+        </w:rPr>
+        <w:t>m,n</w:t>
+      </w:r>
+      <w:proofErr w:type="spellEnd"/>
+      <w:r>
+        <w:rPr>
+          <w:sz w:val="44"/>
+          <w:szCs w:val="44"/>
+          <w:lang w:bidi="fa-IR"/>
+        </w:rPr>
+        <w:t xml:space="preserve"> &gt; N).</w:t>
+      </w:r>
+    </w:p>
+    <w:p>
+      <w:pPr>
+        <w:rPr>
+          <w:sz w:val="44"/>
+          <w:szCs w:val="44"/>
+          <w:lang w:bidi="fa-IR"/>
+        </w:rPr>
+      </w:pPr>
+      <w:r>
+        <w:rPr>
+          <w:sz w:val="44"/>
+          <w:szCs w:val="44"/>
+          <w:lang w:bidi="fa-IR"/>
+        </w:rPr>
+        <w:t>Now let's look again at our sequence ({</w:t>
+      </w:r>
+      <w:proofErr w:type="spellStart"/>
+      <w:r>
+        <w:rPr>
+          <w:sz w:val="44"/>
+          <w:szCs w:val="44"/>
+          <w:lang w:bidi="fa-IR"/>
+        </w:rPr>
+        <w:t>y_n</w:t>
+      </w:r>
+      <w:proofErr w:type="spellEnd"/>
+      <w:r>
+        <w:rPr>
+          <w:sz w:val="44"/>
+          <w:szCs w:val="44"/>
+          <w:lang w:bidi="fa-IR"/>
+        </w:rPr>
+        <w:t>}).</w:t>
       </w:r>
     </w:p>
     <w:p>
@@ -4456,7 +4642,25 @@
           <w:lang w:bidi="fa-IR"/>
         </w:rPr>
         <w:lastRenderedPageBreak/>
-        <w:t>Go back to our previous metric space (X), and consider the same Cauchy sequence ({y_n}).</w:t>
+        <w:t>Go back to our previous metric space (X), and consider the same Cauchy sequence ({</w:t>
+      </w:r>
+      <w:proofErr w:type="spellStart"/>
+      <w:r>
+        <w:rPr>
+          <w:sz w:val="44"/>
+          <w:szCs w:val="44"/>
+          <w:lang w:bidi="fa-IR"/>
+        </w:rPr>
+        <w:t>y_n</w:t>
+      </w:r>
+      <w:proofErr w:type="spellEnd"/>
+      <w:r>
+        <w:rPr>
+          <w:sz w:val="44"/>
+          <w:szCs w:val="44"/>
+          <w:lang w:bidi="fa-IR"/>
+        </w:rPr>
+        <w:t>}).</w:t>
       </w:r>
     </w:p>
     <w:p>
@@ -6518,6 +6722,7 @@
         </w:rPr>
         <w:t xml:space="preserve">Suppose we have two vectors, </w:t>
       </w:r>
+      <w:proofErr w:type="spellStart"/>
       <w:r>
         <w:rPr>
           <w:b/>
@@ -6534,7 +6739,16 @@
           <w:szCs w:val="44"/>
           <w:lang w:bidi="fa-IR"/>
         </w:rPr>
-        <w:t xml:space="preserve">and </w:t>
+        <w:t>and</w:t>
+      </w:r>
+      <w:proofErr w:type="spellEnd"/>
+      <w:r>
+        <w:rPr>
+          <w:sz w:val="44"/>
+          <w:szCs w:val="44"/>
+          <w:lang w:bidi="fa-IR"/>
+        </w:rPr>
+        <w:t xml:space="preserve"> </w:t>
       </w:r>
       <w:r>
         <w:rPr>
@@ -7659,6 +7873,7 @@
         </w:rPr>
         <w:t xml:space="preserve"> in its second argument. This property is also commonly referred to as </w:t>
       </w:r>
+      <w:proofErr w:type="spellStart"/>
       <w:r>
         <w:rPr>
           <w:b/>
@@ -7669,6 +7884,7 @@
         </w:rPr>
         <w:t>semilinearity</w:t>
       </w:r>
+      <w:proofErr w:type="spellEnd"/>
       <w:r>
         <w:rPr>
           <w:sz w:val="44"/>
@@ -7713,8 +7929,20 @@
           <w:lang w:bidi="fa-IR"/>
         </w:rPr>
         <w:lastRenderedPageBreak/>
-        <w:t>Putting these two results together, we conclude that the inner product is sesquilinear</w:t>
-      </w:r>
+        <w:t xml:space="preserve">Putting these two results together, we conclude that the inner product is </w:t>
+      </w:r>
+      <w:proofErr w:type="spellStart"/>
+      <w:r>
+        <w:rPr>
+          <w:b/>
+          <w:bCs/>
+          <w:sz w:val="44"/>
+          <w:szCs w:val="44"/>
+          <w:lang w:bidi="fa-IR"/>
+        </w:rPr>
+        <w:t>sesquilinear</w:t>
+      </w:r>
+      <w:proofErr w:type="spellEnd"/>
     </w:p>
     <w:p>
       <w:pPr>
@@ -8477,7 +8705,25 @@
           <w:lang w:bidi="fa-IR"/>
         </w:rPr>
         <w:lastRenderedPageBreak/>
-        <w:t xml:space="preserve">For instance, the (L^p) norms for (p </w:t>
+        <w:t>For instance, the (</w:t>
+      </w:r>
+      <w:proofErr w:type="spellStart"/>
+      <w:r>
+        <w:rPr>
+          <w:sz w:val="44"/>
+          <w:szCs w:val="44"/>
+          <w:lang w:bidi="fa-IR"/>
+        </w:rPr>
+        <w:t>L^p</w:t>
+      </w:r>
+      <w:proofErr w:type="spellEnd"/>
+      <w:r>
+        <w:rPr>
+          <w:sz w:val="44"/>
+          <w:szCs w:val="44"/>
+          <w:lang w:bidi="fa-IR"/>
+        </w:rPr>
+        <w:t xml:space="preserve">) norms for (p </w:t>
       </w:r>
       <m:oMath>
         <m:r>
@@ -9878,7 +10124,25 @@
           <w:szCs w:val="44"/>
           <w:lang w:bidi="fa-IR"/>
         </w:rPr>
-        <w:t xml:space="preserve">Although (C[a,b]) with the supremum norm </w:t>
+        <w:t>Although (C[</w:t>
+      </w:r>
+      <w:proofErr w:type="spellStart"/>
+      <w:r>
+        <w:rPr>
+          <w:sz w:val="44"/>
+          <w:szCs w:val="44"/>
+          <w:lang w:bidi="fa-IR"/>
+        </w:rPr>
+        <w:t>a,b</w:t>
+      </w:r>
+      <w:proofErr w:type="spellEnd"/>
+      <w:r>
+        <w:rPr>
+          <w:sz w:val="44"/>
+          <w:szCs w:val="44"/>
+          <w:lang w:bidi="fa-IR"/>
+        </w:rPr>
+        <w:t xml:space="preserve">]) with the supremum norm </w:t>
       </w:r>
       <w:r>
         <w:rPr>
@@ -9977,7 +10241,25 @@
           <w:szCs w:val="44"/>
           <w:lang w:bidi="fa-IR"/>
         </w:rPr>
-        <w:t xml:space="preserve">Therefore, (C[a,b]) equipped with the supremum norm is </w:t>
+        <w:t>Therefore, (C[</w:t>
+      </w:r>
+      <w:proofErr w:type="spellStart"/>
+      <w:r>
+        <w:rPr>
+          <w:sz w:val="44"/>
+          <w:szCs w:val="44"/>
+          <w:lang w:bidi="fa-IR"/>
+        </w:rPr>
+        <w:t>a,b</w:t>
+      </w:r>
+      <w:proofErr w:type="spellEnd"/>
+      <w:r>
+        <w:rPr>
+          <w:sz w:val="44"/>
+          <w:szCs w:val="44"/>
+          <w:lang w:bidi="fa-IR"/>
+        </w:rPr>
+        <w:t xml:space="preserve">]) equipped with the supremum norm is </w:t>
       </w:r>
       <w:r>
         <w:rPr>
@@ -11670,7 +11952,51 @@
           <w:szCs w:val="44"/>
           <w:lang w:bidi="fa-IR"/>
         </w:rPr>
-        <w:t>"The norm of x+ ky equals the norm of x−ky for all real numbers k."</w:t>
+        <w:t xml:space="preserve">"The norm of x+ </w:t>
+      </w:r>
+      <w:proofErr w:type="spellStart"/>
+      <w:r>
+        <w:rPr>
+          <w:b/>
+          <w:bCs/>
+          <w:sz w:val="44"/>
+          <w:szCs w:val="44"/>
+          <w:lang w:bidi="fa-IR"/>
+        </w:rPr>
+        <w:t>ky</w:t>
+      </w:r>
+      <w:proofErr w:type="spellEnd"/>
+      <w:r>
+        <w:rPr>
+          <w:b/>
+          <w:bCs/>
+          <w:sz w:val="44"/>
+          <w:szCs w:val="44"/>
+          <w:lang w:bidi="fa-IR"/>
+        </w:rPr>
+        <w:t xml:space="preserve"> equals the norm of x−</w:t>
+      </w:r>
+      <w:proofErr w:type="spellStart"/>
+      <w:r>
+        <w:rPr>
+          <w:b/>
+          <w:bCs/>
+          <w:sz w:val="44"/>
+          <w:szCs w:val="44"/>
+          <w:lang w:bidi="fa-IR"/>
+        </w:rPr>
+        <w:t>ky</w:t>
+      </w:r>
+      <w:proofErr w:type="spellEnd"/>
+      <w:r>
+        <w:rPr>
+          <w:b/>
+          <w:bCs/>
+          <w:sz w:val="44"/>
+          <w:szCs w:val="44"/>
+          <w:lang w:bidi="fa-IR"/>
+        </w:rPr>
+        <w:t xml:space="preserve"> for all real numbers k."</w:t>
       </w:r>
     </w:p>
     <w:p>
@@ -11712,7 +12038,25 @@
           <w:szCs w:val="44"/>
           <w:lang w:bidi="fa-IR"/>
         </w:rPr>
-        <w:t>x is orthogonal to y in the sense of Roberts</w:t>
+        <w:t xml:space="preserve">x is orthogonal </w:t>
+      </w:r>
+      <w:proofErr w:type="spellStart"/>
+      <w:r>
+        <w:rPr>
+          <w:sz w:val="44"/>
+          <w:szCs w:val="44"/>
+          <w:lang w:bidi="fa-IR"/>
+        </w:rPr>
+        <w:t>to y</w:t>
+      </w:r>
+      <w:proofErr w:type="spellEnd"/>
+      <w:r>
+        <w:rPr>
+          <w:sz w:val="44"/>
+          <w:szCs w:val="44"/>
+          <w:lang w:bidi="fa-IR"/>
+        </w:rPr>
+        <w:t xml:space="preserve"> in the sense of Roberts</w:t>
       </w:r>
       <w:r>
         <w:rPr>
@@ -11754,7 +12098,79 @@
           <w:szCs w:val="44"/>
           <w:lang w:bidi="fa-IR"/>
         </w:rPr>
-        <w:t>Suppose we have two vectors, (x) and (y), that are orthogonal in the sense of Roberts. For an arbitrary real number (k), draw the vector (ky). The vectors (x) and (ky) form a parallelogram, and when this parallelogram happens to be a rectangle, its diagonals are (x + ky) and (x - ky).</w:t>
+        <w:t>Suppose we have two vectors, (x) and (y), that are orthogonal in the sense of Roberts. For an arbitrary real number (k), draw the vector (</w:t>
+      </w:r>
+      <w:proofErr w:type="spellStart"/>
+      <w:r>
+        <w:rPr>
+          <w:sz w:val="44"/>
+          <w:szCs w:val="44"/>
+          <w:lang w:bidi="fa-IR"/>
+        </w:rPr>
+        <w:t>ky</w:t>
+      </w:r>
+      <w:proofErr w:type="spellEnd"/>
+      <w:r>
+        <w:rPr>
+          <w:sz w:val="44"/>
+          <w:szCs w:val="44"/>
+          <w:lang w:bidi="fa-IR"/>
+        </w:rPr>
+        <w:t>). The vectors (x) and (</w:t>
+      </w:r>
+      <w:proofErr w:type="spellStart"/>
+      <w:r>
+        <w:rPr>
+          <w:sz w:val="44"/>
+          <w:szCs w:val="44"/>
+          <w:lang w:bidi="fa-IR"/>
+        </w:rPr>
+        <w:t>ky</w:t>
+      </w:r>
+      <w:proofErr w:type="spellEnd"/>
+      <w:r>
+        <w:rPr>
+          <w:sz w:val="44"/>
+          <w:szCs w:val="44"/>
+          <w:lang w:bidi="fa-IR"/>
+        </w:rPr>
+        <w:t xml:space="preserve">) form a parallelogram, and when this parallelogram happens to be a rectangle, its diagonals are (x + </w:t>
+      </w:r>
+      <w:proofErr w:type="spellStart"/>
+      <w:r>
+        <w:rPr>
+          <w:sz w:val="44"/>
+          <w:szCs w:val="44"/>
+          <w:lang w:bidi="fa-IR"/>
+        </w:rPr>
+        <w:t>ky</w:t>
+      </w:r>
+      <w:proofErr w:type="spellEnd"/>
+      <w:r>
+        <w:rPr>
+          <w:sz w:val="44"/>
+          <w:szCs w:val="44"/>
+          <w:lang w:bidi="fa-IR"/>
+        </w:rPr>
+        <w:t xml:space="preserve">) and (x - </w:t>
+      </w:r>
+      <w:proofErr w:type="spellStart"/>
+      <w:r>
+        <w:rPr>
+          <w:sz w:val="44"/>
+          <w:szCs w:val="44"/>
+          <w:lang w:bidi="fa-IR"/>
+        </w:rPr>
+        <w:t>ky</w:t>
+      </w:r>
+      <w:proofErr w:type="spellEnd"/>
+      <w:r>
+        <w:rPr>
+          <w:sz w:val="44"/>
+          <w:szCs w:val="44"/>
+          <w:lang w:bidi="fa-IR"/>
+        </w:rPr>
+        <w:t>).</w:t>
       </w:r>
     </w:p>
     <w:p>
@@ -12332,7 +12748,25 @@
           <w:szCs w:val="44"/>
           <w:lang w:bidi="fa-IR"/>
         </w:rPr>
-        <w:t>Consider the following vectors in (\mathbb{R}^3) equipped with the infinity norm.</w:t>
+        <w:t>Consider the following vectors in (\</w:t>
+      </w:r>
+      <w:proofErr w:type="spellStart"/>
+      <w:r>
+        <w:rPr>
+          <w:sz w:val="44"/>
+          <w:szCs w:val="44"/>
+          <w:lang w:bidi="fa-IR"/>
+        </w:rPr>
+        <w:t>mathbb</w:t>
+      </w:r>
+      <w:proofErr w:type="spellEnd"/>
+      <w:r>
+        <w:rPr>
+          <w:sz w:val="44"/>
+          <w:szCs w:val="44"/>
+          <w:lang w:bidi="fa-IR"/>
+        </w:rPr>
+        <w:t>{R}^3) equipped with the infinity norm.</w:t>
       </w:r>
     </w:p>
     <w:p>
@@ -12515,7 +12949,25 @@
           <w:szCs w:val="44"/>
           <w:lang w:bidi="fa-IR"/>
         </w:rPr>
-        <w:t>We work in (\mathbb{R}^2) equipped with the infinity norm.</w:t>
+        <w:t>We work in (\</w:t>
+      </w:r>
+      <w:proofErr w:type="spellStart"/>
+      <w:r>
+        <w:rPr>
+          <w:sz w:val="44"/>
+          <w:szCs w:val="44"/>
+          <w:lang w:bidi="fa-IR"/>
+        </w:rPr>
+        <w:t>mathbb</w:t>
+      </w:r>
+      <w:proofErr w:type="spellEnd"/>
+      <w:r>
+        <w:rPr>
+          <w:sz w:val="44"/>
+          <w:szCs w:val="44"/>
+          <w:lang w:bidi="fa-IR"/>
+        </w:rPr>
+        <w:t>{R}^2) equipped with the infinity norm.</w:t>
       </w:r>
     </w:p>
     <w:p>
@@ -14161,7 +14613,25 @@
           <w:szCs w:val="44"/>
           <w:lang w:bidi="fa-IR"/>
         </w:rPr>
-        <w:t>We'll work in the space (\mathbb{R}^2) equipped with the (\ell_1) norm.</w:t>
+        <w:t>We'll work in the space (\</w:t>
+      </w:r>
+      <w:proofErr w:type="spellStart"/>
+      <w:r>
+        <w:rPr>
+          <w:sz w:val="44"/>
+          <w:szCs w:val="44"/>
+          <w:lang w:bidi="fa-IR"/>
+        </w:rPr>
+        <w:t>mathbb</w:t>
+      </w:r>
+      <w:proofErr w:type="spellEnd"/>
+      <w:r>
+        <w:rPr>
+          <w:sz w:val="44"/>
+          <w:szCs w:val="44"/>
+          <w:lang w:bidi="fa-IR"/>
+        </w:rPr>
+        <w:t>{R}^2) equipped with the (\ell_1) norm.</w:t>
       </w:r>
     </w:p>
     <w:p>
@@ -14342,7 +14812,25 @@
           <w:lang w:bidi="fa-IR"/>
         </w:rPr>
         <w:lastRenderedPageBreak/>
-        <w:t>First, suppose that (\alpha \neq 0). By factoring out (\alpha) from the norm and making a simple change of variables, we obtain the desired result.</w:t>
+        <w:t>First, suppose that (\alpha \</w:t>
+      </w:r>
+      <w:proofErr w:type="spellStart"/>
+      <w:r>
+        <w:rPr>
+          <w:sz w:val="44"/>
+          <w:szCs w:val="44"/>
+          <w:lang w:bidi="fa-IR"/>
+        </w:rPr>
+        <w:t>neq</w:t>
+      </w:r>
+      <w:proofErr w:type="spellEnd"/>
+      <w:r>
+        <w:rPr>
+          <w:sz w:val="44"/>
+          <w:szCs w:val="44"/>
+          <w:lang w:bidi="fa-IR"/>
+        </w:rPr>
+        <w:t xml:space="preserve"> 0). By factoring out (\alpha) from the norm and making a simple change of variables, we obtain the desired result.</w:t>
       </w:r>
     </w:p>
     <w:p>
@@ -16624,7 +17112,29 @@
           <w:szCs w:val="44"/>
           <w:lang w:bidi="fa-IR"/>
         </w:rPr>
-        <w:t xml:space="preserve">We define f of lambda to be the norm of x+ λy, </w:t>
+        <w:t xml:space="preserve">We define f of lambda to be the norm of x+ </w:t>
+      </w:r>
+      <w:proofErr w:type="spellStart"/>
+      <w:r>
+        <w:rPr>
+          <w:b/>
+          <w:bCs/>
+          <w:sz w:val="44"/>
+          <w:szCs w:val="44"/>
+          <w:lang w:bidi="fa-IR"/>
+        </w:rPr>
+        <w:t>λy</w:t>
+      </w:r>
+      <w:proofErr w:type="spellEnd"/>
+      <w:r>
+        <w:rPr>
+          <w:b/>
+          <w:bCs/>
+          <w:sz w:val="44"/>
+          <w:szCs w:val="44"/>
+          <w:lang w:bidi="fa-IR"/>
+        </w:rPr>
+        <w:t xml:space="preserve">, </w:t>
       </w:r>
       <w:r>
         <w:rPr>
@@ -16868,7 +17378,25 @@
           <w:szCs w:val="44"/>
           <w:lang w:bidi="fa-IR"/>
         </w:rPr>
-        <w:t>The derivative of f at zero is equal to zero</w:t>
+        <w:t xml:space="preserve">The derivative </w:t>
+      </w:r>
+      <w:proofErr w:type="spellStart"/>
+      <w:r>
+        <w:rPr>
+          <w:sz w:val="44"/>
+          <w:szCs w:val="44"/>
+          <w:lang w:bidi="fa-IR"/>
+        </w:rPr>
+        <w:t>of f</w:t>
+      </w:r>
+      <w:proofErr w:type="spellEnd"/>
+      <w:r>
+        <w:rPr>
+          <w:sz w:val="44"/>
+          <w:szCs w:val="44"/>
+          <w:lang w:bidi="fa-IR"/>
+        </w:rPr>
+        <w:t xml:space="preserve"> at zero is equal to zero</w:t>
       </w:r>
       <w:r>
         <w:rPr>
@@ -16902,7 +17430,25 @@
           <w:szCs w:val="44"/>
           <w:lang w:bidi="fa-IR"/>
         </w:rPr>
-        <w:t>Now let's substitute the (\ell_p)-norm into our function.</w:t>
+        <w:t>Now let's substitute the (\</w:t>
+      </w:r>
+      <w:proofErr w:type="spellStart"/>
+      <w:r>
+        <w:rPr>
+          <w:sz w:val="44"/>
+          <w:szCs w:val="44"/>
+          <w:lang w:bidi="fa-IR"/>
+        </w:rPr>
+        <w:t>ell_p</w:t>
+      </w:r>
+      <w:proofErr w:type="spellEnd"/>
+      <w:r>
+        <w:rPr>
+          <w:sz w:val="44"/>
+          <w:szCs w:val="44"/>
+          <w:lang w:bidi="fa-IR"/>
+        </w:rPr>
+        <w:t>)-norm into our function.</w:t>
       </w:r>
     </w:p>
     <w:p>
@@ -16982,7 +17528,25 @@
           <w:lang w:bidi="fa-IR"/>
         </w:rPr>
         <w:br/>
-        <w:t>we arrive at the desired characterization of Birkhoff–James orthogonality in (\ell_p) spaces.</w:t>
+        <w:t>we arrive at the desired characterization of Birkhoff–James orthogonality in (\</w:t>
+      </w:r>
+      <w:proofErr w:type="spellStart"/>
+      <w:r>
+        <w:rPr>
+          <w:sz w:val="44"/>
+          <w:szCs w:val="44"/>
+          <w:lang w:bidi="fa-IR"/>
+        </w:rPr>
+        <w:t>ell_p</w:t>
+      </w:r>
+      <w:proofErr w:type="spellEnd"/>
+      <w:r>
+        <w:rPr>
+          <w:sz w:val="44"/>
+          <w:szCs w:val="44"/>
+          <w:lang w:bidi="fa-IR"/>
+        </w:rPr>
+        <w:t>) spaces.</w:t>
       </w:r>
     </w:p>
     <w:p>
@@ -17363,15 +17927,35 @@
           <w:szCs w:val="44"/>
           <w:lang w:bidi="fa-IR"/>
         </w:rPr>
-        <w:t>orthogonal to</w:t>
-      </w:r>
-      <w:r>
-        <w:rPr>
-          <w:sz w:val="44"/>
-          <w:szCs w:val="44"/>
-          <w:lang w:bidi="fa-IR"/>
-        </w:rPr>
-        <w:t xml:space="preserve"> y in the sense of </w:t>
+        <w:t xml:space="preserve">orthogonal </w:t>
+      </w:r>
+      <w:proofErr w:type="spellStart"/>
+      <w:r>
+        <w:rPr>
+          <w:b/>
+          <w:bCs/>
+          <w:sz w:val="44"/>
+          <w:szCs w:val="44"/>
+          <w:lang w:bidi="fa-IR"/>
+        </w:rPr>
+        <w:t>to</w:t>
+      </w:r>
+      <w:r>
+        <w:rPr>
+          <w:sz w:val="44"/>
+          <w:szCs w:val="44"/>
+          <w:lang w:bidi="fa-IR"/>
+        </w:rPr>
+        <w:t xml:space="preserve"> y</w:t>
+      </w:r>
+      <w:proofErr w:type="spellEnd"/>
+      <w:r>
+        <w:rPr>
+          <w:sz w:val="44"/>
+          <w:szCs w:val="44"/>
+          <w:lang w:bidi="fa-IR"/>
+        </w:rPr>
+        <w:t xml:space="preserve"> in the sense of </w:t>
       </w:r>
       <w:r>
         <w:rPr>
@@ -17389,7 +17973,25 @@
           <w:szCs w:val="44"/>
           <w:lang w:bidi="fa-IR"/>
         </w:rPr>
-        <w:t xml:space="preserve"> if and only if the norm of x+y is equal to the norm of x−y.</w:t>
+        <w:t xml:space="preserve"> if and only if the norm of </w:t>
+      </w:r>
+      <w:proofErr w:type="spellStart"/>
+      <w:r>
+        <w:rPr>
+          <w:sz w:val="44"/>
+          <w:szCs w:val="44"/>
+          <w:lang w:bidi="fa-IR"/>
+        </w:rPr>
+        <w:t>x+y</w:t>
+      </w:r>
+      <w:proofErr w:type="spellEnd"/>
+      <w:r>
+        <w:rPr>
+          <w:sz w:val="44"/>
+          <w:szCs w:val="44"/>
+          <w:lang w:bidi="fa-IR"/>
+        </w:rPr>
+        <w:t xml:space="preserve"> is equal to the norm of x−y.</w:t>
       </w:r>
       <w:r>
         <w:rPr>
@@ -17407,7 +18009,25 @@
           <w:lang w:bidi="fa-IR"/>
         </w:rPr>
         <w:br/>
-        <w:t>When this condition holds, we write we say that x is orthogonal to y in the isosceles sense.</w:t>
+        <w:t xml:space="preserve">When this condition holds, we write we say that x is orthogonal </w:t>
+      </w:r>
+      <w:proofErr w:type="spellStart"/>
+      <w:r>
+        <w:rPr>
+          <w:sz w:val="44"/>
+          <w:szCs w:val="44"/>
+          <w:lang w:bidi="fa-IR"/>
+        </w:rPr>
+        <w:t>to y</w:t>
+      </w:r>
+      <w:proofErr w:type="spellEnd"/>
+      <w:r>
+        <w:rPr>
+          <w:sz w:val="44"/>
+          <w:szCs w:val="44"/>
+          <w:lang w:bidi="fa-IR"/>
+        </w:rPr>
+        <w:t xml:space="preserve"> in the isosceles sense.</w:t>
       </w:r>
     </w:p>
     <w:p>
@@ -17516,7 +18136,25 @@
           <w:szCs w:val="44"/>
           <w:lang w:bidi="fa-IR"/>
         </w:rPr>
-        <w:t>. Finally, construct the vectors x+y and x−</w:t>
+        <w:t xml:space="preserve">. Finally, construct the vectors </w:t>
+      </w:r>
+      <w:proofErr w:type="spellStart"/>
+      <w:r>
+        <w:rPr>
+          <w:sz w:val="44"/>
+          <w:szCs w:val="44"/>
+          <w:lang w:bidi="fa-IR"/>
+        </w:rPr>
+        <w:t>x+y</w:t>
+      </w:r>
+      <w:proofErr w:type="spellEnd"/>
+      <w:r>
+        <w:rPr>
+          <w:sz w:val="44"/>
+          <w:szCs w:val="44"/>
+          <w:lang w:bidi="fa-IR"/>
+        </w:rPr>
+        <w:t xml:space="preserve"> and x−</w:t>
       </w:r>
       <w:r>
         <w:rPr>
@@ -17541,7 +18179,25 @@
           <w:lang w:bidi="fa-IR"/>
         </w:rPr>
         <w:br/>
-        <w:t>Notice what happens: the vectors x+y and x−</w:t>
+        <w:t xml:space="preserve">Notice what happens: the vectors </w:t>
+      </w:r>
+      <w:proofErr w:type="spellStart"/>
+      <w:r>
+        <w:rPr>
+          <w:sz w:val="44"/>
+          <w:szCs w:val="44"/>
+          <w:lang w:bidi="fa-IR"/>
+        </w:rPr>
+        <w:t>x+y</w:t>
+      </w:r>
+      <w:proofErr w:type="spellEnd"/>
+      <w:r>
+        <w:rPr>
+          <w:sz w:val="44"/>
+          <w:szCs w:val="44"/>
+          <w:lang w:bidi="fa-IR"/>
+        </w:rPr>
+        <w:t xml:space="preserve"> and x−</w:t>
       </w:r>
       <w:r>
         <w:rPr>
@@ -17654,7 +18310,25 @@
           <w:lang w:bidi="fa-IR"/>
         </w:rPr>
         <w:br/>
-        <w:t>We consider the space (\mathbb{R}^2) equipped with the (\ell_1)-norm, and define the vectors (x) and (y) as follows.</w:t>
+        <w:t>We consider the space (\</w:t>
+      </w:r>
+      <w:proofErr w:type="spellStart"/>
+      <w:r>
+        <w:rPr>
+          <w:sz w:val="44"/>
+          <w:szCs w:val="44"/>
+          <w:lang w:bidi="fa-IR"/>
+        </w:rPr>
+        <w:t>mathbb</w:t>
+      </w:r>
+      <w:proofErr w:type="spellEnd"/>
+      <w:r>
+        <w:rPr>
+          <w:sz w:val="44"/>
+          <w:szCs w:val="44"/>
+          <w:lang w:bidi="fa-IR"/>
+        </w:rPr>
+        <w:t>{R}^2) equipped with the (\ell_1)-norm, and define the vectors (x) and (y) as follows.</w:t>
       </w:r>
       <w:r>
         <w:rPr>
@@ -17767,7 +18441,25 @@
           <w:lang w:bidi="fa-IR"/>
         </w:rPr>
         <w:br/>
-        <w:t>We'll work in the same space, (\mathbb{R}^2) equipped with the (\ell_1)-norm. We define the vectors (x), (y), and (z) as shown.</w:t>
+        <w:t>We'll work in the same space, (\</w:t>
+      </w:r>
+      <w:proofErr w:type="spellStart"/>
+      <w:r>
+        <w:rPr>
+          <w:sz w:val="44"/>
+          <w:szCs w:val="44"/>
+          <w:lang w:bidi="fa-IR"/>
+        </w:rPr>
+        <w:t>mathbb</w:t>
+      </w:r>
+      <w:proofErr w:type="spellEnd"/>
+      <w:r>
+        <w:rPr>
+          <w:sz w:val="44"/>
+          <w:szCs w:val="44"/>
+          <w:lang w:bidi="fa-IR"/>
+        </w:rPr>
+        <w:t>{R}^2) equipped with the (\ell_1)-norm. We define the vectors (x), (y), and (z) as shown.</w:t>
       </w:r>
       <w:r>
         <w:rPr>
@@ -17794,7 +18486,25 @@
           <w:szCs w:val="44"/>
           <w:lang w:bidi="fa-IR"/>
         </w:rPr>
-        <w:t xml:space="preserve"> orthogonal to (y+z).</w:t>
+        <w:t xml:space="preserve"> orthogonal to (</w:t>
+      </w:r>
+      <w:proofErr w:type="spellStart"/>
+      <w:r>
+        <w:rPr>
+          <w:sz w:val="44"/>
+          <w:szCs w:val="44"/>
+          <w:lang w:bidi="fa-IR"/>
+        </w:rPr>
+        <w:t>y+z</w:t>
+      </w:r>
+      <w:proofErr w:type="spellEnd"/>
+      <w:r>
+        <w:rPr>
+          <w:sz w:val="44"/>
+          <w:szCs w:val="44"/>
+          <w:lang w:bidi="fa-IR"/>
+        </w:rPr>
+        <w:t>).</w:t>
       </w:r>
       <w:r>
         <w:rPr>
@@ -17849,13 +18559,23 @@
           <w:lang w:bidi="fa-IR"/>
         </w:rPr>
       </w:pPr>
-      <w:r>
-        <w:rPr>
-          <w:sz w:val="44"/>
-          <w:szCs w:val="44"/>
-          <w:lang w:bidi="fa-IR"/>
-        </w:rPr>
-        <w:t>Lets prove that</w:t>
+      <w:proofErr w:type="spellStart"/>
+      <w:r>
+        <w:rPr>
+          <w:sz w:val="44"/>
+          <w:szCs w:val="44"/>
+          <w:lang w:bidi="fa-IR"/>
+        </w:rPr>
+        <w:t>Lets</w:t>
+      </w:r>
+      <w:proofErr w:type="spellEnd"/>
+      <w:r>
+        <w:rPr>
+          <w:sz w:val="44"/>
+          <w:szCs w:val="44"/>
+          <w:lang w:bidi="fa-IR"/>
+        </w:rPr>
+        <w:t xml:space="preserve"> prove that</w:t>
       </w:r>
       <w:r>
         <w:rPr>
@@ -18344,7 +19064,16 @@
           <w:lang w:bidi="fa-IR"/>
         </w:rPr>
         <w:lastRenderedPageBreak/>
-        <w:t>Before introducing the next theorem</w:t>
+        <w:t xml:space="preserve">Before introducing the next </w:t>
+      </w:r>
+      <w:proofErr w:type="spellStart"/>
+      <w:r>
+        <w:rPr>
+          <w:sz w:val="44"/>
+          <w:szCs w:val="44"/>
+          <w:lang w:bidi="fa-IR"/>
+        </w:rPr>
+        <w:t>theorem</w:t>
       </w:r>
       <w:r>
         <w:rPr>
@@ -18360,7 +19089,16 @@
           <w:szCs w:val="44"/>
           <w:lang w:bidi="fa-IR"/>
         </w:rPr>
-        <w:t xml:space="preserve">let's quickly review the concept of a </w:t>
+        <w:t>let's</w:t>
+      </w:r>
+      <w:proofErr w:type="spellEnd"/>
+      <w:r>
+        <w:rPr>
+          <w:sz w:val="44"/>
+          <w:szCs w:val="44"/>
+          <w:lang w:bidi="fa-IR"/>
+        </w:rPr>
+        <w:t xml:space="preserve"> quickly review the concept of a </w:t>
       </w:r>
       <w:r>
         <w:rPr>
@@ -18449,7 +19187,29 @@
           <w:szCs w:val="44"/>
           <w:lang w:bidi="fa-IR"/>
         </w:rPr>
-        <w:t>(i)</w:t>
+        <w:t>(</w:t>
+      </w:r>
+      <w:proofErr w:type="spellStart"/>
+      <w:r>
+        <w:rPr>
+          <w:b/>
+          <w:bCs/>
+          <w:sz w:val="44"/>
+          <w:szCs w:val="44"/>
+          <w:lang w:bidi="fa-IR"/>
+        </w:rPr>
+        <w:t>i</w:t>
+      </w:r>
+      <w:proofErr w:type="spellEnd"/>
+      <w:r>
+        <w:rPr>
+          <w:b/>
+          <w:bCs/>
+          <w:sz w:val="44"/>
+          <w:szCs w:val="44"/>
+          <w:lang w:bidi="fa-IR"/>
+        </w:rPr>
+        <w:t>)</w:t>
       </w:r>
       <w:r>
         <w:rPr>
@@ -18699,6 +19459,7 @@
         </w:rPr>
         <w:t xml:space="preserve">. As you can see, the lengths of </w:t>
       </w:r>
+      <w:proofErr w:type="spellStart"/>
       <w:r>
         <w:rPr>
           <w:b/>
@@ -18709,6 +19470,7 @@
         </w:rPr>
         <w:t>x+y</w:t>
       </w:r>
+      <w:proofErr w:type="spellEnd"/>
       <w:r>
         <w:rPr>
           <w:sz w:val="44"/>
@@ -19323,7 +20085,25 @@
           <w:szCs w:val="44"/>
           <w:lang w:bidi="fa-IR"/>
         </w:rPr>
-        <w:t>If we consider two vectors (x) and (y), and draw these two vectors together with their sum (x+y), we obtain a triangle.</w:t>
+        <w:t>If we consider two vectors (x) and (y), and draw these two vectors together with their sum (</w:t>
+      </w:r>
+      <w:proofErr w:type="spellStart"/>
+      <w:r>
+        <w:rPr>
+          <w:sz w:val="44"/>
+          <w:szCs w:val="44"/>
+          <w:lang w:bidi="fa-IR"/>
+        </w:rPr>
+        <w:t>x+y</w:t>
+      </w:r>
+      <w:proofErr w:type="spellEnd"/>
+      <w:r>
+        <w:rPr>
+          <w:sz w:val="44"/>
+          <w:szCs w:val="44"/>
+          <w:lang w:bidi="fa-IR"/>
+        </w:rPr>
+        <w:t>), we obtain a triangle.</w:t>
       </w:r>
     </w:p>
     <w:p>
@@ -19425,7 +20205,25 @@
           <w:szCs w:val="44"/>
           <w:lang w:bidi="fa-IR"/>
         </w:rPr>
-        <w:t>Consider the space (\mathbb{R}^2) equipped with the given norm, and let the vectors (x) and (y) be defined as shown.</w:t>
+        <w:t>Consider the space (\</w:t>
+      </w:r>
+      <w:proofErr w:type="spellStart"/>
+      <w:r>
+        <w:rPr>
+          <w:sz w:val="44"/>
+          <w:szCs w:val="44"/>
+          <w:lang w:bidi="fa-IR"/>
+        </w:rPr>
+        <w:t>mathbb</w:t>
+      </w:r>
+      <w:proofErr w:type="spellEnd"/>
+      <w:r>
+        <w:rPr>
+          <w:sz w:val="44"/>
+          <w:szCs w:val="44"/>
+          <w:lang w:bidi="fa-IR"/>
+        </w:rPr>
+        <w:t>{R}^2) equipped with the given norm, and let the vectors (x) and (y) be defined as shown.</w:t>
       </w:r>
     </w:p>
     <w:p>
@@ -19616,7 +20414,25 @@
           <w:szCs w:val="44"/>
           <w:lang w:bidi="fa-IR"/>
         </w:rPr>
-        <w:t>Consider the space (\mathbb{R}^2) equipped with the infinity norm, and let (x), (y), and (z) be the three vectors defined as shown.</w:t>
+        <w:t>Consider the space (\</w:t>
+      </w:r>
+      <w:proofErr w:type="spellStart"/>
+      <w:r>
+        <w:rPr>
+          <w:sz w:val="44"/>
+          <w:szCs w:val="44"/>
+          <w:lang w:bidi="fa-IR"/>
+        </w:rPr>
+        <w:t>mathbb</w:t>
+      </w:r>
+      <w:proofErr w:type="spellEnd"/>
+      <w:r>
+        <w:rPr>
+          <w:sz w:val="44"/>
+          <w:szCs w:val="44"/>
+          <w:lang w:bidi="fa-IR"/>
+        </w:rPr>
+        <w:t>{R}^2) equipped with the infinity norm, and let (x), (y), and (z) be the three vectors defined as shown.</w:t>
       </w:r>
     </w:p>
     <w:p>
@@ -19651,7 +20467,25 @@
           <w:szCs w:val="44"/>
           <w:lang w:bidi="fa-IR"/>
         </w:rPr>
-        <w:t>However, when we consider the sum (y+z), we can see that the required Pythagorean relation is no longer satisfied</w:t>
+        <w:t>However, when we consider the sum (</w:t>
+      </w:r>
+      <w:proofErr w:type="spellStart"/>
+      <w:r>
+        <w:rPr>
+          <w:sz w:val="44"/>
+          <w:szCs w:val="44"/>
+          <w:lang w:bidi="fa-IR"/>
+        </w:rPr>
+        <w:t>y+z</w:t>
+      </w:r>
+      <w:proofErr w:type="spellEnd"/>
+      <w:r>
+        <w:rPr>
+          <w:sz w:val="44"/>
+          <w:szCs w:val="44"/>
+          <w:lang w:bidi="fa-IR"/>
+        </w:rPr>
+        <w:t>), we can see that the required Pythagorean relation is no longer satisfied</w:t>
       </w:r>
       <w:r>
         <w:rPr>
@@ -19749,7 +20583,43 @@
           <w:szCs w:val="44"/>
           <w:lang w:bidi="fa-IR"/>
         </w:rPr>
-        <w:t>We want to show that for every (x,y\in X) with (x\neq0), there exists a scalar (a\in\mathbb{R}) such that</w:t>
+        <w:t>We want to show that for every (</w:t>
+      </w:r>
+      <w:proofErr w:type="spellStart"/>
+      <w:r>
+        <w:rPr>
+          <w:sz w:val="44"/>
+          <w:szCs w:val="44"/>
+          <w:lang w:bidi="fa-IR"/>
+        </w:rPr>
+        <w:t>x,y</w:t>
+      </w:r>
+      <w:proofErr w:type="spellEnd"/>
+      <w:r>
+        <w:rPr>
+          <w:sz w:val="44"/>
+          <w:szCs w:val="44"/>
+          <w:lang w:bidi="fa-IR"/>
+        </w:rPr>
+        <w:t>\in X) with (x\neq0), there exists a scalar (a\in\</w:t>
+      </w:r>
+      <w:proofErr w:type="spellStart"/>
+      <w:r>
+        <w:rPr>
+          <w:sz w:val="44"/>
+          <w:szCs w:val="44"/>
+          <w:lang w:bidi="fa-IR"/>
+        </w:rPr>
+        <w:t>mathbb</w:t>
+      </w:r>
+      <w:proofErr w:type="spellEnd"/>
+      <w:r>
+        <w:rPr>
+          <w:sz w:val="44"/>
+          <w:szCs w:val="44"/>
+          <w:lang w:bidi="fa-IR"/>
+        </w:rPr>
+        <w:t>{R}) such that</w:t>
       </w:r>
     </w:p>
     <w:p>
@@ -19791,7 +20661,25 @@
           <w:szCs w:val="44"/>
           <w:lang w:bidi="fa-IR"/>
         </w:rPr>
-        <w:t>(ax+y).</w:t>
+        <w:t>(</w:t>
+      </w:r>
+      <w:proofErr w:type="spellStart"/>
+      <w:r>
+        <w:rPr>
+          <w:sz w:val="44"/>
+          <w:szCs w:val="44"/>
+          <w:lang w:bidi="fa-IR"/>
+        </w:rPr>
+        <w:t>ax+y</w:t>
+      </w:r>
+      <w:proofErr w:type="spellEnd"/>
+      <w:r>
+        <w:rPr>
+          <w:sz w:val="44"/>
+          <w:szCs w:val="44"/>
+          <w:lang w:bidi="fa-IR"/>
+        </w:rPr>
+        <w:t>).</w:t>
       </w:r>
       <w:r>
         <w:rPr>
@@ -20471,17 +21359,113 @@
           <w:szCs w:val="44"/>
           <w:lang w:bidi="fa-IR"/>
         </w:rPr>
-        <w:t xml:space="preserve">Notice that the </w:t>
-      </w:r>
-      <w:r>
-        <w:rPr>
-          <w:b/>
-          <w:bCs/>
-          <w:sz w:val="44"/>
-          <w:szCs w:val="44"/>
-          <w:lang w:bidi="fa-IR"/>
-        </w:rPr>
-        <w:t>blue</w:t>
+        <w:t>Now, consider the two blue and green vectors.</w:t>
+      </w:r>
+    </w:p>
+    <w:p>
+      <w:pPr>
+        <w:rPr>
+          <w:sz w:val="44"/>
+          <w:szCs w:val="44"/>
+          <w:lang w:bidi="fa-IR"/>
+        </w:rPr>
+      </w:pPr>
+      <w:r>
+        <w:rPr>
+          <w:sz w:val="44"/>
+          <w:szCs w:val="44"/>
+          <w:lang w:bidi="fa-IR"/>
+        </w:rPr>
+        <w:t>Any vector that lies in the plane spanned by these two vectors can be expressed as a linear combination of them. For example, the red vector shown here lies in the same plane, so it is linearly dependent on the blue and green vectors.</w:t>
+      </w:r>
+    </w:p>
+    <w:p>
+      <w:pPr>
+        <w:rPr>
+          <w:sz w:val="44"/>
+          <w:szCs w:val="44"/>
+          <w:lang w:bidi="fa-IR"/>
+        </w:rPr>
+      </w:pPr>
+      <w:r>
+        <w:rPr>
+          <w:sz w:val="44"/>
+          <w:szCs w:val="44"/>
+          <w:lang w:bidi="fa-IR"/>
+        </w:rPr>
+        <w:lastRenderedPageBreak/>
+        <w:t>However, if we move the red vector out of this plane, it can no longer be written as a linear combination of the other two vectors.</w:t>
+      </w:r>
+    </w:p>
+    <w:p>
+      <w:pPr>
+        <w:rPr>
+          <w:sz w:val="44"/>
+          <w:szCs w:val="44"/>
+          <w:lang w:bidi="fa-IR"/>
+        </w:rPr>
+      </w:pPr>
+      <w:r>
+        <w:rPr>
+          <w:sz w:val="44"/>
+          <w:szCs w:val="44"/>
+          <w:lang w:bidi="fa-IR"/>
+        </w:rPr>
+        <w:t>In that case, the red vector becomes linearly independent of the blue and green vectors.</w:t>
+      </w:r>
+    </w:p>
+    <w:p>
+      <w:pPr>
+        <w:rPr>
+          <w:sz w:val="44"/>
+          <w:szCs w:val="44"/>
+          <w:lang w:bidi="fa-IR"/>
+        </w:rPr>
+      </w:pPr>
+      <w:r>
+        <w:rPr>
+          <w:rFonts w:hint="cs"/>
+          <w:sz w:val="44"/>
+          <w:szCs w:val="44"/>
+          <w:rtl/>
+          <w:lang w:bidi="fa-IR"/>
+        </w:rPr>
+        <w:t xml:space="preserve"> </w:t>
+      </w:r>
+      <w:r>
+        <w:rPr>
+          <w:sz w:val="44"/>
+          <w:szCs w:val="44"/>
+          <w:lang w:bidi="fa-IR"/>
+        </w:rPr>
+        <w:t>5-10:</w:t>
+      </w:r>
+    </w:p>
+    <w:p>
+      <w:pPr>
+        <w:rPr>
+          <w:sz w:val="44"/>
+          <w:szCs w:val="44"/>
+          <w:lang w:bidi="fa-IR"/>
+        </w:rPr>
+      </w:pPr>
+      <w:r>
+        <w:rPr>
+          <w:sz w:val="44"/>
+          <w:szCs w:val="44"/>
+          <w:lang w:bidi="fa-IR"/>
+        </w:rPr>
+        <w:t xml:space="preserve">Now, let's investigate the relationship between </w:t>
+      </w:r>
+      <w:r>
+        <w:rPr>
+          <w:b/>
+          <w:bCs/>
+          <w:sz w:val="44"/>
+          <w:szCs w:val="44"/>
+          <w:lang w:bidi="fa-IR"/>
+        </w:rPr>
+        <w:t>Pythagorean Orthogonality</w:t>
       </w:r>
       <w:r>
         <w:rPr>
@@ -20499,32 +21483,100 @@
           <w:szCs w:val="44"/>
           <w:lang w:bidi="fa-IR"/>
         </w:rPr>
-        <w:t>green</w:t>
-      </w:r>
-      <w:r>
-        <w:rPr>
-          <w:sz w:val="44"/>
-          <w:szCs w:val="44"/>
-          <w:lang w:bidi="fa-IR"/>
-        </w:rPr>
-        <w:t xml:space="preserve"> vectors are linearly dependent. </w:t>
-      </w:r>
-      <w:r>
-        <w:rPr>
-          <w:color w:val="EE0000"/>
-          <w:sz w:val="44"/>
-          <w:szCs w:val="44"/>
-          <w:lang w:bidi="fa-IR"/>
-        </w:rPr>
-        <w:t>They lie on the same line, so one is simply a scalar multiple of the other</w:t>
-      </w:r>
-      <w:r>
-        <w:rPr>
-          <w:sz w:val="44"/>
-          <w:szCs w:val="44"/>
-          <w:lang w:bidi="fa-IR"/>
-        </w:rPr>
-        <w:t>. In other words, they point in the same direction, differing only in magnitude and possibly orientation.</w:t>
+        <w:t>linear independence</w:t>
+      </w:r>
+      <w:r>
+        <w:rPr>
+          <w:sz w:val="44"/>
+          <w:szCs w:val="44"/>
+          <w:lang w:bidi="fa-IR"/>
+        </w:rPr>
+        <w:t>.</w:t>
+      </w:r>
+    </w:p>
+    <w:p>
+      <w:pPr>
+        <w:rPr>
+          <w:sz w:val="44"/>
+          <w:szCs w:val="44"/>
+          <w:lang w:bidi="fa-IR"/>
+        </w:rPr>
+      </w:pPr>
+      <w:r>
+        <w:rPr>
+          <w:sz w:val="44"/>
+          <w:szCs w:val="44"/>
+          <w:lang w:bidi="fa-IR"/>
+        </w:rPr>
+        <w:t>We will consider this question in two different settings: first over the real numbers, and then over the complex numbers.</w:t>
+      </w:r>
+    </w:p>
+    <w:p>
+      <w:pPr>
+        <w:rPr>
+          <w:sz w:val="44"/>
+          <w:szCs w:val="44"/>
+          <w:lang w:bidi="fa-IR"/>
+        </w:rPr>
+      </w:pPr>
+      <w:r>
+        <w:rPr>
+          <w:sz w:val="44"/>
+          <w:szCs w:val="44"/>
+          <w:lang w:bidi="fa-IR"/>
+        </w:rPr>
+        <w:t>Let's begin with the real case.</w:t>
+      </w:r>
+    </w:p>
+    <w:p>
+      <w:pPr>
+        <w:rPr>
+          <w:sz w:val="44"/>
+          <w:szCs w:val="44"/>
+          <w:lang w:bidi="fa-IR"/>
+        </w:rPr>
+      </w:pPr>
+      <w:r>
+        <w:rPr>
+          <w:sz w:val="44"/>
+          <w:szCs w:val="44"/>
+          <w:lang w:bidi="fa-IR"/>
+        </w:rPr>
+        <w:t>We want to prove that if two vectors are Pythagorean orthogonal, then they must be linearly independent.</w:t>
+      </w:r>
+    </w:p>
+    <w:p>
+      <w:pPr>
+        <w:rPr>
+          <w:sz w:val="44"/>
+          <w:szCs w:val="44"/>
+          <w:lang w:bidi="fa-IR"/>
+        </w:rPr>
+      </w:pPr>
+      <w:r>
+        <w:rPr>
+          <w:sz w:val="44"/>
+          <w:szCs w:val="44"/>
+          <w:lang w:bidi="fa-IR"/>
+        </w:rPr>
+        <w:t xml:space="preserve">We will use a proof by </w:t>
+      </w:r>
+      <w:r>
+        <w:rPr>
+          <w:sz w:val="44"/>
+          <w:szCs w:val="44"/>
+          <w:highlight w:val="yellow"/>
+          <w:lang w:bidi="fa-IR"/>
+        </w:rPr>
+        <w:t>contradiction</w:t>
+      </w:r>
+      <w:r>
+        <w:rPr>
+          <w:sz w:val="44"/>
+          <w:szCs w:val="44"/>
+          <w:lang w:bidi="fa-IR"/>
+        </w:rPr>
+        <w:t>.</w:t>
       </w:r>
     </w:p>
     <w:p>
@@ -20542,43 +21594,768 @@
           <w:lang w:bidi="fa-IR"/>
         </w:rPr>
         <w:lastRenderedPageBreak/>
-        <w:t xml:space="preserve">The </w:t>
-      </w:r>
-      <w:r>
-        <w:rPr>
-          <w:b/>
-          <w:bCs/>
-          <w:sz w:val="44"/>
-          <w:szCs w:val="44"/>
-          <w:lang w:bidi="fa-IR"/>
-        </w:rPr>
-        <w:t>red</w:t>
-      </w:r>
-      <w:r>
-        <w:rPr>
-          <w:sz w:val="44"/>
-          <w:szCs w:val="44"/>
-          <w:lang w:bidi="fa-IR"/>
-        </w:rPr>
-        <w:t xml:space="preserve"> vector, however, points in a different direction. It cannot be written as a scalar multiple of either the blue or the green vector, so it is linearly independent of both.</w:t>
-      </w:r>
-    </w:p>
-    <w:p>
-      <w:pPr>
-        <w:rPr>
-          <w:sz w:val="44"/>
-          <w:szCs w:val="44"/>
-          <w:lang w:bidi="fa-IR"/>
-        </w:rPr>
-      </w:pPr>
-      <w:r>
-        <w:rPr>
-          <w:sz w:val="44"/>
-          <w:szCs w:val="44"/>
-          <w:lang w:bidi="fa-IR"/>
-        </w:rPr>
-        <w:t>In two-dimensional space, this is exactly what we need to span the entire plane: two vectors that point in different directions and are linearly independent.</w:t>
-      </w:r>
+        <w:t xml:space="preserve">Assume, on the </w:t>
+      </w:r>
+      <w:r>
+        <w:rPr>
+          <w:sz w:val="44"/>
+          <w:szCs w:val="44"/>
+          <w:highlight w:val="yellow"/>
+          <w:lang w:bidi="fa-IR"/>
+        </w:rPr>
+        <w:t>contrary</w:t>
+      </w:r>
+      <w:r>
+        <w:rPr>
+          <w:sz w:val="44"/>
+          <w:szCs w:val="44"/>
+          <w:lang w:bidi="fa-IR"/>
+        </w:rPr>
+        <w:t>, that (x) and (y) are linearly dependent. Then there exists a real scalar (\lambda) such that</w:t>
+      </w:r>
+    </w:p>
+    <w:p>
+      <w:pPr>
+        <w:rPr>
+          <w:sz w:val="44"/>
+          <w:szCs w:val="44"/>
+          <w:lang w:bidi="fa-IR"/>
+        </w:rPr>
+      </w:pPr>
+      <w:r>
+        <w:rPr>
+          <w:sz w:val="44"/>
+          <w:szCs w:val="44"/>
+          <w:lang w:bidi="fa-IR"/>
+        </w:rPr>
+        <w:t>[</w:t>
+      </w:r>
+      <w:r>
+        <w:rPr>
+          <w:sz w:val="44"/>
+          <w:szCs w:val="44"/>
+          <w:lang w:bidi="fa-IR"/>
+        </w:rPr>
+        <w:br/>
+        <w:t>y=\lambda x.</w:t>
+      </w:r>
+      <w:r>
+        <w:rPr>
+          <w:sz w:val="44"/>
+          <w:szCs w:val="44"/>
+          <w:lang w:bidi="fa-IR"/>
+        </w:rPr>
+        <w:br/>
+        <w:t>]</w:t>
+      </w:r>
+    </w:p>
+    <w:p>
+      <w:pPr>
+        <w:rPr>
+          <w:sz w:val="44"/>
+          <w:szCs w:val="44"/>
+          <w:lang w:bidi="fa-IR"/>
+        </w:rPr>
+      </w:pPr>
+      <w:r>
+        <w:rPr>
+          <w:sz w:val="44"/>
+          <w:szCs w:val="44"/>
+          <w:lang w:bidi="fa-IR"/>
+        </w:rPr>
+        <w:t>Since (x</w:t>
+      </w:r>
+      <w:r>
+        <w:rPr>
+          <w:sz w:val="44"/>
+          <w:szCs w:val="44"/>
+          <w:lang w:bidi="fa-IR"/>
+        </w:rPr>
+        <w:t xml:space="preserve"> is orthogonal to</w:t>
+      </w:r>
+      <w:r>
+        <w:rPr>
+          <w:sz w:val="44"/>
+          <w:szCs w:val="44"/>
+          <w:lang w:bidi="fa-IR"/>
+        </w:rPr>
+        <w:t xml:space="preserve"> y), the defining equality of Pythagorean Orthogonality must hold. Substituting (y=\lambda x) into this equality, we obtain the expression shown on the screen.</w:t>
+      </w:r>
+    </w:p>
+    <w:p>
+      <w:pPr>
+        <w:rPr>
+          <w:sz w:val="44"/>
+          <w:szCs w:val="44"/>
+          <w:lang w:bidi="fa-IR"/>
+        </w:rPr>
+      </w:pPr>
+      <w:r>
+        <w:rPr>
+          <w:sz w:val="44"/>
+          <w:szCs w:val="44"/>
+          <w:lang w:bidi="fa-IR"/>
+        </w:rPr>
+        <w:t>After simplifying</w:t>
+      </w:r>
+      <w:r>
+        <w:rPr>
+          <w:sz w:val="44"/>
+          <w:szCs w:val="44"/>
+          <w:lang w:bidi="fa-IR"/>
+        </w:rPr>
+        <w:t xml:space="preserve"> and </w:t>
+      </w:r>
+      <w:r>
+        <w:rPr>
+          <w:sz w:val="44"/>
+          <w:szCs w:val="44"/>
+          <w:lang w:bidi="fa-IR"/>
+        </w:rPr>
+        <w:t xml:space="preserve">Because (\lambda) is a real number, </w:t>
+      </w:r>
+      <w:r>
+        <w:rPr>
+          <w:sz w:val="44"/>
+          <w:szCs w:val="44"/>
+          <w:lang w:bidi="fa-IR"/>
+        </w:rPr>
+        <w:t>final</w:t>
+      </w:r>
+      <w:r>
+        <w:rPr>
+          <w:sz w:val="44"/>
+          <w:szCs w:val="44"/>
+          <w:lang w:bidi="fa-IR"/>
+        </w:rPr>
+        <w:t xml:space="preserve"> equality is satisfied only when</w:t>
+      </w:r>
+    </w:p>
+    <w:p>
+      <w:pPr>
+        <w:rPr>
+          <w:sz w:val="44"/>
+          <w:szCs w:val="44"/>
+          <w:lang w:bidi="fa-IR"/>
+        </w:rPr>
+      </w:pPr>
+      <w:r>
+        <w:rPr>
+          <w:sz w:val="44"/>
+          <w:szCs w:val="44"/>
+          <w:lang w:bidi="fa-IR"/>
+        </w:rPr>
+        <w:t>[</w:t>
+      </w:r>
+      <w:r>
+        <w:rPr>
+          <w:sz w:val="44"/>
+          <w:szCs w:val="44"/>
+          <w:lang w:bidi="fa-IR"/>
+        </w:rPr>
+        <w:br/>
+        <w:t>\lambda=0.</w:t>
+      </w:r>
+      <w:r>
+        <w:rPr>
+          <w:sz w:val="44"/>
+          <w:szCs w:val="44"/>
+          <w:lang w:bidi="fa-IR"/>
+        </w:rPr>
+        <w:br/>
+        <w:t>]</w:t>
+      </w:r>
+    </w:p>
+    <w:p>
+      <w:pPr>
+        <w:rPr>
+          <w:sz w:val="44"/>
+          <w:szCs w:val="44"/>
+          <w:lang w:bidi="fa-IR"/>
+        </w:rPr>
+      </w:pPr>
+      <w:r>
+        <w:rPr>
+          <w:sz w:val="44"/>
+          <w:szCs w:val="44"/>
+          <w:lang w:bidi="fa-IR"/>
+        </w:rPr>
+        <w:t>Consequently,</w:t>
+      </w:r>
+    </w:p>
+    <w:p>
+      <w:pPr>
+        <w:rPr>
+          <w:sz w:val="44"/>
+          <w:szCs w:val="44"/>
+          <w:lang w:bidi="fa-IR"/>
+        </w:rPr>
+      </w:pPr>
+      <w:r>
+        <w:rPr>
+          <w:sz w:val="44"/>
+          <w:szCs w:val="44"/>
+          <w:lang w:bidi="fa-IR"/>
+        </w:rPr>
+        <w:t>[</w:t>
+      </w:r>
+      <w:r>
+        <w:rPr>
+          <w:sz w:val="44"/>
+          <w:szCs w:val="44"/>
+          <w:lang w:bidi="fa-IR"/>
+        </w:rPr>
+        <w:br/>
+        <w:t>y=0,</w:t>
+      </w:r>
+      <w:r>
+        <w:rPr>
+          <w:sz w:val="44"/>
+          <w:szCs w:val="44"/>
+          <w:lang w:bidi="fa-IR"/>
+        </w:rPr>
+        <w:br/>
+        <w:t>]</w:t>
+      </w:r>
+    </w:p>
+    <w:p>
+      <w:pPr>
+        <w:rPr>
+          <w:sz w:val="44"/>
+          <w:szCs w:val="44"/>
+          <w:lang w:bidi="fa-IR"/>
+        </w:rPr>
+      </w:pPr>
+      <w:r>
+        <w:rPr>
+          <w:sz w:val="44"/>
+          <w:szCs w:val="44"/>
+          <w:lang w:bidi="fa-IR"/>
+        </w:rPr>
+        <w:lastRenderedPageBreak/>
+        <w:t xml:space="preserve">which </w:t>
+      </w:r>
+      <w:r>
+        <w:rPr>
+          <w:sz w:val="44"/>
+          <w:szCs w:val="44"/>
+          <w:highlight w:val="yellow"/>
+          <w:lang w:bidi="fa-IR"/>
+        </w:rPr>
+        <w:t>contradicts</w:t>
+      </w:r>
+      <w:r>
+        <w:rPr>
+          <w:sz w:val="44"/>
+          <w:szCs w:val="44"/>
+          <w:lang w:bidi="fa-IR"/>
+        </w:rPr>
+        <w:t xml:space="preserve"> our assumption that the vectors are linearly dependent</w:t>
+      </w:r>
+      <w:r>
+        <w:rPr>
+          <w:sz w:val="44"/>
+          <w:szCs w:val="44"/>
+          <w:lang w:bidi="fa-IR"/>
+        </w:rPr>
+        <w:t xml:space="preserve"> </w:t>
+      </w:r>
+      <w:r>
+        <w:rPr>
+          <w:sz w:val="44"/>
+          <w:szCs w:val="44"/>
+          <w:lang w:bidi="fa-IR"/>
+        </w:rPr>
+        <w:t>.</w:t>
+      </w:r>
+    </w:p>
+    <w:p>
+      <w:pPr>
+        <w:rPr>
+          <w:sz w:val="44"/>
+          <w:szCs w:val="44"/>
+          <w:lang w:bidi="fa-IR"/>
+        </w:rPr>
+      </w:pPr>
+      <w:r>
+        <w:rPr>
+          <w:sz w:val="44"/>
+          <w:szCs w:val="44"/>
+          <w:lang w:bidi="fa-IR"/>
+        </w:rPr>
+        <w:t>Therefore, our assumption is false, and we conclude that over the real numbers, Pythagorean orthogonal vectors are necessarily linearly independent.</w:t>
+      </w:r>
+    </w:p>
+    <w:p>
+      <w:pPr>
+        <w:rPr>
+          <w:sz w:val="44"/>
+          <w:szCs w:val="44"/>
+          <w:lang w:bidi="fa-IR"/>
+        </w:rPr>
+      </w:pPr>
+      <w:r>
+        <w:rPr>
+          <w:sz w:val="44"/>
+          <w:szCs w:val="44"/>
+          <w:lang w:bidi="fa-IR"/>
+        </w:rPr>
+        <w:t>Now, let's see what happens over the complex numbers.</w:t>
+      </w:r>
+    </w:p>
+    <w:p>
+      <w:pPr>
+        <w:rPr>
+          <w:sz w:val="44"/>
+          <w:szCs w:val="44"/>
+          <w:lang w:bidi="fa-IR"/>
+        </w:rPr>
+      </w:pPr>
+      <w:r>
+        <w:rPr>
+          <w:sz w:val="44"/>
+          <w:szCs w:val="44"/>
+          <w:lang w:bidi="fa-IR"/>
+        </w:rPr>
+        <w:t>Surprisingly, the same conclusion is no longer true.</w:t>
+      </w:r>
+    </w:p>
+    <w:p>
+      <w:pPr>
+        <w:rPr>
+          <w:sz w:val="44"/>
+          <w:szCs w:val="44"/>
+          <w:lang w:bidi="fa-IR"/>
+        </w:rPr>
+      </w:pPr>
+      <w:r>
+        <w:rPr>
+          <w:sz w:val="44"/>
+          <w:szCs w:val="44"/>
+          <w:lang w:bidi="fa-IR"/>
+        </w:rPr>
+        <w:t>Consider the simple example</w:t>
+      </w:r>
+    </w:p>
+    <w:p>
+      <w:pPr>
+        <w:rPr>
+          <w:sz w:val="44"/>
+          <w:szCs w:val="44"/>
+          <w:lang w:bidi="fa-IR"/>
+        </w:rPr>
+      </w:pPr>
+      <w:r>
+        <w:rPr>
+          <w:sz w:val="44"/>
+          <w:szCs w:val="44"/>
+          <w:lang w:bidi="fa-IR"/>
+        </w:rPr>
+        <w:t>[</w:t>
+      </w:r>
+      <w:r>
+        <w:rPr>
+          <w:sz w:val="44"/>
+          <w:szCs w:val="44"/>
+          <w:lang w:bidi="fa-IR"/>
+        </w:rPr>
+        <w:br/>
+        <w:t>y=ix.</w:t>
+      </w:r>
+      <w:r>
+        <w:rPr>
+          <w:sz w:val="44"/>
+          <w:szCs w:val="44"/>
+          <w:lang w:bidi="fa-IR"/>
+        </w:rPr>
+        <w:br/>
+        <w:t>]</w:t>
+      </w:r>
+    </w:p>
+    <w:p>
+      <w:pPr>
+        <w:rPr>
+          <w:sz w:val="44"/>
+          <w:szCs w:val="44"/>
+          <w:lang w:bidi="fa-IR"/>
+        </w:rPr>
+      </w:pPr>
+      <w:r>
+        <w:rPr>
+          <w:sz w:val="44"/>
+          <w:szCs w:val="44"/>
+          <w:lang w:bidi="fa-IR"/>
+        </w:rPr>
+        <w:t>Clearly, (y) is just a scalar multiple of (x), so the two vectors are linearly dependent.</w:t>
+      </w:r>
+    </w:p>
+    <w:p>
+      <w:pPr>
+        <w:rPr>
+          <w:sz w:val="44"/>
+          <w:szCs w:val="44"/>
+          <w:lang w:bidi="fa-IR"/>
+        </w:rPr>
+      </w:pPr>
+      <w:r>
+        <w:rPr>
+          <w:sz w:val="44"/>
+          <w:szCs w:val="44"/>
+          <w:lang w:bidi="fa-IR"/>
+        </w:rPr>
+        <w:t>However, substituting (y=ix) into the definition of Pythagorean Orthogonality, we obtain exactly the equalities shown on the screen.</w:t>
+      </w:r>
+    </w:p>
+    <w:p>
+      <w:pPr>
+        <w:rPr>
+          <w:sz w:val="44"/>
+          <w:szCs w:val="44"/>
+          <w:lang w:bidi="fa-IR"/>
+        </w:rPr>
+      </w:pPr>
+      <w:r>
+        <w:rPr>
+          <w:sz w:val="44"/>
+          <w:szCs w:val="44"/>
+          <w:lang w:bidi="fa-IR"/>
+        </w:rPr>
+        <w:t>Both sides evaluate to</w:t>
+      </w:r>
+      <w:r>
+        <w:rPr>
+          <w:sz w:val="44"/>
+          <w:szCs w:val="44"/>
+          <w:lang w:bidi="fa-IR"/>
+        </w:rPr>
+        <w:t xml:space="preserve"> the same result .</w:t>
+      </w:r>
+    </w:p>
+    <w:p>
+      <w:pPr>
+        <w:rPr>
+          <w:sz w:val="44"/>
+          <w:szCs w:val="44"/>
+          <w:lang w:bidi="fa-IR"/>
+        </w:rPr>
+      </w:pPr>
+      <w:r>
+        <w:rPr>
+          <w:sz w:val="44"/>
+          <w:szCs w:val="44"/>
+          <w:lang w:bidi="fa-IR"/>
+        </w:rPr>
+        <w:lastRenderedPageBreak/>
+        <w:t>Hence,</w:t>
+      </w:r>
+    </w:p>
+    <w:p>
+      <w:pPr>
+        <w:rPr>
+          <w:sz w:val="44"/>
+          <w:szCs w:val="44"/>
+          <w:lang w:bidi="fa-IR"/>
+        </w:rPr>
+      </w:pPr>
+      <w:r>
+        <w:rPr>
+          <w:sz w:val="44"/>
+          <w:szCs w:val="44"/>
+          <w:lang w:bidi="fa-IR"/>
+        </w:rPr>
+        <w:t>[</w:t>
+      </w:r>
+      <w:r>
+        <w:rPr>
+          <w:sz w:val="44"/>
+          <w:szCs w:val="44"/>
+          <w:lang w:bidi="fa-IR"/>
+        </w:rPr>
+        <w:br/>
+        <w:t>x</w:t>
+      </w:r>
+      <w:r>
+        <w:rPr>
+          <w:sz w:val="44"/>
+          <w:szCs w:val="44"/>
+          <w:lang w:bidi="fa-IR"/>
+        </w:rPr>
+        <w:t xml:space="preserve"> is orthogonal to</w:t>
+      </w:r>
+      <w:r>
+        <w:rPr>
+          <w:sz w:val="44"/>
+          <w:szCs w:val="44"/>
+          <w:lang w:bidi="fa-IR"/>
+        </w:rPr>
+        <w:t xml:space="preserve"> ix,</w:t>
+      </w:r>
+      <w:r>
+        <w:rPr>
+          <w:sz w:val="44"/>
+          <w:szCs w:val="44"/>
+          <w:lang w:bidi="fa-IR"/>
+        </w:rPr>
+        <w:br/>
+        <w:t>]</w:t>
+      </w:r>
+    </w:p>
+    <w:p>
+      <w:pPr>
+        <w:rPr>
+          <w:sz w:val="44"/>
+          <w:szCs w:val="44"/>
+          <w:lang w:bidi="fa-IR"/>
+        </w:rPr>
+      </w:pPr>
+      <w:r>
+        <w:rPr>
+          <w:sz w:val="44"/>
+          <w:szCs w:val="44"/>
+          <w:lang w:bidi="fa-IR"/>
+        </w:rPr>
+        <w:t>even though (x) and (ix) are linearly dependent.</w:t>
+      </w:r>
+    </w:p>
+    <w:p>
+      <w:pPr>
+        <w:rPr>
+          <w:sz w:val="44"/>
+          <w:szCs w:val="44"/>
+          <w:lang w:bidi="fa-IR"/>
+        </w:rPr>
+      </w:pPr>
+      <w:r>
+        <w:rPr>
+          <w:sz w:val="44"/>
+          <w:szCs w:val="44"/>
+          <w:lang w:bidi="fa-IR"/>
+        </w:rPr>
+        <w:t>This counterexample shows that the relationship between Pythagorean Orthogonality and linear independence holds over the real numbers, but does not extend to the complex case.</w:t>
+      </w:r>
+    </w:p>
+    <w:p>
+      <w:pPr>
+        <w:rPr>
+          <w:sz w:val="44"/>
+          <w:szCs w:val="44"/>
+          <w:lang w:bidi="fa-IR"/>
+        </w:rPr>
+      </w:pPr>
+      <w:r>
+        <w:rPr>
+          <w:sz w:val="44"/>
+          <w:szCs w:val="44"/>
+          <w:lang w:bidi="fa-IR"/>
+        </w:rPr>
+        <w:t>5-11:</w:t>
+      </w:r>
+    </w:p>
+    <w:p>
+      <w:pPr>
+        <w:rPr>
+          <w:sz w:val="44"/>
+          <w:szCs w:val="44"/>
+          <w:lang w:bidi="fa-IR"/>
+        </w:rPr>
+      </w:pPr>
+      <w:r>
+        <w:rPr>
+          <w:sz w:val="44"/>
+          <w:szCs w:val="44"/>
+          <w:lang w:bidi="fa-IR"/>
+        </w:rPr>
+        <w:t xml:space="preserve"> </w:t>
+      </w:r>
+      <w:r>
+        <w:rPr>
+          <w:sz w:val="44"/>
+          <w:szCs w:val="44"/>
+          <w:lang w:bidi="fa-IR"/>
+        </w:rPr>
+        <w:t xml:space="preserve">In this video, we explored </w:t>
+      </w:r>
+      <w:r>
+        <w:rPr>
+          <w:b/>
+          <w:bCs/>
+          <w:sz w:val="44"/>
+          <w:szCs w:val="44"/>
+          <w:lang w:bidi="fa-IR"/>
+        </w:rPr>
+        <w:t>Pythagorean Orthogonality</w:t>
+      </w:r>
+      <w:r>
+        <w:rPr>
+          <w:sz w:val="44"/>
+          <w:szCs w:val="44"/>
+          <w:lang w:bidi="fa-IR"/>
+        </w:rPr>
+        <w:t>. We introduced its definition, examined its main properties, and discussed its relationship with linear independence.</w:t>
+      </w:r>
+    </w:p>
+    <w:p>
+      <w:pPr>
+        <w:rPr>
+          <w:sz w:val="44"/>
+          <w:szCs w:val="44"/>
+          <w:lang w:bidi="fa-IR"/>
+        </w:rPr>
+      </w:pPr>
+      <w:r>
+        <w:rPr>
+          <w:sz w:val="44"/>
+          <w:szCs w:val="44"/>
+          <w:lang w:bidi="fa-IR"/>
+        </w:rPr>
+        <w:t>In the next video, we will compare all the notions of orthogonality that we have learned so far and explore the relationships between them.</w:t>
+      </w:r>
+    </w:p>
+    <w:p>
+      <w:pPr>
+        <w:rPr>
+          <w:sz w:val="44"/>
+          <w:szCs w:val="44"/>
+          <w:lang w:bidi="fa-IR"/>
+        </w:rPr>
+      </w:pPr>
+      <w:r>
+        <w:rPr>
+          <w:sz w:val="44"/>
+          <w:szCs w:val="44"/>
+          <w:lang w:bidi="fa-IR"/>
+        </w:rPr>
+        <w:t>So, stay tuned, and I'll see you in the next video.</w:t>
+      </w:r>
+    </w:p>
+    <w:p>
+      <w:pPr>
+        <w:rPr>
+          <w:sz w:val="44"/>
+          <w:szCs w:val="44"/>
+          <w:lang w:bidi="fa-IR"/>
+        </w:rPr>
+      </w:pPr>
+      <w:r>
+        <w:rPr>
+          <w:sz w:val="44"/>
+          <w:szCs w:val="44"/>
+          <w:lang w:bidi="fa-IR"/>
+        </w:rPr>
+        <w:lastRenderedPageBreak/>
+        <w:t>6 :</w:t>
+      </w:r>
+    </w:p>
+    <w:p>
+      <w:pPr>
+        <w:rPr>
+          <w:sz w:val="44"/>
+          <w:szCs w:val="44"/>
+          <w:lang w:bidi="fa-IR"/>
+        </w:rPr>
+      </w:pPr>
+      <w:r>
+        <w:rPr>
+          <w:sz w:val="44"/>
+          <w:szCs w:val="44"/>
+          <w:lang w:bidi="fa-IR"/>
+        </w:rPr>
+        <w:t>6-1:</w:t>
+      </w:r>
+    </w:p>
+    <w:p>
+      <w:pPr>
+        <w:rPr>
+          <w:sz w:val="44"/>
+          <w:szCs w:val="44"/>
+          <w:lang w:bidi="fa-IR"/>
+        </w:rPr>
+      </w:pPr>
+      <w:r>
+        <w:rPr>
+          <w:sz w:val="44"/>
+          <w:szCs w:val="44"/>
+          <w:lang w:bidi="fa-IR"/>
+        </w:rPr>
+        <w:t>In this video, we are going to bring together everything we have learned so far.</w:t>
+      </w:r>
+    </w:p>
+    <w:p>
+      <w:pPr>
+        <w:rPr>
+          <w:sz w:val="44"/>
+          <w:szCs w:val="44"/>
+          <w:lang w:bidi="fa-IR"/>
+        </w:rPr>
+      </w:pPr>
+      <w:r>
+        <w:rPr>
+          <w:sz w:val="44"/>
+          <w:szCs w:val="44"/>
+          <w:lang w:bidi="fa-IR"/>
+        </w:rPr>
+        <w:t>First, we will compare the main properties of all the notions of orthogonality that we have studied and summarize them in a single table.</w:t>
+      </w:r>
+    </w:p>
+    <w:p>
+      <w:pPr>
+        <w:rPr>
+          <w:sz w:val="44"/>
+          <w:szCs w:val="44"/>
+          <w:lang w:bidi="fa-IR"/>
+        </w:rPr>
+      </w:pPr>
+      <w:r>
+        <w:rPr>
+          <w:sz w:val="44"/>
+          <w:szCs w:val="44"/>
+          <w:lang w:bidi="fa-IR"/>
+        </w:rPr>
+        <w:t>Then, we will examine the relationships between these different types of orthogonality and see how they are connected.</w:t>
+      </w:r>
+    </w:p>
+    <w:p>
+      <w:pPr>
+        <w:rPr>
+          <w:sz w:val="44"/>
+          <w:szCs w:val="44"/>
+          <w:lang w:bidi="fa-IR"/>
+        </w:rPr>
+      </w:pPr>
+      <w:r>
+        <w:rPr>
+          <w:sz w:val="44"/>
+          <w:szCs w:val="44"/>
+          <w:lang w:bidi="fa-IR"/>
+        </w:rPr>
+        <w:t>So, let's begin by comparing their fundamental properties.</w:t>
+      </w:r>
+    </w:p>
+    <w:p>
+      <w:pPr>
+        <w:rPr>
+          <w:sz w:val="44"/>
+          <w:szCs w:val="44"/>
+          <w:lang w:bidi="fa-IR"/>
+        </w:rPr>
+      </w:pPr>
+      <w:r>
+        <w:rPr>
+          <w:sz w:val="44"/>
+          <w:szCs w:val="44"/>
+          <w:lang w:bidi="fa-IR"/>
+        </w:rPr>
+        <w:t>6-2:</w:t>
+      </w:r>
+    </w:p>
+    <w:p>
+      <w:pPr>
+        <w:rPr>
+          <w:sz w:val="44"/>
+          <w:szCs w:val="44"/>
+          <w:lang w:bidi="fa-IR"/>
+        </w:rPr>
+      </w:pPr>
     </w:p>
     <w:p>
       <w:pPr>

</xml_diff>

<commit_message>
step 106 : finish part 13
</commit_message>
<xml_diff>
--- a/video context/video_context_newVersion.docx
+++ b/video context/video_context_newVersion.docx
@@ -2304,27 +2304,15 @@
           <w:lang w:bidi="fa-IR"/>
         </w:rPr>
       </w:pPr>
-      <w:proofErr w:type="spellStart"/>
-      <w:r>
-        <w:rPr>
-          <w:b/>
-          <w:bCs/>
-          <w:sz w:val="44"/>
-          <w:szCs w:val="44"/>
-          <w:lang w:bidi="fa-IR"/>
-        </w:rPr>
-        <w:t>Hellooo</w:t>
-      </w:r>
-      <w:proofErr w:type="spellEnd"/>
-      <w:r>
-        <w:rPr>
-          <w:b/>
-          <w:bCs/>
-          <w:sz w:val="44"/>
-          <w:szCs w:val="44"/>
-          <w:lang w:bidi="fa-IR"/>
-        </w:rPr>
-        <w:t>, and welcome back!</w:t>
+      <w:r>
+        <w:rPr>
+          <w:b/>
+          <w:bCs/>
+          <w:sz w:val="44"/>
+          <w:szCs w:val="44"/>
+          <w:lang w:bidi="fa-IR"/>
+        </w:rPr>
+        <w:t>Hellooo, and welcome back!</w:t>
       </w:r>
       <w:r>
         <w:rPr>
@@ -2765,25 +2753,7 @@
           <w:lang w:bidi="fa-IR"/>
         </w:rPr>
         <w:lastRenderedPageBreak/>
-        <w:t xml:space="preserve">Next, we show that the distance from x </w:t>
-      </w:r>
-      <w:proofErr w:type="spellStart"/>
-      <w:r>
-        <w:rPr>
-          <w:sz w:val="44"/>
-          <w:szCs w:val="44"/>
-          <w:lang w:bidi="fa-IR"/>
-        </w:rPr>
-        <w:t>to y</w:t>
-      </w:r>
-      <w:proofErr w:type="spellEnd"/>
-      <w:r>
-        <w:rPr>
-          <w:sz w:val="44"/>
-          <w:szCs w:val="44"/>
-          <w:lang w:bidi="fa-IR"/>
-        </w:rPr>
-        <w:t xml:space="preserve"> is equal to the distance from y to x.</w:t>
+        <w:t>Next, we show that the distance from x to y is equal to the distance from y to x.</w:t>
       </w:r>
     </w:p>
     <w:p>
@@ -2817,18 +2787,8 @@
           <w:szCs w:val="44"/>
           <w:lang w:bidi="fa-IR"/>
         </w:rPr>
-        <w:t xml:space="preserve">To gain some geometric intuition, consider two points, x and y, in the two-dimensional plane. We first represent the distance from x </w:t>
-      </w:r>
-      <w:proofErr w:type="spellStart"/>
-      <w:r>
-        <w:rPr>
-          <w:sz w:val="44"/>
-          <w:szCs w:val="44"/>
-          <w:lang w:bidi="fa-IR"/>
-        </w:rPr>
-        <w:t>to y</w:t>
-      </w:r>
-      <w:proofErr w:type="spellEnd"/>
+        <w:t>To gain some geometric intuition, consider two points, x and y, in the two-dimensional plane. We first represent the distance from x to y</w:t>
+      </w:r>
       <w:r>
         <w:rPr>
           <w:sz w:val="44"/>
@@ -3403,78 +3363,24 @@
           <w:szCs w:val="44"/>
           <w:lang w:bidi="fa-IR"/>
         </w:rPr>
-        <w:t>To begin, let (</w:t>
-      </w:r>
-      <w:proofErr w:type="spellStart"/>
-      <w:r>
-        <w:rPr>
-          <w:sz w:val="44"/>
-          <w:szCs w:val="44"/>
-          <w:lang w:bidi="fa-IR"/>
-        </w:rPr>
-        <w:t>X,d</w:t>
-      </w:r>
-      <w:proofErr w:type="spellEnd"/>
-      <w:r>
-        <w:rPr>
-          <w:sz w:val="44"/>
-          <w:szCs w:val="44"/>
-          <w:lang w:bidi="fa-IR"/>
-        </w:rPr>
-        <w:t xml:space="preserve">) be a metric space, and let </w:t>
-      </w:r>
-      <w:proofErr w:type="spellStart"/>
-      <w:r>
-        <w:rPr>
-          <w:sz w:val="44"/>
-          <w:szCs w:val="44"/>
-          <w:lang w:bidi="fa-IR"/>
-        </w:rPr>
-        <w:t>y_n</w:t>
-      </w:r>
-      <w:proofErr w:type="spellEnd"/>
-      <w:r>
-        <w:rPr>
-          <w:sz w:val="44"/>
-          <w:szCs w:val="44"/>
-          <w:lang w:bidi="fa-IR"/>
-        </w:rPr>
-        <w:t xml:space="preserve"> be a sequence in X.</w:t>
-      </w:r>
-    </w:p>
-    <w:p>
-      <w:pPr>
-        <w:rPr>
-          <w:sz w:val="44"/>
-          <w:szCs w:val="44"/>
-          <w:lang w:bidi="fa-IR"/>
-        </w:rPr>
-      </w:pPr>
-      <w:r>
-        <w:rPr>
-          <w:sz w:val="44"/>
-          <w:szCs w:val="44"/>
-          <w:lang w:bidi="fa-IR"/>
-        </w:rPr>
-        <w:t xml:space="preserve">We say that the sequence </w:t>
-      </w:r>
-      <w:proofErr w:type="spellStart"/>
-      <w:r>
-        <w:rPr>
-          <w:sz w:val="44"/>
-          <w:szCs w:val="44"/>
-          <w:lang w:bidi="fa-IR"/>
-        </w:rPr>
-        <w:t>y_n</w:t>
-      </w:r>
-      <w:proofErr w:type="spellEnd"/>
-      <w:r>
-        <w:rPr>
-          <w:sz w:val="44"/>
-          <w:szCs w:val="44"/>
-          <w:lang w:bidi="fa-IR"/>
-        </w:rPr>
-        <w:t xml:space="preserve"> converges</w:t>
+        <w:t>To begin, let (X,d) be a metric space, and let y_n be a sequence in X.</w:t>
+      </w:r>
+    </w:p>
+    <w:p>
+      <w:pPr>
+        <w:rPr>
+          <w:sz w:val="44"/>
+          <w:szCs w:val="44"/>
+          <w:lang w:bidi="fa-IR"/>
+        </w:rPr>
+      </w:pPr>
+      <w:r>
+        <w:rPr>
+          <w:sz w:val="44"/>
+          <w:szCs w:val="44"/>
+          <w:lang w:bidi="fa-IR"/>
+        </w:rPr>
+        <w:t>We say that the sequence y_n converges</w:t>
       </w:r>
       <w:r>
         <w:rPr>
@@ -3596,7 +3502,6 @@
         <w:lastRenderedPageBreak/>
         <w:t xml:space="preserve">In this case, something interesting happens. The very same sequence </w:t>
       </w:r>
-      <w:proofErr w:type="spellStart"/>
       <w:r>
         <w:rPr>
           <w:sz w:val="44"/>
@@ -3605,7 +3510,6 @@
         </w:rPr>
         <w:t>y_n</w:t>
       </w:r>
-      <w:proofErr w:type="spellEnd"/>
       <w:r>
         <w:rPr>
           <w:sz w:val="44"/>
@@ -3819,43 +3723,7 @@
           <w:lang w:bidi="fa-IR"/>
         </w:rPr>
         <w:lastRenderedPageBreak/>
-        <w:t>Formally, a sequence ({</w:t>
-      </w:r>
-      <w:proofErr w:type="spellStart"/>
-      <w:r>
-        <w:rPr>
-          <w:sz w:val="44"/>
-          <w:szCs w:val="44"/>
-          <w:lang w:bidi="fa-IR"/>
-        </w:rPr>
-        <w:t>x_n</w:t>
-      </w:r>
-      <w:proofErr w:type="spellEnd"/>
-      <w:r>
-        <w:rPr>
-          <w:sz w:val="44"/>
-          <w:szCs w:val="44"/>
-          <w:lang w:bidi="fa-IR"/>
-        </w:rPr>
-        <w:t>}) in a metric space ((</w:t>
-      </w:r>
-      <w:proofErr w:type="spellStart"/>
-      <w:r>
-        <w:rPr>
-          <w:sz w:val="44"/>
-          <w:szCs w:val="44"/>
-          <w:lang w:bidi="fa-IR"/>
-        </w:rPr>
-        <w:t>X,d</w:t>
-      </w:r>
-      <w:proofErr w:type="spellEnd"/>
-      <w:r>
-        <w:rPr>
-          <w:sz w:val="44"/>
-          <w:szCs w:val="44"/>
-          <w:lang w:bidi="fa-IR"/>
-        </w:rPr>
-        <w:t xml:space="preserve">)) is called </w:t>
+        <w:t xml:space="preserve">Formally, a sequence ({x_n}) in a metric space ((X,d)) is called </w:t>
       </w:r>
       <w:r>
         <w:rPr>
@@ -3873,25 +3741,7 @@
           <w:szCs w:val="44"/>
           <w:lang w:bidi="fa-IR"/>
         </w:rPr>
-        <w:t xml:space="preserve"> if, for every (\</w:t>
-      </w:r>
-      <w:proofErr w:type="spellStart"/>
-      <w:r>
-        <w:rPr>
-          <w:sz w:val="44"/>
-          <w:szCs w:val="44"/>
-          <w:lang w:bidi="fa-IR"/>
-        </w:rPr>
-        <w:t>varepsilon</w:t>
-      </w:r>
-      <w:proofErr w:type="spellEnd"/>
-      <w:r>
-        <w:rPr>
-          <w:sz w:val="44"/>
-          <w:szCs w:val="44"/>
-          <w:lang w:bidi="fa-IR"/>
-        </w:rPr>
-        <w:t xml:space="preserve"> &gt; 0), there exists an integer (N) such that</w:t>
+        <w:t xml:space="preserve"> if, for every (\varepsilon &gt; 0), there exists an integer (N) such that</w:t>
       </w:r>
     </w:p>
     <w:p>
@@ -4035,60 +3885,24 @@
           <w:szCs w:val="44"/>
           <w:lang w:bidi="fa-IR"/>
         </w:rPr>
-        <w:t>for every (</w:t>
-      </w:r>
-      <w:proofErr w:type="spellStart"/>
-      <w:r>
-        <w:rPr>
-          <w:sz w:val="44"/>
-          <w:szCs w:val="44"/>
-          <w:lang w:bidi="fa-IR"/>
-        </w:rPr>
-        <w:t>m,n</w:t>
-      </w:r>
-      <w:proofErr w:type="spellEnd"/>
-      <w:r>
-        <w:rPr>
-          <w:sz w:val="44"/>
-          <w:szCs w:val="44"/>
-          <w:lang w:bidi="fa-IR"/>
-        </w:rPr>
-        <w:t xml:space="preserve"> &gt; N).</w:t>
-      </w:r>
-    </w:p>
-    <w:p>
-      <w:pPr>
-        <w:rPr>
-          <w:sz w:val="44"/>
-          <w:szCs w:val="44"/>
-          <w:lang w:bidi="fa-IR"/>
-        </w:rPr>
-      </w:pPr>
-      <w:r>
-        <w:rPr>
-          <w:sz w:val="44"/>
-          <w:szCs w:val="44"/>
-          <w:lang w:bidi="fa-IR"/>
-        </w:rPr>
-        <w:t>Now let's look again at our sequence ({</w:t>
-      </w:r>
-      <w:proofErr w:type="spellStart"/>
-      <w:r>
-        <w:rPr>
-          <w:sz w:val="44"/>
-          <w:szCs w:val="44"/>
-          <w:lang w:bidi="fa-IR"/>
-        </w:rPr>
-        <w:t>y_n</w:t>
-      </w:r>
-      <w:proofErr w:type="spellEnd"/>
-      <w:r>
-        <w:rPr>
-          <w:sz w:val="44"/>
-          <w:szCs w:val="44"/>
-          <w:lang w:bidi="fa-IR"/>
-        </w:rPr>
-        <w:t>}).</w:t>
+        <w:t>for every (m,n &gt; N).</w:t>
+      </w:r>
+    </w:p>
+    <w:p>
+      <w:pPr>
+        <w:rPr>
+          <w:sz w:val="44"/>
+          <w:szCs w:val="44"/>
+          <w:lang w:bidi="fa-IR"/>
+        </w:rPr>
+      </w:pPr>
+      <w:r>
+        <w:rPr>
+          <w:sz w:val="44"/>
+          <w:szCs w:val="44"/>
+          <w:lang w:bidi="fa-IR"/>
+        </w:rPr>
+        <w:t>Now let's look again at our sequence ({y_n}).</w:t>
       </w:r>
     </w:p>
     <w:p>
@@ -4642,25 +4456,7 @@
           <w:lang w:bidi="fa-IR"/>
         </w:rPr>
         <w:lastRenderedPageBreak/>
-        <w:t>Go back to our previous metric space (X), and consider the same Cauchy sequence ({</w:t>
-      </w:r>
-      <w:proofErr w:type="spellStart"/>
-      <w:r>
-        <w:rPr>
-          <w:sz w:val="44"/>
-          <w:szCs w:val="44"/>
-          <w:lang w:bidi="fa-IR"/>
-        </w:rPr>
-        <w:t>y_n</w:t>
-      </w:r>
-      <w:proofErr w:type="spellEnd"/>
-      <w:r>
-        <w:rPr>
-          <w:sz w:val="44"/>
-          <w:szCs w:val="44"/>
-          <w:lang w:bidi="fa-IR"/>
-        </w:rPr>
-        <w:t>}).</w:t>
+        <w:t>Go back to our previous metric space (X), and consider the same Cauchy sequence ({y_n}).</w:t>
       </w:r>
     </w:p>
     <w:p>
@@ -6722,7 +6518,6 @@
         </w:rPr>
         <w:t xml:space="preserve">Suppose we have two vectors, </w:t>
       </w:r>
-      <w:proofErr w:type="spellStart"/>
       <w:r>
         <w:rPr>
           <w:b/>
@@ -6739,16 +6534,7 @@
           <w:szCs w:val="44"/>
           <w:lang w:bidi="fa-IR"/>
         </w:rPr>
-        <w:t>and</w:t>
-      </w:r>
-      <w:proofErr w:type="spellEnd"/>
-      <w:r>
-        <w:rPr>
-          <w:sz w:val="44"/>
-          <w:szCs w:val="44"/>
-          <w:lang w:bidi="fa-IR"/>
-        </w:rPr>
-        <w:t xml:space="preserve"> </w:t>
+        <w:t xml:space="preserve">and </w:t>
       </w:r>
       <w:r>
         <w:rPr>
@@ -7873,7 +7659,6 @@
         </w:rPr>
         <w:t xml:space="preserve"> in its second argument. This property is also commonly referred to as </w:t>
       </w:r>
-      <w:proofErr w:type="spellStart"/>
       <w:r>
         <w:rPr>
           <w:b/>
@@ -7884,7 +7669,6 @@
         </w:rPr>
         <w:t>semilinearity</w:t>
       </w:r>
-      <w:proofErr w:type="spellEnd"/>
       <w:r>
         <w:rPr>
           <w:sz w:val="44"/>
@@ -7929,20 +7713,8 @@
           <w:lang w:bidi="fa-IR"/>
         </w:rPr>
         <w:lastRenderedPageBreak/>
-        <w:t xml:space="preserve">Putting these two results together, we conclude that the inner product is </w:t>
-      </w:r>
-      <w:proofErr w:type="spellStart"/>
-      <w:r>
-        <w:rPr>
-          <w:b/>
-          <w:bCs/>
-          <w:sz w:val="44"/>
-          <w:szCs w:val="44"/>
-          <w:lang w:bidi="fa-IR"/>
-        </w:rPr>
-        <w:t>sesquilinear</w:t>
-      </w:r>
-      <w:proofErr w:type="spellEnd"/>
+        <w:t>Putting these two results together, we conclude that the inner product is sesquilinear</w:t>
+      </w:r>
     </w:p>
     <w:p>
       <w:pPr>
@@ -8705,25 +8477,7 @@
           <w:lang w:bidi="fa-IR"/>
         </w:rPr>
         <w:lastRenderedPageBreak/>
-        <w:t>For instance, the (</w:t>
-      </w:r>
-      <w:proofErr w:type="spellStart"/>
-      <w:r>
-        <w:rPr>
-          <w:sz w:val="44"/>
-          <w:szCs w:val="44"/>
-          <w:lang w:bidi="fa-IR"/>
-        </w:rPr>
-        <w:t>L^p</w:t>
-      </w:r>
-      <w:proofErr w:type="spellEnd"/>
-      <w:r>
-        <w:rPr>
-          <w:sz w:val="44"/>
-          <w:szCs w:val="44"/>
-          <w:lang w:bidi="fa-IR"/>
-        </w:rPr>
-        <w:t xml:space="preserve">) norms for (p </w:t>
+        <w:t xml:space="preserve">For instance, the (L^p) norms for (p </w:t>
       </w:r>
       <m:oMath>
         <m:r>
@@ -10124,25 +9878,7 @@
           <w:szCs w:val="44"/>
           <w:lang w:bidi="fa-IR"/>
         </w:rPr>
-        <w:t>Although (C[</w:t>
-      </w:r>
-      <w:proofErr w:type="spellStart"/>
-      <w:r>
-        <w:rPr>
-          <w:sz w:val="44"/>
-          <w:szCs w:val="44"/>
-          <w:lang w:bidi="fa-IR"/>
-        </w:rPr>
-        <w:t>a,b</w:t>
-      </w:r>
-      <w:proofErr w:type="spellEnd"/>
-      <w:r>
-        <w:rPr>
-          <w:sz w:val="44"/>
-          <w:szCs w:val="44"/>
-          <w:lang w:bidi="fa-IR"/>
-        </w:rPr>
-        <w:t xml:space="preserve">]) with the supremum norm </w:t>
+        <w:t xml:space="preserve">Although (C[a,b]) with the supremum norm </w:t>
       </w:r>
       <w:r>
         <w:rPr>
@@ -10241,25 +9977,7 @@
           <w:szCs w:val="44"/>
           <w:lang w:bidi="fa-IR"/>
         </w:rPr>
-        <w:t>Therefore, (C[</w:t>
-      </w:r>
-      <w:proofErr w:type="spellStart"/>
-      <w:r>
-        <w:rPr>
-          <w:sz w:val="44"/>
-          <w:szCs w:val="44"/>
-          <w:lang w:bidi="fa-IR"/>
-        </w:rPr>
-        <w:t>a,b</w:t>
-      </w:r>
-      <w:proofErr w:type="spellEnd"/>
-      <w:r>
-        <w:rPr>
-          <w:sz w:val="44"/>
-          <w:szCs w:val="44"/>
-          <w:lang w:bidi="fa-IR"/>
-        </w:rPr>
-        <w:t xml:space="preserve">]) equipped with the supremum norm is </w:t>
+        <w:t xml:space="preserve">Therefore, (C[a,b]) equipped with the supremum norm is </w:t>
       </w:r>
       <w:r>
         <w:rPr>
@@ -11952,51 +11670,7 @@
           <w:szCs w:val="44"/>
           <w:lang w:bidi="fa-IR"/>
         </w:rPr>
-        <w:t xml:space="preserve">"The norm of x+ </w:t>
-      </w:r>
-      <w:proofErr w:type="spellStart"/>
-      <w:r>
-        <w:rPr>
-          <w:b/>
-          <w:bCs/>
-          <w:sz w:val="44"/>
-          <w:szCs w:val="44"/>
-          <w:lang w:bidi="fa-IR"/>
-        </w:rPr>
-        <w:t>ky</w:t>
-      </w:r>
-      <w:proofErr w:type="spellEnd"/>
-      <w:r>
-        <w:rPr>
-          <w:b/>
-          <w:bCs/>
-          <w:sz w:val="44"/>
-          <w:szCs w:val="44"/>
-          <w:lang w:bidi="fa-IR"/>
-        </w:rPr>
-        <w:t xml:space="preserve"> equals the norm of x−</w:t>
-      </w:r>
-      <w:proofErr w:type="spellStart"/>
-      <w:r>
-        <w:rPr>
-          <w:b/>
-          <w:bCs/>
-          <w:sz w:val="44"/>
-          <w:szCs w:val="44"/>
-          <w:lang w:bidi="fa-IR"/>
-        </w:rPr>
-        <w:t>ky</w:t>
-      </w:r>
-      <w:proofErr w:type="spellEnd"/>
-      <w:r>
-        <w:rPr>
-          <w:b/>
-          <w:bCs/>
-          <w:sz w:val="44"/>
-          <w:szCs w:val="44"/>
-          <w:lang w:bidi="fa-IR"/>
-        </w:rPr>
-        <w:t xml:space="preserve"> for all real numbers k."</w:t>
+        <w:t>"The norm of x+ ky equals the norm of x−ky for all real numbers k."</w:t>
       </w:r>
     </w:p>
     <w:p>
@@ -12038,25 +11712,7 @@
           <w:szCs w:val="44"/>
           <w:lang w:bidi="fa-IR"/>
         </w:rPr>
-        <w:t xml:space="preserve">x is orthogonal </w:t>
-      </w:r>
-      <w:proofErr w:type="spellStart"/>
-      <w:r>
-        <w:rPr>
-          <w:sz w:val="44"/>
-          <w:szCs w:val="44"/>
-          <w:lang w:bidi="fa-IR"/>
-        </w:rPr>
-        <w:t>to y</w:t>
-      </w:r>
-      <w:proofErr w:type="spellEnd"/>
-      <w:r>
-        <w:rPr>
-          <w:sz w:val="44"/>
-          <w:szCs w:val="44"/>
-          <w:lang w:bidi="fa-IR"/>
-        </w:rPr>
-        <w:t xml:space="preserve"> in the sense of Roberts</w:t>
+        <w:t>x is orthogonal to y in the sense of Roberts</w:t>
       </w:r>
       <w:r>
         <w:rPr>
@@ -12098,79 +11754,7 @@
           <w:szCs w:val="44"/>
           <w:lang w:bidi="fa-IR"/>
         </w:rPr>
-        <w:t>Suppose we have two vectors, (x) and (y), that are orthogonal in the sense of Roberts. For an arbitrary real number (k), draw the vector (</w:t>
-      </w:r>
-      <w:proofErr w:type="spellStart"/>
-      <w:r>
-        <w:rPr>
-          <w:sz w:val="44"/>
-          <w:szCs w:val="44"/>
-          <w:lang w:bidi="fa-IR"/>
-        </w:rPr>
-        <w:t>ky</w:t>
-      </w:r>
-      <w:proofErr w:type="spellEnd"/>
-      <w:r>
-        <w:rPr>
-          <w:sz w:val="44"/>
-          <w:szCs w:val="44"/>
-          <w:lang w:bidi="fa-IR"/>
-        </w:rPr>
-        <w:t>). The vectors (x) and (</w:t>
-      </w:r>
-      <w:proofErr w:type="spellStart"/>
-      <w:r>
-        <w:rPr>
-          <w:sz w:val="44"/>
-          <w:szCs w:val="44"/>
-          <w:lang w:bidi="fa-IR"/>
-        </w:rPr>
-        <w:t>ky</w:t>
-      </w:r>
-      <w:proofErr w:type="spellEnd"/>
-      <w:r>
-        <w:rPr>
-          <w:sz w:val="44"/>
-          <w:szCs w:val="44"/>
-          <w:lang w:bidi="fa-IR"/>
-        </w:rPr>
-        <w:t xml:space="preserve">) form a parallelogram, and when this parallelogram happens to be a rectangle, its diagonals are (x + </w:t>
-      </w:r>
-      <w:proofErr w:type="spellStart"/>
-      <w:r>
-        <w:rPr>
-          <w:sz w:val="44"/>
-          <w:szCs w:val="44"/>
-          <w:lang w:bidi="fa-IR"/>
-        </w:rPr>
-        <w:t>ky</w:t>
-      </w:r>
-      <w:proofErr w:type="spellEnd"/>
-      <w:r>
-        <w:rPr>
-          <w:sz w:val="44"/>
-          <w:szCs w:val="44"/>
-          <w:lang w:bidi="fa-IR"/>
-        </w:rPr>
-        <w:t xml:space="preserve">) and (x - </w:t>
-      </w:r>
-      <w:proofErr w:type="spellStart"/>
-      <w:r>
-        <w:rPr>
-          <w:sz w:val="44"/>
-          <w:szCs w:val="44"/>
-          <w:lang w:bidi="fa-IR"/>
-        </w:rPr>
-        <w:t>ky</w:t>
-      </w:r>
-      <w:proofErr w:type="spellEnd"/>
-      <w:r>
-        <w:rPr>
-          <w:sz w:val="44"/>
-          <w:szCs w:val="44"/>
-          <w:lang w:bidi="fa-IR"/>
-        </w:rPr>
-        <w:t>).</w:t>
+        <w:t>Suppose we have two vectors, (x) and (y), that are orthogonal in the sense of Roberts. For an arbitrary real number (k), draw the vector (ky). The vectors (x) and (ky) form a parallelogram, and when this parallelogram happens to be a rectangle, its diagonals are (x + ky) and (x - ky).</w:t>
       </w:r>
     </w:p>
     <w:p>
@@ -12748,25 +12332,7 @@
           <w:szCs w:val="44"/>
           <w:lang w:bidi="fa-IR"/>
         </w:rPr>
-        <w:t>Consider the following vectors in (\</w:t>
-      </w:r>
-      <w:proofErr w:type="spellStart"/>
-      <w:r>
-        <w:rPr>
-          <w:sz w:val="44"/>
-          <w:szCs w:val="44"/>
-          <w:lang w:bidi="fa-IR"/>
-        </w:rPr>
-        <w:t>mathbb</w:t>
-      </w:r>
-      <w:proofErr w:type="spellEnd"/>
-      <w:r>
-        <w:rPr>
-          <w:sz w:val="44"/>
-          <w:szCs w:val="44"/>
-          <w:lang w:bidi="fa-IR"/>
-        </w:rPr>
-        <w:t>{R}^3) equipped with the infinity norm.</w:t>
+        <w:t>Consider the following vectors in (\mathbb{R}^3) equipped with the infinity norm.</w:t>
       </w:r>
     </w:p>
     <w:p>
@@ -12949,25 +12515,7 @@
           <w:szCs w:val="44"/>
           <w:lang w:bidi="fa-IR"/>
         </w:rPr>
-        <w:t>We work in (\</w:t>
-      </w:r>
-      <w:proofErr w:type="spellStart"/>
-      <w:r>
-        <w:rPr>
-          <w:sz w:val="44"/>
-          <w:szCs w:val="44"/>
-          <w:lang w:bidi="fa-IR"/>
-        </w:rPr>
-        <w:t>mathbb</w:t>
-      </w:r>
-      <w:proofErr w:type="spellEnd"/>
-      <w:r>
-        <w:rPr>
-          <w:sz w:val="44"/>
-          <w:szCs w:val="44"/>
-          <w:lang w:bidi="fa-IR"/>
-        </w:rPr>
-        <w:t>{R}^2) equipped with the infinity norm.</w:t>
+        <w:t>We work in (\mathbb{R}^2) equipped with the infinity norm.</w:t>
       </w:r>
     </w:p>
     <w:p>
@@ -14613,25 +14161,7 @@
           <w:szCs w:val="44"/>
           <w:lang w:bidi="fa-IR"/>
         </w:rPr>
-        <w:t>We'll work in the space (\</w:t>
-      </w:r>
-      <w:proofErr w:type="spellStart"/>
-      <w:r>
-        <w:rPr>
-          <w:sz w:val="44"/>
-          <w:szCs w:val="44"/>
-          <w:lang w:bidi="fa-IR"/>
-        </w:rPr>
-        <w:t>mathbb</w:t>
-      </w:r>
-      <w:proofErr w:type="spellEnd"/>
-      <w:r>
-        <w:rPr>
-          <w:sz w:val="44"/>
-          <w:szCs w:val="44"/>
-          <w:lang w:bidi="fa-IR"/>
-        </w:rPr>
-        <w:t>{R}^2) equipped with the (\ell_1) norm.</w:t>
+        <w:t>We'll work in the space (\mathbb{R}^2) equipped with the (\ell_1) norm.</w:t>
       </w:r>
     </w:p>
     <w:p>
@@ -14812,25 +14342,7 @@
           <w:lang w:bidi="fa-IR"/>
         </w:rPr>
         <w:lastRenderedPageBreak/>
-        <w:t>First, suppose that (\alpha \</w:t>
-      </w:r>
-      <w:proofErr w:type="spellStart"/>
-      <w:r>
-        <w:rPr>
-          <w:sz w:val="44"/>
-          <w:szCs w:val="44"/>
-          <w:lang w:bidi="fa-IR"/>
-        </w:rPr>
-        <w:t>neq</w:t>
-      </w:r>
-      <w:proofErr w:type="spellEnd"/>
-      <w:r>
-        <w:rPr>
-          <w:sz w:val="44"/>
-          <w:szCs w:val="44"/>
-          <w:lang w:bidi="fa-IR"/>
-        </w:rPr>
-        <w:t xml:space="preserve"> 0). By factoring out (\alpha) from the norm and making a simple change of variables, we obtain the desired result.</w:t>
+        <w:t>First, suppose that (\alpha \neq 0). By factoring out (\alpha) from the norm and making a simple change of variables, we obtain the desired result.</w:t>
       </w:r>
     </w:p>
     <w:p>
@@ -17112,29 +16624,7 @@
           <w:szCs w:val="44"/>
           <w:lang w:bidi="fa-IR"/>
         </w:rPr>
-        <w:t xml:space="preserve">We define f of lambda to be the norm of x+ </w:t>
-      </w:r>
-      <w:proofErr w:type="spellStart"/>
-      <w:r>
-        <w:rPr>
-          <w:b/>
-          <w:bCs/>
-          <w:sz w:val="44"/>
-          <w:szCs w:val="44"/>
-          <w:lang w:bidi="fa-IR"/>
-        </w:rPr>
-        <w:t>λy</w:t>
-      </w:r>
-      <w:proofErr w:type="spellEnd"/>
-      <w:r>
-        <w:rPr>
-          <w:b/>
-          <w:bCs/>
-          <w:sz w:val="44"/>
-          <w:szCs w:val="44"/>
-          <w:lang w:bidi="fa-IR"/>
-        </w:rPr>
-        <w:t xml:space="preserve">, </w:t>
+        <w:t xml:space="preserve">We define f of lambda to be the norm of x+ λy, </w:t>
       </w:r>
       <w:r>
         <w:rPr>
@@ -17378,25 +16868,7 @@
           <w:szCs w:val="44"/>
           <w:lang w:bidi="fa-IR"/>
         </w:rPr>
-        <w:t xml:space="preserve">The derivative </w:t>
-      </w:r>
-      <w:proofErr w:type="spellStart"/>
-      <w:r>
-        <w:rPr>
-          <w:sz w:val="44"/>
-          <w:szCs w:val="44"/>
-          <w:lang w:bidi="fa-IR"/>
-        </w:rPr>
-        <w:t>of f</w:t>
-      </w:r>
-      <w:proofErr w:type="spellEnd"/>
-      <w:r>
-        <w:rPr>
-          <w:sz w:val="44"/>
-          <w:szCs w:val="44"/>
-          <w:lang w:bidi="fa-IR"/>
-        </w:rPr>
-        <w:t xml:space="preserve"> at zero is equal to zero</w:t>
+        <w:t>The derivative of f at zero is equal to zero</w:t>
       </w:r>
       <w:r>
         <w:rPr>
@@ -17430,25 +16902,7 @@
           <w:szCs w:val="44"/>
           <w:lang w:bidi="fa-IR"/>
         </w:rPr>
-        <w:t>Now let's substitute the (\</w:t>
-      </w:r>
-      <w:proofErr w:type="spellStart"/>
-      <w:r>
-        <w:rPr>
-          <w:sz w:val="44"/>
-          <w:szCs w:val="44"/>
-          <w:lang w:bidi="fa-IR"/>
-        </w:rPr>
-        <w:t>ell_p</w:t>
-      </w:r>
-      <w:proofErr w:type="spellEnd"/>
-      <w:r>
-        <w:rPr>
-          <w:sz w:val="44"/>
-          <w:szCs w:val="44"/>
-          <w:lang w:bidi="fa-IR"/>
-        </w:rPr>
-        <w:t>)-norm into our function.</w:t>
+        <w:t>Now let's substitute the (\ell_p)-norm into our function.</w:t>
       </w:r>
     </w:p>
     <w:p>
@@ -17528,25 +16982,7 @@
           <w:lang w:bidi="fa-IR"/>
         </w:rPr>
         <w:br/>
-        <w:t>we arrive at the desired characterization of Birkhoff–James orthogonality in (\</w:t>
-      </w:r>
-      <w:proofErr w:type="spellStart"/>
-      <w:r>
-        <w:rPr>
-          <w:sz w:val="44"/>
-          <w:szCs w:val="44"/>
-          <w:lang w:bidi="fa-IR"/>
-        </w:rPr>
-        <w:t>ell_p</w:t>
-      </w:r>
-      <w:proofErr w:type="spellEnd"/>
-      <w:r>
-        <w:rPr>
-          <w:sz w:val="44"/>
-          <w:szCs w:val="44"/>
-          <w:lang w:bidi="fa-IR"/>
-        </w:rPr>
-        <w:t>) spaces.</w:t>
+        <w:t>we arrive at the desired characterization of Birkhoff–James orthogonality in (\ell_p) spaces.</w:t>
       </w:r>
     </w:p>
     <w:p>
@@ -17927,35 +17363,15 @@
           <w:szCs w:val="44"/>
           <w:lang w:bidi="fa-IR"/>
         </w:rPr>
-        <w:t xml:space="preserve">orthogonal </w:t>
-      </w:r>
-      <w:proofErr w:type="spellStart"/>
-      <w:r>
-        <w:rPr>
-          <w:b/>
-          <w:bCs/>
-          <w:sz w:val="44"/>
-          <w:szCs w:val="44"/>
-          <w:lang w:bidi="fa-IR"/>
-        </w:rPr>
-        <w:t>to</w:t>
-      </w:r>
-      <w:r>
-        <w:rPr>
-          <w:sz w:val="44"/>
-          <w:szCs w:val="44"/>
-          <w:lang w:bidi="fa-IR"/>
-        </w:rPr>
-        <w:t xml:space="preserve"> y</w:t>
-      </w:r>
-      <w:proofErr w:type="spellEnd"/>
-      <w:r>
-        <w:rPr>
-          <w:sz w:val="44"/>
-          <w:szCs w:val="44"/>
-          <w:lang w:bidi="fa-IR"/>
-        </w:rPr>
-        <w:t xml:space="preserve"> in the sense of </w:t>
+        <w:t>orthogonal to</w:t>
+      </w:r>
+      <w:r>
+        <w:rPr>
+          <w:sz w:val="44"/>
+          <w:szCs w:val="44"/>
+          <w:lang w:bidi="fa-IR"/>
+        </w:rPr>
+        <w:t xml:space="preserve"> y in the sense of </w:t>
       </w:r>
       <w:r>
         <w:rPr>
@@ -17973,25 +17389,7 @@
           <w:szCs w:val="44"/>
           <w:lang w:bidi="fa-IR"/>
         </w:rPr>
-        <w:t xml:space="preserve"> if and only if the norm of </w:t>
-      </w:r>
-      <w:proofErr w:type="spellStart"/>
-      <w:r>
-        <w:rPr>
-          <w:sz w:val="44"/>
-          <w:szCs w:val="44"/>
-          <w:lang w:bidi="fa-IR"/>
-        </w:rPr>
-        <w:t>x+y</w:t>
-      </w:r>
-      <w:proofErr w:type="spellEnd"/>
-      <w:r>
-        <w:rPr>
-          <w:sz w:val="44"/>
-          <w:szCs w:val="44"/>
-          <w:lang w:bidi="fa-IR"/>
-        </w:rPr>
-        <w:t xml:space="preserve"> is equal to the norm of x−y.</w:t>
+        <w:t xml:space="preserve"> if and only if the norm of x+y is equal to the norm of x−y.</w:t>
       </w:r>
       <w:r>
         <w:rPr>
@@ -18009,25 +17407,7 @@
           <w:lang w:bidi="fa-IR"/>
         </w:rPr>
         <w:br/>
-        <w:t xml:space="preserve">When this condition holds, we write we say that x is orthogonal </w:t>
-      </w:r>
-      <w:proofErr w:type="spellStart"/>
-      <w:r>
-        <w:rPr>
-          <w:sz w:val="44"/>
-          <w:szCs w:val="44"/>
-          <w:lang w:bidi="fa-IR"/>
-        </w:rPr>
-        <w:t>to y</w:t>
-      </w:r>
-      <w:proofErr w:type="spellEnd"/>
-      <w:r>
-        <w:rPr>
-          <w:sz w:val="44"/>
-          <w:szCs w:val="44"/>
-          <w:lang w:bidi="fa-IR"/>
-        </w:rPr>
-        <w:t xml:space="preserve"> in the isosceles sense.</w:t>
+        <w:t>When this condition holds, we write we say that x is orthogonal to y in the isosceles sense.</w:t>
       </w:r>
     </w:p>
     <w:p>
@@ -18136,25 +17516,7 @@
           <w:szCs w:val="44"/>
           <w:lang w:bidi="fa-IR"/>
         </w:rPr>
-        <w:t xml:space="preserve">. Finally, construct the vectors </w:t>
-      </w:r>
-      <w:proofErr w:type="spellStart"/>
-      <w:r>
-        <w:rPr>
-          <w:sz w:val="44"/>
-          <w:szCs w:val="44"/>
-          <w:lang w:bidi="fa-IR"/>
-        </w:rPr>
-        <w:t>x+y</w:t>
-      </w:r>
-      <w:proofErr w:type="spellEnd"/>
-      <w:r>
-        <w:rPr>
-          <w:sz w:val="44"/>
-          <w:szCs w:val="44"/>
-          <w:lang w:bidi="fa-IR"/>
-        </w:rPr>
-        <w:t xml:space="preserve"> and x−</w:t>
+        <w:t>. Finally, construct the vectors x+y and x−</w:t>
       </w:r>
       <w:r>
         <w:rPr>
@@ -18179,25 +17541,7 @@
           <w:lang w:bidi="fa-IR"/>
         </w:rPr>
         <w:br/>
-        <w:t xml:space="preserve">Notice what happens: the vectors </w:t>
-      </w:r>
-      <w:proofErr w:type="spellStart"/>
-      <w:r>
-        <w:rPr>
-          <w:sz w:val="44"/>
-          <w:szCs w:val="44"/>
-          <w:lang w:bidi="fa-IR"/>
-        </w:rPr>
-        <w:t>x+y</w:t>
-      </w:r>
-      <w:proofErr w:type="spellEnd"/>
-      <w:r>
-        <w:rPr>
-          <w:sz w:val="44"/>
-          <w:szCs w:val="44"/>
-          <w:lang w:bidi="fa-IR"/>
-        </w:rPr>
-        <w:t xml:space="preserve"> and x−</w:t>
+        <w:t>Notice what happens: the vectors x+y and x−</w:t>
       </w:r>
       <w:r>
         <w:rPr>
@@ -18310,25 +17654,7 @@
           <w:lang w:bidi="fa-IR"/>
         </w:rPr>
         <w:br/>
-        <w:t>We consider the space (\</w:t>
-      </w:r>
-      <w:proofErr w:type="spellStart"/>
-      <w:r>
-        <w:rPr>
-          <w:sz w:val="44"/>
-          <w:szCs w:val="44"/>
-          <w:lang w:bidi="fa-IR"/>
-        </w:rPr>
-        <w:t>mathbb</w:t>
-      </w:r>
-      <w:proofErr w:type="spellEnd"/>
-      <w:r>
-        <w:rPr>
-          <w:sz w:val="44"/>
-          <w:szCs w:val="44"/>
-          <w:lang w:bidi="fa-IR"/>
-        </w:rPr>
-        <w:t>{R}^2) equipped with the (\ell_1)-norm, and define the vectors (x) and (y) as follows.</w:t>
+        <w:t>We consider the space (\mathbb{R}^2) equipped with the (\ell_1)-norm, and define the vectors (x) and (y) as follows.</w:t>
       </w:r>
       <w:r>
         <w:rPr>
@@ -18441,25 +17767,7 @@
           <w:lang w:bidi="fa-IR"/>
         </w:rPr>
         <w:br/>
-        <w:t>We'll work in the same space, (\</w:t>
-      </w:r>
-      <w:proofErr w:type="spellStart"/>
-      <w:r>
-        <w:rPr>
-          <w:sz w:val="44"/>
-          <w:szCs w:val="44"/>
-          <w:lang w:bidi="fa-IR"/>
-        </w:rPr>
-        <w:t>mathbb</w:t>
-      </w:r>
-      <w:proofErr w:type="spellEnd"/>
-      <w:r>
-        <w:rPr>
-          <w:sz w:val="44"/>
-          <w:szCs w:val="44"/>
-          <w:lang w:bidi="fa-IR"/>
-        </w:rPr>
-        <w:t>{R}^2) equipped with the (\ell_1)-norm. We define the vectors (x), (y), and (z) as shown.</w:t>
+        <w:t>We'll work in the same space, (\mathbb{R}^2) equipped with the (\ell_1)-norm. We define the vectors (x), (y), and (z) as shown.</w:t>
       </w:r>
       <w:r>
         <w:rPr>
@@ -18486,25 +17794,7 @@
           <w:szCs w:val="44"/>
           <w:lang w:bidi="fa-IR"/>
         </w:rPr>
-        <w:t xml:space="preserve"> orthogonal to (</w:t>
-      </w:r>
-      <w:proofErr w:type="spellStart"/>
-      <w:r>
-        <w:rPr>
-          <w:sz w:val="44"/>
-          <w:szCs w:val="44"/>
-          <w:lang w:bidi="fa-IR"/>
-        </w:rPr>
-        <w:t>y+z</w:t>
-      </w:r>
-      <w:proofErr w:type="spellEnd"/>
-      <w:r>
-        <w:rPr>
-          <w:sz w:val="44"/>
-          <w:szCs w:val="44"/>
-          <w:lang w:bidi="fa-IR"/>
-        </w:rPr>
-        <w:t>).</w:t>
+        <w:t xml:space="preserve"> orthogonal to (y+z).</w:t>
       </w:r>
       <w:r>
         <w:rPr>
@@ -18559,23 +17849,13 @@
           <w:lang w:bidi="fa-IR"/>
         </w:rPr>
       </w:pPr>
-      <w:proofErr w:type="spellStart"/>
-      <w:r>
-        <w:rPr>
-          <w:sz w:val="44"/>
-          <w:szCs w:val="44"/>
-          <w:lang w:bidi="fa-IR"/>
-        </w:rPr>
-        <w:t>Lets</w:t>
-      </w:r>
-      <w:proofErr w:type="spellEnd"/>
-      <w:r>
-        <w:rPr>
-          <w:sz w:val="44"/>
-          <w:szCs w:val="44"/>
-          <w:lang w:bidi="fa-IR"/>
-        </w:rPr>
-        <w:t xml:space="preserve"> prove that</w:t>
+      <w:r>
+        <w:rPr>
+          <w:sz w:val="44"/>
+          <w:szCs w:val="44"/>
+          <w:lang w:bidi="fa-IR"/>
+        </w:rPr>
+        <w:t>Lets prove that</w:t>
       </w:r>
       <w:r>
         <w:rPr>
@@ -19064,16 +18344,7 @@
           <w:lang w:bidi="fa-IR"/>
         </w:rPr>
         <w:lastRenderedPageBreak/>
-        <w:t xml:space="preserve">Before introducing the next </w:t>
-      </w:r>
-      <w:proofErr w:type="spellStart"/>
-      <w:r>
-        <w:rPr>
-          <w:sz w:val="44"/>
-          <w:szCs w:val="44"/>
-          <w:lang w:bidi="fa-IR"/>
-        </w:rPr>
-        <w:t>theorem</w:t>
+        <w:t>Before introducing the next theorem</w:t>
       </w:r>
       <w:r>
         <w:rPr>
@@ -19089,16 +18360,7 @@
           <w:szCs w:val="44"/>
           <w:lang w:bidi="fa-IR"/>
         </w:rPr>
-        <w:t>let's</w:t>
-      </w:r>
-      <w:proofErr w:type="spellEnd"/>
-      <w:r>
-        <w:rPr>
-          <w:sz w:val="44"/>
-          <w:szCs w:val="44"/>
-          <w:lang w:bidi="fa-IR"/>
-        </w:rPr>
-        <w:t xml:space="preserve"> quickly review the concept of a </w:t>
+        <w:t xml:space="preserve">let's quickly review the concept of a </w:t>
       </w:r>
       <w:r>
         <w:rPr>
@@ -19187,29 +18449,7 @@
           <w:szCs w:val="44"/>
           <w:lang w:bidi="fa-IR"/>
         </w:rPr>
-        <w:t>(</w:t>
-      </w:r>
-      <w:proofErr w:type="spellStart"/>
-      <w:r>
-        <w:rPr>
-          <w:b/>
-          <w:bCs/>
-          <w:sz w:val="44"/>
-          <w:szCs w:val="44"/>
-          <w:lang w:bidi="fa-IR"/>
-        </w:rPr>
-        <w:t>i</w:t>
-      </w:r>
-      <w:proofErr w:type="spellEnd"/>
-      <w:r>
-        <w:rPr>
-          <w:b/>
-          <w:bCs/>
-          <w:sz w:val="44"/>
-          <w:szCs w:val="44"/>
-          <w:lang w:bidi="fa-IR"/>
-        </w:rPr>
-        <w:t>)</w:t>
+        <w:t>(i)</w:t>
       </w:r>
       <w:r>
         <w:rPr>
@@ -19459,7 +18699,6 @@
         </w:rPr>
         <w:t xml:space="preserve">. As you can see, the lengths of </w:t>
       </w:r>
-      <w:proofErr w:type="spellStart"/>
       <w:r>
         <w:rPr>
           <w:b/>
@@ -19470,7 +18709,6 @@
         </w:rPr>
         <w:t>x+y</w:t>
       </w:r>
-      <w:proofErr w:type="spellEnd"/>
       <w:r>
         <w:rPr>
           <w:sz w:val="44"/>
@@ -20085,25 +19323,7 @@
           <w:szCs w:val="44"/>
           <w:lang w:bidi="fa-IR"/>
         </w:rPr>
-        <w:t>If we consider two vectors (x) and (y), and draw these two vectors together with their sum (</w:t>
-      </w:r>
-      <w:proofErr w:type="spellStart"/>
-      <w:r>
-        <w:rPr>
-          <w:sz w:val="44"/>
-          <w:szCs w:val="44"/>
-          <w:lang w:bidi="fa-IR"/>
-        </w:rPr>
-        <w:t>x+y</w:t>
-      </w:r>
-      <w:proofErr w:type="spellEnd"/>
-      <w:r>
-        <w:rPr>
-          <w:sz w:val="44"/>
-          <w:szCs w:val="44"/>
-          <w:lang w:bidi="fa-IR"/>
-        </w:rPr>
-        <w:t>), we obtain a triangle.</w:t>
+        <w:t>If we consider two vectors (x) and (y), and draw these two vectors together with their sum (x+y), we obtain a triangle.</w:t>
       </w:r>
     </w:p>
     <w:p>
@@ -20205,25 +19425,7 @@
           <w:szCs w:val="44"/>
           <w:lang w:bidi="fa-IR"/>
         </w:rPr>
-        <w:t>Consider the space (\</w:t>
-      </w:r>
-      <w:proofErr w:type="spellStart"/>
-      <w:r>
-        <w:rPr>
-          <w:sz w:val="44"/>
-          <w:szCs w:val="44"/>
-          <w:lang w:bidi="fa-IR"/>
-        </w:rPr>
-        <w:t>mathbb</w:t>
-      </w:r>
-      <w:proofErr w:type="spellEnd"/>
-      <w:r>
-        <w:rPr>
-          <w:sz w:val="44"/>
-          <w:szCs w:val="44"/>
-          <w:lang w:bidi="fa-IR"/>
-        </w:rPr>
-        <w:t>{R}^2) equipped with the given norm, and let the vectors (x) and (y) be defined as shown.</w:t>
+        <w:t>Consider the space (\mathbb{R}^2) equipped with the given norm, and let the vectors (x) and (y) be defined as shown.</w:t>
       </w:r>
     </w:p>
     <w:p>
@@ -20414,25 +19616,7 @@
           <w:szCs w:val="44"/>
           <w:lang w:bidi="fa-IR"/>
         </w:rPr>
-        <w:t>Consider the space (\</w:t>
-      </w:r>
-      <w:proofErr w:type="spellStart"/>
-      <w:r>
-        <w:rPr>
-          <w:sz w:val="44"/>
-          <w:szCs w:val="44"/>
-          <w:lang w:bidi="fa-IR"/>
-        </w:rPr>
-        <w:t>mathbb</w:t>
-      </w:r>
-      <w:proofErr w:type="spellEnd"/>
-      <w:r>
-        <w:rPr>
-          <w:sz w:val="44"/>
-          <w:szCs w:val="44"/>
-          <w:lang w:bidi="fa-IR"/>
-        </w:rPr>
-        <w:t>{R}^2) equipped with the infinity norm, and let (x), (y), and (z) be the three vectors defined as shown.</w:t>
+        <w:t>Consider the space (\mathbb{R}^2) equipped with the infinity norm, and let (x), (y), and (z) be the three vectors defined as shown.</w:t>
       </w:r>
     </w:p>
     <w:p>
@@ -20467,25 +19651,7 @@
           <w:szCs w:val="44"/>
           <w:lang w:bidi="fa-IR"/>
         </w:rPr>
-        <w:t>However, when we consider the sum (</w:t>
-      </w:r>
-      <w:proofErr w:type="spellStart"/>
-      <w:r>
-        <w:rPr>
-          <w:sz w:val="44"/>
-          <w:szCs w:val="44"/>
-          <w:lang w:bidi="fa-IR"/>
-        </w:rPr>
-        <w:t>y+z</w:t>
-      </w:r>
-      <w:proofErr w:type="spellEnd"/>
-      <w:r>
-        <w:rPr>
-          <w:sz w:val="44"/>
-          <w:szCs w:val="44"/>
-          <w:lang w:bidi="fa-IR"/>
-        </w:rPr>
-        <w:t>), we can see that the required Pythagorean relation is no longer satisfied</w:t>
+        <w:t>However, when we consider the sum (y+z), we can see that the required Pythagorean relation is no longer satisfied</w:t>
       </w:r>
       <w:r>
         <w:rPr>
@@ -20583,43 +19749,7 @@
           <w:szCs w:val="44"/>
           <w:lang w:bidi="fa-IR"/>
         </w:rPr>
-        <w:t>We want to show that for every (</w:t>
-      </w:r>
-      <w:proofErr w:type="spellStart"/>
-      <w:r>
-        <w:rPr>
-          <w:sz w:val="44"/>
-          <w:szCs w:val="44"/>
-          <w:lang w:bidi="fa-IR"/>
-        </w:rPr>
-        <w:t>x,y</w:t>
-      </w:r>
-      <w:proofErr w:type="spellEnd"/>
-      <w:r>
-        <w:rPr>
-          <w:sz w:val="44"/>
-          <w:szCs w:val="44"/>
-          <w:lang w:bidi="fa-IR"/>
-        </w:rPr>
-        <w:t>\in X) with (x\neq0), there exists a scalar (a\in\</w:t>
-      </w:r>
-      <w:proofErr w:type="spellStart"/>
-      <w:r>
-        <w:rPr>
-          <w:sz w:val="44"/>
-          <w:szCs w:val="44"/>
-          <w:lang w:bidi="fa-IR"/>
-        </w:rPr>
-        <w:t>mathbb</w:t>
-      </w:r>
-      <w:proofErr w:type="spellEnd"/>
-      <w:r>
-        <w:rPr>
-          <w:sz w:val="44"/>
-          <w:szCs w:val="44"/>
-          <w:lang w:bidi="fa-IR"/>
-        </w:rPr>
-        <w:t>{R}) such that</w:t>
+        <w:t>We want to show that for every (x,y\in X) with (x\neq0), there exists a scalar (a\in\mathbb{R}) such that</w:t>
       </w:r>
     </w:p>
     <w:p>
@@ -20661,25 +19791,7 @@
           <w:szCs w:val="44"/>
           <w:lang w:bidi="fa-IR"/>
         </w:rPr>
-        <w:t>(</w:t>
-      </w:r>
-      <w:proofErr w:type="spellStart"/>
-      <w:r>
-        <w:rPr>
-          <w:sz w:val="44"/>
-          <w:szCs w:val="44"/>
-          <w:lang w:bidi="fa-IR"/>
-        </w:rPr>
-        <w:t>ax+y</w:t>
-      </w:r>
-      <w:proofErr w:type="spellEnd"/>
-      <w:r>
-        <w:rPr>
-          <w:sz w:val="44"/>
-          <w:szCs w:val="44"/>
-          <w:lang w:bidi="fa-IR"/>
-        </w:rPr>
-        <w:t>).</w:t>
+        <w:t>(ax+y).</w:t>
       </w:r>
       <w:r>
         <w:rPr>
@@ -22356,6 +21468,1005 @@
           <w:lang w:bidi="fa-IR"/>
         </w:rPr>
       </w:pPr>
+      <w:r>
+        <w:rPr>
+          <w:sz w:val="44"/>
+          <w:szCs w:val="44"/>
+          <w:lang w:bidi="fa-IR"/>
+        </w:rPr>
+        <w:t>In this table, you can see a complete summary of all the properties we have examined throughout this series.</w:t>
+      </w:r>
+    </w:p>
+    <w:p>
+      <w:pPr>
+        <w:rPr>
+          <w:sz w:val="44"/>
+          <w:szCs w:val="44"/>
+          <w:lang w:bidi="fa-IR"/>
+        </w:rPr>
+      </w:pPr>
+      <w:r>
+        <w:rPr>
+          <w:sz w:val="44"/>
+          <w:szCs w:val="44"/>
+          <w:lang w:bidi="fa-IR"/>
+        </w:rPr>
+        <w:t xml:space="preserve">It provides an overview of which properties hold for each notion of orthogonality and which ones do </w:t>
+      </w:r>
+      <w:r>
+        <w:rPr>
+          <w:sz w:val="44"/>
+          <w:szCs w:val="44"/>
+          <w:lang w:bidi="fa-IR"/>
+        </w:rPr>
+        <w:lastRenderedPageBreak/>
+        <w:t>not, making it easier to compare the different concepts side by side.</w:t>
+      </w:r>
+    </w:p>
+    <w:p>
+      <w:pPr>
+        <w:rPr>
+          <w:sz w:val="44"/>
+          <w:szCs w:val="44"/>
+          <w:lang w:bidi="fa-IR"/>
+        </w:rPr>
+      </w:pPr>
+      <w:r>
+        <w:rPr>
+          <w:sz w:val="44"/>
+          <w:szCs w:val="44"/>
+          <w:lang w:bidi="fa-IR"/>
+        </w:rPr>
+        <w:t>Now, let's move on to the second table.</w:t>
+      </w:r>
+    </w:p>
+    <w:p>
+      <w:pPr>
+        <w:rPr>
+          <w:sz w:val="44"/>
+          <w:szCs w:val="44"/>
+          <w:lang w:bidi="fa-IR"/>
+        </w:rPr>
+      </w:pPr>
+      <w:r>
+        <w:rPr>
+          <w:sz w:val="44"/>
+          <w:szCs w:val="44"/>
+          <w:lang w:bidi="fa-IR"/>
+        </w:rPr>
+        <w:t>As you can see, this table lists several fundamental properties that we previously encountered when studying orthogonality in inner product spaces.</w:t>
+      </w:r>
+    </w:p>
+    <w:p>
+      <w:pPr>
+        <w:rPr>
+          <w:sz w:val="44"/>
+          <w:szCs w:val="44"/>
+          <w:lang w:bidi="fa-IR"/>
+        </w:rPr>
+      </w:pPr>
+      <w:r>
+        <w:rPr>
+          <w:sz w:val="44"/>
+          <w:szCs w:val="44"/>
+          <w:lang w:bidi="fa-IR"/>
+        </w:rPr>
+        <w:t>The interesting point is that these properties are not exclusive to inner product spaces. In fact, they also remain valid for the notions of orthogonality that we have studied in general normed spaces.</w:t>
+      </w:r>
+    </w:p>
+    <w:p>
+      <w:pPr>
+        <w:rPr>
+          <w:sz w:val="44"/>
+          <w:szCs w:val="44"/>
+          <w:lang w:bidi="fa-IR"/>
+        </w:rPr>
+      </w:pPr>
+      <w:r>
+        <w:rPr>
+          <w:sz w:val="44"/>
+          <w:szCs w:val="44"/>
+          <w:lang w:bidi="fa-IR"/>
+        </w:rPr>
+        <w:t>6-3:</w:t>
+      </w:r>
+    </w:p>
+    <w:p>
+      <w:pPr>
+        <w:rPr>
+          <w:sz w:val="44"/>
+          <w:szCs w:val="44"/>
+          <w:lang w:bidi="fa-IR"/>
+        </w:rPr>
+      </w:pPr>
+      <w:r>
+        <w:rPr>
+          <w:sz w:val="44"/>
+          <w:szCs w:val="44"/>
+          <w:lang w:bidi="fa-IR"/>
+        </w:rPr>
+        <w:t>Now, let's move on to the relationships between the different notions of orthogonality.</w:t>
+      </w:r>
+    </w:p>
+    <w:p>
+      <w:pPr>
+        <w:rPr>
+          <w:sz w:val="44"/>
+          <w:szCs w:val="44"/>
+          <w:lang w:bidi="fa-IR"/>
+        </w:rPr>
+      </w:pPr>
+      <w:r>
+        <w:rPr>
+          <w:sz w:val="44"/>
+          <w:szCs w:val="44"/>
+          <w:lang w:bidi="fa-IR"/>
+        </w:rPr>
+        <w:t xml:space="preserve">In </w:t>
+      </w:r>
+      <w:r>
+        <w:rPr>
+          <w:b/>
+          <w:bCs/>
+          <w:sz w:val="44"/>
+          <w:szCs w:val="44"/>
+          <w:lang w:bidi="fa-IR"/>
+        </w:rPr>
+        <w:t>inner product spaces</w:t>
+      </w:r>
+      <w:r>
+        <w:rPr>
+          <w:sz w:val="44"/>
+          <w:szCs w:val="44"/>
+          <w:lang w:bidi="fa-IR"/>
+        </w:rPr>
+        <w:t>, all of the notions of orthogonality that we have studied are equivalent. In other words, if one of them holds, then all the others hold as well.</w:t>
+      </w:r>
+    </w:p>
+    <w:p>
+      <w:pPr>
+        <w:rPr>
+          <w:sz w:val="44"/>
+          <w:szCs w:val="44"/>
+          <w:lang w:bidi="fa-IR"/>
+        </w:rPr>
+      </w:pPr>
+      <w:r>
+        <w:rPr>
+          <w:sz w:val="44"/>
+          <w:szCs w:val="44"/>
+          <w:lang w:bidi="fa-IR"/>
+        </w:rPr>
+        <w:t>###</w:t>
+      </w:r>
+    </w:p>
+    <w:p>
+      <w:pPr>
+        <w:rPr>
+          <w:sz w:val="44"/>
+          <w:szCs w:val="44"/>
+          <w:lang w:bidi="fa-IR"/>
+        </w:rPr>
+      </w:pPr>
+      <w:r>
+        <w:rPr>
+          <w:sz w:val="44"/>
+          <w:szCs w:val="44"/>
+          <w:lang w:bidi="fa-IR"/>
+        </w:rPr>
+        <w:lastRenderedPageBreak/>
+        <w:t>However, this is no longer true in general normed spaces.</w:t>
+      </w:r>
+    </w:p>
+    <w:p>
+      <w:pPr>
+        <w:rPr>
+          <w:sz w:val="44"/>
+          <w:szCs w:val="44"/>
+          <w:lang w:bidi="fa-IR"/>
+        </w:rPr>
+      </w:pPr>
+      <w:r>
+        <w:rPr>
+          <w:sz w:val="44"/>
+          <w:szCs w:val="44"/>
+          <w:lang w:bidi="fa-IR"/>
+        </w:rPr>
+        <w:t>This naturally leads to an important question:</w:t>
+      </w:r>
+    </w:p>
+    <w:p>
+      <w:pPr>
+        <w:rPr>
+          <w:sz w:val="44"/>
+          <w:szCs w:val="44"/>
+          <w:lang w:bidi="fa-IR"/>
+        </w:rPr>
+      </w:pPr>
+      <w:r>
+        <w:rPr>
+          <w:b/>
+          <w:bCs/>
+          <w:sz w:val="44"/>
+          <w:szCs w:val="44"/>
+          <w:lang w:bidi="fa-IR"/>
+        </w:rPr>
+        <w:t>Can one notion of orthogonality imply another?</w:t>
+      </w:r>
+    </w:p>
+    <w:p>
+      <w:pPr>
+        <w:rPr>
+          <w:sz w:val="44"/>
+          <w:szCs w:val="44"/>
+          <w:lang w:bidi="fa-IR"/>
+        </w:rPr>
+      </w:pPr>
+      <w:r>
+        <w:rPr>
+          <w:sz w:val="44"/>
+          <w:szCs w:val="44"/>
+          <w:lang w:bidi="fa-IR"/>
+        </w:rPr>
+        <w:t>In other words, if two vectors are orthogonal in one sense, does this necessarily mean that they are orthogonal in another sense?</w:t>
+      </w:r>
+    </w:p>
+    <w:p>
+      <w:pPr>
+        <w:rPr>
+          <w:sz w:val="44"/>
+          <w:szCs w:val="44"/>
+          <w:lang w:bidi="fa-IR"/>
+        </w:rPr>
+      </w:pPr>
+      <w:r>
+        <w:rPr>
+          <w:sz w:val="44"/>
+          <w:szCs w:val="44"/>
+          <w:lang w:bidi="fa-IR"/>
+        </w:rPr>
+        <w:t>Let's investigate some of these implications.</w:t>
+      </w:r>
+    </w:p>
+    <w:p>
+      <w:pPr>
+        <w:rPr>
+          <w:b/>
+          <w:bCs/>
+          <w:sz w:val="44"/>
+          <w:szCs w:val="44"/>
+          <w:lang w:bidi="fa-IR"/>
+        </w:rPr>
+      </w:pPr>
+      <w:r>
+        <w:rPr>
+          <w:b/>
+          <w:bCs/>
+          <w:sz w:val="44"/>
+          <w:szCs w:val="44"/>
+          <w:lang w:bidi="fa-IR"/>
+        </w:rPr>
+        <w:t xml:space="preserve">Roberts Orthogonality </w:t>
+      </w:r>
+      <w:r>
+        <w:rPr>
+          <w:rFonts w:ascii="Cambria Math" w:hAnsi="Cambria Math" w:cs="Cambria Math"/>
+          <w:b/>
+          <w:bCs/>
+          <w:sz w:val="44"/>
+          <w:szCs w:val="44"/>
+          <w:lang w:bidi="fa-IR"/>
+        </w:rPr>
+        <w:t>⇒</w:t>
+      </w:r>
+      <w:r>
+        <w:rPr>
+          <w:b/>
+          <w:bCs/>
+          <w:sz w:val="44"/>
+          <w:szCs w:val="44"/>
+          <w:lang w:bidi="fa-IR"/>
+        </w:rPr>
+        <w:t xml:space="preserve"> Birkhoff</w:t>
+      </w:r>
+      <w:r>
+        <w:rPr>
+          <w:rFonts w:ascii="Calibri" w:hAnsi="Calibri" w:cs="Calibri"/>
+          <w:b/>
+          <w:bCs/>
+          <w:sz w:val="44"/>
+          <w:szCs w:val="44"/>
+          <w:lang w:bidi="fa-IR"/>
+        </w:rPr>
+        <w:t>–</w:t>
+      </w:r>
+      <w:r>
+        <w:rPr>
+          <w:b/>
+          <w:bCs/>
+          <w:sz w:val="44"/>
+          <w:szCs w:val="44"/>
+          <w:lang w:bidi="fa-IR"/>
+        </w:rPr>
+        <w:t>James Orthogonality</w:t>
+      </w:r>
+    </w:p>
+    <w:p>
+      <w:pPr>
+        <w:rPr>
+          <w:sz w:val="44"/>
+          <w:szCs w:val="44"/>
+          <w:lang w:bidi="fa-IR"/>
+        </w:rPr>
+      </w:pPr>
+      <w:r>
+        <w:rPr>
+          <w:sz w:val="44"/>
+          <w:szCs w:val="44"/>
+          <w:lang w:bidi="fa-IR"/>
+        </w:rPr>
+        <w:t>We begin by asking whether Roberts Orthogonality implies Birkhoff–James Orthogonality.</w:t>
+      </w:r>
+    </w:p>
+    <w:p>
+      <w:pPr>
+        <w:rPr>
+          <w:sz w:val="44"/>
+          <w:szCs w:val="44"/>
+          <w:lang w:bidi="fa-IR"/>
+        </w:rPr>
+      </w:pPr>
+      <w:r>
+        <w:rPr>
+          <w:sz w:val="44"/>
+          <w:szCs w:val="44"/>
+          <w:lang w:bidi="fa-IR"/>
+        </w:rPr>
+        <w:t>Using the definition of Roberts Orthogonality and applying the triangle inequality, we can obtain the required condition shown on the screen.</w:t>
+      </w:r>
+    </w:p>
+    <w:p>
+      <w:pPr>
+        <w:rPr>
+          <w:sz w:val="44"/>
+          <w:szCs w:val="44"/>
+          <w:lang w:bidi="fa-IR"/>
+        </w:rPr>
+      </w:pPr>
+      <w:r>
+        <w:rPr>
+          <w:sz w:val="44"/>
+          <w:szCs w:val="44"/>
+          <w:lang w:bidi="fa-IR"/>
+        </w:rPr>
+        <w:t>This condition is exactly the definition of Birkhoff–James Orthogonality.</w:t>
+      </w:r>
+    </w:p>
+    <w:p>
+      <w:pPr>
+        <w:rPr>
+          <w:sz w:val="44"/>
+          <w:szCs w:val="44"/>
+          <w:lang w:bidi="fa-IR"/>
+        </w:rPr>
+      </w:pPr>
+      <w:r>
+        <w:rPr>
+          <w:sz w:val="44"/>
+          <w:szCs w:val="44"/>
+          <w:lang w:bidi="fa-IR"/>
+        </w:rPr>
+        <w:lastRenderedPageBreak/>
+        <w:t>Therefore, every pair of vectors that are Roberts orthogonal are also Birkhoff–James orthogonal.</w:t>
+      </w:r>
+    </w:p>
+    <w:p>
+      <w:pPr>
+        <w:rPr>
+          <w:sz w:val="44"/>
+          <w:szCs w:val="44"/>
+          <w:lang w:bidi="fa-IR"/>
+        </w:rPr>
+      </w:pPr>
+      <w:r>
+        <w:rPr>
+          <w:sz w:val="44"/>
+          <w:szCs w:val="44"/>
+          <w:lang w:bidi="fa-IR"/>
+        </w:rPr>
+        <w:pict w14:anchorId="508FAFFB">
+          <v:rect id="_x0000_i1099" style="width:0;height:1.5pt" o:hralign="center" o:hrstd="t" o:hr="t" fillcolor="#a0a0a0" stroked="f"/>
+        </w:pict>
+      </w:r>
+    </w:p>
+    <w:p>
+      <w:pPr>
+        <w:rPr>
+          <w:b/>
+          <w:bCs/>
+          <w:sz w:val="44"/>
+          <w:szCs w:val="44"/>
+          <w:lang w:bidi="fa-IR"/>
+        </w:rPr>
+      </w:pPr>
+      <w:r>
+        <w:rPr>
+          <w:b/>
+          <w:bCs/>
+          <w:sz w:val="44"/>
+          <w:szCs w:val="44"/>
+          <w:lang w:bidi="fa-IR"/>
+        </w:rPr>
+        <w:t xml:space="preserve">Roberts Orthogonality </w:t>
+      </w:r>
+      <w:r>
+        <w:rPr>
+          <w:rFonts w:ascii="Cambria Math" w:hAnsi="Cambria Math" w:cs="Cambria Math"/>
+          <w:b/>
+          <w:bCs/>
+          <w:sz w:val="44"/>
+          <w:szCs w:val="44"/>
+          <w:lang w:bidi="fa-IR"/>
+        </w:rPr>
+        <w:t>⇒</w:t>
+      </w:r>
+      <w:r>
+        <w:rPr>
+          <w:b/>
+          <w:bCs/>
+          <w:sz w:val="44"/>
+          <w:szCs w:val="44"/>
+          <w:lang w:bidi="fa-IR"/>
+        </w:rPr>
+        <w:t xml:space="preserve"> Isosceles Orthogonality</w:t>
+      </w:r>
+    </w:p>
+    <w:p>
+      <w:pPr>
+        <w:rPr>
+          <w:sz w:val="44"/>
+          <w:szCs w:val="44"/>
+          <w:lang w:bidi="fa-IR"/>
+        </w:rPr>
+      </w:pPr>
+      <w:r>
+        <w:rPr>
+          <w:sz w:val="44"/>
+          <w:szCs w:val="44"/>
+          <w:lang w:bidi="fa-IR"/>
+        </w:rPr>
+        <w:t>Next, we investigate the relationship between Roberts Orthogonality and Isosceles Orthogonality.</w:t>
+      </w:r>
+    </w:p>
+    <w:p>
+      <w:pPr>
+        <w:rPr>
+          <w:sz w:val="44"/>
+          <w:szCs w:val="44"/>
+          <w:lang w:bidi="fa-IR"/>
+        </w:rPr>
+      </w:pPr>
+      <w:r>
+        <w:rPr>
+          <w:sz w:val="44"/>
+          <w:szCs w:val="44"/>
+          <w:lang w:bidi="fa-IR"/>
+        </w:rPr>
+        <w:t>From the definition of Roberts Orthogonality, we have a stronger symmetry property that directly leads to the condition required for Isosceles Orthogonality.</w:t>
+      </w:r>
+    </w:p>
+    <w:p>
+      <w:pPr>
+        <w:rPr>
+          <w:sz w:val="44"/>
+          <w:szCs w:val="44"/>
+          <w:lang w:bidi="fa-IR"/>
+        </w:rPr>
+      </w:pPr>
+      <w:r>
+        <w:rPr>
+          <w:sz w:val="44"/>
+          <w:szCs w:val="44"/>
+          <w:lang w:bidi="fa-IR"/>
+        </w:rPr>
+        <w:t>Therefore, Roberts Orthogonality always implies Isosceles Orthogonality.</w:t>
+      </w:r>
+    </w:p>
+    <w:p>
+      <w:pPr>
+        <w:rPr>
+          <w:sz w:val="44"/>
+          <w:szCs w:val="44"/>
+          <w:lang w:bidi="fa-IR"/>
+        </w:rPr>
+      </w:pPr>
+      <w:r>
+        <w:rPr>
+          <w:sz w:val="44"/>
+          <w:szCs w:val="44"/>
+          <w:lang w:bidi="fa-IR"/>
+        </w:rPr>
+        <w:pict w14:anchorId="335F19AF">
+          <v:rect id="_x0000_i1100" style="width:0;height:1.5pt" o:hralign="center" o:hrstd="t" o:hr="t" fillcolor="#a0a0a0" stroked="f"/>
+        </w:pict>
+      </w:r>
+    </w:p>
+    <w:p>
+      <w:pPr>
+        <w:rPr>
+          <w:b/>
+          <w:bCs/>
+          <w:sz w:val="44"/>
+          <w:szCs w:val="44"/>
+          <w:lang w:bidi="fa-IR"/>
+        </w:rPr>
+      </w:pPr>
+      <w:r>
+        <w:rPr>
+          <w:b/>
+          <w:bCs/>
+          <w:sz w:val="44"/>
+          <w:szCs w:val="44"/>
+          <w:lang w:bidi="fa-IR"/>
+        </w:rPr>
+        <w:t xml:space="preserve">Birkhoff–James Orthogonality </w:t>
+      </w:r>
+      <w:r>
+        <w:rPr>
+          <w:rFonts w:ascii="Cambria Math" w:hAnsi="Cambria Math" w:cs="Cambria Math"/>
+          <w:b/>
+          <w:bCs/>
+          <w:sz w:val="44"/>
+          <w:szCs w:val="44"/>
+          <w:lang w:bidi="fa-IR"/>
+        </w:rPr>
+        <w:t>⇒</w:t>
+      </w:r>
+      <w:r>
+        <w:rPr>
+          <w:b/>
+          <w:bCs/>
+          <w:sz w:val="44"/>
+          <w:szCs w:val="44"/>
+          <w:lang w:bidi="fa-IR"/>
+        </w:rPr>
+        <w:t xml:space="preserve"> Isosceles Orthogonality?</w:t>
+      </w:r>
+    </w:p>
+    <w:p>
+      <w:pPr>
+        <w:rPr>
+          <w:sz w:val="44"/>
+          <w:szCs w:val="44"/>
+          <w:lang w:bidi="fa-IR"/>
+        </w:rPr>
+      </w:pPr>
+      <w:r>
+        <w:rPr>
+          <w:sz w:val="44"/>
+          <w:szCs w:val="44"/>
+          <w:lang w:bidi="fa-IR"/>
+        </w:rPr>
+        <w:t>Does Birkhoff–James Orthogonality always imply Isosceles Orthogonality?</w:t>
+      </w:r>
+    </w:p>
+    <w:p>
+      <w:pPr>
+        <w:rPr>
+          <w:sz w:val="44"/>
+          <w:szCs w:val="44"/>
+          <w:lang w:bidi="fa-IR"/>
+        </w:rPr>
+      </w:pPr>
+      <w:r>
+        <w:rPr>
+          <w:sz w:val="44"/>
+          <w:szCs w:val="44"/>
+          <w:lang w:bidi="fa-IR"/>
+        </w:rPr>
+        <w:t>The answer is no.</w:t>
+      </w:r>
+    </w:p>
+    <w:p>
+      <w:pPr>
+        <w:rPr>
+          <w:sz w:val="44"/>
+          <w:szCs w:val="44"/>
+          <w:lang w:bidi="fa-IR"/>
+        </w:rPr>
+      </w:pPr>
+      <w:r>
+        <w:rPr>
+          <w:sz w:val="44"/>
+          <w:szCs w:val="44"/>
+          <w:lang w:bidi="fa-IR"/>
+        </w:rPr>
+        <w:lastRenderedPageBreak/>
+        <w:t>The example shown on the screen satisfies the condition for Birkhoff–James Orthogonality. However, it does not satisfy the required condition for Isosceles Orthogonality.</w:t>
+      </w:r>
+    </w:p>
+    <w:p>
+      <w:pPr>
+        <w:rPr>
+          <w:sz w:val="44"/>
+          <w:szCs w:val="44"/>
+          <w:lang w:bidi="fa-IR"/>
+        </w:rPr>
+      </w:pPr>
+      <w:r>
+        <w:rPr>
+          <w:sz w:val="44"/>
+          <w:szCs w:val="44"/>
+          <w:lang w:bidi="fa-IR"/>
+        </w:rPr>
+        <w:t>Therefore, this example shows that Birkhoff–James Orthogonality does not necessarily imply Isosceles Orthogonality.</w:t>
+      </w:r>
+    </w:p>
+    <w:p>
+      <w:pPr>
+        <w:rPr>
+          <w:sz w:val="44"/>
+          <w:szCs w:val="44"/>
+          <w:lang w:bidi="fa-IR"/>
+        </w:rPr>
+      </w:pPr>
+      <w:r>
+        <w:rPr>
+          <w:sz w:val="44"/>
+          <w:szCs w:val="44"/>
+          <w:lang w:bidi="fa-IR"/>
+        </w:rPr>
+        <w:pict w14:anchorId="69BBF6B8">
+          <v:rect id="_x0000_i1059" style="width:0;height:1.5pt" o:hralign="center" o:hrstd="t" o:hr="t" fillcolor="#a0a0a0" stroked="f"/>
+        </w:pict>
+      </w:r>
+    </w:p>
+    <w:p>
+      <w:pPr>
+        <w:rPr>
+          <w:sz w:val="44"/>
+          <w:szCs w:val="44"/>
+          <w:lang w:bidi="fa-IR"/>
+        </w:rPr>
+      </w:pPr>
+      <w:r>
+        <w:rPr>
+          <w:sz w:val="44"/>
+          <w:szCs w:val="44"/>
+          <w:lang w:bidi="fa-IR"/>
+        </w:rPr>
+        <w:t>Of course, these are only a few examples.</w:t>
+      </w:r>
+    </w:p>
+    <w:p>
+      <w:pPr>
+        <w:rPr>
+          <w:sz w:val="44"/>
+          <w:szCs w:val="44"/>
+          <w:lang w:bidi="fa-IR"/>
+        </w:rPr>
+      </w:pPr>
+      <w:r>
+        <w:rPr>
+          <w:sz w:val="44"/>
+          <w:szCs w:val="44"/>
+          <w:lang w:bidi="fa-IR"/>
+        </w:rPr>
+        <w:t>If we carry out the same analysis for every pair of orthogonality notions, we obtain the complete summary shown in the following table, which tells us exactly which implications hold and which do not.</w:t>
+      </w:r>
+    </w:p>
+    <w:p>
+      <w:pPr>
+        <w:rPr>
+          <w:sz w:val="44"/>
+          <w:szCs w:val="44"/>
+          <w:lang w:bidi="fa-IR"/>
+        </w:rPr>
+      </w:pPr>
+      <w:r>
+        <w:rPr>
+          <w:sz w:val="44"/>
+          <w:szCs w:val="44"/>
+          <w:lang w:bidi="fa-IR"/>
+        </w:rPr>
+        <w:t>6-4:</w:t>
+      </w:r>
+    </w:p>
+    <w:p>
+      <w:pPr>
+        <w:rPr>
+          <w:sz w:val="44"/>
+          <w:szCs w:val="44"/>
+          <w:lang w:bidi="fa-IR"/>
+        </w:rPr>
+      </w:pPr>
+      <w:r>
+        <w:rPr>
+          <w:sz w:val="44"/>
+          <w:szCs w:val="44"/>
+          <w:lang w:bidi="fa-IR"/>
+        </w:rPr>
+        <w:t xml:space="preserve">Now, let's conclude with a remarkable characterization theorem due to </w:t>
+      </w:r>
+      <w:r>
+        <w:rPr>
+          <w:b/>
+          <w:bCs/>
+          <w:sz w:val="44"/>
+          <w:szCs w:val="44"/>
+          <w:lang w:bidi="fa-IR"/>
+        </w:rPr>
+        <w:t>Kapoor</w:t>
+      </w:r>
+      <w:r>
+        <w:rPr>
+          <w:sz w:val="44"/>
+          <w:szCs w:val="44"/>
+          <w:lang w:bidi="fa-IR"/>
+        </w:rPr>
+        <w:t>.</w:t>
+      </w:r>
+    </w:p>
+    <w:p>
+      <w:pPr>
+        <w:rPr>
+          <w:sz w:val="44"/>
+          <w:szCs w:val="44"/>
+          <w:lang w:bidi="fa-IR"/>
+        </w:rPr>
+      </w:pPr>
+      <w:r>
+        <w:rPr>
+          <w:sz w:val="44"/>
+          <w:szCs w:val="44"/>
+          <w:lang w:bidi="fa-IR"/>
+        </w:rPr>
+        <w:lastRenderedPageBreak/>
+        <w:t>This theorem establishes a deep connection between the different notions of orthogonality and the geometry of the underlying normed space.</w:t>
+      </w:r>
+    </w:p>
+    <w:p>
+      <w:pPr>
+        <w:rPr>
+          <w:sz w:val="44"/>
+          <w:szCs w:val="44"/>
+          <w:lang w:bidi="fa-IR"/>
+        </w:rPr>
+      </w:pPr>
+      <w:r>
+        <w:rPr>
+          <w:sz w:val="44"/>
+          <w:szCs w:val="44"/>
+          <w:lang w:bidi="fa-IR"/>
+        </w:rPr>
+        <w:t xml:space="preserve">It states that a normed space is an </w:t>
+      </w:r>
+      <w:r>
+        <w:rPr>
+          <w:b/>
+          <w:bCs/>
+          <w:sz w:val="44"/>
+          <w:szCs w:val="44"/>
+          <w:lang w:bidi="fa-IR"/>
+        </w:rPr>
+        <w:t>inner product space</w:t>
+      </w:r>
+      <w:r>
+        <w:rPr>
+          <w:sz w:val="44"/>
+          <w:szCs w:val="44"/>
+          <w:lang w:bidi="fa-IR"/>
+        </w:rPr>
+        <w:t xml:space="preserve"> if and only if just one of the implication relationships between these orthogonality notions becomes true.</w:t>
+      </w:r>
+    </w:p>
+    <w:p>
+      <w:pPr>
+        <w:rPr>
+          <w:sz w:val="44"/>
+          <w:szCs w:val="44"/>
+          <w:lang w:bidi="fa-IR"/>
+        </w:rPr>
+      </w:pPr>
+      <w:r>
+        <w:rPr>
+          <w:sz w:val="44"/>
+          <w:szCs w:val="44"/>
+          <w:lang w:bidi="fa-IR"/>
+        </w:rPr>
+        <w:t>More precisely, the statements listed on the screen are all equivalent.</w:t>
+      </w:r>
+    </w:p>
+    <w:p>
+      <w:pPr>
+        <w:rPr>
+          <w:sz w:val="44"/>
+          <w:szCs w:val="44"/>
+          <w:lang w:bidi="fa-IR"/>
+        </w:rPr>
+      </w:pPr>
+      <w:r>
+        <w:rPr>
+          <w:sz w:val="44"/>
+          <w:szCs w:val="44"/>
+          <w:lang w:bidi="fa-IR"/>
+        </w:rPr>
+        <w:t>The first statement says that the space is an inner product space.</w:t>
+      </w:r>
+    </w:p>
+    <w:p>
+      <w:pPr>
+        <w:rPr>
+          <w:sz w:val="44"/>
+          <w:szCs w:val="44"/>
+          <w:lang w:bidi="fa-IR"/>
+        </w:rPr>
+      </w:pPr>
+      <w:r>
+        <w:rPr>
+          <w:sz w:val="44"/>
+          <w:szCs w:val="44"/>
+          <w:lang w:bidi="fa-IR"/>
+        </w:rPr>
+        <w:t>Each of the remaining statements says that one type of orthogonality always implies another—for example, that Pythagorean Orthogonality always implies Isosceles Orthogonality, or that Birkhoff–James Orthogonality always implies Pythagorean Orthogonality.</w:t>
+      </w:r>
+    </w:p>
+    <w:p>
+      <w:pPr>
+        <w:rPr>
+          <w:sz w:val="44"/>
+          <w:szCs w:val="44"/>
+          <w:lang w:bidi="fa-IR"/>
+        </w:rPr>
+      </w:pPr>
+      <w:r>
+        <w:rPr>
+          <w:sz w:val="44"/>
+          <w:szCs w:val="44"/>
+          <w:lang w:bidi="fa-IR"/>
+        </w:rPr>
+        <w:lastRenderedPageBreak/>
+        <w:t xml:space="preserve">The remarkable point is that </w:t>
+      </w:r>
+      <w:r>
+        <w:rPr>
+          <w:b/>
+          <w:bCs/>
+          <w:sz w:val="44"/>
+          <w:szCs w:val="44"/>
+          <w:lang w:bidi="fa-IR"/>
+        </w:rPr>
+        <w:t>any one of these implications is enough</w:t>
+      </w:r>
+      <w:r>
+        <w:rPr>
+          <w:sz w:val="44"/>
+          <w:szCs w:val="44"/>
+          <w:lang w:bidi="fa-IR"/>
+        </w:rPr>
+        <w:t xml:space="preserve"> to characterize an inner product space.</w:t>
+      </w:r>
+    </w:p>
+    <w:p>
+      <w:pPr>
+        <w:rPr>
+          <w:sz w:val="44"/>
+          <w:szCs w:val="44"/>
+          <w:lang w:bidi="fa-IR"/>
+        </w:rPr>
+      </w:pPr>
+      <w:r>
+        <w:rPr>
+          <w:sz w:val="44"/>
+          <w:szCs w:val="44"/>
+          <w:lang w:bidi="fa-IR"/>
+        </w:rPr>
+        <w:t xml:space="preserve">In other words, if </w:t>
+      </w:r>
+      <w:r>
+        <w:rPr>
+          <w:b/>
+          <w:bCs/>
+          <w:sz w:val="44"/>
+          <w:szCs w:val="44"/>
+          <w:lang w:bidi="fa-IR"/>
+        </w:rPr>
+        <w:t>any</w:t>
+      </w:r>
+      <w:r>
+        <w:rPr>
+          <w:sz w:val="44"/>
+          <w:szCs w:val="44"/>
+          <w:lang w:bidi="fa-IR"/>
+        </w:rPr>
+        <w:t xml:space="preserve"> one of these implication statements holds for every pair of vectors in a normed space, then the norm must come from an inner product. Conversely, every inner product space satisfies all of these implication relations.</w:t>
+      </w:r>
+    </w:p>
+    <w:p>
+      <w:pPr>
+        <w:rPr>
+          <w:sz w:val="44"/>
+          <w:szCs w:val="44"/>
+          <w:lang w:bidi="fa-IR"/>
+        </w:rPr>
+      </w:pPr>
+      <w:r>
+        <w:rPr>
+          <w:sz w:val="44"/>
+          <w:szCs w:val="44"/>
+          <w:lang w:bidi="fa-IR"/>
+        </w:rPr>
+        <w:t>This theorem beautifully illustrates how the relationships between different notions of orthogonality reveal the underlying structure of the space itself.</w:t>
+      </w:r>
+    </w:p>
+    <w:p>
+      <w:pPr>
+        <w:rPr>
+          <w:sz w:val="44"/>
+          <w:szCs w:val="44"/>
+          <w:lang w:bidi="fa-IR"/>
+        </w:rPr>
+      </w:pPr>
+      <w:r>
+        <w:rPr>
+          <w:sz w:val="44"/>
+          <w:szCs w:val="44"/>
+          <w:lang w:bidi="fa-IR"/>
+        </w:rPr>
+        <w:t>6-5:</w:t>
+      </w:r>
+    </w:p>
+    <w:p>
+      <w:pPr>
+        <w:rPr>
+          <w:sz w:val="44"/>
+          <w:szCs w:val="44"/>
+          <w:lang w:bidi="fa-IR"/>
+        </w:rPr>
+      </w:pPr>
+      <w:r>
+        <w:rPr>
+          <w:sz w:val="44"/>
+          <w:szCs w:val="44"/>
+          <w:lang w:bidi="fa-IR"/>
+        </w:rPr>
+        <w:t>And finally, our journey through the different notions of orthogonality comes to an end here.</w:t>
+      </w:r>
+    </w:p>
+    <w:p>
+      <w:pPr>
+        <w:rPr>
+          <w:sz w:val="44"/>
+          <w:szCs w:val="44"/>
+          <w:lang w:bidi="fa-IR"/>
+        </w:rPr>
+      </w:pPr>
+      <w:r>
+        <w:rPr>
+          <w:sz w:val="44"/>
+          <w:szCs w:val="44"/>
+          <w:lang w:bidi="fa-IR"/>
+        </w:rPr>
+        <w:t>Throughout this series, we explored various types of orthogonality in normed spaces, studied their properties, and examined the relationships between them.</w:t>
+      </w:r>
+    </w:p>
+    <w:p>
+      <w:pPr>
+        <w:rPr>
+          <w:sz w:val="44"/>
+          <w:szCs w:val="44"/>
+          <w:lang w:bidi="fa-IR"/>
+        </w:rPr>
+      </w:pPr>
+      <w:r>
+        <w:rPr>
+          <w:sz w:val="44"/>
+          <w:szCs w:val="44"/>
+          <w:lang w:bidi="fa-IR"/>
+        </w:rPr>
+        <w:lastRenderedPageBreak/>
+        <w:t>I hope you have enjoyed these videos and found them useful for understanding the beautiful connections between geometry and functional analysis.</w:t>
+      </w:r>
     </w:p>
     <w:p>
       <w:pPr>
@@ -22366,6 +22477,14 @@
           <w:lang w:bidi="fa-IR"/>
         </w:rPr>
       </w:pPr>
+      <w:r>
+        <w:rPr>
+          <w:sz w:val="44"/>
+          <w:szCs w:val="44"/>
+          <w:lang w:bidi="fa-IR"/>
+        </w:rPr>
+        <w:t>Thank you very much for watching and for staying with me until the end.</w:t>
+      </w:r>
     </w:p>
     <w:sectPr>
       <w:pgSz w:w="12240" w:h="15840"/>

</xml_diff>